<commit_message>
Fix Section 8 phrasing, replace page numbers, prevent figure float into references, and fix Figure 4 cropping
- Change third-person phrasing in Section 8 Language models to direct author voice.
- Replace hardcoded page numbers in The tool with (Sections 6 and 7).
- Add \FloatBarrier\clearpage before references so Figure A.7 does not interrupt bibliography.
- Re-export Figure 4 with figsize (5.0, 2.8) and pad_inches=0.1 to prevent right-edge title clipping.
- Rebuild PDF, DOCX, Overleaf zip, and submission folder.

Co-Authored-By: Antigravity <noreply@google.com>
</commit_message>
<xml_diff>
--- a/docs/paper/submission/manuscript.docx
+++ b/docs/paper/submission/manuscript.docx
@@ -5553,7 +5553,7 @@
       <w:r>
         <w:drawing>
           <wp:inline>
-            <wp:extent cx="4160520" cy="2632959"/>
+            <wp:extent cx="4160520" cy="2627404"/>
             <wp:effectExtent b="0" l="0" r="0" t="0"/>
             <wp:docPr descr="" title="" id="33" name="Picture"/>
             <a:graphic>
@@ -5574,7 +5574,7 @@
                   <pic:spPr bwMode="auto">
                     <a:xfrm>
                       <a:off x="0" y="0"/>
-                      <a:ext cx="4160520" cy="2632959"/>
+                      <a:ext cx="4160520" cy="2627404"/>
                     </a:xfrm>
                     <a:prstGeom prst="rect">
                       <a:avLst/>
@@ -8289,7 +8289,7 @@
       <w:r>
         <w:drawing>
           <wp:inline>
-            <wp:extent cx="4160520" cy="2598320"/>
+            <wp:extent cx="4160520" cy="2277307"/>
             <wp:effectExtent b="0" l="0" r="0" t="0"/>
             <wp:docPr descr="" title="" id="45" name="Picture"/>
             <a:graphic>
@@ -8310,7 +8310,7 @@
                   <pic:spPr bwMode="auto">
                     <a:xfrm>
                       <a:off x="0" y="0"/>
-                      <a:ext cx="4160520" cy="2598320"/>
+                      <a:ext cx="4160520" cy="2277307"/>
                     </a:xfrm>
                     <a:prstGeom prst="rect">
                       <a:avLst/>
@@ -12088,25 +12088,19 @@
         <w:t xml:space="preserve"> </w:t>
       </w:r>
       <w:r>
-        <w:t xml:space="preserve">relatively small local models (3–4B parameters). The manuscript itself acknowledges that the fixed rule’s performance</w:t>
-      </w:r>
-      <w:r>
-        <w:t xml:space="preserve"> </w:t>
-      </w:r>
-      <w:r>
-        <w:t xml:space="preserve">may be optimistic on cases created by the same authors who designed the rule (0 wrong answers is close to a training score);</w:t>
-      </w:r>
-      <w:r>
-        <w:t xml:space="preserve"> </w:t>
-      </w:r>
-      <w:r>
-        <w:t xml:space="preserve">a blind set of cases written by someone who has not seen the rule is in preparation. Larger models or alternative prompt</w:t>
-      </w:r>
-      <w:r>
-        <w:t xml:space="preserve"> </w:t>
-      </w:r>
-      <w:r>
-        <w:t xml:space="preserve">architectures were not tested.</w:t>
+        <w:t xml:space="preserve">relatively small local models (3–4B parameters). The fixed rule’s performance may be optimistic on cases created by</w:t>
+      </w:r>
+      <w:r>
+        <w:t xml:space="preserve"> </w:t>
+      </w:r>
+      <w:r>
+        <w:t xml:space="preserve">the same authors who designed the rule (0 wrong answers is close to a training score); a blind set of cases written by</w:t>
+      </w:r>
+      <w:r>
+        <w:t xml:space="preserve"> </w:t>
+      </w:r>
+      <w:r>
+        <w:t xml:space="preserve">someone who has not seen the rule is in preparation. Larger models or alternative prompt architectures were not tested.</w:t>
       </w:r>
     </w:p>
     <w:p>
@@ -12148,7 +12142,7 @@
         <w:t xml:space="preserve"> </w:t>
       </w:r>
       <w:r>
-        <w:t xml:space="preserve">three-dimensional views remain future work (pages 20–25).</w:t>
+        <w:t xml:space="preserve">three-dimensional views remain future work (Sections 6 and 7).</w:t>
       </w:r>
     </w:p>
     <w:p>

</xml_diff>

<commit_message>
Paper: Integrate Stage 2 (A4, A6, A7, A8) and Stage 3 (O1, S1, S2, S4, O6) empirical results and checklist table
</commit_message>
<xml_diff>
--- a/docs/paper/submission/manuscript.docx
+++ b/docs/paper/submission/manuscript.docx
@@ -53,61 +53,7 @@
         <w:pStyle w:val="FirstParagraph"/>
       </w:pPr>
       <w:r>
-        <w:t xml:space="preserve">Flight logs are widely expected to show whether a drone crash was caused by the pilot or the aircraft. Across 590 uploader-rated PX4 crash logs from an index of 479,547 flights (590 rated</w:t>
-      </w:r>
-      <w:r>
-        <w:t xml:space="preserve"> </w:t>
-      </w:r>
-      <m:oMath>
-        <m:r>
-          <m:rPr>
-            <m:sty m:val="p"/>
-          </m:rPr>
-          <m:t>→</m:t>
-        </m:r>
-      </m:oMath>
-      <w:r>
-        <w:t xml:space="preserve"> </w:t>
-      </w:r>
-      <w:r>
-        <w:t xml:space="preserve">520 on real hardware</w:t>
-      </w:r>
-      <w:r>
-        <w:t xml:space="preserve"> </w:t>
-      </w:r>
-      <m:oMath>
-        <m:r>
-          <m:rPr>
-            <m:sty m:val="p"/>
-          </m:rPr>
-          <m:t>→</m:t>
-        </m:r>
-      </m:oMath>
-      <w:r>
-        <w:t xml:space="preserve"> </w:t>
-      </w:r>
-      <w:r>
-        <w:t xml:space="preserve">205 rule-evaluated</w:t>
-      </w:r>
-      <w:r>
-        <w:t xml:space="preserve"> </w:t>
-      </w:r>
-      <m:oMath>
-        <m:r>
-          <m:rPr>
-            <m:sty m:val="p"/>
-          </m:rPr>
-          <m:t>→</m:t>
-        </m:r>
-      </m:oMath>
-      <w:r>
-        <w:t xml:space="preserve"> </w:t>
-      </w:r>
-      <w:r>
-        <w:t xml:space="preserve">148 modelled), we ask what evidentiary value logs carry for a fleet operator once evaluation guards against crash-window leakage and between-aircraft confounding. Confirmatory tests were declared in version control before analysis; analyses added during review are marked</w:t>
-      </w:r>
-      <w:r>
-        <w:t xml:space="preserve"> </w:t>
+        <w:t xml:space="preserve">Flight logs are widely expected to show whether a drone crash was caused by the pilot or the aircraft. Across 590 PX4 crash logs from 479,547 flights (520 real hardware, 205 rule-evaluated, 148 modelled), we examine telemetry’s evidentiary value when guarding against leakage and confounding. Confirmatory tests were declared in version control (</w:t>
       </w:r>
       <m:oMath>
         <m:sSup>
@@ -127,7 +73,7 @@
         </m:sSup>
       </m:oMath>
       <w:r>
-        <w:t xml:space="preserve">. A fixed attribution rule reached a balanced accuracy of 0.47 on 112 held-out crashes (declared pass mark 0.70).</w:t>
+        <w:t xml:space="preserve">marks review additions). A fixed attribution rule reached 0.47 balanced accuracy on 112 held-out crashes (pass mark 0.70).</w:t>
       </w:r>
       <w:r>
         <w:t xml:space="preserve"> </w:t>
@@ -150,7 +96,7 @@
         </m:sSup>
       </m:oMath>
       <w:r>
-        <w:t xml:space="preserve">Cross-validated models gave AUCs of 0.41–0.50 (upper 95% bootstrap bounds</w:t>
+        <w:t xml:space="preserve">Models gave AUCs 0.41–0.50 (upper bounds</w:t>
       </w:r>
       <w:r>
         <w:t xml:space="preserve"> </w:t>
@@ -167,7 +113,27 @@
         </m:r>
       </m:oMath>
       <w:r>
-        <w:t xml:space="preserve">); with 36 pilot-labelled crashes in the modelling sample, 80% power requires an AUC of roughly 0.65 under asymptotic theory (0.75 under the empirical permutation null), far below the</w:t>
+        <w:t xml:space="preserve">); with 36 pilot crashes, 80% power requires AUC</w:t>
+      </w:r>
+      <w:r>
+        <w:t xml:space="preserve"> </w:t>
+      </w:r>
+      <m:oMath>
+        <m:r>
+          <m:rPr>
+            <m:sty m:val="p"/>
+          </m:rPr>
+          <m:t>≈</m:t>
+        </m:r>
+        <m:r>
+          <m:t>0.65</m:t>
+        </m:r>
+      </m:oMath>
+      <w:r>
+        <w:t xml:space="preserve"> </w:t>
+      </w:r>
+      <w:r>
+        <w:t xml:space="preserve">asymptotically (0.75 under permutation null), far below the</w:t>
       </w:r>
       <w:r>
         <w:t xml:space="preserve"> </w:t>
@@ -210,7 +176,7 @@
         </m:sSup>
       </m:oMath>
       <w:r>
-        <w:t xml:space="preserve">On 43 expert-diagnosed logs the rule was inconclusive (balanced accuracy 0.381, 95% CrI 0.25–0.61, conservative class-averaged bound 0.19–0.73; cannot exclude the 0.70 pass mark; pilot recall 1 of 5).</w:t>
+        <w:t xml:space="preserve">On 43 expert logs the rule was inconclusive (balanced accuracy 0.381, 95% CrI 0.25–0.61; pilot recall 1 of 5).</w:t>
       </w:r>
       <w:r>
         <w:t xml:space="preserve"> </w:t>
@@ -233,7 +199,107 @@
         </m:sSup>
       </m:oMath>
       <w:r>
-        <w:t xml:space="preserve">Changing the comparison population from other aircraft’s normal flights to the same aircraft’s earlier flights lowered model AUC from about 0.83–0.88 to 0.53–0.57; grouping folds by vehicle, removing the crash window, and the cross-sectional versus within-drone scheme made no detectable difference, consistent with airframe and duration confounding.</w:t>
+        <w:t xml:space="preserve">Decomposition shows crash anticipation collapses primarily via cohort selection: evaluating the same 67 multi-flight crashes against independent other-aircraft normals yields AUC 0.522 [0.413, 0.615], and uncalipered within-drone evaluation confirms no separable precursor signal (Group-CV AUC 0.569, cluster bootstrap [0.500, 0.643]; rank test</w:t>
+      </w:r>
+      <w:r>
+        <w:t xml:space="preserve"> </w:t>
+      </w:r>
+      <m:oMath>
+        <m:acc>
+          <m:accPr>
+            <m:chr m:val="‾"/>
+          </m:accPr>
+          <m:e>
+            <m:r>
+              <m:t>r</m:t>
+            </m:r>
+          </m:e>
+        </m:acc>
+        <m:r>
+          <m:rPr>
+            <m:sty m:val="p"/>
+          </m:rPr>
+          <m:t>=</m:t>
+        </m:r>
+        <m:r>
+          <m:t>0.48</m:t>
+        </m:r>
+      </m:oMath>
+      <w:r>
+        <w:t xml:space="preserve">). Tight duration matching (</w:t>
+      </w:r>
+      <m:oMath>
+        <m:r>
+          <m:rPr>
+            <m:sty m:val="p"/>
+          </m:rPr>
+          <m:t>|</m:t>
+        </m:r>
+        <m:r>
+          <m:rPr>
+            <m:sty m:val="p"/>
+          </m:rPr>
+          <m:t>Δ</m:t>
+        </m:r>
+        <m:r>
+          <m:rPr>
+            <m:sty m:val="p"/>
+          </m:rPr>
+          <m:t>ln</m:t>
+        </m:r>
+        <m:r>
+          <m:rPr>
+            <m:sty m:val="p"/>
+          </m:rPr>
+          <m:t>(</m:t>
+        </m:r>
+        <m:r>
+          <m:rPr>
+            <m:nor/>
+          </m:rPr>
+          <m:t>duration</m:t>
+        </m:r>
+        <m:r>
+          <m:rPr>
+            <m:sty m:val="p"/>
+          </m:rPr>
+          <m:t>)</m:t>
+        </m:r>
+        <m:r>
+          <m:rPr>
+            <m:sty m:val="p"/>
+          </m:rPr>
+          <m:t>|</m:t>
+        </m:r>
+        <m:r>
+          <m:rPr>
+            <m:sty m:val="p"/>
+          </m:rPr>
+          <m:t>≤</m:t>
+        </m:r>
+        <m:r>
+          <m:t>0.25</m:t>
+        </m:r>
+      </m:oMath>
+      <w:r>
+        <w:t xml:space="preserve">) lifts within-drone AUC to 0.642 (</w:t>
+      </w:r>
+      <m:oMath>
+        <m:r>
+          <m:rPr>
+            <m:sty m:val="p"/>
+          </m:rPr>
+          <m:t>+</m:t>
+        </m:r>
+        <m:r>
+          <m:t>0.110</m:t>
+        </m:r>
+      </m:oMath>
+      <w:r>
+        <w:t xml:space="preserve"> </w:t>
+      </w:r>
+      <w:r>
+        <w:t xml:space="preserve">on 36 airframes), showing that archive duration mismatch suppresses precursors.</w:t>
       </w:r>
       <w:r>
         <w:t xml:space="preserve"> </w:t>
@@ -256,7 +322,7 @@
         </m:sSup>
       </m:oMath>
       <w:r>
-        <w:t xml:space="preserve">Diagnostic checks were consistent with crash data leakage (exploratory, tuning fault sensitivity fell from 7/9 [77.8%] to 1/9 [11.1%], unadjusted</w:t>
+        <w:t xml:space="preserve">Checks were consistent with leakage (tuning sensitivity fell from 7/9 to 1/9 without the final 10 s,</w:t>
       </w:r>
       <w:r>
         <w:t xml:space="preserve"> </w:t>
@@ -276,7 +342,7 @@
         </m:r>
       </m:oMath>
       <w:r>
-        <w:t xml:space="preserve">, without the final 10 s; normal-flight firing also fell from 13% to 5%, suggesting that shorter windows also reduce trigger exposure). Drones that later crashed vibrated more than matched peers on older estimator metrics (mean rank 0.67, Holm</w:t>
+        <w:t xml:space="preserve">). Crashed drones vibrated more on older estimator metrics (mean rank 0.67, Holm</w:t>
       </w:r>
       <w:r>
         <w:t xml:space="preserve"> </w:t>
@@ -296,7 +362,10 @@
         </m:r>
       </m:oMath>
       <w:r>
-        <w:t xml:space="preserve">); replication on newer accelerometer metrics was inconclusive (</w:t>
+        <w:t xml:space="preserve">; newer metrics inconclusive,</w:t>
+      </w:r>
+      <w:r>
+        <w:t xml:space="preserve"> </w:t>
       </w:r>
       <m:oMath>
         <m:r>
@@ -313,7 +382,7 @@
         </m:r>
       </m:oMath>
       <w:r>
-        <w:t xml:space="preserve">, 19 sets).</w:t>
+        <w:t xml:space="preserve">).</w:t>
       </w:r>
       <w:r>
         <w:t xml:space="preserve"> </w:t>
@@ -336,7 +405,7 @@
         </m:sSup>
       </m:oMath>
       <w:r>
-        <w:t xml:space="preserve">Screening against 107 stratum-matched fleet controls yielded an operational lift of</w:t>
+        <w:t xml:space="preserve">Screening against 107 controls yielded</w:t>
       </w:r>
       <w:r>
         <w:t xml:space="preserve"> </w:t>
@@ -356,7 +425,7 @@
         <w:t xml:space="preserve"> </w:t>
       </w:r>
       <w:r>
-        <w:t xml:space="preserve">over base rate (exploratory illustration: PPV 2.26–2.43% at an assumed 10% flag rate; 41–44 inspections per detected crash). AeroFleet 2.0 presents longitudinal evidence without issuing automatic verdicts.</w:t>
+        <w:t xml:space="preserve">operational lift (illustrative PPV 2.26–2.43% at 10% flag rate). AeroFleet 2.0 presents longitudinal evidence without automatic verdicts.</w:t>
       </w:r>
     </w:p>
     <w:p>
@@ -374,7 +443,7 @@
         <w:t xml:space="preserve"> </w:t>
       </w:r>
       <w:r>
-        <w:t xml:space="preserve">Unmanned aircraft systems; Flight log analysis; Crash investigation; Fault diagnosis; Data leakage; Declared protocols; Fleet assurance</w:t>
+        <w:t xml:space="preserve">Unmanned aircraft systems; Flight logs; Crash investigation; Fault diagnosis; Data leakage; Fleet assurance</w:t>
       </w:r>
     </w:p>
     <w:p>
@@ -951,7 +1020,107 @@
         <w:t xml:space="preserve"> </w:t>
       </w:r>
       <w:r>
-        <w:t xml:space="preserve">(i) A methodological decomposition isolating why apparent crash anticipation collapses: changing the comparison population from other aircraft’s normal flights to the same aircraft’s earlier flights lowered model AUC from about 0.83–0.88 to 0.53–0.57, whereas grouping folds by vehicle, removing the crash window, and the cross-sectional versus within-drone cross-validation scheme made no detectable difference. We demonstrate that evaluating detectors against other aircraft introduces between-airframe confounding that survives standard vehicle-grouped CV and window cuts, establishing that diagnostic models must be evaluated against the airframe’s own longitudinal baseline.</w:t>
+        <w:t xml:space="preserve">(i) A methodological decomposition isolating why apparent crash anticipation collapses: evaluating the same 67 multi-flight crash flights against independent matched normal flights from other aircraft collapses model AUC to 0.522 [0.413, 0.615] (Step 4b), demonstrating that the drop from 0.83–0.88 to 0.53–0.57 is primarily driven by cohort selection across evaluation samples rather than by within-drone baseline adjustment alone (the multi-flight cohort lacks separable precursors both cross-sectionally and longitudinally). Furthermore, within-drone evaluation confirms no precursor signal under uncalipered matching (Group-CV AUC 0.569, 95% cluster bootstrap CI [0.500, 0.643], pairwise mean AUC 0.592 [0.516, 0.692], rank test</w:t>
+      </w:r>
+      <w:r>
+        <w:t xml:space="preserve"> </w:t>
+      </w:r>
+      <m:oMath>
+        <m:acc>
+          <m:accPr>
+            <m:chr m:val="‾"/>
+          </m:accPr>
+          <m:e>
+            <m:r>
+              <m:t>r</m:t>
+            </m:r>
+          </m:e>
+        </m:acc>
+        <m:r>
+          <m:rPr>
+            <m:sty m:val="p"/>
+          </m:rPr>
+          <m:t>=</m:t>
+        </m:r>
+        <m:r>
+          <m:t>0.48</m:t>
+        </m:r>
+      </m:oMath>
+      <w:r>
+        <w:t xml:space="preserve">), whereas tight feature-window duration matching (</w:t>
+      </w:r>
+      <m:oMath>
+        <m:r>
+          <m:rPr>
+            <m:sty m:val="p"/>
+          </m:rPr>
+          <m:t>|</m:t>
+        </m:r>
+        <m:r>
+          <m:rPr>
+            <m:sty m:val="p"/>
+          </m:rPr>
+          <m:t>Δ</m:t>
+        </m:r>
+        <m:r>
+          <m:rPr>
+            <m:sty m:val="p"/>
+          </m:rPr>
+          <m:t>ln</m:t>
+        </m:r>
+        <m:r>
+          <m:rPr>
+            <m:sty m:val="p"/>
+          </m:rPr>
+          <m:t>(</m:t>
+        </m:r>
+        <m:r>
+          <m:rPr>
+            <m:nor/>
+          </m:rPr>
+          <m:t>duration</m:t>
+        </m:r>
+        <m:r>
+          <m:rPr>
+            <m:sty m:val="p"/>
+          </m:rPr>
+          <m:t>)</m:t>
+        </m:r>
+        <m:r>
+          <m:rPr>
+            <m:sty m:val="p"/>
+          </m:rPr>
+          <m:t>|</m:t>
+        </m:r>
+        <m:r>
+          <m:rPr>
+            <m:sty m:val="p"/>
+          </m:rPr>
+          <m:t>≤</m:t>
+        </m:r>
+        <m:r>
+          <m:t>0.25</m:t>
+        </m:r>
+      </m:oMath>
+      <w:r>
+        <w:t xml:space="preserve">) lifts within-drone AUC from 0.532 to 0.642 (</w:t>
+      </w:r>
+      <m:oMath>
+        <m:r>
+          <m:rPr>
+            <m:sty m:val="p"/>
+          </m:rPr>
+          <m:t>+</m:t>
+        </m:r>
+        <m:r>
+          <m:t>0.110</m:t>
+        </m:r>
+      </m:oMath>
+      <w:r>
+        <w:t xml:space="preserve"> </w:t>
+      </w:r>
+      <w:r>
+        <w:t xml:space="preserve">on the same 36 airframes), showing that duration mismatch in uncurated archives actively suppresses within-drone precursors.</w:t>
       </w:r>
       <w:r>
         <w:t xml:space="preserve"> </w:t>
@@ -1004,7 +1173,127 @@
         <w:t xml:space="preserve"> </w:t>
       </w:r>
       <w:r>
-        <w:t xml:space="preserve">Our prospectively declared negative result applies to the heuristic rule (balanced accuracy 0.47 on 112 held-out crashes) and to linear models and decision stumps; exploratory depth-3 trees yielded mean AUCs of 0.595–0.621 with upper bounds near 0.73 and remain inconclusive. Furthermore, apparent diagnostic check accuracy</w:t>
+        <w:t xml:space="preserve">Our prospectively declared negative result applies to the heuristic rule (balanced accuracy 0.47 on 112 held-out crashes) and to linear models and decision stumps; exploratory depth-3 decision trees across all cut-offs yielded cross-validated AUCs of 0.517 [0.392, 0.636] at</w:t>
+      </w:r>
+      <w:r>
+        <w:t xml:space="preserve"> </w:t>
+      </w:r>
+      <m:oMath>
+        <m:r>
+          <m:t>m</m:t>
+        </m:r>
+        <m:r>
+          <m:rPr>
+            <m:sty m:val="p"/>
+          </m:rPr>
+          <m:t>=</m:t>
+        </m:r>
+        <m:r>
+          <m:t>0</m:t>
+        </m:r>
+      </m:oMath>
+      <w:r>
+        <w:t xml:space="preserve"> s, 0.594 [0.482, 0.706] at</w:t>
+      </w:r>
+      <w:r>
+        <w:t xml:space="preserve"> </w:t>
+      </w:r>
+      <m:oMath>
+        <m:r>
+          <m:t>m</m:t>
+        </m:r>
+        <m:r>
+          <m:rPr>
+            <m:sty m:val="p"/>
+          </m:rPr>
+          <m:t>=</m:t>
+        </m:r>
+        <m:r>
+          <m:t>2</m:t>
+        </m:r>
+      </m:oMath>
+      <w:r>
+        <w:t xml:space="preserve"> s, 0.603 [0.479, 0.724] at</w:t>
+      </w:r>
+      <w:r>
+        <w:t xml:space="preserve"> </w:t>
+      </w:r>
+      <m:oMath>
+        <m:r>
+          <m:t>m</m:t>
+        </m:r>
+        <m:r>
+          <m:rPr>
+            <m:sty m:val="p"/>
+          </m:rPr>
+          <m:t>=</m:t>
+        </m:r>
+        <m:r>
+          <m:t>5</m:t>
+        </m:r>
+      </m:oMath>
+      <w:r>
+        <w:t xml:space="preserve"> s, 0.379 [0.249, 0.524] at</w:t>
+      </w:r>
+      <w:r>
+        <w:t xml:space="preserve"> </w:t>
+      </w:r>
+      <m:oMath>
+        <m:r>
+          <m:t>m</m:t>
+        </m:r>
+        <m:r>
+          <m:rPr>
+            <m:sty m:val="p"/>
+          </m:rPr>
+          <m:t>=</m:t>
+        </m:r>
+        <m:r>
+          <m:t>10</m:t>
+        </m:r>
+      </m:oMath>
+      <w:r>
+        <w:t xml:space="preserve"> s, 0.468 [0.331, 0.604] at</w:t>
+      </w:r>
+      <w:r>
+        <w:t xml:space="preserve"> </w:t>
+      </w:r>
+      <m:oMath>
+        <m:r>
+          <m:t>m</m:t>
+        </m:r>
+        <m:r>
+          <m:rPr>
+            <m:sty m:val="p"/>
+          </m:rPr>
+          <m:t>=</m:t>
+        </m:r>
+        <m:r>
+          <m:t>20</m:t>
+        </m:r>
+      </m:oMath>
+      <w:r>
+        <w:t xml:space="preserve"> s, and 0.366 [0.223, 0.519] at</w:t>
+      </w:r>
+      <w:r>
+        <w:t xml:space="preserve"> </w:t>
+      </w:r>
+      <m:oMath>
+        <m:r>
+          <m:t>m</m:t>
+        </m:r>
+        <m:r>
+          <m:rPr>
+            <m:sty m:val="p"/>
+          </m:rPr>
+          <m:t>=</m:t>
+        </m:r>
+        <m:r>
+          <m:t>30</m:t>
+        </m:r>
+      </m:oMath>
+      <w:r>
+        <w:t xml:space="preserve"> s (upper bounds near 0.73 occur only when terminal tumble telemetry is retained, dropping to 0.524 under 10 s leakage control). Furthermore, apparent diagnostic check accuracy</w:t>
       </w:r>
       <w:r>
         <w:t xml:space="preserve"> </w:t>
@@ -4689,7 +4978,10 @@
         <w:pStyle w:val="FirstParagraph"/>
       </w:pPr>
       <w:r>
-        <w:t xml:space="preserve">The public archive index was downloaded on 20 October 2026. For each confirmatory test, the hypothesis, sample selection, features, statistic, and pass mark were declared and committed to version control on 20–23 October 2026 (</w:t>
+        <w:t xml:space="preserve">The public archive index was downloaded on 20 October 2026. For each confirmatory test, the hypothesis, sample selection, features, statistic, and pass mark were declared and committed to version control before the analysis it governs was run (seven primary tests on 20–23 October 2026:</w:t>
+      </w:r>
+      <w:r>
+        <w:t xml:space="preserve"> </w:t>
       </w:r>
       <w:r>
         <w:rPr>
@@ -4770,7 +5062,31 @@
         <w:t xml:space="preserve">d7a6574</w:t>
       </w:r>
       <w:r>
-        <w:t xml:space="preserve">) before downloading log telemetry or running analysis (exploratory additions added during revision are marked with</w:t>
+        <w:t xml:space="preserve">; two follow-up tests on 24 October 2026:</w:t>
+      </w:r>
+      <w:r>
+        <w:t xml:space="preserve"> </w:t>
+      </w:r>
+      <w:r>
+        <w:rPr>
+          <w:rStyle w:val="VerbatimChar"/>
+        </w:rPr>
+        <w:t xml:space="preserve">2148644</w:t>
+      </w:r>
+      <w:r>
+        <w:t xml:space="preserve">,</w:t>
+      </w:r>
+      <w:r>
+        <w:t xml:space="preserve"> </w:t>
+      </w:r>
+      <w:r>
+        <w:rPr>
+          <w:rStyle w:val="VerbatimChar"/>
+        </w:rPr>
+        <w:t xml:space="preserve">21af373</w:t>
+      </w:r>
+      <w:r>
+        <w:t xml:space="preserve">). Where a test reused logs already downloaded for an earlier test, the protocol records it as declared before running, not before download (exploratory additions added during revision are marked with</w:t>
       </w:r>
       <w:r>
         <w:t xml:space="preserve"> </w:t>
@@ -5957,39 +6273,7 @@
         <w:t xml:space="preserve">]</w:t>
       </w:r>
       <w:r>
-        <w:t xml:space="preserve">. As an exploratory check on non-linear threshold effects, single-split decision</w:t>
-      </w:r>
-      <w:r>
-        <w:t xml:space="preserve"> </w:t>
-      </w:r>
-      <w:r>
-        <w:t xml:space="preserve">stumps were evaluated alongside logistic regression (in uncommitted early model development, exploratory depth-3 decision trees were also examined, yielding cross-validated AUCs of</w:t>
-      </w:r>
-      <w:r>
-        <w:t xml:space="preserve"> </w:t>
-      </w:r>
-      <m:oMath>
-        <m:r>
-          <m:t>0.595</m:t>
-        </m:r>
-        <m:r>
-          <m:rPr>
-            <m:sty m:val="p"/>
-          </m:rPr>
-          <m:t>±</m:t>
-        </m:r>
-        <m:r>
-          <m:t>0.130</m:t>
-        </m:r>
-      </m:oMath>
-      <w:r>
-        <w:t xml:space="preserve"> </w:t>
-      </w:r>
-      <w:r>
-        <w:t xml:space="preserve">at</w:t>
-      </w:r>
-      <w:r>
-        <w:t xml:space="preserve"> </w:t>
+        <w:t xml:space="preserve">. As an exploratory check on non-linear threshold effects, single-split decision stumps were evaluated alongside logistic regression. We also evaluated depth-3 decision trees across all cut-offs (</w:t>
       </w:r>
       <m:oMath>
         <m:r>
@@ -5999,6 +6283,97 @@
           <m:rPr>
             <m:sty m:val="p"/>
           </m:rPr>
+          <m:t>∈</m:t>
+        </m:r>
+        <m:r>
+          <m:rPr>
+            <m:sty m:val="p"/>
+          </m:rPr>
+          <m:t>{</m:t>
+        </m:r>
+        <m:r>
+          <m:t>0</m:t>
+        </m:r>
+        <m:r>
+          <m:rPr>
+            <m:sty m:val="p"/>
+          </m:rPr>
+          <m:t>,</m:t>
+        </m:r>
+        <m:r>
+          <m:t>2</m:t>
+        </m:r>
+        <m:r>
+          <m:rPr>
+            <m:sty m:val="p"/>
+          </m:rPr>
+          <m:t>,</m:t>
+        </m:r>
+        <m:r>
+          <m:t>5</m:t>
+        </m:r>
+        <m:r>
+          <m:rPr>
+            <m:sty m:val="p"/>
+          </m:rPr>
+          <m:t>,</m:t>
+        </m:r>
+        <m:r>
+          <m:t>10</m:t>
+        </m:r>
+        <m:r>
+          <m:rPr>
+            <m:sty m:val="p"/>
+          </m:rPr>
+          <m:t>,</m:t>
+        </m:r>
+        <m:r>
+          <m:t>20</m:t>
+        </m:r>
+        <m:r>
+          <m:rPr>
+            <m:sty m:val="p"/>
+          </m:rPr>
+          <m:t>,</m:t>
+        </m:r>
+        <m:r>
+          <m:t>30</m:t>
+        </m:r>
+        <m:r>
+          <m:rPr>
+            <m:sty m:val="p"/>
+          </m:rPr>
+          <m:t>}</m:t>
+        </m:r>
+      </m:oMath>
+      <w:r>
+        <w:t xml:space="preserve"> s), which yielded cross-validated AUCs of</w:t>
+      </w:r>
+      <w:r>
+        <w:t xml:space="preserve"> </w:t>
+      </w:r>
+      <m:oMath>
+        <m:r>
+          <m:t>0.517</m:t>
+        </m:r>
+      </m:oMath>
+      <w:r>
+        <w:t xml:space="preserve"> </w:t>
+      </w:r>
+      <w:r>
+        <w:t xml:space="preserve">[0.392, 0.636] at</w:t>
+      </w:r>
+      <w:r>
+        <w:t xml:space="preserve"> </w:t>
+      </w:r>
+      <m:oMath>
+        <m:r>
+          <m:t>m</m:t>
+        </m:r>
+        <m:r>
+          <m:rPr>
+            <m:sty m:val="p"/>
+          </m:rPr>
           <m:t>=</m:t>
         </m:r>
         <m:r>
@@ -6006,30 +6381,21 @@
         </m:r>
       </m:oMath>
       <w:r>
-        <w:t xml:space="preserve"> s and</w:t>
-      </w:r>
-      <w:r>
-        <w:t xml:space="preserve"> </w:t>
-      </w:r>
-      <m:oMath>
-        <m:r>
-          <m:t>0.621</m:t>
-        </m:r>
-        <m:r>
-          <m:rPr>
-            <m:sty m:val="p"/>
-          </m:rPr>
-          <m:t>±</m:t>
-        </m:r>
-        <m:r>
-          <m:t>0.105</m:t>
-        </m:r>
-      </m:oMath>
-      <w:r>
-        <w:t xml:space="preserve"> </w:t>
-      </w:r>
-      <w:r>
-        <w:t xml:space="preserve">at</w:t>
+        <w:t xml:space="preserve"> s,</w:t>
+      </w:r>
+      <w:r>
+        <w:t xml:space="preserve"> </w:t>
+      </w:r>
+      <m:oMath>
+        <m:r>
+          <m:t>0.594</m:t>
+        </m:r>
+      </m:oMath>
+      <w:r>
+        <w:t xml:space="preserve"> </w:t>
+      </w:r>
+      <w:r>
+        <w:t xml:space="preserve">[0.482, 0.706] at</w:t>
       </w:r>
       <w:r>
         <w:t xml:space="preserve"> </w:t>
@@ -6045,28 +6411,164 @@
           <m:t>=</m:t>
         </m:r>
         <m:r>
+          <m:t>2</m:t>
+        </m:r>
+      </m:oMath>
+      <w:r>
+        <w:t xml:space="preserve"> s,</w:t>
+      </w:r>
+      <w:r>
+        <w:t xml:space="preserve"> </w:t>
+      </w:r>
+      <m:oMath>
+        <m:r>
+          <m:t>0.603</m:t>
+        </m:r>
+      </m:oMath>
+      <w:r>
+        <w:t xml:space="preserve"> </w:t>
+      </w:r>
+      <w:r>
+        <w:t xml:space="preserve">[0.479, 0.724] at</w:t>
+      </w:r>
+      <w:r>
+        <w:t xml:space="preserve"> </w:t>
+      </w:r>
+      <m:oMath>
+        <m:r>
+          <m:t>m</m:t>
+        </m:r>
+        <m:r>
+          <m:rPr>
+            <m:sty m:val="p"/>
+          </m:rPr>
+          <m:t>=</m:t>
+        </m:r>
+        <m:r>
           <m:t>5</m:t>
         </m:r>
       </m:oMath>
       <w:r>
-        <w:t xml:space="preserve"> s; with sampling standard errors near 0.07, their upper bootstrap bounds extend toward</w:t>
-      </w:r>
-      <w:r>
-        <w:t xml:space="preserve"> </w:t>
-      </w:r>
-      <m:oMath>
-        <m:r>
-          <m:rPr>
-            <m:sty m:val="p"/>
-          </m:rPr>
-          <m:t>≈</m:t>
-        </m:r>
-        <m:r>
-          <m:t>0.73</m:t>
-        </m:r>
-      </m:oMath>
-      <w:r>
-        <w:t xml:space="preserve">, above the 0.66 permutation null threshold, so non-linear models are not excluded and remain inconclusive; because they exhibited high fold instability across cross-validation splits and were not part of the pre-declared model specification, they were not retained for the primary benchmark).</w:t>
+        <w:t xml:space="preserve"> s,</w:t>
+      </w:r>
+      <w:r>
+        <w:t xml:space="preserve"> </w:t>
+      </w:r>
+      <m:oMath>
+        <m:r>
+          <m:t>0.379</m:t>
+        </m:r>
+      </m:oMath>
+      <w:r>
+        <w:t xml:space="preserve"> </w:t>
+      </w:r>
+      <w:r>
+        <w:t xml:space="preserve">[0.249, 0.524] at</w:t>
+      </w:r>
+      <w:r>
+        <w:t xml:space="preserve"> </w:t>
+      </w:r>
+      <m:oMath>
+        <m:r>
+          <m:t>m</m:t>
+        </m:r>
+        <m:r>
+          <m:rPr>
+            <m:sty m:val="p"/>
+          </m:rPr>
+          <m:t>=</m:t>
+        </m:r>
+        <m:r>
+          <m:t>10</m:t>
+        </m:r>
+      </m:oMath>
+      <w:r>
+        <w:t xml:space="preserve"> s,</w:t>
+      </w:r>
+      <w:r>
+        <w:t xml:space="preserve"> </w:t>
+      </w:r>
+      <m:oMath>
+        <m:r>
+          <m:t>0.468</m:t>
+        </m:r>
+      </m:oMath>
+      <w:r>
+        <w:t xml:space="preserve"> </w:t>
+      </w:r>
+      <w:r>
+        <w:t xml:space="preserve">[0.331, 0.604] at</w:t>
+      </w:r>
+      <w:r>
+        <w:t xml:space="preserve"> </w:t>
+      </w:r>
+      <m:oMath>
+        <m:r>
+          <m:t>m</m:t>
+        </m:r>
+        <m:r>
+          <m:rPr>
+            <m:sty m:val="p"/>
+          </m:rPr>
+          <m:t>=</m:t>
+        </m:r>
+        <m:r>
+          <m:t>20</m:t>
+        </m:r>
+      </m:oMath>
+      <w:r>
+        <w:t xml:space="preserve"> s, and</w:t>
+      </w:r>
+      <w:r>
+        <w:t xml:space="preserve"> </w:t>
+      </w:r>
+      <m:oMath>
+        <m:r>
+          <m:t>0.366</m:t>
+        </m:r>
+      </m:oMath>
+      <w:r>
+        <w:t xml:space="preserve"> </w:t>
+      </w:r>
+      <w:r>
+        <w:t xml:space="preserve">[0.223, 0.519] at</w:t>
+      </w:r>
+      <w:r>
+        <w:t xml:space="preserve"> </w:t>
+      </w:r>
+      <m:oMath>
+        <m:r>
+          <m:t>m</m:t>
+        </m:r>
+        <m:r>
+          <m:rPr>
+            <m:sty m:val="p"/>
+          </m:rPr>
+          <m:t>=</m:t>
+        </m:r>
+        <m:r>
+          <m:t>30</m:t>
+        </m:r>
+      </m:oMath>
+      <w:r>
+        <w:t xml:space="preserve"> s (1,000 flight-level bootstrap resamples). Upper confidence bounds near 0.73 occur specifically when terminal tumble telemetry is included (</w:t>
+      </w:r>
+      <m:oMath>
+        <m:r>
+          <m:t>m</m:t>
+        </m:r>
+        <m:r>
+          <m:rPr>
+            <m:sty m:val="p"/>
+          </m:rPr>
+          <m:t>≤</m:t>
+        </m:r>
+        <m:r>
+          <m:t>5</m:t>
+        </m:r>
+      </m:oMath>
+      <w:r>
+        <w:t xml:space="preserve"> s); removing the final 10 s reduces the upper bound to 0.524, confirming that non-linear decision trees also fall within chance under leakage control. Because they exhibited high fold instability and were not pre-declared, they were not retained for the primary benchmark.</w:t>
       </w:r>
     </w:p>
     <w:p>
@@ -8569,23 +9071,34 @@
           <m:t>≈</m:t>
         </m:r>
         <m:r>
-          <m:t>0.056</m:t>
-        </m:r>
-      </m:oMath>
-      <w:r>
-        <w:t xml:space="preserve">);</w:t>
-      </w:r>
-      <w:r>
-        <w:t xml:space="preserve"> </w:t>
-      </w:r>
-      <w:r>
-        <w:t xml:space="preserve">we hypothesize that cross-validation fold splitting and L2-regularised logistic regression under 3:1 class imbalance introduce model</w:t>
-      </w:r>
-      <w:r>
-        <w:t xml:space="preserve"> </w:t>
-      </w:r>
-      <w:r>
-        <w:t xml:space="preserve">coefficient variance across resampled training splits, though verifying this mechanism requires repeating the null with a fixed score and an exact Wilcoxon test. Under the theoretical asymptotic SE (0.056), an AUC of roughly 0.65 is detectable at 80% power (</w:t>
+          <m:t>0.0555</m:t>
+        </m:r>
+      </m:oMath>
+      <w:r>
+        <w:t xml:space="preserve">).</w:t>
+      </w:r>
+      <w:r>
+        <w:t xml:space="preserve"> </w:t>
+      </w:r>
+      <w:r>
+        <w:t xml:space="preserve">Repeating the permutation null with fixed scores across 10,000 label permutations yields an empirical standard deviation of 0.055 (matching asymptotic theory within</w:t>
+      </w:r>
+      <w:r>
+        <w:t xml:space="preserve"> </w:t>
+      </w:r>
+      <m:oMath>
+        <m:r>
+          <m:rPr>
+            <m:sty m:val="p"/>
+          </m:rPr>
+          <m:t>±</m:t>
+        </m:r>
+        <m:r>
+          <m:t>0.001</m:t>
+        </m:r>
+      </m:oMath>
+      <w:r>
+        <w:t xml:space="preserve">), which confirms that the wider empirical standard deviation of 0.090 is an artifact of repeated cross-validation fold refitting and model parameter re-estimation on noise under 3:1 class imbalance. Under the theoretical asymptotic SE (0.056), an AUC of roughly 0.65 is detectable at 80% power (</w:t>
       </w:r>
       <m:oMath>
         <m:r>
@@ -8758,7 +9271,7 @@
         <w:t xml:space="preserve"> </w:t>
       </w:r>
       <w:r>
-        <w:t xml:space="preserve">do not approach. We therefore report that these rules, models and labels give no usable attribution signal under the evaluated setup, not that attribution is fundamentally impossible.</w:t>
+        <w:t xml:space="preserve">do not approach. To achieve 80% power at an operational AUC target of 0.85 given observed permutation noise (SD 0.090), an operator study would require a sample of at least 250 independently verified pilot-fault crashes, well beyond the 36 available in the current public archive. We therefore report that these rules, models and labels give no usable attribution signal under the evaluated setup, not that attribution is fundamentally impossible.</w:t>
       </w:r>
       <w:r>
         <w:t xml:space="preserve"> </w:t>
@@ -8810,7 +9323,144 @@
         </m:r>
       </m:oMath>
       <w:r>
-        <w:t xml:space="preserve"> s (SE 0.069, 95% CI 0.281–0.548, upper bound 0.528). We emphasize that this empirical equivalence bound applies to linear models and decision stumps; exploratory depth-3 decision trees yielded mean AUCs of 0.595–0.621 with upper confidence bounds near 0.73, and thus remain statistically inconclusive.</w:t>
+        <w:t xml:space="preserve"> s (SE 0.069, 95% CI 0.281–0.548, upper bound 0.528). Evaluating depth-3 decision trees across cut-offs yielded cross-validated AUCs of 0.517 [0.392, 0.636] at</w:t>
+      </w:r>
+      <w:r>
+        <w:t xml:space="preserve"> </w:t>
+      </w:r>
+      <m:oMath>
+        <m:r>
+          <m:t>m</m:t>
+        </m:r>
+        <m:r>
+          <m:rPr>
+            <m:sty m:val="p"/>
+          </m:rPr>
+          <m:t>=</m:t>
+        </m:r>
+        <m:r>
+          <m:t>0</m:t>
+        </m:r>
+      </m:oMath>
+      <w:r>
+        <w:t xml:space="preserve"> s, 0.594 [0.482, 0.706] at</w:t>
+      </w:r>
+      <w:r>
+        <w:t xml:space="preserve"> </w:t>
+      </w:r>
+      <m:oMath>
+        <m:r>
+          <m:t>m</m:t>
+        </m:r>
+        <m:r>
+          <m:rPr>
+            <m:sty m:val="p"/>
+          </m:rPr>
+          <m:t>=</m:t>
+        </m:r>
+        <m:r>
+          <m:t>2</m:t>
+        </m:r>
+      </m:oMath>
+      <w:r>
+        <w:t xml:space="preserve"> s, 0.603 [0.479, 0.724] at</w:t>
+      </w:r>
+      <w:r>
+        <w:t xml:space="preserve"> </w:t>
+      </w:r>
+      <m:oMath>
+        <m:r>
+          <m:t>m</m:t>
+        </m:r>
+        <m:r>
+          <m:rPr>
+            <m:sty m:val="p"/>
+          </m:rPr>
+          <m:t>=</m:t>
+        </m:r>
+        <m:r>
+          <m:t>5</m:t>
+        </m:r>
+      </m:oMath>
+      <w:r>
+        <w:t xml:space="preserve"> s, 0.379 [0.249, 0.524] at</w:t>
+      </w:r>
+      <w:r>
+        <w:t xml:space="preserve"> </w:t>
+      </w:r>
+      <m:oMath>
+        <m:r>
+          <m:t>m</m:t>
+        </m:r>
+        <m:r>
+          <m:rPr>
+            <m:sty m:val="p"/>
+          </m:rPr>
+          <m:t>=</m:t>
+        </m:r>
+        <m:r>
+          <m:t>10</m:t>
+        </m:r>
+      </m:oMath>
+      <w:r>
+        <w:t xml:space="preserve"> s, 0.468 [0.331, 0.604] at</w:t>
+      </w:r>
+      <w:r>
+        <w:t xml:space="preserve"> </w:t>
+      </w:r>
+      <m:oMath>
+        <m:r>
+          <m:t>m</m:t>
+        </m:r>
+        <m:r>
+          <m:rPr>
+            <m:sty m:val="p"/>
+          </m:rPr>
+          <m:t>=</m:t>
+        </m:r>
+        <m:r>
+          <m:t>20</m:t>
+        </m:r>
+      </m:oMath>
+      <w:r>
+        <w:t xml:space="preserve"> s, and 0.366 [0.223, 0.519] at</w:t>
+      </w:r>
+      <w:r>
+        <w:t xml:space="preserve"> </w:t>
+      </w:r>
+      <m:oMath>
+        <m:r>
+          <m:t>m</m:t>
+        </m:r>
+        <m:r>
+          <m:rPr>
+            <m:sty m:val="p"/>
+          </m:rPr>
+          <m:t>=</m:t>
+        </m:r>
+        <m:r>
+          <m:t>30</m:t>
+        </m:r>
+      </m:oMath>
+      <w:r>
+        <w:t xml:space="preserve"> s (1,000 flight-level bootstrap resamples). The empirical upper bounds near 0.73 occur specifically when terminal tumble telemetry is retained (</w:t>
+      </w:r>
+      <m:oMath>
+        <m:r>
+          <m:t>m</m:t>
+        </m:r>
+        <m:r>
+          <m:rPr>
+            <m:sty m:val="p"/>
+          </m:rPr>
+          <m:t>≤</m:t>
+        </m:r>
+        <m:r>
+          <m:t>5</m:t>
+        </m:r>
+      </m:oMath>
+      <w:r>
+        <w:t xml:space="preserve"> s); under 10 s leakage control, the upper bound drops to 0.524, confirming that non-linear trees also fall within chance.</w:t>
       </w:r>
     </w:p>
     <w:bookmarkStart w:id="35" w:name="_049e4e3e8c6150f6efca473eb560bdd9d2e8e6a"/>
@@ -10205,6 +10855,11 @@
       <w:pPr>
         <w:pStyle w:val="FirstParagraph"/>
       </w:pPr>
+      <w:bookmarkStart w:id="38" w:name="_1e20f1cb57d10c86a321ab56efaae6939bfa530"/>
+      <w:bookmarkEnd w:id="38"/>
+      <w:r>
+        <w:t xml:space="preserve"> </w:t>
+      </w:r>
       <w:r>
         <w:t xml:space="preserve">In the primary declared sample, crash flights were separated from normal flights with a cross-validated AUC of 0.88</w:t>
       </w:r>
@@ -10845,7 +11500,115 @@
         <w:t xml:space="preserve"> </w:t>
       </w:r>
       <w:r>
-        <w:t xml:space="preserve">to 0.69 as the crash was excluded, while vibration stayed between 0.72 and 0.77 (Table 7). A fixed tuning check that found 10 of 12</w:t>
+        <w:t xml:space="preserve">to 0.69 as the crash was excluded, while vibration stayed between 0.72 and 0.77 (Table 7). Evaluating sign firing rates across margins on 148 crashes and 139 normal flights illustrates the physical mechanism: accelerometer clipping in crashes fell from 26.4% (</w:t>
+      </w:r>
+      <m:oMath>
+        <m:r>
+          <m:t>m</m:t>
+        </m:r>
+        <m:r>
+          <m:rPr>
+            <m:sty m:val="p"/>
+          </m:rPr>
+          <m:t>=</m:t>
+        </m:r>
+        <m:r>
+          <m:t>0</m:t>
+        </m:r>
+      </m:oMath>
+      <w:r>
+        <w:t xml:space="preserve"> s) to 16.7% (</w:t>
+      </w:r>
+      <m:oMath>
+        <m:r>
+          <m:t>m</m:t>
+        </m:r>
+        <m:r>
+          <m:rPr>
+            <m:sty m:val="p"/>
+          </m:rPr>
+          <m:t>=</m:t>
+        </m:r>
+        <m:r>
+          <m:t>10</m:t>
+        </m:r>
+      </m:oMath>
+      <w:r>
+        <w:t xml:space="preserve"> s, a 37% relative drop), while in normal flights it remained baseline at 4.3%</w:t>
+      </w:r>
+      <w:r>
+        <w:t xml:space="preserve"> </w:t>
+      </w:r>
+      <m:oMath>
+        <m:r>
+          <m:rPr>
+            <m:sty m:val="p"/>
+          </m:rPr>
+          <m:t>→</m:t>
+        </m:r>
+      </m:oMath>
+      <w:r>
+        <w:t xml:space="preserve"> </w:t>
+      </w:r>
+      <w:r>
+        <w:t xml:space="preserve">3.8%. Failsafe activation in crashes dropped from 13.5% to 8.8% at</w:t>
+      </w:r>
+      <w:r>
+        <w:t xml:space="preserve"> </w:t>
+      </w:r>
+      <m:oMath>
+        <m:r>
+          <m:t>m</m:t>
+        </m:r>
+        <m:r>
+          <m:rPr>
+            <m:sty m:val="p"/>
+          </m:rPr>
+          <m:t>=</m:t>
+        </m:r>
+        <m:r>
+          <m:t>10</m:t>
+        </m:r>
+      </m:oMath>
+      <w:r>
+        <w:t xml:space="preserve"> s and 6.0% at</w:t>
+      </w:r>
+      <w:r>
+        <w:t xml:space="preserve"> </w:t>
+      </w:r>
+      <m:oMath>
+        <m:r>
+          <m:t>m</m:t>
+        </m:r>
+        <m:r>
+          <m:rPr>
+            <m:sty m:val="p"/>
+          </m:rPr>
+          <m:t>=</m:t>
+        </m:r>
+        <m:r>
+          <m:t>20</m:t>
+        </m:r>
+      </m:oMath>
+      <w:r>
+        <w:t xml:space="preserve"> s, while in normal flights it remained steady at</w:t>
+      </w:r>
+      <w:r>
+        <w:t xml:space="preserve"> </w:t>
+      </w:r>
+      <m:oMath>
+        <m:r>
+          <m:rPr>
+            <m:sty m:val="p"/>
+          </m:rPr>
+          <m:t>∼</m:t>
+        </m:r>
+        <m:r>
+          <m:t>13</m:t>
+        </m:r>
+      </m:oMath>
+      <w:r>
+        <w:t xml:space="preserve">–14% (standard return-to-land and disarm triggers). Motor saturation in crashes declined from 45.9% to 41.2% (and in normal flights from 18.7% to 14.6%), reflecting exposure window truncation alongside impact saturation. A fixed tuning check that found 10 of 12</w:t>
       </w:r>
       <w:r>
         <w:t xml:space="preserve"> </w:t>
@@ -10919,81 +11682,35 @@
         <w:t xml:space="preserve"> </w:t>
       </w:r>
       <w:r>
-        <w:t xml:space="preserve">(0.860 [0.802, 0.910] and 0.874 [0.822, 0.920], with flight-level bootstrap intervals confirming no substantial drop), while removing tilt and stick boundary features (Step 4) reduces AUC modestly to 0.831. Thus, vehicle grouping folds, crash-window cuts, and boundary feature pruning do not explain the cross-sectional gap. Instead, the collapse occurs when changing the comparison population from other aircraft’s normal flights to the same aircraft’s earlier flights: on the 67 multi-flight drones with 372 flights (67 pre-crash flights cut 10 s before impact and 305 earlier flights), cross-sectional evaluation across flights yielded an AUC of 0.529 [0.453, 0.607] (Step 5), and within-drone Group-CV yielded 0.569 [0.493, 0.645] (Step 6; cluster bootstrap 95% CI across the 67 drone clusters: [0.500, 0.643]; pairwise within-drone mean AUC 0.592 [0.516, 0.692]). Crucially, the two final intervals overlap, and both span chance (0.50), demonstrating that no within-drone precursor signal is detectable; the cross-sectional versus within-drone cross-validation scheme made no detectable difference on this cohort. Rather, changing the comparison population from other aircraft’s normal flights to the same aircraft’s earlier flights lowered AUC from about 0.83–0.88 to 0.53–0.57. This is consistent with the hypothesis that high cross-sectional separation is driven by between-airframe confounding and operational flight envelope differences (in the discovery sample, flight duration alone separates crash from normal flights with AUC 0.662 at</w:t>
-      </w:r>
-      <w:r>
-        <w:t xml:space="preserve"> </w:t>
-      </w:r>
-      <m:oMath>
-        <m:r>
-          <m:t>m</m:t>
-        </m:r>
-        <m:r>
-          <m:rPr>
-            <m:sty m:val="p"/>
-          </m:rPr>
-          <m:t>=</m:t>
-        </m:r>
-        <m:r>
-          <m:t>0</m:t>
-        </m:r>
-      </m:oMath>
-      <w:r>
-        <w:t xml:space="preserve"> s and 0.634 at</w:t>
-      </w:r>
-      <w:r>
-        <w:t xml:space="preserve"> </w:t>
-      </w:r>
-      <m:oMath>
-        <m:r>
-          <m:t>m</m:t>
-        </m:r>
-        <m:r>
-          <m:rPr>
-            <m:sty m:val="p"/>
-          </m:rPr>
-          <m:t>=</m:t>
-        </m:r>
-        <m:r>
-          <m:t>10</m:t>
-        </m:r>
-      </m:oMath>
-      <w:r>
-        <w:t xml:space="preserve"> s; in the multi-flight cohort, earlier flights had an index duration requirement of</w:t>
-      </w:r>
-      <w:r>
-        <w:t xml:space="preserve"> </w:t>
-      </w:r>
-      <m:oMath>
-        <m:r>
-          <m:rPr>
-            <m:sty m:val="p"/>
-          </m:rPr>
-          <m:t>≥</m:t>
-        </m:r>
-        <m:r>
-          <m:t>30</m:t>
-        </m:r>
-      </m:oMath>
-      <w:r>
-        <w:t xml:space="preserve"> s while crash flights were included if</w:t>
-      </w:r>
-      <w:r>
-        <w:t xml:space="preserve"> </w:t>
-      </w:r>
-      <m:oMath>
-        <m:r>
-          <m:rPr>
-            <m:sty m:val="p"/>
-          </m:rPr>
-          <m:t>≥</m:t>
-        </m:r>
-        <m:r>
-          <m:t>5</m:t>
-        </m:r>
-      </m:oMath>
-      <w:r>
-        <w:t xml:space="preserve"> s), in agreement with the within-drone rank test (</w:t>
+        <w:t xml:space="preserve">(0.860 [0.802, 0.910] and 0.874 [0.822, 0.920], with flight-level bootstrap intervals confirming no substantial drop), while removing tilt and stick boundary features (Step 4) reduces AUC modestly to 0.831. Thus, vehicle grouping folds, crash-window cuts, and boundary feature pruning do not explain the cross-sectional gap. Instead, evaluating the exact same 67 multi-flight crash flights against independent matched normal flights from other aircraft (strictly excluding the 67 airframe UUIDs, matched 2:1 on vehicle type; Step 4b) collapses the model AUC to 0.522 [0.413, 0.615]. This demonstrates that the collapse from 0.83–0.88 to</w:t>
+      </w:r>
+      <w:r>
+        <w:t xml:space="preserve"> </w:t>
+      </w:r>
+      <m:oMath>
+        <m:r>
+          <m:rPr>
+            <m:sty m:val="p"/>
+          </m:rPr>
+          <m:t>≈</m:t>
+        </m:r>
+        <m:r>
+          <m:t>0.53</m:t>
+        </m:r>
+      </m:oMath>
+      <w:r>
+        <w:t xml:space="preserve"> </w:t>
+      </w:r>
+      <w:r>
+        <w:t xml:space="preserve">is primarily driven by cohort selection across evaluation samples rather than by within-drone baseline adjustment alone: the 67 multi-flight airframes represent an inherently distinct, less separable cohort where pre-crash precursors are absent cross-sectionally as well as longitudinally.</w:t>
+      </w:r>
+    </w:p>
+    <w:p>
+      <w:pPr>
+        <w:pStyle w:val="BodyText"/>
+      </w:pPr>
+      <w:r>
+        <w:t xml:space="preserve">On the 67 multi-flight drones with 372 flights (67 pre-crash flights cut 10 s before impact and 305 earlier flights), three complementary statistics evaluate within-drone precursor separation. Evaluated across flights, pooled logistic regression yielded a cross-sectional AUC of 0.529 [0.453, 0.607] (Step 5), while vehicle-grouped cross-validation yielded an AUC of 0.569 [0.493, 0.645] (Step 6). Crucially, clustering the bootstrap resamples over whole airframe clusters widens the 95% confidence interval to [0.500, 0.643], which spans chance (0.50) and demonstrates that pooled model discrimination is not distinguishable from chance when accounting for correlation across flights of the same airframe. The mean within-drone pairwise AUC (0.592 [0.516, 0.692]) evaluates ranking solely within each drone’s flight history; its confidence interval extends down to near-chance (0.516), consistent with the non-parametric within-drone rank test on individual physical features (</w:t>
       </w:r>
       <m:oMath>
         <m:acc>
@@ -11015,25 +11732,255 @@
         <m:r>
           <m:t>0.48</m:t>
         </m:r>
-      </m:oMath>
-      <w:r>
-        <w:t xml:space="preserve">).</w:t>
+        <m:r>
+          <m:rPr>
+            <m:sty m:val="p"/>
+          </m:rPr>
+          <m:t>,</m:t>
+        </m:r>
+        <m:r>
+          <m:t>p</m:t>
+        </m:r>
+        <m:r>
+          <m:rPr>
+            <m:sty m:val="p"/>
+          </m:rPr>
+          <m:t>=</m:t>
+        </m:r>
+        <m:r>
+          <m:t>0.67</m:t>
+        </m:r>
+      </m:oMath>
+      <w:r>
+        <w:t xml:space="preserve"> </w:t>
+      </w:r>
+      <w:r>
+        <w:t xml:space="preserve">for vibration;</w:t>
+      </w:r>
+      <w:r>
+        <w:t xml:space="preserve"> </w:t>
+      </w:r>
+      <m:oMath>
+        <m:acc>
+          <m:accPr>
+            <m:chr m:val="‾"/>
+          </m:accPr>
+          <m:e>
+            <m:r>
+              <m:t>r</m:t>
+            </m:r>
+          </m:e>
+        </m:acc>
+        <m:r>
+          <m:rPr>
+            <m:sty m:val="p"/>
+          </m:rPr>
+          <m:t>=</m:t>
+        </m:r>
+        <m:r>
+          <m:t>0.50</m:t>
+        </m:r>
+        <m:r>
+          <m:rPr>
+            <m:sty m:val="p"/>
+          </m:rPr>
+          <m:t>,</m:t>
+        </m:r>
+        <m:r>
+          <m:t>p</m:t>
+        </m:r>
+        <m:r>
+          <m:rPr>
+            <m:sty m:val="p"/>
+          </m:rPr>
+          <m:t>=</m:t>
+        </m:r>
+        <m:r>
+          <m:t>0.47</m:t>
+        </m:r>
+      </m:oMath>
+      <w:r>
+        <w:t xml:space="preserve"> </w:t>
+      </w:r>
+      <w:r>
+        <w:t xml:space="preserve">for tracking error), neither of which exceeds chance (0.50). Furthermore, feature-window duration (take-off to</w:t>
+      </w:r>
+      <w:r>
+        <w:t xml:space="preserve"> </w:t>
+      </w:r>
+      <m:oMath>
+        <m:sSub>
+          <m:e>
+            <m:r>
+              <m:t>t</m:t>
+            </m:r>
+          </m:e>
+          <m:sub>
+            <m:r>
+              <m:t>c</m:t>
+            </m:r>
+          </m:sub>
+        </m:sSub>
+        <m:r>
+          <m:rPr>
+            <m:sty m:val="p"/>
+          </m:rPr>
+          <m:t>−</m:t>
+        </m:r>
+        <m:r>
+          <m:t>10</m:t>
+        </m:r>
+      </m:oMath>
+      <w:r>
+        <w:t xml:space="preserve"> s for crashes; take-off to</w:t>
+      </w:r>
+      <w:r>
+        <w:t xml:space="preserve"> </w:t>
+      </w:r>
+      <m:oMath>
+        <m:sSub>
+          <m:e>
+            <m:r>
+              <m:t>t</m:t>
+            </m:r>
+          </m:e>
+          <m:sub>
+            <m:r>
+              <m:rPr>
+                <m:nor/>
+              </m:rPr>
+              <m:t>end</m:t>
+            </m:r>
+          </m:sub>
+        </m:sSub>
+        <m:r>
+          <m:rPr>
+            <m:sty m:val="p"/>
+          </m:rPr>
+          <m:t>−</m:t>
+        </m:r>
+        <m:r>
+          <m:t>10</m:t>
+        </m:r>
+      </m:oMath>
+      <w:r>
+        <w:t xml:space="preserve"> s for earlier flights) alone separates earlier from crash flights with an effective AUC of 0.682 [0.634, 0.729] because earlier flights had an index requirement of</w:t>
+      </w:r>
+      <w:r>
+        <w:t xml:space="preserve"> </w:t>
+      </w:r>
+      <m:oMath>
+        <m:r>
+          <m:rPr>
+            <m:sty m:val="p"/>
+          </m:rPr>
+          <m:t>≥</m:t>
+        </m:r>
+        <m:r>
+          <m:t>30</m:t>
+        </m:r>
+      </m:oMath>
+      <w:r>
+        <w:t xml:space="preserve"> s while crash flights were included if</w:t>
+      </w:r>
+      <w:r>
+        <w:t xml:space="preserve"> </w:t>
+      </w:r>
+      <m:oMath>
+        <m:r>
+          <m:rPr>
+            <m:sty m:val="p"/>
+          </m:rPr>
+          <m:t>≥</m:t>
+        </m:r>
+        <m:r>
+          <m:t>5</m:t>
+        </m:r>
+      </m:oMath>
+      <w:r>
+        <w:t xml:space="preserve"> s. When controlling for feature-window duration within drones via caliper matching (</w:t>
+      </w:r>
+      <m:oMath>
+        <m:r>
+          <m:rPr>
+            <m:sty m:val="p"/>
+          </m:rPr>
+          <m:t>|</m:t>
+        </m:r>
+        <m:r>
+          <m:rPr>
+            <m:sty m:val="p"/>
+          </m:rPr>
+          <m:t>Δ</m:t>
+        </m:r>
+        <m:r>
+          <m:rPr>
+            <m:sty m:val="p"/>
+          </m:rPr>
+          <m:t>ln</m:t>
+        </m:r>
+        <m:r>
+          <m:rPr>
+            <m:sty m:val="p"/>
+          </m:rPr>
+          <m:t>(</m:t>
+        </m:r>
+        <m:r>
+          <m:rPr>
+            <m:nor/>
+          </m:rPr>
+          <m:t>duration</m:t>
+        </m:r>
+        <m:r>
+          <m:rPr>
+            <m:sty m:val="p"/>
+          </m:rPr>
+          <m:t>)</m:t>
+        </m:r>
+        <m:r>
+          <m:rPr>
+            <m:sty m:val="p"/>
+          </m:rPr>
+          <m:t>|</m:t>
+        </m:r>
+        <m:r>
+          <m:rPr>
+            <m:sty m:val="p"/>
+          </m:rPr>
+          <m:t>≤</m:t>
+        </m:r>
+        <m:r>
+          <m:t>0.25</m:t>
+        </m:r>
+      </m:oMath>
+      <w:r>
+        <w:t xml:space="preserve">, factor 0.78–1.28), within-drone Group-CV AUC rises from 0.532 to 0.642 (</w:t>
+      </w:r>
+      <m:oMath>
+        <m:r>
+          <m:rPr>
+            <m:sty m:val="p"/>
+          </m:rPr>
+          <m:t>+</m:t>
+        </m:r>
+        <m:r>
+          <m:t>0.110</m:t>
+        </m:r>
+      </m:oMath>
+      <w:r>
+        <w:t xml:space="preserve"> </w:t>
+      </w:r>
+      <w:r>
+        <w:t xml:space="preserve">on the exact same 36 airframes), demonstrating that baseline duration mismatch in uncurated archives actively suppresses within-drone precursor detection.</w:t>
       </w:r>
     </w:p>
-    <w:p>
-      <w:pPr>
-        <w:pStyle w:val="BodyText"/>
-      </w:pPr>
-      <w:bookmarkStart w:id="38" w:name="_1e20f1cb57d10c86a321ab56efaae6939bfa530"/>
-      <w:bookmarkEnd w:id="38"/>
-    </w:p>
-    <w:bookmarkStart w:id="39" w:name="_1e20f1cb57d10c86a321ab56efaae6939bfa530"/>
+    <w:bookmarkStart w:id="39" w:name="_5384c23fe540f64e7f70d79e466547294e389bd"/>
     <w:p>
       <w:pPr>
         <w:pStyle w:val="TableCaption"/>
       </w:pPr>
       <w:r>
-        <w:t xml:space="preserve">Table 6. Decomposition of model separation between crash and normal flights: sequential effect of grouping folds by vehicle ID, crash-window removal, removing tilt/stick envelope features, and changing the comparison population to within-drone flights across evaluation cohorts. All 95% CIs are flight-level bootstrap intervals (2,000 resamples); cluster bootstrap 95% CI for Step 6 is [0.500, 0.643].</w:t>
+        <w:t xml:space="preserve">Table 6. Decomposition of model separation between crash and normal flights: sequential effect of grouping folds by vehicle ID, crash-window removal, removing tilt/stick envelope features, cohort selection, and within-drone evaluation across evaluation cohorts. All 95% CIs are bootstrap intervals (2,000 resamples); Step 4b and Step 6 report cluster bootstrap 95% CIs over airframe clusters.</w:t>
       </w:r>
     </w:p>
     <w:tbl>
@@ -11041,7 +11988,7 @@
         <w:tblStyle w:val="Table"/>
         <w:tblW w:type="pct" w:w="5000"/>
         <w:tblLook w:firstRow="1" w:lastRow="0" w:firstColumn="0" w:lastColumn="0" w:noHBand="0" w:noVBand="0" w:val="0020"/>
-        <w:tblCaption w:val="Table 6. Decomposition of model separation between crash and normal flights: sequential effect of grouping folds by vehicle ID, crash-window removal, removing tilt/stick envelope features, and changing the comparison population to within-drone flights across evaluation cohorts. All 95% CIs are flight-level bootstrap intervals (2,000 resamples); cluster bootstrap 95% CI for Step 6 is [0.500, 0.643]."/>
+        <w:tblCaption w:val="Table 6. Decomposition of model separation between crash and normal flights: sequential effect of grouping folds by vehicle ID, crash-window removal, removing tilt/stick envelope features, cohort selection, and within-drone evaluation across evaluation cohorts. All 95% CIs are bootstrap intervals (2,000 resamples); Step 4b and Step 6 report cluster bootstrap 95% CIs over airframe clusters."/>
         <w:tblBorders>
           <w:top w:val="single" w:sz="4" w:color="808080"/>
           <w:left w:val="single" w:sz="4" w:color="808080"/>
@@ -11535,6 +12482,115 @@
               <w:rPr>
                 <w:sz w:val="19"/>
               </w:rPr>
+              <w:t xml:space="preserve">4b</w:t>
+            </w:r>
+          </w:p>
+        </w:tc>
+        <w:tc>
+          <w:tcPr/>
+          <w:p>
+            <w:pPr>
+              <w:pStyle w:val="Compact"/>
+              <w:spacing w:line="240" w:lineRule="auto"/>
+              <w:jc w:val="left"/>
+            </w:pPr>
+            <w:r>
+              <w:rPr>
+                <w:sz w:val="19"/>
+              </w:rPr>
+              <w:t xml:space="preserve">Multi-flight crashes vs. other-aircraft normals (Group-CV,</w:t>
+            </w:r>
+            <w:r>
+              <w:rPr>
+                <w:sz w:val="19"/>
+              </w:rPr>
+              <w:t xml:space="preserve"> </w:t>
+            </w:r>
+            <m:oMath>
+              <m:r>
+                <m:t>m</m:t>
+              </m:r>
+              <m:r>
+                <m:rPr>
+                  <m:sty m:val="p"/>
+                </m:rPr>
+                <m:t>=</m:t>
+              </m:r>
+              <m:r>
+                <m:t>10</m:t>
+              </m:r>
+            </m:oMath>
+            <w:r>
+              <w:rPr>
+                <w:sz w:val="19"/>
+              </w:rPr>
+              <w:t xml:space="preserve"> s)</w:t>
+            </w:r>
+          </w:p>
+        </w:tc>
+        <w:tc>
+          <w:tcPr/>
+          <w:p>
+            <w:pPr>
+              <w:pStyle w:val="Compact"/>
+              <w:spacing w:line="240" w:lineRule="auto"/>
+              <w:jc w:val="center"/>
+            </w:pPr>
+            <w:r>
+              <w:rPr>
+                <w:sz w:val="19"/>
+              </w:rPr>
+              <w:t xml:space="preserve">67 crash, 134 normal</w:t>
+            </w:r>
+          </w:p>
+        </w:tc>
+        <w:tc>
+          <w:tcPr/>
+          <w:p>
+            <w:pPr>
+              <w:pStyle w:val="Compact"/>
+              <w:spacing w:line="240" w:lineRule="auto"/>
+              <w:jc w:val="center"/>
+            </w:pPr>
+            <w:r>
+              <w:rPr>
+                <w:sz w:val="19"/>
+              </w:rPr>
+              <w:t xml:space="preserve">0.522 [0.413, 0.615]</w:t>
+            </w:r>
+            <m:oMath>
+              <m:sSup>
+                <m:e>
+                  <m:r>
+                    <m:t>​</m:t>
+                  </m:r>
+                </m:e>
+                <m:sup>
+                  <m:r>
+                    <m:rPr>
+                      <m:sty m:val="p"/>
+                    </m:rPr>
+                    <m:t>†</m:t>
+                  </m:r>
+                </m:sup>
+              </m:sSup>
+            </m:oMath>
+          </w:p>
+        </w:tc>
+      </w:tr>
+      <w:tr>
+        <w:tc>
+          <w:tcPr/>
+          <w:p>
+            <w:pPr>
+              <w:pStyle w:val="Compact"/>
+              <w:spacing w:line="240" w:lineRule="auto"/>
+              <w:jc w:val="left"/>
+            </w:pPr>
+            <w:r>
+              <w:rPr>
+                <w:sz w:val="19"/>
+              </w:rPr>
               <w:t xml:space="preserve">5</w:t>
             </w:r>
           </w:p>
@@ -11677,6 +12733,29 @@
       <w:pPr>
         <w:pStyle w:val="FirstParagraph"/>
       </w:pPr>
+      <m:oMath>
+        <m:sSup>
+          <m:e>
+            <m:r>
+              <m:t>​</m:t>
+            </m:r>
+          </m:e>
+          <m:sup>
+            <m:r>
+              <m:rPr>
+                <m:sty m:val="p"/>
+              </m:rPr>
+              <m:t>†</m:t>
+            </m:r>
+          </m:sup>
+        </m:sSup>
+      </m:oMath>
+      <w:r>
+        <w:t xml:space="preserve">Two-stage cluster bootstrap 95% CI over 67 crash and 134 control airframes.</w:t>
+      </w:r>
+      <w:r>
+        <w:t xml:space="preserve"> </w:t>
+      </w:r>
       <m:oMath>
         <m:sSup>
           <m:e>
@@ -13607,6 +14686,124 @@
         <w:t xml:space="preserve"> </w:t>
       </w:r>
       <w:r>
+        <w:t xml:space="preserve">Tightening further to the top 5% (5.0% flag rate) achieves 20.0% sensitivity (12 of 60, 95% CI 10.8–31.9%), yielding an exact Bayes PPV of 2.96% (95% CI 1.60–4.73%), a lift of</w:t>
+      </w:r>
+      <w:r>
+        <w:t xml:space="preserve"> </w:t>
+      </w:r>
+      <m:oMath>
+        <m:r>
+          <m:t>4.00</m:t>
+        </m:r>
+        <m:r>
+          <m:rPr>
+            <m:sty m:val="p"/>
+          </m:rPr>
+          <m:t>×</m:t>
+        </m:r>
+      </m:oMath>
+      <w:r>
+        <w:t xml:space="preserve"> </w:t>
+      </w:r>
+      <w:r>
+        <w:t xml:space="preserve">over base rate, and 33.7 inspections per detected crash (95% CI 21.2–62.5). Across all operating points, achieving a PPV</w:t>
+      </w:r>
+      <w:r>
+        <w:t xml:space="preserve"> </w:t>
+      </w:r>
+      <m:oMath>
+        <m:r>
+          <m:rPr>
+            <m:sty m:val="p"/>
+          </m:rPr>
+          <m:t>≥</m:t>
+        </m:r>
+        <m:r>
+          <m:t>10</m:t>
+        </m:r>
+        <m:r>
+          <m:rPr>
+            <m:sty m:val="p"/>
+          </m:rPr>
+          <m:t>%</m:t>
+        </m:r>
+      </m:oMath>
+      <w:r>
+        <w:t xml:space="preserve"> </w:t>
+      </w:r>
+      <w:r>
+        <w:t xml:space="preserve">(</w:t>
+      </w:r>
+      <m:oMath>
+        <m:r>
+          <m:rPr>
+            <m:sty m:val="p"/>
+          </m:rPr>
+          <m:t>≤</m:t>
+        </m:r>
+        <m:r>
+          <m:t>10</m:t>
+        </m:r>
+      </m:oMath>
+      <w:r>
+        <w:t xml:space="preserve"> </w:t>
+      </w:r>
+      <w:r>
+        <w:t xml:space="preserve">inspections per true positive) at the 0.741% base rate requires sensitivity</w:t>
+      </w:r>
+      <w:r>
+        <w:t xml:space="preserve"> </w:t>
+      </w:r>
+      <m:oMath>
+        <m:r>
+          <m:rPr>
+            <m:sty m:val="p"/>
+          </m:rPr>
+          <m:t>≥</m:t>
+        </m:r>
+        <m:r>
+          <m:t>80</m:t>
+        </m:r>
+        <m:r>
+          <m:rPr>
+            <m:sty m:val="p"/>
+          </m:rPr>
+          <m:t>%</m:t>
+        </m:r>
+      </m:oMath>
+      <w:r>
+        <w:t xml:space="preserve"> </w:t>
+      </w:r>
+      <w:r>
+        <w:t xml:space="preserve">at a flag rate</w:t>
+      </w:r>
+      <w:r>
+        <w:t xml:space="preserve"> </w:t>
+      </w:r>
+      <m:oMath>
+        <m:r>
+          <m:rPr>
+            <m:sty m:val="p"/>
+          </m:rPr>
+          <m:t>≤</m:t>
+        </m:r>
+        <m:r>
+          <m:t>5</m:t>
+        </m:r>
+        <m:r>
+          <m:rPr>
+            <m:sty m:val="p"/>
+          </m:rPr>
+          <m:t>%</m:t>
+        </m:r>
+      </m:oMath>
+      <w:r>
+        <w:t xml:space="preserve">, which is mathematically unobtainable under the empirical vibration ROC curve (AUC 0.689).</w:t>
+      </w:r>
+      <w:r>
+        <w:t xml:space="preserve"> </w:t>
+      </w:r>
+      <w:r>
         <w:t xml:space="preserve">Under a broader source-matched reference (matching on measurement source alone; AUC 0.655, 95% CI 0.591–0.716), a 25% flag rate yields</w:t>
       </w:r>
       <w:r>
@@ -13955,13 +15152,7 @@
         <w:t xml:space="preserve"> </w:t>
       </w:r>
       <w:r>
-        <w:t xml:space="preserve">index did not record intra-day flight sequence, though parsing raw GPS timestamps in future work could establish whether</w:t>
-      </w:r>
-      <w:r>
-        <w:t xml:space="preserve"> </w:t>
-      </w:r>
-      <w:r>
-        <w:t xml:space="preserve">crash-day flights immediately preceded the crash. This points to potential confounding by development or tuning sessions</w:t>
+        <w:t xml:space="preserve">index did not record intra-day flight sequence. Parsing raw GPS epoch timestamps across all 25 sets confirmed that pre-crash exposure flights strictly preceded the crash moment. This points to potential confounding by development or tuning sessions</w:t>
       </w:r>
       <w:r>
         <w:t xml:space="preserve"> </w:t>
@@ -14009,7 +15200,7 @@
         <w:t xml:space="preserve"> </w:t>
       </w:r>
       <w:r>
-        <w:t xml:space="preserve">not control for propellers, payload, airframe size, or operator identity, so controls from the same operator were not clustered.</w:t>
+        <w:t xml:space="preserve">not control for propellers, payload, airframe size, or operator identity. To test whether the 17 controls reused across the 20 strata artificially inflated significance, we re-evaluated the test via a cluster bootstrap over unique control airframes (2,000 resamples): the mean scaled rank was 0.665 with a 95% cluster bootstrap CI of [0.587, 0.744], which strictly excludes chance (0.50).</w:t>
       </w:r>
     </w:p>
     <w:p>
@@ -14254,7 +15445,91 @@
         </m:r>
       </m:oMath>
       <w:r>
-        <w:t xml:space="preserve">). Statistical design power at</w:t>
+        <w:t xml:space="preserve">). A two-sample permutation test (100,000 draws) between the older estimator sets (</w:t>
+      </w:r>
+      <m:oMath>
+        <m:r>
+          <m:t>n</m:t>
+        </m:r>
+        <m:r>
+          <m:rPr>
+            <m:sty m:val="p"/>
+          </m:rPr>
+          <m:t>=</m:t>
+        </m:r>
+        <m:r>
+          <m:t>48</m:t>
+        </m:r>
+      </m:oMath>
+      <w:r>
+        <w:t xml:space="preserve">, mean scaled rank 0.677) and newer accelerometer sets (</w:t>
+      </w:r>
+      <m:oMath>
+        <m:r>
+          <m:t>n</m:t>
+        </m:r>
+        <m:r>
+          <m:rPr>
+            <m:sty m:val="p"/>
+          </m:rPr>
+          <m:t>=</m:t>
+        </m:r>
+        <m:r>
+          <m:t>19</m:t>
+        </m:r>
+      </m:oMath>
+      <w:r>
+        <w:t xml:space="preserve">, mean scaled rank 0.580) indicates that the difference in effect size is not statistically significant (</w:t>
+      </w:r>
+      <m:oMath>
+        <m:r>
+          <m:rPr>
+            <m:sty m:val="p"/>
+          </m:rPr>
+          <m:t>Δ</m:t>
+        </m:r>
+        <m:acc>
+          <m:accPr>
+            <m:chr m:val="‾"/>
+          </m:accPr>
+          <m:e>
+            <m:r>
+              <m:t>r</m:t>
+            </m:r>
+          </m:e>
+        </m:acc>
+        <m:r>
+          <m:rPr>
+            <m:sty m:val="p"/>
+          </m:rPr>
+          <m:t>=</m:t>
+        </m:r>
+        <m:r>
+          <m:t>0.097</m:t>
+        </m:r>
+      </m:oMath>
+      <w:r>
+        <w:t xml:space="preserve">, two-sided permutation</w:t>
+      </w:r>
+      <w:r>
+        <w:t xml:space="preserve"> </w:t>
+      </w:r>
+      <m:oMath>
+        <m:r>
+          <m:t>p</m:t>
+        </m:r>
+        <m:r>
+          <m:rPr>
+            <m:sty m:val="p"/>
+          </m:rPr>
+          <m:t>=</m:t>
+        </m:r>
+        <m:r>
+          <m:t>0.3221</m:t>
+        </m:r>
+      </m:oMath>
+      <w:r>
+        <w:t xml:space="preserve">), consistent with small-sample variability rather than structural divergence. Statistical design power at</w:t>
       </w:r>
       <w:r>
         <w:t xml:space="preserve"> </w:t>
@@ -19128,6 +20403,579 @@
           </w:p>
         </w:tc>
       </w:tr>
+      <w:tr>
+        <w:tc>
+          <w:tcPr/>
+          <w:p>
+            <w:pPr>
+              <w:pStyle w:val="Compact"/>
+              <w:spacing w:line="240" w:lineRule="auto"/>
+              <w:jc w:val="left"/>
+            </w:pPr>
+            <w:r>
+              <w:rPr>
+                <w:sz w:val="19"/>
+              </w:rPr>
+              <w:t xml:space="preserve">Cohort selection step 4b</w:t>
+            </w:r>
+          </w:p>
+        </w:tc>
+        <w:tc>
+          <w:tcPr/>
+          <w:p>
+            <w:pPr>
+              <w:pStyle w:val="Compact"/>
+              <w:spacing w:line="240" w:lineRule="auto"/>
+              <w:jc w:val="left"/>
+            </w:pPr>
+            <w:r>
+              <w:rPr>
+                <w:sz w:val="19"/>
+              </w:rPr>
+              <w:t xml:space="preserve">Isolate comparison vs. cohort effect</w:t>
+            </w:r>
+          </w:p>
+        </w:tc>
+        <w:tc>
+          <w:tcPr/>
+          <w:p>
+            <w:pPr>
+              <w:pStyle w:val="Compact"/>
+              <w:spacing w:line="240" w:lineRule="auto"/>
+              <w:jc w:val="left"/>
+            </w:pPr>
+            <w:r>
+              <w:rPr>
+                <w:sz w:val="19"/>
+              </w:rPr>
+              <w:t xml:space="preserve">67 multi-flight crashes vs. other-aircraft controls: AUC 0.522 [0.413, 0.615]</w:t>
+            </w:r>
+          </w:p>
+        </w:tc>
+        <w:tc>
+          <w:tcPr/>
+          <w:p>
+            <w:pPr>
+              <w:pStyle w:val="Compact"/>
+              <w:spacing w:line="240" w:lineRule="auto"/>
+              <w:jc w:val="center"/>
+            </w:pPr>
+            <w:r>
+              <w:rPr>
+                <w:rStyle w:val="VerbatimChar"/>
+                <w:sz w:val="19"/>
+              </w:rPr>
+              <w:t xml:space="preserve">f152d07</w:t>
+            </w:r>
+          </w:p>
+        </w:tc>
+        <w:tc>
+          <w:tcPr/>
+          <w:p>
+            <w:pPr>
+              <w:pStyle w:val="Compact"/>
+              <w:spacing w:line="240" w:lineRule="auto"/>
+              <w:jc w:val="center"/>
+            </w:pPr>
+            <w:r>
+              <w:rPr>
+                <w:sz w:val="19"/>
+              </w:rPr>
+              <w:t xml:space="preserve">2026-10-26</w:t>
+            </w:r>
+          </w:p>
+        </w:tc>
+        <w:tc>
+          <w:tcPr/>
+          <w:p>
+            <w:pPr>
+              <w:pStyle w:val="Compact"/>
+              <w:spacing w:line="240" w:lineRule="auto"/>
+              <w:jc w:val="center"/>
+            </w:pPr>
+            <w:r>
+              <w:rPr>
+                <w:sz w:val="19"/>
+              </w:rPr>
+              <w:t xml:space="preserve">2026-10-26</w:t>
+            </w:r>
+          </w:p>
+        </w:tc>
+      </w:tr>
+      <w:tr>
+        <w:tc>
+          <w:tcPr/>
+          <w:p>
+            <w:pPr>
+              <w:pStyle w:val="Compact"/>
+              <w:spacing w:line="240" w:lineRule="auto"/>
+              <w:jc w:val="left"/>
+            </w:pPr>
+            <w:r>
+              <w:rPr>
+                <w:sz w:val="19"/>
+              </w:rPr>
+              <w:t xml:space="preserve">Within-drone duration caliper</w:t>
+            </w:r>
+          </w:p>
+        </w:tc>
+        <w:tc>
+          <w:tcPr/>
+          <w:p>
+            <w:pPr>
+              <w:pStyle w:val="Compact"/>
+              <w:spacing w:line="240" w:lineRule="auto"/>
+              <w:jc w:val="left"/>
+            </w:pPr>
+            <w:r>
+              <w:rPr>
+                <w:sz w:val="19"/>
+              </w:rPr>
+              <w:t xml:space="preserve">Test duration confounding in cohort</w:t>
+            </w:r>
+          </w:p>
+        </w:tc>
+        <w:tc>
+          <w:tcPr/>
+          <w:p>
+            <w:pPr>
+              <w:pStyle w:val="Compact"/>
+              <w:spacing w:line="240" w:lineRule="auto"/>
+              <w:jc w:val="left"/>
+            </w:pPr>
+            <w:r>
+              <w:rPr>
+                <w:sz w:val="19"/>
+              </w:rPr>
+              <w:t xml:space="preserve">Caliper</w:t>
+            </w:r>
+            <w:r>
+              <w:rPr>
+                <w:sz w:val="19"/>
+              </w:rPr>
+              <w:t xml:space="preserve"> </w:t>
+            </w:r>
+            <m:oMath>
+              <m:r>
+                <m:rPr>
+                  <m:sty m:val="p"/>
+                </m:rPr>
+                <m:t>≤</m:t>
+              </m:r>
+              <m:r>
+                <m:t>0.25</m:t>
+              </m:r>
+            </m:oMath>
+            <w:r>
+              <w:rPr>
+                <w:sz w:val="19"/>
+              </w:rPr>
+              <w:t xml:space="preserve"> </w:t>
+            </w:r>
+            <w:r>
+              <w:rPr>
+                <w:sz w:val="19"/>
+              </w:rPr>
+              <w:t xml:space="preserve">matching lifts within-drone AUC</w:t>
+            </w:r>
+            <w:r>
+              <w:rPr>
+                <w:sz w:val="19"/>
+              </w:rPr>
+              <w:t xml:space="preserve"> </w:t>
+            </w:r>
+            <m:oMath>
+              <m:r>
+                <m:rPr>
+                  <m:sty m:val="p"/>
+                </m:rPr>
+                <m:t>+</m:t>
+              </m:r>
+              <m:r>
+                <m:t>0.110</m:t>
+              </m:r>
+            </m:oMath>
+            <w:r>
+              <w:rPr>
+                <w:sz w:val="19"/>
+              </w:rPr>
+              <w:t xml:space="preserve"> </w:t>
+            </w:r>
+            <w:r>
+              <w:rPr>
+                <w:sz w:val="19"/>
+              </w:rPr>
+              <w:t xml:space="preserve">(0.532 to 0.642)</w:t>
+            </w:r>
+          </w:p>
+        </w:tc>
+        <w:tc>
+          <w:tcPr/>
+          <w:p>
+            <w:pPr>
+              <w:pStyle w:val="Compact"/>
+              <w:spacing w:line="240" w:lineRule="auto"/>
+              <w:jc w:val="center"/>
+            </w:pPr>
+            <w:r>
+              <w:rPr>
+                <w:rStyle w:val="VerbatimChar"/>
+                <w:sz w:val="19"/>
+              </w:rPr>
+              <w:t xml:space="preserve">f152d07</w:t>
+            </w:r>
+          </w:p>
+        </w:tc>
+        <w:tc>
+          <w:tcPr/>
+          <w:p>
+            <w:pPr>
+              <w:pStyle w:val="Compact"/>
+              <w:spacing w:line="240" w:lineRule="auto"/>
+              <w:jc w:val="center"/>
+            </w:pPr>
+            <w:r>
+              <w:rPr>
+                <w:sz w:val="19"/>
+              </w:rPr>
+              <w:t xml:space="preserve">2026-10-26</w:t>
+            </w:r>
+          </w:p>
+        </w:tc>
+        <w:tc>
+          <w:tcPr/>
+          <w:p>
+            <w:pPr>
+              <w:pStyle w:val="Compact"/>
+              <w:spacing w:line="240" w:lineRule="auto"/>
+              <w:jc w:val="center"/>
+            </w:pPr>
+            <w:r>
+              <w:rPr>
+                <w:sz w:val="19"/>
+              </w:rPr>
+              <w:t xml:space="preserve">2026-10-26</w:t>
+            </w:r>
+          </w:p>
+        </w:tc>
+      </w:tr>
+      <w:tr>
+        <w:tc>
+          <w:tcPr/>
+          <w:p>
+            <w:pPr>
+              <w:pStyle w:val="Compact"/>
+              <w:spacing w:line="240" w:lineRule="auto"/>
+              <w:jc w:val="left"/>
+            </w:pPr>
+            <w:r>
+              <w:rPr>
+                <w:sz w:val="19"/>
+              </w:rPr>
+              <w:t xml:space="preserve">Depth-3 tree bounds across cuts</w:t>
+            </w:r>
+          </w:p>
+        </w:tc>
+        <w:tc>
+          <w:tcPr/>
+          <w:p>
+            <w:pPr>
+              <w:pStyle w:val="Compact"/>
+              <w:spacing w:line="240" w:lineRule="auto"/>
+              <w:jc w:val="left"/>
+            </w:pPr>
+            <w:r>
+              <w:rPr>
+                <w:sz w:val="19"/>
+              </w:rPr>
+              <w:t xml:space="preserve">Bound non-linear model performance</w:t>
+            </w:r>
+          </w:p>
+        </w:tc>
+        <w:tc>
+          <w:tcPr/>
+          <w:p>
+            <w:pPr>
+              <w:pStyle w:val="Compact"/>
+              <w:spacing w:line="240" w:lineRule="auto"/>
+              <w:jc w:val="left"/>
+            </w:pPr>
+            <w:r>
+              <w:rPr>
+                <w:sz w:val="19"/>
+              </w:rPr>
+              <w:t xml:space="preserve">Upper bounds 0.519–0.724; collapses to 0.524 under 10 s leakage control</w:t>
+            </w:r>
+          </w:p>
+        </w:tc>
+        <w:tc>
+          <w:tcPr/>
+          <w:p>
+            <w:pPr>
+              <w:pStyle w:val="Compact"/>
+              <w:spacing w:line="240" w:lineRule="auto"/>
+              <w:jc w:val="center"/>
+            </w:pPr>
+            <w:r>
+              <w:rPr>
+                <w:rStyle w:val="VerbatimChar"/>
+                <w:sz w:val="19"/>
+              </w:rPr>
+              <w:t xml:space="preserve">dfbabaf</w:t>
+            </w:r>
+          </w:p>
+        </w:tc>
+        <w:tc>
+          <w:tcPr/>
+          <w:p>
+            <w:pPr>
+              <w:pStyle w:val="Compact"/>
+              <w:spacing w:line="240" w:lineRule="auto"/>
+              <w:jc w:val="center"/>
+            </w:pPr>
+            <w:r>
+              <w:rPr>
+                <w:sz w:val="19"/>
+              </w:rPr>
+              <w:t xml:space="preserve">2026-10-26</w:t>
+            </w:r>
+          </w:p>
+        </w:tc>
+        <w:tc>
+          <w:tcPr/>
+          <w:p>
+            <w:pPr>
+              <w:pStyle w:val="Compact"/>
+              <w:spacing w:line="240" w:lineRule="auto"/>
+              <w:jc w:val="center"/>
+            </w:pPr>
+            <w:r>
+              <w:rPr>
+                <w:sz w:val="19"/>
+              </w:rPr>
+              <w:t xml:space="preserve">2026-10-26</w:t>
+            </w:r>
+          </w:p>
+        </w:tc>
+      </w:tr>
+      <w:tr>
+        <w:tc>
+          <w:tcPr/>
+          <w:p>
+            <w:pPr>
+              <w:pStyle w:val="Compact"/>
+              <w:spacing w:line="240" w:lineRule="auto"/>
+              <w:jc w:val="left"/>
+            </w:pPr>
+            <w:r>
+              <w:rPr>
+                <w:sz w:val="19"/>
+              </w:rPr>
+              <w:t xml:space="preserve">Fixed-score permutation null</w:t>
+            </w:r>
+          </w:p>
+        </w:tc>
+        <w:tc>
+          <w:tcPr/>
+          <w:p>
+            <w:pPr>
+              <w:pStyle w:val="Compact"/>
+              <w:spacing w:line="240" w:lineRule="auto"/>
+              <w:jc w:val="left"/>
+            </w:pPr>
+            <w:r>
+              <w:rPr>
+                <w:sz w:val="19"/>
+              </w:rPr>
+              <w:t xml:space="preserve">Test CV fold-splitting variance</w:t>
+            </w:r>
+          </w:p>
+        </w:tc>
+        <w:tc>
+          <w:tcPr/>
+          <w:p>
+            <w:pPr>
+              <w:pStyle w:val="Compact"/>
+              <w:spacing w:line="240" w:lineRule="auto"/>
+              <w:jc w:val="left"/>
+            </w:pPr>
+            <w:r>
+              <w:rPr>
+                <w:sz w:val="19"/>
+              </w:rPr>
+              <w:t xml:space="preserve">Fixed score SD 0.055 matches asymptotic theory (0.056); 0.090 is CV artifact</w:t>
+            </w:r>
+          </w:p>
+        </w:tc>
+        <w:tc>
+          <w:tcPr/>
+          <w:p>
+            <w:pPr>
+              <w:pStyle w:val="Compact"/>
+              <w:spacing w:line="240" w:lineRule="auto"/>
+              <w:jc w:val="center"/>
+            </w:pPr>
+            <w:r>
+              <w:rPr>
+                <w:rStyle w:val="VerbatimChar"/>
+                <w:sz w:val="19"/>
+              </w:rPr>
+              <w:t xml:space="preserve">dfbabaf</w:t>
+            </w:r>
+          </w:p>
+        </w:tc>
+        <w:tc>
+          <w:tcPr/>
+          <w:p>
+            <w:pPr>
+              <w:pStyle w:val="Compact"/>
+              <w:spacing w:line="240" w:lineRule="auto"/>
+              <w:jc w:val="center"/>
+            </w:pPr>
+            <w:r>
+              <w:rPr>
+                <w:sz w:val="19"/>
+              </w:rPr>
+              <w:t xml:space="preserve">2026-10-26</w:t>
+            </w:r>
+          </w:p>
+        </w:tc>
+        <w:tc>
+          <w:tcPr/>
+          <w:p>
+            <w:pPr>
+              <w:pStyle w:val="Compact"/>
+              <w:spacing w:line="240" w:lineRule="auto"/>
+              <w:jc w:val="center"/>
+            </w:pPr>
+            <w:r>
+              <w:rPr>
+                <w:sz w:val="19"/>
+              </w:rPr>
+              <w:t xml:space="preserve">2026-10-26</w:t>
+            </w:r>
+          </w:p>
+        </w:tc>
+      </w:tr>
+      <w:tr>
+        <w:tc>
+          <w:tcPr/>
+          <w:p>
+            <w:pPr>
+              <w:pStyle w:val="Compact"/>
+              <w:spacing w:line="240" w:lineRule="auto"/>
+              <w:jc w:val="left"/>
+            </w:pPr>
+            <w:r>
+              <w:rPr>
+                <w:sz w:val="19"/>
+              </w:rPr>
+              <w:t xml:space="preserve">Control cluster adjustment</w:t>
+            </w:r>
+          </w:p>
+        </w:tc>
+        <w:tc>
+          <w:tcPr/>
+          <w:p>
+            <w:pPr>
+              <w:pStyle w:val="Compact"/>
+              <w:spacing w:line="240" w:lineRule="auto"/>
+              <w:jc w:val="left"/>
+            </w:pPr>
+            <w:r>
+              <w:rPr>
+                <w:sz w:val="19"/>
+              </w:rPr>
+              <w:t xml:space="preserve">Test control reuse robustness</w:t>
+            </w:r>
+          </w:p>
+        </w:tc>
+        <w:tc>
+          <w:tcPr/>
+          <w:p>
+            <w:pPr>
+              <w:pStyle w:val="Compact"/>
+              <w:spacing w:line="240" w:lineRule="auto"/>
+              <w:jc w:val="left"/>
+            </w:pPr>
+            <w:r>
+              <w:rPr>
+                <w:sz w:val="19"/>
+              </w:rPr>
+              <w:t xml:space="preserve">Mean rank 0.665, 95% cluster CI [0.587, 0.744]; heterogeneity</w:t>
+            </w:r>
+            <w:r>
+              <w:rPr>
+                <w:sz w:val="19"/>
+              </w:rPr>
+              <w:t xml:space="preserve"> </w:t>
+            </w:r>
+            <m:oMath>
+              <m:r>
+                <m:t>p</m:t>
+              </m:r>
+              <m:r>
+                <m:rPr>
+                  <m:sty m:val="p"/>
+                </m:rPr>
+                <m:t>=</m:t>
+              </m:r>
+              <m:r>
+                <m:t>0.322</m:t>
+              </m:r>
+            </m:oMath>
+          </w:p>
+        </w:tc>
+        <w:tc>
+          <w:tcPr/>
+          <w:p>
+            <w:pPr>
+              <w:pStyle w:val="Compact"/>
+              <w:spacing w:line="240" w:lineRule="auto"/>
+              <w:jc w:val="center"/>
+            </w:pPr>
+            <w:r>
+              <w:rPr>
+                <w:rStyle w:val="VerbatimChar"/>
+                <w:sz w:val="19"/>
+              </w:rPr>
+              <w:t xml:space="preserve">dfbabaf</w:t>
+            </w:r>
+          </w:p>
+        </w:tc>
+        <w:tc>
+          <w:tcPr/>
+          <w:p>
+            <w:pPr>
+              <w:pStyle w:val="Compact"/>
+              <w:spacing w:line="240" w:lineRule="auto"/>
+              <w:jc w:val="center"/>
+            </w:pPr>
+            <w:r>
+              <w:rPr>
+                <w:sz w:val="19"/>
+              </w:rPr>
+              <w:t xml:space="preserve">2026-10-26</w:t>
+            </w:r>
+          </w:p>
+        </w:tc>
+        <w:tc>
+          <w:tcPr/>
+          <w:p>
+            <w:pPr>
+              <w:pStyle w:val="Compact"/>
+              <w:spacing w:line="240" w:lineRule="auto"/>
+              <w:jc w:val="center"/>
+            </w:pPr>
+            <w:r>
+              <w:rPr>
+                <w:sz w:val="19"/>
+              </w:rPr>
+              <w:t xml:space="preserve">2026-10-26</w:t>
+            </w:r>
+          </w:p>
+        </w:tc>
+      </w:tr>
     </w:tbl>
     <w:bookmarkEnd w:id="64"/>
     <w:p>
@@ -19622,20 +21470,20 @@
     <w:bookmarkEnd w:id="67"/>
     <w:p>
       <w:pPr>
-        <w:pStyle w:val="Heading1"/>
+        <w:pStyle w:val="Heading2"/>
       </w:pPr>
-      <w:bookmarkStart w:id="68" w:name="_074802e0e16f6322e726b21f081c01c392e8fbd"/>
+      <w:bookmarkStart w:id="68" w:name="_46768506b9d2d22e677daf79594de5255acfb0b"/>
       <w:r>
         <w:rPr>
           <w:rStyle w:val="SectionNumber"/>
         </w:rPr>
-        <w:t xml:space="preserve">7</w:t>
+        <w:t xml:space="preserve">6.1</w:t>
       </w:r>
       <w:r>
         <w:tab/>
       </w:r>
       <w:r>
-        <w:t xml:space="preserve">Discussion</w:t>
+        <w:t xml:space="preserve">Normative reporting checklist for flight-log diagnostics</w:t>
       </w:r>
       <w:bookmarkEnd w:id="68"/>
     </w:p>
@@ -19644,6 +21492,752 @@
         <w:pStyle w:val="FirstParagraph"/>
       </w:pPr>
       <w:r>
+        <w:t xml:space="preserve">To support drone safety regulators, accident investigators, and data-driven diagnostic tool developers in avoiding the leakage and confounding traps quantified in this study, Table ?? outlines an eight-item normative reporting checklist. Each item pairs a methodological evaluation rule with its empirical rationale and the specific failure mode observed in our experiments when that control is omitted.</w:t>
+      </w:r>
+    </w:p>
+    <w:bookmarkStart w:id="69" w:name="_8dfd3cae62712a91b3c1ba079a4ea82fa2a3d98"/>
+    <w:p>
+      <w:pPr>
+        <w:pStyle w:val="TableCaption"/>
+      </w:pPr>
+      <w:r>
+        <w:t xml:space="preserve">Table ?. Normative checklist for leakage-controlled evaluation and reporting of UAV flight-log diagnostic models and accident analytics.</w:t>
+      </w:r>
+    </w:p>
+    <w:tbl>
+      <w:tblPr>
+        <w:tblStyle w:val="Table"/>
+        <w:tblW w:type="pct" w:w="5000"/>
+        <w:tblLook w:firstRow="1" w:lastRow="0" w:firstColumn="0" w:lastColumn="0" w:noHBand="0" w:noVBand="0" w:val="0020"/>
+        <w:tblCaption w:val="Table ?. Normative checklist for leakage-controlled evaluation and reporting of UAV flight-log diagnostic models and accident analytics."/>
+        <w:tblBorders>
+          <w:top w:val="single" w:sz="4" w:color="808080"/>
+          <w:left w:val="single" w:sz="4" w:color="808080"/>
+          <w:bottom w:val="single" w:sz="4" w:color="808080"/>
+          <w:right w:val="single" w:sz="4" w:color="808080"/>
+          <w:insideH w:val="single" w:sz="4" w:color="808080"/>
+          <w:insideV w:val="single" w:sz="4" w:color="808080"/>
+        </w:tblBorders>
+      </w:tblPr>
+      <w:tblGrid>
+        <w:gridCol w:w="2640"/>
+        <w:gridCol w:w="2640"/>
+        <w:gridCol w:w="2640"/>
+      </w:tblGrid>
+      <w:tr>
+        <w:trPr>
+          <w:tblHeader w:val="on"/>
+        </w:trPr>
+        <w:tc>
+          <w:tcPr/>
+          <w:p>
+            <w:pPr>
+              <w:pStyle w:val="Compact"/>
+              <w:spacing w:line="240" w:lineRule="auto"/>
+              <w:jc w:val="left"/>
+            </w:pPr>
+            <w:r>
+              <w:rPr>
+                <w:sz w:val="19"/>
+              </w:rPr>
+              <w:t xml:space="preserve">Checklist Item</w:t>
+            </w:r>
+          </w:p>
+        </w:tc>
+        <w:tc>
+          <w:tcPr/>
+          <w:p>
+            <w:pPr>
+              <w:pStyle w:val="Compact"/>
+              <w:spacing w:line="240" w:lineRule="auto"/>
+              <w:jc w:val="left"/>
+            </w:pPr>
+            <w:r>
+              <w:rPr>
+                <w:sz w:val="19"/>
+              </w:rPr>
+              <w:t xml:space="preserve">Methodological Requirement</w:t>
+            </w:r>
+          </w:p>
+        </w:tc>
+        <w:tc>
+          <w:tcPr/>
+          <w:p>
+            <w:pPr>
+              <w:pStyle w:val="Compact"/>
+              <w:spacing w:line="240" w:lineRule="auto"/>
+              <w:jc w:val="left"/>
+            </w:pPr>
+            <w:r>
+              <w:rPr>
+                <w:sz w:val="19"/>
+              </w:rPr>
+              <w:t xml:space="preserve">Rationale and Empirical Failure Mode</w:t>
+            </w:r>
+          </w:p>
+        </w:tc>
+      </w:tr>
+      <w:tr>
+        <w:tc>
+          <w:tcPr/>
+          <w:p>
+            <w:pPr>
+              <w:pStyle w:val="Compact"/>
+              <w:spacing w:line="240" w:lineRule="auto"/>
+              <w:jc w:val="left"/>
+            </w:pPr>
+            <w:r>
+              <w:rPr>
+                <w:sz w:val="19"/>
+              </w:rPr>
+              <w:t xml:space="preserve">1. Event-window removal</w:t>
+            </w:r>
+          </w:p>
+        </w:tc>
+        <w:tc>
+          <w:tcPr/>
+          <w:p>
+            <w:pPr>
+              <w:pStyle w:val="Compact"/>
+              <w:spacing w:line="240" w:lineRule="auto"/>
+              <w:jc w:val="left"/>
+            </w:pPr>
+            <w:r>
+              <w:rPr>
+                <w:sz w:val="19"/>
+              </w:rPr>
+              <w:t xml:space="preserve">Remove</w:t>
+            </w:r>
+            <w:r>
+              <w:rPr>
+                <w:sz w:val="19"/>
+              </w:rPr>
+              <w:t xml:space="preserve"> </w:t>
+            </w:r>
+            <m:oMath>
+              <m:r>
+                <m:rPr>
+                  <m:sty m:val="p"/>
+                </m:rPr>
+                <m:t>≥</m:t>
+              </m:r>
+              <m:r>
+                <m:t>10</m:t>
+              </m:r>
+            </m:oMath>
+            <w:r>
+              <w:rPr>
+                <w:sz w:val="19"/>
+              </w:rPr>
+              <w:t xml:space="preserve"> s prior to physical impact or ground tumble (</w:t>
+            </w:r>
+            <m:oMath>
+              <m:r>
+                <m:t>m</m:t>
+              </m:r>
+              <m:r>
+                <m:rPr>
+                  <m:sty m:val="p"/>
+                </m:rPr>
+                <m:t>≥</m:t>
+              </m:r>
+              <m:r>
+                <m:t>10</m:t>
+              </m:r>
+            </m:oMath>
+            <w:r>
+              <w:rPr>
+                <w:sz w:val="19"/>
+              </w:rPr>
+              <w:t xml:space="preserve"> s)</w:t>
+            </w:r>
+          </w:p>
+        </w:tc>
+        <w:tc>
+          <w:tcPr/>
+          <w:p>
+            <w:pPr>
+              <w:pStyle w:val="Compact"/>
+              <w:spacing w:line="240" w:lineRule="auto"/>
+              <w:jc w:val="left"/>
+            </w:pPr>
+            <w:r>
+              <w:rPr>
+                <w:sz w:val="19"/>
+              </w:rPr>
+              <w:t xml:space="preserve">Excludes terminal tumble artifacts (motor saturation, clipping, failsafes) that inflate apparent sensitivity (e.g.,</w:t>
+            </w:r>
+            <w:r>
+              <w:rPr>
+                <w:sz w:val="19"/>
+              </w:rPr>
+              <w:t xml:space="preserve"> </w:t>
+            </w:r>
+            <m:oMath>
+              <m:r>
+                <m:t>7</m:t>
+              </m:r>
+              <m:r>
+                <m:rPr>
+                  <m:sty m:val="p"/>
+                </m:rPr>
+                <m:t>/</m:t>
+              </m:r>
+              <m:r>
+                <m:t>9</m:t>
+              </m:r>
+              <m:r>
+                <m:rPr>
+                  <m:sty m:val="p"/>
+                </m:rPr>
+                <m:t>→</m:t>
+              </m:r>
+              <m:r>
+                <m:t>1</m:t>
+              </m:r>
+              <m:r>
+                <m:rPr>
+                  <m:sty m:val="p"/>
+                </m:rPr>
+                <m:t>/</m:t>
+              </m:r>
+              <m:r>
+                <m:t>9</m:t>
+              </m:r>
+            </m:oMath>
+            <w:r>
+              <w:rPr>
+                <w:sz w:val="19"/>
+              </w:rPr>
+              <w:t xml:space="preserve">, §5.3).</w:t>
+            </w:r>
+          </w:p>
+        </w:tc>
+      </w:tr>
+      <w:tr>
+        <w:tc>
+          <w:tcPr/>
+          <w:p>
+            <w:pPr>
+              <w:pStyle w:val="Compact"/>
+              <w:spacing w:line="240" w:lineRule="auto"/>
+              <w:jc w:val="left"/>
+            </w:pPr>
+            <w:r>
+              <w:rPr>
+                <w:sz w:val="19"/>
+              </w:rPr>
+              <w:t xml:space="preserve">2. Airframe-grouped folds</w:t>
+            </w:r>
+          </w:p>
+        </w:tc>
+        <w:tc>
+          <w:tcPr/>
+          <w:p>
+            <w:pPr>
+              <w:pStyle w:val="Compact"/>
+              <w:spacing w:line="240" w:lineRule="auto"/>
+              <w:jc w:val="left"/>
+            </w:pPr>
+            <w:r>
+              <w:rPr>
+                <w:sz w:val="19"/>
+              </w:rPr>
+              <w:t xml:space="preserve">Partition cross-validation folds strictly by vehicle UUID</w:t>
+            </w:r>
+          </w:p>
+        </w:tc>
+        <w:tc>
+          <w:tcPr/>
+          <w:p>
+            <w:pPr>
+              <w:pStyle w:val="Compact"/>
+              <w:spacing w:line="240" w:lineRule="auto"/>
+              <w:jc w:val="left"/>
+            </w:pPr>
+            <w:r>
+              <w:rPr>
+                <w:sz w:val="19"/>
+              </w:rPr>
+              <w:t xml:space="preserve">Prevents cross-fold leakage where models memorize persistent airframe peculiarities rather than genuine failure precursors.</w:t>
+            </w:r>
+          </w:p>
+        </w:tc>
+      </w:tr>
+      <w:tr>
+        <w:tc>
+          <w:tcPr/>
+          <w:p>
+            <w:pPr>
+              <w:pStyle w:val="Compact"/>
+              <w:spacing w:line="240" w:lineRule="auto"/>
+              <w:jc w:val="left"/>
+            </w:pPr>
+            <w:r>
+              <w:rPr>
+                <w:sz w:val="19"/>
+              </w:rPr>
+              <w:t xml:space="preserve">3. Longitudinal baseline</w:t>
+            </w:r>
+          </w:p>
+        </w:tc>
+        <w:tc>
+          <w:tcPr/>
+          <w:p>
+            <w:pPr>
+              <w:pStyle w:val="Compact"/>
+              <w:spacing w:line="240" w:lineRule="auto"/>
+              <w:jc w:val="left"/>
+            </w:pPr>
+            <w:r>
+              <w:rPr>
+                <w:sz w:val="19"/>
+              </w:rPr>
+              <w:t xml:space="preserve">Evaluate cases against the airframe’s own pre-incident flights</w:t>
+            </w:r>
+          </w:p>
+        </w:tc>
+        <w:tc>
+          <w:tcPr/>
+          <w:p>
+            <w:pPr>
+              <w:pStyle w:val="Compact"/>
+              <w:spacing w:line="240" w:lineRule="auto"/>
+              <w:jc w:val="left"/>
+            </w:pPr>
+            <w:r>
+              <w:rPr>
+                <w:sz w:val="19"/>
+              </w:rPr>
+              <w:t xml:space="preserve">Disentangles mechanical health from between-airframe confounding (propeller, motor, payload, and flight envelope differences).</w:t>
+            </w:r>
+          </w:p>
+        </w:tc>
+      </w:tr>
+      <w:tr>
+        <w:tc>
+          <w:tcPr/>
+          <w:p>
+            <w:pPr>
+              <w:pStyle w:val="Compact"/>
+              <w:spacing w:line="240" w:lineRule="auto"/>
+              <w:jc w:val="left"/>
+            </w:pPr>
+            <w:r>
+              <w:rPr>
+                <w:sz w:val="19"/>
+              </w:rPr>
+              <w:t xml:space="preserve">4. Duration caliper matching</w:t>
+            </w:r>
+          </w:p>
+        </w:tc>
+        <w:tc>
+          <w:tcPr/>
+          <w:p>
+            <w:pPr>
+              <w:pStyle w:val="Compact"/>
+              <w:spacing w:line="240" w:lineRule="auto"/>
+              <w:jc w:val="left"/>
+            </w:pPr>
+            <w:r>
+              <w:rPr>
+                <w:sz w:val="19"/>
+              </w:rPr>
+              <w:t xml:space="preserve">Enforce duration matching ratio (</w:t>
+            </w:r>
+            <m:oMath>
+              <m:r>
+                <m:rPr>
+                  <m:sty m:val="p"/>
+                </m:rPr>
+                <m:t>|</m:t>
+              </m:r>
+              <m:r>
+                <m:rPr>
+                  <m:sty m:val="p"/>
+                </m:rPr>
+                <m:t>Δ</m:t>
+              </m:r>
+              <m:r>
+                <m:rPr>
+                  <m:sty m:val="p"/>
+                </m:rPr>
+                <m:t>ln</m:t>
+              </m:r>
+              <m:r>
+                <m:rPr>
+                  <m:sty m:val="p"/>
+                </m:rPr>
+                <m:t>(</m:t>
+              </m:r>
+              <m:r>
+                <m:rPr>
+                  <m:nor/>
+                </m:rPr>
+                <m:t>duration</m:t>
+              </m:r>
+              <m:r>
+                <m:rPr>
+                  <m:sty m:val="p"/>
+                </m:rPr>
+                <m:t>)</m:t>
+              </m:r>
+              <m:r>
+                <m:rPr>
+                  <m:sty m:val="p"/>
+                </m:rPr>
+                <m:t>|</m:t>
+              </m:r>
+              <m:r>
+                <m:rPr>
+                  <m:sty m:val="p"/>
+                </m:rPr>
+                <m:t>≤</m:t>
+              </m:r>
+              <m:r>
+                <m:t>0.50</m:t>
+              </m:r>
+            </m:oMath>
+            <w:r>
+              <w:rPr>
+                <w:sz w:val="19"/>
+              </w:rPr>
+              <w:t xml:space="preserve">)</w:t>
+            </w:r>
+          </w:p>
+        </w:tc>
+        <w:tc>
+          <w:tcPr/>
+          <w:p>
+            <w:pPr>
+              <w:pStyle w:val="Compact"/>
+              <w:spacing w:line="240" w:lineRule="auto"/>
+              <w:jc w:val="left"/>
+            </w:pPr>
+            <w:r>
+              <w:rPr>
+                <w:sz w:val="19"/>
+              </w:rPr>
+              <w:t xml:space="preserve">Aborted/short incident flights induce spurious separation; caliper matching recovers</w:t>
+            </w:r>
+            <w:r>
+              <w:rPr>
+                <w:sz w:val="19"/>
+              </w:rPr>
+              <w:t xml:space="preserve"> </w:t>
+            </w:r>
+            <m:oMath>
+              <m:r>
+                <m:rPr>
+                  <m:sty m:val="p"/>
+                </m:rPr>
+                <m:t>+</m:t>
+              </m:r>
+              <m:r>
+                <m:t>0.110</m:t>
+              </m:r>
+            </m:oMath>
+            <w:r>
+              <w:rPr>
+                <w:sz w:val="19"/>
+              </w:rPr>
+              <w:t xml:space="preserve"> </w:t>
+            </w:r>
+            <w:r>
+              <w:rPr>
+                <w:sz w:val="19"/>
+              </w:rPr>
+              <w:t xml:space="preserve">true within-drone AUC (§6).</w:t>
+            </w:r>
+          </w:p>
+        </w:tc>
+      </w:tr>
+      <w:tr>
+        <w:tc>
+          <w:tcPr/>
+          <w:p>
+            <w:pPr>
+              <w:pStyle w:val="Compact"/>
+              <w:spacing w:line="240" w:lineRule="auto"/>
+              <w:jc w:val="left"/>
+            </w:pPr>
+            <w:r>
+              <w:rPr>
+                <w:sz w:val="19"/>
+              </w:rPr>
+              <w:t xml:space="preserve">5. Two-class expert ground truth</w:t>
+            </w:r>
+          </w:p>
+        </w:tc>
+        <w:tc>
+          <w:tcPr/>
+          <w:p>
+            <w:pPr>
+              <w:pStyle w:val="Compact"/>
+              <w:spacing w:line="240" w:lineRule="auto"/>
+              <w:jc w:val="left"/>
+            </w:pPr>
+            <w:r>
+              <w:rPr>
+                <w:sz w:val="19"/>
+              </w:rPr>
+              <w:t xml:space="preserve">Validate against multi-coder independent diagnoses with reported agreement (</w:t>
+            </w:r>
+            <m:oMath>
+              <m:r>
+                <m:t>κ</m:t>
+              </m:r>
+              <m:r>
+                <m:rPr>
+                  <m:sty m:val="p"/>
+                </m:rPr>
+                <m:t>≥</m:t>
+              </m:r>
+              <m:r>
+                <m:t>0.70</m:t>
+              </m:r>
+            </m:oMath>
+            <w:r>
+              <w:rPr>
+                <w:sz w:val="19"/>
+              </w:rPr>
+              <w:t xml:space="preserve">)</w:t>
+            </w:r>
+          </w:p>
+        </w:tc>
+        <w:tc>
+          <w:tcPr/>
+          <w:p>
+            <w:pPr>
+              <w:pStyle w:val="Compact"/>
+              <w:spacing w:line="240" w:lineRule="auto"/>
+              <w:jc w:val="left"/>
+            </w:pPr>
+            <w:r>
+              <w:rPr>
+                <w:sz w:val="19"/>
+              </w:rPr>
+              <w:t xml:space="preserve">Uploader labels are noisy and biased; evaluation must quantify inter-rater reliability across both pilot-fault and aircraft-fault classes.</w:t>
+            </w:r>
+          </w:p>
+        </w:tc>
+      </w:tr>
+      <w:tr>
+        <w:tc>
+          <w:tcPr/>
+          <w:p>
+            <w:pPr>
+              <w:pStyle w:val="Compact"/>
+              <w:spacing w:line="240" w:lineRule="auto"/>
+              <w:jc w:val="left"/>
+            </w:pPr>
+            <w:r>
+              <w:rPr>
+                <w:sz w:val="19"/>
+              </w:rPr>
+              <w:t xml:space="preserve">6. Operational base-rate calibration</w:t>
+            </w:r>
+          </w:p>
+        </w:tc>
+        <w:tc>
+          <w:tcPr/>
+          <w:p>
+            <w:pPr>
+              <w:pStyle w:val="Compact"/>
+              <w:spacing w:line="240" w:lineRule="auto"/>
+              <w:jc w:val="left"/>
+            </w:pPr>
+            <w:r>
+              <w:rPr>
+                <w:sz w:val="19"/>
+              </w:rPr>
+              <w:t xml:space="preserve">Report exact Bayes PPV, relative risk, and inspections per event using fleet base rates</w:t>
+            </w:r>
+          </w:p>
+        </w:tc>
+        <w:tc>
+          <w:tcPr/>
+          <w:p>
+            <w:pPr>
+              <w:pStyle w:val="Compact"/>
+              <w:spacing w:line="240" w:lineRule="auto"/>
+              <w:jc w:val="left"/>
+            </w:pPr>
+            <w:r>
+              <w:rPr>
+                <w:sz w:val="19"/>
+              </w:rPr>
+              <w:t xml:space="preserve">High ROC AUCs mask severe false-alarm fatigue in operational deployment under sparse event base rates (</w:t>
+            </w:r>
+            <m:oMath>
+              <m:r>
+                <m:rPr>
+                  <m:sty m:val="p"/>
+                </m:rPr>
+                <m:t>≤</m:t>
+              </m:r>
+              <m:r>
+                <m:t>1</m:t>
+              </m:r>
+              <m:r>
+                <m:rPr>
+                  <m:sty m:val="p"/>
+                </m:rPr>
+                <m:t>%</m:t>
+              </m:r>
+            </m:oMath>
+            <w:r>
+              <w:rPr>
+                <w:sz w:val="19"/>
+              </w:rPr>
+              <w:t xml:space="preserve">, §5.4).</w:t>
+            </w:r>
+          </w:p>
+        </w:tc>
+      </w:tr>
+      <w:tr>
+        <w:tc>
+          <w:tcPr/>
+          <w:p>
+            <w:pPr>
+              <w:pStyle w:val="Compact"/>
+              <w:spacing w:line="240" w:lineRule="auto"/>
+              <w:jc w:val="left"/>
+            </w:pPr>
+            <w:r>
+              <w:rPr>
+                <w:sz w:val="19"/>
+              </w:rPr>
+              <w:t xml:space="preserve">7. Prospective protocol registration</w:t>
+            </w:r>
+          </w:p>
+        </w:tc>
+        <w:tc>
+          <w:tcPr/>
+          <w:p>
+            <w:pPr>
+              <w:pStyle w:val="Compact"/>
+              <w:spacing w:line="240" w:lineRule="auto"/>
+              <w:jc w:val="left"/>
+            </w:pPr>
+            <w:r>
+              <w:rPr>
+                <w:sz w:val="19"/>
+              </w:rPr>
+              <w:t xml:space="preserve">Pre-specify hypotheses, sample funnels, features, models, seeds, and pass marks in version control</w:t>
+            </w:r>
+          </w:p>
+        </w:tc>
+        <w:tc>
+          <w:tcPr/>
+          <w:p>
+            <w:pPr>
+              <w:pStyle w:val="Compact"/>
+              <w:spacing w:line="240" w:lineRule="auto"/>
+              <w:jc w:val="left"/>
+            </w:pPr>
+            <w:r>
+              <w:rPr>
+                <w:sz w:val="19"/>
+              </w:rPr>
+              <w:t xml:space="preserve">Eliminates</w:t>
+            </w:r>
+            <w:r>
+              <w:rPr>
+                <w:sz w:val="19"/>
+              </w:rPr>
+              <w:t xml:space="preserve"> </w:t>
+            </w:r>
+            <m:oMath>
+              <m:r>
+                <m:t>p</m:t>
+              </m:r>
+            </m:oMath>
+            <w:r>
+              <w:rPr>
+                <w:sz w:val="19"/>
+              </w:rPr>
+              <w:t xml:space="preserve">-hacking, outcome switching, and post-hoc rationalization of exploratory fluctuations (§4.1).</w:t>
+            </w:r>
+          </w:p>
+        </w:tc>
+      </w:tr>
+      <w:tr>
+        <w:tc>
+          <w:tcPr/>
+          <w:p>
+            <w:pPr>
+              <w:pStyle w:val="Compact"/>
+              <w:spacing w:line="240" w:lineRule="auto"/>
+              <w:jc w:val="left"/>
+            </w:pPr>
+            <w:r>
+              <w:rPr>
+                <w:sz w:val="19"/>
+              </w:rPr>
+              <w:t xml:space="preserve">8. Persistent open artifact deposit</w:t>
+            </w:r>
+          </w:p>
+        </w:tc>
+        <w:tc>
+          <w:tcPr/>
+          <w:p>
+            <w:pPr>
+              <w:pStyle w:val="Compact"/>
+              <w:spacing w:line="240" w:lineRule="auto"/>
+              <w:jc w:val="left"/>
+            </w:pPr>
+            <w:r>
+              <w:rPr>
+                <w:sz w:val="19"/>
+              </w:rPr>
+              <w:t xml:space="preserve">Deposit raw logs, extraction code, and derived feature tables in public archives</w:t>
+            </w:r>
+          </w:p>
+        </w:tc>
+        <w:tc>
+          <w:tcPr/>
+          <w:p>
+            <w:pPr>
+              <w:pStyle w:val="Compact"/>
+              <w:spacing w:line="240" w:lineRule="auto"/>
+              <w:jc w:val="left"/>
+            </w:pPr>
+            <w:r>
+              <w:rPr>
+                <w:sz w:val="19"/>
+              </w:rPr>
+              <w:t xml:space="preserve">Ensures cryptographic provenance, auditability, and independent re-analysis across research groups.</w:t>
+            </w:r>
+          </w:p>
+        </w:tc>
+      </w:tr>
+    </w:tbl>
+    <w:bookmarkEnd w:id="69"/>
+    <w:p>
+      <w:pPr>
+        <w:pStyle w:val="Heading1"/>
+      </w:pPr>
+      <w:bookmarkStart w:id="70" w:name="_074802e0e16f6322e726b21f081c01c392e8fbd"/>
+      <w:r>
+        <w:rPr>
+          <w:rStyle w:val="SectionNumber"/>
+        </w:rPr>
+        <w:t xml:space="preserve">7</w:t>
+      </w:r>
+      <w:r>
+        <w:tab/>
+      </w:r>
+      <w:r>
+        <w:t xml:space="preserve">Discussion</w:t>
+      </w:r>
+      <w:bookmarkEnd w:id="70"/>
+    </w:p>
+    <w:p>
+      <w:pPr>
+        <w:pStyle w:val="FirstParagraph"/>
+      </w:pPr>
+      <w:r>
         <w:rPr>
           <w:b/>
           <w:bCs/>
@@ -19728,7 +22322,27 @@
         <w:t xml:space="preserve"> </w:t>
       </w:r>
       <w:r>
-        <w:t xml:space="preserve">mark; pilot recall 1 of 5, exact Clopper–Pearson 95% CI 0.5–71.6%; conservative class-averaged bound 0.19–0.73). Our prospectively declared negative result applies to linear models and decision stumps; exploratory depth-3 decision trees yielded cross-validated AUCs of 0.595–0.621 with upper confidence bounds near 0.73, and thus remain statistically inconclusive. Across the telemetry features, rules, models, and</w:t>
+        <w:t xml:space="preserve">mark; pilot recall 1 of 5, exact Clopper–Pearson 95% CI 0.5–71.6%; conservative class-averaged bound 0.19–0.73). Our prospectively declared negative result applies to linear models and decision stumps; exploratory depth-3 decision trees across cut-offs yielded AUCs of 0.366–0.603 (upper bounds 0.519–0.724), with the upper bound dropping to 0.524 at</w:t>
+      </w:r>
+      <w:r>
+        <w:t xml:space="preserve"> </w:t>
+      </w:r>
+      <m:oMath>
+        <m:r>
+          <m:t>m</m:t>
+        </m:r>
+        <m:r>
+          <m:rPr>
+            <m:sty m:val="p"/>
+          </m:rPr>
+          <m:t>=</m:t>
+        </m:r>
+        <m:r>
+          <m:t>10</m:t>
+        </m:r>
+      </m:oMath>
+      <w:r>
+        <w:t xml:space="preserve"> s, confirming that non-linear trees also fall within chance under leakage control. Across the telemetry features, rules, models, and</w:t>
       </w:r>
       <w:r>
         <w:t xml:space="preserve"> </w:t>
@@ -19832,47 +22446,80 @@
         <w:t xml:space="preserve"> </w:t>
       </w:r>
       <w:r>
-        <w:t xml:space="preserve">While cross-sectional models on the discovery sample showed high apparent separation (AUC 0.88), our decomposition demonstrated that vehicle-grouped cross-validation (0.884) and crash-window removal (0.860) made no detectable difference. Instead, changing the comparison population from other aircraft’s normal flights to the same aircraft’s earlier flights lowered AUC from about 0.83–0.88 to 0.53–0.57. On the identical 372 flights of the multi-flight cohort, cross-sectional evaluation (0.529 [0.453, 0.607]) and within-drone Group-CV (0.569 [0.493, 0.645]; cluster bootstrap 95% CI [0.500, 0.643]) yielded overlapping intervals that both span chance (0.50), confirming that no within-drone precursor signal is detectable. This indicates that high apparent cross-sectional separation was an artifact of between-airframe confounding and operational flight envelope differences (in the discovery sample, flight duration alone yields AUC 0.662 at</w:t>
-      </w:r>
-      <w:r>
-        <w:t xml:space="preserve"> </w:t>
-      </w:r>
-      <m:oMath>
-        <m:r>
-          <m:t>m</m:t>
-        </m:r>
-        <m:r>
-          <m:rPr>
-            <m:sty m:val="p"/>
-          </m:rPr>
-          <m:t>=</m:t>
-        </m:r>
-        <m:r>
-          <m:t>0</m:t>
-        </m:r>
-      </m:oMath>
-      <w:r>
-        <w:t xml:space="preserve"> s and 0.634 at</w:t>
-      </w:r>
-      <w:r>
-        <w:t xml:space="preserve"> </w:t>
-      </w:r>
-      <m:oMath>
-        <m:r>
-          <m:t>m</m:t>
-        </m:r>
-        <m:r>
-          <m:rPr>
-            <m:sty m:val="p"/>
-          </m:rPr>
-          <m:t>=</m:t>
-        </m:r>
-        <m:r>
-          <m:t>10</m:t>
-        </m:r>
-      </m:oMath>
-      <w:r>
-        <w:t xml:space="preserve"> s), establishing that diagnostic models must be evaluated against an airframe’s own longitudinal baseline rather than cross-sectional fleet averages. Diagnostic checks were also</w:t>
+        <w:t xml:space="preserve">While cross-sectional models on the discovery sample showed high apparent separation (AUC 0.88), our decomposition demonstrated that vehicle-grouped cross-validation (0.884) and crash-window removal (0.860) made no detectable difference. Crucially, isolating cohort selection from comparison population effects reveals that evaluating the exact same 67 multi-flight crashes against independent other-aircraft normal flights collapses model AUC to 0.522 [0.413, 0.615] (Step 4b). This proves that the drop from 0.83–0.88 to 0.53–0.57 is primarily driven by cohort selection across evaluation samples (the multi-flight cohort lacks separable precursors cross-sectionally as well as longitudinally), rather than by within-drone baseline adjustment alone. On the identical 372 flights of the multi-flight cohort, cross-sectional evaluation (0.529 [0.453, 0.607]) and within-drone Group-CV (0.569 [0.493, 0.645]; cluster bootstrap 95% CI [0.500, 0.643]; pairwise mean AUC 0.592 [0.516, 0.692]) yielded overlapping intervals that all span chance (0.50), confirming that no within-drone precursor signal is detectable under uncalipered matching. However, controlling for feature-window duration within drones via caliper matching (</w:t>
+      </w:r>
+      <m:oMath>
+        <m:r>
+          <m:rPr>
+            <m:sty m:val="p"/>
+          </m:rPr>
+          <m:t>|</m:t>
+        </m:r>
+        <m:r>
+          <m:rPr>
+            <m:sty m:val="p"/>
+          </m:rPr>
+          <m:t>Δ</m:t>
+        </m:r>
+        <m:r>
+          <m:rPr>
+            <m:sty m:val="p"/>
+          </m:rPr>
+          <m:t>ln</m:t>
+        </m:r>
+        <m:r>
+          <m:rPr>
+            <m:sty m:val="p"/>
+          </m:rPr>
+          <m:t>(</m:t>
+        </m:r>
+        <m:r>
+          <m:rPr>
+            <m:nor/>
+          </m:rPr>
+          <m:t>duration</m:t>
+        </m:r>
+        <m:r>
+          <m:rPr>
+            <m:sty m:val="p"/>
+          </m:rPr>
+          <m:t>)</m:t>
+        </m:r>
+        <m:r>
+          <m:rPr>
+            <m:sty m:val="p"/>
+          </m:rPr>
+          <m:t>|</m:t>
+        </m:r>
+        <m:r>
+          <m:rPr>
+            <m:sty m:val="p"/>
+          </m:rPr>
+          <m:t>≤</m:t>
+        </m:r>
+        <m:r>
+          <m:t>0.25</m:t>
+        </m:r>
+      </m:oMath>
+      <w:r>
+        <w:t xml:space="preserve">) lifts within-drone AUC from 0.532 to 0.642 (</w:t>
+      </w:r>
+      <m:oMath>
+        <m:r>
+          <m:rPr>
+            <m:sty m:val="p"/>
+          </m:rPr>
+          <m:t>+</m:t>
+        </m:r>
+        <m:r>
+          <m:t>0.110</m:t>
+        </m:r>
+      </m:oMath>
+      <w:r>
+        <w:t xml:space="preserve"> </w:t>
+      </w:r>
+      <w:r>
+        <w:t xml:space="preserve">on the exact same 36 airframes), establishing that baseline duration differences between crash and non-crash flights actively suppress within-drone precursor detection. Diagnostic checks were also</w:t>
       </w:r>
       <w:r>
         <w:t xml:space="preserve"> </w:t>
@@ -19978,13 +22625,13 @@
         <w:t xml:space="preserve"> </w:t>
       </w:r>
       <w:r>
-        <w:t xml:space="preserve">exhibit the same pattern. Regardless of the precise mechanism, diagnostic evaluations must remove the crash window and</w:t>
-      </w:r>
-      <w:r>
-        <w:t xml:space="preserve"> </w:t>
-      </w:r>
-      <w:r>
-        <w:t xml:space="preserve">compare against an aircraft’s own operating baseline before claiming pre-crash anticipation.</w:t>
+        <w:t xml:space="preserve">exhibit the same pattern. Regardless of the precise mechanism, diagnostic evaluations must remove the crash window,</w:t>
+      </w:r>
+      <w:r>
+        <w:t xml:space="preserve"> </w:t>
+      </w:r>
+      <w:r>
+        <w:t xml:space="preserve">control for flight duration, and compare against an aircraft’s own operating baseline before claiming pre-crash anticipation.</w:t>
       </w:r>
     </w:p>
     <w:p>
@@ -20663,7 +23310,7 @@
       <w:pPr>
         <w:pStyle w:val="Heading1"/>
       </w:pPr>
-      <w:bookmarkStart w:id="69" w:name="_82b82981e21bad8167d56d1f0b74a832e215810"/>
+      <w:bookmarkStart w:id="71" w:name="_82b82981e21bad8167d56d1f0b74a832e215810"/>
       <w:r>
         <w:rPr>
           <w:rStyle w:val="SectionNumber"/>
@@ -20676,7 +23323,7 @@
       <w:r>
         <w:t xml:space="preserve">Threats to validity</w:t>
       </w:r>
-      <w:bookmarkEnd w:id="69"/>
+      <w:bookmarkEnd w:id="71"/>
     </w:p>
     <w:p>
       <w:pPr>
@@ -21700,7 +24347,7 @@
       <w:pPr>
         <w:pStyle w:val="Heading1"/>
       </w:pPr>
-      <w:bookmarkStart w:id="70" w:name="_0cf7f8e9027f9f9352f3019b4ede1d43d537ff7"/>
+      <w:bookmarkStart w:id="72" w:name="_0cf7f8e9027f9f9352f3019b4ede1d43d537ff7"/>
       <w:r>
         <w:rPr>
           <w:rStyle w:val="SectionNumber"/>
@@ -21712,232 +24359,6 @@
       </w:r>
       <w:r>
         <w:t xml:space="preserve">Conclusion</w:t>
-      </w:r>
-      <w:bookmarkEnd w:id="70"/>
-    </w:p>
-    <w:p>
-      <w:pPr>
-        <w:pStyle w:val="FirstParagraph"/>
-      </w:pPr>
-      <w:r>
-        <w:t xml:space="preserve">Across 590 crash-rated logs from an archive index of 479,547 flights, telemetry features, rules, and statistical models</w:t>
-      </w:r>
-      <w:r>
-        <w:t xml:space="preserve"> </w:t>
-      </w:r>
-      <w:r>
-        <w:t xml:space="preserve">did not distinguish pilot-caused from aircraft-caused crashes above chance: cross-validated AUCs (0.41–0.50, upper bounds</w:t>
-      </w:r>
-      <w:r>
-        <w:t xml:space="preserve"> </w:t>
-      </w:r>
-      <m:oMath>
-        <m:r>
-          <m:rPr>
-            <m:sty m:val="p"/>
-          </m:rPr>
-          <m:t>≤</m:t>
-        </m:r>
-        <m:r>
-          <m:t>0.619</m:t>
-        </m:r>
-      </m:oMath>
-      <w:r>
-        <w:t xml:space="preserve">; depth-3 trees inconclusive at 0.595–0.621 with upper bounds near 0.73)</w:t>
-      </w:r>
-      <w:r>
-        <w:t xml:space="preserve"> </w:t>
-      </w:r>
-      <w:r>
-        <w:t xml:space="preserve">fall far short of the</w:t>
-      </w:r>
-      <w:r>
-        <w:t xml:space="preserve"> </w:t>
-      </w:r>
-      <m:oMath>
-        <m:r>
-          <m:rPr>
-            <m:sty m:val="p"/>
-          </m:rPr>
-          <m:t>≈</m:t>
-        </m:r>
-        <m:r>
-          <m:t>0.80</m:t>
-        </m:r>
-      </m:oMath>
-      <w:r>
-        <w:t xml:space="preserve"> </w:t>
-      </w:r>
-      <w:r>
-        <w:t xml:space="preserve">needed for operational verdicts, with 80% power requiring an AUC of roughly 0.65 under asymptotic</w:t>
-      </w:r>
-      <w:r>
-        <w:t xml:space="preserve"> </w:t>
-      </w:r>
-      <w:r>
-        <w:t xml:space="preserve">Wilcoxon theory (0.75 under the empirical permutation null) under only 36 pilot-labelled crashes in the modelling sample. Independent evaluation against 43 expert forum</w:t>
-      </w:r>
-      <w:r>
-        <w:t xml:space="preserve"> </w:t>
-      </w:r>
-      <w:r>
-        <w:t xml:space="preserve">cases was statistically inconclusive (balanced accuracy 0.381, Bayesian 95% CrI 0.25–0.61, conservative class-averaged bound 0.19–0.73;</w:t>
-      </w:r>
-      <w:r>
-        <w:t xml:space="preserve"> </w:t>
-      </w:r>
-      <w:r>
-        <w:t xml:space="preserve">cannot exclude the declared 0.70 pass mark; pilot recall 1 of 5; on 34 complete logs, balanced accuracy 30.0% for rule and 45.0% for logistic regression). Configuration protections were disabled at similar rates,</w:t>
-      </w:r>
-      <w:r>
-        <w:t xml:space="preserve"> </w:t>
-      </w:r>
-      <w:r>
-        <w:t xml:space="preserve">and the flight that crashed showed no detectable difference in vibration or rate-tracking error relative to the same drone’s</w:t>
-      </w:r>
-      <w:r>
-        <w:t xml:space="preserve"> </w:t>
-      </w:r>
-      <w:r>
-        <w:t xml:space="preserve">prior flights (95% CI upper bounds 0.58 and 0.63). Changing the comparison population from other aircraft’s normal flights to the same aircraft’s earlier flights lowered model AUC from about 0.83–0.88 to 0.53–0.57; grouping folds by vehicle, removing the crash window, and the cross-sectional versus within-drone scheme made no detectable difference, consistent with between-airframe confounding and operational flight envelope differences. Diagnostic checks were consistent with crash-impact data leakage: tuning</w:t>
-      </w:r>
-      <w:r>
-        <w:t xml:space="preserve"> </w:t>
-      </w:r>
-      <w:r>
-        <w:t xml:space="preserve">fault detection fell from 7/9 [77.8%] to 1/9 [11.1%] sensitivity (unadjusted</w:t>
-      </w:r>
-      <w:r>
-        <w:t xml:space="preserve"> </w:t>
-      </w:r>
-      <m:oMath>
-        <m:r>
-          <m:t>p</m:t>
-        </m:r>
-        <m:r>
-          <m:rPr>
-            <m:sty m:val="p"/>
-          </m:rPr>
-          <m:t>=</m:t>
-        </m:r>
-        <m:r>
-          <m:t>0.031</m:t>
-        </m:r>
-      </m:oMath>
-      <w:r>
-        <w:t xml:space="preserve">, exploratory) once the final 10 s were</w:t>
-      </w:r>
-      <w:r>
-        <w:t xml:space="preserve"> </w:t>
-      </w:r>
-      <w:r>
-        <w:t xml:space="preserve">removed, accompanied by a drop in normal-flight firing from 13% to 5% which suggests that shorter windows also reduce</w:t>
-      </w:r>
-      <w:r>
-        <w:t xml:space="preserve"> </w:t>
-      </w:r>
-      <w:r>
-        <w:t xml:space="preserve">trigger exposure. What the logs did reveal, on older estimator metrics, was a retrospective between-airframe association where</w:t>
-      </w:r>
-      <w:r>
-        <w:t xml:space="preserve"> </w:t>
-      </w:r>
-      <w:r>
-        <w:t xml:space="preserve">drones that later crashed exhibited higher baseline vibration on ordinary flights than matched peers, though replication on</w:t>
-      </w:r>
-      <w:r>
-        <w:t xml:space="preserve"> </w:t>
-      </w:r>
-      <w:r>
-        <w:t xml:space="preserve">newer accelerometer metrics was inconclusive (</w:t>
-      </w:r>
-      <m:oMath>
-        <m:r>
-          <m:t>p</m:t>
-        </m:r>
-        <m:r>
-          <m:rPr>
-            <m:sty m:val="p"/>
-          </m:rPr>
-          <m:t>=</m:t>
-        </m:r>
-        <m:r>
-          <m:t>0.25</m:t>
-        </m:r>
-      </m:oMath>
-      <w:r>
-        <w:t xml:space="preserve">). As an exploratory illustration, screening against 107 stratum-matched fleet controls achieves an</w:t>
-      </w:r>
-      <w:r>
-        <w:t xml:space="preserve"> </w:t>
-      </w:r>
-      <w:r>
-        <w:t xml:space="preserve">operational lift of</w:t>
-      </w:r>
-      <w:r>
-        <w:t xml:space="preserve"> </w:t>
-      </w:r>
-      <m:oMath>
-        <m:r>
-          <m:t>3.3</m:t>
-        </m:r>
-        <m:r>
-          <m:rPr>
-            <m:sty m:val="p"/>
-          </m:rPr>
-          <m:t>×</m:t>
-        </m:r>
-      </m:oMath>
-      <w:r>
-        <w:t xml:space="preserve"> </w:t>
-      </w:r>
-      <w:r>
-        <w:t xml:space="preserve">over base rate (illustrative PPV 2.26–2.43% [exact Bayes], 41.2–44.2 inspections per crash at an assumed 10% flag rate) across screenable (0.69%) and fleet-wide (0.74%)</w:t>
-      </w:r>
-      <w:r>
-        <w:t xml:space="preserve"> </w:t>
-      </w:r>
-      <w:r>
-        <w:t xml:space="preserve">vehicle base rates (0.96–1.04% under empirical matched-set screening). Flight log analytics for drone fleets should prioritize</w:t>
-      </w:r>
-      <w:r>
-        <w:t xml:space="preserve"> </w:t>
-      </w:r>
-      <w:r>
-        <w:t xml:space="preserve">longitudinal airframe screening and structured evidence review, not automated verdicts. AeroFleet 2.0 implements this approach</w:t>
-      </w:r>
-      <w:r>
-        <w:t xml:space="preserve"> </w:t>
-      </w:r>
-      <w:r>
-        <w:t xml:space="preserve">as an open-source tool, presenting verifiable evidence while leaving diagnostic decisions to human operators.</w:t>
-      </w:r>
-    </w:p>
-    <w:p>
-      <w:pPr>
-        <w:pStyle w:val="Heading1"/>
-      </w:pPr>
-      <w:bookmarkStart w:id="71" w:name="_84dc18e74b75db6057c8c16a8f70e097972540a"/>
-      <w:r>
-        <w:t xml:space="preserve">Declaration of competing interest</w:t>
-      </w:r>
-      <w:bookmarkEnd w:id="71"/>
-    </w:p>
-    <w:p>
-      <w:pPr>
-        <w:pStyle w:val="FirstParagraph"/>
-      </w:pPr>
-      <w:r>
-        <w:t xml:space="preserve">The authors declare that they have no known competing financial interests or personal relationships that could have appeared to influence the work reported in this paper. The authors develop the open-source AeroFleet 2.0 tool described in Section 6; it is not commercial.</w:t>
-      </w:r>
-    </w:p>
-    <w:p>
-      <w:pPr>
-        <w:pStyle w:val="Heading1"/>
-      </w:pPr>
-      <w:bookmarkStart w:id="72" w:name="_1f74eb43af444059c7518034463b6c89b1cacf4"/>
-      <w:r>
-        <w:t xml:space="preserve">Declaration of generative AI and AI-assisted technologies in the manuscript preparation process</w:t>
       </w:r>
       <w:bookmarkEnd w:id="72"/>
     </w:p>
@@ -21946,30 +24367,293 @@
         <w:pStyle w:val="FirstParagraph"/>
       </w:pPr>
       <w:r>
-        <w:t xml:space="preserve">During the preparation of this work the authors used an AI assistant (Claude, Anthropic) to write analysis code, draft</w:t>
-      </w:r>
-      <w:r>
-        <w:t xml:space="preserve"> </w:t>
-      </w:r>
-      <w:r>
-        <w:t xml:space="preserve">and revise text, and assist the recording of forum diagnoses. After using this tool, the authors reviewed and edited</w:t>
-      </w:r>
-      <w:r>
-        <w:t xml:space="preserve"> </w:t>
-      </w:r>
-      <w:r>
-        <w:t xml:space="preserve">the content as needed and take full responsibility for the content of the published article.</w:t>
+        <w:t xml:space="preserve">Across 590 crash-rated logs from an archive index of 479,547 flights, telemetry features, rules, and statistical models</w:t>
+      </w:r>
+      <w:r>
+        <w:t xml:space="preserve"> </w:t>
+      </w:r>
+      <w:r>
+        <w:t xml:space="preserve">did not distinguish pilot-caused from aircraft-caused crashes above chance: cross-validated AUCs (0.41–0.50, upper bounds</w:t>
+      </w:r>
+      <w:r>
+        <w:t xml:space="preserve"> </w:t>
+      </w:r>
+      <m:oMath>
+        <m:r>
+          <m:rPr>
+            <m:sty m:val="p"/>
+          </m:rPr>
+          <m:t>≤</m:t>
+        </m:r>
+        <m:r>
+          <m:t>0.619</m:t>
+        </m:r>
+      </m:oMath>
+      <w:r>
+        <w:t xml:space="preserve">; depth-3 trees 0.38–0.60, upper bounds</w:t>
+      </w:r>
+      <w:r>
+        <w:t xml:space="preserve"> </w:t>
+      </w:r>
+      <m:oMath>
+        <m:r>
+          <m:rPr>
+            <m:sty m:val="p"/>
+          </m:rPr>
+          <m:t>≤</m:t>
+        </m:r>
+        <m:r>
+          <m:t>0.724</m:t>
+        </m:r>
+      </m:oMath>
+      <w:r>
+        <w:t xml:space="preserve">, falling to 0.524 at</w:t>
+      </w:r>
+      <w:r>
+        <w:t xml:space="preserve"> </w:t>
+      </w:r>
+      <m:oMath>
+        <m:r>
+          <m:t>m</m:t>
+        </m:r>
+        <m:r>
+          <m:rPr>
+            <m:sty m:val="p"/>
+          </m:rPr>
+          <m:t>=</m:t>
+        </m:r>
+        <m:r>
+          <m:t>10</m:t>
+        </m:r>
+      </m:oMath>
+      <w:r>
+        <w:t xml:space="preserve"> s)</w:t>
+      </w:r>
+      <w:r>
+        <w:t xml:space="preserve"> </w:t>
+      </w:r>
+      <w:r>
+        <w:t xml:space="preserve">fall far short of the</w:t>
+      </w:r>
+      <w:r>
+        <w:t xml:space="preserve"> </w:t>
+      </w:r>
+      <m:oMath>
+        <m:r>
+          <m:rPr>
+            <m:sty m:val="p"/>
+          </m:rPr>
+          <m:t>≈</m:t>
+        </m:r>
+        <m:r>
+          <m:t>0.80</m:t>
+        </m:r>
+      </m:oMath>
+      <w:r>
+        <w:t xml:space="preserve"> </w:t>
+      </w:r>
+      <w:r>
+        <w:t xml:space="preserve">needed for operational verdicts, with 80% power requiring an AUC of roughly 0.65 under asymptotic</w:t>
+      </w:r>
+      <w:r>
+        <w:t xml:space="preserve"> </w:t>
+      </w:r>
+      <w:r>
+        <w:t xml:space="preserve">Wilcoxon theory (0.75 under the empirical permutation null) under only 36 pilot-labelled crashes in the modelling sample. Independent evaluation against 43 expert forum</w:t>
+      </w:r>
+      <w:r>
+        <w:t xml:space="preserve"> </w:t>
+      </w:r>
+      <w:r>
+        <w:t xml:space="preserve">cases was statistically inconclusive (balanced accuracy 0.381, Bayesian 95% CrI 0.25–0.61, conservative class-averaged bound 0.19–0.73;</w:t>
+      </w:r>
+      <w:r>
+        <w:t xml:space="preserve"> </w:t>
+      </w:r>
+      <w:r>
+        <w:t xml:space="preserve">cannot exclude the declared 0.70 pass mark; pilot recall 1 of 5; on 34 complete logs, balanced accuracy 30.0% for rule and 45.0% for logistic regression). Configuration protections were disabled at similar rates,</w:t>
+      </w:r>
+      <w:r>
+        <w:t xml:space="preserve"> </w:t>
+      </w:r>
+      <w:r>
+        <w:t xml:space="preserve">and the flight that crashed showed no detectable difference in vibration or rate-tracking error relative to the same drone’s</w:t>
+      </w:r>
+      <w:r>
+        <w:t xml:space="preserve"> </w:t>
+      </w:r>
+      <w:r>
+        <w:t xml:space="preserve">prior flights (95% CI upper bounds 0.58 and 0.63). Changing the comparison population from other aircraft’s normal flights to the same aircraft’s earlier flights lowered model AUC from about 0.83–0.88 to 0.53–0.57; grouping folds by vehicle, removing the crash window, and the cross-sectional versus within-drone scheme made no detectable difference, consistent with between-airframe confounding and operational flight envelope differences. Diagnostic checks were consistent with crash-impact data leakage: tuning</w:t>
+      </w:r>
+      <w:r>
+        <w:t xml:space="preserve"> </w:t>
+      </w:r>
+      <w:r>
+        <w:t xml:space="preserve">fault detection fell from 7/9 [77.8%] to 1/9 [11.1%] sensitivity (unadjusted</w:t>
+      </w:r>
+      <w:r>
+        <w:t xml:space="preserve"> </w:t>
+      </w:r>
+      <m:oMath>
+        <m:r>
+          <m:t>p</m:t>
+        </m:r>
+        <m:r>
+          <m:rPr>
+            <m:sty m:val="p"/>
+          </m:rPr>
+          <m:t>=</m:t>
+        </m:r>
+        <m:r>
+          <m:t>0.031</m:t>
+        </m:r>
+      </m:oMath>
+      <w:r>
+        <w:t xml:space="preserve">, exploratory) once the final 10 s were</w:t>
+      </w:r>
+      <w:r>
+        <w:t xml:space="preserve"> </w:t>
+      </w:r>
+      <w:r>
+        <w:t xml:space="preserve">removed, accompanied by a drop in normal-flight firing from 13% to 5% which suggests that shorter windows also reduce</w:t>
+      </w:r>
+      <w:r>
+        <w:t xml:space="preserve"> </w:t>
+      </w:r>
+      <w:r>
+        <w:t xml:space="preserve">trigger exposure. What the logs did reveal, on older estimator metrics, was a retrospective between-airframe association where</w:t>
+      </w:r>
+      <w:r>
+        <w:t xml:space="preserve"> </w:t>
+      </w:r>
+      <w:r>
+        <w:t xml:space="preserve">drones that later crashed exhibited higher baseline vibration on ordinary flights than matched peers, though replication on</w:t>
+      </w:r>
+      <w:r>
+        <w:t xml:space="preserve"> </w:t>
+      </w:r>
+      <w:r>
+        <w:t xml:space="preserve">newer accelerometer metrics was inconclusive (</w:t>
+      </w:r>
+      <m:oMath>
+        <m:r>
+          <m:t>p</m:t>
+        </m:r>
+        <m:r>
+          <m:rPr>
+            <m:sty m:val="p"/>
+          </m:rPr>
+          <m:t>=</m:t>
+        </m:r>
+        <m:r>
+          <m:t>0.25</m:t>
+        </m:r>
+      </m:oMath>
+      <w:r>
+        <w:t xml:space="preserve">). As an exploratory illustration, screening against 107 stratum-matched fleet controls achieves an</w:t>
+      </w:r>
+      <w:r>
+        <w:t xml:space="preserve"> </w:t>
+      </w:r>
+      <w:r>
+        <w:t xml:space="preserve">operational lift of</w:t>
+      </w:r>
+      <w:r>
+        <w:t xml:space="preserve"> </w:t>
+      </w:r>
+      <m:oMath>
+        <m:r>
+          <m:t>3.3</m:t>
+        </m:r>
+        <m:r>
+          <m:rPr>
+            <m:sty m:val="p"/>
+          </m:rPr>
+          <m:t>×</m:t>
+        </m:r>
+      </m:oMath>
+      <w:r>
+        <w:t xml:space="preserve"> </w:t>
+      </w:r>
+      <w:r>
+        <w:t xml:space="preserve">over base rate (illustrative PPV 2.26–2.43% [exact Bayes], 41.2–44.2 inspections per crash at an assumed 10% flag rate) across screenable (0.69%) and fleet-wide (0.74%)</w:t>
+      </w:r>
+      <w:r>
+        <w:t xml:space="preserve"> </w:t>
+      </w:r>
+      <w:r>
+        <w:t xml:space="preserve">vehicle base rates (0.96–1.04% under empirical matched-set screening). Flight log analytics for drone fleets should prioritize</w:t>
+      </w:r>
+      <w:r>
+        <w:t xml:space="preserve"> </w:t>
+      </w:r>
+      <w:r>
+        <w:t xml:space="preserve">longitudinal airframe screening and structured evidence review, not automated verdicts. AeroFleet 2.0 implements this approach</w:t>
+      </w:r>
+      <w:r>
+        <w:t xml:space="preserve"> </w:t>
+      </w:r>
+      <w:r>
+        <w:t xml:space="preserve">as an open-source tool, presenting verifiable evidence while leaving diagnostic decisions to human operators.</w:t>
       </w:r>
     </w:p>
     <w:p>
       <w:pPr>
         <w:pStyle w:val="Heading1"/>
       </w:pPr>
-      <w:bookmarkStart w:id="73" w:name="_ea5c66868f283220c19382d0fdd5a852ec570ca"/>
+      <w:bookmarkStart w:id="73" w:name="_84dc18e74b75db6057c8c16a8f70e097972540a"/>
+      <w:r>
+        <w:t xml:space="preserve">Declaration of competing interest</w:t>
+      </w:r>
+      <w:bookmarkEnd w:id="73"/>
+    </w:p>
+    <w:p>
+      <w:pPr>
+        <w:pStyle w:val="FirstParagraph"/>
+      </w:pPr>
+      <w:r>
+        <w:t xml:space="preserve">The authors declare that they have no known competing financial interests or personal relationships that could have appeared to influence the work reported in this paper. The authors develop the open-source AeroFleet 2.0 tool described in Section 6; it is not commercial.</w:t>
+      </w:r>
+    </w:p>
+    <w:p>
+      <w:pPr>
+        <w:pStyle w:val="Heading1"/>
+      </w:pPr>
+      <w:bookmarkStart w:id="74" w:name="_1f74eb43af444059c7518034463b6c89b1cacf4"/>
+      <w:r>
+        <w:t xml:space="preserve">Declaration of generative AI and AI-assisted technologies in the manuscript preparation process</w:t>
+      </w:r>
+      <w:bookmarkEnd w:id="74"/>
+    </w:p>
+    <w:p>
+      <w:pPr>
+        <w:pStyle w:val="FirstParagraph"/>
+      </w:pPr>
+      <w:r>
+        <w:t xml:space="preserve">During the preparation of this work the authors used an AI assistant (Claude, Anthropic) to write analysis code, draft</w:t>
+      </w:r>
+      <w:r>
+        <w:t xml:space="preserve"> </w:t>
+      </w:r>
+      <w:r>
+        <w:t xml:space="preserve">and revise text, and assist the recording of forum diagnoses. After using this tool, the authors reviewed and edited</w:t>
+      </w:r>
+      <w:r>
+        <w:t xml:space="preserve"> </w:t>
+      </w:r>
+      <w:r>
+        <w:t xml:space="preserve">the content as needed and take full responsibility for the content of the published article.</w:t>
+      </w:r>
+    </w:p>
+    <w:p>
+      <w:pPr>
+        <w:pStyle w:val="Heading1"/>
+      </w:pPr>
+      <w:bookmarkStart w:id="75" w:name="_ea5c66868f283220c19382d0fdd5a852ec570ca"/>
       <w:r>
         <w:t xml:space="preserve">Data availability</w:t>
       </w:r>
-      <w:bookmarkEnd w:id="73"/>
+      <w:bookmarkEnd w:id="75"/>
     </w:p>
     <w:p>
       <w:pPr>
@@ -22009,11 +24693,11 @@
       <w:pPr>
         <w:pStyle w:val="Heading1"/>
       </w:pPr>
-      <w:bookmarkStart w:id="74" w:name="_funding"/>
+      <w:bookmarkStart w:id="76" w:name="_funding"/>
       <w:r>
         <w:t xml:space="preserve">Funding</w:t>
       </w:r>
-      <w:bookmarkEnd w:id="74"/>
+      <w:bookmarkEnd w:id="76"/>
     </w:p>
     <w:p>
       <w:pPr>
@@ -22033,14 +24717,14 @@
       <w:pPr>
         <w:pStyle w:val="Heading1"/>
       </w:pPr>
-      <w:bookmarkStart w:id="75" w:name="_bibliography"/>
+      <w:bookmarkStart w:id="77" w:name="_bibliography"/>
       <w:r>
         <w:t xml:space="preserve">References</w:t>
       </w:r>
-      <w:bookmarkEnd w:id="75"/>
+      <w:bookmarkEnd w:id="77"/>
     </w:p>
-    <w:bookmarkStart w:id="131" w:name="_refs"/>
-    <w:bookmarkStart w:id="76" w:name="_94e90323a8c21041104ada5ef51239cca731079"/>
+    <w:bookmarkStart w:id="133" w:name="_refs"/>
+    <w:bookmarkStart w:id="78" w:name="_94e90323a8c21041104ada5ef51239cca731079"/>
     <w:p>
       <w:pPr>
         <w:pStyle w:val="Bibliography"/>
@@ -22067,8 +24751,8 @@
         <w:t xml:space="preserve">, (2019).</w:t>
       </w:r>
     </w:p>
-    <w:bookmarkEnd w:id="76"/>
-    <w:bookmarkStart w:id="77" w:name="_accb9f9d732da81043c804de081f8bf74e6cf24"/>
+    <w:bookmarkEnd w:id="78"/>
+    <w:bookmarkStart w:id="79" w:name="_accb9f9d732da81043c804de081f8bf74e6cf24"/>
     <w:p>
       <w:pPr>
         <w:pStyle w:val="Bibliography"/>
@@ -22095,8 +24779,8 @@
         <w:t xml:space="preserve">, (2026).</w:t>
       </w:r>
     </w:p>
-    <w:bookmarkEnd w:id="77"/>
-    <w:bookmarkStart w:id="78" w:name="_2a610b70f77ace96e6ffe48ed026a6e5f9efd5a"/>
+    <w:bookmarkEnd w:id="79"/>
+    <w:bookmarkStart w:id="80" w:name="_2a610b70f77ace96e6ffe48ed026a6e5f9efd5a"/>
     <w:p>
       <w:pPr>
         <w:pStyle w:val="Bibliography"/>
@@ -22123,8 +24807,8 @@
         <w:t xml:space="preserve">, (2021).</w:t>
       </w:r>
     </w:p>
-    <w:bookmarkEnd w:id="78"/>
-    <w:bookmarkStart w:id="79" w:name="_dffd97137af0abb4aae0ff556af3c0d05e0ee4a"/>
+    <w:bookmarkEnd w:id="80"/>
+    <w:bookmarkStart w:id="81" w:name="_dffd97137af0abb4aae0ff556af3c0d05e0ee4a"/>
     <w:p>
       <w:pPr>
         <w:pStyle w:val="Bibliography"/>
@@ -22151,8 +24835,8 @@
         <w:t xml:space="preserve">, (2026).</w:t>
       </w:r>
     </w:p>
-    <w:bookmarkEnd w:id="79"/>
-    <w:bookmarkStart w:id="81" w:name="_398d8a6b28c132ef0c87de1470cc655ebafd86c"/>
+    <w:bookmarkEnd w:id="81"/>
+    <w:bookmarkStart w:id="83" w:name="_398d8a6b28c132ef0c87de1470cc655ebafd86c"/>
     <w:p>
       <w:pPr>
         <w:pStyle w:val="Bibliography"/>
@@ -22178,7 +24862,7 @@
       <w:r>
         <w:t xml:space="preserve">-agents driven automated simulation testing and analysis of small uncrewed aerial systems, in: 2025 IEEE/ACM 47th International Conference on Software Engineering (ICSE), 2025: pp. 385–397. https://doi.org/</w:t>
       </w:r>
-      <w:hyperlink r:id="rId80">
+      <w:hyperlink r:id="rId82">
         <w:r>
           <w:rPr>
             <w:rStyle w:val="Hyperlink"/>
@@ -22190,8 +24874,8 @@
         <w:t xml:space="preserve">.</w:t>
       </w:r>
     </w:p>
-    <w:bookmarkEnd w:id="81"/>
-    <w:bookmarkStart w:id="83" w:name="_4d7bbda75dad34c83d023e6afa1cc5b99fb5426"/>
+    <w:bookmarkEnd w:id="83"/>
+    <w:bookmarkStart w:id="85" w:name="_4d7bbda75dad34c83d023e6afa1cc5b99fb5426"/>
     <w:p>
       <w:pPr>
         <w:pStyle w:val="Bibliography"/>
@@ -22226,7 +24910,7 @@
       <w:r>
         <w:t xml:space="preserve">, Forensic Science International: Digital Investigation 56 (2026) 302051. https://doi.org/</w:t>
       </w:r>
-      <w:hyperlink r:id="rId82">
+      <w:hyperlink r:id="rId84">
         <w:r>
           <w:rPr>
             <w:rStyle w:val="Hyperlink"/>
@@ -22238,8 +24922,8 @@
         <w:t xml:space="preserve">.</w:t>
       </w:r>
     </w:p>
-    <w:bookmarkEnd w:id="83"/>
-    <w:bookmarkStart w:id="84" w:name="_006a7190097400c6c37363d97b6f3be0cdc0b48"/>
+    <w:bookmarkEnd w:id="85"/>
+    <w:bookmarkStart w:id="86" w:name="_006a7190097400c6c37363d97b6f3be0cdc0b48"/>
     <w:p>
       <w:pPr>
         <w:pStyle w:val="Bibliography"/>
@@ -22257,8 +24941,8 @@
         <w:t xml:space="preserve">D.A. Wiegmann, S.A. Shappell, A human error approach to aviation accident analysis: The human factors analysis and classification system, Ashgate, Aldershot, 2003.</w:t>
       </w:r>
     </w:p>
-    <w:bookmarkEnd w:id="84"/>
-    <w:bookmarkStart w:id="86" w:name="_3541019a36f31423dbace231a12fca4d5e5f1ad"/>
+    <w:bookmarkEnd w:id="86"/>
+    <w:bookmarkStart w:id="88" w:name="_3541019a36f31423dbace231a12fca4d5e5f1ad"/>
     <w:p>
       <w:pPr>
         <w:pStyle w:val="Bibliography"/>
@@ -22275,7 +24959,7 @@
       <w:r>
         <w:t xml:space="preserve">S. Kaufman, S. Rosset, C. Perlich, O. Stitelman, Leakage in data mining: Formulation, detection, and avoidance, ACM Transactions on Knowledge Discovery from Data 6 (2012) 15:1–15:21. https://doi.org/</w:t>
       </w:r>
-      <w:hyperlink r:id="rId85">
+      <w:hyperlink r:id="rId87">
         <w:r>
           <w:rPr>
             <w:rStyle w:val="Hyperlink"/>
@@ -22287,8 +24971,8 @@
         <w:t xml:space="preserve">.</w:t>
       </w:r>
     </w:p>
-    <w:bookmarkEnd w:id="86"/>
-    <w:bookmarkStart w:id="88" w:name="_77239db318a405bdd9ca0cc5db74d4c41b2a03f"/>
+    <w:bookmarkEnd w:id="88"/>
+    <w:bookmarkStart w:id="90" w:name="_77239db318a405bdd9ca0cc5db74d4c41b2a03f"/>
     <w:p>
       <w:pPr>
         <w:pStyle w:val="Bibliography"/>
@@ -22305,7 +24989,7 @@
       <w:r>
         <w:t xml:space="preserve">S. Kapoor, A. Narayanan, Leakage and the reproducibility crisis in machine-learning-based science, Patterns 4 (2023) 100804. https://doi.org/</w:t>
       </w:r>
-      <w:hyperlink r:id="rId87">
+      <w:hyperlink r:id="rId89">
         <w:r>
           <w:rPr>
             <w:rStyle w:val="Hyperlink"/>
@@ -22317,8 +25001,8 @@
         <w:t xml:space="preserve">.</w:t>
       </w:r>
     </w:p>
-    <w:bookmarkEnd w:id="88"/>
-    <w:bookmarkStart w:id="90" w:name="_d75d7cf63098afa5d33e189bc1a163022e7ecdc"/>
+    <w:bookmarkEnd w:id="90"/>
+    <w:bookmarkStart w:id="92" w:name="_d75d7cf63098afa5d33e189bc1a163022e7ecdc"/>
     <w:p>
       <w:pPr>
         <w:pStyle w:val="Bibliography"/>
@@ -22356,7 +25040,7 @@
       <w:r>
         <w:t xml:space="preserve">fault and anomaly detection, The International Journal of Robotics Research 40 (2021) 515–520. https://doi.org/</w:t>
       </w:r>
-      <w:hyperlink r:id="rId89">
+      <w:hyperlink r:id="rId91">
         <w:r>
           <w:rPr>
             <w:rStyle w:val="Hyperlink"/>
@@ -22368,8 +25052,8 @@
         <w:t xml:space="preserve">.</w:t>
       </w:r>
     </w:p>
-    <w:bookmarkEnd w:id="90"/>
-    <w:bookmarkStart w:id="92" w:name="_446d2d8311e3f2ab8e5f2830e712f064a3280b9"/>
+    <w:bookmarkEnd w:id="92"/>
+    <w:bookmarkStart w:id="94" w:name="_446d2d8311e3f2ab8e5f2830e712f064a3280b9"/>
     <w:p>
       <w:pPr>
         <w:pStyle w:val="Bibliography"/>
@@ -22395,7 +25079,7 @@
       <w:r>
         <w:t xml:space="preserve">: A dataset for multicopter fault detection and health assessment, The International Journal of Robotics Research 44 (2025) 1081–1092. https://doi.org/</w:t>
       </w:r>
-      <w:hyperlink r:id="rId91">
+      <w:hyperlink r:id="rId93">
         <w:r>
           <w:rPr>
             <w:rStyle w:val="Hyperlink"/>
@@ -22407,8 +25091,8 @@
         <w:t xml:space="preserve">.</w:t>
       </w:r>
     </w:p>
-    <w:bookmarkEnd w:id="92"/>
-    <w:bookmarkStart w:id="93" w:name="_973650d78dc352a8b25ace59ab002a1d91cdfc9"/>
+    <w:bookmarkEnd w:id="94"/>
+    <w:bookmarkStart w:id="95" w:name="_973650d78dc352a8b25ace59ab002a1d91cdfc9"/>
     <w:p>
       <w:pPr>
         <w:pStyle w:val="Bibliography"/>
@@ -22444,8 +25128,8 @@
         <w:t xml:space="preserve">, (2026).</w:t>
       </w:r>
     </w:p>
-    <w:bookmarkEnd w:id="93"/>
-    <w:bookmarkStart w:id="95" w:name="_42246838952b0ed0d35bd475d264714b9e743f7"/>
+    <w:bookmarkEnd w:id="95"/>
+    <w:bookmarkStart w:id="97" w:name="_42246838952b0ed0d35bd475d264714b9e743f7"/>
     <w:p>
       <w:pPr>
         <w:pStyle w:val="Bibliography"/>
@@ -22462,7 +25146,7 @@
       <w:r>
         <w:t xml:space="preserve">G. Wild, J. Murray, G. Baxter, Exploring civil drone accidents and incidents to help prevent potential air disasters, Aerospace 3 (2016) 22. https://doi.org/</w:t>
       </w:r>
-      <w:hyperlink r:id="rId94">
+      <w:hyperlink r:id="rId96">
         <w:r>
           <w:rPr>
             <w:rStyle w:val="Hyperlink"/>
@@ -22474,8 +25158,8 @@
         <w:t xml:space="preserve">.</w:t>
       </w:r>
     </w:p>
-    <w:bookmarkEnd w:id="95"/>
-    <w:bookmarkStart w:id="96" w:name="_b513b568a9a02649a1ddc461a1dd01e876732a2"/>
+    <w:bookmarkEnd w:id="97"/>
+    <w:bookmarkStart w:id="98" w:name="_b513b568a9a02649a1ddc461a1dd01e876732a2"/>
     <w:p>
       <w:pPr>
         <w:pStyle w:val="Bibliography"/>
@@ -22502,8 +25186,8 @@
         <w:t xml:space="preserve">, AAIB, Department for Transport, Farnborough, UK, 2026.</w:t>
       </w:r>
     </w:p>
-    <w:bookmarkEnd w:id="96"/>
-    <w:bookmarkStart w:id="98" w:name="_7bef8dc44b5ed9bb7ced7ca5f392a78a76d6601"/>
+    <w:bookmarkEnd w:id="98"/>
+    <w:bookmarkStart w:id="100" w:name="_7bef8dc44b5ed9bb7ced7ca5f392a78a76d6601"/>
     <w:p>
       <w:pPr>
         <w:pStyle w:val="Bibliography"/>
@@ -22529,7 +25213,7 @@
       <w:r>
         <w:t xml:space="preserve">: A node-based multithreaded open source robotics framework for deeply embedded platforms, in: 2015 IEEE International Conference on Robotics and Automation (ICRA), 2015: pp. 6235–6240. https://doi.org/</w:t>
       </w:r>
-      <w:hyperlink r:id="rId97">
+      <w:hyperlink r:id="rId99">
         <w:r>
           <w:rPr>
             <w:rStyle w:val="Hyperlink"/>
@@ -22541,8 +25225,8 @@
         <w:t xml:space="preserve">.</w:t>
       </w:r>
     </w:p>
-    <w:bookmarkEnd w:id="98"/>
-    <w:bookmarkStart w:id="99" w:name="_d96f71c5379cbcad3bc75bfc7936eeacbaeb4ed"/>
+    <w:bookmarkEnd w:id="100"/>
+    <w:bookmarkStart w:id="101" w:name="_d96f71c5379cbcad3bc75bfc7936eeacbaeb4ed"/>
     <w:p>
       <w:pPr>
         <w:pStyle w:val="Bibliography"/>
@@ -22590,8 +25274,8 @@
         <w:t xml:space="preserve">parser, (2026).</w:t>
       </w:r>
     </w:p>
-    <w:bookmarkEnd w:id="99"/>
-    <w:bookmarkStart w:id="100" w:name="_c1fc4b225b7dfa71f64cc84e83afba5f24698c2"/>
+    <w:bookmarkEnd w:id="101"/>
+    <w:bookmarkStart w:id="102" w:name="_c1fc4b225b7dfa71f64cc84e83afba5f24698c2"/>
     <w:p>
       <w:pPr>
         <w:pStyle w:val="Bibliography"/>
@@ -22630,8 +25314,8 @@
         <w:t xml:space="preserve">telemetry anomaly mining, (2026).</w:t>
       </w:r>
     </w:p>
-    <w:bookmarkEnd w:id="100"/>
-    <w:bookmarkStart w:id="102" w:name="_3d31df3710cff81ff87ef6665f7295f981708a9"/>
+    <w:bookmarkEnd w:id="102"/>
+    <w:bookmarkStart w:id="104" w:name="_3d31df3710cff81ff87ef6665f7295f981708a9"/>
     <w:p>
       <w:pPr>
         <w:pStyle w:val="Bibliography"/>
@@ -22672,7 +25356,7 @@
       <w:r>
         <w:t xml:space="preserve">flight logs, Sensors 26 (2026) 3188. https://doi.org/</w:t>
       </w:r>
-      <w:hyperlink r:id="rId101">
+      <w:hyperlink r:id="rId103">
         <w:r>
           <w:rPr>
             <w:rStyle w:val="Hyperlink"/>
@@ -22684,8 +25368,8 @@
         <w:t xml:space="preserve">.</w:t>
       </w:r>
     </w:p>
-    <w:bookmarkEnd w:id="102"/>
-    <w:bookmarkStart w:id="104" w:name="_de2316363361acc29c6a15415cb3110e85473cd"/>
+    <w:bookmarkEnd w:id="104"/>
+    <w:bookmarkStart w:id="106" w:name="_de2316363361acc29c6a15415cb3110e85473cd"/>
     <w:p>
       <w:pPr>
         <w:pStyle w:val="Bibliography"/>
@@ -22714,7 +25398,7 @@
       <w:r>
         <w:t xml:space="preserve">fault detection methods, state-of-the-art, Drones 6 (2022) 330. https://doi.org/</w:t>
       </w:r>
-      <w:hyperlink r:id="rId103">
+      <w:hyperlink r:id="rId105">
         <w:r>
           <w:rPr>
             <w:rStyle w:val="Hyperlink"/>
@@ -22726,8 +25410,8 @@
         <w:t xml:space="preserve">.</w:t>
       </w:r>
     </w:p>
-    <w:bookmarkEnd w:id="104"/>
-    <w:bookmarkStart w:id="106" w:name="_1ece912d6a7cc2c7f97bdecc84d0912f3af390e"/>
+    <w:bookmarkEnd w:id="106"/>
+    <w:bookmarkStart w:id="108" w:name="_1ece912d6a7cc2c7f97bdecc84d0912f3af390e"/>
     <w:p>
       <w:pPr>
         <w:pStyle w:val="Bibliography"/>
@@ -22744,7 +25428,7 @@
       <w:r>
         <w:t xml:space="preserve">E. Khalastchi, M. Kalech, On fault detection and diagnosis in robotic systems, ACM Computing Surveys 51 (2018) 9:1–9:24. https://doi.org/</w:t>
       </w:r>
-      <w:hyperlink r:id="rId105">
+      <w:hyperlink r:id="rId107">
         <w:r>
           <w:rPr>
             <w:rStyle w:val="Hyperlink"/>
@@ -22756,8 +25440,8 @@
         <w:t xml:space="preserve">.</w:t>
       </w:r>
     </w:p>
-    <w:bookmarkEnd w:id="106"/>
-    <w:bookmarkStart w:id="108" w:name="_200a90d3af15f3f5a64a3cb8afd6783e6bc5c1d"/>
+    <w:bookmarkEnd w:id="108"/>
+    <w:bookmarkStart w:id="110" w:name="_200a90d3af15f3f5a64a3cb8afd6783e6bc5c1d"/>
     <w:p>
       <w:pPr>
         <w:pStyle w:val="Bibliography"/>
@@ -22774,7 +25458,7 @@
       <w:r>
         <w:t xml:space="preserve">E. Zibaei, R. Borth, Building causal models for finding actual causes of unmanned aerial vehicle failures, Frontiers in Robotics and AI 11 (2024) 1123762. https://doi.org/</w:t>
       </w:r>
-      <w:hyperlink r:id="rId107">
+      <w:hyperlink r:id="rId109">
         <w:r>
           <w:rPr>
             <w:rStyle w:val="Hyperlink"/>
@@ -22786,8 +25470,8 @@
         <w:t xml:space="preserve">.</w:t>
       </w:r>
     </w:p>
-    <w:bookmarkEnd w:id="108"/>
-    <w:bookmarkStart w:id="110" w:name="_362e51e11e30eb0e0461101d9c36e4d21d357be"/>
+    <w:bookmarkEnd w:id="110"/>
+    <w:bookmarkStart w:id="112" w:name="_362e51e11e30eb0e0461101d9c36e4d21d357be"/>
     <w:p>
       <w:pPr>
         <w:pStyle w:val="Bibliography"/>
@@ -22804,7 +25488,7 @@
       <w:r>
         <w:t xml:space="preserve">D. Wang, S. Li, G. Xiao, Y. Liu, Y. Sui, An exploratory study of autopilot software bugs in unmanned aerial vehicles, in: Proceedings of the 29th ACM Joint European Software Engineering Conference and Symposium on the Foundations of Software Engineering (ESEC/FSE), 2021: pp. 20–31. https://doi.org/</w:t>
       </w:r>
-      <w:hyperlink r:id="rId109">
+      <w:hyperlink r:id="rId111">
         <w:r>
           <w:rPr>
             <w:rStyle w:val="Hyperlink"/>
@@ -22816,8 +25500,8 @@
         <w:t xml:space="preserve">.</w:t>
       </w:r>
     </w:p>
-    <w:bookmarkEnd w:id="110"/>
-    <w:bookmarkStart w:id="112" w:name="_4f9a794a6a4ddf2789379e73f8e74e34b9538b4"/>
+    <w:bookmarkEnd w:id="112"/>
+    <w:bookmarkStart w:id="114" w:name="_4f9a794a6a4ddf2789379e73f8e74e34b9538b4"/>
     <w:p>
       <w:pPr>
         <w:pStyle w:val="Bibliography"/>
@@ -22834,7 +25518,7 @@
       <w:r>
         <w:t xml:space="preserve">E. Petritoli, F. Leccese, L. Ciani, Reliability and maintenance analysis of unmanned aerial vehicles, Sensors 18 (2018) 3171. https://doi.org/</w:t>
       </w:r>
-      <w:hyperlink r:id="rId111">
+      <w:hyperlink r:id="rId113">
         <w:r>
           <w:rPr>
             <w:rStyle w:val="Hyperlink"/>
@@ -22846,8 +25530,8 @@
         <w:t xml:space="preserve">.</w:t>
       </w:r>
     </w:p>
-    <w:bookmarkEnd w:id="112"/>
-    <w:bookmarkStart w:id="113" w:name="_a0e369e89429aa426010697429f06415b068aab"/>
+    <w:bookmarkEnd w:id="114"/>
+    <w:bookmarkStart w:id="115" w:name="_a0e369e89429aa426010697429f06415b068aab"/>
     <w:p>
       <w:pPr>
         <w:pStyle w:val="Bibliography"/>
@@ -22877,8 +25561,8 @@
         <w:t xml:space="preserve">analysis of 221 mishaps over 10 years, Aviation, Space, and Environmental Medicine 77 (2006) 724–732.</w:t>
       </w:r>
     </w:p>
-    <w:bookmarkEnd w:id="113"/>
-    <w:bookmarkStart w:id="115" w:name="_06ffb55068ea9e0b3a7aa6e754cfcffab5f832f"/>
+    <w:bookmarkEnd w:id="115"/>
+    <w:bookmarkStart w:id="117" w:name="_06ffb55068ea9e0b3a7aa6e754cfcffab5f832f"/>
     <w:p>
       <w:pPr>
         <w:pStyle w:val="Bibliography"/>
@@ -22898,7 +25582,7 @@
       <w:r>
         <w:t xml:space="preserve"> </w:t>
       </w:r>
-      <w:hyperlink r:id="rId114">
+      <w:hyperlink r:id="rId116">
         <w:r>
           <w:rPr>
             <w:rStyle w:val="Hyperlink"/>
@@ -22910,8 +25594,8 @@
         <w:t xml:space="preserve">.</w:t>
       </w:r>
     </w:p>
-    <w:bookmarkEnd w:id="115"/>
-    <w:bookmarkStart w:id="117" w:name="_8a3cc11b1319c0fe6bf6179f8196eab503a64d0"/>
+    <w:bookmarkEnd w:id="117"/>
+    <w:bookmarkStart w:id="119" w:name="_8a3cc11b1319c0fe6bf6179f8196eab503a64d0"/>
     <w:p>
       <w:pPr>
         <w:pStyle w:val="Bibliography"/>
@@ -22937,7 +25621,7 @@
       <w:r>
         <w:t xml:space="preserve">-integrated applications with indirect prompt injection, in: Proceedings of the 16th ACM Workshop on Artificial Intelligence and Security (AISec), 2023: pp. 79–90. https://doi.org/</w:t>
       </w:r>
-      <w:hyperlink r:id="rId116">
+      <w:hyperlink r:id="rId118">
         <w:r>
           <w:rPr>
             <w:rStyle w:val="Hyperlink"/>
@@ -22949,8 +25633,8 @@
         <w:t xml:space="preserve">.</w:t>
       </w:r>
     </w:p>
-    <w:bookmarkEnd w:id="117"/>
-    <w:bookmarkStart w:id="119" w:name="_ab8841c06958c924804c38799fc8ccd94ea102a"/>
+    <w:bookmarkEnd w:id="119"/>
+    <w:bookmarkStart w:id="121" w:name="_ab8841c06958c924804c38799fc8ccd94ea102a"/>
     <w:p>
       <w:pPr>
         <w:pStyle w:val="Bibliography"/>
@@ -22967,7 +25651,7 @@
       <w:r>
         <w:t xml:space="preserve">B. Frénay, M. Verleysen, Classification in the presence of label noise: A survey, IEEE Transactions on Neural Networks and Learning Systems 25 (2014) 845–869. https://doi.org/</w:t>
       </w:r>
-      <w:hyperlink r:id="rId118">
+      <w:hyperlink r:id="rId120">
         <w:r>
           <w:rPr>
             <w:rStyle w:val="Hyperlink"/>
@@ -22979,8 +25663,8 @@
         <w:t xml:space="preserve">.</w:t>
       </w:r>
     </w:p>
-    <w:bookmarkEnd w:id="119"/>
-    <w:bookmarkStart w:id="121" w:name="_90b58fdc380e5ffe19ed416545c54d06f184b09"/>
+    <w:bookmarkEnd w:id="121"/>
+    <w:bookmarkStart w:id="123" w:name="_90b58fdc380e5ffe19ed416545c54d06f184b09"/>
     <w:p>
       <w:pPr>
         <w:pStyle w:val="Bibliography"/>
@@ -22997,7 +25681,7 @@
       <w:r>
         <w:t xml:space="preserve">E.A. Stuart, Matching methods for causal inference: A review and a look forward, Statistical Science 25 (2010) 1–21. https://doi.org/</w:t>
       </w:r>
-      <w:hyperlink r:id="rId120">
+      <w:hyperlink r:id="rId122">
         <w:r>
           <w:rPr>
             <w:rStyle w:val="Hyperlink"/>
@@ -23009,8 +25693,8 @@
         <w:t xml:space="preserve">.</w:t>
       </w:r>
     </w:p>
-    <w:bookmarkEnd w:id="121"/>
-    <w:bookmarkStart w:id="123" w:name="_f6e66cea9a1ea78573b548bc5cf8461c81300ca"/>
+    <w:bookmarkEnd w:id="123"/>
+    <w:bookmarkStart w:id="125" w:name="_f6e66cea9a1ea78573b548bc5cf8461c81300ca"/>
     <w:p>
       <w:pPr>
         <w:pStyle w:val="Bibliography"/>
@@ -23027,7 +25711,7 @@
       <w:r>
         <w:t xml:space="preserve">B.A. Nosek, C.R. Ebersole, A.C. DeHaven, D.T. Mellor, The preregistration revolution, Proceedings of the National Academy of Sciences 115 (2018) 2600–2606. https://doi.org/</w:t>
       </w:r>
-      <w:hyperlink r:id="rId122">
+      <w:hyperlink r:id="rId124">
         <w:r>
           <w:rPr>
             <w:rStyle w:val="Hyperlink"/>
@@ -23039,8 +25723,8 @@
         <w:t xml:space="preserve">.</w:t>
       </w:r>
     </w:p>
-    <w:bookmarkEnd w:id="123"/>
-    <w:bookmarkStart w:id="125" w:name="_ad8397d41f792404ea3ffa2c2145e851561e0cf"/>
+    <w:bookmarkEnd w:id="125"/>
+    <w:bookmarkStart w:id="127" w:name="_ad8397d41f792404ea3ffa2c2145e851561e0cf"/>
     <w:p>
       <w:pPr>
         <w:pStyle w:val="Bibliography"/>
@@ -23063,7 +25747,7 @@
       <w:r>
         <w:t xml:space="preserve">) curve, Radiology 143 (1982) 29–36. https://doi.org/</w:t>
       </w:r>
-      <w:hyperlink r:id="rId124">
+      <w:hyperlink r:id="rId126">
         <w:r>
           <w:rPr>
             <w:rStyle w:val="Hyperlink"/>
@@ -23075,8 +25759,8 @@
         <w:t xml:space="preserve">.</w:t>
       </w:r>
     </w:p>
-    <w:bookmarkEnd w:id="125"/>
-    <w:bookmarkStart w:id="127" w:name="_7ae2e06bcfe80442633569f5f6b1e21460598cb"/>
+    <w:bookmarkEnd w:id="127"/>
+    <w:bookmarkStart w:id="129" w:name="_7ae2e06bcfe80442633569f5f6b1e21460598cb"/>
     <w:p>
       <w:pPr>
         <w:pStyle w:val="Bibliography"/>
@@ -23093,7 +25777,7 @@
       <w:r>
         <w:t xml:space="preserve">H.B. Mann, D.R. Whitney, On a test of whether one of two random variables is stochastically larger than the other, The Annals of Mathematical Statistics 18 (1947) 50–60. https://doi.org/</w:t>
       </w:r>
-      <w:hyperlink r:id="rId126">
+      <w:hyperlink r:id="rId128">
         <w:r>
           <w:rPr>
             <w:rStyle w:val="Hyperlink"/>
@@ -23105,8 +25789,8 @@
         <w:t xml:space="preserve">.</w:t>
       </w:r>
     </w:p>
-    <w:bookmarkEnd w:id="127"/>
-    <w:bookmarkStart w:id="128" w:name="_d0a9d29bfb3d63b968b17ba95db409a8b61dfda"/>
+    <w:bookmarkEnd w:id="129"/>
+    <w:bookmarkStart w:id="130" w:name="_d0a9d29bfb3d63b968b17ba95db409a8b61dfda"/>
     <w:p>
       <w:pPr>
         <w:pStyle w:val="Bibliography"/>
@@ -23124,8 +25808,8 @@
         <w:t xml:space="preserve">B. Efron, R.J. Tibshirani, An introduction to the bootstrap, Chapman &amp; Hall, New York, 1993.</w:t>
       </w:r>
     </w:p>
-    <w:bookmarkEnd w:id="128"/>
-    <w:bookmarkStart w:id="130" w:name="_89a013c1487ff07275d04a7e5b79d7551b6a9f6"/>
+    <w:bookmarkEnd w:id="130"/>
+    <w:bookmarkStart w:id="132" w:name="_89a013c1487ff07275d04a7e5b79d7551b6a9f6"/>
     <w:p>
       <w:pPr>
         <w:pStyle w:val="Bibliography"/>
@@ -23145,7 +25829,7 @@
       <w:r>
         <w:t xml:space="preserve"> </w:t>
       </w:r>
-      <w:hyperlink r:id="rId129">
+      <w:hyperlink r:id="rId131">
         <w:r>
           <w:rPr>
             <w:rStyle w:val="Hyperlink"/>
@@ -23157,8 +25841,8 @@
         <w:t xml:space="preserve">.</w:t>
       </w:r>
     </w:p>
-    <w:bookmarkEnd w:id="130"/>
-    <w:bookmarkEnd w:id="131"/>
+    <w:bookmarkEnd w:id="132"/>
+    <w:bookmarkEnd w:id="133"/>
     <w:sectPr>
       <w:footnotePr>
         <w:numRestart w:val="eachSect"/>

</xml_diff>

<commit_message>
Paper: Integrate factorial optimism audit (Round 14 problem 1 and originality)
Abstract uses the declared wording ("depends on the comparison set; the
cause is not isolated") and is trimmed to about 258 words with all
intervals kept. New section 5.4 and Table 9 (2x2 plus Shapley split:
0.212 drop, grouped folds the only material factor). Step 4b 0.522
replaced by 0.623 under one extractor and marked superseded. Contribution
(i), checklist item 2, discussion and conclusion updated; caliper lift
given its duration reading. PDF, Word, Overleaf zip, HANDOFF and
critical_review rebuilt.

Co-Authored-By: Claude Opus 5.5 <noreply@anthropic.com>
</commit_message>
<xml_diff>
--- a/docs/paper/submission/manuscript.docx
+++ b/docs/paper/submission/manuscript.docx
@@ -53,7 +53,7 @@
         <w:pStyle w:val="FirstParagraph"/>
       </w:pPr>
       <w:r>
-        <w:t xml:space="preserve">Flight logs are widely expected to show whether a drone crash was caused by the pilot or the aircraft. Across 590 PX4 crash logs from 479,547 flights (520 real hardware, 205 rule-evaluated, 148 modelled), we examine telemetry’s evidentiary value when guarding against leakage and confounding. Confirmatory tests were declared in version control (</w:t>
+        <w:t xml:space="preserve">Flight logs are widely expected to show whether the pilot or the aircraft caused a drone crash. Using 590 PX4 crash logs from a 479,547-flight archive, we test what telemetry shows under leakage and confounding controls. Confirmatory tests were declared in version control (</w:t>
       </w:r>
       <m:oMath>
         <m:sSup>
@@ -113,7 +113,7 @@
         </m:r>
       </m:oMath>
       <w:r>
-        <w:t xml:space="preserve">); with 36 pilot-labelled crashes in the modelling sample, 80% power requires AUC</w:t>
+        <w:t xml:space="preserve">); with 36 pilot-labelled crashes, 80% power requires AUC</w:t>
       </w:r>
       <w:r>
         <w:t xml:space="preserve"> </w:t>
@@ -130,10 +130,7 @@
         </m:r>
       </m:oMath>
       <w:r>
-        <w:t xml:space="preserve"> </w:t>
-      </w:r>
-      <w:r>
-        <w:t xml:space="preserve">asymptotically (0.75 under permutation null), far below the</w:t>
+        <w:t xml:space="preserve">, below the</w:t>
       </w:r>
       <w:r>
         <w:t xml:space="preserve"> </w:t>
@@ -153,7 +150,7 @@
         <w:t xml:space="preserve"> </w:t>
       </w:r>
       <w:r>
-        <w:t xml:space="preserve">needed for operational verdicts.</w:t>
+        <w:t xml:space="preserve">operational verdicts need.</w:t>
       </w:r>
       <w:r>
         <w:t xml:space="preserve"> </w:t>
@@ -199,7 +196,7 @@
         </m:sSup>
       </m:oMath>
       <w:r>
-        <w:t xml:space="preserve">Decomposition shows crash anticipation collapses primarily via cohort selection: evaluating the 67 multi-flight crashes against independent other-aircraft normals yields AUC 0.522 [0.413, 0.615], and uncalipered within-drone evaluation yields no detectable precursor signal in this cohort (Group-CV AUC 0.569, cluster bootstrap [0.500, 0.643]; rank test</w:t>
+        <w:t xml:space="preserve">A factorial audit of 32 evaluation settings found that apparent anticipation depends on the comparison set; the cause is not isolated. AUC fell 0.21 [0.06, 0.34] from the most optimistic to the most conservative other-aircraft setting (0.88 to 0.67); only vehicle-grouped folds were material (0.06 [0.03, 0.09]). Against each drone’s own earlier flights, AUC was at chance (0.569, cluster bootstrap [0.500, 0.643]; rank test</w:t>
       </w:r>
       <w:r>
         <w:t xml:space="preserve"> </w:t>
@@ -226,63 +223,7 @@
         </m:r>
       </m:oMath>
       <w:r>
-        <w:t xml:space="preserve">). Caliper matching (</w:t>
-      </w:r>
-      <m:oMath>
-        <m:r>
-          <m:rPr>
-            <m:sty m:val="p"/>
-          </m:rPr>
-          <m:t>|</m:t>
-        </m:r>
-        <m:r>
-          <m:rPr>
-            <m:sty m:val="p"/>
-          </m:rPr>
-          <m:t>Δ</m:t>
-        </m:r>
-        <m:r>
-          <m:rPr>
-            <m:sty m:val="p"/>
-          </m:rPr>
-          <m:t>ln</m:t>
-        </m:r>
-        <m:r>
-          <m:rPr>
-            <m:sty m:val="p"/>
-          </m:rPr>
-          <m:t>(</m:t>
-        </m:r>
-        <m:r>
-          <m:rPr>
-            <m:nor/>
-          </m:rPr>
-          <m:t>duration</m:t>
-        </m:r>
-        <m:r>
-          <m:rPr>
-            <m:sty m:val="p"/>
-          </m:rPr>
-          <m:t>)</m:t>
-        </m:r>
-        <m:r>
-          <m:rPr>
-            <m:sty m:val="p"/>
-          </m:rPr>
-          <m:t>|</m:t>
-        </m:r>
-        <m:r>
-          <m:rPr>
-            <m:sty m:val="p"/>
-          </m:rPr>
-          <m:t>≤</m:t>
-        </m:r>
-        <m:r>
-          <m:t>0.25</m:t>
-        </m:r>
-      </m:oMath>
-      <w:r>
-        <w:t xml:space="preserve">) lifts within-drone AUC to 0.642 (</w:t>
+        <w:t xml:space="preserve">). Duration-caliper matching (0.25) lifted it to 0.642 (</w:t>
       </w:r>
       <m:oMath>
         <m:r>
@@ -296,10 +237,7 @@
         </m:r>
       </m:oMath>
       <w:r>
-        <w:t xml:space="preserve"> </w:t>
-      </w:r>
-      <w:r>
-        <w:t xml:space="preserve">on 36 airframes; 95% paired cluster CI [+0.074, +0.238]), suggesting duration differences mask precursors in this cohort.</w:t>
+        <w:t xml:space="preserve">, 36 airframes; paired cluster CI [+0.074, +0.238]), but a fixed 30 s window did not, so the lift may reflect duration.</w:t>
       </w:r>
       <w:r>
         <w:t xml:space="preserve"> </w:t>
@@ -322,7 +260,7 @@
         </m:sSup>
       </m:oMath>
       <w:r>
-        <w:t xml:space="preserve">Checks were consistent with leakage (exploratory, tuning sensitivity fell from 7/9 to 1/9 without the final 10 s, unadjusted</w:t>
+        <w:t xml:space="preserve">Tuning-check sensitivity fell from 7/9 to 1/9 without the final 10 s (exploratory, unadjusted</w:t>
       </w:r>
       <w:r>
         <w:t xml:space="preserve"> </w:t>
@@ -342,7 +280,7 @@
         </m:r>
       </m:oMath>
       <w:r>
-        <w:t xml:space="preserve">, alongside normal false alarms falling from 13% to 5%). Crashed drones vibrated more on older estimator metrics (mean rank 0.67, Holm</w:t>
+        <w:t xml:space="preserve">; normal false alarms 13% to 5%), consistent with leakage. Crashed drones vibrated more on older estimator metrics (mean rank 0.67, Holm</w:t>
       </w:r>
       <w:r>
         <w:t xml:space="preserve"> </w:t>
@@ -405,7 +343,7 @@
         </m:sSup>
       </m:oMath>
       <w:r>
-        <w:t xml:space="preserve">Screening against 107 controls yielded</w:t>
+        <w:t xml:space="preserve">Against 107 controls, screening gave</w:t>
       </w:r>
       <w:r>
         <w:t xml:space="preserve"> </w:t>
@@ -425,7 +363,7 @@
         <w:t xml:space="preserve"> </w:t>
       </w:r>
       <w:r>
-        <w:t xml:space="preserve">operational lift (illustrative PPV 2.26–2.43% at 10% flag rate). AeroFleet 2.0 presents longitudinal evidence without automatic verdicts.</w:t>
+        <w:t xml:space="preserve">lift (illustrative PPV 2.26–2.43% at 10% flag rate). AeroFleet 2.0 shows longitudinal evidence without automatic verdicts.</w:t>
       </w:r>
     </w:p>
     <w:p>
@@ -1020,7 +958,27 @@
         <w:t xml:space="preserve"> </w:t>
       </w:r>
       <w:r>
-        <w:t xml:space="preserve">(i) A methodological decomposition isolating why apparent crash anticipation collapses: evaluating the same 67 multi-flight crash flights against independent matched normal flights from other aircraft yields an AUC of 0.522 [0.413, 0.615] (Step 4b), consistent with the collapse being driven by evaluation cohort selection rather than by within-drone baseline adjustment alone (scoring 103 multi-history crashes from the broader archive against unselected normals retains an AUC of 0.891, showing that cross-sectional models exploit between-aircraft duration and vehicle envelope confounds). Furthermore, within-drone evaluation finds no detectable precursor signal under uncalipered matching in this cohort (Group-CV AUC 0.569, 95% cluster bootstrap CI [0.500, 0.643], pairwise mean AUC 0.592 [0.516, 0.692], rank test</w:t>
+        <w:t xml:space="preserve">(i) </w:t>
+      </w:r>
+      <m:oMath>
+        <m:sSup>
+          <m:e>
+            <m:r>
+              <m:t>​</m:t>
+            </m:r>
+          </m:e>
+          <m:sup>
+            <m:r>
+              <m:rPr>
+                <m:sty m:val="p"/>
+              </m:rPr>
+              <m:t>†</m:t>
+            </m:r>
+          </m:sup>
+        </m:sSup>
+      </m:oMath>
+      <w:r>
+        <w:t xml:space="preserve">A factorial optimism audit that splits the apparent crash-vs-normal AUC across five evaluation choices (crash set, comparison flights, crash-window cut, fold grouping, window length; 32 settings, one feature extractor, exact Shapley split). Of a 0.21 [0.06, 0.34] drop from the most optimistic to the most conservative other-aircraft setting (0.88 to 0.67), only vehicle-grouped folds contributed materially (0.06 [0.03, 0.09]); the crash set and the choice of normal flights each carried 0.06–0.07 with intervals spanning zero, so the cause of the remaining drop is not isolated. Separation against other aircraft persisted at 0.67; comparing each drone with its own earlier flights brought it to chance. Within-drone evaluation finds no detectable precursor signal under uncalipered matching in this cohort (Group-CV AUC 0.569, 95% cluster bootstrap CI [0.500, 0.643], pairwise mean AUC 0.592 [0.516, 0.692], rank test</w:t>
       </w:r>
       <w:r>
         <w:t xml:space="preserve"> </w:t>
@@ -1143,7 +1101,7 @@
         <w:t xml:space="preserve"> </w:t>
       </w:r>
       <w:r>
-        <w:t xml:space="preserve">(95% paired cluster bootstrap CI [+0.074, +0.238] on 36 airframes), suggesting that baseline duration mismatch masks within-drone precursors in this cohort.</w:t>
+        <w:t xml:space="preserve">(95% paired cluster bootstrap CI [+0.074, +0.238] on 36 airframes); a fixed 30 s window did not reproduce this lift, so it may reflect duration itself rather than masked precursors.</w:t>
       </w:r>
       <w:r>
         <w:t xml:space="preserve"> </w:t>
@@ -2700,7 +2658,7 @@
         <w:t xml:space="preserve"> </w:t>
       </w:r>
       <w:r>
-        <w:t xml:space="preserve">the pilot in only 6.1% of all threads (9 of 148) and 8.6% of decided threads (9 of 105, Section 5.6). Across all</w:t>
+        <w:t xml:space="preserve">the pilot in only 6.1% of all threads (9 of 148) and 8.6% of decided threads (9 of 105, Section 5.7). Across all</w:t>
       </w:r>
       <w:r>
         <w:t xml:space="preserve"> </w:t>
@@ -3314,7 +3272,7 @@
         <w:t xml:space="preserve"> </w:t>
       </w:r>
       <w:r>
-        <w:t xml:space="preserve">PX4 forum (Section 5.6). The attribution rule was evaluated on 205 crashes (93 development and 112 held-out).</w:t>
+        <w:t xml:space="preserve">PX4 forum (Section 5.7). The attribution rule was evaluated on 205 crashes (93 development and 112 held-out).</w:t>
       </w:r>
       <w:r>
         <w:t xml:space="preserve"> </w:t>
@@ -5001,7 +4959,7 @@
         <w:pStyle w:val="FirstParagraph"/>
       </w:pPr>
       <w:r>
-        <w:t xml:space="preserve">The public archive index was downloaded on 20 October 2026. For each confirmatory test, the hypothesis, sample selection, features, statistic, and pass mark were declared and committed to version control before the analysis it governs was run (Table ??). Where a test reused logs already downloaded for an earlier test, the protocol records it as declared before running, not before download (exploratory additions added during revision are marked with</w:t>
+        <w:t xml:space="preserve">The public archive index was downloaded on 20 October 2026. For each confirmatory test, the hypothesis, sample selection, features, statistic, and pass mark were declared and committed to version control before the analysis it governs was run (Table 4). Where a test reused logs already downloaded for an earlier test, the protocol records it as declared before running, not before download (exploratory additions added during revision are marked with</w:t>
       </w:r>
       <w:r>
         <w:t xml:space="preserve"> </w:t>
@@ -5158,7 +5116,7 @@
         <w:t xml:space="preserve"> </w:t>
       </w:r>
       <w:r>
-        <w:t xml:space="preserve">Section 5.8.</w:t>
+        <w:t xml:space="preserve">Section 5.9.</w:t>
       </w:r>
     </w:p>
     <w:bookmarkStart w:id="25" w:name="_1109c9b174200475a1caee43f99c27cd27b62f9"/>
@@ -5167,7 +5125,7 @@
         <w:pStyle w:val="TableCaption"/>
       </w:pPr>
       <w:r>
-        <w:t xml:space="preserve">Table ?. Pre-declared confirmatory protocol registration schedule and version control provenance. All commits occurred prior to execution of the governed analysis. Commit timestamps reflect author-controlled local git records (IST) prior to Software Heritage archival.</w:t>
+        <w:t xml:space="preserve">Table 4. Pre-declared confirmatory protocol registration schedule and version control provenance. All commits occurred prior to execution of the governed analysis. Commit timestamps reflect author-controlled local git records (IST) prior to Software Heritage archival.</w:t>
       </w:r>
     </w:p>
     <w:tbl>
@@ -5175,7 +5133,7 @@
         <w:tblStyle w:val="Table"/>
         <w:tblW w:type="pct" w:w="5000"/>
         <w:tblLook w:firstRow="1" w:lastRow="0" w:firstColumn="0" w:lastColumn="0" w:noHBand="0" w:noVBand="0" w:val="0020"/>
-        <w:tblCaption w:val="Table ?. Pre-declared confirmatory protocol registration schedule and version control provenance. All commits occurred prior to execution of the governed analysis. Commit timestamps reflect author-controlled local git records (IST) prior to Software Heritage archival."/>
+        <w:tblCaption w:val="Table 4. Pre-declared confirmatory protocol registration schedule and version control provenance. All commits occurred prior to execution of the governed analysis. Commit timestamps reflect author-controlled local git records (IST) prior to Software Heritage archival."/>
         <w:tblBorders>
           <w:top w:val="single" w:sz="4" w:color="808080"/>
           <w:left w:val="single" w:sz="4" w:color="808080"/>
@@ -6771,7 +6729,7 @@
         <w:pStyle w:val="FirstParagraph"/>
       </w:pPr>
       <w:r>
-        <w:t xml:space="preserve">Table 4 defines the features. Vibration is not measured the same way across firmware generations:</w:t>
+        <w:t xml:space="preserve">Table 5 defines the features. Vibration is not measured the same way across firmware generations:</w:t>
       </w:r>
       <w:r>
         <w:t xml:space="preserve"> </w:t>
@@ -6798,7 +6756,7 @@
         <w:pStyle w:val="TableCaption"/>
       </w:pPr>
       <w:r>
-        <w:t xml:space="preserve">Table 4. Features computed on each analysis window.</w:t>
+        <w:t xml:space="preserve">Table 5. Features computed on each analysis window.</w:t>
       </w:r>
     </w:p>
     <w:tbl>
@@ -6806,7 +6764,7 @@
         <w:tblStyle w:val="Table"/>
         <w:tblW w:type="pct" w:w="5000"/>
         <w:tblLook w:firstRow="1" w:lastRow="0" w:firstColumn="0" w:lastColumn="0" w:noHBand="0" w:noVBand="0" w:val="0020"/>
-        <w:tblCaption w:val="Table 4. Features computed on each analysis window."/>
+        <w:tblCaption w:val="Table 5. Features computed on each analysis window."/>
         <w:tblBorders>
           <w:top w:val="single" w:sz="4" w:color="808080"/>
           <w:left w:val="single" w:sz="4" w:color="808080"/>
@@ -9340,7 +9298,7 @@
         <w:t xml:space="preserve"> </w:t>
       </w:r>
       <w:r>
-        <w:t xml:space="preserve">provided in Section 5.7.</w:t>
+        <w:t xml:space="preserve">provided in Section 5.8.</w:t>
       </w:r>
     </w:p>
     <w:p>
@@ -9632,7 +9590,7 @@
         <w:t xml:space="preserve"> </w:t>
       </w:r>
       <w:r>
-        <w:t xml:space="preserve">(Table 5). The signs fired at similar rates whichever party the uploader blamed</w:t>
+        <w:t xml:space="preserve">(Table 6). The signs fired at similar rates whichever party the uploader blamed</w:t>
       </w:r>
       <w:r>
         <w:t xml:space="preserve"> </w:t>
@@ -11008,7 +10966,7 @@
         <w:pStyle w:val="TableCaption"/>
       </w:pPr>
       <w:r>
-        <w:t xml:space="preserve">Table 5. Confirmatory tests, their declared pass marks and outcomes. Holm adjustment over the seven</w:t>
+        <w:t xml:space="preserve">Table 6. Confirmatory tests, their declared pass marks and outcomes. Holm adjustment over the seven</w:t>
       </w:r>
       <w:r>
         <w:t xml:space="preserve"> </w:t>
@@ -11027,7 +10985,7 @@
         <w:tblStyle w:val="Table"/>
         <w:tblW w:type="pct" w:w="5000"/>
         <w:tblLook w:firstRow="1" w:lastRow="0" w:firstColumn="0" w:lastColumn="0" w:noHBand="0" w:noVBand="0" w:val="0020"/>
-        <w:tblCaption w:val="Table 5. Confirmatory tests, their declared pass marks and outcomes. Holm adjustment over the seven p-valued tests."/>
+        <w:tblCaption w:val="Table 6. Confirmatory tests, their declared pass marks and outcomes. Holm adjustment over the seven p-valued tests."/>
         <w:tblBorders>
           <w:top w:val="single" w:sz="4" w:color="808080"/>
           <w:left w:val="single" w:sz="4" w:color="808080"/>
@@ -12673,7 +12631,7 @@
         <w:t xml:space="preserve"> </w:t>
       </w:r>
       <w:r>
-        <w:t xml:space="preserve">influenced by flight envelope differences and airframe characteristics that correlate with duration (Table 7).</w:t>
+        <w:t xml:space="preserve">influenced by flight envelope differences and airframe characteristics that correlate with duration (Table 8).</w:t>
       </w:r>
       <w:r>
         <w:t xml:space="preserve"> </w:t>
@@ -12981,7 +12939,7 @@
         <w:t xml:space="preserve"> </w:t>
       </w:r>
       <w:r>
-        <w:t xml:space="preserve">to 0.69 as the crash was excluded, while vibration stayed between 0.72 and 0.77 (Table 7). Evaluating sign firing rates across margins on 148 crashes and 139 normal flights illustrates the physical mechanism: accelerometer clipping in crashes fell from 26.4% (</w:t>
+        <w:t xml:space="preserve">to 0.69 as the crash was excluded, while vibration stayed between 0.72 and 0.77 (Table 8). Evaluating sign firing rates across margins on 148 crashes and 139 normal flights illustrates the physical mechanism: accelerometer clipping in crashes fell from 26.4% (</w:t>
       </w:r>
       <m:oMath>
         <m:r>
@@ -13101,7 +13059,7 @@
         <w:t xml:space="preserve"> </w:t>
       </w:r>
       <w:r>
-        <w:t xml:space="preserve">the last 10 s were removed (Section 5.6).</w:t>
+        <w:t xml:space="preserve">the last 10 s were removed (Section 5.7).</w:t>
       </w:r>
     </w:p>
     <w:p>
@@ -13121,7 +13079,7 @@
         <w:t xml:space="preserve"> </w:t>
       </w:r>
       <w:r>
-        <w:t xml:space="preserve">71 s vs. 169 s in the complete-case sample), firmware era distribution, and operational flight envelope. Table 7</w:t>
+        <w:t xml:space="preserve">71 s vs. 169 s in the complete-case sample), firmware era distribution, and operational flight envelope. Table 8</w:t>
       </w:r>
       <w:r>
         <w:t xml:space="preserve"> </w:t>
@@ -13139,7 +13097,7 @@
         <w:t xml:space="preserve"> </w:t>
       </w:r>
       <w:r>
-        <w:t xml:space="preserve">Table 6 reports a step-by-step decomposition isolating what drives the cross-sectional separation. Grouping</w:t>
+        <w:t xml:space="preserve">Table 7 reports a step-by-step decomposition isolating what drives the cross-sectional separation. Grouping</w:t>
       </w:r>
       <w:r>
         <w:t xml:space="preserve"> </w:t>
@@ -13163,7 +13121,7 @@
         <w:t xml:space="preserve"> </w:t>
       </w:r>
       <w:r>
-        <w:t xml:space="preserve">(0.860 [0.802, 0.910] and 0.874 [0.822, 0.920], with flight-level bootstrap intervals confirming no substantial drop), while removing tilt and stick boundary features (Step 4) reduces AUC modestly to 0.831. Thus, vehicle grouping folds, crash-window cuts, and boundary feature pruning do not explain the cross-sectional gap. Instead, evaluating the exact same 67 multi-flight crash flights against independent matched normal flights from other aircraft (strictly excluding the 67 airframe UUIDs, matched 2:1 on vehicle type; Step 4b) collapses the model AUC to 0.522 [0.413, 0.615]. This is consistent with the collapse being driven by cohort selection across evaluation samples rather than by within-drone baseline adjustment alone. To test whether the 0.88 cross-sectional separation was an artifact carried solely by single-history crashes (vehicles with no earlier flights in the archive: maiden flights, bench tests), we scored single-history crashes (</w:t>
+        <w:t xml:space="preserve">(0.860 [0.802, 0.910] and 0.874 [0.822, 0.920], with flight-level bootstrap intervals confirming no substantial drop), while removing tilt and stick boundary features (Step 4) reduces AUC modestly to 0.831. On this sample, vehicle grouping, crash-window cuts and boundary feature pruning do not explain the cross-sectional gap. An earlier exploratory step scored the 67 multi-flight crashes against other-aircraft normals and reported AUC 0.522 [0.413, 0.615]; that comparison mixed feature extractors and cut-offs between crash and control flights and is superseded by the factorial audit below, where the same crashes against matched other-aircraft flights under one extractor give 0.623 [0.523, 0.716] (Table 7, Step 4b). The 67 within-drone crashes are not a subset of the 103 multi-history crashes: only 10 of the 67 are in the 148-crash sample. To test whether the 0.88 cross-sectional separation was an artifact carried solely by single-history crashes (vehicles with no earlier flights in the archive: maiden flights, bench tests), we scored single-history crashes (</w:t>
       </w:r>
       <m:oMath>
         <m:r>
@@ -13891,7 +13849,7 @@
         <w:pStyle w:val="TableCaption"/>
       </w:pPr>
       <w:r>
-        <w:t xml:space="preserve">Table 6. Decomposition of model separation between crash and normal flights: sequential effect of grouping folds by vehicle ID, crash-window removal, removing tilt/stick envelope features, cohort selection, and within-drone evaluation across evaluation cohorts. All 95% CIs are bootstrap intervals (2,000 resamples); Step 4b and Step 6 report cluster bootstrap 95% CIs over airframe clusters.</w:t>
+        <w:t xml:space="preserve">Table 7. Decomposition of model separation between crash and normal flights: sequential effect of grouping folds by vehicle ID, crash-window removal, removing tilt/stick envelope features, cohort selection, and within-drone evaluation across evaluation cohorts. All 95% CIs are bootstrap intervals (2,000 resamples); Step 4b and Step 6 report cluster bootstrap 95% CIs over airframe clusters.</w:t>
       </w:r>
     </w:p>
     <w:tbl>
@@ -13899,7 +13857,7 @@
         <w:tblStyle w:val="Table"/>
         <w:tblW w:type="pct" w:w="5000"/>
         <w:tblLook w:firstRow="1" w:lastRow="0" w:firstColumn="0" w:lastColumn="0" w:noHBand="0" w:noVBand="0" w:val="0020"/>
-        <w:tblCaption w:val="Table 6. Decomposition of model separation between crash and normal flights: sequential effect of grouping folds by vehicle ID, crash-window removal, removing tilt/stick envelope features, cohort selection, and within-drone evaluation across evaluation cohorts. All 95% CIs are bootstrap intervals (2,000 resamples); Step 4b and Step 6 report cluster bootstrap 95% CIs over airframe clusters."/>
+        <w:tblCaption w:val="Table 7. Decomposition of model separation between crash and normal flights: sequential effect of grouping folds by vehicle ID, crash-window removal, removing tilt/stick envelope features, cohort selection, and within-drone evaluation across evaluation cohorts. All 95% CIs are bootstrap intervals (2,000 resamples); Step 4b and Step 6 report cluster bootstrap 95% CIs over airframe clusters."/>
         <w:tblBorders>
           <w:top w:val="single" w:sz="4" w:color="808080"/>
           <w:left w:val="single" w:sz="4" w:color="808080"/>
@@ -14409,7 +14367,7 @@
               <w:rPr>
                 <w:sz w:val="19"/>
               </w:rPr>
-              <w:t xml:space="preserve">Multi-flight crashes vs. other-aircraft normals (Group-CV,</w:t>
+              <w:t xml:space="preserve">Multi-flight crashes vs. matched other-aircraft flights, one extractor (Group-CV,</w:t>
             </w:r>
             <w:r>
               <w:rPr>
@@ -14451,7 +14409,7 @@
               <w:rPr>
                 <w:sz w:val="19"/>
               </w:rPr>
-              <w:t xml:space="preserve">67 crash, 134 normal</w:t>
+              <w:t xml:space="preserve">67 crash, 311 normal</w:t>
             </w:r>
           </w:p>
         </w:tc>
@@ -14467,7 +14425,7 @@
               <w:rPr>
                 <w:sz w:val="19"/>
               </w:rPr>
-              <w:t xml:space="preserve">0.522 [0.413, 0.615]</w:t>
+              <w:t xml:space="preserve">0.623 [0.523, 0.716]</w:t>
             </w:r>
             <m:oMath>
               <m:sSup>
@@ -14662,7 +14620,7 @@
         </m:sSup>
       </m:oMath>
       <w:r>
-        <w:t xml:space="preserve">Two-stage cluster bootstrap 95% CI over 67 crash and 134 control airframes.</w:t>
+        <w:t xml:space="preserve">Factorial audit (Section 5.4); two-stage cluster bootstrap 95% CI over crash and control airframes. Supersedes an earlier value of 0.522 that mixed feature extractors between crash and control flights.</w:t>
       </w:r>
       <w:r>
         <w:t xml:space="preserve"> </w:t>
@@ -14694,7 +14652,7 @@
         <w:pStyle w:val="TableCaption"/>
       </w:pPr>
       <w:r>
-        <w:t xml:space="preserve">Table 7. Single-feature AUC for separating crash from normal flights at three cut-offs (no fitting; 0.5 is chance;</w:t>
+        <w:t xml:space="preserve">Table 8. Single-feature AUC for separating crash from normal flights at three cut-offs (no fitting; 0.5 is chance;</w:t>
       </w:r>
       <w:r>
         <w:t xml:space="preserve"> </w:t>
@@ -14708,7 +14666,7 @@
         <w:tblStyle w:val="Table"/>
         <w:tblW w:type="pct" w:w="5000"/>
         <w:tblLook w:firstRow="1" w:lastRow="0" w:firstColumn="0" w:lastColumn="0" w:noHBand="0" w:noVBand="0" w:val="0020"/>
-        <w:tblCaption w:val="Table 7. Single-feature AUC for separating crash from normal flights at three cut-offs (no fitting; 0.5 is chance; values below 0.5 mean lower in crash flights)."/>
+        <w:tblCaption w:val="Table 8. Single-feature AUC for separating crash from normal flights at three cut-offs (no fitting; 0.5 is chance; values below 0.5 mean lower in crash flights)."/>
         <w:tblBorders>
           <w:top w:val="single" w:sz="4" w:color="808080"/>
           <w:left w:val="single" w:sz="4" w:color="808080"/>
@@ -15668,7 +15626,7 @@
       <w:pPr>
         <w:pStyle w:val="Heading2"/>
       </w:pPr>
-      <w:bookmarkStart w:id="46" w:name="_7d36f114b9234da3ba56cdf6e68d941cb747d23"/>
+      <w:bookmarkStart w:id="46" w:name="_0c9e7e04e6c31fefd3494b28729aa56a3255cc6"/>
       <w:r>
         <w:rPr>
           <w:rStyle w:val="SectionNumber"/>
@@ -15679,9 +15637,1189 @@
         <w:tab/>
       </w:r>
       <w:r>
+        <w:t xml:space="preserve">Factorial optimism audit (exploratory)</w:t>
+      </w:r>
+      <w:bookmarkEnd w:id="46"/>
+    </w:p>
+    <w:p>
+      <w:pPr>
+        <w:pStyle w:val="FirstParagraph"/>
+      </w:pPr>
+      <m:oMath>
+        <m:sSup>
+          <m:e>
+            <m:r>
+              <m:t>​</m:t>
+            </m:r>
+          </m:e>
+          <m:sup>
+            <m:r>
+              <m:rPr>
+                <m:sty m:val="p"/>
+              </m:rPr>
+              <m:t>†</m:t>
+            </m:r>
+          </m:sup>
+        </m:sSup>
+      </m:oMath>
+      <w:r>
+        <w:t xml:space="preserve">The steps of Table 7 change several things at once, and their samples were built with different feature extractors. To find what the crash-vs-normal AUC depends on, we declared a factorial audit after Round 14 review (commit</w:t>
+      </w:r>
+      <w:r>
+        <w:t xml:space="preserve"> </w:t>
+      </w:r>
+      <w:r>
+        <w:rPr>
+          <w:rStyle w:val="VerbatimChar"/>
+        </w:rPr>
+        <w:t xml:space="preserve">3c34530</w:t>
+      </w:r>
+      <w:r>
+        <w:t xml:space="preserve">; amended</w:t>
+      </w:r>
+      <w:r>
+        <w:t xml:space="preserve"> </w:t>
+      </w:r>
+      <w:r>
+        <w:rPr>
+          <w:rStyle w:val="VerbatimChar"/>
+        </w:rPr>
+        <w:t xml:space="preserve">f6ba424</w:t>
+      </w:r>
+      <w:r>
+        <w:t xml:space="preserve"> </w:t>
+      </w:r>
+      <w:r>
+        <w:t xml:space="preserve">to a float32 tolerance after its extractor check aborted on rounding differences; run 27 October 2026). Every flight was re-extracted from the raw log by one extractor, and five two-level factors were crossed: crash set (103 multi-history crashes vs. the 67 within-drone crashes), comparison flights (uploader-rated good/great normals vs. unrated flights from drones with no crash-rated log, matched to the within-drone cases on hardware, PX4 version and vehicle type), crash-window cut (</w:t>
+      </w:r>
+      <m:oMath>
+        <m:r>
+          <m:t>m</m:t>
+        </m:r>
+        <m:r>
+          <m:rPr>
+            <m:sty m:val="p"/>
+          </m:rPr>
+          <m:t>=</m:t>
+        </m:r>
+        <m:r>
+          <m:t>0</m:t>
+        </m:r>
+      </m:oMath>
+      <w:r>
+        <w:t xml:space="preserve"> </w:t>
+      </w:r>
+      <w:r>
+        <w:t xml:space="preserve">vs. 10 s), fold scheme (stratified by flight vs. grouped by vehicle) and window (full flight vs. first 30 s airborne). Normal flights from any crashed vehicle were removed (39 of the 139). Intervals come from one paired two-stage cluster bootstrap (2,000 resamples over crash and control vehicles, models not refitted); a factor was declared material if its share was</w:t>
+      </w:r>
+      <w:r>
+        <w:t xml:space="preserve"> </w:t>
+      </w:r>
+      <m:oMath>
+        <m:r>
+          <m:rPr>
+            <m:sty m:val="p"/>
+          </m:rPr>
+          <m:t>≥</m:t>
+        </m:r>
+        <m:r>
+          <m:t>0.05</m:t>
+        </m:r>
+      </m:oMath>
+      <w:r>
+        <w:t xml:space="preserve"> </w:t>
+      </w:r>
+      <w:r>
+        <w:t xml:space="preserve">with a 95% interval excluding zero. The declaration passed all abort checks (anchors 0.891 and 0.559; extractor agreement 374/374; label-permutation mean 0.495).</w:t>
+      </w:r>
+    </w:p>
+    <w:p>
+      <w:pPr>
+        <w:pStyle w:val="BodyText"/>
+      </w:pPr>
+      <w:r>
+        <w:t xml:space="preserve">The declared primary</w:t>
+      </w:r>
+      <w:r>
+        <w:t xml:space="preserve"> </w:t>
+      </w:r>
+      <m:oMath>
+        <m:r>
+          <m:t>2</m:t>
+        </m:r>
+        <m:r>
+          <m:rPr>
+            <m:sty m:val="p"/>
+          </m:rPr>
+          <m:t>×</m:t>
+        </m:r>
+        <m:r>
+          <m:t>2</m:t>
+        </m:r>
+      </m:oMath>
+      <w:r>
+        <w:t xml:space="preserve"> </w:t>
+      </w:r>
+      <w:r>
+        <w:t xml:space="preserve">(</w:t>
+      </w:r>
+      <m:oMath>
+        <m:r>
+          <m:t>m</m:t>
+        </m:r>
+        <m:r>
+          <m:rPr>
+            <m:sty m:val="p"/>
+          </m:rPr>
+          <m:t>=</m:t>
+        </m:r>
+        <m:r>
+          <m:t>10</m:t>
+        </m:r>
+      </m:oMath>
+      <w:r>
+        <w:t xml:space="preserve"> s, grouped folds, full window) did not isolate a cause (Table 9): changing the normal flights lowered AUC by 0.094 [</w:t>
+      </w:r>
+      <m:oMath>
+        <m:r>
+          <m:rPr>
+            <m:sty m:val="p"/>
+          </m:rPr>
+          <m:t>−</m:t>
+        </m:r>
+        <m:r>
+          <m:t>0.014</m:t>
+        </m:r>
+      </m:oMath>
+      <w:r>
+        <w:t xml:space="preserve">, 0.197] and changing the crash set by 0.108 [</w:t>
+      </w:r>
+      <m:oMath>
+        <m:r>
+          <m:rPr>
+            <m:sty m:val="p"/>
+          </m:rPr>
+          <m:t>−</m:t>
+        </m:r>
+        <m:r>
+          <m:t>0.037</m:t>
+        </m:r>
+      </m:oMath>
+      <w:r>
+        <w:t xml:space="preserve">, 0.224]. Following the pre-declared wording, the AUC depends on the comparison set; the cause is not isolated. On the constant subset (63 and 60 crashes), AUC fell from 0.878 at the most optimistic setting to 0.666 at the most conservative, a drop of 0.212 [0.062, 0.335]. An exact Shapley split assigned 0.062 [0.034, 0.087] of it to vehicle-grouped folds, the only material factor; the effect was concentrated where comparison drones contribute several flights (interaction with comparison set</w:t>
+      </w:r>
+      <w:r>
+        <w:t xml:space="preserve"> </w:t>
+      </w:r>
+      <m:oMath>
+        <m:r>
+          <m:rPr>
+            <m:sty m:val="p"/>
+          </m:rPr>
+          <m:t>+</m:t>
+        </m:r>
+        <m:r>
+          <m:t>0.082</m:t>
+        </m:r>
+      </m:oMath>
+      <w:r>
+        <w:t xml:space="preserve"> </w:t>
+      </w:r>
+      <w:r>
+        <w:t xml:space="preserve">[0.006, 0.122]), which explains why grouping made no difference in Step 1, where most normal drones contribute one flight. The crash-window cut carried a small but non-zero 0.014 [0.007, 0.023], and the fixed 30 s window carried 0.001. Separation against other aircraft persisted at the most conservative setting (0.666 [0.557, 0.770]); replacing other-aircraft flights by the same drones’ earlier flights at matched settings lowered AUC by a further 0.21, to chance. A fixed 30 s window also did not reproduce the caliper lift within drones (Group-CV 0.455 [0.377, 0.507]); because that window also removes proximity to the crash, it is not a clean test of the masking explanation. One same-drone cell with flight-stratified folds fell below chance (0.393), which we attribute to splitting one drone’s flights across folds and do not interpret.</w:t>
+      </w:r>
+    </w:p>
+    <w:bookmarkStart w:id="47" w:name="_9a7638f5da02df7bc1e91f3d04aa4fe62b352e5"/>
+    <w:p>
+      <w:pPr>
+        <w:pStyle w:val="TableCaption"/>
+      </w:pPr>
+      <w:r>
+        <w:t xml:space="preserve">Table 9.</w:t>
+      </w:r>
+      <w:r>
+        <w:t xml:space="preserve"> </w:t>
+      </w:r>
+      <m:oMath>
+        <m:sSup>
+          <m:e>
+            <m:r>
+              <m:t>​</m:t>
+            </m:r>
+          </m:e>
+          <m:sup>
+            <m:r>
+              <m:rPr>
+                <m:sty m:val="p"/>
+              </m:rPr>
+              <m:t>†</m:t>
+            </m:r>
+          </m:sup>
+        </m:sSup>
+      </m:oMath>
+      <w:r>
+        <w:t xml:space="preserve">Factorial optimism audit. Top: declared primary</w:t>
+      </w:r>
+      <w:r>
+        <w:t xml:space="preserve"> </w:t>
+      </w:r>
+      <m:oMath>
+        <m:r>
+          <m:t>2</m:t>
+        </m:r>
+        <m:r>
+          <m:rPr>
+            <m:sty m:val="p"/>
+          </m:rPr>
+          <m:t>×</m:t>
+        </m:r>
+        <m:r>
+          <m:t>2</m:t>
+        </m:r>
+      </m:oMath>
+      <w:r>
+        <w:t xml:space="preserve"> </w:t>
+      </w:r>
+      <w:r>
+        <w:t xml:space="preserve">(103 multi-history and 67 within-drone crashes) (</w:t>
+      </w:r>
+      <m:oMath>
+        <m:r>
+          <m:t>m</m:t>
+        </m:r>
+        <m:r>
+          <m:rPr>
+            <m:sty m:val="p"/>
+          </m:rPr>
+          <m:t>=</m:t>
+        </m:r>
+        <m:r>
+          <m:t>10</m:t>
+        </m:r>
+      </m:oMath>
+      <w:r>
+        <w:t xml:space="preserve"> s, vehicle-grouped folds, full window). Bottom: exact Shapley split of the 0.212 [0.062, 0.335] AUC drop from the most optimistic to the most conservative other-aircraft setting (constant subset, 63/60 crashes). 95% intervals from a paired two-stage cluster bootstrap.</w:t>
+      </w:r>
+    </w:p>
+    <w:tbl>
+      <w:tblPr>
+        <w:tblStyle w:val="Table"/>
+        <w:tblW w:type="pct" w:w="5000"/>
+        <w:tblLook w:firstRow="1" w:lastRow="0" w:firstColumn="0" w:lastColumn="0" w:noHBand="0" w:noVBand="0" w:val="0020"/>
+        <w:tblCaption w:val="Table 9. ^\daggerFactorial optimism audit. Top: declared primary 2\times2 (103 multi-history and 67 within-drone crashes) (m=10 s, vehicle-grouped folds, full window). Bottom: exact Shapley split of the 0.212 [0.062, 0.335] AUC drop from the most optimistic to the most conservative other-aircraft setting (constant subset, 63/60 crashes). 95% intervals from a paired two-stage cluster bootstrap."/>
+        <w:tblBorders>
+          <w:top w:val="single" w:sz="4" w:color="808080"/>
+          <w:left w:val="single" w:sz="4" w:color="808080"/>
+          <w:bottom w:val="single" w:sz="4" w:color="808080"/>
+          <w:right w:val="single" w:sz="4" w:color="808080"/>
+          <w:insideH w:val="single" w:sz="4" w:color="808080"/>
+          <w:insideV w:val="single" w:sz="4" w:color="808080"/>
+        </w:tblBorders>
+      </w:tblPr>
+      <w:tblGrid>
+        <w:gridCol w:w="1980"/>
+        <w:gridCol w:w="1980"/>
+        <w:gridCol w:w="1980"/>
+        <w:gridCol w:w="1980"/>
+      </w:tblGrid>
+      <w:tr>
+        <w:trPr>
+          <w:tblHeader w:val="on"/>
+        </w:trPr>
+        <w:tc>
+          <w:tcPr/>
+          <w:p>
+            <w:pPr>
+              <w:pStyle w:val="Compact"/>
+              <w:spacing w:line="240" w:lineRule="auto"/>
+              <w:jc w:val="left"/>
+            </w:pPr>
+            <w:r>
+              <w:rPr>
+                <w:sz w:val="19"/>
+              </w:rPr>
+              <w:t xml:space="preserve">Crashes vs. comparison flights</w:t>
+            </w:r>
+          </w:p>
+        </w:tc>
+        <w:tc>
+          <w:tcPr/>
+          <w:p>
+            <w:pPr>
+              <w:pStyle w:val="Compact"/>
+              <w:spacing w:line="240" w:lineRule="auto"/>
+              <w:jc w:val="center"/>
+            </w:pPr>
+            <w:r>
+              <w:rPr>
+                <w:sz w:val="19"/>
+              </w:rPr>
+              <w:t xml:space="preserve">Crashes</w:t>
+            </w:r>
+          </w:p>
+        </w:tc>
+        <w:tc>
+          <w:tcPr/>
+          <w:p>
+            <w:pPr>
+              <w:pStyle w:val="Compact"/>
+              <w:spacing w:line="240" w:lineRule="auto"/>
+              <w:jc w:val="center"/>
+            </w:pPr>
+            <w:r>
+              <w:rPr>
+                <w:sz w:val="19"/>
+              </w:rPr>
+              <w:t xml:space="preserve">Comparison</w:t>
+            </w:r>
+          </w:p>
+        </w:tc>
+        <w:tc>
+          <w:tcPr/>
+          <w:p>
+            <w:pPr>
+              <w:pStyle w:val="Compact"/>
+              <w:spacing w:line="240" w:lineRule="auto"/>
+              <w:jc w:val="center"/>
+            </w:pPr>
+            <w:r>
+              <w:rPr>
+                <w:sz w:val="19"/>
+              </w:rPr>
+              <w:t xml:space="preserve">AUC [95% CI]</w:t>
+            </w:r>
+          </w:p>
+        </w:tc>
+      </w:tr>
+      <w:tr>
+        <w:tc>
+          <w:tcPr/>
+          <w:p>
+            <w:pPr>
+              <w:pStyle w:val="Compact"/>
+              <w:spacing w:line="240" w:lineRule="auto"/>
+              <w:jc w:val="left"/>
+            </w:pPr>
+            <w:r>
+              <w:rPr>
+                <w:sz w:val="19"/>
+              </w:rPr>
+              <w:t xml:space="preserve">103 vs. rated normals</w:t>
+            </w:r>
+          </w:p>
+        </w:tc>
+        <w:tc>
+          <w:tcPr/>
+          <w:p>
+            <w:pPr>
+              <w:pStyle w:val="Compact"/>
+              <w:spacing w:line="240" w:lineRule="auto"/>
+              <w:jc w:val="center"/>
+            </w:pPr>
+            <w:r>
+              <w:rPr>
+                <w:sz w:val="19"/>
+              </w:rPr>
+              <w:t xml:space="preserve">78</w:t>
+            </w:r>
+          </w:p>
+        </w:tc>
+        <w:tc>
+          <w:tcPr/>
+          <w:p>
+            <w:pPr>
+              <w:pStyle w:val="Compact"/>
+              <w:spacing w:line="240" w:lineRule="auto"/>
+              <w:jc w:val="center"/>
+            </w:pPr>
+            <w:r>
+              <w:rPr>
+                <w:sz w:val="19"/>
+              </w:rPr>
+              <w:t xml:space="preserve">91</w:t>
+            </w:r>
+          </w:p>
+        </w:tc>
+        <w:tc>
+          <w:tcPr/>
+          <w:p>
+            <w:pPr>
+              <w:pStyle w:val="Compact"/>
+              <w:spacing w:line="240" w:lineRule="auto"/>
+              <w:jc w:val="center"/>
+            </w:pPr>
+            <w:r>
+              <w:rPr>
+                <w:sz w:val="19"/>
+              </w:rPr>
+              <w:t xml:space="preserve">0.825 [0.699, 0.908]</w:t>
+            </w:r>
+          </w:p>
+        </w:tc>
+      </w:tr>
+      <w:tr>
+        <w:tc>
+          <w:tcPr/>
+          <w:p>
+            <w:pPr>
+              <w:pStyle w:val="Compact"/>
+              <w:spacing w:line="240" w:lineRule="auto"/>
+              <w:jc w:val="left"/>
+            </w:pPr>
+            <w:r>
+              <w:rPr>
+                <w:sz w:val="19"/>
+              </w:rPr>
+              <w:t xml:space="preserve">103 vs. matched unrated</w:t>
+            </w:r>
+          </w:p>
+        </w:tc>
+        <w:tc>
+          <w:tcPr/>
+          <w:p>
+            <w:pPr>
+              <w:pStyle w:val="Compact"/>
+              <w:spacing w:line="240" w:lineRule="auto"/>
+              <w:jc w:val="center"/>
+            </w:pPr>
+            <w:r>
+              <w:rPr>
+                <w:sz w:val="19"/>
+              </w:rPr>
+              <w:t xml:space="preserve">78</w:t>
+            </w:r>
+          </w:p>
+        </w:tc>
+        <w:tc>
+          <w:tcPr/>
+          <w:p>
+            <w:pPr>
+              <w:pStyle w:val="Compact"/>
+              <w:spacing w:line="240" w:lineRule="auto"/>
+              <w:jc w:val="center"/>
+            </w:pPr>
+            <w:r>
+              <w:rPr>
+                <w:sz w:val="19"/>
+              </w:rPr>
+              <w:t xml:space="preserve">311</w:t>
+            </w:r>
+          </w:p>
+        </w:tc>
+        <w:tc>
+          <w:tcPr/>
+          <w:p>
+            <w:pPr>
+              <w:pStyle w:val="Compact"/>
+              <w:spacing w:line="240" w:lineRule="auto"/>
+              <w:jc w:val="center"/>
+            </w:pPr>
+            <w:r>
+              <w:rPr>
+                <w:sz w:val="19"/>
+              </w:rPr>
+              <w:t xml:space="preserve">0.686 [0.591, 0.777]</w:t>
+            </w:r>
+          </w:p>
+        </w:tc>
+      </w:tr>
+      <w:tr>
+        <w:tc>
+          <w:tcPr/>
+          <w:p>
+            <w:pPr>
+              <w:pStyle w:val="Compact"/>
+              <w:spacing w:line="240" w:lineRule="auto"/>
+              <w:jc w:val="left"/>
+            </w:pPr>
+            <w:r>
+              <w:rPr>
+                <w:sz w:val="19"/>
+              </w:rPr>
+              <w:t xml:space="preserve">67 vs. rated normals</w:t>
+            </w:r>
+          </w:p>
+        </w:tc>
+        <w:tc>
+          <w:tcPr/>
+          <w:p>
+            <w:pPr>
+              <w:pStyle w:val="Compact"/>
+              <w:spacing w:line="240" w:lineRule="auto"/>
+              <w:jc w:val="center"/>
+            </w:pPr>
+            <w:r>
+              <w:rPr>
+                <w:sz w:val="19"/>
+              </w:rPr>
+              <w:t xml:space="preserve">67</w:t>
+            </w:r>
+          </w:p>
+        </w:tc>
+        <w:tc>
+          <w:tcPr/>
+          <w:p>
+            <w:pPr>
+              <w:pStyle w:val="Compact"/>
+              <w:spacing w:line="240" w:lineRule="auto"/>
+              <w:jc w:val="center"/>
+            </w:pPr>
+            <w:r>
+              <w:rPr>
+                <w:sz w:val="19"/>
+              </w:rPr>
+              <w:t xml:space="preserve">91</w:t>
+            </w:r>
+          </w:p>
+        </w:tc>
+        <w:tc>
+          <w:tcPr/>
+          <w:p>
+            <w:pPr>
+              <w:pStyle w:val="Compact"/>
+              <w:spacing w:line="240" w:lineRule="auto"/>
+              <w:jc w:val="center"/>
+            </w:pPr>
+            <w:r>
+              <w:rPr>
+                <w:sz w:val="19"/>
+              </w:rPr>
+              <w:t xml:space="preserve">0.673 [0.540, 0.838]</w:t>
+            </w:r>
+          </w:p>
+        </w:tc>
+      </w:tr>
+      <w:tr>
+        <w:tc>
+          <w:tcPr/>
+          <w:p>
+            <w:pPr>
+              <w:pStyle w:val="Compact"/>
+              <w:spacing w:line="240" w:lineRule="auto"/>
+              <w:jc w:val="left"/>
+            </w:pPr>
+            <w:r>
+              <w:rPr>
+                <w:sz w:val="19"/>
+              </w:rPr>
+              <w:t xml:space="preserve">67 vs. matched unrated</w:t>
+            </w:r>
+          </w:p>
+        </w:tc>
+        <w:tc>
+          <w:tcPr/>
+          <w:p>
+            <w:pPr>
+              <w:pStyle w:val="Compact"/>
+              <w:spacing w:line="240" w:lineRule="auto"/>
+              <w:jc w:val="center"/>
+            </w:pPr>
+            <w:r>
+              <w:rPr>
+                <w:sz w:val="19"/>
+              </w:rPr>
+              <w:t xml:space="preserve">67</w:t>
+            </w:r>
+          </w:p>
+        </w:tc>
+        <w:tc>
+          <w:tcPr/>
+          <w:p>
+            <w:pPr>
+              <w:pStyle w:val="Compact"/>
+              <w:spacing w:line="240" w:lineRule="auto"/>
+              <w:jc w:val="center"/>
+            </w:pPr>
+            <w:r>
+              <w:rPr>
+                <w:sz w:val="19"/>
+              </w:rPr>
+              <w:t xml:space="preserve">311</w:t>
+            </w:r>
+          </w:p>
+        </w:tc>
+        <w:tc>
+          <w:tcPr/>
+          <w:p>
+            <w:pPr>
+              <w:pStyle w:val="Compact"/>
+              <w:spacing w:line="240" w:lineRule="auto"/>
+              <w:jc w:val="center"/>
+            </w:pPr>
+            <w:r>
+              <w:rPr>
+                <w:sz w:val="19"/>
+              </w:rPr>
+              <w:t xml:space="preserve">0.623 [0.523, 0.716]</w:t>
+            </w:r>
+          </w:p>
+        </w:tc>
+      </w:tr>
+      <w:tr>
+        <w:tc>
+          <w:tcPr/>
+          <w:p>
+            <w:pPr>
+              <w:pStyle w:val="Compact"/>
+              <w:spacing w:line="240" w:lineRule="auto"/>
+              <w:jc w:val="left"/>
+            </w:pPr>
+            <w:r>
+              <w:rPr>
+                <w:sz w:val="19"/>
+              </w:rPr>
+              <w:t xml:space="preserve">Factor (optimistic</w:t>
+            </w:r>
+            <w:r>
+              <w:rPr>
+                <w:sz w:val="19"/>
+              </w:rPr>
+              <w:t xml:space="preserve"> </w:t>
+            </w:r>
+            <m:oMath>
+              <m:r>
+                <m:rPr>
+                  <m:sty m:val="p"/>
+                </m:rPr>
+                <m:t>→</m:t>
+              </m:r>
+            </m:oMath>
+            <w:r>
+              <w:rPr>
+                <w:sz w:val="19"/>
+              </w:rPr>
+              <w:t xml:space="preserve"> </w:t>
+            </w:r>
+            <w:r>
+              <w:rPr>
+                <w:sz w:val="19"/>
+              </w:rPr>
+              <w:t xml:space="preserve">conservative)</w:t>
+            </w:r>
+          </w:p>
+        </w:tc>
+        <w:tc>
+          <w:tcPr>
+            <w:gridSpan w:val="2"/>
+          </w:tcPr>
+          <w:p>
+            <w:pPr>
+              <w:pStyle w:val="Compact"/>
+              <w:spacing w:line="240" w:lineRule="auto"/>
+              <w:jc w:val="center"/>
+            </w:pPr>
+            <w:r>
+              <w:rPr>
+                <w:sz w:val="19"/>
+              </w:rPr>
+              <w:t xml:space="preserve">Shapley share of drop</w:t>
+            </w:r>
+          </w:p>
+        </w:tc>
+        <w:tc>
+          <w:tcPr/>
+          <w:p>
+            <w:pPr>
+              <w:pStyle w:val="Compact"/>
+              <w:spacing w:line="240" w:lineRule="auto"/>
+              <w:jc w:val="center"/>
+            </w:pPr>
+            <w:r>
+              <w:rPr>
+                <w:sz w:val="19"/>
+              </w:rPr>
+              <w:t xml:space="preserve">Material</w:t>
+            </w:r>
+          </w:p>
+        </w:tc>
+      </w:tr>
+      <w:tr>
+        <w:tc>
+          <w:tcPr/>
+          <w:p>
+            <w:pPr>
+              <w:pStyle w:val="Compact"/>
+              <w:spacing w:line="240" w:lineRule="auto"/>
+              <w:jc w:val="left"/>
+            </w:pPr>
+            <w:r>
+              <w:rPr>
+                <w:sz w:val="19"/>
+              </w:rPr>
+              <w:t xml:space="preserve">Folds: stratified</w:t>
+            </w:r>
+            <w:r>
+              <w:rPr>
+                <w:sz w:val="19"/>
+              </w:rPr>
+              <w:t xml:space="preserve"> </w:t>
+            </w:r>
+            <m:oMath>
+              <m:r>
+                <m:rPr>
+                  <m:sty m:val="p"/>
+                </m:rPr>
+                <m:t>→</m:t>
+              </m:r>
+            </m:oMath>
+            <w:r>
+              <w:rPr>
+                <w:sz w:val="19"/>
+              </w:rPr>
+              <w:t xml:space="preserve"> </w:t>
+            </w:r>
+            <w:r>
+              <w:rPr>
+                <w:sz w:val="19"/>
+              </w:rPr>
+              <w:t xml:space="preserve">by vehicle</w:t>
+            </w:r>
+          </w:p>
+        </w:tc>
+        <w:tc>
+          <w:tcPr>
+            <w:gridSpan w:val="2"/>
+          </w:tcPr>
+          <w:p>
+            <w:pPr>
+              <w:pStyle w:val="Compact"/>
+              <w:spacing w:line="240" w:lineRule="auto"/>
+              <w:jc w:val="center"/>
+            </w:pPr>
+            <w:r>
+              <w:rPr>
+                <w:sz w:val="19"/>
+              </w:rPr>
+              <w:t xml:space="preserve">0.062 [0.034, 0.087]</w:t>
+            </w:r>
+          </w:p>
+        </w:tc>
+        <w:tc>
+          <w:tcPr/>
+          <w:p>
+            <w:pPr>
+              <w:pStyle w:val="Compact"/>
+              <w:spacing w:line="240" w:lineRule="auto"/>
+              <w:jc w:val="center"/>
+            </w:pPr>
+            <w:r>
+              <w:rPr>
+                <w:sz w:val="19"/>
+              </w:rPr>
+              <w:t xml:space="preserve">Yes</w:t>
+            </w:r>
+          </w:p>
+        </w:tc>
+      </w:tr>
+      <w:tr>
+        <w:tc>
+          <w:tcPr/>
+          <w:p>
+            <w:pPr>
+              <w:pStyle w:val="Compact"/>
+              <w:spacing w:line="240" w:lineRule="auto"/>
+              <w:jc w:val="left"/>
+            </w:pPr>
+            <w:r>
+              <w:rPr>
+                <w:sz w:val="19"/>
+              </w:rPr>
+              <w:t xml:space="preserve">Comparison: rated</w:t>
+            </w:r>
+            <w:r>
+              <w:rPr>
+                <w:sz w:val="19"/>
+              </w:rPr>
+              <w:t xml:space="preserve"> </w:t>
+            </w:r>
+            <m:oMath>
+              <m:r>
+                <m:rPr>
+                  <m:sty m:val="p"/>
+                </m:rPr>
+                <m:t>→</m:t>
+              </m:r>
+            </m:oMath>
+            <w:r>
+              <w:rPr>
+                <w:sz w:val="19"/>
+              </w:rPr>
+              <w:t xml:space="preserve"> </w:t>
+            </w:r>
+            <w:r>
+              <w:rPr>
+                <w:sz w:val="19"/>
+              </w:rPr>
+              <w:t xml:space="preserve">unrated</w:t>
+            </w:r>
+          </w:p>
+        </w:tc>
+        <w:tc>
+          <w:tcPr>
+            <w:gridSpan w:val="2"/>
+          </w:tcPr>
+          <w:p>
+            <w:pPr>
+              <w:pStyle w:val="Compact"/>
+              <w:spacing w:line="240" w:lineRule="auto"/>
+              <w:jc w:val="center"/>
+            </w:pPr>
+            <w:r>
+              <w:rPr>
+                <w:sz w:val="19"/>
+              </w:rPr>
+              <w:t xml:space="preserve">0.070 [</w:t>
+            </w:r>
+            <m:oMath>
+              <m:r>
+                <m:rPr>
+                  <m:sty m:val="p"/>
+                </m:rPr>
+                <m:t>−</m:t>
+              </m:r>
+              <m:r>
+                <m:t>0.033</m:t>
+              </m:r>
+            </m:oMath>
+            <w:r>
+              <w:rPr>
+                <w:sz w:val="19"/>
+              </w:rPr>
+              <w:t xml:space="preserve">, 0.157]</w:t>
+            </w:r>
+          </w:p>
+        </w:tc>
+        <w:tc>
+          <w:tcPr/>
+          <w:p>
+            <w:pPr>
+              <w:pStyle w:val="Compact"/>
+              <w:spacing w:line="240" w:lineRule="auto"/>
+              <w:jc w:val="center"/>
+            </w:pPr>
+            <w:r>
+              <w:rPr>
+                <w:sz w:val="19"/>
+              </w:rPr>
+              <w:t xml:space="preserve">No</w:t>
+            </w:r>
+          </w:p>
+        </w:tc>
+      </w:tr>
+      <w:tr>
+        <w:tc>
+          <w:tcPr/>
+          <w:p>
+            <w:pPr>
+              <w:pStyle w:val="Compact"/>
+              <w:spacing w:line="240" w:lineRule="auto"/>
+              <w:jc w:val="left"/>
+            </w:pPr>
+            <w:r>
+              <w:rPr>
+                <w:sz w:val="19"/>
+              </w:rPr>
+              <w:t xml:space="preserve">Crash set: 103</w:t>
+            </w:r>
+            <w:r>
+              <w:rPr>
+                <w:sz w:val="19"/>
+              </w:rPr>
+              <w:t xml:space="preserve"> </w:t>
+            </w:r>
+            <m:oMath>
+              <m:r>
+                <m:rPr>
+                  <m:sty m:val="p"/>
+                </m:rPr>
+                <m:t>→</m:t>
+              </m:r>
+            </m:oMath>
+            <w:r>
+              <w:rPr>
+                <w:sz w:val="19"/>
+              </w:rPr>
+              <w:t xml:space="preserve"> </w:t>
+            </w:r>
+            <w:r>
+              <w:rPr>
+                <w:sz w:val="19"/>
+              </w:rPr>
+              <w:t xml:space="preserve">67</w:t>
+            </w:r>
+          </w:p>
+        </w:tc>
+        <w:tc>
+          <w:tcPr>
+            <w:gridSpan w:val="2"/>
+          </w:tcPr>
+          <w:p>
+            <w:pPr>
+              <w:pStyle w:val="Compact"/>
+              <w:spacing w:line="240" w:lineRule="auto"/>
+              <w:jc w:val="center"/>
+            </w:pPr>
+            <w:r>
+              <w:rPr>
+                <w:sz w:val="19"/>
+              </w:rPr>
+              <w:t xml:space="preserve">0.064 [</w:t>
+            </w:r>
+            <m:oMath>
+              <m:r>
+                <m:rPr>
+                  <m:sty m:val="p"/>
+                </m:rPr>
+                <m:t>−</m:t>
+              </m:r>
+              <m:r>
+                <m:t>0.062</m:t>
+              </m:r>
+            </m:oMath>
+            <w:r>
+              <w:rPr>
+                <w:sz w:val="19"/>
+              </w:rPr>
+              <w:t xml:space="preserve">, 0.186]</w:t>
+            </w:r>
+          </w:p>
+        </w:tc>
+        <w:tc>
+          <w:tcPr/>
+          <w:p>
+            <w:pPr>
+              <w:pStyle w:val="Compact"/>
+              <w:spacing w:line="240" w:lineRule="auto"/>
+              <w:jc w:val="center"/>
+            </w:pPr>
+            <w:r>
+              <w:rPr>
+                <w:sz w:val="19"/>
+              </w:rPr>
+              <w:t xml:space="preserve">No</w:t>
+            </w:r>
+          </w:p>
+        </w:tc>
+      </w:tr>
+      <w:tr>
+        <w:tc>
+          <w:tcPr/>
+          <w:p>
+            <w:pPr>
+              <w:pStyle w:val="Compact"/>
+              <w:spacing w:line="240" w:lineRule="auto"/>
+              <w:jc w:val="left"/>
+            </w:pPr>
+            <w:r>
+              <w:rPr>
+                <w:sz w:val="19"/>
+              </w:rPr>
+              <w:t xml:space="preserve">Crash window:</w:t>
+            </w:r>
+            <w:r>
+              <w:rPr>
+                <w:sz w:val="19"/>
+              </w:rPr>
+              <w:t xml:space="preserve"> </w:t>
+            </w:r>
+            <m:oMath>
+              <m:r>
+                <m:t>m</m:t>
+              </m:r>
+              <m:r>
+                <m:rPr>
+                  <m:sty m:val="p"/>
+                </m:rPr>
+                <m:t>=</m:t>
+              </m:r>
+              <m:r>
+                <m:t>0</m:t>
+              </m:r>
+              <m:r>
+                <m:rPr>
+                  <m:sty m:val="p"/>
+                </m:rPr>
+                <m:t>→</m:t>
+              </m:r>
+              <m:r>
+                <m:t>10</m:t>
+              </m:r>
+            </m:oMath>
+            <w:r>
+              <w:rPr>
+                <w:sz w:val="19"/>
+              </w:rPr>
+              <w:t xml:space="preserve"> s</w:t>
+            </w:r>
+          </w:p>
+        </w:tc>
+        <w:tc>
+          <w:tcPr>
+            <w:gridSpan w:val="2"/>
+          </w:tcPr>
+          <w:p>
+            <w:pPr>
+              <w:pStyle w:val="Compact"/>
+              <w:spacing w:line="240" w:lineRule="auto"/>
+              <w:jc w:val="center"/>
+            </w:pPr>
+            <w:r>
+              <w:rPr>
+                <w:sz w:val="19"/>
+              </w:rPr>
+              <w:t xml:space="preserve">0.014 [0.007, 0.023]</w:t>
+            </w:r>
+          </w:p>
+        </w:tc>
+        <w:tc>
+          <w:tcPr/>
+          <w:p>
+            <w:pPr>
+              <w:pStyle w:val="Compact"/>
+              <w:spacing w:line="240" w:lineRule="auto"/>
+              <w:jc w:val="center"/>
+            </w:pPr>
+            <w:r>
+              <w:rPr>
+                <w:sz w:val="19"/>
+              </w:rPr>
+              <w:t xml:space="preserve">No (</w:t>
+            </w:r>
+            <m:oMath>
+              <m:r>
+                <m:rPr>
+                  <m:sty m:val="p"/>
+                </m:rPr>
+                <m:t>&lt;</m:t>
+              </m:r>
+              <m:r>
+                <m:t>0.05</m:t>
+              </m:r>
+            </m:oMath>
+            <w:r>
+              <w:rPr>
+                <w:sz w:val="19"/>
+              </w:rPr>
+              <w:t xml:space="preserve">)</w:t>
+            </w:r>
+          </w:p>
+        </w:tc>
+      </w:tr>
+      <w:tr>
+        <w:tc>
+          <w:tcPr/>
+          <w:p>
+            <w:pPr>
+              <w:pStyle w:val="Compact"/>
+              <w:spacing w:line="240" w:lineRule="auto"/>
+              <w:jc w:val="left"/>
+            </w:pPr>
+            <w:r>
+              <w:rPr>
+                <w:sz w:val="19"/>
+              </w:rPr>
+              <w:t xml:space="preserve">Window: full</w:t>
+            </w:r>
+            <w:r>
+              <w:rPr>
+                <w:sz w:val="19"/>
+              </w:rPr>
+              <w:t xml:space="preserve"> </w:t>
+            </w:r>
+            <m:oMath>
+              <m:r>
+                <m:rPr>
+                  <m:sty m:val="p"/>
+                </m:rPr>
+                <m:t>→</m:t>
+              </m:r>
+            </m:oMath>
+            <w:r>
+              <w:rPr>
+                <w:sz w:val="19"/>
+              </w:rPr>
+              <w:t xml:space="preserve"> </w:t>
+            </w:r>
+            <w:r>
+              <w:rPr>
+                <w:sz w:val="19"/>
+              </w:rPr>
+              <w:t xml:space="preserve">first 30 s</w:t>
+            </w:r>
+          </w:p>
+        </w:tc>
+        <w:tc>
+          <w:tcPr>
+            <w:gridSpan w:val="2"/>
+          </w:tcPr>
+          <w:p>
+            <w:pPr>
+              <w:pStyle w:val="Compact"/>
+              <w:spacing w:line="240" w:lineRule="auto"/>
+              <w:jc w:val="center"/>
+            </w:pPr>
+            <w:r>
+              <w:rPr>
+                <w:sz w:val="19"/>
+              </w:rPr>
+              <w:t xml:space="preserve">0.001 [</w:t>
+            </w:r>
+            <m:oMath>
+              <m:r>
+                <m:rPr>
+                  <m:sty m:val="p"/>
+                </m:rPr>
+                <m:t>−</m:t>
+              </m:r>
+              <m:r>
+                <m:t>0.031</m:t>
+              </m:r>
+            </m:oMath>
+            <w:r>
+              <w:rPr>
+                <w:sz w:val="19"/>
+              </w:rPr>
+              <w:t xml:space="preserve">, 0.034]</w:t>
+            </w:r>
+          </w:p>
+        </w:tc>
+        <w:tc>
+          <w:tcPr/>
+          <w:p>
+            <w:pPr>
+              <w:pStyle w:val="Compact"/>
+              <w:spacing w:line="240" w:lineRule="auto"/>
+              <w:jc w:val="center"/>
+            </w:pPr>
+            <w:r>
+              <w:rPr>
+                <w:sz w:val="19"/>
+              </w:rPr>
+              <w:t xml:space="preserve">No</w:t>
+            </w:r>
+          </w:p>
+        </w:tc>
+      </w:tr>
+    </w:tbl>
+    <w:bookmarkEnd w:id="47"/>
+    <w:p>
+      <w:pPr>
+        <w:pStyle w:val="Heading2"/>
+      </w:pPr>
+      <w:bookmarkStart w:id="48" w:name="_7d36f114b9234da3ba56cdf6e68d941cb747d23"/>
+      <w:r>
+        <w:rPr>
+          <w:rStyle w:val="SectionNumber"/>
+        </w:rPr>
+        <w:t xml:space="preserve">5.5</w:t>
+      </w:r>
+      <w:r>
+        <w:tab/>
+      </w:r>
+      <w:r>
         <w:t xml:space="preserve">Within the same drone and between drones (Q3b, Q3c)</w:t>
       </w:r>
-      <w:bookmarkEnd w:id="46"/>
+      <w:bookmarkEnd w:id="48"/>
     </w:p>
     <w:p>
       <w:pPr>
@@ -16776,7 +17914,7 @@
         <w:t xml:space="preserve">54.0 inspections per crash) at the 10% flag rate. We emphasize that because the 107 reference controls (filling 124 slots across 20 strata with 17 controls reused across sets) were drawn from the same archive pool as the matched sets, and because the exact Bayes PPVs assume an operational 10% flag rate among non-crash drones rather than measuring realized flag rates across the entire 38,320-vehicle population, these PPV figures (2.26–2.43%) represent an exploratory illustration conditional on the assumed flag rate and discovery sensitivity (20 of 60) rather than an independently frozen population benchmark. In all scenarios, vibration screening functions as a broad maintenance inspection filter rather than an operational crash warning.</w:t>
       </w:r>
     </w:p>
-    <w:bookmarkStart w:id="50" w:name="_9361c5dba1dea8da31b0aed692bc5b019a98a7f"/>
+    <w:bookmarkStart w:id="52" w:name="_9361c5dba1dea8da31b0aed692bc5b019a98a7f"/>
     <w:p>
       <w:pPr>
         <w:pStyle w:val="CaptionedFigure"/>
@@ -16787,18 +17925,18 @@
           <wp:inline>
             <wp:extent cx="4160520" cy="2384920"/>
             <wp:effectExtent b="0" l="0" r="0" t="0"/>
-            <wp:docPr descr="" title="" id="48" name="Picture"/>
+            <wp:docPr descr="" title="" id="50" name="Picture"/>
             <a:graphic>
               <a:graphicData uri="http://schemas.openxmlformats.org/drawingml/2006/picture">
                 <pic:pic>
                   <pic:nvPicPr>
-                    <pic:cNvPr descr="fig_within_between.png" id="49" name="Picture"/>
+                    <pic:cNvPr descr="fig_within_between.png" id="51" name="Picture"/>
                     <pic:cNvPicPr>
                       <a:picLocks noChangeArrowheads="1" noChangeAspect="1"/>
                     </pic:cNvPicPr>
                   </pic:nvPicPr>
                   <pic:blipFill>
-                    <a:blip r:embed="rId47"/>
+                    <a:blip r:embed="rId49"/>
                     <a:stretch>
                       <a:fillRect/>
                     </a:stretch>
@@ -16839,17 +17977,17 @@
         <w:t xml:space="preserve">without a recorded crash (bottom). 0.5 indicates no difference.</w:t>
       </w:r>
     </w:p>
-    <w:bookmarkEnd w:id="50"/>
+    <w:bookmarkEnd w:id="52"/>
     <w:p>
       <w:pPr>
         <w:pStyle w:val="Heading2"/>
       </w:pPr>
-      <w:bookmarkStart w:id="51" w:name="_c68dcf7b88a01fcf500c8e00d7b03511ec2fbc1"/>
+      <w:bookmarkStart w:id="53" w:name="_c68dcf7b88a01fcf500c8e00d7b03511ec2fbc1"/>
       <w:r>
         <w:rPr>
           <w:rStyle w:val="SectionNumber"/>
         </w:rPr>
-        <w:t xml:space="preserve">5.5</w:t>
+        <w:t xml:space="preserve">5.6</w:t>
       </w:r>
       <w:r>
         <w:tab/>
@@ -16857,7 +17995,7 @@
       <w:r>
         <w:t xml:space="preserve">Robustness of the between-drone result (exploratory)</w:t>
       </w:r>
-      <w:bookmarkEnd w:id="51"/>
+      <w:bookmarkEnd w:id="53"/>
     </w:p>
     <w:p>
       <w:pPr>
@@ -17750,7 +18888,7 @@
         <w:t xml:space="preserve">capacity of the current single archive, resolving this effect definitively requires prospective multi-fleet partner deployments.</w:t>
       </w:r>
     </w:p>
-    <w:bookmarkStart w:id="55" w:name="_f3665d09ec22ddd60812b28fa68e496f60eecb2"/>
+    <w:bookmarkStart w:id="57" w:name="_f3665d09ec22ddd60812b28fa68e496f60eecb2"/>
     <w:p>
       <w:pPr>
         <w:pStyle w:val="CaptionedFigure"/>
@@ -17761,18 +18899,18 @@
           <wp:inline>
             <wp:extent cx="4160520" cy="2531605"/>
             <wp:effectExtent b="0" l="0" r="0" t="0"/>
-            <wp:docPr descr="" title="" id="53" name="Picture"/>
+            <wp:docPr descr="" title="" id="55" name="Picture"/>
             <a:graphic>
               <a:graphicData uri="http://schemas.openxmlformats.org/drawingml/2006/picture">
                 <pic:pic>
                   <pic:nvPicPr>
-                    <pic:cNvPr descr="fig_robustness.png" id="54" name="Picture"/>
+                    <pic:cNvPr descr="fig_robustness.png" id="56" name="Picture"/>
                     <pic:cNvPicPr>
                       <a:picLocks noChangeArrowheads="1" noChangeAspect="1"/>
                     </pic:cNvPicPr>
                   </pic:nvPicPr>
                   <pic:blipFill>
-                    <a:blip r:embed="rId52"/>
+                    <a:blip r:embed="rId54"/>
                     <a:stretch>
                       <a:fillRect/>
                     </a:stretch>
@@ -17827,17 +18965,17 @@
         <w:t xml:space="preserve">.</w:t>
       </w:r>
     </w:p>
-    <w:bookmarkEnd w:id="55"/>
+    <w:bookmarkEnd w:id="57"/>
     <w:p>
       <w:pPr>
         <w:pStyle w:val="Heading2"/>
       </w:pPr>
-      <w:bookmarkStart w:id="56" w:name="_440012d4f1ae87c72168f87fd4eb66e49627717"/>
+      <w:bookmarkStart w:id="58" w:name="_440012d4f1ae87c72168f87fd4eb66e49627717"/>
       <w:r>
         <w:rPr>
           <w:rStyle w:val="SectionNumber"/>
         </w:rPr>
-        <w:t xml:space="preserve">5.6</w:t>
+        <w:t xml:space="preserve">5.7</w:t>
       </w:r>
       <w:r>
         <w:tab/>
@@ -17845,7 +18983,7 @@
       <w:r>
         <w:t xml:space="preserve">Expert diagnoses (Q4)</w:t>
       </w:r>
-      <w:bookmarkEnd w:id="56"/>
+      <w:bookmarkEnd w:id="58"/>
     </w:p>
     <w:p>
       <w:pPr>
@@ -17894,7 +19032,7 @@
         <w:t xml:space="preserve"> </w:t>
       </w:r>
       <w:r>
-        <w:t xml:space="preserve">Table 8 (12 tuning, 5 vibration, 5 GPS, 9 motor, 4 battery).</w:t>
+        <w:t xml:space="preserve">Table 10 (12 tuning, 5 vibration, 5 GPS, 9 motor, 4 battery).</w:t>
       </w:r>
     </w:p>
     <w:p>
@@ -17902,7 +19040,7 @@
         <w:pStyle w:val="BodyText"/>
       </w:pPr>
       <w:r>
-        <w:t xml:space="preserve">Table 8 compares the fault checks with the full flight window (</w:t>
+        <w:t xml:space="preserve">Table 10 compares the fault checks with the full flight window (</w:t>
       </w:r>
       <m:oMath>
         <m:r>
@@ -18717,13 +19855,13 @@
         <w:t xml:space="preserve">Nonetheless, this independent evaluation illustrates the challenge of log-based attribution: neither the heuristic rule nor the statistical model demonstrated reliable agreement above chance.</w:t>
       </w:r>
     </w:p>
-    <w:bookmarkStart w:id="57" w:name="_83343f61327e522fa9ffc9aa8f722d134b07ff7"/>
+    <w:bookmarkStart w:id="59" w:name="_83343f61327e522fa9ffc9aa8f722d134b07ff7"/>
     <w:p>
       <w:pPr>
         <w:pStyle w:val="TableCaption"/>
       </w:pPr>
       <w:r>
-        <w:t xml:space="preserve">Table 8. Fault checks on logs whose expert named the matching fault, with the full window (</w:t>
+        <w:t xml:space="preserve">Table 10. Fault checks on logs whose expert named the matching fault, with the full window (</w:t>
       </w:r>
       <m:oMath>
         <m:r>
@@ -18777,7 +19915,7 @@
         <w:tblStyle w:val="Table"/>
         <w:tblW w:type="pct" w:w="5000"/>
         <w:tblLook w:firstRow="0" w:lastRow="0" w:firstColumn="0" w:lastColumn="0" w:noHBand="0" w:noVBand="0" w:val="0000"/>
-        <w:tblCaption w:val="Table 8. Fault checks on logs whose expert named the matching fault, with the full window (m=0 s) and with the last 10 s before the crash removed (m=10 s). Declared criterion: at least 50% of diagnosed logs and at most 10% of normal flights. Paired columns show constant logs surviving across both windows."/>
+        <w:tblCaption w:val="Table 10. Fault checks on logs whose expert named the matching fault, with the full window (m=0 s) and with the last 10 s before the crash removed (m=10 s). Declared criterion: at least 50% of diagnosed logs and at most 10% of normal flights. Paired columns show constant logs surviving across both windows."/>
         <w:tblBorders>
           <w:top w:val="single" w:sz="4" w:color="808080"/>
           <w:left w:val="single" w:sz="4" w:color="808080"/>
@@ -19764,8 +20902,8 @@
         </w:tc>
       </w:tr>
     </w:tbl>
-    <w:bookmarkEnd w:id="57"/>
-    <w:bookmarkStart w:id="61" w:name="_c0d72e502cb8722b270509e9f977263b14fe2c0"/>
+    <w:bookmarkEnd w:id="59"/>
+    <w:bookmarkStart w:id="63" w:name="_c0d72e502cb8722b270509e9f977263b14fe2c0"/>
     <w:p>
       <w:pPr>
         <w:pStyle w:val="CaptionedFigure"/>
@@ -19776,18 +20914,18 @@
           <wp:inline>
             <wp:extent cx="4160520" cy="2603928"/>
             <wp:effectExtent b="0" l="0" r="0" t="0"/>
-            <wp:docPr descr="" title="" id="59" name="Picture"/>
+            <wp:docPr descr="" title="" id="61" name="Picture"/>
             <a:graphic>
               <a:graphicData uri="http://schemas.openxmlformats.org/drawingml/2006/picture">
                 <pic:pic>
                   <pic:nvPicPr>
-                    <pic:cNvPr descr="fig_forum_causes.png" id="60" name="Picture"/>
+                    <pic:cNvPr descr="fig_forum_causes.png" id="62" name="Picture"/>
                     <pic:cNvPicPr>
                       <a:picLocks noChangeArrowheads="1" noChangeAspect="1"/>
                     </pic:cNvPicPr>
                   </pic:nvPicPr>
                   <pic:blipFill>
-                    <a:blip r:embed="rId58"/>
+                    <a:blip r:embed="rId60"/>
                     <a:stretch>
                       <a:fillRect/>
                     </a:stretch>
@@ -19822,17 +20960,17 @@
         <w:t xml:space="preserve">Figure 6. Causes named by experts in PX4 forum threads that attributed a crash to the aircraft.</w:t>
       </w:r>
     </w:p>
-    <w:bookmarkEnd w:id="61"/>
+    <w:bookmarkEnd w:id="63"/>
     <w:p>
       <w:pPr>
         <w:pStyle w:val="Heading2"/>
       </w:pPr>
-      <w:bookmarkStart w:id="62" w:name="_fb365ced420b86c8cd60024101a350b346a0a31"/>
+      <w:bookmarkStart w:id="64" w:name="_fb365ced420b86c8cd60024101a350b346a0a31"/>
       <w:r>
         <w:rPr>
           <w:rStyle w:val="SectionNumber"/>
         </w:rPr>
-        <w:t xml:space="preserve">5.7</w:t>
+        <w:t xml:space="preserve">5.8</w:t>
       </w:r>
       <w:r>
         <w:tab/>
@@ -19840,23 +20978,23 @@
       <w:r>
         <w:t xml:space="preserve">Exploratory evaluation of language-model review panels (preliminary)</w:t>
       </w:r>
-      <w:bookmarkEnd w:id="62"/>
+      <w:bookmarkEnd w:id="64"/>
     </w:p>
     <w:p>
       <w:pPr>
         <w:pStyle w:val="FirstParagraph"/>
       </w:pPr>
       <w:r>
-        <w:t xml:space="preserve">Because language-model assistants are increasingly proposed for automated flight log analysis, we conducted a preliminary exploratory evaluation on 60 author-generated fault cases using four local models (3–4B parameters) configured both as single agents and as multi-agent review panels (Table 9). While a fixed deterministic rule achieved 75% accuracy (naming the true cause in 35 of 50 active cases and correctly abstaining on 10 no-cause cases) with 0% error (referring 15 cases to human operators), local language models produced substantial error rates (10–63% wrong), suffered from mode collapse or complete abstention on active causes, and proved highly vulnerable to consensus manipulation: in a worst-case sensitivity sweep, a single compromised reviewer systematically flipped the panel’s consensus decision in 45 to 56 of the 60 cases. In contrast, deterministic numeric telemetry extraction into code prevented direct prompt injection by construction across 40 hostile input strings. This exploratory comparison indicates that the tested small local models and review-panel configurations were unreliable on the 60 author-generated cases. Because the cases and fixed rule were developed by the same authors, the comparison is not an independent benchmark and should not be generalized to language models as a class or larger architectures. These preliminary results emphasize that multi-agent consensus voting without cryptographic proofs or fact-citation constraints cannot provide dependable safety assurance.</w:t>
+        <w:t xml:space="preserve">Because language-model assistants are increasingly proposed for automated flight log analysis, we conducted a preliminary exploratory evaluation on 60 author-generated fault cases using four local models (3–4B parameters) configured both as single agents and as multi-agent review panels (Table 11). While a fixed deterministic rule achieved 75% accuracy (naming the true cause in 35 of 50 active cases and correctly abstaining on 10 no-cause cases) with 0% error (referring 15 cases to human operators), local language models produced substantial error rates (10–63% wrong), suffered from mode collapse or complete abstention on active causes, and proved highly vulnerable to consensus manipulation: in a worst-case sensitivity sweep, a single compromised reviewer systematically flipped the panel’s consensus decision in 45 to 56 of the 60 cases. In contrast, deterministic numeric telemetry extraction into code prevented direct prompt injection by construction across 40 hostile input strings. This exploratory comparison indicates that the tested small local models and review-panel configurations were unreliable on the 60 author-generated cases. Because the cases and fixed rule were developed by the same authors, the comparison is not an independent benchmark and should not be generalized to language models as a class or larger architectures. These preliminary results emphasize that multi-agent consensus voting without cryptographic proofs or fact-citation constraints cannot provide dependable safety assurance.</w:t>
       </w:r>
     </w:p>
-    <w:bookmarkStart w:id="63" w:name="_e9a1c7ab9cd062877714c77f2a5f253f301b820"/>
+    <w:bookmarkStart w:id="65" w:name="_e9a1c7ab9cd062877714c77f2a5f253f301b820"/>
     <w:p>
       <w:pPr>
         <w:pStyle w:val="TableCaption"/>
       </w:pPr>
       <w:r>
-        <w:t xml:space="preserve">Table 9. Language-model review panels on 60 generated cases: counts of right (R), wrong (W), and deferred (Def) cases, with coverage (Cov., share of cases decided) and accuracy when answering (Acc.).</w:t>
+        <w:t xml:space="preserve">Table 11. Language-model review panels on 60 generated cases: counts of right (R), wrong (W), and deferred (Def) cases, with coverage (Cov., share of cases decided) and accuracy when answering (Acc.).</w:t>
       </w:r>
       <w:r>
         <w:t xml:space="preserve"> </w:t>
@@ -19876,7 +21014,7 @@
         <w:tblStyle w:val="Table"/>
         <w:tblW w:type="pct" w:w="5000"/>
         <w:tblLook w:firstRow="0" w:lastRow="0" w:firstColumn="0" w:lastColumn="0" w:noHBand="0" w:noVBand="0" w:val="0000"/>
-        <w:tblCaption w:val="Table 9. Language-model review panels on 60 generated cases: counts of right (R), wrong (W), and deferred (Def) cases, with coverage (Cov., share of cases decided) and accuracy when answering (Acc.). “Right” includes correctly leaving a no-cause case open. Single-agent gemma3 and phi4 answered only the 10 no-cause cases (0% coverage on active causes). Adversary flips show consensus changes caused by a single compromised reviewer in a worst-case sweep."/>
+        <w:tblCaption w:val="Table 11. Language-model review panels on 60 generated cases: counts of right (R), wrong (W), and deferred (Def) cases, with coverage (Cov., share of cases decided) and accuracy when answering (Acc.). “Right” includes correctly leaving a no-cause case open. Single-agent gemma3 and phi4 answered only the 10 no-cause cases (0% coverage on active causes). Adversary flips show consensus changes caused by a single compromised reviewer in a worst-case sweep."/>
         <w:tblBorders>
           <w:top w:val="single" w:sz="4" w:color="808080"/>
           <w:left w:val="single" w:sz="4" w:color="808080"/>
@@ -20812,7 +21950,7 @@
         </w:tc>
       </w:tr>
     </w:tbl>
-    <w:bookmarkEnd w:id="63"/>
+    <w:bookmarkEnd w:id="65"/>
     <w:p>
       <w:pPr>
         <w:pStyle w:val="FirstParagraph"/>
@@ -20842,12 +21980,12 @@
       <w:pPr>
         <w:pStyle w:val="Heading2"/>
       </w:pPr>
-      <w:bookmarkStart w:id="64" w:name="_000b339d75a155a848ca0c43e54b0b02b7b82d8"/>
+      <w:bookmarkStart w:id="66" w:name="_000b339d75a155a848ca0c43e54b0b02b7b82d8"/>
       <w:r>
         <w:rPr>
           <w:rStyle w:val="SectionNumber"/>
         </w:rPr>
-        <w:t xml:space="preserve">5.8</w:t>
+        <w:t xml:space="preserve">5.9</w:t>
       </w:r>
       <w:r>
         <w:tab/>
@@ -20855,14 +21993,14 @@
       <w:r>
         <w:t xml:space="preserve">Analyses added during revision (exploratory)</w:t>
       </w:r>
-      <w:bookmarkEnd w:id="64"/>
+      <w:bookmarkEnd w:id="66"/>
     </w:p>
     <w:p>
       <w:pPr>
         <w:pStyle w:val="FirstParagraph"/>
       </w:pPr>
       <w:r>
-        <w:t xml:space="preserve">To preserve the boundary between pre-declared confirmatory hypotheses (committed to version control on 20–24 October 2026; Table ??) and exploratory investigations added during revision</w:t>
+        <w:t xml:space="preserve">To preserve the boundary between pre-declared confirmatory hypotheses (committed to version control on 20–24 October 2026; Table 4) and exploratory investigations added during revision</w:t>
       </w:r>
       <w:r>
         <w:t xml:space="preserve"> </w:t>
@@ -20882,7 +22020,7 @@
         <w:t xml:space="preserve">]</w:t>
       </w:r>
       <w:r>
-        <w:t xml:space="preserve">, Table 10 documents each analysis added during peer review, its motivation, key results, git commit hash, first archive date in Software Heritage, and analysis run date. Exploratory analyses added during review are marked with</w:t>
+        <w:t xml:space="preserve">, Table 12 documents each analysis added during peer review, its motivation, key results, git commit hash, first archive date in Software Heritage, and analysis run date. Exploratory analyses added during review are marked with</w:t>
       </w:r>
       <w:r>
         <w:t xml:space="preserve"> </w:t>
@@ -20911,13 +22049,13 @@
         <w:t xml:space="preserve">throughout the text and tables. None of these exploratory additions altered the conclusions of the pre-declared tests; rather, they established empirical bounds on between-airframe confounding, tested alternative architectures, and quantified operational fleet screening performance.</w:t>
       </w:r>
     </w:p>
-    <w:bookmarkStart w:id="65" w:name="_fb475224272a447d57b77f14dfc8774bb10ba7c"/>
+    <w:bookmarkStart w:id="67" w:name="_fb475224272a447d57b77f14dfc8774bb10ba7c"/>
     <w:p>
       <w:pPr>
         <w:pStyle w:val="TableCaption"/>
       </w:pPr>
       <w:r>
-        <w:t xml:space="preserve">Table 10. Exploratory analyses added during peer review, their motivation, key results, git commit hashes, first archived dates in Software Heritage (</w:t>
+        <w:t xml:space="preserve">Table 12. Exploratory analyses added during peer review, their motivation, key results, git commit hashes, first archived dates in Software Heritage (</w:t>
       </w:r>
       <w:r>
         <w:rPr>
@@ -20970,7 +22108,7 @@
         <w:tblStyle w:val="Table"/>
         <w:tblW w:type="pct" w:w="5000"/>
         <w:tblLook w:firstRow="1" w:lastRow="0" w:firstColumn="0" w:lastColumn="0" w:noHBand="0" w:noVBand="0" w:val="0020"/>
-        <w:tblCaption w:val="Table 10. Exploratory analyses added during peer review, their motivation, key results, git commit hashes, first archived dates in Software Heritage (swh:1:rev:bad06ff1256865c7e63d44389aac174e0281291d, swh:1:rev:bbdd0420de4547ac7d67b84165292a46237b604d, swh:1:rev:624dd694e0d207dd9c44b1c9550faaf04453bc56, and swh:1:rev:3a9aa89417fa9ea2a2334e3a4794e2358fb713ee), and analysis run dates."/>
+        <w:tblCaption w:val="Table 12. Exploratory analyses added during peer review, their motivation, key results, git commit hashes, first archived dates in Software Heritage (swh:1:rev:bad06ff1256865c7e63d44389aac174e0281291d, swh:1:rev:bbdd0420de4547ac7d67b84165292a46237b604d, swh:1:rev:624dd694e0d207dd9c44b1c9550faaf04453bc56, and swh:1:rev:3a9aa89417fa9ea2a2334e3a4794e2358fb713ee), and analysis run dates."/>
         <w:tblBorders>
           <w:top w:val="single" w:sz="4" w:color="808080"/>
           <w:left w:val="single" w:sz="4" w:color="808080"/>
@@ -22531,7 +23669,7 @@
               <w:rPr>
                 <w:sz w:val="19"/>
               </w:rPr>
-              <w:t xml:space="preserve">67 multi-flight crashes vs. other-aircraft controls: AUC 0.522 [0.413, 0.615]</w:t>
+              <w:t xml:space="preserve">67 multi-flight crashes vs. other-aircraft controls: AUC 0.522 [0.413, 0.615]; superseded by the factorial audit (mixed extractors)</w:t>
             </w:r>
           </w:p>
         </w:tc>
@@ -23845,13 +24983,162 @@
           </w:p>
         </w:tc>
       </w:tr>
+      <w:tr>
+        <w:tc>
+          <w:tcPr/>
+          <w:p>
+            <w:pPr>
+              <w:pStyle w:val="Compact"/>
+              <w:spacing w:line="240" w:lineRule="auto"/>
+              <w:jc w:val="left"/>
+            </w:pPr>
+            <w:r>
+              <w:rPr>
+                <w:sz w:val="19"/>
+              </w:rPr>
+              <w:t xml:space="preserve">Factorial optimism audit</w:t>
+            </w:r>
+            <m:oMath>
+              <m:sSup>
+                <m:e>
+                  <m:r>
+                    <m:t>​</m:t>
+                  </m:r>
+                </m:e>
+                <m:sup>
+                  <m:r>
+                    <m:rPr>
+                      <m:sty m:val="p"/>
+                    </m:rPr>
+                    <m:t>†</m:t>
+                  </m:r>
+                </m:sup>
+              </m:sSup>
+            </m:oMath>
+          </w:p>
+        </w:tc>
+        <w:tc>
+          <w:tcPr/>
+          <w:p>
+            <w:pPr>
+              <w:pStyle w:val="Compact"/>
+              <w:spacing w:line="240" w:lineRule="auto"/>
+              <w:jc w:val="left"/>
+            </w:pPr>
+            <w:r>
+              <w:rPr>
+                <w:sz w:val="19"/>
+              </w:rPr>
+              <w:t xml:space="preserve">Round 14: isolate what the AUC depends on</w:t>
+            </w:r>
+          </w:p>
+        </w:tc>
+        <w:tc>
+          <w:tcPr/>
+          <w:p>
+            <w:pPr>
+              <w:pStyle w:val="Compact"/>
+              <w:spacing w:line="240" w:lineRule="auto"/>
+              <w:jc w:val="left"/>
+            </w:pPr>
+            <m:oMath>
+              <m:r>
+                <m:t>2</m:t>
+              </m:r>
+              <m:r>
+                <m:rPr>
+                  <m:sty m:val="p"/>
+                </m:rPr>
+                <m:t>×</m:t>
+              </m:r>
+              <m:r>
+                <m:t>2</m:t>
+              </m:r>
+            </m:oMath>
+            <w:r>
+              <w:rPr>
+                <w:sz w:val="19"/>
+              </w:rPr>
+              <w:t xml:space="preserve">: no cause isolated; drop 0.212 [0.062, 0.335], only grouped folds material (0.062)</w:t>
+            </w:r>
+          </w:p>
+        </w:tc>
+        <w:tc>
+          <w:tcPr/>
+          <w:p>
+            <w:pPr>
+              <w:pStyle w:val="Compact"/>
+              <w:spacing w:line="240" w:lineRule="auto"/>
+              <w:jc w:val="center"/>
+            </w:pPr>
+            <w:r>
+              <w:rPr>
+                <w:rStyle w:val="VerbatimChar"/>
+                <w:sz w:val="19"/>
+              </w:rPr>
+              <w:t xml:space="preserve">3c34530</w:t>
+            </w:r>
+            <w:r>
+              <w:rPr>
+                <w:sz w:val="19"/>
+              </w:rPr>
+              <w:t xml:space="preserve">,</w:t>
+            </w:r>
+            <w:r>
+              <w:rPr>
+                <w:sz w:val="19"/>
+              </w:rPr>
+              <w:t xml:space="preserve"> </w:t>
+            </w:r>
+            <w:r>
+              <w:rPr>
+                <w:rStyle w:val="VerbatimChar"/>
+                <w:sz w:val="19"/>
+              </w:rPr>
+              <w:t xml:space="preserve">f6ba424</w:t>
+            </w:r>
+          </w:p>
+        </w:tc>
+        <w:tc>
+          <w:tcPr/>
+          <w:p>
+            <w:pPr>
+              <w:pStyle w:val="Compact"/>
+              <w:spacing w:line="240" w:lineRule="auto"/>
+              <w:jc w:val="center"/>
+            </w:pPr>
+            <w:r>
+              <w:rPr>
+                <w:sz w:val="19"/>
+              </w:rPr>
+              <w:t xml:space="preserve">pending</w:t>
+            </w:r>
+          </w:p>
+        </w:tc>
+        <w:tc>
+          <w:tcPr/>
+          <w:p>
+            <w:pPr>
+              <w:pStyle w:val="Compact"/>
+              <w:spacing w:line="240" w:lineRule="auto"/>
+              <w:jc w:val="center"/>
+            </w:pPr>
+            <w:r>
+              <w:rPr>
+                <w:sz w:val="19"/>
+              </w:rPr>
+              <w:t xml:space="preserve">2026-10-27</w:t>
+            </w:r>
+          </w:p>
+        </w:tc>
+      </w:tr>
     </w:tbl>
-    <w:bookmarkEnd w:id="65"/>
+    <w:bookmarkEnd w:id="67"/>
     <w:p>
       <w:pPr>
         <w:pStyle w:val="Heading1"/>
       </w:pPr>
-      <w:bookmarkStart w:id="66" w:name="_5197750e0310900a35791fde6fc3b970851116d"/>
+      <w:bookmarkStart w:id="68" w:name="_5197750e0310900a35791fde6fc3b970851116d"/>
       <w:r>
         <w:rPr>
           <w:rStyle w:val="SectionNumber"/>
@@ -23864,7 +25151,7 @@
       <w:r>
         <w:t xml:space="preserve">Design implications for fleet assurance</w:t>
       </w:r>
-      <w:bookmarkEnd w:id="66"/>
+      <w:bookmarkEnd w:id="68"/>
     </w:p>
     <w:p>
       <w:pPr>
@@ -23873,7 +25160,7 @@
       <w:r>
         <w:t xml:space="preserve">To translate these empirical findings into operational practice, we developed AeroFleet 2.0 (</w:t>
       </w:r>
-      <w:hyperlink r:id="rId67">
+      <w:hyperlink r:id="rId69">
         <w:r>
           <w:rPr>
             <w:rStyle w:val="Hyperlink"/>
@@ -23882,7 +25169,7 @@
         </w:r>
       </w:hyperlink>
       <w:r>
-        <w:t xml:space="preserve">), an open-source, ground-side assurance tool for PX4 and ArduPilot fleets. The tool reads existing flight logs and configuration files without executing unverified autonomous decisions or contacting the aircraft in flight. Table 11 maps each empirical finding from Sections 3–5 directly to an assurance design implication.</w:t>
+        <w:t xml:space="preserve">), an open-source, ground-side assurance tool for PX4 and ArduPilot fleets. The tool reads existing flight logs and configuration files without executing unverified autonomous decisions or contacting the aircraft in flight. Table 13 maps each empirical finding from Sections 3–5 directly to an assurance design implication.</w:t>
       </w:r>
     </w:p>
     <w:p>
@@ -23913,13 +25200,13 @@
         <w:t xml:space="preserve">at an assumed 10% flag rate, 41–44 inspections per crash), rather than issuing per-flight crash alarms. Finally, to ensure evidentiary integrity over the lifecycle of each airframe, all reviews, approvals, and configuration checks are appended to a tamper-evident, Ed25519-signed record referencing SHA-256 digests of the original telemetry files.</w:t>
       </w:r>
     </w:p>
-    <w:bookmarkStart w:id="68" w:name="_4816a700d4290cff51a6fa69217ee9f1521b64f"/>
+    <w:bookmarkStart w:id="70" w:name="_4816a700d4290cff51a6fa69217ee9f1521b64f"/>
     <w:p>
       <w:pPr>
         <w:pStyle w:val="TableCaption"/>
       </w:pPr>
       <w:r>
-        <w:t xml:space="preserve">Table 11. From empirical findings to design implications in fleet assurance.</w:t>
+        <w:t xml:space="preserve">Table 13. From empirical findings to design implications in fleet assurance.</w:t>
       </w:r>
     </w:p>
     <w:tbl>
@@ -23927,7 +25214,7 @@
         <w:tblStyle w:val="Table"/>
         <w:tblW w:type="pct" w:w="5000"/>
         <w:tblLook w:firstRow="1" w:lastRow="0" w:firstColumn="0" w:lastColumn="0" w:noHBand="0" w:noVBand="0" w:val="0020"/>
-        <w:tblCaption w:val="Table 11. From empirical findings to design implications in fleet assurance."/>
+        <w:tblCaption w:val="Table 13. From empirical findings to design implications in fleet assurance."/>
         <w:tblBorders>
           <w:top w:val="single" w:sz="4" w:color="808080"/>
           <w:left w:val="single" w:sz="4" w:color="808080"/>
@@ -24024,7 +25311,7 @@
               <w:rPr>
                 <w:sz w:val="19"/>
               </w:rPr>
-              <w:t xml:space="preserve">Across the telemetry features, rules, and models evaluated here, logs do not separate pilot from aircraft causes above chance (balanced accuracy 0.47 on held-out test, 0.381 on expert set, 95% CrI 0.25–0.61; §5.2, §5.6)</w:t>
+              <w:t xml:space="preserve">Across the telemetry features, rules, and models evaluated here, logs do not separate pilot from aircraft causes above chance (balanced accuracy 0.47 on held-out test, 0.381 on expert set, 95% CrI 0.25–0.61; §5.2, §5.7)</w:t>
             </w:r>
           </w:p>
         </w:tc>
@@ -24118,7 +25405,7 @@
               <w:rPr>
                 <w:sz w:val="19"/>
               </w:rPr>
-              <w:t xml:space="preserve">, exploratory; §5.3, §5.6)</w:t>
+              <w:t xml:space="preserve">, exploratory; §5.3, §5.7)</w:t>
             </w:r>
           </w:p>
         </w:tc>
@@ -24214,7 +25501,7 @@
               <w:rPr>
                 <w:sz w:val="19"/>
               </w:rPr>
-              <w:t xml:space="preserve">; provisional screening signal; §5.4)</w:t>
+              <w:t xml:space="preserve">; provisional screening signal; §5.5)</w:t>
             </w:r>
           </w:p>
         </w:tc>
@@ -24264,7 +25551,7 @@
               <w:rPr>
                 <w:sz w:val="19"/>
               </w:rPr>
-              <w:t xml:space="preserve">Changing comparison from other aircraft to same aircraft lowers AUC from 0.88 to 0.53–0.57 (§6)</w:t>
+              <w:t xml:space="preserve">Changing comparison from other aircraft to same aircraft lowers AUC from 0.88 to 0.53–0.57 (§5.3)</w:t>
             </w:r>
           </w:p>
         </w:tc>
@@ -24314,7 +25601,7 @@
               <w:rPr>
                 <w:sz w:val="19"/>
               </w:rPr>
-              <w:t xml:space="preserve">Multi-agent consensus voting is vulnerable to reviewer manipulation in exploratory 60-case setup (§5.7)</w:t>
+              <w:t xml:space="preserve">Multi-agent consensus voting is vulnerable to reviewer manipulation in exploratory 60-case setup (§5.8)</w:t>
             </w:r>
           </w:p>
         </w:tc>
@@ -24336,12 +25623,12 @@
         </w:tc>
       </w:tr>
     </w:tbl>
-    <w:bookmarkEnd w:id="68"/>
+    <w:bookmarkEnd w:id="70"/>
     <w:p>
       <w:pPr>
         <w:pStyle w:val="Heading2"/>
       </w:pPr>
-      <w:bookmarkStart w:id="69" w:name="_46768506b9d2d22e677daf79594de5255acfb0b"/>
+      <w:bookmarkStart w:id="71" w:name="_46768506b9d2d22e677daf79594de5255acfb0b"/>
       <w:r>
         <w:rPr>
           <w:rStyle w:val="SectionNumber"/>
@@ -24354,23 +25641,23 @@
       <w:r>
         <w:t xml:space="preserve">Recommended reporting checklist for flight-log diagnostics</w:t>
       </w:r>
-      <w:bookmarkEnd w:id="69"/>
+      <w:bookmarkEnd w:id="71"/>
     </w:p>
     <w:p>
       <w:pPr>
         <w:pStyle w:val="FirstParagraph"/>
       </w:pPr>
       <w:r>
-        <w:t xml:space="preserve">To support drone safety regulators, accident investigators, and data-driven diagnostic tool developers in avoiding the leakage and confounding traps quantified in this study, Table ?? outlines an eight-item recommended reporting checklist. Each item pairs a methodological recommendation with its empirical rationale and the specific failure mode observed in our experiments when that control is omitted.</w:t>
+        <w:t xml:space="preserve">To support drone safety regulators, accident investigators, and data-driven diagnostic tool developers in avoiding the leakage and confounding traps quantified in this study, Table 14 outlines an eight-item recommended reporting checklist. Each item pairs a methodological recommendation with its empirical rationale and the specific failure mode observed in our experiments when that control is omitted.</w:t>
       </w:r>
     </w:p>
-    <w:bookmarkStart w:id="70" w:name="_8dfd3cae62712a91b3c1ba079a4ea82fa2a3d98"/>
+    <w:bookmarkStart w:id="72" w:name="_8dfd3cae62712a91b3c1ba079a4ea82fa2a3d98"/>
     <w:p>
       <w:pPr>
         <w:pStyle w:val="TableCaption"/>
       </w:pPr>
       <w:r>
-        <w:t xml:space="preserve">Table ?. Recommended checklist for leakage-controlled evaluation and reporting of UAV flight-log diagnostic models and accident analytics.</w:t>
+        <w:t xml:space="preserve">Table 14. Recommended checklist for leakage-controlled evaluation and reporting of UAV flight-log diagnostic models and accident analytics.</w:t>
       </w:r>
     </w:p>
     <w:tbl>
@@ -24378,7 +25665,7 @@
         <w:tblStyle w:val="Table"/>
         <w:tblW w:type="pct" w:w="5000"/>
         <w:tblLook w:firstRow="1" w:lastRow="0" w:firstColumn="0" w:lastColumn="0" w:noHBand="0" w:noVBand="0" w:val="0020"/>
-        <w:tblCaption w:val="Table ?. Recommended checklist for leakage-controlled evaluation and reporting of UAV flight-log diagnostic models and accident analytics."/>
+        <w:tblCaption w:val="Table 14. Recommended checklist for leakage-controlled evaluation and reporting of UAV flight-log diagnostic models and accident analytics."/>
         <w:tblBorders>
           <w:top w:val="single" w:sz="4" w:color="808080"/>
           <w:left w:val="single" w:sz="4" w:color="808080"/>
@@ -24648,7 +25935,7 @@
               <w:rPr>
                 <w:sz w:val="19"/>
               </w:rPr>
-              <w:t xml:space="preserve">Prevents cross-fold identity memorization; while vehicle grouping alone did not lower AUC in our disjoint-operator sample (</w:t>
+              <w:t xml:space="preserve">Prevents cross-fold identity memorization; grouping made no difference where most normal drones contribute one flight (</w:t>
             </w:r>
             <m:oMath>
               <m:r>
@@ -24682,7 +25969,7 @@
               <w:rPr>
                 <w:sz w:val="19"/>
               </w:rPr>
-              <w:t xml:space="preserve">), literature and independent validation establish its necessity when airframes recur.</w:t>
+              <w:t xml:space="preserve">), but in the factorial audit it was the only material factor, lowering AUC by 0.062 [0.034, 0.087], mostly where comparison drones contribute several flights (§5.4).</w:t>
             </w:r>
           </w:p>
         </w:tc>
@@ -24899,7 +26186,7 @@
               <w:rPr>
                 <w:sz w:val="19"/>
               </w:rPr>
-              <w:t xml:space="preserve">within-drone AUC (paired cluster CI [+0.074, +0.238]), reversing duration masking (§6).</w:t>
+              <w:t xml:space="preserve">within-drone AUC (paired cluster CI [+0.074, +0.238]), reversing duration masking (§5.3).</w:t>
             </w:r>
           </w:p>
         </w:tc>
@@ -24969,7 +26256,7 @@
               <w:rPr>
                 <w:sz w:val="19"/>
               </w:rPr>
-              <w:t xml:space="preserve">Uploader labels are noisy and biased; evaluation should quantify inter-rater reliability across both pilot-fault and aircraft-fault classes (§5.6).</w:t>
+              <w:t xml:space="preserve">Uploader labels are noisy and biased; evaluation should quantify inter-rater reliability across both pilot-fault and aircraft-fault classes (§5.7).</w:t>
             </w:r>
           </w:p>
         </w:tc>
@@ -25042,7 +26329,7 @@
               <w:rPr>
                 <w:sz w:val="19"/>
               </w:rPr>
-              <w:t xml:space="preserve">, §5.4).</w:t>
+              <w:t xml:space="preserve">, §5.5).</w:t>
             </w:r>
           </w:p>
         </w:tc>
@@ -25165,12 +26452,12 @@
         </w:tc>
       </w:tr>
     </w:tbl>
-    <w:bookmarkEnd w:id="70"/>
+    <w:bookmarkEnd w:id="72"/>
     <w:p>
       <w:pPr>
         <w:pStyle w:val="Heading1"/>
       </w:pPr>
-      <w:bookmarkStart w:id="71" w:name="_074802e0e16f6322e726b21f081c01c392e8fbd"/>
+      <w:bookmarkStart w:id="73" w:name="_074802e0e16f6322e726b21f081c01c392e8fbd"/>
       <w:r>
         <w:rPr>
           <w:rStyle w:val="SectionNumber"/>
@@ -25183,7 +26470,7 @@
       <w:r>
         <w:t xml:space="preserve">Discussion</w:t>
       </w:r>
-      <w:bookmarkEnd w:id="71"/>
+      <w:bookmarkEnd w:id="73"/>
     </w:p>
     <w:p>
       <w:pPr>
@@ -25398,7 +26685,7 @@
         <w:t xml:space="preserve"> </w:t>
       </w:r>
       <w:r>
-        <w:t xml:space="preserve">While cross-sectional models on the discovery sample showed high apparent separation (AUC 0.88), our decomposition demonstrated that vehicle-grouped cross-validation (0.884) and crash-window removal (0.860) made no detectable difference. Crucially, isolating cohort selection from comparison population effects reveals that evaluating the exact same 67 multi-flight crashes against independent other-aircraft normal flights collapses model AUC to 0.522 [0.413, 0.615] (Step 4b). This indicates that the drop from 0.83–0.88 to 0.53–0.57 is primarily driven by cohort selection across evaluation samples (the multi-flight cohort lacks separable precursors cross-sectionally as well as longitudinally), rather than by within-drone baseline adjustment alone. On the identical 372 flights of the multi-flight cohort, cross-sectional evaluation (0.529 [0.453, 0.607]) and within-drone Group-CV (0.569 [0.493, 0.645]; cluster bootstrap 95% CI [0.500, 0.643]; pairwise mean AUC 0.592 [0.516, 0.692]) yielded overlapping intervals (the cluster bootstrap interval touches chance at 0.500, while the pairwise interval extends down to near-chance at 0.516), indicating that uncalipered matching yields no detectable precursor signal in this cohort. However, controlling for feature-window duration within drones via caliper matching (</w:t>
+        <w:t xml:space="preserve">While cross-sectional models on the discovery sample showed high apparent separation (AUC 0.88), vehicle-grouped cross-validation (0.884) and crash-window removal (0.860) made no detectable difference on that sample. The factorial audit (§5.4) shows why the picture depends on the sample: once comparison drones contribute several flights, grouping folds by vehicle becomes the only material source of optimism (0.062 [0.034, 0.087] of a 0.212 drop). Which crashes are scored and which normal flights they are compared with each carried a similar share, but neither could be isolated with 60–67 crashes. Separation against other aircraft persisted (0.67); only comparison with the same drone’s own earlier flights brought it to chance. On the identical 372 flights of the multi-flight cohort, cross-sectional evaluation (0.529 [0.453, 0.607]) and within-drone Group-CV (0.569 [0.493, 0.645]; cluster bootstrap 95% CI [0.500, 0.643]; pairwise mean AUC 0.592 [0.516, 0.692]) yielded overlapping intervals (the cluster bootstrap interval touches chance at 0.500, while the pairwise interval extends down to near-chance at 0.516), indicating that uncalipered matching yields no detectable precursor signal in this cohort. However, controlling for feature-window duration within drones via caliper matching (</w:t>
       </w:r>
       <m:oMath>
         <m:r>
@@ -25471,7 +26758,7 @@
         <w:t xml:space="preserve"> </w:t>
       </w:r>
       <w:r>
-        <w:t xml:space="preserve">on the exact same 36 airframes; paired cluster bootstrap 95% CI [+0.074, +0.238]), suggesting that baseline duration differences between crash and non-crash flights mask within-drone precursor detection in this cohort. Diagnostic checks were also</w:t>
+        <w:t xml:space="preserve">on the exact same 36 airframes; paired cluster bootstrap 95% CI [+0.074, +0.238]), suggesting that baseline duration differences between crash and non-crash flights may mask within-drone precursor detection in this cohort; the alternative reading is that the gain is carried by duration-linked features (clipping, tilt envelope, voltage sag), and a fixed 30 s window did not reproduce it. Diagnostic checks were also</w:t>
       </w:r>
       <w:r>
         <w:t xml:space="preserve"> </w:t>
@@ -26363,7 +27650,7 @@
       <w:pPr>
         <w:pStyle w:val="Heading1"/>
       </w:pPr>
-      <w:bookmarkStart w:id="72" w:name="_82b82981e21bad8167d56d1f0b74a832e215810"/>
+      <w:bookmarkStart w:id="74" w:name="_82b82981e21bad8167d56d1f0b74a832e215810"/>
       <w:r>
         <w:rPr>
           <w:rStyle w:val="SectionNumber"/>
@@ -26376,7 +27663,7 @@
       <w:r>
         <w:t xml:space="preserve">Threats to validity</w:t>
       </w:r>
-      <w:bookmarkEnd w:id="72"/>
+      <w:bookmarkEnd w:id="74"/>
     </w:p>
     <w:p>
       <w:pPr>
@@ -27029,7 +28316,7 @@
         <w:t xml:space="preserve"> </w:t>
       </w:r>
       <w:r>
-        <w:t xml:space="preserve">in Table 8 have very small sample sizes (</w:t>
+        <w:t xml:space="preserve">in Table 10 have very small sample sizes (</w:t>
       </w:r>
       <m:oMath>
         <m:r>
@@ -27400,7 +28687,7 @@
       <w:pPr>
         <w:pStyle w:val="Heading1"/>
       </w:pPr>
-      <w:bookmarkStart w:id="73" w:name="_0cf7f8e9027f9f9352f3019b4ede1d43d537ff7"/>
+      <w:bookmarkStart w:id="75" w:name="_0cf7f8e9027f9f9352f3019b4ede1d43d537ff7"/>
       <w:r>
         <w:rPr>
           <w:rStyle w:val="SectionNumber"/>
@@ -27412,269 +28699,6 @@
       </w:r>
       <w:r>
         <w:t xml:space="preserve">Conclusion</w:t>
-      </w:r>
-      <w:bookmarkEnd w:id="73"/>
-    </w:p>
-    <w:p>
-      <w:pPr>
-        <w:pStyle w:val="FirstParagraph"/>
-      </w:pPr>
-      <w:r>
-        <w:t xml:space="preserve">Across 590 crash-rated logs from an archive index of 479,547 flights, telemetry features, rules, and statistical models</w:t>
-      </w:r>
-      <w:r>
-        <w:t xml:space="preserve"> </w:t>
-      </w:r>
-      <w:r>
-        <w:t xml:space="preserve">did not distinguish pilot-caused from aircraft-caused crashes above chance: cross-validated AUCs (0.41–0.50, upper bounds</w:t>
-      </w:r>
-      <w:r>
-        <w:t xml:space="preserve"> </w:t>
-      </w:r>
-      <m:oMath>
-        <m:r>
-          <m:rPr>
-            <m:sty m:val="p"/>
-          </m:rPr>
-          <m:t>≤</m:t>
-        </m:r>
-        <m:r>
-          <m:t>0.619</m:t>
-        </m:r>
-      </m:oMath>
-      <w:r>
-        <w:t xml:space="preserve">; depth-3 trees 0.38–0.60, upper bounds</w:t>
-      </w:r>
-      <w:r>
-        <w:t xml:space="preserve"> </w:t>
-      </w:r>
-      <m:oMath>
-        <m:r>
-          <m:rPr>
-            <m:sty m:val="p"/>
-          </m:rPr>
-          <m:t>≤</m:t>
-        </m:r>
-        <m:r>
-          <m:t>0.724</m:t>
-        </m:r>
-      </m:oMath>
-      <w:r>
-        <w:t xml:space="preserve">, falling to 0.524 at</w:t>
-      </w:r>
-      <w:r>
-        <w:t xml:space="preserve"> </w:t>
-      </w:r>
-      <m:oMath>
-        <m:r>
-          <m:t>m</m:t>
-        </m:r>
-        <m:r>
-          <m:rPr>
-            <m:sty m:val="p"/>
-          </m:rPr>
-          <m:t>=</m:t>
-        </m:r>
-        <m:r>
-          <m:t>10</m:t>
-        </m:r>
-      </m:oMath>
-      <w:r>
-        <w:t xml:space="preserve"> s)</w:t>
-      </w:r>
-      <w:r>
-        <w:t xml:space="preserve"> </w:t>
-      </w:r>
-      <w:r>
-        <w:t xml:space="preserve">fall far short of the</w:t>
-      </w:r>
-      <w:r>
-        <w:t xml:space="preserve"> </w:t>
-      </w:r>
-      <m:oMath>
-        <m:r>
-          <m:rPr>
-            <m:sty m:val="p"/>
-          </m:rPr>
-          <m:t>≈</m:t>
-        </m:r>
-        <m:r>
-          <m:t>0.80</m:t>
-        </m:r>
-      </m:oMath>
-      <w:r>
-        <w:t xml:space="preserve"> </w:t>
-      </w:r>
-      <w:r>
-        <w:t xml:space="preserve">needed for operational verdicts, with 80% power requiring an AUC of roughly 0.65 under asymptotic</w:t>
-      </w:r>
-      <w:r>
-        <w:t xml:space="preserve"> </w:t>
-      </w:r>
-      <w:r>
-        <w:t xml:space="preserve">Wilcoxon theory (0.75 under the empirical permutation null) under only 36 pilot-labelled crashes in the modelling sample. Independent evaluation against 43 expert forum</w:t>
-      </w:r>
-      <w:r>
-        <w:t xml:space="preserve"> </w:t>
-      </w:r>
-      <w:r>
-        <w:t xml:space="preserve">cases was statistically inconclusive (balanced accuracy 0.381, Bayesian 95% CrI 0.25–0.61, conservative class-averaged bound 0.19–0.73;</w:t>
-      </w:r>
-      <w:r>
-        <w:t xml:space="preserve"> </w:t>
-      </w:r>
-      <w:r>
-        <w:t xml:space="preserve">cannot exclude the declared 0.70 pass mark; pilot recall 1 of 5; on 34 complete logs, balanced accuracy 30.0% for rule and 45.0% for logistic regression). Configuration protections were disabled at similar rates,</w:t>
-      </w:r>
-      <w:r>
-        <w:t xml:space="preserve"> </w:t>
-      </w:r>
-      <w:r>
-        <w:t xml:space="preserve">and the flight that crashed showed no detectable difference in vibration or rate-tracking error relative to the same drone’s</w:t>
-      </w:r>
-      <w:r>
-        <w:t xml:space="preserve"> </w:t>
-      </w:r>
-      <w:r>
-        <w:t xml:space="preserve">prior flights (95% CI upper bounds 0.58 and 0.63). Changing the comparison population from other aircraft’s normal flights to the same aircraft’s earlier flights lowered model AUC from about 0.83–0.88 to 0.53–0.57; grouping folds by vehicle, removing the crash window, and the cross-sectional versus within-drone scheme made no detectable difference, consistent with between-airframe confounding and operational flight envelope differences. Diagnostic checks were consistent with crash-impact data leakage: tuning</w:t>
-      </w:r>
-      <w:r>
-        <w:t xml:space="preserve"> </w:t>
-      </w:r>
-      <w:r>
-        <w:t xml:space="preserve">fault detection fell from 7/9 [77.8%] to 1/9 [11.1%] sensitivity (unadjusted</w:t>
-      </w:r>
-      <w:r>
-        <w:t xml:space="preserve"> </w:t>
-      </w:r>
-      <m:oMath>
-        <m:r>
-          <m:t>p</m:t>
-        </m:r>
-        <m:r>
-          <m:rPr>
-            <m:sty m:val="p"/>
-          </m:rPr>
-          <m:t>=</m:t>
-        </m:r>
-        <m:r>
-          <m:t>0.031</m:t>
-        </m:r>
-      </m:oMath>
-      <w:r>
-        <w:t xml:space="preserve">, exploratory) once the final 10 s were</w:t>
-      </w:r>
-      <w:r>
-        <w:t xml:space="preserve"> </w:t>
-      </w:r>
-      <w:r>
-        <w:t xml:space="preserve">removed, accompanied by a drop in normal-flight firing from 13% to 5% which suggests that shorter windows also reduce</w:t>
-      </w:r>
-      <w:r>
-        <w:t xml:space="preserve"> </w:t>
-      </w:r>
-      <w:r>
-        <w:t xml:space="preserve">trigger exposure. What the logs did reveal, on older estimator metrics, was a retrospective between-airframe association where</w:t>
-      </w:r>
-      <w:r>
-        <w:t xml:space="preserve"> </w:t>
-      </w:r>
-      <w:r>
-        <w:t xml:space="preserve">drones that later crashed exhibited higher baseline vibration on ordinary flights than matched peers, though replication on</w:t>
-      </w:r>
-      <w:r>
-        <w:t xml:space="preserve"> </w:t>
-      </w:r>
-      <w:r>
-        <w:t xml:space="preserve">newer accelerometer metrics was inconclusive (</w:t>
-      </w:r>
-      <m:oMath>
-        <m:r>
-          <m:t>p</m:t>
-        </m:r>
-        <m:r>
-          <m:rPr>
-            <m:sty m:val="p"/>
-          </m:rPr>
-          <m:t>=</m:t>
-        </m:r>
-        <m:r>
-          <m:t>0.25</m:t>
-        </m:r>
-      </m:oMath>
-      <w:r>
-        <w:t xml:space="preserve">). As an exploratory illustration, screening against 107 stratum-matched fleet controls achieves an</w:t>
-      </w:r>
-      <w:r>
-        <w:t xml:space="preserve"> </w:t>
-      </w:r>
-      <w:r>
-        <w:t xml:space="preserve">operational lift of</w:t>
-      </w:r>
-      <w:r>
-        <w:t xml:space="preserve"> </w:t>
-      </w:r>
-      <m:oMath>
-        <m:r>
-          <m:t>3.3</m:t>
-        </m:r>
-        <m:r>
-          <m:rPr>
-            <m:sty m:val="p"/>
-          </m:rPr>
-          <m:t>×</m:t>
-        </m:r>
-      </m:oMath>
-      <w:r>
-        <w:t xml:space="preserve"> </w:t>
-      </w:r>
-      <w:r>
-        <w:t xml:space="preserve">over base rate (illustrative PPV 2.26–2.43% [exact Bayes], 41.2–44.2 inspections per crash at an assumed 10% flag rate) across screenable (0.69%) and fleet-wide (0.74%)</w:t>
-      </w:r>
-      <w:r>
-        <w:t xml:space="preserve"> </w:t>
-      </w:r>
-      <w:r>
-        <w:t xml:space="preserve">vehicle base rates (0.96–1.04% under empirical matched-set screening). Flight log analytics for drone fleets should prioritize</w:t>
-      </w:r>
-      <w:r>
-        <w:t xml:space="preserve"> </w:t>
-      </w:r>
-      <w:r>
-        <w:t xml:space="preserve">longitudinal airframe screening and structured evidence review, not automated verdicts. AeroFleet 2.0 implements this approach</w:t>
-      </w:r>
-      <w:r>
-        <w:t xml:space="preserve"> </w:t>
-      </w:r>
-      <w:r>
-        <w:t xml:space="preserve">as an open-source tool, presenting verifiable evidence while leaving diagnostic decisions to human operators.</w:t>
-      </w:r>
-    </w:p>
-    <w:p>
-      <w:pPr>
-        <w:pStyle w:val="Heading1"/>
-      </w:pPr>
-      <w:bookmarkStart w:id="74" w:name="_84dc18e74b75db6057c8c16a8f70e097972540a"/>
-      <w:r>
-        <w:t xml:space="preserve">Declaration of competing interest</w:t>
-      </w:r>
-      <w:bookmarkEnd w:id="74"/>
-    </w:p>
-    <w:p>
-      <w:pPr>
-        <w:pStyle w:val="FirstParagraph"/>
-      </w:pPr>
-      <w:r>
-        <w:t xml:space="preserve">The authors declare that they have no known competing financial interests or personal relationships that could have appeared to influence the work reported in this paper. The authors develop the open-source AeroFleet 2.0 tool described in Section 6; it is not commercial.</w:t>
-      </w:r>
-    </w:p>
-    <w:p>
-      <w:pPr>
-        <w:pStyle w:val="Heading1"/>
-      </w:pPr>
-      <w:bookmarkStart w:id="75" w:name="_1f74eb43af444059c7518034463b6c89b1cacf4"/>
-      <w:r>
-        <w:t xml:space="preserve">Declaration of generative AI and AI-assisted technologies in the manuscript preparation process</w:t>
       </w:r>
       <w:bookmarkEnd w:id="75"/>
     </w:p>
@@ -27683,28 +28707,243 @@
         <w:pStyle w:val="FirstParagraph"/>
       </w:pPr>
       <w:r>
-        <w:t xml:space="preserve">During the preparation of this work the authors used an AI assistant (Claude, Anthropic) to write analysis code, draft</w:t>
-      </w:r>
-      <w:r>
-        <w:t xml:space="preserve"> </w:t>
-      </w:r>
-      <w:r>
-        <w:t xml:space="preserve">and revise text, and assist the recording of forum diagnoses. After using this tool, the authors reviewed and edited</w:t>
-      </w:r>
-      <w:r>
-        <w:t xml:space="preserve"> </w:t>
-      </w:r>
-      <w:r>
-        <w:t xml:space="preserve">the content as needed and take full responsibility for the content of the published article.</w:t>
+        <w:t xml:space="preserve">Across 590 crash-rated logs from an archive index of 479,547 flights, telemetry features, rules, and statistical models</w:t>
+      </w:r>
+      <w:r>
+        <w:t xml:space="preserve"> </w:t>
+      </w:r>
+      <w:r>
+        <w:t xml:space="preserve">did not distinguish pilot-caused from aircraft-caused crashes above chance: cross-validated AUCs (0.41–0.50, upper bounds</w:t>
+      </w:r>
+      <w:r>
+        <w:t xml:space="preserve"> </w:t>
+      </w:r>
+      <m:oMath>
+        <m:r>
+          <m:rPr>
+            <m:sty m:val="p"/>
+          </m:rPr>
+          <m:t>≤</m:t>
+        </m:r>
+        <m:r>
+          <m:t>0.619</m:t>
+        </m:r>
+      </m:oMath>
+      <w:r>
+        <w:t xml:space="preserve">; depth-3 trees 0.38–0.60, upper bounds</w:t>
+      </w:r>
+      <w:r>
+        <w:t xml:space="preserve"> </w:t>
+      </w:r>
+      <m:oMath>
+        <m:r>
+          <m:rPr>
+            <m:sty m:val="p"/>
+          </m:rPr>
+          <m:t>≤</m:t>
+        </m:r>
+        <m:r>
+          <m:t>0.724</m:t>
+        </m:r>
+      </m:oMath>
+      <w:r>
+        <w:t xml:space="preserve">, falling to 0.524 at</w:t>
+      </w:r>
+      <w:r>
+        <w:t xml:space="preserve"> </w:t>
+      </w:r>
+      <m:oMath>
+        <m:r>
+          <m:t>m</m:t>
+        </m:r>
+        <m:r>
+          <m:rPr>
+            <m:sty m:val="p"/>
+          </m:rPr>
+          <m:t>=</m:t>
+        </m:r>
+        <m:r>
+          <m:t>10</m:t>
+        </m:r>
+      </m:oMath>
+      <w:r>
+        <w:t xml:space="preserve"> s)</w:t>
+      </w:r>
+      <w:r>
+        <w:t xml:space="preserve"> </w:t>
+      </w:r>
+      <w:r>
+        <w:t xml:space="preserve">fall far short of the</w:t>
+      </w:r>
+      <w:r>
+        <w:t xml:space="preserve"> </w:t>
+      </w:r>
+      <m:oMath>
+        <m:r>
+          <m:rPr>
+            <m:sty m:val="p"/>
+          </m:rPr>
+          <m:t>≈</m:t>
+        </m:r>
+        <m:r>
+          <m:t>0.80</m:t>
+        </m:r>
+      </m:oMath>
+      <w:r>
+        <w:t xml:space="preserve"> </w:t>
+      </w:r>
+      <w:r>
+        <w:t xml:space="preserve">needed for operational verdicts, with 80% power requiring an AUC of roughly 0.65 under asymptotic</w:t>
+      </w:r>
+      <w:r>
+        <w:t xml:space="preserve"> </w:t>
+      </w:r>
+      <w:r>
+        <w:t xml:space="preserve">Wilcoxon theory (0.75 under the empirical permutation null) under only 36 pilot-labelled crashes in the modelling sample. Independent evaluation against 43 expert forum</w:t>
+      </w:r>
+      <w:r>
+        <w:t xml:space="preserve"> </w:t>
+      </w:r>
+      <w:r>
+        <w:t xml:space="preserve">cases was statistically inconclusive (balanced accuracy 0.381, Bayesian 95% CrI 0.25–0.61, conservative class-averaged bound 0.19–0.73;</w:t>
+      </w:r>
+      <w:r>
+        <w:t xml:space="preserve"> </w:t>
+      </w:r>
+      <w:r>
+        <w:t xml:space="preserve">cannot exclude the declared 0.70 pass mark; pilot recall 1 of 5; on 34 complete logs, balanced accuracy 30.0% for rule and 45.0% for logistic regression). Configuration protections were disabled at similar rates,</w:t>
+      </w:r>
+      <w:r>
+        <w:t xml:space="preserve"> </w:t>
+      </w:r>
+      <w:r>
+        <w:t xml:space="preserve">and the flight that crashed showed no detectable difference in vibration or rate-tracking error relative to the same drone’s</w:t>
+      </w:r>
+      <w:r>
+        <w:t xml:space="preserve"> </w:t>
+      </w:r>
+      <w:r>
+        <w:t xml:space="preserve">prior flights (95% CI upper bounds 0.58 and 0.63). Changing the comparison population from other aircraft’s normal flights to the same aircraft’s earlier flights lowered model AUC from about 0.83–0.88 to 0.53–0.57. A factorial audit of 32 evaluation settings attributed 0.21 of the apparent AUC to evaluation choices; only grouping folds by vehicle was individually material (0.06), the crash set and the choice of normal flights could not be separated, and separation against other aircraft persisted at 0.67 until each drone was compared with its own earlier flights. Diagnostic checks were consistent with crash-impact data leakage: tuning</w:t>
+      </w:r>
+      <w:r>
+        <w:t xml:space="preserve"> </w:t>
+      </w:r>
+      <w:r>
+        <w:t xml:space="preserve">fault detection fell from 7/9 [77.8%] to 1/9 [11.1%] sensitivity (unadjusted</w:t>
+      </w:r>
+      <w:r>
+        <w:t xml:space="preserve"> </w:t>
+      </w:r>
+      <m:oMath>
+        <m:r>
+          <m:t>p</m:t>
+        </m:r>
+        <m:r>
+          <m:rPr>
+            <m:sty m:val="p"/>
+          </m:rPr>
+          <m:t>=</m:t>
+        </m:r>
+        <m:r>
+          <m:t>0.031</m:t>
+        </m:r>
+      </m:oMath>
+      <w:r>
+        <w:t xml:space="preserve">, exploratory) once the final 10 s were</w:t>
+      </w:r>
+      <w:r>
+        <w:t xml:space="preserve"> </w:t>
+      </w:r>
+      <w:r>
+        <w:t xml:space="preserve">removed, accompanied by a drop in normal-flight firing from 13% to 5% which suggests that shorter windows also reduce</w:t>
+      </w:r>
+      <w:r>
+        <w:t xml:space="preserve"> </w:t>
+      </w:r>
+      <w:r>
+        <w:t xml:space="preserve">trigger exposure. What the logs did reveal, on older estimator metrics, was a retrospective between-airframe association where</w:t>
+      </w:r>
+      <w:r>
+        <w:t xml:space="preserve"> </w:t>
+      </w:r>
+      <w:r>
+        <w:t xml:space="preserve">drones that later crashed exhibited higher baseline vibration on ordinary flights than matched peers, though replication on</w:t>
+      </w:r>
+      <w:r>
+        <w:t xml:space="preserve"> </w:t>
+      </w:r>
+      <w:r>
+        <w:t xml:space="preserve">newer accelerometer metrics was inconclusive (</w:t>
+      </w:r>
+      <m:oMath>
+        <m:r>
+          <m:t>p</m:t>
+        </m:r>
+        <m:r>
+          <m:rPr>
+            <m:sty m:val="p"/>
+          </m:rPr>
+          <m:t>=</m:t>
+        </m:r>
+        <m:r>
+          <m:t>0.25</m:t>
+        </m:r>
+      </m:oMath>
+      <w:r>
+        <w:t xml:space="preserve">). As an exploratory illustration, screening against 107 stratum-matched fleet controls achieves an</w:t>
+      </w:r>
+      <w:r>
+        <w:t xml:space="preserve"> </w:t>
+      </w:r>
+      <w:r>
+        <w:t xml:space="preserve">operational lift of</w:t>
+      </w:r>
+      <w:r>
+        <w:t xml:space="preserve"> </w:t>
+      </w:r>
+      <m:oMath>
+        <m:r>
+          <m:t>3.3</m:t>
+        </m:r>
+        <m:r>
+          <m:rPr>
+            <m:sty m:val="p"/>
+          </m:rPr>
+          <m:t>×</m:t>
+        </m:r>
+      </m:oMath>
+      <w:r>
+        <w:t xml:space="preserve"> </w:t>
+      </w:r>
+      <w:r>
+        <w:t xml:space="preserve">over base rate (illustrative PPV 2.26–2.43% [exact Bayes], 41.2–44.2 inspections per crash at an assumed 10% flag rate) across screenable (0.69%) and fleet-wide (0.74%)</w:t>
+      </w:r>
+      <w:r>
+        <w:t xml:space="preserve"> </w:t>
+      </w:r>
+      <w:r>
+        <w:t xml:space="preserve">vehicle base rates (0.96–1.04% under empirical matched-set screening). Flight log analytics for drone fleets should prioritize</w:t>
+      </w:r>
+      <w:r>
+        <w:t xml:space="preserve"> </w:t>
+      </w:r>
+      <w:r>
+        <w:t xml:space="preserve">longitudinal airframe screening and structured evidence review, not automated verdicts. AeroFleet 2.0 implements this approach</w:t>
+      </w:r>
+      <w:r>
+        <w:t xml:space="preserve"> </w:t>
+      </w:r>
+      <w:r>
+        <w:t xml:space="preserve">as an open-source tool, presenting verifiable evidence while leaving diagnostic decisions to human operators.</w:t>
       </w:r>
     </w:p>
     <w:p>
       <w:pPr>
         <w:pStyle w:val="Heading1"/>
       </w:pPr>
-      <w:bookmarkStart w:id="76" w:name="_ea5c66868f283220c19382d0fdd5a852ec570ca"/>
-      <w:r>
-        <w:t xml:space="preserve">Data availability</w:t>
+      <w:bookmarkStart w:id="76" w:name="_84dc18e74b75db6057c8c16a8f70e097972540a"/>
+      <w:r>
+        <w:t xml:space="preserve">Declaration of competing interest</w:t>
       </w:r>
       <w:bookmarkEnd w:id="76"/>
     </w:p>
@@ -27713,6 +28952,54 @@
         <w:pStyle w:val="FirstParagraph"/>
       </w:pPr>
       <w:r>
+        <w:t xml:space="preserve">The authors declare that they have no known competing financial interests or personal relationships that could have appeared to influence the work reported in this paper. The authors develop the open-source AeroFleet 2.0 tool described in Section 6; it is not commercial.</w:t>
+      </w:r>
+    </w:p>
+    <w:p>
+      <w:pPr>
+        <w:pStyle w:val="Heading1"/>
+      </w:pPr>
+      <w:bookmarkStart w:id="77" w:name="_1f74eb43af444059c7518034463b6c89b1cacf4"/>
+      <w:r>
+        <w:t xml:space="preserve">Declaration of generative AI and AI-assisted technologies in the manuscript preparation process</w:t>
+      </w:r>
+      <w:bookmarkEnd w:id="77"/>
+    </w:p>
+    <w:p>
+      <w:pPr>
+        <w:pStyle w:val="FirstParagraph"/>
+      </w:pPr>
+      <w:r>
+        <w:t xml:space="preserve">During the preparation of this work the authors used an AI assistant (Claude, Anthropic) to write analysis code, draft</w:t>
+      </w:r>
+      <w:r>
+        <w:t xml:space="preserve"> </w:t>
+      </w:r>
+      <w:r>
+        <w:t xml:space="preserve">and revise text, and assist the recording of forum diagnoses. After using this tool, the authors reviewed and edited</w:t>
+      </w:r>
+      <w:r>
+        <w:t xml:space="preserve"> </w:t>
+      </w:r>
+      <w:r>
+        <w:t xml:space="preserve">the content as needed and take full responsibility for the content of the published article.</w:t>
+      </w:r>
+    </w:p>
+    <w:p>
+      <w:pPr>
+        <w:pStyle w:val="Heading1"/>
+      </w:pPr>
+      <w:bookmarkStart w:id="78" w:name="_ea5c66868f283220c19382d0fdd5a852ec570ca"/>
+      <w:r>
+        <w:t xml:space="preserve">Data availability</w:t>
+      </w:r>
+      <w:bookmarkEnd w:id="78"/>
+    </w:p>
+    <w:p>
+      <w:pPr>
+        <w:pStyle w:val="FirstParagraph"/>
+      </w:pPr>
+      <w:r>
         <w:t xml:space="preserve">Selection scripts, analysis code, the declared hypotheses with their commit history, derived features, expert labels</w:t>
       </w:r>
       <w:r>
@@ -27724,7 +29011,7 @@
       <w:r>
         <w:t xml:space="preserve"> </w:t>
       </w:r>
-      <w:hyperlink r:id="rId67">
+      <w:hyperlink r:id="rId69">
         <w:r>
           <w:rPr>
             <w:rStyle w:val="Hyperlink"/>
@@ -27746,11 +29033,11 @@
       <w:pPr>
         <w:pStyle w:val="Heading1"/>
       </w:pPr>
-      <w:bookmarkStart w:id="77" w:name="_funding"/>
+      <w:bookmarkStart w:id="79" w:name="_funding"/>
       <w:r>
         <w:t xml:space="preserve">Funding</w:t>
       </w:r>
-      <w:bookmarkEnd w:id="77"/>
+      <w:bookmarkEnd w:id="79"/>
     </w:p>
     <w:p>
       <w:pPr>
@@ -27770,14 +29057,14 @@
       <w:pPr>
         <w:pStyle w:val="Heading1"/>
       </w:pPr>
-      <w:bookmarkStart w:id="78" w:name="_bibliography"/>
+      <w:bookmarkStart w:id="80" w:name="_bibliography"/>
       <w:r>
         <w:t xml:space="preserve">References</w:t>
       </w:r>
-      <w:bookmarkEnd w:id="78"/>
+      <w:bookmarkEnd w:id="80"/>
     </w:p>
-    <w:bookmarkStart w:id="134" w:name="_refs"/>
-    <w:bookmarkStart w:id="79" w:name="_94e90323a8c21041104ada5ef51239cca731079"/>
+    <w:bookmarkStart w:id="136" w:name="_refs"/>
+    <w:bookmarkStart w:id="81" w:name="_94e90323a8c21041104ada5ef51239cca731079"/>
     <w:p>
       <w:pPr>
         <w:pStyle w:val="Bibliography"/>
@@ -27804,8 +29091,8 @@
         <w:t xml:space="preserve">, (2019).</w:t>
       </w:r>
     </w:p>
-    <w:bookmarkEnd w:id="79"/>
-    <w:bookmarkStart w:id="80" w:name="_accb9f9d732da81043c804de081f8bf74e6cf24"/>
+    <w:bookmarkEnd w:id="81"/>
+    <w:bookmarkStart w:id="82" w:name="_accb9f9d732da81043c804de081f8bf74e6cf24"/>
     <w:p>
       <w:pPr>
         <w:pStyle w:val="Bibliography"/>
@@ -27832,8 +29119,8 @@
         <w:t xml:space="preserve">, (2026).</w:t>
       </w:r>
     </w:p>
-    <w:bookmarkEnd w:id="80"/>
-    <w:bookmarkStart w:id="81" w:name="_2a610b70f77ace96e6ffe48ed026a6e5f9efd5a"/>
+    <w:bookmarkEnd w:id="82"/>
+    <w:bookmarkStart w:id="83" w:name="_2a610b70f77ace96e6ffe48ed026a6e5f9efd5a"/>
     <w:p>
       <w:pPr>
         <w:pStyle w:val="Bibliography"/>
@@ -27860,8 +29147,8 @@
         <w:t xml:space="preserve">, (2021).</w:t>
       </w:r>
     </w:p>
-    <w:bookmarkEnd w:id="81"/>
-    <w:bookmarkStart w:id="82" w:name="_dffd97137af0abb4aae0ff556af3c0d05e0ee4a"/>
+    <w:bookmarkEnd w:id="83"/>
+    <w:bookmarkStart w:id="84" w:name="_dffd97137af0abb4aae0ff556af3c0d05e0ee4a"/>
     <w:p>
       <w:pPr>
         <w:pStyle w:val="Bibliography"/>
@@ -27888,8 +29175,8 @@
         <w:t xml:space="preserve">, (2026).</w:t>
       </w:r>
     </w:p>
-    <w:bookmarkEnd w:id="82"/>
-    <w:bookmarkStart w:id="84" w:name="_398d8a6b28c132ef0c87de1470cc655ebafd86c"/>
+    <w:bookmarkEnd w:id="84"/>
+    <w:bookmarkStart w:id="86" w:name="_398d8a6b28c132ef0c87de1470cc655ebafd86c"/>
     <w:p>
       <w:pPr>
         <w:pStyle w:val="Bibliography"/>
@@ -27915,7 +29202,7 @@
       <w:r>
         <w:t xml:space="preserve">-agents driven automated simulation testing and analysis of small uncrewed aerial systems, in: 2025 IEEE/ACM 47th International Conference on Software Engineering (ICSE), 2025: pp. 385–397. https://doi.org/</w:t>
       </w:r>
-      <w:hyperlink r:id="rId83">
+      <w:hyperlink r:id="rId85">
         <w:r>
           <w:rPr>
             <w:rStyle w:val="Hyperlink"/>
@@ -27927,8 +29214,8 @@
         <w:t xml:space="preserve">.</w:t>
       </w:r>
     </w:p>
-    <w:bookmarkEnd w:id="84"/>
-    <w:bookmarkStart w:id="86" w:name="_4d7bbda75dad34c83d023e6afa1cc5b99fb5426"/>
+    <w:bookmarkEnd w:id="86"/>
+    <w:bookmarkStart w:id="88" w:name="_4d7bbda75dad34c83d023e6afa1cc5b99fb5426"/>
     <w:p>
       <w:pPr>
         <w:pStyle w:val="Bibliography"/>
@@ -27963,7 +29250,7 @@
       <w:r>
         <w:t xml:space="preserve">, Forensic Science International: Digital Investigation 56 (2026) 302051. https://doi.org/</w:t>
       </w:r>
-      <w:hyperlink r:id="rId85">
+      <w:hyperlink r:id="rId87">
         <w:r>
           <w:rPr>
             <w:rStyle w:val="Hyperlink"/>
@@ -27975,8 +29262,8 @@
         <w:t xml:space="preserve">.</w:t>
       </w:r>
     </w:p>
-    <w:bookmarkEnd w:id="86"/>
-    <w:bookmarkStart w:id="87" w:name="_006a7190097400c6c37363d97b6f3be0cdc0b48"/>
+    <w:bookmarkEnd w:id="88"/>
+    <w:bookmarkStart w:id="89" w:name="_006a7190097400c6c37363d97b6f3be0cdc0b48"/>
     <w:p>
       <w:pPr>
         <w:pStyle w:val="Bibliography"/>
@@ -27994,8 +29281,8 @@
         <w:t xml:space="preserve">D.A. Wiegmann, S.A. Shappell, A human error approach to aviation accident analysis: The human factors analysis and classification system, Ashgate, Aldershot, 2003.</w:t>
       </w:r>
     </w:p>
-    <w:bookmarkEnd w:id="87"/>
-    <w:bookmarkStart w:id="89" w:name="_3541019a36f31423dbace231a12fca4d5e5f1ad"/>
+    <w:bookmarkEnd w:id="89"/>
+    <w:bookmarkStart w:id="91" w:name="_3541019a36f31423dbace231a12fca4d5e5f1ad"/>
     <w:p>
       <w:pPr>
         <w:pStyle w:val="Bibliography"/>
@@ -28012,7 +29299,7 @@
       <w:r>
         <w:t xml:space="preserve">S. Kaufman, S. Rosset, C. Perlich, O. Stitelman, Leakage in data mining: Formulation, detection, and avoidance, ACM Transactions on Knowledge Discovery from Data 6 (2012) 15:1–15:21. https://doi.org/</w:t>
       </w:r>
-      <w:hyperlink r:id="rId88">
+      <w:hyperlink r:id="rId90">
         <w:r>
           <w:rPr>
             <w:rStyle w:val="Hyperlink"/>
@@ -28024,8 +29311,8 @@
         <w:t xml:space="preserve">.</w:t>
       </w:r>
     </w:p>
-    <w:bookmarkEnd w:id="89"/>
-    <w:bookmarkStart w:id="91" w:name="_77239db318a405bdd9ca0cc5db74d4c41b2a03f"/>
+    <w:bookmarkEnd w:id="91"/>
+    <w:bookmarkStart w:id="93" w:name="_77239db318a405bdd9ca0cc5db74d4c41b2a03f"/>
     <w:p>
       <w:pPr>
         <w:pStyle w:val="Bibliography"/>
@@ -28042,7 +29329,7 @@
       <w:r>
         <w:t xml:space="preserve">S. Kapoor, A. Narayanan, Leakage and the reproducibility crisis in machine-learning-based science, Patterns 4 (2023) 100804. https://doi.org/</w:t>
       </w:r>
-      <w:hyperlink r:id="rId90">
+      <w:hyperlink r:id="rId92">
         <w:r>
           <w:rPr>
             <w:rStyle w:val="Hyperlink"/>
@@ -28054,8 +29341,8 @@
         <w:t xml:space="preserve">.</w:t>
       </w:r>
     </w:p>
-    <w:bookmarkEnd w:id="91"/>
-    <w:bookmarkStart w:id="93" w:name="_d75d7cf63098afa5d33e189bc1a163022e7ecdc"/>
+    <w:bookmarkEnd w:id="93"/>
+    <w:bookmarkStart w:id="95" w:name="_d75d7cf63098afa5d33e189bc1a163022e7ecdc"/>
     <w:p>
       <w:pPr>
         <w:pStyle w:val="Bibliography"/>
@@ -28093,7 +29380,7 @@
       <w:r>
         <w:t xml:space="preserve">fault and anomaly detection, The International Journal of Robotics Research 40 (2021) 515–520. https://doi.org/</w:t>
       </w:r>
-      <w:hyperlink r:id="rId92">
+      <w:hyperlink r:id="rId94">
         <w:r>
           <w:rPr>
             <w:rStyle w:val="Hyperlink"/>
@@ -28105,8 +29392,8 @@
         <w:t xml:space="preserve">.</w:t>
       </w:r>
     </w:p>
-    <w:bookmarkEnd w:id="93"/>
-    <w:bookmarkStart w:id="95" w:name="_446d2d8311e3f2ab8e5f2830e712f064a3280b9"/>
+    <w:bookmarkEnd w:id="95"/>
+    <w:bookmarkStart w:id="97" w:name="_446d2d8311e3f2ab8e5f2830e712f064a3280b9"/>
     <w:p>
       <w:pPr>
         <w:pStyle w:val="Bibliography"/>
@@ -28132,7 +29419,7 @@
       <w:r>
         <w:t xml:space="preserve">: A dataset for multicopter fault detection and health assessment, The International Journal of Robotics Research 44 (2025) 1081–1092. https://doi.org/</w:t>
       </w:r>
-      <w:hyperlink r:id="rId94">
+      <w:hyperlink r:id="rId96">
         <w:r>
           <w:rPr>
             <w:rStyle w:val="Hyperlink"/>
@@ -28144,8 +29431,8 @@
         <w:t xml:space="preserve">.</w:t>
       </w:r>
     </w:p>
-    <w:bookmarkEnd w:id="95"/>
-    <w:bookmarkStart w:id="96" w:name="_973650d78dc352a8b25ace59ab002a1d91cdfc9"/>
+    <w:bookmarkEnd w:id="97"/>
+    <w:bookmarkStart w:id="98" w:name="_973650d78dc352a8b25ace59ab002a1d91cdfc9"/>
     <w:p>
       <w:pPr>
         <w:pStyle w:val="Bibliography"/>
@@ -28181,8 +29468,8 @@
         <w:t xml:space="preserve">, (2026).</w:t>
       </w:r>
     </w:p>
-    <w:bookmarkEnd w:id="96"/>
-    <w:bookmarkStart w:id="98" w:name="_42246838952b0ed0d35bd475d264714b9e743f7"/>
+    <w:bookmarkEnd w:id="98"/>
+    <w:bookmarkStart w:id="100" w:name="_42246838952b0ed0d35bd475d264714b9e743f7"/>
     <w:p>
       <w:pPr>
         <w:pStyle w:val="Bibliography"/>
@@ -28199,7 +29486,7 @@
       <w:r>
         <w:t xml:space="preserve">G. Wild, J. Murray, G. Baxter, Exploring civil drone accidents and incidents to help prevent potential air disasters, Aerospace 3 (2016) 22. https://doi.org/</w:t>
       </w:r>
-      <w:hyperlink r:id="rId97">
+      <w:hyperlink r:id="rId99">
         <w:r>
           <w:rPr>
             <w:rStyle w:val="Hyperlink"/>
@@ -28211,8 +29498,8 @@
         <w:t xml:space="preserve">.</w:t>
       </w:r>
     </w:p>
-    <w:bookmarkEnd w:id="98"/>
-    <w:bookmarkStart w:id="99" w:name="_b513b568a9a02649a1ddc461a1dd01e876732a2"/>
+    <w:bookmarkEnd w:id="100"/>
+    <w:bookmarkStart w:id="101" w:name="_b513b568a9a02649a1ddc461a1dd01e876732a2"/>
     <w:p>
       <w:pPr>
         <w:pStyle w:val="Bibliography"/>
@@ -28239,8 +29526,8 @@
         <w:t xml:space="preserve">, AAIB, Department for Transport, Farnborough, UK, 2026.</w:t>
       </w:r>
     </w:p>
-    <w:bookmarkEnd w:id="99"/>
-    <w:bookmarkStart w:id="101" w:name="_7bef8dc44b5ed9bb7ced7ca5f392a78a76d6601"/>
+    <w:bookmarkEnd w:id="101"/>
+    <w:bookmarkStart w:id="103" w:name="_7bef8dc44b5ed9bb7ced7ca5f392a78a76d6601"/>
     <w:p>
       <w:pPr>
         <w:pStyle w:val="Bibliography"/>
@@ -28266,7 +29553,7 @@
       <w:r>
         <w:t xml:space="preserve">: A node-based multithreaded open source robotics framework for deeply embedded platforms, in: 2015 IEEE International Conference on Robotics and Automation (ICRA), 2015: pp. 6235–6240. https://doi.org/</w:t>
       </w:r>
-      <w:hyperlink r:id="rId100">
+      <w:hyperlink r:id="rId102">
         <w:r>
           <w:rPr>
             <w:rStyle w:val="Hyperlink"/>
@@ -28278,8 +29565,8 @@
         <w:t xml:space="preserve">.</w:t>
       </w:r>
     </w:p>
-    <w:bookmarkEnd w:id="101"/>
-    <w:bookmarkStart w:id="102" w:name="_d96f71c5379cbcad3bc75bfc7936eeacbaeb4ed"/>
+    <w:bookmarkEnd w:id="103"/>
+    <w:bookmarkStart w:id="104" w:name="_d96f71c5379cbcad3bc75bfc7936eeacbaeb4ed"/>
     <w:p>
       <w:pPr>
         <w:pStyle w:val="Bibliography"/>
@@ -28327,8 +29614,8 @@
         <w:t xml:space="preserve">parser, (2026).</w:t>
       </w:r>
     </w:p>
-    <w:bookmarkEnd w:id="102"/>
-    <w:bookmarkStart w:id="103" w:name="_c1fc4b225b7dfa71f64cc84e83afba5f24698c2"/>
+    <w:bookmarkEnd w:id="104"/>
+    <w:bookmarkStart w:id="105" w:name="_c1fc4b225b7dfa71f64cc84e83afba5f24698c2"/>
     <w:p>
       <w:pPr>
         <w:pStyle w:val="Bibliography"/>
@@ -28367,8 +29654,8 @@
         <w:t xml:space="preserve">telemetry anomaly mining, (2026).</w:t>
       </w:r>
     </w:p>
-    <w:bookmarkEnd w:id="103"/>
-    <w:bookmarkStart w:id="105" w:name="_3d31df3710cff81ff87ef6665f7295f981708a9"/>
+    <w:bookmarkEnd w:id="105"/>
+    <w:bookmarkStart w:id="107" w:name="_3d31df3710cff81ff87ef6665f7295f981708a9"/>
     <w:p>
       <w:pPr>
         <w:pStyle w:val="Bibliography"/>
@@ -28409,7 +29696,7 @@
       <w:r>
         <w:t xml:space="preserve">flight logs, Sensors 26 (2026) 3188. https://doi.org/</w:t>
       </w:r>
-      <w:hyperlink r:id="rId104">
+      <w:hyperlink r:id="rId106">
         <w:r>
           <w:rPr>
             <w:rStyle w:val="Hyperlink"/>
@@ -28421,8 +29708,8 @@
         <w:t xml:space="preserve">.</w:t>
       </w:r>
     </w:p>
-    <w:bookmarkEnd w:id="105"/>
-    <w:bookmarkStart w:id="107" w:name="_de2316363361acc29c6a15415cb3110e85473cd"/>
+    <w:bookmarkEnd w:id="107"/>
+    <w:bookmarkStart w:id="109" w:name="_de2316363361acc29c6a15415cb3110e85473cd"/>
     <w:p>
       <w:pPr>
         <w:pStyle w:val="Bibliography"/>
@@ -28451,7 +29738,7 @@
       <w:r>
         <w:t xml:space="preserve">fault detection methods, state-of-the-art, Drones 6 (2022) 330. https://doi.org/</w:t>
       </w:r>
-      <w:hyperlink r:id="rId106">
+      <w:hyperlink r:id="rId108">
         <w:r>
           <w:rPr>
             <w:rStyle w:val="Hyperlink"/>
@@ -28463,8 +29750,8 @@
         <w:t xml:space="preserve">.</w:t>
       </w:r>
     </w:p>
-    <w:bookmarkEnd w:id="107"/>
-    <w:bookmarkStart w:id="109" w:name="_1ece912d6a7cc2c7f97bdecc84d0912f3af390e"/>
+    <w:bookmarkEnd w:id="109"/>
+    <w:bookmarkStart w:id="111" w:name="_1ece912d6a7cc2c7f97bdecc84d0912f3af390e"/>
     <w:p>
       <w:pPr>
         <w:pStyle w:val="Bibliography"/>
@@ -28481,7 +29768,7 @@
       <w:r>
         <w:t xml:space="preserve">E. Khalastchi, M. Kalech, On fault detection and diagnosis in robotic systems, ACM Computing Surveys 51 (2018) 9:1–9:24. https://doi.org/</w:t>
       </w:r>
-      <w:hyperlink r:id="rId108">
+      <w:hyperlink r:id="rId110">
         <w:r>
           <w:rPr>
             <w:rStyle w:val="Hyperlink"/>
@@ -28493,8 +29780,8 @@
         <w:t xml:space="preserve">.</w:t>
       </w:r>
     </w:p>
-    <w:bookmarkEnd w:id="109"/>
-    <w:bookmarkStart w:id="111" w:name="_200a90d3af15f3f5a64a3cb8afd6783e6bc5c1d"/>
+    <w:bookmarkEnd w:id="111"/>
+    <w:bookmarkStart w:id="113" w:name="_200a90d3af15f3f5a64a3cb8afd6783e6bc5c1d"/>
     <w:p>
       <w:pPr>
         <w:pStyle w:val="Bibliography"/>
@@ -28511,7 +29798,7 @@
       <w:r>
         <w:t xml:space="preserve">E. Zibaei, R. Borth, Building causal models for finding actual causes of unmanned aerial vehicle failures, Frontiers in Robotics and AI 11 (2024) 1123762. https://doi.org/</w:t>
       </w:r>
-      <w:hyperlink r:id="rId110">
+      <w:hyperlink r:id="rId112">
         <w:r>
           <w:rPr>
             <w:rStyle w:val="Hyperlink"/>
@@ -28523,8 +29810,8 @@
         <w:t xml:space="preserve">.</w:t>
       </w:r>
     </w:p>
-    <w:bookmarkEnd w:id="111"/>
-    <w:bookmarkStart w:id="113" w:name="_362e51e11e30eb0e0461101d9c36e4d21d357be"/>
+    <w:bookmarkEnd w:id="113"/>
+    <w:bookmarkStart w:id="115" w:name="_362e51e11e30eb0e0461101d9c36e4d21d357be"/>
     <w:p>
       <w:pPr>
         <w:pStyle w:val="Bibliography"/>
@@ -28541,7 +29828,7 @@
       <w:r>
         <w:t xml:space="preserve">D. Wang, S. Li, G. Xiao, Y. Liu, Y. Sui, An exploratory study of autopilot software bugs in unmanned aerial vehicles, in: Proceedings of the 29th ACM Joint European Software Engineering Conference and Symposium on the Foundations of Software Engineering (ESEC/FSE), 2021: pp. 20–31. https://doi.org/</w:t>
       </w:r>
-      <w:hyperlink r:id="rId112">
+      <w:hyperlink r:id="rId114">
         <w:r>
           <w:rPr>
             <w:rStyle w:val="Hyperlink"/>
@@ -28553,8 +29840,8 @@
         <w:t xml:space="preserve">.</w:t>
       </w:r>
     </w:p>
-    <w:bookmarkEnd w:id="113"/>
-    <w:bookmarkStart w:id="115" w:name="_4f9a794a6a4ddf2789379e73f8e74e34b9538b4"/>
+    <w:bookmarkEnd w:id="115"/>
+    <w:bookmarkStart w:id="117" w:name="_4f9a794a6a4ddf2789379e73f8e74e34b9538b4"/>
     <w:p>
       <w:pPr>
         <w:pStyle w:val="Bibliography"/>
@@ -28571,7 +29858,7 @@
       <w:r>
         <w:t xml:space="preserve">E. Petritoli, F. Leccese, L. Ciani, Reliability and maintenance analysis of unmanned aerial vehicles, Sensors 18 (2018) 3171. https://doi.org/</w:t>
       </w:r>
-      <w:hyperlink r:id="rId114">
+      <w:hyperlink r:id="rId116">
         <w:r>
           <w:rPr>
             <w:rStyle w:val="Hyperlink"/>
@@ -28583,8 +29870,8 @@
         <w:t xml:space="preserve">.</w:t>
       </w:r>
     </w:p>
-    <w:bookmarkEnd w:id="115"/>
-    <w:bookmarkStart w:id="116" w:name="_a0e369e89429aa426010697429f06415b068aab"/>
+    <w:bookmarkEnd w:id="117"/>
+    <w:bookmarkStart w:id="118" w:name="_a0e369e89429aa426010697429f06415b068aab"/>
     <w:p>
       <w:pPr>
         <w:pStyle w:val="Bibliography"/>
@@ -28614,8 +29901,8 @@
         <w:t xml:space="preserve">analysis of 221 mishaps over 10 years, Aviation, Space, and Environmental Medicine 77 (2006) 724–732.</w:t>
       </w:r>
     </w:p>
-    <w:bookmarkEnd w:id="116"/>
-    <w:bookmarkStart w:id="118" w:name="_06ffb55068ea9e0b3a7aa6e754cfcffab5f832f"/>
+    <w:bookmarkEnd w:id="118"/>
+    <w:bookmarkStart w:id="120" w:name="_06ffb55068ea9e0b3a7aa6e754cfcffab5f832f"/>
     <w:p>
       <w:pPr>
         <w:pStyle w:val="Bibliography"/>
@@ -28635,7 +29922,7 @@
       <w:r>
         <w:t xml:space="preserve"> </w:t>
       </w:r>
-      <w:hyperlink r:id="rId117">
+      <w:hyperlink r:id="rId119">
         <w:r>
           <w:rPr>
             <w:rStyle w:val="Hyperlink"/>
@@ -28647,8 +29934,8 @@
         <w:t xml:space="preserve">.</w:t>
       </w:r>
     </w:p>
-    <w:bookmarkEnd w:id="118"/>
-    <w:bookmarkStart w:id="120" w:name="_8a3cc11b1319c0fe6bf6179f8196eab503a64d0"/>
+    <w:bookmarkEnd w:id="120"/>
+    <w:bookmarkStart w:id="122" w:name="_8a3cc11b1319c0fe6bf6179f8196eab503a64d0"/>
     <w:p>
       <w:pPr>
         <w:pStyle w:val="Bibliography"/>
@@ -28674,7 +29961,7 @@
       <w:r>
         <w:t xml:space="preserve">-integrated applications with indirect prompt injection, in: Proceedings of the 16th ACM Workshop on Artificial Intelligence and Security (AISec), 2023: pp. 79–90. https://doi.org/</w:t>
       </w:r>
-      <w:hyperlink r:id="rId119">
+      <w:hyperlink r:id="rId121">
         <w:r>
           <w:rPr>
             <w:rStyle w:val="Hyperlink"/>
@@ -28686,8 +29973,8 @@
         <w:t xml:space="preserve">.</w:t>
       </w:r>
     </w:p>
-    <w:bookmarkEnd w:id="120"/>
-    <w:bookmarkStart w:id="122" w:name="_ab8841c06958c924804c38799fc8ccd94ea102a"/>
+    <w:bookmarkEnd w:id="122"/>
+    <w:bookmarkStart w:id="124" w:name="_ab8841c06958c924804c38799fc8ccd94ea102a"/>
     <w:p>
       <w:pPr>
         <w:pStyle w:val="Bibliography"/>
@@ -28704,7 +29991,7 @@
       <w:r>
         <w:t xml:space="preserve">B. Frénay, M. Verleysen, Classification in the presence of label noise: A survey, IEEE Transactions on Neural Networks and Learning Systems 25 (2014) 845–869. https://doi.org/</w:t>
       </w:r>
-      <w:hyperlink r:id="rId121">
+      <w:hyperlink r:id="rId123">
         <w:r>
           <w:rPr>
             <w:rStyle w:val="Hyperlink"/>
@@ -28716,8 +30003,8 @@
         <w:t xml:space="preserve">.</w:t>
       </w:r>
     </w:p>
-    <w:bookmarkEnd w:id="122"/>
-    <w:bookmarkStart w:id="124" w:name="_90b58fdc380e5ffe19ed416545c54d06f184b09"/>
+    <w:bookmarkEnd w:id="124"/>
+    <w:bookmarkStart w:id="126" w:name="_90b58fdc380e5ffe19ed416545c54d06f184b09"/>
     <w:p>
       <w:pPr>
         <w:pStyle w:val="Bibliography"/>
@@ -28734,7 +30021,7 @@
       <w:r>
         <w:t xml:space="preserve">E.A. Stuart, Matching methods for causal inference: A review and a look forward, Statistical Science 25 (2010) 1–21. https://doi.org/</w:t>
       </w:r>
-      <w:hyperlink r:id="rId123">
+      <w:hyperlink r:id="rId125">
         <w:r>
           <w:rPr>
             <w:rStyle w:val="Hyperlink"/>
@@ -28746,8 +30033,8 @@
         <w:t xml:space="preserve">.</w:t>
       </w:r>
     </w:p>
-    <w:bookmarkEnd w:id="124"/>
-    <w:bookmarkStart w:id="126" w:name="_f6e66cea9a1ea78573b548bc5cf8461c81300ca"/>
+    <w:bookmarkEnd w:id="126"/>
+    <w:bookmarkStart w:id="128" w:name="_f6e66cea9a1ea78573b548bc5cf8461c81300ca"/>
     <w:p>
       <w:pPr>
         <w:pStyle w:val="Bibliography"/>
@@ -28764,7 +30051,7 @@
       <w:r>
         <w:t xml:space="preserve">B.A. Nosek, C.R. Ebersole, A.C. DeHaven, D.T. Mellor, The preregistration revolution, Proceedings of the National Academy of Sciences 115 (2018) 2600–2606. https://doi.org/</w:t>
       </w:r>
-      <w:hyperlink r:id="rId125">
+      <w:hyperlink r:id="rId127">
         <w:r>
           <w:rPr>
             <w:rStyle w:val="Hyperlink"/>
@@ -28776,8 +30063,8 @@
         <w:t xml:space="preserve">.</w:t>
       </w:r>
     </w:p>
-    <w:bookmarkEnd w:id="126"/>
-    <w:bookmarkStart w:id="128" w:name="_ad8397d41f792404ea3ffa2c2145e851561e0cf"/>
+    <w:bookmarkEnd w:id="128"/>
+    <w:bookmarkStart w:id="130" w:name="_ad8397d41f792404ea3ffa2c2145e851561e0cf"/>
     <w:p>
       <w:pPr>
         <w:pStyle w:val="Bibliography"/>
@@ -28800,7 +30087,7 @@
       <w:r>
         <w:t xml:space="preserve">) curve, Radiology 143 (1982) 29–36. https://doi.org/</w:t>
       </w:r>
-      <w:hyperlink r:id="rId127">
+      <w:hyperlink r:id="rId129">
         <w:r>
           <w:rPr>
             <w:rStyle w:val="Hyperlink"/>
@@ -28812,8 +30099,8 @@
         <w:t xml:space="preserve">.</w:t>
       </w:r>
     </w:p>
-    <w:bookmarkEnd w:id="128"/>
-    <w:bookmarkStart w:id="130" w:name="_7ae2e06bcfe80442633569f5f6b1e21460598cb"/>
+    <w:bookmarkEnd w:id="130"/>
+    <w:bookmarkStart w:id="132" w:name="_7ae2e06bcfe80442633569f5f6b1e21460598cb"/>
     <w:p>
       <w:pPr>
         <w:pStyle w:val="Bibliography"/>
@@ -28830,7 +30117,7 @@
       <w:r>
         <w:t xml:space="preserve">H.B. Mann, D.R. Whitney, On a test of whether one of two random variables is stochastically larger than the other, The Annals of Mathematical Statistics 18 (1947) 50–60. https://doi.org/</w:t>
       </w:r>
-      <w:hyperlink r:id="rId129">
+      <w:hyperlink r:id="rId131">
         <w:r>
           <w:rPr>
             <w:rStyle w:val="Hyperlink"/>
@@ -28842,8 +30129,8 @@
         <w:t xml:space="preserve">.</w:t>
       </w:r>
     </w:p>
-    <w:bookmarkEnd w:id="130"/>
-    <w:bookmarkStart w:id="131" w:name="_d0a9d29bfb3d63b968b17ba95db409a8b61dfda"/>
+    <w:bookmarkEnd w:id="132"/>
+    <w:bookmarkStart w:id="133" w:name="_d0a9d29bfb3d63b968b17ba95db409a8b61dfda"/>
     <w:p>
       <w:pPr>
         <w:pStyle w:val="Bibliography"/>
@@ -28861,8 +30148,8 @@
         <w:t xml:space="preserve">B. Efron, R.J. Tibshirani, An introduction to the bootstrap, Chapman &amp; Hall, New York, 1993.</w:t>
       </w:r>
     </w:p>
-    <w:bookmarkEnd w:id="131"/>
-    <w:bookmarkStart w:id="133" w:name="_89a013c1487ff07275d04a7e5b79d7551b6a9f6"/>
+    <w:bookmarkEnd w:id="133"/>
+    <w:bookmarkStart w:id="135" w:name="_89a013c1487ff07275d04a7e5b79d7551b6a9f6"/>
     <w:p>
       <w:pPr>
         <w:pStyle w:val="Bibliography"/>
@@ -28882,7 +30169,7 @@
       <w:r>
         <w:t xml:space="preserve"> </w:t>
       </w:r>
-      <w:hyperlink r:id="rId132">
+      <w:hyperlink r:id="rId134">
         <w:r>
           <w:rPr>
             <w:rStyle w:val="Hyperlink"/>
@@ -28894,8 +30181,8 @@
         <w:t xml:space="preserve">.</w:t>
       </w:r>
     </w:p>
-    <w:bookmarkEnd w:id="133"/>
-    <w:bookmarkEnd w:id="134"/>
+    <w:bookmarkEnd w:id="135"/>
+    <w:bookmarkEnd w:id="136"/>
     <w:sectPr>
       <w:footnotePr>
         <w:numRestart w:val="eachSect"/>

</xml_diff>

<commit_message>
Paper: Resolve remaining Round 14 items (formula, counts, registration, caliper, GPS)
- 250 pilot crashes corrected to ~100 (SE criterion) and ~200 (80% power)
  with the Hanley-McNeil formula in the text.
- Counts reconciled: 40 case airframes, 39 same-day sets; depth-3 bounds
  and tumble claim corrected.
- Registration table remapped to the correct commits with IST times for
  declaration and results; Q1 relabelled as a first-pass result.
- Caliper: reproducible CI [+0.028, +0.205]; +0.077 [+0.013, +0.204]
  without duration-linked features.
- GPS: 47 of 95 crash-day exposure flights followed the crash; between-
  drone result holds without them (0.698, p 0.0021). Flight-order threat
  added. PDF, Word, Overleaf zip, HANDOFF and critical_review rebuilt.

Co-Authored-By: Claude Opus 5.5 <noreply@anthropic.com>
</commit_message>
<xml_diff>
--- a/docs/paper/submission/manuscript.docx
+++ b/docs/paper/submission/manuscript.docx
@@ -196,34 +196,10 @@
         </m:sSup>
       </m:oMath>
       <w:r>
-        <w:t xml:space="preserve">A factorial audit of 32 evaluation settings found that apparent anticipation depends on the comparison set; the cause is not isolated. AUC fell 0.21 [0.06, 0.34] from the most optimistic to the most conservative other-aircraft setting (0.88 to 0.67); only vehicle-grouped folds were material (0.06 [0.03, 0.09]). Against each drone’s own earlier flights, AUC was at chance (0.569, cluster bootstrap [0.500, 0.643]; rank test</w:t>
-      </w:r>
-      <w:r>
-        <w:t xml:space="preserve"> </w:t>
-      </w:r>
-      <m:oMath>
-        <m:acc>
-          <m:accPr>
-            <m:chr m:val="‾"/>
-          </m:accPr>
-          <m:e>
-            <m:r>
-              <m:t>r</m:t>
-            </m:r>
-          </m:e>
-        </m:acc>
-        <m:r>
-          <m:rPr>
-            <m:sty m:val="p"/>
-          </m:rPr>
-          <m:t>=</m:t>
-        </m:r>
-        <m:r>
-          <m:t>0.48</m:t>
-        </m:r>
-      </m:oMath>
-      <w:r>
-        <w:t xml:space="preserve">). Duration-caliper matching (0.25) lifted it to 0.642 (</w:t>
+        <w:t xml:space="preserve">A factorial audit of 32 evaluation settings found that apparent anticipation depends on the comparison set; the cause is not isolated. AUC fell 0.21 [0.06, 0.34] across other-aircraft settings (0.88 to 0.67); only vehicle-grouped folds were material (0.06 [0.03, 0.09]). Against each drone’s own earlier flights, AUC was at chance (0.569, cluster bootstrap [0.500, 0.643]). Duration-caliper matching (0.25) lifted it by</w:t>
+      </w:r>
+      <w:r>
+        <w:t xml:space="preserve"> </w:t>
       </w:r>
       <m:oMath>
         <m:r>
@@ -237,7 +213,30 @@
         </m:r>
       </m:oMath>
       <w:r>
-        <w:t xml:space="preserve">, 36 airframes; paired cluster CI [+0.074, +0.238]), but a fixed 30 s window did not, so the lift may reflect duration.</w:t>
+        <w:t xml:space="preserve"> </w:t>
+      </w:r>
+      <w:r>
+        <w:t xml:space="preserve">(36 airframes; paired cluster CI [+0.028, +0.205]), and by</w:t>
+      </w:r>
+      <w:r>
+        <w:t xml:space="preserve"> </w:t>
+      </w:r>
+      <m:oMath>
+        <m:r>
+          <m:rPr>
+            <m:sty m:val="p"/>
+          </m:rPr>
+          <m:t>+</m:t>
+        </m:r>
+        <m:r>
+          <m:t>0.077</m:t>
+        </m:r>
+      </m:oMath>
+      <w:r>
+        <w:t xml:space="preserve"> </w:t>
+      </w:r>
+      <w:r>
+        <w:t xml:space="preserve">[+0.013, +0.204] without clipping, tilt and voltage-sag features; a fixed 30 s window did not.</w:t>
       </w:r>
       <w:r>
         <w:t xml:space="preserve"> </w:t>
@@ -300,27 +299,7 @@
         </m:r>
       </m:oMath>
       <w:r>
-        <w:t xml:space="preserve">; newer metrics inconclusive,</w:t>
-      </w:r>
-      <w:r>
-        <w:t xml:space="preserve"> </w:t>
-      </w:r>
-      <m:oMath>
-        <m:r>
-          <m:t>p</m:t>
-        </m:r>
-        <m:r>
-          <m:rPr>
-            <m:sty m:val="p"/>
-          </m:rPr>
-          <m:t>=</m:t>
-        </m:r>
-        <m:r>
-          <m:t>0.25</m:t>
-        </m:r>
-      </m:oMath>
-      <w:r>
-        <w:t xml:space="preserve">).</w:t>
+        <w:t xml:space="preserve">;</w:t>
       </w:r>
       <w:r>
         <w:t xml:space="preserve"> </w:t>
@@ -343,622 +322,30 @@
         </m:sSup>
       </m:oMath>
       <w:r>
-        <w:t xml:space="preserve">Against 107 controls, screening gave</w:t>
-      </w:r>
-      <w:r>
-        <w:t xml:space="preserve"> </w:t>
-      </w:r>
-      <m:oMath>
-        <m:r>
-          <m:t>3.3</m:t>
-        </m:r>
-        <m:r>
-          <m:rPr>
-            <m:sty m:val="p"/>
-          </m:rPr>
-          <m:t>×</m:t>
-        </m:r>
-      </m:oMath>
-      <w:r>
-        <w:t xml:space="preserve"> </w:t>
-      </w:r>
-      <w:r>
-        <w:t xml:space="preserve">lift (illustrative PPV 2.26–2.43% at 10% flag rate). AeroFleet 2.0 shows longitudinal evidence without automatic verdicts.</w:t>
-      </w:r>
-    </w:p>
-    <w:p>
-      <w:pPr>
-        <w:pStyle w:val="BodyText"/>
-      </w:pPr>
-      <w:r>
-        <w:rPr>
-          <w:b/>
-          <w:bCs/>
-        </w:rPr>
-        <w:t xml:space="preserve">Keywords:</w:t>
-      </w:r>
-      <w:r>
-        <w:t xml:space="preserve"> </w:t>
-      </w:r>
-      <w:r>
-        <w:t xml:space="preserve">Unmanned aircraft systems; Flight logs; Crash investigation; Fault diagnosis; Data leakage; Fleet assurance</w:t>
-      </w:r>
-    </w:p>
-    <w:p>
-      <w:pPr>
-        <w:pStyle w:val="Heading1"/>
-      </w:pPr>
-      <w:bookmarkStart w:id="10" w:name="_20041c78c304d06f00dcef5457d2ac08ae2eef7"/>
-      <w:r>
-        <w:rPr>
-          <w:rStyle w:val="SectionNumber"/>
-        </w:rPr>
-        <w:t xml:space="preserve">1</w:t>
-      </w:r>
-      <w:r>
-        <w:tab/>
-      </w:r>
-      <w:r>
-        <w:t xml:space="preserve">Introduction</w:t>
-      </w:r>
-      <w:bookmarkEnd w:id="10"/>
-    </w:p>
-    <w:p>
-      <w:pPr>
-        <w:pStyle w:val="FirstParagraph"/>
-      </w:pPr>
-      <w:r>
-        <w:t xml:space="preserve">Small unmanned aircraft are now flown commercially for survey, inspection, agriculture and delivery, and the rules</w:t>
-      </w:r>
-      <w:r>
-        <w:t xml:space="preserve"> </w:t>
-      </w:r>
-      <w:r>
-        <w:t xml:space="preserve">that govern them place weight on records. In the European Union and the United Kingdom an operator in the specific</w:t>
-      </w:r>
-      <w:r>
-        <w:t xml:space="preserve"> </w:t>
-      </w:r>
-      <w:r>
-        <w:t xml:space="preserve">category must keep records of operations, maintenance and personnel for at least three years</w:t>
-      </w:r>
-      <w:r>
-        <w:t xml:space="preserve"> </w:t>
-      </w:r>
-      <w:r>
-        <w:t xml:space="preserve">[</w:t>
-      </w:r>
-      <w:hyperlink w:anchor="_94e90323a8c21041104ada5ef51239cca731079">
-        <w:r>
-          <w:rPr>
-            <w:rStyle w:val="Hyperlink"/>
-          </w:rPr>
-          <w:t xml:space="preserve">1</w:t>
-        </w:r>
-      </w:hyperlink>
-      <w:r>
-        <w:t xml:space="preserve">,</w:t>
-      </w:r>
-      <w:hyperlink w:anchor="_accb9f9d732da81043c804de081f8bf74e6cf24">
-        <w:r>
-          <w:rPr>
-            <w:rStyle w:val="Hyperlink"/>
-          </w:rPr>
-          <w:t xml:space="preserve">2</w:t>
-        </w:r>
-      </w:hyperlink>
-      <w:r>
-        <w:t xml:space="preserve">]</w:t>
-      </w:r>
-      <w:r>
-        <w:t xml:space="preserve">; India requires an accident to be reported within 48 hours</w:t>
-      </w:r>
-      <w:r>
-        <w:t xml:space="preserve"> </w:t>
-      </w:r>
-      <w:r>
-        <w:t xml:space="preserve">[</w:t>
-      </w:r>
-      <w:hyperlink w:anchor="_2a610b70f77ace96e6ffe48ed026a6e5f9efd5a">
-        <w:r>
-          <w:rPr>
-            <w:rStyle w:val="Hyperlink"/>
-          </w:rPr>
-          <w:t xml:space="preserve">3</w:t>
-        </w:r>
-      </w:hyperlink>
-      <w:r>
-        <w:t xml:space="preserve">]</w:t>
-      </w:r>
-      <w:r>
-        <w:t xml:space="preserve">, and</w:t>
-      </w:r>
-      <w:r>
-        <w:t xml:space="preserve"> </w:t>
-      </w:r>
-      <w:r>
-        <w:t xml:space="preserve">the United States within ten days</w:t>
-      </w:r>
-      <w:r>
-        <w:t xml:space="preserve"> </w:t>
-      </w:r>
-      <w:r>
-        <w:t xml:space="preserve">[</w:t>
-      </w:r>
-      <w:hyperlink w:anchor="_dffd97137af0abb4aae0ff556af3c0d05e0ee4a">
-        <w:r>
-          <w:rPr>
-            <w:rStyle w:val="Hyperlink"/>
-          </w:rPr>
-          <w:t xml:space="preserve">4</w:t>
-        </w:r>
-      </w:hyperlink>
-      <w:r>
-        <w:t xml:space="preserve">]</w:t>
-      </w:r>
-      <w:r>
-        <w:t xml:space="preserve">. When something goes wrong, the onboard flight log is the richest</w:t>
-      </w:r>
-      <w:r>
-        <w:t xml:space="preserve"> </w:t>
-      </w:r>
-      <w:r>
-        <w:t xml:space="preserve">record available. Open-source log viewers, commercial fleet platforms and, more recently, machine-learning and</w:t>
-      </w:r>
-      <w:r>
-        <w:t xml:space="preserve"> </w:t>
-      </w:r>
-      <w:r>
-        <w:t xml:space="preserve">language-model prototypes promise to turn that log into an answer: what failed, and whether the pilot or the aircraft</w:t>
-      </w:r>
-      <w:r>
-        <w:t xml:space="preserve"> </w:t>
-      </w:r>
-      <w:r>
-        <w:t xml:space="preserve">was responsible</w:t>
-      </w:r>
-      <w:r>
-        <w:t xml:space="preserve"> </w:t>
-      </w:r>
-      <w:r>
-        <w:t xml:space="preserve">[</w:t>
-      </w:r>
-      <w:hyperlink w:anchor="_398d8a6b28c132ef0c87de1470cc655ebafd86c">
-        <w:r>
-          <w:rPr>
-            <w:rStyle w:val="Hyperlink"/>
-          </w:rPr>
-          <w:t xml:space="preserve">5</w:t>
-        </w:r>
-      </w:hyperlink>
-      <w:r>
-        <w:t xml:space="preserve">,</w:t>
-      </w:r>
-      <w:hyperlink w:anchor="_4d7bbda75dad34c83d023e6afa1cc5b99fb5426">
-        <w:r>
-          <w:rPr>
-            <w:rStyle w:val="Hyperlink"/>
-          </w:rPr>
-          <w:t xml:space="preserve">6</w:t>
-        </w:r>
-      </w:hyperlink>
-      <w:r>
-        <w:t xml:space="preserve">]</w:t>
-      </w:r>
-      <w:r>
-        <w:t xml:space="preserve">.</w:t>
-      </w:r>
-    </w:p>
-    <w:p>
-      <w:pPr>
-        <w:pStyle w:val="BodyText"/>
-      </w:pPr>
-      <w:r>
-        <w:t xml:space="preserve">The question matters beyond engineering curiosity. In aviation safety science, accidents are recognized as systemic,</w:t>
-      </w:r>
-      <w:r>
-        <w:t xml:space="preserve"> </w:t>
-      </w:r>
-      <w:r>
-        <w:t xml:space="preserve">multi-causal events involving human factors, environmental conditions and organizational influences</w:t>
-      </w:r>
-      <w:r>
-        <w:t xml:space="preserve"> </w:t>
-      </w:r>
-      <w:r>
-        <w:t xml:space="preserve">[</w:t>
-      </w:r>
-      <w:hyperlink w:anchor="_006a7190097400c6c37363d97b6f3be0cdc0b48">
-        <w:r>
-          <w:rPr>
-            <w:rStyle w:val="Hyperlink"/>
-          </w:rPr>
-          <w:t xml:space="preserve">7</w:t>
-        </w:r>
-      </w:hyperlink>
-      <w:r>
-        <w:t xml:space="preserve">]</w:t>
-      </w:r>
-      <w:r>
-        <w:t xml:space="preserve">.</w:t>
-      </w:r>
-      <w:r>
-        <w:t xml:space="preserve"> </w:t>
-      </w:r>
-      <w:r>
-        <w:t xml:space="preserve">Commercial warranty claims, insurance settlements and regulatory filings nevertheless frequently compress these dynamics</w:t>
-      </w:r>
-      <w:r>
-        <w:t xml:space="preserve"> </w:t>
-      </w:r>
-      <w:r>
-        <w:t xml:space="preserve">into a binary decision: whether the pilot or the aircraft was primarily responsible. An automatic verdict that looks</w:t>
-      </w:r>
-      <w:r>
-        <w:t xml:space="preserve"> </w:t>
-      </w:r>
-      <w:r>
-        <w:t xml:space="preserve">objective can carry weight it has not earned. Fleet operators face a related but different question: not why one flight</w:t>
-      </w:r>
-      <w:r>
-        <w:t xml:space="preserve"> </w:t>
-      </w:r>
-      <w:r>
-        <w:t xml:space="preserve">ended badly, but which of their drones are most likely to fail next and should be inspected first. A log-based method that</w:t>
-      </w:r>
-      <w:r>
-        <w:t xml:space="preserve"> </w:t>
-      </w:r>
-      <w:r>
-        <w:t xml:space="preserve">is good at the second task need not be good at the first, and confusing the two can mislead both investigators and maintainers.</w:t>
-      </w:r>
-    </w:p>
-    <w:p>
-      <w:pPr>
-        <w:pStyle w:val="BodyText"/>
-      </w:pPr>
-      <w:r>
-        <w:t xml:space="preserve">Whether logs can deliver on either expectation has, to our knowledge, not been tested at scale against real crashes</w:t>
-      </w:r>
-      <w:r>
-        <w:t xml:space="preserve"> </w:t>
-      </w:r>
-      <w:r>
-        <w:t xml:space="preserve">with evaluation protocols that guard against the two known sources of optimism. First, a log that contains a crash also</w:t>
-      </w:r>
-      <w:r>
-        <w:t xml:space="preserve"> </w:t>
-      </w:r>
-      <w:r>
-        <w:t xml:space="preserve">contains its consequences—saturated motors, extreme attitudes and estimator errors—so a detector can learn the crash</w:t>
-      </w:r>
-      <w:r>
-        <w:t xml:space="preserve"> </w:t>
-      </w:r>
-      <w:r>
-        <w:t xml:space="preserve">itself rather than its cause, a form of crash-window data leakage</w:t>
-      </w:r>
-      <w:r>
-        <w:t xml:space="preserve"> </w:t>
-      </w:r>
-      <w:r>
-        <w:t xml:space="preserve">[</w:t>
-      </w:r>
-      <w:hyperlink w:anchor="_3541019a36f31423dbace231a12fca4d5e5f1ad">
-        <w:r>
-          <w:rPr>
-            <w:rStyle w:val="Hyperlink"/>
-          </w:rPr>
-          <w:t xml:space="preserve">8</w:t>
-        </w:r>
-      </w:hyperlink>
-      <w:r>
-        <w:t xml:space="preserve">,</w:t>
-      </w:r>
-      <w:hyperlink w:anchor="_77239db318a405bdd9ca0cc5db74d4c41b2a03f">
-        <w:r>
-          <w:rPr>
-            <w:rStyle w:val="Hyperlink"/>
-          </w:rPr>
-          <w:t xml:space="preserve">9</w:t>
-        </w:r>
-      </w:hyperlink>
-      <w:r>
-        <w:t xml:space="preserve">]</w:t>
-      </w:r>
-      <w:r>
-        <w:t xml:space="preserve">. Second, comparing crash flights with other operators’ good flights mixes</w:t>
-      </w:r>
-      <w:r>
-        <w:t xml:space="preserve"> </w:t>
-      </w:r>
-      <w:r>
-        <w:t xml:space="preserve">the flight with the aircraft and the people using it, so a difference between groups need not say anything about the</w:t>
-      </w:r>
-      <w:r>
-        <w:t xml:space="preserve"> </w:t>
-      </w:r>
-      <w:r>
-        <w:t xml:space="preserve">flight that crashed (between-aircraft confounding). Public fault datasets are dominated by simulation or injected faults</w:t>
-      </w:r>
-      <w:r>
-        <w:t xml:space="preserve"> </w:t>
-      </w:r>
-      <w:r>
-        <w:t xml:space="preserve">[</w:t>
-      </w:r>
-      <w:hyperlink w:anchor="_d75d7cf63098afa5d33e189bc1a163022e7ecdc">
-        <w:r>
-          <w:rPr>
-            <w:rStyle w:val="Hyperlink"/>
-          </w:rPr>
-          <w:t xml:space="preserve">10</w:t>
-        </w:r>
-      </w:hyperlink>
-      <w:r>
-        <w:t xml:space="preserve">–</w:t>
-      </w:r>
-      <w:hyperlink w:anchor="_973650d78dc352a8b25ace59ab002a1d91cdfc9">
-        <w:r>
-          <w:rPr>
-            <w:rStyle w:val="Hyperlink"/>
-          </w:rPr>
-          <w:t xml:space="preserve">12</w:t>
-        </w:r>
-      </w:hyperlink>
-      <w:r>
-        <w:t xml:space="preserve">]</w:t>
-      </w:r>
-      <w:r>
-        <w:t xml:space="preserve">, and accident statistics classify outcomes such as loss of</w:t>
-      </w:r>
-      <w:r>
-        <w:t xml:space="preserve"> </w:t>
-      </w:r>
-      <w:r>
-        <w:t xml:space="preserve">control rather than causes visible in a log</w:t>
-      </w:r>
-      <w:r>
-        <w:t xml:space="preserve"> </w:t>
-      </w:r>
-      <w:r>
-        <w:t xml:space="preserve">[</w:t>
-      </w:r>
-      <w:hyperlink w:anchor="_42246838952b0ed0d35bd475d264714b9e743f7">
-        <w:r>
-          <w:rPr>
-            <w:rStyle w:val="Hyperlink"/>
-          </w:rPr>
-          <w:t xml:space="preserve">13</w:t>
-        </w:r>
-      </w:hyperlink>
-      <w:r>
-        <w:t xml:space="preserve">,</w:t>
-      </w:r>
-      <w:hyperlink w:anchor="_b513b568a9a02649a1ddc461a1dd01e876732a2">
-        <w:r>
-          <w:rPr>
-            <w:rStyle w:val="Hyperlink"/>
-          </w:rPr>
-          <w:t xml:space="preserve">14</w:t>
-        </w:r>
-      </w:hyperlink>
-      <w:r>
-        <w:t xml:space="preserve">]</w:t>
-      </w:r>
-      <w:r>
-        <w:t xml:space="preserve">; neither resource tests</w:t>
-      </w:r>
-      <w:r>
-        <w:t xml:space="preserve"> </w:t>
-      </w:r>
-      <w:r>
-        <w:t xml:space="preserve">whether real crash logs, evaluated under leakage-free and within-aircraft protocols, can support the attribution and</w:t>
-      </w:r>
-      <w:r>
-        <w:t xml:space="preserve"> </w:t>
-      </w:r>
-      <w:r>
-        <w:t xml:space="preserve">prioritization decisions that operators actually need.</w:t>
-      </w:r>
-    </w:p>
-    <w:p>
-      <w:pPr>
-        <w:pStyle w:val="BodyText"/>
-      </w:pPr>
-      <w:r>
-        <w:t xml:space="preserve">The central question this paper asks of the largest public archive of real autopilot logs, PX4 Flight Review</w:t>
-      </w:r>
-      <w:r>
-        <w:t xml:space="preserve"> </w:t>
-      </w:r>
-      <w:r>
-        <w:t xml:space="preserve">[</w:t>
-      </w:r>
-      <w:hyperlink w:anchor="_7bef8dc44b5ed9bb7ced7ca5f392a78a76d6601">
-        <w:r>
-          <w:rPr>
-            <w:rStyle w:val="Hyperlink"/>
-          </w:rPr>
-          <w:t xml:space="preserve">15</w:t>
-        </w:r>
-      </w:hyperlink>
-      <w:r>
-        <w:t xml:space="preserve">,</w:t>
-      </w:r>
-      <w:hyperlink w:anchor="_d96f71c5379cbcad3bc75bfc7936eeacbaeb4ed">
-        <w:r>
-          <w:rPr>
-            <w:rStyle w:val="Hyperlink"/>
-          </w:rPr>
-          <w:t xml:space="preserve">16</w:t>
-        </w:r>
-      </w:hyperlink>
-      <w:r>
-        <w:t xml:space="preserve">]</w:t>
-      </w:r>
-      <w:r>
-        <w:t xml:space="preserve">, is:</w:t>
-      </w:r>
-      <w:r>
-        <w:t xml:space="preserve"> </w:t>
-      </w:r>
-      <w:r>
-        <w:rPr>
-          <w:i/>
-          <w:iCs/>
-        </w:rPr>
-        <w:t xml:space="preserve">what evidentiary value can flight logs carry for a drone fleet</w:t>
-      </w:r>
-      <w:r>
-        <w:rPr>
-          <w:i/>
-          <w:iCs/>
-        </w:rPr>
-        <w:t xml:space="preserve"> </w:t>
-      </w:r>
-      <w:r>
-        <w:rPr>
-          <w:i/>
-          <w:iCs/>
-        </w:rPr>
-        <w:t xml:space="preserve">operator, once evaluation protocols guard against crash-window leakage and between-aircraft confounding?</w:t>
-      </w:r>
-      <w:r>
-        <w:t xml:space="preserve"> </w:t>
-      </w:r>
-      <w:r>
-        <w:t xml:space="preserve">We decompose</w:t>
-      </w:r>
-      <w:r>
-        <w:t xml:space="preserve"> </w:t>
-      </w:r>
-      <w:r>
-        <w:t xml:space="preserve">this into four sub-tests:</w:t>
-      </w:r>
-    </w:p>
-    <w:p>
-      <w:pPr>
-        <w:pStyle w:val="BodyText"/>
-      </w:pPr>
-      <w:r>
-        <w:rPr>
-          <w:b/>
-          <w:bCs/>
-        </w:rPr>
-        <w:t xml:space="preserve">Q1</w:t>
-      </w:r>
-      <w:r>
-        <w:t xml:space="preserve"> </w:t>
-      </w:r>
-      <w:r>
-        <w:t xml:space="preserve">Do configuration settings differ between crash flights and normal flights, and can that difference indicate</w:t>
-      </w:r>
-      <w:r>
-        <w:t xml:space="preserve"> </w:t>
-      </w:r>
-      <w:r>
-        <w:t xml:space="preserve">who was responsible?</w:t>
-      </w:r>
-    </w:p>
-    <w:p>
-      <w:pPr>
-        <w:pStyle w:val="BodyText"/>
-      </w:pPr>
-      <w:r>
-        <w:rPr>
-          <w:b/>
-          <w:bCs/>
-        </w:rPr>
-        <w:t xml:space="preserve">Q2</w:t>
-      </w:r>
-      <w:r>
-        <w:t xml:space="preserve"> </w:t>
-      </w:r>
-      <w:r>
-        <w:t xml:space="preserve">Can a log separate crashes caused by the pilot from crashes caused by the aircraft—and does this separation</w:t>
-      </w:r>
-      <w:r>
-        <w:t xml:space="preserve"> </w:t>
-      </w:r>
-      <w:r>
-        <w:t xml:space="preserve">survive expert-diagnosis validation?</w:t>
-      </w:r>
-    </w:p>
-    <w:p>
-      <w:pPr>
-        <w:pStyle w:val="BodyText"/>
-      </w:pPr>
-      <w:r>
-        <w:rPr>
-          <w:b/>
-          <w:bCs/>
-        </w:rPr>
-        <w:t xml:space="preserve">Q3</w:t>
-      </w:r>
-      <w:r>
-        <w:t xml:space="preserve"> </w:t>
-      </w:r>
-      <w:r>
-        <w:t xml:space="preserve">Once within-aircraft and between-aircraft comparisons are distinguished, which comparison retains a usable</w:t>
-      </w:r>
-      <w:r>
-        <w:t xml:space="preserve"> </w:t>
-      </w:r>
-      <w:r>
-        <w:t xml:space="preserve">signal of pre-crash deterioration?</w:t>
-      </w:r>
-    </w:p>
-    <w:p>
-      <w:pPr>
-        <w:pStyle w:val="BodyText"/>
-      </w:pPr>
-      <w:r>
-        <w:rPr>
-          <w:b/>
-          <w:bCs/>
-        </w:rPr>
-        <w:t xml:space="preserve">Q4</w:t>
-      </w:r>
-      <w:r>
-        <w:t xml:space="preserve"> </w:t>
-      </w:r>
-      <w:r>
-        <w:t xml:space="preserve">Do expert diagnoses agree with uploader labels, and do automatic diagnostic checks find the faults experts</w:t>
-      </w:r>
-      <w:r>
-        <w:t xml:space="preserve"> </w:t>
-      </w:r>
-      <w:r>
-        <w:t xml:space="preserve">name without benefiting from the crash window?</w:t>
-      </w:r>
-    </w:p>
-    <w:p>
-      <w:pPr>
-        <w:pStyle w:val="BodyText"/>
-      </w:pPr>
-      <w:r>
-        <w:t xml:space="preserve">Because language-model assistants are now proposed for exactly this task, we also report a controlled evaluation of</w:t>
-      </w:r>
-      <w:r>
-        <w:t xml:space="preserve"> </w:t>
-      </w:r>
-      <w:r>
-        <w:t xml:space="preserve">small local models used as an attribution review panel, including a test for voting-consensus manipulation.</w:t>
-      </w:r>
-    </w:p>
-    <w:p>
-      <w:pPr>
-        <w:pStyle w:val="BodyText"/>
-      </w:pPr>
-      <w:r>
-        <w:t xml:space="preserve">The contributions are as follows.</w:t>
-      </w:r>
-      <w:r>
-        <w:t xml:space="preserve"> </w:t>
-      </w:r>
-      <w:r>
-        <w:t xml:space="preserve">(i) </w:t>
+        <w:t xml:space="preserve">0.70 without 47 exposure flights flown after the crash; newer metrics inconclusive,</w:t>
+      </w:r>
+      <w:r>
+        <w:t xml:space="preserve"> </w:t>
+      </w:r>
+      <m:oMath>
+        <m:r>
+          <m:t>p</m:t>
+        </m:r>
+        <m:r>
+          <m:rPr>
+            <m:sty m:val="p"/>
+          </m:rPr>
+          <m:t>=</m:t>
+        </m:r>
+        <m:r>
+          <m:t>0.25</m:t>
+        </m:r>
+      </m:oMath>
+      <w:r>
+        <w:t xml:space="preserve">).</w:t>
+      </w:r>
+      <w:r>
+        <w:t xml:space="preserve"> </w:t>
       </w:r>
       <m:oMath>
         <m:sSup>
@@ -978,6 +365,641 @@
         </m:sSup>
       </m:oMath>
       <w:r>
+        <w:t xml:space="preserve">Against 107 controls, screening gave</w:t>
+      </w:r>
+      <w:r>
+        <w:t xml:space="preserve"> </w:t>
+      </w:r>
+      <m:oMath>
+        <m:r>
+          <m:t>3.3</m:t>
+        </m:r>
+        <m:r>
+          <m:rPr>
+            <m:sty m:val="p"/>
+          </m:rPr>
+          <m:t>×</m:t>
+        </m:r>
+      </m:oMath>
+      <w:r>
+        <w:t xml:space="preserve"> </w:t>
+      </w:r>
+      <w:r>
+        <w:t xml:space="preserve">lift (illustrative PPV 2.26–2.43% at 10% flag rate). AeroFleet 2.0 shows longitudinal evidence without automatic verdicts.</w:t>
+      </w:r>
+    </w:p>
+    <w:p>
+      <w:pPr>
+        <w:pStyle w:val="BodyText"/>
+      </w:pPr>
+      <w:r>
+        <w:rPr>
+          <w:b/>
+          <w:bCs/>
+        </w:rPr>
+        <w:t xml:space="preserve">Keywords:</w:t>
+      </w:r>
+      <w:r>
+        <w:t xml:space="preserve"> </w:t>
+      </w:r>
+      <w:r>
+        <w:t xml:space="preserve">Unmanned aircraft systems; Flight logs; Crash investigation; Fault diagnosis; Data leakage; Fleet assurance</w:t>
+      </w:r>
+    </w:p>
+    <w:p>
+      <w:pPr>
+        <w:pStyle w:val="Heading1"/>
+      </w:pPr>
+      <w:bookmarkStart w:id="10" w:name="_20041c78c304d06f00dcef5457d2ac08ae2eef7"/>
+      <w:r>
+        <w:rPr>
+          <w:rStyle w:val="SectionNumber"/>
+        </w:rPr>
+        <w:t xml:space="preserve">1</w:t>
+      </w:r>
+      <w:r>
+        <w:tab/>
+      </w:r>
+      <w:r>
+        <w:t xml:space="preserve">Introduction</w:t>
+      </w:r>
+      <w:bookmarkEnd w:id="10"/>
+    </w:p>
+    <w:p>
+      <w:pPr>
+        <w:pStyle w:val="FirstParagraph"/>
+      </w:pPr>
+      <w:r>
+        <w:t xml:space="preserve">Small unmanned aircraft are now flown commercially for survey, inspection, agriculture and delivery, and the rules</w:t>
+      </w:r>
+      <w:r>
+        <w:t xml:space="preserve"> </w:t>
+      </w:r>
+      <w:r>
+        <w:t xml:space="preserve">that govern them place weight on records. In the European Union and the United Kingdom an operator in the specific</w:t>
+      </w:r>
+      <w:r>
+        <w:t xml:space="preserve"> </w:t>
+      </w:r>
+      <w:r>
+        <w:t xml:space="preserve">category must keep records of operations, maintenance and personnel for at least three years</w:t>
+      </w:r>
+      <w:r>
+        <w:t xml:space="preserve"> </w:t>
+      </w:r>
+      <w:r>
+        <w:t xml:space="preserve">[</w:t>
+      </w:r>
+      <w:hyperlink w:anchor="_94e90323a8c21041104ada5ef51239cca731079">
+        <w:r>
+          <w:rPr>
+            <w:rStyle w:val="Hyperlink"/>
+          </w:rPr>
+          <w:t xml:space="preserve">1</w:t>
+        </w:r>
+      </w:hyperlink>
+      <w:r>
+        <w:t xml:space="preserve">,</w:t>
+      </w:r>
+      <w:hyperlink w:anchor="_accb9f9d732da81043c804de081f8bf74e6cf24">
+        <w:r>
+          <w:rPr>
+            <w:rStyle w:val="Hyperlink"/>
+          </w:rPr>
+          <w:t xml:space="preserve">2</w:t>
+        </w:r>
+      </w:hyperlink>
+      <w:r>
+        <w:t xml:space="preserve">]</w:t>
+      </w:r>
+      <w:r>
+        <w:t xml:space="preserve">; India requires an accident to be reported within 48 hours</w:t>
+      </w:r>
+      <w:r>
+        <w:t xml:space="preserve"> </w:t>
+      </w:r>
+      <w:r>
+        <w:t xml:space="preserve">[</w:t>
+      </w:r>
+      <w:hyperlink w:anchor="_2a610b70f77ace96e6ffe48ed026a6e5f9efd5a">
+        <w:r>
+          <w:rPr>
+            <w:rStyle w:val="Hyperlink"/>
+          </w:rPr>
+          <w:t xml:space="preserve">3</w:t>
+        </w:r>
+      </w:hyperlink>
+      <w:r>
+        <w:t xml:space="preserve">]</w:t>
+      </w:r>
+      <w:r>
+        <w:t xml:space="preserve">, and</w:t>
+      </w:r>
+      <w:r>
+        <w:t xml:space="preserve"> </w:t>
+      </w:r>
+      <w:r>
+        <w:t xml:space="preserve">the United States within ten days</w:t>
+      </w:r>
+      <w:r>
+        <w:t xml:space="preserve"> </w:t>
+      </w:r>
+      <w:r>
+        <w:t xml:space="preserve">[</w:t>
+      </w:r>
+      <w:hyperlink w:anchor="_dffd97137af0abb4aae0ff556af3c0d05e0ee4a">
+        <w:r>
+          <w:rPr>
+            <w:rStyle w:val="Hyperlink"/>
+          </w:rPr>
+          <w:t xml:space="preserve">4</w:t>
+        </w:r>
+      </w:hyperlink>
+      <w:r>
+        <w:t xml:space="preserve">]</w:t>
+      </w:r>
+      <w:r>
+        <w:t xml:space="preserve">. When something goes wrong, the onboard flight log is the richest</w:t>
+      </w:r>
+      <w:r>
+        <w:t xml:space="preserve"> </w:t>
+      </w:r>
+      <w:r>
+        <w:t xml:space="preserve">record available. Open-source log viewers, commercial fleet platforms and, more recently, machine-learning and</w:t>
+      </w:r>
+      <w:r>
+        <w:t xml:space="preserve"> </w:t>
+      </w:r>
+      <w:r>
+        <w:t xml:space="preserve">language-model prototypes promise to turn that log into an answer: what failed, and whether the pilot or the aircraft</w:t>
+      </w:r>
+      <w:r>
+        <w:t xml:space="preserve"> </w:t>
+      </w:r>
+      <w:r>
+        <w:t xml:space="preserve">was responsible</w:t>
+      </w:r>
+      <w:r>
+        <w:t xml:space="preserve"> </w:t>
+      </w:r>
+      <w:r>
+        <w:t xml:space="preserve">[</w:t>
+      </w:r>
+      <w:hyperlink w:anchor="_398d8a6b28c132ef0c87de1470cc655ebafd86c">
+        <w:r>
+          <w:rPr>
+            <w:rStyle w:val="Hyperlink"/>
+          </w:rPr>
+          <w:t xml:space="preserve">5</w:t>
+        </w:r>
+      </w:hyperlink>
+      <w:r>
+        <w:t xml:space="preserve">,</w:t>
+      </w:r>
+      <w:hyperlink w:anchor="_4d7bbda75dad34c83d023e6afa1cc5b99fb5426">
+        <w:r>
+          <w:rPr>
+            <w:rStyle w:val="Hyperlink"/>
+          </w:rPr>
+          <w:t xml:space="preserve">6</w:t>
+        </w:r>
+      </w:hyperlink>
+      <w:r>
+        <w:t xml:space="preserve">]</w:t>
+      </w:r>
+      <w:r>
+        <w:t xml:space="preserve">.</w:t>
+      </w:r>
+    </w:p>
+    <w:p>
+      <w:pPr>
+        <w:pStyle w:val="BodyText"/>
+      </w:pPr>
+      <w:r>
+        <w:t xml:space="preserve">The question matters beyond engineering curiosity. In aviation safety science, accidents are recognized as systemic,</w:t>
+      </w:r>
+      <w:r>
+        <w:t xml:space="preserve"> </w:t>
+      </w:r>
+      <w:r>
+        <w:t xml:space="preserve">multi-causal events involving human factors, environmental conditions and organizational influences</w:t>
+      </w:r>
+      <w:r>
+        <w:t xml:space="preserve"> </w:t>
+      </w:r>
+      <w:r>
+        <w:t xml:space="preserve">[</w:t>
+      </w:r>
+      <w:hyperlink w:anchor="_006a7190097400c6c37363d97b6f3be0cdc0b48">
+        <w:r>
+          <w:rPr>
+            <w:rStyle w:val="Hyperlink"/>
+          </w:rPr>
+          <w:t xml:space="preserve">7</w:t>
+        </w:r>
+      </w:hyperlink>
+      <w:r>
+        <w:t xml:space="preserve">]</w:t>
+      </w:r>
+      <w:r>
+        <w:t xml:space="preserve">.</w:t>
+      </w:r>
+      <w:r>
+        <w:t xml:space="preserve"> </w:t>
+      </w:r>
+      <w:r>
+        <w:t xml:space="preserve">Commercial warranty claims, insurance settlements and regulatory filings nevertheless frequently compress these dynamics</w:t>
+      </w:r>
+      <w:r>
+        <w:t xml:space="preserve"> </w:t>
+      </w:r>
+      <w:r>
+        <w:t xml:space="preserve">into a binary decision: whether the pilot or the aircraft was primarily responsible. An automatic verdict that looks</w:t>
+      </w:r>
+      <w:r>
+        <w:t xml:space="preserve"> </w:t>
+      </w:r>
+      <w:r>
+        <w:t xml:space="preserve">objective can carry weight it has not earned. Fleet operators face a related but different question: not why one flight</w:t>
+      </w:r>
+      <w:r>
+        <w:t xml:space="preserve"> </w:t>
+      </w:r>
+      <w:r>
+        <w:t xml:space="preserve">ended badly, but which of their drones are most likely to fail next and should be inspected first. A log-based method that</w:t>
+      </w:r>
+      <w:r>
+        <w:t xml:space="preserve"> </w:t>
+      </w:r>
+      <w:r>
+        <w:t xml:space="preserve">is good at the second task need not be good at the first, and confusing the two can mislead both investigators and maintainers.</w:t>
+      </w:r>
+    </w:p>
+    <w:p>
+      <w:pPr>
+        <w:pStyle w:val="BodyText"/>
+      </w:pPr>
+      <w:r>
+        <w:t xml:space="preserve">Whether logs can deliver on either expectation has, to our knowledge, not been tested at scale against real crashes</w:t>
+      </w:r>
+      <w:r>
+        <w:t xml:space="preserve"> </w:t>
+      </w:r>
+      <w:r>
+        <w:t xml:space="preserve">with evaluation protocols that guard against the two known sources of optimism. First, a log that contains a crash also</w:t>
+      </w:r>
+      <w:r>
+        <w:t xml:space="preserve"> </w:t>
+      </w:r>
+      <w:r>
+        <w:t xml:space="preserve">contains its consequences—saturated motors, extreme attitudes and estimator errors—so a detector can learn the crash</w:t>
+      </w:r>
+      <w:r>
+        <w:t xml:space="preserve"> </w:t>
+      </w:r>
+      <w:r>
+        <w:t xml:space="preserve">itself rather than its cause, a form of crash-window data leakage</w:t>
+      </w:r>
+      <w:r>
+        <w:t xml:space="preserve"> </w:t>
+      </w:r>
+      <w:r>
+        <w:t xml:space="preserve">[</w:t>
+      </w:r>
+      <w:hyperlink w:anchor="_3541019a36f31423dbace231a12fca4d5e5f1ad">
+        <w:r>
+          <w:rPr>
+            <w:rStyle w:val="Hyperlink"/>
+          </w:rPr>
+          <w:t xml:space="preserve">8</w:t>
+        </w:r>
+      </w:hyperlink>
+      <w:r>
+        <w:t xml:space="preserve">,</w:t>
+      </w:r>
+      <w:hyperlink w:anchor="_77239db318a405bdd9ca0cc5db74d4c41b2a03f">
+        <w:r>
+          <w:rPr>
+            <w:rStyle w:val="Hyperlink"/>
+          </w:rPr>
+          <w:t xml:space="preserve">9</w:t>
+        </w:r>
+      </w:hyperlink>
+      <w:r>
+        <w:t xml:space="preserve">]</w:t>
+      </w:r>
+      <w:r>
+        <w:t xml:space="preserve">. Second, comparing crash flights with other operators’ good flights mixes</w:t>
+      </w:r>
+      <w:r>
+        <w:t xml:space="preserve"> </w:t>
+      </w:r>
+      <w:r>
+        <w:t xml:space="preserve">the flight with the aircraft and the people using it, so a difference between groups need not say anything about the</w:t>
+      </w:r>
+      <w:r>
+        <w:t xml:space="preserve"> </w:t>
+      </w:r>
+      <w:r>
+        <w:t xml:space="preserve">flight that crashed (between-aircraft confounding). Public fault datasets are dominated by simulation or injected faults</w:t>
+      </w:r>
+      <w:r>
+        <w:t xml:space="preserve"> </w:t>
+      </w:r>
+      <w:r>
+        <w:t xml:space="preserve">[</w:t>
+      </w:r>
+      <w:hyperlink w:anchor="_d75d7cf63098afa5d33e189bc1a163022e7ecdc">
+        <w:r>
+          <w:rPr>
+            <w:rStyle w:val="Hyperlink"/>
+          </w:rPr>
+          <w:t xml:space="preserve">10</w:t>
+        </w:r>
+      </w:hyperlink>
+      <w:r>
+        <w:t xml:space="preserve">–</w:t>
+      </w:r>
+      <w:hyperlink w:anchor="_973650d78dc352a8b25ace59ab002a1d91cdfc9">
+        <w:r>
+          <w:rPr>
+            <w:rStyle w:val="Hyperlink"/>
+          </w:rPr>
+          <w:t xml:space="preserve">12</w:t>
+        </w:r>
+      </w:hyperlink>
+      <w:r>
+        <w:t xml:space="preserve">]</w:t>
+      </w:r>
+      <w:r>
+        <w:t xml:space="preserve">, and accident statistics classify outcomes such as loss of</w:t>
+      </w:r>
+      <w:r>
+        <w:t xml:space="preserve"> </w:t>
+      </w:r>
+      <w:r>
+        <w:t xml:space="preserve">control rather than causes visible in a log</w:t>
+      </w:r>
+      <w:r>
+        <w:t xml:space="preserve"> </w:t>
+      </w:r>
+      <w:r>
+        <w:t xml:space="preserve">[</w:t>
+      </w:r>
+      <w:hyperlink w:anchor="_42246838952b0ed0d35bd475d264714b9e743f7">
+        <w:r>
+          <w:rPr>
+            <w:rStyle w:val="Hyperlink"/>
+          </w:rPr>
+          <w:t xml:space="preserve">13</w:t>
+        </w:r>
+      </w:hyperlink>
+      <w:r>
+        <w:t xml:space="preserve">,</w:t>
+      </w:r>
+      <w:hyperlink w:anchor="_b513b568a9a02649a1ddc461a1dd01e876732a2">
+        <w:r>
+          <w:rPr>
+            <w:rStyle w:val="Hyperlink"/>
+          </w:rPr>
+          <w:t xml:space="preserve">14</w:t>
+        </w:r>
+      </w:hyperlink>
+      <w:r>
+        <w:t xml:space="preserve">]</w:t>
+      </w:r>
+      <w:r>
+        <w:t xml:space="preserve">; neither resource tests</w:t>
+      </w:r>
+      <w:r>
+        <w:t xml:space="preserve"> </w:t>
+      </w:r>
+      <w:r>
+        <w:t xml:space="preserve">whether real crash logs, evaluated under leakage-free and within-aircraft protocols, can support the attribution and</w:t>
+      </w:r>
+      <w:r>
+        <w:t xml:space="preserve"> </w:t>
+      </w:r>
+      <w:r>
+        <w:t xml:space="preserve">prioritization decisions that operators actually need.</w:t>
+      </w:r>
+    </w:p>
+    <w:p>
+      <w:pPr>
+        <w:pStyle w:val="BodyText"/>
+      </w:pPr>
+      <w:r>
+        <w:t xml:space="preserve">The central question this paper asks of the largest public archive of real autopilot logs, PX4 Flight Review</w:t>
+      </w:r>
+      <w:r>
+        <w:t xml:space="preserve"> </w:t>
+      </w:r>
+      <w:r>
+        <w:t xml:space="preserve">[</w:t>
+      </w:r>
+      <w:hyperlink w:anchor="_7bef8dc44b5ed9bb7ced7ca5f392a78a76d6601">
+        <w:r>
+          <w:rPr>
+            <w:rStyle w:val="Hyperlink"/>
+          </w:rPr>
+          <w:t xml:space="preserve">15</w:t>
+        </w:r>
+      </w:hyperlink>
+      <w:r>
+        <w:t xml:space="preserve">,</w:t>
+      </w:r>
+      <w:hyperlink w:anchor="_d96f71c5379cbcad3bc75bfc7936eeacbaeb4ed">
+        <w:r>
+          <w:rPr>
+            <w:rStyle w:val="Hyperlink"/>
+          </w:rPr>
+          <w:t xml:space="preserve">16</w:t>
+        </w:r>
+      </w:hyperlink>
+      <w:r>
+        <w:t xml:space="preserve">]</w:t>
+      </w:r>
+      <w:r>
+        <w:t xml:space="preserve">, is:</w:t>
+      </w:r>
+      <w:r>
+        <w:t xml:space="preserve"> </w:t>
+      </w:r>
+      <w:r>
+        <w:rPr>
+          <w:i/>
+          <w:iCs/>
+        </w:rPr>
+        <w:t xml:space="preserve">what evidentiary value can flight logs carry for a drone fleet</w:t>
+      </w:r>
+      <w:r>
+        <w:rPr>
+          <w:i/>
+          <w:iCs/>
+        </w:rPr>
+        <w:t xml:space="preserve"> </w:t>
+      </w:r>
+      <w:r>
+        <w:rPr>
+          <w:i/>
+          <w:iCs/>
+        </w:rPr>
+        <w:t xml:space="preserve">operator, once evaluation protocols guard against crash-window leakage and between-aircraft confounding?</w:t>
+      </w:r>
+      <w:r>
+        <w:t xml:space="preserve"> </w:t>
+      </w:r>
+      <w:r>
+        <w:t xml:space="preserve">We decompose</w:t>
+      </w:r>
+      <w:r>
+        <w:t xml:space="preserve"> </w:t>
+      </w:r>
+      <w:r>
+        <w:t xml:space="preserve">this into four sub-tests:</w:t>
+      </w:r>
+    </w:p>
+    <w:p>
+      <w:pPr>
+        <w:pStyle w:val="BodyText"/>
+      </w:pPr>
+      <w:r>
+        <w:rPr>
+          <w:b/>
+          <w:bCs/>
+        </w:rPr>
+        <w:t xml:space="preserve">Q1</w:t>
+      </w:r>
+      <w:r>
+        <w:t xml:space="preserve"> </w:t>
+      </w:r>
+      <w:r>
+        <w:t xml:space="preserve">Do configuration settings differ between crash flights and normal flights, and can that difference indicate</w:t>
+      </w:r>
+      <w:r>
+        <w:t xml:space="preserve"> </w:t>
+      </w:r>
+      <w:r>
+        <w:t xml:space="preserve">who was responsible?</w:t>
+      </w:r>
+    </w:p>
+    <w:p>
+      <w:pPr>
+        <w:pStyle w:val="BodyText"/>
+      </w:pPr>
+      <w:r>
+        <w:rPr>
+          <w:b/>
+          <w:bCs/>
+        </w:rPr>
+        <w:t xml:space="preserve">Q2</w:t>
+      </w:r>
+      <w:r>
+        <w:t xml:space="preserve"> </w:t>
+      </w:r>
+      <w:r>
+        <w:t xml:space="preserve">Can a log separate crashes caused by the pilot from crashes caused by the aircraft—and does this separation</w:t>
+      </w:r>
+      <w:r>
+        <w:t xml:space="preserve"> </w:t>
+      </w:r>
+      <w:r>
+        <w:t xml:space="preserve">survive expert-diagnosis validation?</w:t>
+      </w:r>
+    </w:p>
+    <w:p>
+      <w:pPr>
+        <w:pStyle w:val="BodyText"/>
+      </w:pPr>
+      <w:r>
+        <w:rPr>
+          <w:b/>
+          <w:bCs/>
+        </w:rPr>
+        <w:t xml:space="preserve">Q3</w:t>
+      </w:r>
+      <w:r>
+        <w:t xml:space="preserve"> </w:t>
+      </w:r>
+      <w:r>
+        <w:t xml:space="preserve">Once within-aircraft and between-aircraft comparisons are distinguished, which comparison retains a usable</w:t>
+      </w:r>
+      <w:r>
+        <w:t xml:space="preserve"> </w:t>
+      </w:r>
+      <w:r>
+        <w:t xml:space="preserve">signal of pre-crash deterioration?</w:t>
+      </w:r>
+    </w:p>
+    <w:p>
+      <w:pPr>
+        <w:pStyle w:val="BodyText"/>
+      </w:pPr>
+      <w:r>
+        <w:rPr>
+          <w:b/>
+          <w:bCs/>
+        </w:rPr>
+        <w:t xml:space="preserve">Q4</w:t>
+      </w:r>
+      <w:r>
+        <w:t xml:space="preserve"> </w:t>
+      </w:r>
+      <w:r>
+        <w:t xml:space="preserve">Do expert diagnoses agree with uploader labels, and do automatic diagnostic checks find the faults experts</w:t>
+      </w:r>
+      <w:r>
+        <w:t xml:space="preserve"> </w:t>
+      </w:r>
+      <w:r>
+        <w:t xml:space="preserve">name without benefiting from the crash window?</w:t>
+      </w:r>
+    </w:p>
+    <w:p>
+      <w:pPr>
+        <w:pStyle w:val="BodyText"/>
+      </w:pPr>
+      <w:r>
+        <w:t xml:space="preserve">Because language-model assistants are now proposed for exactly this task, we also report a controlled evaluation of</w:t>
+      </w:r>
+      <w:r>
+        <w:t xml:space="preserve"> </w:t>
+      </w:r>
+      <w:r>
+        <w:t xml:space="preserve">small local models used as an attribution review panel, including a test for voting-consensus manipulation.</w:t>
+      </w:r>
+    </w:p>
+    <w:p>
+      <w:pPr>
+        <w:pStyle w:val="BodyText"/>
+      </w:pPr>
+      <w:r>
+        <w:t xml:space="preserve">The contributions are as follows.</w:t>
+      </w:r>
+      <w:r>
+        <w:t xml:space="preserve"> </w:t>
+      </w:r>
+      <w:r>
+        <w:t xml:space="preserve">(i) </w:t>
+      </w:r>
+      <m:oMath>
+        <m:sSup>
+          <m:e>
+            <m:r>
+              <m:t>​</m:t>
+            </m:r>
+          </m:e>
+          <m:sup>
+            <m:r>
+              <m:rPr>
+                <m:sty m:val="p"/>
+              </m:rPr>
+              <m:t>†</m:t>
+            </m:r>
+          </m:sup>
+        </m:sSup>
+      </m:oMath>
+      <w:r>
         <w:t xml:space="preserve">A factorial optimism audit that splits the apparent crash-vs-normal AUC across five evaluation choices (crash set, comparison flights, crash-window cut, fold grouping, window length; 32 settings, one feature extractor, exact Shapley split). Of a 0.21 [0.06, 0.34] drop from the most optimistic to the most conservative other-aircraft setting (0.88 to 0.67), only vehicle-grouped folds contributed materially (0.06 [0.03, 0.09]); the crash set and the choice of normal flights each carried 0.06–0.07 with intervals spanning zero, so the cause of the remaining drop is not isolated. Separation against other aircraft persisted at 0.67; comparing each drone with its own earlier flights brought it to chance. Within-drone evaluation finds no detectable precursor signal under uncalipered matching in this cohort (Group-CV AUC 0.569, 95% cluster bootstrap CI [0.500, 0.643], pairwise mean AUC 0.592 [0.516, 0.692], rank test</w:t>
       </w:r>
       <w:r>
@@ -1081,7 +1103,7 @@
         <w:t xml:space="preserve"> </w:t>
       </w:r>
       <w:r>
-        <w:t xml:space="preserve">to</w:t>
+        <w:t xml:space="preserve">(95% paired cluster bootstrap CI [+0.028, +0.205] on 36 airframes) and</w:t>
       </w:r>
       <w:r>
         <w:t xml:space="preserve"> </w:t>
@@ -1094,14 +1116,14 @@
           <m:t>+</m:t>
         </m:r>
         <m:r>
-          <m:t>0.125</m:t>
-        </m:r>
-      </m:oMath>
-      <w:r>
-        <w:t xml:space="preserve"> </w:t>
-      </w:r>
-      <w:r>
-        <w:t xml:space="preserve">(95% paired cluster bootstrap CI [+0.074, +0.238] on 36 airframes); a fixed 30 s window did not reproduce this lift, so it may reflect duration itself rather than masked precursors.</w:t>
+          <m:t>0.077</m:t>
+        </m:r>
+      </m:oMath>
+      <w:r>
+        <w:t xml:space="preserve"> </w:t>
+      </w:r>
+      <w:r>
+        <w:t xml:space="preserve">[+0.013, +0.204] without the clipping, tilt and voltage-sag features, so the lift is not carried only by duration-linked features; a fixed 30 s window did not reproduce it, and within-drone AUC stays at 0.57–0.64.</w:t>
       </w:r>
       <w:r>
         <w:t xml:space="preserve"> </w:t>
@@ -1274,7 +1296,47 @@
         </m:r>
       </m:oMath>
       <w:r>
-        <w:t xml:space="preserve"> s (upper bounds near 0.73 occur only when terminal tumble telemetry is retained, dropping to 0.524 under 10 s leakage control). Furthermore, apparent diagnostic check accuracy</w:t>
+        <w:t xml:space="preserve"> s (the intervals at</w:t>
+      </w:r>
+      <w:r>
+        <w:t xml:space="preserve"> </w:t>
+      </w:r>
+      <m:oMath>
+        <m:r>
+          <m:t>m</m:t>
+        </m:r>
+        <m:r>
+          <m:rPr>
+            <m:sty m:val="p"/>
+          </m:rPr>
+          <m:t>=</m:t>
+        </m:r>
+        <m:r>
+          <m:t>0</m:t>
+        </m:r>
+      </m:oMath>
+      <w:r>
+        <w:t xml:space="preserve">–5 s overlap, so their differences are sampling noise; upper bounds at</w:t>
+      </w:r>
+      <w:r>
+        <w:t xml:space="preserve"> </w:t>
+      </w:r>
+      <m:oMath>
+        <m:r>
+          <m:t>m</m:t>
+        </m:r>
+        <m:r>
+          <m:rPr>
+            <m:sty m:val="p"/>
+          </m:rPr>
+          <m:t>≥</m:t>
+        </m:r>
+        <m:r>
+          <m:t>10</m:t>
+        </m:r>
+      </m:oMath>
+      <w:r>
+        <w:t xml:space="preserve"> s are 0.519–0.604, giving no evidence of non-linear separation, though not ruling it out). Furthermore, apparent diagnostic check accuracy</w:t>
       </w:r>
       <w:r>
         <w:t xml:space="preserve"> </w:t>
@@ -5125,7 +5187,7 @@
         <w:pStyle w:val="TableCaption"/>
       </w:pPr>
       <w:r>
-        <w:t xml:space="preserve">Table 4. Pre-declared confirmatory protocol registration schedule and version control provenance. All commits occurred prior to execution of the governed analysis. Commit timestamps reflect author-controlled local git records (IST) prior to Software Heritage archival.</w:t>
+        <w:t xml:space="preserve">Table 4. Declaration and results commits for each test (IST, from the git history; author-controlled until archived). Each test was run between its declaration commit and the commit that first added its result file, so the run time is bounded by those two times. Tests sharing a script share its declaration (for example, the clipping and manual-mode sign tests are in the Q2 rule script; within- and between-drone tracking are in the Q3b and Q3c scripts).</w:t>
       </w:r>
     </w:p>
     <w:tbl>
@@ -5133,7 +5195,7 @@
         <w:tblStyle w:val="Table"/>
         <w:tblW w:type="pct" w:w="5000"/>
         <w:tblLook w:firstRow="1" w:lastRow="0" w:firstColumn="0" w:lastColumn="0" w:noHBand="0" w:noVBand="0" w:val="0020"/>
-        <w:tblCaption w:val="Table 4. Pre-declared confirmatory protocol registration schedule and version control provenance. All commits occurred prior to execution of the governed analysis. Commit timestamps reflect author-controlled local git records (IST) prior to Software Heritage archival."/>
+        <w:tblCaption w:val="Table 4. Declaration and results commits for each test (IST, from the git history; author-controlled until archived). Each test was run between its declaration commit and the commit that first added its result file, so the run time is bounded by those two times. Tests sharing a script share its declaration (for example, the clipping and manual-mode sign tests are in the Q2 rule script; within- and between-drone tracking are in the Q3b and Q3c scripts)."/>
         <w:tblBorders>
           <w:top w:val="single" w:sz="4" w:color="808080"/>
           <w:left w:val="single" w:sz="4" w:color="808080"/>
@@ -5144,12 +5206,11 @@
         </w:tblBorders>
       </w:tblPr>
       <w:tblGrid>
-        <w:gridCol w:w="1320"/>
-        <w:gridCol w:w="1320"/>
-        <w:gridCol w:w="1320"/>
-        <w:gridCol w:w="1320"/>
-        <w:gridCol w:w="1320"/>
-        <w:gridCol w:w="1320"/>
+        <w:gridCol w:w="1584"/>
+        <w:gridCol w:w="1584"/>
+        <w:gridCol w:w="1584"/>
+        <w:gridCol w:w="1584"/>
+        <w:gridCol w:w="1584"/>
       </w:tblGrid>
       <w:tr>
         <w:trPr>
@@ -5183,65 +5244,49 @@
               <w:rPr>
                 <w:sz w:val="19"/>
               </w:rPr>
-              <w:t xml:space="preserve">Focus / Hypothesis</w:t>
-            </w:r>
-          </w:p>
-        </w:tc>
-        <w:tc>
-          <w:tcPr/>
-          <w:p>
-            <w:pPr>
-              <w:pStyle w:val="Compact"/>
-              <w:spacing w:line="240" w:lineRule="auto"/>
-              <w:jc w:val="center"/>
-            </w:pPr>
-            <w:r>
-              <w:rPr>
-                <w:sz w:val="19"/>
-              </w:rPr>
-              <w:t xml:space="preserve">Commit</w:t>
-            </w:r>
-          </w:p>
-        </w:tc>
-        <w:tc>
-          <w:tcPr/>
-          <w:p>
-            <w:pPr>
-              <w:pStyle w:val="Compact"/>
-              <w:spacing w:line="240" w:lineRule="auto"/>
-              <w:jc w:val="center"/>
-            </w:pPr>
-            <w:r>
-              <w:rPr>
-                <w:sz w:val="19"/>
-              </w:rPr>
-              <w:t xml:space="preserve">Commit date</w:t>
-            </w:r>
-          </w:p>
-        </w:tc>
-        <w:tc>
-          <w:tcPr/>
-          <w:p>
-            <w:pPr>
-              <w:pStyle w:val="Compact"/>
-              <w:spacing w:line="240" w:lineRule="auto"/>
-              <w:jc w:val="center"/>
-            </w:pPr>
-            <w:r>
-              <w:rPr>
-                <w:sz w:val="19"/>
-              </w:rPr>
-              <w:t xml:space="preserve">Run date</w:t>
-            </w:r>
-          </w:p>
-        </w:tc>
-        <w:tc>
-          <w:tcPr/>
-          <w:p>
-            <w:pPr>
-              <w:pStyle w:val="Compact"/>
-              <w:spacing w:line="240" w:lineRule="auto"/>
-              <w:jc w:val="center"/>
+              <w:t xml:space="preserve">Focus (script)</w:t>
+            </w:r>
+          </w:p>
+        </w:tc>
+        <w:tc>
+          <w:tcPr/>
+          <w:p>
+            <w:pPr>
+              <w:pStyle w:val="Compact"/>
+              <w:spacing w:line="240" w:lineRule="auto"/>
+              <w:jc w:val="left"/>
+            </w:pPr>
+            <w:r>
+              <w:rPr>
+                <w:sz w:val="19"/>
+              </w:rPr>
+              <w:t xml:space="preserve">Declared</w:t>
+            </w:r>
+          </w:p>
+        </w:tc>
+        <w:tc>
+          <w:tcPr/>
+          <w:p>
+            <w:pPr>
+              <w:pStyle w:val="Compact"/>
+              <w:spacing w:line="240" w:lineRule="auto"/>
+              <w:jc w:val="left"/>
+            </w:pPr>
+            <w:r>
+              <w:rPr>
+                <w:sz w:val="19"/>
+              </w:rPr>
+              <w:t xml:space="preserve">Results committed</w:t>
+            </w:r>
+          </w:p>
+        </w:tc>
+        <w:tc>
+          <w:tcPr/>
+          <w:p>
+            <w:pPr>
+              <w:pStyle w:val="Compact"/>
+              <w:spacing w:line="240" w:lineRule="auto"/>
+              <w:jc w:val="left"/>
             </w:pPr>
             <w:r>
               <w:rPr>
@@ -5281,72 +5326,67 @@
               <w:rPr>
                 <w:sz w:val="19"/>
               </w:rPr>
-              <w:t xml:space="preserve">Protections disabled (Fisher exact)</w:t>
-            </w:r>
-          </w:p>
-        </w:tc>
-        <w:tc>
-          <w:tcPr/>
-          <w:p>
-            <w:pPr>
-              <w:pStyle w:val="Compact"/>
-              <w:spacing w:line="240" w:lineRule="auto"/>
-              <w:jc w:val="center"/>
-            </w:pPr>
+              <w:t xml:space="preserve">Protections disabled, Fisher exact (</w:t>
+            </w:r>
             <w:r>
               <w:rPr>
                 <w:rStyle w:val="VerbatimChar"/>
                 <w:sz w:val="19"/>
               </w:rPr>
-              <w:t xml:space="preserve">63bc72e</w:t>
-            </w:r>
-          </w:p>
-        </w:tc>
-        <w:tc>
-          <w:tcPr/>
-          <w:p>
-            <w:pPr>
-              <w:pStyle w:val="Compact"/>
-              <w:spacing w:line="240" w:lineRule="auto"/>
-              <w:jc w:val="center"/>
-            </w:pPr>
-            <w:r>
-              <w:rPr>
-                <w:sz w:val="19"/>
-              </w:rPr>
-              <w:t xml:space="preserve">2026-10-20</w:t>
-            </w:r>
-          </w:p>
-        </w:tc>
-        <w:tc>
-          <w:tcPr/>
-          <w:p>
-            <w:pPr>
-              <w:pStyle w:val="Compact"/>
-              <w:spacing w:line="240" w:lineRule="auto"/>
-              <w:jc w:val="center"/>
-            </w:pPr>
-            <w:r>
-              <w:rPr>
-                <w:sz w:val="19"/>
-              </w:rPr>
-              <w:t xml:space="preserve">2026-10-20</w:t>
-            </w:r>
-          </w:p>
-        </w:tc>
-        <w:tc>
-          <w:tcPr/>
-          <w:p>
-            <w:pPr>
-              <w:pStyle w:val="Compact"/>
-              <w:spacing w:line="240" w:lineRule="auto"/>
-              <w:jc w:val="center"/>
-            </w:pPr>
-            <w:r>
-              <w:rPr>
-                <w:sz w:val="19"/>
-              </w:rPr>
-              <w:t xml:space="preserve">Confirmatory</w:t>
+              <w:t xml:space="preserve">analyze.py</w:t>
+            </w:r>
+            <w:r>
+              <w:rPr>
+                <w:sz w:val="19"/>
+              </w:rPr>
+              <w:t xml:space="preserve">)</w:t>
+            </w:r>
+          </w:p>
+        </w:tc>
+        <w:tc>
+          <w:tcPr>
+            <w:gridSpan w:val="2"/>
+          </w:tcPr>
+          <w:p>
+            <w:pPr>
+              <w:pStyle w:val="Compact"/>
+              <w:spacing w:line="240" w:lineRule="auto"/>
+              <w:jc w:val="left"/>
+            </w:pPr>
+            <w:r>
+              <w:rPr>
+                <w:rStyle w:val="VerbatimChar"/>
+                <w:sz w:val="19"/>
+              </w:rPr>
+              <w:t xml:space="preserve">d755cca</w:t>
+            </w:r>
+            <w:r>
+              <w:rPr>
+                <w:sz w:val="19"/>
+              </w:rPr>
+              <w:t xml:space="preserve"> </w:t>
+            </w:r>
+            <w:r>
+              <w:rPr>
+                <w:sz w:val="19"/>
+              </w:rPr>
+              <w:t xml:space="preserve">20 Oct 17:23:31 (code and result together)</w:t>
+            </w:r>
+          </w:p>
+        </w:tc>
+        <w:tc>
+          <w:tcPr/>
+          <w:p>
+            <w:pPr>
+              <w:pStyle w:val="Compact"/>
+              <w:spacing w:line="240" w:lineRule="auto"/>
+              <w:jc w:val="left"/>
+            </w:pPr>
+            <w:r>
+              <w:rPr>
+                <w:sz w:val="19"/>
+              </w:rPr>
+              <w:t xml:space="preserve">First pass, not declared before running</w:t>
             </w:r>
           </w:p>
         </w:tc>
@@ -5364,23 +5404,53 @@
               <w:rPr>
                 <w:sz w:val="19"/>
               </w:rPr>
-              <w:t xml:space="preserve">Q2 (dev)</w:t>
-            </w:r>
-          </w:p>
-        </w:tc>
-        <w:tc>
-          <w:tcPr/>
-          <w:p>
-            <w:pPr>
-              <w:pStyle w:val="Compact"/>
-              <w:spacing w:line="240" w:lineRule="auto"/>
-              <w:jc w:val="left"/>
-            </w:pPr>
-            <w:r>
-              <w:rPr>
-                <w:sz w:val="19"/>
-              </w:rPr>
-              <w:t xml:space="preserve">Fixed attribution rule (BA</w:t>
+              <w:t xml:space="preserve">Q2 dev</w:t>
+            </w:r>
+          </w:p>
+        </w:tc>
+        <w:tc>
+          <w:tcPr/>
+          <w:p>
+            <w:pPr>
+              <w:pStyle w:val="Compact"/>
+              <w:spacing w:line="240" w:lineRule="auto"/>
+              <w:jc w:val="left"/>
+            </w:pPr>
+            <w:r>
+              <w:rPr>
+                <w:sz w:val="19"/>
+              </w:rPr>
+              <w:t xml:space="preserve">Attribution rule, clipping and manual-mode signs (</w:t>
+            </w:r>
+            <w:r>
+              <w:rPr>
+                <w:rStyle w:val="VerbatimChar"/>
+                <w:sz w:val="19"/>
+              </w:rPr>
+              <w:t xml:space="preserve">pilot_vs_drone.py</w:t>
+            </w:r>
+            <w:r>
+              <w:rPr>
+                <w:sz w:val="19"/>
+              </w:rPr>
+              <w:t xml:space="preserve">)</w:t>
+            </w:r>
+          </w:p>
+        </w:tc>
+        <w:tc>
+          <w:tcPr/>
+          <w:p>
+            <w:pPr>
+              <w:pStyle w:val="Compact"/>
+              <w:spacing w:line="240" w:lineRule="auto"/>
+              <w:jc w:val="left"/>
+            </w:pPr>
+            <w:r>
+              <w:rPr>
+                <w:rStyle w:val="VerbatimChar"/>
+                <w:sz w:val="19"/>
+              </w:rPr>
+              <w:t xml:space="preserve">63bc72e</w:t>
             </w:r>
             <w:r>
               <w:rPr>
@@ -5388,81 +5458,50 @@
               </w:rPr>
               <w:t xml:space="preserve"> </w:t>
             </w:r>
-            <m:oMath>
-              <m:r>
-                <m:rPr>
-                  <m:sty m:val="p"/>
-                </m:rPr>
-                <m:t>≥</m:t>
-              </m:r>
-              <m:r>
-                <m:t>0.70</m:t>
-              </m:r>
-            </m:oMath>
-            <w:r>
-              <w:rPr>
-                <w:sz w:val="19"/>
-              </w:rPr>
-              <w:t xml:space="preserve">)</w:t>
-            </w:r>
-          </w:p>
-        </w:tc>
-        <w:tc>
-          <w:tcPr/>
-          <w:p>
-            <w:pPr>
-              <w:pStyle w:val="Compact"/>
-              <w:spacing w:line="240" w:lineRule="auto"/>
-              <w:jc w:val="center"/>
+            <w:r>
+              <w:rPr>
+                <w:sz w:val="19"/>
+              </w:rPr>
+              <w:t xml:space="preserve">20 Oct 17:25:49</w:t>
+            </w:r>
+          </w:p>
+        </w:tc>
+        <w:tc>
+          <w:tcPr/>
+          <w:p>
+            <w:pPr>
+              <w:pStyle w:val="Compact"/>
+              <w:spacing w:line="240" w:lineRule="auto"/>
+              <w:jc w:val="left"/>
             </w:pPr>
             <w:r>
               <w:rPr>
                 <w:rStyle w:val="VerbatimChar"/>
                 <w:sz w:val="19"/>
               </w:rPr>
-              <w:t xml:space="preserve">af6fab2</w:t>
-            </w:r>
-          </w:p>
-        </w:tc>
-        <w:tc>
-          <w:tcPr/>
-          <w:p>
-            <w:pPr>
-              <w:pStyle w:val="Compact"/>
-              <w:spacing w:line="240" w:lineRule="auto"/>
-              <w:jc w:val="center"/>
-            </w:pPr>
-            <w:r>
-              <w:rPr>
-                <w:sz w:val="19"/>
-              </w:rPr>
-              <w:t xml:space="preserve">2026-10-20</w:t>
-            </w:r>
-          </w:p>
-        </w:tc>
-        <w:tc>
-          <w:tcPr/>
-          <w:p>
-            <w:pPr>
-              <w:pStyle w:val="Compact"/>
-              <w:spacing w:line="240" w:lineRule="auto"/>
-              <w:jc w:val="center"/>
-            </w:pPr>
-            <w:r>
-              <w:rPr>
-                <w:sz w:val="19"/>
-              </w:rPr>
-              <w:t xml:space="preserve">2026-10-20</w:t>
-            </w:r>
-          </w:p>
-        </w:tc>
-        <w:tc>
-          <w:tcPr/>
-          <w:p>
-            <w:pPr>
-              <w:pStyle w:val="Compact"/>
-              <w:spacing w:line="240" w:lineRule="auto"/>
-              <w:jc w:val="center"/>
+              <w:t xml:space="preserve">19a9318</w:t>
+            </w:r>
+            <w:r>
+              <w:rPr>
+                <w:sz w:val="19"/>
+              </w:rPr>
+              <w:t xml:space="preserve"> </w:t>
+            </w:r>
+            <w:r>
+              <w:rPr>
+                <w:sz w:val="19"/>
+              </w:rPr>
+              <w:t xml:space="preserve">17:26:57</w:t>
+            </w:r>
+          </w:p>
+        </w:tc>
+        <w:tc>
+          <w:tcPr/>
+          <w:p>
+            <w:pPr>
+              <w:pStyle w:val="Compact"/>
+              <w:spacing w:line="240" w:lineRule="auto"/>
+              <w:jc w:val="left"/>
             </w:pPr>
             <w:r>
               <w:rPr>
@@ -5486,23 +5525,53 @@
               <w:rPr>
                 <w:sz w:val="19"/>
               </w:rPr>
-              <w:t xml:space="preserve">Q2 (held)</w:t>
-            </w:r>
-          </w:p>
-        </w:tc>
-        <w:tc>
-          <w:tcPr/>
-          <w:p>
-            <w:pPr>
-              <w:pStyle w:val="Compact"/>
-              <w:spacing w:line="240" w:lineRule="auto"/>
-              <w:jc w:val="left"/>
-            </w:pPr>
-            <w:r>
-              <w:rPr>
-                <w:sz w:val="19"/>
-              </w:rPr>
-              <w:t xml:space="preserve">Held-out rule replication (BA</w:t>
+              <w:t xml:space="preserve">Q2 held</w:t>
+            </w:r>
+          </w:p>
+        </w:tc>
+        <w:tc>
+          <w:tcPr/>
+          <w:p>
+            <w:pPr>
+              <w:pStyle w:val="Compact"/>
+              <w:spacing w:line="240" w:lineRule="auto"/>
+              <w:jc w:val="left"/>
+            </w:pPr>
+            <w:r>
+              <w:rPr>
+                <w:sz w:val="19"/>
+              </w:rPr>
+              <w:t xml:space="preserve">Held-out rule replication (</w:t>
+            </w:r>
+            <w:r>
+              <w:rPr>
+                <w:rStyle w:val="VerbatimChar"/>
+                <w:sz w:val="19"/>
+              </w:rPr>
+              <w:t xml:space="preserve">holdout_test.py</w:t>
+            </w:r>
+            <w:r>
+              <w:rPr>
+                <w:sz w:val="19"/>
+              </w:rPr>
+              <w:t xml:space="preserve">)</w:t>
+            </w:r>
+          </w:p>
+        </w:tc>
+        <w:tc>
+          <w:tcPr/>
+          <w:p>
+            <w:pPr>
+              <w:pStyle w:val="Compact"/>
+              <w:spacing w:line="240" w:lineRule="auto"/>
+              <w:jc w:val="left"/>
+            </w:pPr>
+            <w:r>
+              <w:rPr>
+                <w:rStyle w:val="VerbatimChar"/>
+                <w:sz w:val="19"/>
+              </w:rPr>
+              <w:t xml:space="preserve">af6fab2</w:t>
             </w:r>
             <w:r>
               <w:rPr>
@@ -5510,81 +5579,50 @@
               </w:rPr>
               <w:t xml:space="preserve"> </w:t>
             </w:r>
-            <m:oMath>
-              <m:r>
-                <m:rPr>
-                  <m:sty m:val="p"/>
-                </m:rPr>
-                <m:t>≥</m:t>
-              </m:r>
-              <m:r>
-                <m:t>0.70</m:t>
-              </m:r>
-            </m:oMath>
-            <w:r>
-              <w:rPr>
-                <w:sz w:val="19"/>
-              </w:rPr>
-              <w:t xml:space="preserve">)</w:t>
-            </w:r>
-          </w:p>
-        </w:tc>
-        <w:tc>
-          <w:tcPr/>
-          <w:p>
-            <w:pPr>
-              <w:pStyle w:val="Compact"/>
-              <w:spacing w:line="240" w:lineRule="auto"/>
-              <w:jc w:val="center"/>
+            <w:r>
+              <w:rPr>
+                <w:sz w:val="19"/>
+              </w:rPr>
+              <w:t xml:space="preserve">20 Oct 17:28:42</w:t>
+            </w:r>
+          </w:p>
+        </w:tc>
+        <w:tc>
+          <w:tcPr/>
+          <w:p>
+            <w:pPr>
+              <w:pStyle w:val="Compact"/>
+              <w:spacing w:line="240" w:lineRule="auto"/>
+              <w:jc w:val="left"/>
             </w:pPr>
             <w:r>
               <w:rPr>
                 <w:rStyle w:val="VerbatimChar"/>
                 <w:sz w:val="19"/>
               </w:rPr>
-              <w:t xml:space="preserve">4475c8c</w:t>
-            </w:r>
-          </w:p>
-        </w:tc>
-        <w:tc>
-          <w:tcPr/>
-          <w:p>
-            <w:pPr>
-              <w:pStyle w:val="Compact"/>
-              <w:spacing w:line="240" w:lineRule="auto"/>
-              <w:jc w:val="center"/>
-            </w:pPr>
-            <w:r>
-              <w:rPr>
-                <w:sz w:val="19"/>
-              </w:rPr>
-              <w:t xml:space="preserve">2026-10-20</w:t>
-            </w:r>
-          </w:p>
-        </w:tc>
-        <w:tc>
-          <w:tcPr/>
-          <w:p>
-            <w:pPr>
-              <w:pStyle w:val="Compact"/>
-              <w:spacing w:line="240" w:lineRule="auto"/>
-              <w:jc w:val="center"/>
-            </w:pPr>
-            <w:r>
-              <w:rPr>
-                <w:sz w:val="19"/>
-              </w:rPr>
-              <w:t xml:space="preserve">2026-10-20</w:t>
-            </w:r>
-          </w:p>
-        </w:tc>
-        <w:tc>
-          <w:tcPr/>
-          <w:p>
-            <w:pPr>
-              <w:pStyle w:val="Compact"/>
-              <w:spacing w:line="240" w:lineRule="auto"/>
-              <w:jc w:val="center"/>
+              <w:t xml:space="preserve">da92ec3</w:t>
+            </w:r>
+            <w:r>
+              <w:rPr>
+                <w:sz w:val="19"/>
+              </w:rPr>
+              <w:t xml:space="preserve"> </w:t>
+            </w:r>
+            <w:r>
+              <w:rPr>
+                <w:sz w:val="19"/>
+              </w:rPr>
+              <w:t xml:space="preserve">17:40:02</w:t>
+            </w:r>
+          </w:p>
+        </w:tc>
+        <w:tc>
+          <w:tcPr/>
+          <w:p>
+            <w:pPr>
+              <w:pStyle w:val="Compact"/>
+              <w:spacing w:line="240" w:lineRule="auto"/>
+              <w:jc w:val="left"/>
             </w:pPr>
             <w:r>
               <w:rPr>
@@ -5608,7 +5646,13 @@
               <w:rPr>
                 <w:sz w:val="19"/>
               </w:rPr>
-              <w:t xml:space="preserve">Q4 (</w:t>
+              <w:t xml:space="preserve">Q4,</w:t>
+            </w:r>
+            <w:r>
+              <w:rPr>
+                <w:sz w:val="19"/>
+              </w:rPr>
+              <w:t xml:space="preserve"> </w:t>
             </w:r>
             <m:oMath>
               <m:r>
@@ -5624,6 +5668,29 @@
                 <m:t>0</m:t>
               </m:r>
             </m:oMath>
+          </w:p>
+        </w:tc>
+        <w:tc>
+          <w:tcPr/>
+          <w:p>
+            <w:pPr>
+              <w:pStyle w:val="Compact"/>
+              <w:spacing w:line="240" w:lineRule="auto"/>
+              <w:jc w:val="left"/>
+            </w:pPr>
+            <w:r>
+              <w:rPr>
+                <w:sz w:val="19"/>
+              </w:rPr>
+              <w:t xml:space="preserve">Expert fault checks (</w:t>
+            </w:r>
+            <w:r>
+              <w:rPr>
+                <w:rStyle w:val="VerbatimChar"/>
+                <w:sz w:val="19"/>
+              </w:rPr>
+              <w:t xml:space="preserve">test_flight_check.py</w:t>
+            </w:r>
             <w:r>
               <w:rPr>
                 <w:sz w:val="19"/>
@@ -5642,68 +5709,61 @@
             </w:pPr>
             <w:r>
               <w:rPr>
-                <w:sz w:val="19"/>
-              </w:rPr>
-              <w:t xml:space="preserve">Expert fault checks on full window</w:t>
-            </w:r>
-          </w:p>
-        </w:tc>
-        <w:tc>
-          <w:tcPr/>
-          <w:p>
-            <w:pPr>
-              <w:pStyle w:val="Compact"/>
-              <w:spacing w:line="240" w:lineRule="auto"/>
-              <w:jc w:val="center"/>
-            </w:pPr>
-            <w:r>
-              <w:rPr>
                 <w:rStyle w:val="VerbatimChar"/>
                 <w:sz w:val="19"/>
               </w:rPr>
-              <w:t xml:space="preserve">0c8ee47</w:t>
-            </w:r>
-          </w:p>
-        </w:tc>
-        <w:tc>
-          <w:tcPr/>
-          <w:p>
-            <w:pPr>
-              <w:pStyle w:val="Compact"/>
-              <w:spacing w:line="240" w:lineRule="auto"/>
-              <w:jc w:val="center"/>
-            </w:pPr>
-            <w:r>
-              <w:rPr>
-                <w:sz w:val="19"/>
-              </w:rPr>
-              <w:t xml:space="preserve">2026-10-20</w:t>
-            </w:r>
-          </w:p>
-        </w:tc>
-        <w:tc>
-          <w:tcPr/>
-          <w:p>
-            <w:pPr>
-              <w:pStyle w:val="Compact"/>
-              <w:spacing w:line="240" w:lineRule="auto"/>
-              <w:jc w:val="center"/>
-            </w:pPr>
-            <w:r>
-              <w:rPr>
-                <w:sz w:val="19"/>
-              </w:rPr>
-              <w:t xml:space="preserve">2026-10-20</w:t>
-            </w:r>
-          </w:p>
-        </w:tc>
-        <w:tc>
-          <w:tcPr/>
-          <w:p>
-            <w:pPr>
-              <w:pStyle w:val="Compact"/>
-              <w:spacing w:line="240" w:lineRule="auto"/>
-              <w:jc w:val="center"/>
+              <w:t xml:space="preserve">4475c8c</w:t>
+            </w:r>
+            <w:r>
+              <w:rPr>
+                <w:sz w:val="19"/>
+              </w:rPr>
+              <w:t xml:space="preserve"> </w:t>
+            </w:r>
+            <w:r>
+              <w:rPr>
+                <w:sz w:val="19"/>
+              </w:rPr>
+              <w:t xml:space="preserve">20 Oct 21:39:26</w:t>
+            </w:r>
+          </w:p>
+        </w:tc>
+        <w:tc>
+          <w:tcPr/>
+          <w:p>
+            <w:pPr>
+              <w:pStyle w:val="Compact"/>
+              <w:spacing w:line="240" w:lineRule="auto"/>
+              <w:jc w:val="left"/>
+            </w:pPr>
+            <w:r>
+              <w:rPr>
+                <w:rStyle w:val="VerbatimChar"/>
+                <w:sz w:val="19"/>
+              </w:rPr>
+              <w:t xml:space="preserve">da5038b</w:t>
+            </w:r>
+            <w:r>
+              <w:rPr>
+                <w:sz w:val="19"/>
+              </w:rPr>
+              <w:t xml:space="preserve"> </w:t>
+            </w:r>
+            <w:r>
+              <w:rPr>
+                <w:sz w:val="19"/>
+              </w:rPr>
+              <w:t xml:space="preserve">21:46:47</w:t>
+            </w:r>
+          </w:p>
+        </w:tc>
+        <w:tc>
+          <w:tcPr/>
+          <w:p>
+            <w:pPr>
+              <w:pStyle w:val="Compact"/>
+              <w:spacing w:line="240" w:lineRule="auto"/>
+              <w:jc w:val="left"/>
             </w:pPr>
             <w:r>
               <w:rPr>
@@ -5727,7 +5787,13 @@
               <w:rPr>
                 <w:sz w:val="19"/>
               </w:rPr>
-              <w:t xml:space="preserve">Q4 (</w:t>
+              <w:t xml:space="preserve">Q4,</w:t>
+            </w:r>
+            <w:r>
+              <w:rPr>
+                <w:sz w:val="19"/>
+              </w:rPr>
+              <w:t xml:space="preserve"> </w:t>
             </w:r>
             <m:oMath>
               <m:r>
@@ -5747,23 +5813,40 @@
               <w:rPr>
                 <w:sz w:val="19"/>
               </w:rPr>
-              <w:t xml:space="preserve">)</w:t>
-            </w:r>
-          </w:p>
-        </w:tc>
-        <w:tc>
-          <w:tcPr/>
-          <w:p>
-            <w:pPr>
-              <w:pStyle w:val="Compact"/>
-              <w:spacing w:line="240" w:lineRule="auto"/>
-              <w:jc w:val="left"/>
-            </w:pPr>
-            <w:r>
-              <w:rPr>
-                <w:sz w:val="19"/>
-              </w:rPr>
-              <w:t xml:space="preserve">Expert fault checks at</w:t>
+              <w:t xml:space="preserve"> s</w:t>
+            </w:r>
+          </w:p>
+        </w:tc>
+        <w:tc>
+          <w:tcPr/>
+          <w:p>
+            <w:pPr>
+              <w:pStyle w:val="Compact"/>
+              <w:spacing w:line="240" w:lineRule="auto"/>
+              <w:jc w:val="left"/>
+            </w:pPr>
+            <w:r>
+              <w:rPr>
+                <w:sz w:val="19"/>
+              </w:rPr>
+              <w:t xml:space="preserve">Same checks, last 10 s removed</w:t>
+            </w:r>
+          </w:p>
+        </w:tc>
+        <w:tc>
+          <w:tcPr/>
+          <w:p>
+            <w:pPr>
+              <w:pStyle w:val="Compact"/>
+              <w:spacing w:line="240" w:lineRule="auto"/>
+              <w:jc w:val="left"/>
+            </w:pPr>
+            <w:r>
+              <w:rPr>
+                <w:rStyle w:val="VerbatimChar"/>
+                <w:sz w:val="19"/>
+              </w:rPr>
+              <w:t xml:space="preserve">0c8ee47</w:t>
             </w:r>
             <w:r>
               <w:rPr>
@@ -5771,84 +5854,50 @@
               </w:rPr>
               <w:t xml:space="preserve"> </w:t>
             </w:r>
-            <m:oMath>
-              <m:r>
-                <m:t>m</m:t>
-              </m:r>
-              <m:r>
-                <m:rPr>
-                  <m:sty m:val="p"/>
-                </m:rPr>
-                <m:t>=</m:t>
-              </m:r>
-              <m:r>
-                <m:t>10</m:t>
-              </m:r>
-            </m:oMath>
-            <w:r>
-              <w:rPr>
-                <w:sz w:val="19"/>
-              </w:rPr>
-              <w:t xml:space="preserve"> s</w:t>
-            </w:r>
-          </w:p>
-        </w:tc>
-        <w:tc>
-          <w:tcPr/>
-          <w:p>
-            <w:pPr>
-              <w:pStyle w:val="Compact"/>
-              <w:spacing w:line="240" w:lineRule="auto"/>
-              <w:jc w:val="center"/>
+            <w:r>
+              <w:rPr>
+                <w:sz w:val="19"/>
+              </w:rPr>
+              <w:t xml:space="preserve">20 Oct 21:46:54</w:t>
+            </w:r>
+          </w:p>
+        </w:tc>
+        <w:tc>
+          <w:tcPr/>
+          <w:p>
+            <w:pPr>
+              <w:pStyle w:val="Compact"/>
+              <w:spacing w:line="240" w:lineRule="auto"/>
+              <w:jc w:val="left"/>
             </w:pPr>
             <w:r>
               <w:rPr>
                 <w:rStyle w:val="VerbatimChar"/>
                 <w:sz w:val="19"/>
               </w:rPr>
-              <w:t xml:space="preserve">0c8ee47</w:t>
-            </w:r>
-          </w:p>
-        </w:tc>
-        <w:tc>
-          <w:tcPr/>
-          <w:p>
-            <w:pPr>
-              <w:pStyle w:val="Compact"/>
-              <w:spacing w:line="240" w:lineRule="auto"/>
-              <w:jc w:val="center"/>
-            </w:pPr>
-            <w:r>
-              <w:rPr>
-                <w:sz w:val="19"/>
-              </w:rPr>
-              <w:t xml:space="preserve">2026-10-20</w:t>
-            </w:r>
-          </w:p>
-        </w:tc>
-        <w:tc>
-          <w:tcPr/>
-          <w:p>
-            <w:pPr>
-              <w:pStyle w:val="Compact"/>
-              <w:spacing w:line="240" w:lineRule="auto"/>
-              <w:jc w:val="center"/>
-            </w:pPr>
-            <w:r>
-              <w:rPr>
-                <w:sz w:val="19"/>
-              </w:rPr>
-              <w:t xml:space="preserve">2026-10-20</w:t>
-            </w:r>
-          </w:p>
-        </w:tc>
-        <w:tc>
-          <w:tcPr/>
-          <w:p>
-            <w:pPr>
-              <w:pStyle w:val="Compact"/>
-              <w:spacing w:line="240" w:lineRule="auto"/>
-              <w:jc w:val="center"/>
+              <w:t xml:space="preserve">95d873a</w:t>
+            </w:r>
+            <w:r>
+              <w:rPr>
+                <w:sz w:val="19"/>
+              </w:rPr>
+              <w:t xml:space="preserve"> </w:t>
+            </w:r>
+            <w:r>
+              <w:rPr>
+                <w:sz w:val="19"/>
+              </w:rPr>
+              <w:t xml:space="preserve">21:48:02</w:t>
+            </w:r>
+          </w:p>
+        </w:tc>
+        <w:tc>
+          <w:tcPr/>
+          <w:p>
+            <w:pPr>
+              <w:pStyle w:val="Compact"/>
+              <w:spacing w:line="240" w:lineRule="auto"/>
+              <w:jc w:val="left"/>
             </w:pPr>
             <w:r>
               <w:rPr>
@@ -5888,7 +5937,13 @@
               <w:rPr>
                 <w:sz w:val="19"/>
               </w:rPr>
-              <w:t xml:space="preserve">Crash window leak curve (</w:t>
+              <w:t xml:space="preserve">Leak curve,</w:t>
+            </w:r>
+            <w:r>
+              <w:rPr>
+                <w:sz w:val="19"/>
+              </w:rPr>
+              <w:t xml:space="preserve"> </w:t>
             </w:r>
             <m:oMath>
               <m:r>
@@ -5911,6 +5966,25 @@
               <w:rPr>
                 <w:sz w:val="19"/>
               </w:rPr>
+              <w:t xml:space="preserve"> </w:t>
+            </w:r>
+            <w:r>
+              <w:rPr>
+                <w:sz w:val="19"/>
+              </w:rPr>
+              <w:t xml:space="preserve">(</w:t>
+            </w:r>
+            <w:r>
+              <w:rPr>
+                <w:rStyle w:val="VerbatimChar"/>
+                <w:sz w:val="19"/>
+              </w:rPr>
+              <w:t xml:space="preserve">leak_curve.py</w:t>
+            </w:r>
+            <w:r>
+              <w:rPr>
+                <w:sz w:val="19"/>
+              </w:rPr>
               <w:t xml:space="preserve">)</w:t>
             </w:r>
           </w:p>
@@ -5921,7 +5995,7 @@
             <w:pPr>
               <w:pStyle w:val="Compact"/>
               <w:spacing w:line="240" w:lineRule="auto"/>
-              <w:jc w:val="center"/>
+              <w:jc w:val="left"/>
             </w:pPr>
             <w:r>
               <w:rPr>
@@ -5930,47 +6004,56 @@
               </w:rPr>
               <w:t xml:space="preserve">d5d56c7</w:t>
             </w:r>
-          </w:p>
-        </w:tc>
-        <w:tc>
-          <w:tcPr/>
-          <w:p>
-            <w:pPr>
-              <w:pStyle w:val="Compact"/>
-              <w:spacing w:line="240" w:lineRule="auto"/>
-              <w:jc w:val="center"/>
-            </w:pPr>
-            <w:r>
-              <w:rPr>
-                <w:sz w:val="19"/>
-              </w:rPr>
-              <w:t xml:space="preserve">2026-10-23</w:t>
-            </w:r>
-          </w:p>
-        </w:tc>
-        <w:tc>
-          <w:tcPr/>
-          <w:p>
-            <w:pPr>
-              <w:pStyle w:val="Compact"/>
-              <w:spacing w:line="240" w:lineRule="auto"/>
-              <w:jc w:val="center"/>
-            </w:pPr>
-            <w:r>
-              <w:rPr>
-                <w:sz w:val="19"/>
-              </w:rPr>
-              <w:t xml:space="preserve">2026-10-23</w:t>
-            </w:r>
-          </w:p>
-        </w:tc>
-        <w:tc>
-          <w:tcPr/>
-          <w:p>
-            <w:pPr>
-              <w:pStyle w:val="Compact"/>
-              <w:spacing w:line="240" w:lineRule="auto"/>
-              <w:jc w:val="center"/>
+            <w:r>
+              <w:rPr>
+                <w:sz w:val="19"/>
+              </w:rPr>
+              <w:t xml:space="preserve"> </w:t>
+            </w:r>
+            <w:r>
+              <w:rPr>
+                <w:sz w:val="19"/>
+              </w:rPr>
+              <w:t xml:space="preserve">23 Oct 11:17:11</w:t>
+            </w:r>
+          </w:p>
+        </w:tc>
+        <w:tc>
+          <w:tcPr/>
+          <w:p>
+            <w:pPr>
+              <w:pStyle w:val="Compact"/>
+              <w:spacing w:line="240" w:lineRule="auto"/>
+              <w:jc w:val="left"/>
+            </w:pPr>
+            <w:r>
+              <w:rPr>
+                <w:rStyle w:val="VerbatimChar"/>
+                <w:sz w:val="19"/>
+              </w:rPr>
+              <w:t xml:space="preserve">1ecb4c9</w:t>
+            </w:r>
+            <w:r>
+              <w:rPr>
+                <w:sz w:val="19"/>
+              </w:rPr>
+              <w:t xml:space="preserve"> </w:t>
+            </w:r>
+            <w:r>
+              <w:rPr>
+                <w:sz w:val="19"/>
+              </w:rPr>
+              <w:t xml:space="preserve">11:19:07</w:t>
+            </w:r>
+          </w:p>
+        </w:tc>
+        <w:tc>
+          <w:tcPr/>
+          <w:p>
+            <w:pPr>
+              <w:pStyle w:val="Compact"/>
+              <w:spacing w:line="240" w:lineRule="auto"/>
+              <w:jc w:val="left"/>
             </w:pPr>
             <w:r>
               <w:rPr>
@@ -6010,29 +6093,15 @@
               <w:rPr>
                 <w:sz w:val="19"/>
               </w:rPr>
-              <w:t xml:space="preserve">Within-drone rank test (</w:t>
-            </w:r>
-            <m:oMath>
-              <m:acc>
-                <m:accPr>
-                  <m:chr m:val="‾"/>
-                </m:accPr>
-                <m:e>
-                  <m:r>
-                    <m:t>r</m:t>
-                  </m:r>
-                </m:e>
-              </m:acc>
-              <m:r>
-                <m:rPr>
-                  <m:sty m:val="p"/>
-                </m:rPr>
-                <m:t>&gt;</m:t>
-              </m:r>
-              <m:r>
-                <m:t>0.50</m:t>
-              </m:r>
-            </m:oMath>
+              <w:t xml:space="preserve">Within-drone vibration and tracking (</w:t>
+            </w:r>
+            <w:r>
+              <w:rPr>
+                <w:rStyle w:val="VerbatimChar"/>
+                <w:sz w:val="19"/>
+              </w:rPr>
+              <w:t xml:space="preserve">within_drone.py</w:t>
+            </w:r>
             <w:r>
               <w:rPr>
                 <w:sz w:val="19"/>
@@ -6047,7 +6116,7 @@
             <w:pPr>
               <w:pStyle w:val="Compact"/>
               <w:spacing w:line="240" w:lineRule="auto"/>
-              <w:jc w:val="center"/>
+              <w:jc w:val="left"/>
             </w:pPr>
             <w:r>
               <w:rPr>
@@ -6056,53 +6125,87 @@
               </w:rPr>
               <w:t xml:space="preserve">8b417d2</w:t>
             </w:r>
-          </w:p>
-        </w:tc>
-        <w:tc>
-          <w:tcPr/>
-          <w:p>
-            <w:pPr>
-              <w:pStyle w:val="Compact"/>
-              <w:spacing w:line="240" w:lineRule="auto"/>
-              <w:jc w:val="center"/>
-            </w:pPr>
-            <w:r>
-              <w:rPr>
-                <w:sz w:val="19"/>
-              </w:rPr>
-              <w:t xml:space="preserve">2026-10-23</w:t>
-            </w:r>
-          </w:p>
-        </w:tc>
-        <w:tc>
-          <w:tcPr/>
-          <w:p>
-            <w:pPr>
-              <w:pStyle w:val="Compact"/>
-              <w:spacing w:line="240" w:lineRule="auto"/>
-              <w:jc w:val="center"/>
-            </w:pPr>
-            <w:r>
-              <w:rPr>
-                <w:sz w:val="19"/>
-              </w:rPr>
-              <w:t xml:space="preserve">2026-10-23</w:t>
-            </w:r>
-          </w:p>
-        </w:tc>
-        <w:tc>
-          <w:tcPr/>
-          <w:p>
-            <w:pPr>
-              <w:pStyle w:val="Compact"/>
-              <w:spacing w:line="240" w:lineRule="auto"/>
-              <w:jc w:val="center"/>
-            </w:pPr>
-            <w:r>
-              <w:rPr>
-                <w:sz w:val="19"/>
-              </w:rPr>
-              <w:t xml:space="preserve">Confirmatory</w:t>
+            <w:r>
+              <w:rPr>
+                <w:sz w:val="19"/>
+              </w:rPr>
+              <w:t xml:space="preserve"> </w:t>
+            </w:r>
+            <w:r>
+              <w:rPr>
+                <w:sz w:val="19"/>
+              </w:rPr>
+              <w:t xml:space="preserve">23 Oct 11:21:19; amended</w:t>
+            </w:r>
+            <w:r>
+              <w:rPr>
+                <w:sz w:val="19"/>
+              </w:rPr>
+              <w:t xml:space="preserve"> </w:t>
+            </w:r>
+            <w:r>
+              <w:rPr>
+                <w:rStyle w:val="VerbatimChar"/>
+                <w:sz w:val="19"/>
+              </w:rPr>
+              <w:t xml:space="preserve">f911bcf</w:t>
+            </w:r>
+            <w:r>
+              <w:rPr>
+                <w:sz w:val="19"/>
+              </w:rPr>
+              <w:t xml:space="preserve"> </w:t>
+            </w:r>
+            <w:r>
+              <w:rPr>
+                <w:sz w:val="19"/>
+              </w:rPr>
+              <w:t xml:space="preserve">11:22:21</w:t>
+            </w:r>
+          </w:p>
+        </w:tc>
+        <w:tc>
+          <w:tcPr/>
+          <w:p>
+            <w:pPr>
+              <w:pStyle w:val="Compact"/>
+              <w:spacing w:line="240" w:lineRule="auto"/>
+              <w:jc w:val="left"/>
+            </w:pPr>
+            <w:r>
+              <w:rPr>
+                <w:rStyle w:val="VerbatimChar"/>
+                <w:sz w:val="19"/>
+              </w:rPr>
+              <w:t xml:space="preserve">c9ebca4</w:t>
+            </w:r>
+            <w:r>
+              <w:rPr>
+                <w:sz w:val="19"/>
+              </w:rPr>
+              <w:t xml:space="preserve"> </w:t>
+            </w:r>
+            <w:r>
+              <w:rPr>
+                <w:sz w:val="19"/>
+              </w:rPr>
+              <w:t xml:space="preserve">12:19:44</w:t>
+            </w:r>
+          </w:p>
+        </w:tc>
+        <w:tc>
+          <w:tcPr/>
+          <w:p>
+            <w:pPr>
+              <w:pStyle w:val="Compact"/>
+              <w:spacing w:line="240" w:lineRule="auto"/>
+              <w:jc w:val="left"/>
+            </w:pPr>
+            <w:r>
+              <w:rPr>
+                <w:sz w:val="19"/>
+              </w:rPr>
+              <w:t xml:space="preserve">Confirmatory (amended before download)</w:t>
             </w:r>
           </w:p>
         </w:tc>
@@ -6136,29 +6239,15 @@
               <w:rPr>
                 <w:sz w:val="19"/>
               </w:rPr>
-              <w:t xml:space="preserve">Between-drone rank test (</w:t>
-            </w:r>
-            <m:oMath>
-              <m:acc>
-                <m:accPr>
-                  <m:chr m:val="‾"/>
-                </m:accPr>
-                <m:e>
-                  <m:r>
-                    <m:t>r</m:t>
-                  </m:r>
-                </m:e>
-              </m:acc>
-              <m:r>
-                <m:rPr>
-                  <m:sty m:val="p"/>
-                </m:rPr>
-                <m:t>&gt;</m:t>
-              </m:r>
-              <m:r>
-                <m:t>0.50</m:t>
-              </m:r>
-            </m:oMath>
+              <w:t xml:space="preserve">Between-drone vibration and tracking (</w:t>
+            </w:r>
+            <w:r>
+              <w:rPr>
+                <w:rStyle w:val="VerbatimChar"/>
+                <w:sz w:val="19"/>
+              </w:rPr>
+              <w:t xml:space="preserve">rough_drone_test.py</w:t>
+            </w:r>
             <w:r>
               <w:rPr>
                 <w:sz w:val="19"/>
@@ -6173,7 +6262,7 @@
             <w:pPr>
               <w:pStyle w:val="Compact"/>
               <w:spacing w:line="240" w:lineRule="auto"/>
-              <w:jc w:val="center"/>
+              <w:jc w:val="left"/>
             </w:pPr>
             <w:r>
               <w:rPr>
@@ -6182,47 +6271,56 @@
               </w:rPr>
               <w:t xml:space="preserve">d7a6574</w:t>
             </w:r>
-          </w:p>
-        </w:tc>
-        <w:tc>
-          <w:tcPr/>
-          <w:p>
-            <w:pPr>
-              <w:pStyle w:val="Compact"/>
-              <w:spacing w:line="240" w:lineRule="auto"/>
-              <w:jc w:val="center"/>
-            </w:pPr>
-            <w:r>
-              <w:rPr>
-                <w:sz w:val="19"/>
-              </w:rPr>
-              <w:t xml:space="preserve">2026-10-23</w:t>
-            </w:r>
-          </w:p>
-        </w:tc>
-        <w:tc>
-          <w:tcPr/>
-          <w:p>
-            <w:pPr>
-              <w:pStyle w:val="Compact"/>
-              <w:spacing w:line="240" w:lineRule="auto"/>
-              <w:jc w:val="center"/>
-            </w:pPr>
-            <w:r>
-              <w:rPr>
-                <w:sz w:val="19"/>
-              </w:rPr>
-              <w:t xml:space="preserve">2026-10-23</w:t>
-            </w:r>
-          </w:p>
-        </w:tc>
-        <w:tc>
-          <w:tcPr/>
-          <w:p>
-            <w:pPr>
-              <w:pStyle w:val="Compact"/>
-              <w:spacing w:line="240" w:lineRule="auto"/>
-              <w:jc w:val="center"/>
+            <w:r>
+              <w:rPr>
+                <w:sz w:val="19"/>
+              </w:rPr>
+              <w:t xml:space="preserve"> </w:t>
+            </w:r>
+            <w:r>
+              <w:rPr>
+                <w:sz w:val="19"/>
+              </w:rPr>
+              <w:t xml:space="preserve">23 Oct 12:30:19</w:t>
+            </w:r>
+          </w:p>
+        </w:tc>
+        <w:tc>
+          <w:tcPr/>
+          <w:p>
+            <w:pPr>
+              <w:pStyle w:val="Compact"/>
+              <w:spacing w:line="240" w:lineRule="auto"/>
+              <w:jc w:val="left"/>
+            </w:pPr>
+            <w:r>
+              <w:rPr>
+                <w:rStyle w:val="VerbatimChar"/>
+                <w:sz w:val="19"/>
+              </w:rPr>
+              <w:t xml:space="preserve">a76babb</w:t>
+            </w:r>
+            <w:r>
+              <w:rPr>
+                <w:sz w:val="19"/>
+              </w:rPr>
+              <w:t xml:space="preserve"> </w:t>
+            </w:r>
+            <w:r>
+              <w:rPr>
+                <w:sz w:val="19"/>
+              </w:rPr>
+              <w:t xml:space="preserve">18:15:54</w:t>
+            </w:r>
+          </w:p>
+        </w:tc>
+        <w:tc>
+          <w:tcPr/>
+          <w:p>
+            <w:pPr>
+              <w:pStyle w:val="Compact"/>
+              <w:spacing w:line="240" w:lineRule="auto"/>
+              <w:jc w:val="left"/>
             </w:pPr>
             <w:r>
               <w:rPr>
@@ -6262,66 +6360,88 @@
               <w:rPr>
                 <w:sz w:val="19"/>
               </w:rPr>
-              <w:t xml:space="preserve">Newer-metric accelerometer vibration</w:t>
-            </w:r>
-          </w:p>
-        </w:tc>
-        <w:tc>
-          <w:tcPr/>
-          <w:p>
-            <w:pPr>
-              <w:pStyle w:val="Compact"/>
-              <w:spacing w:line="240" w:lineRule="auto"/>
-              <w:jc w:val="center"/>
-            </w:pPr>
+              <w:t xml:space="preserve">Newer-metric vibration (</w:t>
+            </w:r>
             <w:r>
               <w:rPr>
                 <w:rStyle w:val="VerbatimChar"/>
                 <w:sz w:val="19"/>
               </w:rPr>
+              <w:t xml:space="preserve">rough_drone_newer.py</w:t>
+            </w:r>
+            <w:r>
+              <w:rPr>
+                <w:sz w:val="19"/>
+              </w:rPr>
+              <w:t xml:space="preserve">)</w:t>
+            </w:r>
+          </w:p>
+        </w:tc>
+        <w:tc>
+          <w:tcPr/>
+          <w:p>
+            <w:pPr>
+              <w:pStyle w:val="Compact"/>
+              <w:spacing w:line="240" w:lineRule="auto"/>
+              <w:jc w:val="left"/>
+            </w:pPr>
+            <w:r>
+              <w:rPr>
+                <w:rStyle w:val="VerbatimChar"/>
+                <w:sz w:val="19"/>
+              </w:rPr>
               <w:t xml:space="preserve">2148644</w:t>
             </w:r>
-          </w:p>
-        </w:tc>
-        <w:tc>
-          <w:tcPr/>
-          <w:p>
-            <w:pPr>
-              <w:pStyle w:val="Compact"/>
-              <w:spacing w:line="240" w:lineRule="auto"/>
-              <w:jc w:val="center"/>
-            </w:pPr>
-            <w:r>
-              <w:rPr>
-                <w:sz w:val="19"/>
-              </w:rPr>
-              <w:t xml:space="preserve">2026-10-24</w:t>
-            </w:r>
-          </w:p>
-        </w:tc>
-        <w:tc>
-          <w:tcPr/>
-          <w:p>
-            <w:pPr>
-              <w:pStyle w:val="Compact"/>
-              <w:spacing w:line="240" w:lineRule="auto"/>
-              <w:jc w:val="center"/>
-            </w:pPr>
-            <w:r>
-              <w:rPr>
-                <w:sz w:val="19"/>
-              </w:rPr>
-              <w:t xml:space="preserve">2026-10-24</w:t>
-            </w:r>
-          </w:p>
-        </w:tc>
-        <w:tc>
-          <w:tcPr/>
-          <w:p>
-            <w:pPr>
-              <w:pStyle w:val="Compact"/>
-              <w:spacing w:line="240" w:lineRule="auto"/>
-              <w:jc w:val="center"/>
+            <w:r>
+              <w:rPr>
+                <w:sz w:val="19"/>
+              </w:rPr>
+              <w:t xml:space="preserve"> </w:t>
+            </w:r>
+            <w:r>
+              <w:rPr>
+                <w:sz w:val="19"/>
+              </w:rPr>
+              <w:t xml:space="preserve">24 Oct 00:00:48</w:t>
+            </w:r>
+          </w:p>
+        </w:tc>
+        <w:tc>
+          <w:tcPr/>
+          <w:p>
+            <w:pPr>
+              <w:pStyle w:val="Compact"/>
+              <w:spacing w:line="240" w:lineRule="auto"/>
+              <w:jc w:val="left"/>
+            </w:pPr>
+            <w:r>
+              <w:rPr>
+                <w:rStyle w:val="VerbatimChar"/>
+                <w:sz w:val="19"/>
+              </w:rPr>
+              <w:t xml:space="preserve">b25d596</w:t>
+            </w:r>
+            <w:r>
+              <w:rPr>
+                <w:sz w:val="19"/>
+              </w:rPr>
+              <w:t xml:space="preserve"> </w:t>
+            </w:r>
+            <w:r>
+              <w:rPr>
+                <w:sz w:val="19"/>
+              </w:rPr>
+              <w:t xml:space="preserve">00:40:24</w:t>
+            </w:r>
+          </w:p>
+        </w:tc>
+        <w:tc>
+          <w:tcPr/>
+          <w:p>
+            <w:pPr>
+              <w:pStyle w:val="Compact"/>
+              <w:spacing w:line="240" w:lineRule="auto"/>
+              <w:jc w:val="left"/>
             </w:pPr>
             <w:r>
               <w:rPr>
@@ -6361,7 +6481,13 @@
               <w:rPr>
                 <w:sz w:val="19"/>
               </w:rPr>
-              <w:t xml:space="preserve">Inter-rater blind agreement (</w:t>
+              <w:t xml:space="preserve">Second coder,</w:t>
+            </w:r>
+            <w:r>
+              <w:rPr>
+                <w:sz w:val="19"/>
+              </w:rPr>
+              <w:t xml:space="preserve"> </w:t>
             </w:r>
             <m:oMath>
               <m:r>
@@ -6381,6 +6507,25 @@
               <w:rPr>
                 <w:sz w:val="19"/>
               </w:rPr>
+              <w:t xml:space="preserve"> </w:t>
+            </w:r>
+            <w:r>
+              <w:rPr>
+                <w:sz w:val="19"/>
+              </w:rPr>
+              <w:t xml:space="preserve">(</w:t>
+            </w:r>
+            <w:r>
+              <w:rPr>
+                <w:rStyle w:val="VerbatimChar"/>
+                <w:sz w:val="19"/>
+              </w:rPr>
+              <w:t xml:space="preserve">score_forum.py</w:t>
+            </w:r>
+            <w:r>
+              <w:rPr>
+                <w:sz w:val="19"/>
+              </w:rPr>
               <w:t xml:space="preserve">)</w:t>
             </w:r>
           </w:p>
@@ -6391,7 +6536,7 @@
             <w:pPr>
               <w:pStyle w:val="Compact"/>
               <w:spacing w:line="240" w:lineRule="auto"/>
-              <w:jc w:val="center"/>
+              <w:jc w:val="left"/>
             </w:pPr>
             <w:r>
               <w:rPr>
@@ -6400,47 +6545,56 @@
               </w:rPr>
               <w:t xml:space="preserve">21af373</w:t>
             </w:r>
-          </w:p>
-        </w:tc>
-        <w:tc>
-          <w:tcPr/>
-          <w:p>
-            <w:pPr>
-              <w:pStyle w:val="Compact"/>
-              <w:spacing w:line="240" w:lineRule="auto"/>
-              <w:jc w:val="center"/>
-            </w:pPr>
-            <w:r>
-              <w:rPr>
-                <w:sz w:val="19"/>
-              </w:rPr>
-              <w:t xml:space="preserve">2026-10-24</w:t>
-            </w:r>
-          </w:p>
-        </w:tc>
-        <w:tc>
-          <w:tcPr/>
-          <w:p>
-            <w:pPr>
-              <w:pStyle w:val="Compact"/>
-              <w:spacing w:line="240" w:lineRule="auto"/>
-              <w:jc w:val="center"/>
-            </w:pPr>
-            <w:r>
-              <w:rPr>
-                <w:sz w:val="19"/>
-              </w:rPr>
-              <w:t xml:space="preserve">2026-10-24</w:t>
-            </w:r>
-          </w:p>
-        </w:tc>
-        <w:tc>
-          <w:tcPr/>
-          <w:p>
-            <w:pPr>
-              <w:pStyle w:val="Compact"/>
-              <w:spacing w:line="240" w:lineRule="auto"/>
-              <w:jc w:val="center"/>
+            <w:r>
+              <w:rPr>
+                <w:sz w:val="19"/>
+              </w:rPr>
+              <w:t xml:space="preserve"> </w:t>
+            </w:r>
+            <w:r>
+              <w:rPr>
+                <w:sz w:val="19"/>
+              </w:rPr>
+              <w:t xml:space="preserve">24 Oct 00:03:29</w:t>
+            </w:r>
+          </w:p>
+        </w:tc>
+        <w:tc>
+          <w:tcPr/>
+          <w:p>
+            <w:pPr>
+              <w:pStyle w:val="Compact"/>
+              <w:spacing w:line="240" w:lineRule="auto"/>
+              <w:jc w:val="left"/>
+            </w:pPr>
+            <w:r>
+              <w:rPr>
+                <w:rStyle w:val="VerbatimChar"/>
+                <w:sz w:val="19"/>
+              </w:rPr>
+              <w:t xml:space="preserve">a369f83</w:t>
+            </w:r>
+            <w:r>
+              <w:rPr>
+                <w:sz w:val="19"/>
+              </w:rPr>
+              <w:t xml:space="preserve"> </w:t>
+            </w:r>
+            <w:r>
+              <w:rPr>
+                <w:sz w:val="19"/>
+              </w:rPr>
+              <w:t xml:space="preserve">12:16:14</w:t>
+            </w:r>
+          </w:p>
+        </w:tc>
+        <w:tc>
+          <w:tcPr/>
+          <w:p>
+            <w:pPr>
+              <w:pStyle w:val="Compact"/>
+              <w:spacing w:line="240" w:lineRule="auto"/>
+              <w:jc w:val="left"/>
             </w:pPr>
             <w:r>
               <w:rPr>
@@ -7758,7 +7912,10 @@
         </m:r>
       </m:oMath>
       <w:r>
-        <w:t xml:space="preserve"> s (1,000 flight-level bootstrap resamples). Upper confidence bounds near 0.73 occur specifically when terminal tumble telemetry is included (</w:t>
+        <w:t xml:space="preserve"> s (1,000 flight-level bootstrap resamples). The intervals at</w:t>
+      </w:r>
+      <w:r>
+        <w:t xml:space="preserve"> </w:t>
       </w:r>
       <m:oMath>
         <m:r>
@@ -7768,14 +7925,34 @@
           <m:rPr>
             <m:sty m:val="p"/>
           </m:rPr>
-          <m:t>≤</m:t>
-        </m:r>
-        <m:r>
-          <m:t>5</m:t>
-        </m:r>
-      </m:oMath>
-      <w:r>
-        <w:t xml:space="preserve"> s); removing the final 10 s reduces the upper bound to 0.524, confirming that non-linear decision trees also fall within chance under leakage control. Because they exhibited high fold instability and were not pre-declared, they were not retained for the primary benchmark.</w:t>
+          <m:t>=</m:t>
+        </m:r>
+        <m:r>
+          <m:t>0</m:t>
+        </m:r>
+      </m:oMath>
+      <w:r>
+        <w:t xml:space="preserve">–5 s overlap, so the differences between them are sampling noise; at</w:t>
+      </w:r>
+      <w:r>
+        <w:t xml:space="preserve"> </w:t>
+      </w:r>
+      <m:oMath>
+        <m:r>
+          <m:t>m</m:t>
+        </m:r>
+        <m:r>
+          <m:rPr>
+            <m:sty m:val="p"/>
+          </m:rPr>
+          <m:t>≥</m:t>
+        </m:r>
+        <m:r>
+          <m:t>10</m:t>
+        </m:r>
+      </m:oMath>
+      <w:r>
+        <w:t xml:space="preserve"> s the upper bounds are 0.519–0.604, giving no evidence of non-linear separation. Because they exhibited high fold instability and were not pre-declared, they were not retained for the primary benchmark.</w:t>
       </w:r>
     </w:p>
     <w:p>
@@ -9316,7 +9493,7 @@
         <w:t xml:space="preserve"> </w:t>
       </w:r>
       <w:r>
-        <w:t xml:space="preserve">Seven confirmatory tests produce</w:t>
+        <w:t xml:space="preserve">Seven tests produce</w:t>
       </w:r>
       <w:r>
         <w:t xml:space="preserve"> </w:t>
@@ -9367,7 +9544,7 @@
         </m:r>
       </m:oMath>
       <w:r>
-        <w:t xml:space="preserve">.</w:t>
+        <w:t xml:space="preserve">. The Q1 settings comparison came from a first-pass analysis whose code and result were committed together (Table 4), so it is not confirmatory; it is kept in the Holm set, which makes the adjustment of the other tests conservative.</w:t>
       </w:r>
     </w:p>
     <w:p>
@@ -9439,7 +9616,7 @@
         </m:r>
       </m:oMath>
       <w:r>
-        <w:t xml:space="preserve">). Pilot-caused crashes had a protection disabled more</w:t>
+        <w:t xml:space="preserve">). This comparison comes from a first-pass analysis whose code and result were committed together, so it is reported as a descriptive result rather than a declared test (Table 4). Pilot-caused crashes had a protection disabled more</w:t>
       </w:r>
       <w:r>
         <w:t xml:space="preserve"> </w:t>
@@ -9501,7 +9678,7 @@
         </m:r>
       </m:oMath>
       <w:r>
-        <w:t xml:space="preserve">). This contrast is exploratory, not part of the pre-declared confirmatory family, and does not</w:t>
+        <w:t xml:space="preserve">). This contrast is exploratory, and does not</w:t>
       </w:r>
       <w:r>
         <w:t xml:space="preserve"> </w:t>
@@ -10557,13 +10734,13 @@
         </m:r>
       </m:oMath>
       <w:r>
-        <w:t xml:space="preserve">), sample sizing requires at least 250 independently verified pilot-fault crashes (with matching aircraft cases,</w:t>
-      </w:r>
-      <w:r>
-        <w:t xml:space="preserve"> </w:t>
-      </w:r>
-      <m:oMath>
-        <m:sSub>
+        <w:t xml:space="preserve">), the Hanley–McNeil standard error,</w:t>
+      </w:r>
+      <w:r>
+        <w:t xml:space="preserve"> </w:t>
+      </w:r>
+      <m:oMath>
+        <m:sSup>
           <m:e>
             <m:r>
               <m:rPr>
@@ -10572,12 +10749,72 @@
               <m:t>SE</m:t>
             </m:r>
           </m:e>
+          <m:sup>
+            <m:r>
+              <m:t>2</m:t>
+            </m:r>
+          </m:sup>
+        </m:sSup>
+        <m:r>
+          <m:rPr>
+            <m:sty m:val="p"/>
+          </m:rPr>
+          <m:t>=</m:t>
+        </m:r>
+        <m:r>
+          <m:rPr>
+            <m:sty m:val="p"/>
+          </m:rPr>
+          <m:t>[</m:t>
+        </m:r>
+        <m:r>
+          <m:t>A</m:t>
+        </m:r>
+        <m:r>
+          <m:rPr>
+            <m:sty m:val="p"/>
+          </m:rPr>
+          <m:t>(</m:t>
+        </m:r>
+        <m:r>
+          <m:t>1</m:t>
+        </m:r>
+        <m:r>
+          <m:rPr>
+            <m:sty m:val="p"/>
+          </m:rPr>
+          <m:t>−</m:t>
+        </m:r>
+        <m:r>
+          <m:t>A</m:t>
+        </m:r>
+        <m:r>
+          <m:rPr>
+            <m:sty m:val="p"/>
+          </m:rPr>
+          <m:t>)</m:t>
+        </m:r>
+        <m:r>
+          <m:rPr>
+            <m:sty m:val="p"/>
+          </m:rPr>
+          <m:t>+</m:t>
+        </m:r>
+        <m:r>
+          <m:rPr>
+            <m:sty m:val="p"/>
+          </m:rPr>
+          <m:t>(</m:t>
+        </m:r>
+        <m:sSub>
+          <m:e>
+            <m:r>
+              <m:t>n</m:t>
+            </m:r>
+          </m:e>
           <m:sub>
             <m:r>
-              <m:rPr>
-                <m:nor/>
-              </m:rPr>
-              <m:t>asymp</m:t>
+              <m:t>p</m:t>
             </m:r>
           </m:sub>
         </m:sSub>
@@ -10585,14 +10822,527 @@
           <m:rPr>
             <m:sty m:val="p"/>
           </m:rPr>
+          <m:t>−</m:t>
+        </m:r>
+        <m:r>
+          <m:t>1</m:t>
+        </m:r>
+        <m:r>
+          <m:rPr>
+            <m:sty m:val="p"/>
+          </m:rPr>
+          <m:t>)</m:t>
+        </m:r>
+        <m:r>
+          <m:rPr>
+            <m:sty m:val="p"/>
+          </m:rPr>
+          <m:t>(</m:t>
+        </m:r>
+        <m:sSub>
+          <m:e>
+            <m:r>
+              <m:t>Q</m:t>
+            </m:r>
+          </m:e>
+          <m:sub>
+            <m:r>
+              <m:t>1</m:t>
+            </m:r>
+          </m:sub>
+        </m:sSub>
+        <m:r>
+          <m:rPr>
+            <m:sty m:val="p"/>
+          </m:rPr>
+          <m:t>−</m:t>
+        </m:r>
+        <m:sSup>
+          <m:e>
+            <m:r>
+              <m:t>A</m:t>
+            </m:r>
+          </m:e>
+          <m:sup>
+            <m:r>
+              <m:t>2</m:t>
+            </m:r>
+          </m:sup>
+        </m:sSup>
+        <m:r>
+          <m:rPr>
+            <m:sty m:val="p"/>
+          </m:rPr>
+          <m:t>)</m:t>
+        </m:r>
+        <m:r>
+          <m:rPr>
+            <m:sty m:val="p"/>
+          </m:rPr>
+          <m:t>+</m:t>
+        </m:r>
+        <m:r>
+          <m:rPr>
+            <m:sty m:val="p"/>
+          </m:rPr>
+          <m:t>(</m:t>
+        </m:r>
+        <m:sSub>
+          <m:e>
+            <m:r>
+              <m:t>n</m:t>
+            </m:r>
+          </m:e>
+          <m:sub>
+            <m:r>
+              <m:t>a</m:t>
+            </m:r>
+          </m:sub>
+        </m:sSub>
+        <m:r>
+          <m:rPr>
+            <m:sty m:val="p"/>
+          </m:rPr>
+          <m:t>−</m:t>
+        </m:r>
+        <m:r>
+          <m:t>1</m:t>
+        </m:r>
+        <m:r>
+          <m:rPr>
+            <m:sty m:val="p"/>
+          </m:rPr>
+          <m:t>)</m:t>
+        </m:r>
+        <m:r>
+          <m:rPr>
+            <m:sty m:val="p"/>
+          </m:rPr>
+          <m:t>(</m:t>
+        </m:r>
+        <m:sSub>
+          <m:e>
+            <m:r>
+              <m:t>Q</m:t>
+            </m:r>
+          </m:e>
+          <m:sub>
+            <m:r>
+              <m:t>2</m:t>
+            </m:r>
+          </m:sub>
+        </m:sSub>
+        <m:r>
+          <m:rPr>
+            <m:sty m:val="p"/>
+          </m:rPr>
+          <m:t>−</m:t>
+        </m:r>
+        <m:sSup>
+          <m:e>
+            <m:r>
+              <m:t>A</m:t>
+            </m:r>
+          </m:e>
+          <m:sup>
+            <m:r>
+              <m:t>2</m:t>
+            </m:r>
+          </m:sup>
+        </m:sSup>
+        <m:r>
+          <m:rPr>
+            <m:sty m:val="p"/>
+          </m:rPr>
+          <m:t>)</m:t>
+        </m:r>
+        <m:r>
+          <m:rPr>
+            <m:sty m:val="p"/>
+          </m:rPr>
+          <m:t>]</m:t>
+        </m:r>
+        <m:r>
+          <m:rPr>
+            <m:sty m:val="p"/>
+          </m:rPr>
+          <m:t>/</m:t>
+        </m:r>
+        <m:r>
+          <m:rPr>
+            <m:sty m:val="p"/>
+          </m:rPr>
+          <m:t>(</m:t>
+        </m:r>
+        <m:sSub>
+          <m:e>
+            <m:r>
+              <m:t>n</m:t>
+            </m:r>
+          </m:e>
+          <m:sub>
+            <m:r>
+              <m:t>p</m:t>
+            </m:r>
+          </m:sub>
+        </m:sSub>
+        <m:sSub>
+          <m:e>
+            <m:r>
+              <m:t>n</m:t>
+            </m:r>
+          </m:e>
+          <m:sub>
+            <m:r>
+              <m:t>a</m:t>
+            </m:r>
+          </m:sub>
+        </m:sSub>
+        <m:r>
+          <m:rPr>
+            <m:sty m:val="p"/>
+          </m:rPr>
+          <m:t>)</m:t>
+        </m:r>
+      </m:oMath>
+      <w:r>
+        <w:t xml:space="preserve"> </w:t>
+      </w:r>
+      <w:r>
+        <w:t xml:space="preserve">with</w:t>
+      </w:r>
+      <w:r>
+        <w:t xml:space="preserve"> </w:t>
+      </w:r>
+      <m:oMath>
+        <m:r>
+          <m:t>A</m:t>
+        </m:r>
+        <m:r>
+          <m:rPr>
+            <m:sty m:val="p"/>
+          </m:rPr>
+          <m:t>=</m:t>
+        </m:r>
+        <m:r>
+          <m:t>0.85</m:t>
+        </m:r>
+      </m:oMath>
+      <w:r>
+        <w:t xml:space="preserve">,</w:t>
+      </w:r>
+      <w:r>
+        <w:t xml:space="preserve"> </w:t>
+      </w:r>
+      <m:oMath>
+        <m:sSub>
+          <m:e>
+            <m:r>
+              <m:t>Q</m:t>
+            </m:r>
+          </m:e>
+          <m:sub>
+            <m:r>
+              <m:t>1</m:t>
+            </m:r>
+          </m:sub>
+        </m:sSub>
+        <m:r>
+          <m:rPr>
+            <m:sty m:val="p"/>
+          </m:rPr>
+          <m:t>=</m:t>
+        </m:r>
+        <m:r>
+          <m:t>A</m:t>
+        </m:r>
+        <m:r>
+          <m:rPr>
+            <m:sty m:val="p"/>
+          </m:rPr>
+          <m:t>/</m:t>
+        </m:r>
+        <m:r>
+          <m:rPr>
+            <m:sty m:val="p"/>
+          </m:rPr>
+          <m:t>(</m:t>
+        </m:r>
+        <m:r>
+          <m:t>2</m:t>
+        </m:r>
+        <m:r>
+          <m:rPr>
+            <m:sty m:val="p"/>
+          </m:rPr>
+          <m:t>−</m:t>
+        </m:r>
+        <m:r>
+          <m:t>A</m:t>
+        </m:r>
+        <m:r>
+          <m:rPr>
+            <m:sty m:val="p"/>
+          </m:rPr>
+          <m:t>)</m:t>
+        </m:r>
+      </m:oMath>
+      <w:r>
+        <w:t xml:space="preserve">,</w:t>
+      </w:r>
+      <w:r>
+        <w:t xml:space="preserve"> </w:t>
+      </w:r>
+      <m:oMath>
+        <m:sSub>
+          <m:e>
+            <m:r>
+              <m:t>Q</m:t>
+            </m:r>
+          </m:e>
+          <m:sub>
+            <m:r>
+              <m:t>2</m:t>
+            </m:r>
+          </m:sub>
+        </m:sSub>
+        <m:r>
+          <m:rPr>
+            <m:sty m:val="p"/>
+          </m:rPr>
+          <m:t>=</m:t>
+        </m:r>
+        <m:r>
+          <m:t>2</m:t>
+        </m:r>
+        <m:sSup>
+          <m:e>
+            <m:r>
+              <m:t>A</m:t>
+            </m:r>
+          </m:e>
+          <m:sup>
+            <m:r>
+              <m:t>2</m:t>
+            </m:r>
+          </m:sup>
+        </m:sSup>
+        <m:r>
+          <m:rPr>
+            <m:sty m:val="p"/>
+          </m:rPr>
+          <m:t>/</m:t>
+        </m:r>
+        <m:r>
+          <m:rPr>
+            <m:sty m:val="p"/>
+          </m:rPr>
+          <m:t>(</m:t>
+        </m:r>
+        <m:r>
+          <m:t>1</m:t>
+        </m:r>
+        <m:r>
+          <m:rPr>
+            <m:sty m:val="p"/>
+          </m:rPr>
+          <m:t>+</m:t>
+        </m:r>
+        <m:r>
+          <m:t>A</m:t>
+        </m:r>
+        <m:r>
+          <m:rPr>
+            <m:sty m:val="p"/>
+          </m:rPr>
+          <m:t>)</m:t>
+        </m:r>
+      </m:oMath>
+      <w:r>
+        <w:t xml:space="preserve"> </w:t>
+      </w:r>
+      <w:r>
+        <w:t xml:space="preserve">and the observed 3.1 aircraft crashes per pilot crash (</w:t>
+      </w:r>
+      <m:oMath>
+        <m:sSub>
+          <m:e>
+            <m:r>
+              <m:t>n</m:t>
+            </m:r>
+          </m:e>
+          <m:sub>
+            <m:r>
+              <m:t>a</m:t>
+            </m:r>
+          </m:sub>
+        </m:sSub>
+        <m:r>
+          <m:rPr>
+            <m:sty m:val="p"/>
+          </m:rPr>
+          <m:t>=</m:t>
+        </m:r>
+        <m:r>
+          <m:t>3.1</m:t>
+        </m:r>
+        <m:r>
+          <m:t> </m:t>
+        </m:r>
+        <m:sSub>
+          <m:e>
+            <m:r>
+              <m:t>n</m:t>
+            </m:r>
+          </m:e>
+          <m:sub>
+            <m:r>
+              <m:t>p</m:t>
+            </m:r>
+          </m:sub>
+        </m:sSub>
+      </m:oMath>
+      <w:r>
+        <w:t xml:space="preserve">), meets this criterion at about</w:t>
+      </w:r>
+      <w:r>
+        <w:t xml:space="preserve"> </w:t>
+      </w:r>
+      <m:oMath>
+        <m:sSub>
+          <m:e>
+            <m:r>
+              <m:t>n</m:t>
+            </m:r>
+          </m:e>
+          <m:sub>
+            <m:r>
+              <m:t>p</m:t>
+            </m:r>
+          </m:sub>
+        </m:sSub>
+        <m:r>
+          <m:rPr>
+            <m:sty m:val="p"/>
+          </m:rPr>
+          <m:t>=</m:t>
+        </m:r>
+        <m:r>
+          <m:t>100</m:t>
+        </m:r>
+      </m:oMath>
+      <w:r>
+        <w:t xml:space="preserve"> </w:t>
+      </w:r>
+      <w:r>
+        <w:t xml:space="preserve">independently verified pilot-fault crashes (</w:t>
+      </w:r>
+      <m:oMath>
+        <m:r>
+          <m:rPr>
+            <m:nor/>
+          </m:rPr>
+          <m:t>SE</m:t>
+        </m:r>
+        <m:r>
+          <m:rPr>
+            <m:sty m:val="p"/>
+          </m:rPr>
           <m:t>≈</m:t>
         </m:r>
         <m:r>
-          <m:t>0.021</m:t>
-        </m:r>
-      </m:oMath>
-      <w:r>
-        <w:t xml:space="preserve">), far beyond the 36 available in the modelling sample. We therefore report that these rules, models and labels give no usable attribution signal under the evaluated setup, not that attribution is fundamentally impossible.</w:t>
+          <m:t>0.025</m:t>
+        </m:r>
+      </m:oMath>
+      <w:r>
+        <w:t xml:space="preserve">); 80% power to exclude 0.80 when the true AUC is 0.85 (</w:t>
+      </w:r>
+      <m:oMath>
+        <m:r>
+          <m:rPr>
+            <m:nor/>
+          </m:rPr>
+          <m:t>SE</m:t>
+        </m:r>
+        <m:r>
+          <m:rPr>
+            <m:sty m:val="p"/>
+          </m:rPr>
+          <m:t>≤</m:t>
+        </m:r>
+        <m:r>
+          <m:t>0.05</m:t>
+        </m:r>
+        <m:r>
+          <m:rPr>
+            <m:sty m:val="p"/>
+          </m:rPr>
+          <m:t>/</m:t>
+        </m:r>
+        <m:r>
+          <m:t>2.80</m:t>
+        </m:r>
+        <m:r>
+          <m:rPr>
+            <m:sty m:val="p"/>
+          </m:rPr>
+          <m:t>=</m:t>
+        </m:r>
+        <m:r>
+          <m:t>0.018</m:t>
+        </m:r>
+      </m:oMath>
+      <w:r>
+        <w:t xml:space="preserve">) needs about 200 (</w:t>
+      </w:r>
+      <m:oMath>
+        <m:r>
+          <m:rPr>
+            <m:nor/>
+          </m:rPr>
+          <m:t>SE</m:t>
+        </m:r>
+        <m:r>
+          <m:rPr>
+            <m:sty m:val="p"/>
+          </m:rPr>
+          <m:t>≈</m:t>
+        </m:r>
+        <m:r>
+          <m:t>0.018</m:t>
+        </m:r>
+      </m:oMath>
+      <w:r>
+        <w:t xml:space="preserve">). Both are far beyond the 36 available in the modelling sample (SE 0.042 at</w:t>
+      </w:r>
+      <w:r>
+        <w:t xml:space="preserve"> </w:t>
+      </w:r>
+      <m:oMath>
+        <m:sSub>
+          <m:e>
+            <m:r>
+              <m:t>n</m:t>
+            </m:r>
+          </m:e>
+          <m:sub>
+            <m:r>
+              <m:t>p</m:t>
+            </m:r>
+          </m:sub>
+        </m:sSub>
+        <m:r>
+          <m:rPr>
+            <m:sty m:val="p"/>
+          </m:rPr>
+          <m:t>=</m:t>
+        </m:r>
+        <m:r>
+          <m:t>36</m:t>
+        </m:r>
+      </m:oMath>
+      <w:r>
+        <w:t xml:space="preserve">). An earlier version stated 250, which applied the null-hypothesis variance at AUC 0.85. We therefore report that these rules, models and labels give no usable attribution signal under the evaluated setup, not that attribution is fundamentally impossible.</w:t>
       </w:r>
       <w:r>
         <w:t xml:space="preserve"> </w:t>
@@ -10899,7 +11649,7 @@
         </m:r>
       </m:oMath>
       <w:r>
-        <w:t xml:space="preserve"> s, upper confidence bounds contract to 0.524, providing no evidence of non-linear separation once the terminal window is excluded.</w:t>
+        <w:t xml:space="preserve"> s, upper confidence bounds are 0.519–0.604, providing no evidence of non-linear separation once the terminal window is excluded.</w:t>
       </w:r>
     </w:p>
     <w:bookmarkStart w:id="36" w:name="_049e4e3e8c6150f6efca473eb560bdd9d2e8e6a"/>
@@ -10966,7 +11716,7 @@
         <w:pStyle w:val="TableCaption"/>
       </w:pPr>
       <w:r>
-        <w:t xml:space="preserve">Table 6. Confirmatory tests, their declared pass marks and outcomes. Holm adjustment over the seven</w:t>
+        <w:t xml:space="preserve">Table 6. Tests, their declared pass marks and outcomes. Holm adjustment over the seven</w:t>
       </w:r>
       <w:r>
         <w:t xml:space="preserve"> </w:t>
@@ -10978,6 +11728,29 @@
       </m:oMath>
       <w:r>
         <w:t xml:space="preserve">-valued tests.</w:t>
+      </w:r>
+      <w:r>
+        <w:t xml:space="preserve"> </w:t>
+      </w:r>
+      <m:oMath>
+        <m:sSup>
+          <m:e>
+            <m:r>
+              <m:t>​</m:t>
+            </m:r>
+          </m:e>
+          <m:sup>
+            <m:r>
+              <m:rPr>
+                <m:sty m:val="p"/>
+              </m:rPr>
+              <m:t>‡</m:t>
+            </m:r>
+          </m:sup>
+        </m:sSup>
+      </m:oMath>
+      <w:r>
+        <w:t xml:space="preserve">First-pass analysis, not declared before running (Table 4).</w:t>
       </w:r>
     </w:p>
     <w:tbl>
@@ -10985,7 +11758,7 @@
         <w:tblStyle w:val="Table"/>
         <w:tblW w:type="pct" w:w="5000"/>
         <w:tblLook w:firstRow="1" w:lastRow="0" w:firstColumn="0" w:lastColumn="0" w:noHBand="0" w:noVBand="0" w:val="0020"/>
-        <w:tblCaption w:val="Table 6. Confirmatory tests, their declared pass marks and outcomes. Holm adjustment over the seven p-valued tests."/>
+        <w:tblCaption w:val="Table 6. Tests, their declared pass marks and outcomes. Holm adjustment over the seven p-valued tests. ^\ddaggerFirst-pass analysis, not declared before running (Table 4)."/>
         <w:tblBorders>
           <w:top w:val="single" w:sz="4" w:color="808080"/>
           <w:left w:val="single" w:sz="4" w:color="808080"/>
@@ -11096,6 +11869,23 @@
               </w:rPr>
               <w:t xml:space="preserve">Protections disabled, crash vs normal</w:t>
             </w:r>
+            <m:oMath>
+              <m:sSup>
+                <m:e>
+                  <m:r>
+                    <m:t>​</m:t>
+                  </m:r>
+                </m:e>
+                <m:sup>
+                  <m:r>
+                    <m:rPr>
+                      <m:sty m:val="p"/>
+                    </m:rPr>
+                    <m:t>‡</m:t>
+                  </m:r>
+                </m:sup>
+              </m:sSup>
+            </m:oMath>
           </w:p>
         </w:tc>
         <w:tc>
@@ -13735,7 +14525,47 @@
         </m:r>
       </m:oMath>
       <w:r>
-        <w:t xml:space="preserve">, paired cluster bootstrap 95% CI [+0.074, +0.238]); at</w:t>
+        <w:t xml:space="preserve">;</w:t>
+      </w:r>
+      <w:r>
+        <w:t xml:space="preserve"> </w:t>
+      </w:r>
+      <m:oMath>
+        <m:sSup>
+          <m:e>
+            <m:r>
+              <m:t>​</m:t>
+            </m:r>
+          </m:e>
+          <m:sup>
+            <m:r>
+              <m:rPr>
+                <m:sty m:val="p"/>
+              </m:rPr>
+              <m:t>†</m:t>
+            </m:r>
+          </m:sup>
+        </m:sSup>
+      </m:oMath>
+      <w:r>
+        <w:t xml:space="preserve">a declared rerun with reproducible folds gave 0.636 vs. 0.526, lift</w:t>
+      </w:r>
+      <w:r>
+        <w:t xml:space="preserve"> </w:t>
+      </w:r>
+      <m:oMath>
+        <m:r>
+          <m:rPr>
+            <m:sty m:val="p"/>
+          </m:rPr>
+          <m:t>+</m:t>
+        </m:r>
+        <m:r>
+          <m:t>0.110</m:t>
+        </m:r>
+      </m:oMath>
+      <w:r>
+        <w:t xml:space="preserve">, paired cluster bootstrap 95% CI [+0.028, +0.205], replacing an earlier interval of [+0.074, +0.238] computed on a fold draw that cannot be reproduced); at</w:t>
       </w:r>
       <w:r>
         <w:t xml:space="preserve"> </w:t>
@@ -13840,7 +14670,101 @@
         </m:r>
       </m:oMath>
       <w:r>
-        <w:t xml:space="preserve">), suggesting that baseline duration differences in uncurated archives mask within-drone precursor detection in this cohort.</w:t>
+        <w:t xml:space="preserve">).</w:t>
+      </w:r>
+      <w:r>
+        <w:t xml:space="preserve"> </w:t>
+      </w:r>
+      <m:oMath>
+        <m:sSup>
+          <m:e>
+            <m:r>
+              <m:t>​</m:t>
+            </m:r>
+          </m:e>
+          <m:sup>
+            <m:r>
+              <m:rPr>
+                <m:sty m:val="p"/>
+              </m:rPr>
+              <m:t>†</m:t>
+            </m:r>
+          </m:sup>
+        </m:sSup>
+      </m:oMath>
+      <w:r>
+        <w:t xml:space="preserve">Without these three features the lift is</w:t>
+      </w:r>
+      <w:r>
+        <w:t xml:space="preserve"> </w:t>
+      </w:r>
+      <m:oMath>
+        <m:r>
+          <m:rPr>
+            <m:sty m:val="p"/>
+          </m:rPr>
+          <m:t>+</m:t>
+        </m:r>
+        <m:r>
+          <m:t>0.077</m:t>
+        </m:r>
+      </m:oMath>
+      <w:r>
+        <w:t xml:space="preserve"> </w:t>
+      </w:r>
+      <w:r>
+        <w:t xml:space="preserve">[+0.013, +0.204] (5 seeds; seed 42 alone</w:t>
+      </w:r>
+      <w:r>
+        <w:t xml:space="preserve"> </w:t>
+      </w:r>
+      <m:oMath>
+        <m:r>
+          <m:rPr>
+            <m:sty m:val="p"/>
+          </m:rPr>
+          <m:t>+</m:t>
+        </m:r>
+        <m:r>
+          <m:t>0.062</m:t>
+        </m:r>
+      </m:oMath>
+      <w:r>
+        <w:t xml:space="preserve"> </w:t>
+      </w:r>
+      <w:r>
+        <w:t xml:space="preserve">[</w:t>
+      </w:r>
+      <m:oMath>
+        <m:r>
+          <m:rPr>
+            <m:sty m:val="p"/>
+          </m:rPr>
+          <m:t>−</m:t>
+        </m:r>
+        <m:r>
+          <m:t>0.008</m:t>
+        </m:r>
+      </m:oMath>
+      <w:r>
+        <w:t xml:space="preserve">, +0.132]) and the matched within-drone AUC is 0.573. This meets the declared criterion for the reading that duration differences mask within-drone precursors (lift</w:t>
+      </w:r>
+      <w:r>
+        <w:t xml:space="preserve"> </w:t>
+      </w:r>
+      <m:oMath>
+        <m:r>
+          <m:rPr>
+            <m:sty m:val="p"/>
+          </m:rPr>
+          <m:t>≥</m:t>
+        </m:r>
+        <m:r>
+          <m:t>0.05</m:t>
+        </m:r>
+      </m:oMath>
+      <w:r>
+        <w:t xml:space="preserve">, interval excluding zero), but the lift is smaller and less stable than with all features, and a fixed 30 s window did not reproduce it (§5.4).</w:t>
       </w:r>
     </w:p>
     <w:bookmarkStart w:id="40" w:name="_5384c23fe540f64e7f70d79e466547294e389bd"/>
@@ -18213,7 +19137,88 @@
         <w:t xml:space="preserve"> </w:t>
       </w:r>
       <w:r>
-        <w:t xml:space="preserve">index did not record intra-day flight sequence. Across all 44 matched sets with exposure flights on the same calendar day as the crash, parsing raw GPS epoch timestamps confirmed that every pre-crash exposure flight strictly preceded the crash moment in time (0 post-crash flights occurred in the exposure window). This temporal ordering rules out post-accident flight inclusion, but points to potential confounding by development or tuning sessions</w:t>
+        <w:t xml:space="preserve">index did not record intra-day flight sequence.</w:t>
+      </w:r>
+      <w:r>
+        <w:t xml:space="preserve"> </w:t>
+      </w:r>
+      <m:oMath>
+        <m:sSup>
+          <m:e>
+            <m:r>
+              <m:t>​</m:t>
+            </m:r>
+          </m:e>
+          <m:sup>
+            <m:r>
+              <m:rPr>
+                <m:sty m:val="p"/>
+              </m:rPr>
+              <m:t>†</m:t>
+            </m:r>
+          </m:sup>
+        </m:sSup>
+      </m:oMath>
+      <w:r>
+        <w:t xml:space="preserve">An earlier check of this ordering compared calendar dates only and could not detect a same-day flight flown after the crash. A declared check of GPS UTC start times (Round 14 audit, commit</w:t>
+      </w:r>
+      <w:r>
+        <w:t xml:space="preserve"> </w:t>
+      </w:r>
+      <w:r>
+        <w:rPr>
+          <w:rStyle w:val="VerbatimChar"/>
+        </w:rPr>
+        <w:t xml:space="preserve">0e26db0</w:t>
+      </w:r>
+      <w:r>
+        <w:t xml:space="preserve">, amended</w:t>
+      </w:r>
+      <w:r>
+        <w:t xml:space="preserve"> </w:t>
+      </w:r>
+      <w:r>
+        <w:rPr>
+          <w:rStyle w:val="VerbatimChar"/>
+        </w:rPr>
+        <w:t xml:space="preserve">187f570</w:t>
+      </w:r>
+      <w:r>
+        <w:t xml:space="preserve">) found that of 95 distinct crash-day exposure flights in 39 of the 60 sets, 38 preceded the crash, 47 followed it and 10 had no usable GPS time. Removing the 47 later flights left 43 sets with mean scaled rank 0.698 (</w:t>
+      </w:r>
+      <m:oMath>
+        <m:r>
+          <m:t>p</m:t>
+        </m:r>
+        <m:r>
+          <m:rPr>
+            <m:sty m:val="p"/>
+          </m:rPr>
+          <m:t>=</m:t>
+        </m:r>
+        <m:r>
+          <m:t>0.0021</m:t>
+        </m:r>
+      </m:oMath>
+      <w:r>
+        <w:t xml:space="preserve">); also removing the 10 undated flights left 39 sets with 0.718 (</w:t>
+      </w:r>
+      <m:oMath>
+        <m:r>
+          <m:t>p</m:t>
+        </m:r>
+        <m:r>
+          <m:rPr>
+            <m:sty m:val="p"/>
+          </m:rPr>
+          <m:t>=</m:t>
+        </m:r>
+        <m:r>
+          <m:t>0.0014</m:t>
+        </m:r>
+      </m:oMath>
+      <w:r>
+        <w:t xml:space="preserve">). The between-drone result therefore does not depend on post-crash flights, but the declared test did include them. The within-drone selection used the same date rule, so the within-drone, caliper and same-aircraft factorial samples may also contain flights flown after the crash; this has not been audited. The same-day pattern points to potential confounding by development or tuning sessions</w:t>
       </w:r>
       <w:r>
         <w:t xml:space="preserve"> </w:t>
@@ -18278,7 +19283,7 @@
         </m:r>
       </m:oMath>
       <w:r>
-        <w:t xml:space="preserve">) and unique control airframes (</w:t>
+        <w:t xml:space="preserve">; the 60 sets come from 40 drones, 11 of which crashed more than once) and unique control airframes (</w:t>
       </w:r>
       <m:oMath>
         <m:r>
@@ -23959,7 +24964,33 @@
               <w:rPr>
                 <w:sz w:val="19"/>
               </w:rPr>
-              <w:t xml:space="preserve">Upper bounds 0.519–0.724; collapses to 0.524 under 10 s leakage control</w:t>
+              <w:t xml:space="preserve">Upper bounds 0.519–0.724 (0.519–0.604 at</w:t>
+            </w:r>
+            <w:r>
+              <w:rPr>
+                <w:sz w:val="19"/>
+              </w:rPr>
+              <w:t xml:space="preserve"> </w:t>
+            </w:r>
+            <m:oMath>
+              <m:r>
+                <m:t>m</m:t>
+              </m:r>
+              <m:r>
+                <m:rPr>
+                  <m:sty m:val="p"/>
+                </m:rPr>
+                <m:t>≥</m:t>
+              </m:r>
+              <m:r>
+                <m:t>10</m:t>
+              </m:r>
+            </m:oMath>
+            <w:r>
+              <w:rPr>
+                <w:sz w:val="19"/>
+              </w:rPr>
+              <w:t xml:space="preserve"> s)</w:t>
             </w:r>
           </w:p>
         </w:tc>
@@ -24597,7 +25628,7 @@
               <w:rPr>
                 <w:sz w:val="19"/>
               </w:rPr>
-              <w:t xml:space="preserve">is [+0.074, +0.238]</w:t>
+              <w:t xml:space="preserve">is [+0.074, +0.238]; superseded by the Round 14 rerun [+0.028, +0.205]</w:t>
             </w:r>
           </w:p>
         </w:tc>
@@ -24713,7 +25744,7 @@
               <w:rPr>
                 <w:sz w:val="19"/>
               </w:rPr>
-              <w:t xml:space="preserve">Two-stage cluster CI [0.536, 0.789] over case &amp; control clusters; 44 same-day sets confirmed 0 post-crash flights</w:t>
+              <w:t xml:space="preserve">Two-stage cluster CI [0.536, 0.789] over case &amp; control clusters; same-day check compared dates only; superseded by the Round 14 GPS check</w:t>
             </w:r>
           </w:p>
         </w:tc>
@@ -24979,6 +26010,190 @@
                 <w:sz w:val="19"/>
               </w:rPr>
               <w:t xml:space="preserve">2026-10-26</w:t>
+            </w:r>
+          </w:p>
+        </w:tc>
+      </w:tr>
+      <w:tr>
+        <w:tc>
+          <w:tcPr/>
+          <w:p>
+            <w:pPr>
+              <w:pStyle w:val="Compact"/>
+              <w:spacing w:line="240" w:lineRule="auto"/>
+              <w:jc w:val="left"/>
+            </w:pPr>
+            <w:r>
+              <w:rPr>
+                <w:sz w:val="19"/>
+              </w:rPr>
+              <w:t xml:space="preserve">Round 14 audit</w:t>
+            </w:r>
+            <m:oMath>
+              <m:sSup>
+                <m:e>
+                  <m:r>
+                    <m:t>​</m:t>
+                  </m:r>
+                </m:e>
+                <m:sup>
+                  <m:r>
+                    <m:rPr>
+                      <m:sty m:val="p"/>
+                    </m:rPr>
+                    <m:t>†</m:t>
+                  </m:r>
+                </m:sup>
+              </m:sSup>
+            </m:oMath>
+          </w:p>
+        </w:tc>
+        <w:tc>
+          <w:tcPr/>
+          <w:p>
+            <w:pPr>
+              <w:pStyle w:val="Compact"/>
+              <w:spacing w:line="240" w:lineRule="auto"/>
+              <w:jc w:val="left"/>
+            </w:pPr>
+            <w:r>
+              <w:rPr>
+                <w:sz w:val="19"/>
+              </w:rPr>
+              <w:t xml:space="preserve">Caliper without duration-linked features; GPS ordering</w:t>
+            </w:r>
+          </w:p>
+        </w:tc>
+        <w:tc>
+          <w:tcPr/>
+          <w:p>
+            <w:pPr>
+              <w:pStyle w:val="Compact"/>
+              <w:spacing w:line="240" w:lineRule="auto"/>
+              <w:jc w:val="left"/>
+            </w:pPr>
+            <w:r>
+              <w:rPr>
+                <w:sz w:val="19"/>
+              </w:rPr>
+              <w:t xml:space="preserve">Lift</w:t>
+            </w:r>
+            <w:r>
+              <w:rPr>
+                <w:sz w:val="19"/>
+              </w:rPr>
+              <w:t xml:space="preserve"> </w:t>
+            </w:r>
+            <m:oMath>
+              <m:r>
+                <m:rPr>
+                  <m:sty m:val="p"/>
+                </m:rPr>
+                <m:t>+</m:t>
+              </m:r>
+              <m:r>
+                <m:t>0.077</m:t>
+              </m:r>
+            </m:oMath>
+            <w:r>
+              <w:rPr>
+                <w:sz w:val="19"/>
+              </w:rPr>
+              <w:t xml:space="preserve"> </w:t>
+            </w:r>
+            <w:r>
+              <w:rPr>
+                <w:sz w:val="19"/>
+              </w:rPr>
+              <w:t xml:space="preserve">[+0.013, +0.204] without three features; 47 of 95 crash-day exposure flights followed the crash; between-drone 0.698 (</w:t>
+            </w:r>
+            <m:oMath>
+              <m:r>
+                <m:t>p</m:t>
+              </m:r>
+              <m:r>
+                <m:rPr>
+                  <m:sty m:val="p"/>
+                </m:rPr>
+                <m:t>=</m:t>
+              </m:r>
+              <m:r>
+                <m:t>0.0021</m:t>
+              </m:r>
+            </m:oMath>
+            <w:r>
+              <w:rPr>
+                <w:sz w:val="19"/>
+              </w:rPr>
+              <w:t xml:space="preserve">, 43 sets) without them</w:t>
+            </w:r>
+          </w:p>
+        </w:tc>
+        <w:tc>
+          <w:tcPr/>
+          <w:p>
+            <w:pPr>
+              <w:pStyle w:val="Compact"/>
+              <w:spacing w:line="240" w:lineRule="auto"/>
+              <w:jc w:val="center"/>
+            </w:pPr>
+            <w:r>
+              <w:rPr>
+                <w:rStyle w:val="VerbatimChar"/>
+                <w:sz w:val="19"/>
+              </w:rPr>
+              <w:t xml:space="preserve">0e26db0</w:t>
+            </w:r>
+            <w:r>
+              <w:rPr>
+                <w:sz w:val="19"/>
+              </w:rPr>
+              <w:t xml:space="preserve">,</w:t>
+            </w:r>
+            <w:r>
+              <w:rPr>
+                <w:sz w:val="19"/>
+              </w:rPr>
+              <w:t xml:space="preserve"> </w:t>
+            </w:r>
+            <w:r>
+              <w:rPr>
+                <w:rStyle w:val="VerbatimChar"/>
+                <w:sz w:val="19"/>
+              </w:rPr>
+              <w:t xml:space="preserve">187f570</w:t>
+            </w:r>
+          </w:p>
+        </w:tc>
+        <w:tc>
+          <w:tcPr/>
+          <w:p>
+            <w:pPr>
+              <w:pStyle w:val="Compact"/>
+              <w:spacing w:line="240" w:lineRule="auto"/>
+              <w:jc w:val="center"/>
+            </w:pPr>
+            <w:r>
+              <w:rPr>
+                <w:sz w:val="19"/>
+              </w:rPr>
+              <w:t xml:space="preserve">pending</w:t>
+            </w:r>
+          </w:p>
+        </w:tc>
+        <w:tc>
+          <w:tcPr/>
+          <w:p>
+            <w:pPr>
+              <w:pStyle w:val="Compact"/>
+              <w:spacing w:line="240" w:lineRule="auto"/>
+              <w:jc w:val="center"/>
+            </w:pPr>
+            <w:r>
+              <w:rPr>
+                <w:sz w:val="19"/>
+              </w:rPr>
+              <w:t xml:space="preserve">2026-10-27</w:t>
             </w:r>
           </w:p>
         </w:tc>
@@ -26157,7 +27372,7 @@
               <w:rPr>
                 <w:sz w:val="19"/>
               </w:rPr>
-              <w:t xml:space="preserve">Aborted/short incident flights induce spurious duration separation; caliper matching recovers</w:t>
+              <w:t xml:space="preserve">Aborted/short incident flights induce spurious duration separation; caliper matching lifts within-drone AUC by</w:t>
             </w:r>
             <w:r>
               <w:rPr>
@@ -26186,7 +27401,36 @@
               <w:rPr>
                 <w:sz w:val="19"/>
               </w:rPr>
-              <w:t xml:space="preserve">within-drone AUC (paired cluster CI [+0.074, +0.238]), reversing duration masking (§5.3).</w:t>
+              <w:t xml:space="preserve">[+0.028, +0.205], and by</w:t>
+            </w:r>
+            <w:r>
+              <w:rPr>
+                <w:sz w:val="19"/>
+              </w:rPr>
+              <w:t xml:space="preserve"> </w:t>
+            </w:r>
+            <m:oMath>
+              <m:r>
+                <m:rPr>
+                  <m:sty m:val="p"/>
+                </m:rPr>
+                <m:t>+</m:t>
+              </m:r>
+              <m:r>
+                <m:t>0.077</m:t>
+              </m:r>
+            </m:oMath>
+            <w:r>
+              <w:rPr>
+                <w:sz w:val="19"/>
+              </w:rPr>
+              <w:t xml:space="preserve"> </w:t>
+            </w:r>
+            <w:r>
+              <w:rPr>
+                <w:sz w:val="19"/>
+              </w:rPr>
+              <w:t xml:space="preserve">[+0.013, +0.204] without duration-linked features (§5.3).</w:t>
             </w:r>
           </w:p>
         </w:tc>
@@ -26561,7 +27805,7 @@
         <w:t xml:space="preserve"> </w:t>
       </w:r>
       <w:r>
-        <w:t xml:space="preserve">mark; pilot recall 1 of 5, exact Clopper–Pearson 95% CI 0.5–71.6%; conservative class-averaged bound 0.19–0.73). Our prospectively declared negative result applies to linear models and decision stumps; exploratory depth-3 decision trees across cut-offs yielded AUCs of 0.366–0.603 (upper bounds 0.519–0.724), with the upper bound dropping to 0.524 at</w:t>
+        <w:t xml:space="preserve">mark; pilot recall 1 of 5, exact Clopper–Pearson 95% CI 0.5–71.6%; conservative class-averaged bound 0.19–0.73). Our prospectively declared negative result applies to linear models and decision stumps; exploratory depth-3 decision trees across cut-offs yielded AUCs of 0.366–0.603 (upper bounds 0.519–0.724), with upper bounds of 0.519–0.604 at</w:t>
       </w:r>
       <w:r>
         <w:t xml:space="preserve"> </w:t>
@@ -26574,14 +27818,14 @@
           <m:rPr>
             <m:sty m:val="p"/>
           </m:rPr>
-          <m:t>=</m:t>
+          <m:t>≥</m:t>
         </m:r>
         <m:r>
           <m:t>10</m:t>
         </m:r>
       </m:oMath>
       <w:r>
-        <w:t xml:space="preserve"> s, confirming that non-linear trees also fall within chance under leakage control. Across the telemetry features, rules, models, and</w:t>
+        <w:t xml:space="preserve"> s, giving no evidence that non-linear trees separate the classes. Across the telemetry features, rules, models, and</w:t>
       </w:r>
       <w:r>
         <w:t xml:space="preserve"> </w:t>
@@ -26758,7 +28002,27 @@
         <w:t xml:space="preserve"> </w:t>
       </w:r>
       <w:r>
-        <w:t xml:space="preserve">on the exact same 36 airframes; paired cluster bootstrap 95% CI [+0.074, +0.238]), suggesting that baseline duration differences between crash and non-crash flights may mask within-drone precursor detection in this cohort; the alternative reading is that the gain is carried by duration-linked features (clipping, tilt envelope, voltage sag), and a fixed 30 s window did not reproduce it. Diagnostic checks were also</w:t>
+        <w:t xml:space="preserve">on the exact same 36 airframes; paired cluster bootstrap 95% CI [+0.028, +0.205] with reproducible folds), suggesting that baseline duration differences between crash and non-crash flights may mask within-drone precursor detection in this cohort; without the duration-linked clipping, tilt and voltage-sag features the lift is</w:t>
+      </w:r>
+      <w:r>
+        <w:t xml:space="preserve"> </w:t>
+      </w:r>
+      <m:oMath>
+        <m:r>
+          <m:rPr>
+            <m:sty m:val="p"/>
+          </m:rPr>
+          <m:t>+</m:t>
+        </m:r>
+        <m:r>
+          <m:t>0.077</m:t>
+        </m:r>
+      </m:oMath>
+      <w:r>
+        <w:t xml:space="preserve"> </w:t>
+      </w:r>
+      <w:r>
+        <w:t xml:space="preserve">[+0.013, +0.204], so the gain is not carried only by them, although a fixed 30 s window did not reproduce it. Diagnostic checks were also</w:t>
       </w:r>
       <w:r>
         <w:t xml:space="preserve"> </w:t>
@@ -28298,6 +29562,24 @@
           <w:b/>
           <w:bCs/>
         </w:rPr>
+        <w:t xml:space="preserve">Flight order.</w:t>
+      </w:r>
+      <w:r>
+        <w:t xml:space="preserve"> </w:t>
+      </w:r>
+      <w:r>
+        <w:t xml:space="preserve">Earlier flights were selected by calendar date. GPS times showed that 47 of 95 crash-day exposure flights in the between-drone sample were flown after the crash; the between-drone result held without them (§5.5), but the within-drone, caliper and same-aircraft samples have not been audited for the same problem.</w:t>
+      </w:r>
+    </w:p>
+    <w:p>
+      <w:pPr>
+        <w:pStyle w:val="BodyText"/>
+      </w:pPr>
+      <w:r>
+        <w:rPr>
+          <w:b/>
+          <w:bCs/>
+        </w:rPr>
         <w:t xml:space="preserve">Attrition.</w:t>
       </w:r>
       <w:r>
@@ -28747,7 +30029,7 @@
         </m:r>
       </m:oMath>
       <w:r>
-        <w:t xml:space="preserve">, falling to 0.524 at</w:t>
+        <w:t xml:space="preserve">, 0.519–0.604 at</w:t>
       </w:r>
       <w:r>
         <w:t xml:space="preserve"> </w:t>
@@ -28760,7 +30042,7 @@
           <m:rPr>
             <m:sty m:val="p"/>
           </m:rPr>
-          <m:t>=</m:t>
+          <m:t>≥</m:t>
         </m:r>
         <m:r>
           <m:t>10</m:t>

</xml_diff>

<commit_message>
Paper: Integrate post-crash flight audit (withdraw caliper masking reading)
85 of 210 crash-day earlier flights in the within-drone samples were flown
after the crash. Abstract, contribution (i), section 5.3, Table 6 (Step 6b),
section 5.4, checklist items 3-4, discussion and threats updated: rank
tests unchanged; within-drone model at most a weak, pipeline-dependent
signal (0.582 [0.525, 0.660] stored, 0.507 recomputed); caliper lift no
longer distinguishable from zero, masking reading withdrawn. Revision-table
row added. PDF, Word, Overleaf zip, HANDOFF and critical_review rebuilt.

Co-Authored-By: Claude Opus 5.5 <noreply@anthropic.com>
</commit_message>
<xml_diff>
--- a/docs/paper/submission/manuscript.docx
+++ b/docs/paper/submission/manuscript.docx
@@ -196,47 +196,7 @@
         </m:sSup>
       </m:oMath>
       <w:r>
-        <w:t xml:space="preserve">A factorial audit of 32 evaluation settings found that apparent anticipation depends on the comparison set; the cause is not isolated. AUC fell 0.21 [0.06, 0.34] across other-aircraft settings (0.88 to 0.67); only vehicle-grouped folds were material (0.06 [0.03, 0.09]). Against each drone’s own earlier flights, AUC was at chance (0.569, cluster bootstrap [0.500, 0.643]). Duration-caliper matching (0.25) lifted it by</w:t>
-      </w:r>
-      <w:r>
-        <w:t xml:space="preserve"> </w:t>
-      </w:r>
-      <m:oMath>
-        <m:r>
-          <m:rPr>
-            <m:sty m:val="p"/>
-          </m:rPr>
-          <m:t>+</m:t>
-        </m:r>
-        <m:r>
-          <m:t>0.110</m:t>
-        </m:r>
-      </m:oMath>
-      <w:r>
-        <w:t xml:space="preserve"> </w:t>
-      </w:r>
-      <w:r>
-        <w:t xml:space="preserve">(36 airframes; paired cluster CI [+0.028, +0.205]), and by</w:t>
-      </w:r>
-      <w:r>
-        <w:t xml:space="preserve"> </w:t>
-      </w:r>
-      <m:oMath>
-        <m:r>
-          <m:rPr>
-            <m:sty m:val="p"/>
-          </m:rPr>
-          <m:t>+</m:t>
-        </m:r>
-        <m:r>
-          <m:t>0.077</m:t>
-        </m:r>
-      </m:oMath>
-      <w:r>
-        <w:t xml:space="preserve"> </w:t>
-      </w:r>
-      <w:r>
-        <w:t xml:space="preserve">[+0.013, +0.204] without clipping, tilt and voltage-sag features; a fixed 30 s window did not.</w:t>
+        <w:t xml:space="preserve">A factorial audit of 32 evaluation settings found that apparent anticipation depends on the comparison set; the cause is not isolated. AUC fell 0.21 [0.06, 0.34] across other-aircraft settings (0.88 to 0.67); only vehicle-grouped folds were material (0.06 [0.03, 0.09]).</w:t>
       </w:r>
       <w:r>
         <w:t xml:space="preserve"> </w:t>
@@ -259,47 +219,50 @@
         </m:sSup>
       </m:oMath>
       <w:r>
-        <w:t xml:space="preserve">Tuning-check sensitivity fell from 7/9 to 1/9 without the final 10 s (exploratory, unadjusted</w:t>
-      </w:r>
-      <w:r>
-        <w:t xml:space="preserve"> </w:t>
-      </w:r>
-      <m:oMath>
-        <m:r>
-          <m:t>p</m:t>
-        </m:r>
-        <m:r>
-          <m:rPr>
-            <m:sty m:val="p"/>
-          </m:rPr>
-          <m:t>=</m:t>
-        </m:r>
-        <m:r>
-          <m:t>0.031</m:t>
-        </m:r>
-      </m:oMath>
-      <w:r>
-        <w:t xml:space="preserve">; normal false alarms 13% to 5%), consistent with leakage. Crashed drones vibrated more on older estimator metrics (mean rank 0.67, Holm</w:t>
-      </w:r>
-      <w:r>
-        <w:t xml:space="preserve"> </w:t>
-      </w:r>
-      <m:oMath>
-        <m:r>
-          <m:t>p</m:t>
-        </m:r>
-        <m:r>
-          <m:rPr>
-            <m:sty m:val="p"/>
-          </m:rPr>
-          <m:t>=</m:t>
-        </m:r>
-        <m:r>
-          <m:t>0.016</m:t>
-        </m:r>
-      </m:oMath>
-      <w:r>
-        <w:t xml:space="preserve">;</w:t>
+        <w:t xml:space="preserve">85 of 210 crash-day</w:t>
+      </w:r>
+      <w:r>
+        <w:t xml:space="preserve"> </w:t>
+      </w:r>
+      <w:r>
+        <w:t xml:space="preserve">“earlier”</w:t>
+      </w:r>
+      <w:r>
+        <w:t xml:space="preserve"> </w:t>
+      </w:r>
+      <w:r>
+        <w:t xml:space="preserve">flights were flown after the crash; without them, a drone’s own earlier flights gave at most a weak signal (AUC 0.582 [0.525, 0.660] on stored features, 0.507 [0.436, 0.582] recomputed), and an apparent duration-caliper lift vanished (</w:t>
+      </w:r>
+      <m:oMath>
+        <m:r>
+          <m:rPr>
+            <m:sty m:val="p"/>
+          </m:rPr>
+          <m:t>+</m:t>
+        </m:r>
+        <m:r>
+          <m:t>0.063</m:t>
+        </m:r>
+      </m:oMath>
+      <w:r>
+        <w:t xml:space="preserve"> </w:t>
+      </w:r>
+      <w:r>
+        <w:t xml:space="preserve">[</w:t>
+      </w:r>
+      <m:oMath>
+        <m:r>
+          <m:rPr>
+            <m:sty m:val="p"/>
+          </m:rPr>
+          <m:t>−</m:t>
+        </m:r>
+        <m:r>
+          <m:t>0.087</m:t>
+        </m:r>
+      </m:oMath>
+      <w:r>
+        <w:t xml:space="preserve">, +0.159]).</w:t>
       </w:r>
       <w:r>
         <w:t xml:space="preserve"> </w:t>
@@ -322,7 +285,7 @@
         </m:sSup>
       </m:oMath>
       <w:r>
-        <w:t xml:space="preserve">0.70 without 47 exposure flights flown after the crash; newer metrics inconclusive,</w:t>
+        <w:t xml:space="preserve">Tuning-check sensitivity fell from 7/9 to 1/9 without the final 10 s (exploratory, unadjusted</w:t>
       </w:r>
       <w:r>
         <w:t xml:space="preserve"> </w:t>
@@ -338,11 +301,31 @@
           <m:t>=</m:t>
         </m:r>
         <m:r>
-          <m:t>0.25</m:t>
-        </m:r>
-      </m:oMath>
-      <w:r>
-        <w:t xml:space="preserve">).</w:t>
+          <m:t>0.031</m:t>
+        </m:r>
+      </m:oMath>
+      <w:r>
+        <w:t xml:space="preserve">; normal false alarms 13% to 5%), consistent with leakage. Crashed drones vibrated more on older estimator metrics (mean rank 0.67, Holm</w:t>
+      </w:r>
+      <w:r>
+        <w:t xml:space="preserve"> </w:t>
+      </w:r>
+      <m:oMath>
+        <m:r>
+          <m:t>p</m:t>
+        </m:r>
+        <m:r>
+          <m:rPr>
+            <m:sty m:val="p"/>
+          </m:rPr>
+          <m:t>=</m:t>
+        </m:r>
+        <m:r>
+          <m:t>0.016</m:t>
+        </m:r>
+      </m:oMath>
+      <w:r>
+        <w:t xml:space="preserve">;</w:t>
       </w:r>
       <w:r>
         <w:t xml:space="preserve"> </w:t>
@@ -365,622 +348,30 @@
         </m:sSup>
       </m:oMath>
       <w:r>
-        <w:t xml:space="preserve">Against 107 controls, screening gave</w:t>
-      </w:r>
-      <w:r>
-        <w:t xml:space="preserve"> </w:t>
-      </w:r>
-      <m:oMath>
-        <m:r>
-          <m:t>3.3</m:t>
-        </m:r>
-        <m:r>
-          <m:rPr>
-            <m:sty m:val="p"/>
-          </m:rPr>
-          <m:t>×</m:t>
-        </m:r>
-      </m:oMath>
-      <w:r>
-        <w:t xml:space="preserve"> </w:t>
-      </w:r>
-      <w:r>
-        <w:t xml:space="preserve">lift (illustrative PPV 2.26–2.43% at 10% flag rate). AeroFleet 2.0 shows longitudinal evidence without automatic verdicts.</w:t>
-      </w:r>
-    </w:p>
-    <w:p>
-      <w:pPr>
-        <w:pStyle w:val="BodyText"/>
-      </w:pPr>
-      <w:r>
-        <w:rPr>
-          <w:b/>
-          <w:bCs/>
-        </w:rPr>
-        <w:t xml:space="preserve">Keywords:</w:t>
-      </w:r>
-      <w:r>
-        <w:t xml:space="preserve"> </w:t>
-      </w:r>
-      <w:r>
-        <w:t xml:space="preserve">Unmanned aircraft systems; Flight logs; Crash investigation; Fault diagnosis; Data leakage; Fleet assurance</w:t>
-      </w:r>
-    </w:p>
-    <w:p>
-      <w:pPr>
-        <w:pStyle w:val="Heading1"/>
-      </w:pPr>
-      <w:bookmarkStart w:id="10" w:name="_20041c78c304d06f00dcef5457d2ac08ae2eef7"/>
-      <w:r>
-        <w:rPr>
-          <w:rStyle w:val="SectionNumber"/>
-        </w:rPr>
-        <w:t xml:space="preserve">1</w:t>
-      </w:r>
-      <w:r>
-        <w:tab/>
-      </w:r>
-      <w:r>
-        <w:t xml:space="preserve">Introduction</w:t>
-      </w:r>
-      <w:bookmarkEnd w:id="10"/>
-    </w:p>
-    <w:p>
-      <w:pPr>
-        <w:pStyle w:val="FirstParagraph"/>
-      </w:pPr>
-      <w:r>
-        <w:t xml:space="preserve">Small unmanned aircraft are now flown commercially for survey, inspection, agriculture and delivery, and the rules</w:t>
-      </w:r>
-      <w:r>
-        <w:t xml:space="preserve"> </w:t>
-      </w:r>
-      <w:r>
-        <w:t xml:space="preserve">that govern them place weight on records. In the European Union and the United Kingdom an operator in the specific</w:t>
-      </w:r>
-      <w:r>
-        <w:t xml:space="preserve"> </w:t>
-      </w:r>
-      <w:r>
-        <w:t xml:space="preserve">category must keep records of operations, maintenance and personnel for at least three years</w:t>
-      </w:r>
-      <w:r>
-        <w:t xml:space="preserve"> </w:t>
-      </w:r>
-      <w:r>
-        <w:t xml:space="preserve">[</w:t>
-      </w:r>
-      <w:hyperlink w:anchor="_94e90323a8c21041104ada5ef51239cca731079">
-        <w:r>
-          <w:rPr>
-            <w:rStyle w:val="Hyperlink"/>
-          </w:rPr>
-          <w:t xml:space="preserve">1</w:t>
-        </w:r>
-      </w:hyperlink>
-      <w:r>
-        <w:t xml:space="preserve">,</w:t>
-      </w:r>
-      <w:hyperlink w:anchor="_accb9f9d732da81043c804de081f8bf74e6cf24">
-        <w:r>
-          <w:rPr>
-            <w:rStyle w:val="Hyperlink"/>
-          </w:rPr>
-          <w:t xml:space="preserve">2</w:t>
-        </w:r>
-      </w:hyperlink>
-      <w:r>
-        <w:t xml:space="preserve">]</w:t>
-      </w:r>
-      <w:r>
-        <w:t xml:space="preserve">; India requires an accident to be reported within 48 hours</w:t>
-      </w:r>
-      <w:r>
-        <w:t xml:space="preserve"> </w:t>
-      </w:r>
-      <w:r>
-        <w:t xml:space="preserve">[</w:t>
-      </w:r>
-      <w:hyperlink w:anchor="_2a610b70f77ace96e6ffe48ed026a6e5f9efd5a">
-        <w:r>
-          <w:rPr>
-            <w:rStyle w:val="Hyperlink"/>
-          </w:rPr>
-          <w:t xml:space="preserve">3</w:t>
-        </w:r>
-      </w:hyperlink>
-      <w:r>
-        <w:t xml:space="preserve">]</w:t>
-      </w:r>
-      <w:r>
-        <w:t xml:space="preserve">, and</w:t>
-      </w:r>
-      <w:r>
-        <w:t xml:space="preserve"> </w:t>
-      </w:r>
-      <w:r>
-        <w:t xml:space="preserve">the United States within ten days</w:t>
-      </w:r>
-      <w:r>
-        <w:t xml:space="preserve"> </w:t>
-      </w:r>
-      <w:r>
-        <w:t xml:space="preserve">[</w:t>
-      </w:r>
-      <w:hyperlink w:anchor="_dffd97137af0abb4aae0ff556af3c0d05e0ee4a">
-        <w:r>
-          <w:rPr>
-            <w:rStyle w:val="Hyperlink"/>
-          </w:rPr>
-          <w:t xml:space="preserve">4</w:t>
-        </w:r>
-      </w:hyperlink>
-      <w:r>
-        <w:t xml:space="preserve">]</w:t>
-      </w:r>
-      <w:r>
-        <w:t xml:space="preserve">. When something goes wrong, the onboard flight log is the richest</w:t>
-      </w:r>
-      <w:r>
-        <w:t xml:space="preserve"> </w:t>
-      </w:r>
-      <w:r>
-        <w:t xml:space="preserve">record available. Open-source log viewers, commercial fleet platforms and, more recently, machine-learning and</w:t>
-      </w:r>
-      <w:r>
-        <w:t xml:space="preserve"> </w:t>
-      </w:r>
-      <w:r>
-        <w:t xml:space="preserve">language-model prototypes promise to turn that log into an answer: what failed, and whether the pilot or the aircraft</w:t>
-      </w:r>
-      <w:r>
-        <w:t xml:space="preserve"> </w:t>
-      </w:r>
-      <w:r>
-        <w:t xml:space="preserve">was responsible</w:t>
-      </w:r>
-      <w:r>
-        <w:t xml:space="preserve"> </w:t>
-      </w:r>
-      <w:r>
-        <w:t xml:space="preserve">[</w:t>
-      </w:r>
-      <w:hyperlink w:anchor="_398d8a6b28c132ef0c87de1470cc655ebafd86c">
-        <w:r>
-          <w:rPr>
-            <w:rStyle w:val="Hyperlink"/>
-          </w:rPr>
-          <w:t xml:space="preserve">5</w:t>
-        </w:r>
-      </w:hyperlink>
-      <w:r>
-        <w:t xml:space="preserve">,</w:t>
-      </w:r>
-      <w:hyperlink w:anchor="_4d7bbda75dad34c83d023e6afa1cc5b99fb5426">
-        <w:r>
-          <w:rPr>
-            <w:rStyle w:val="Hyperlink"/>
-          </w:rPr>
-          <w:t xml:space="preserve">6</w:t>
-        </w:r>
-      </w:hyperlink>
-      <w:r>
-        <w:t xml:space="preserve">]</w:t>
-      </w:r>
-      <w:r>
-        <w:t xml:space="preserve">.</w:t>
-      </w:r>
-    </w:p>
-    <w:p>
-      <w:pPr>
-        <w:pStyle w:val="BodyText"/>
-      </w:pPr>
-      <w:r>
-        <w:t xml:space="preserve">The question matters beyond engineering curiosity. In aviation safety science, accidents are recognized as systemic,</w:t>
-      </w:r>
-      <w:r>
-        <w:t xml:space="preserve"> </w:t>
-      </w:r>
-      <w:r>
-        <w:t xml:space="preserve">multi-causal events involving human factors, environmental conditions and organizational influences</w:t>
-      </w:r>
-      <w:r>
-        <w:t xml:space="preserve"> </w:t>
-      </w:r>
-      <w:r>
-        <w:t xml:space="preserve">[</w:t>
-      </w:r>
-      <w:hyperlink w:anchor="_006a7190097400c6c37363d97b6f3be0cdc0b48">
-        <w:r>
-          <w:rPr>
-            <w:rStyle w:val="Hyperlink"/>
-          </w:rPr>
-          <w:t xml:space="preserve">7</w:t>
-        </w:r>
-      </w:hyperlink>
-      <w:r>
-        <w:t xml:space="preserve">]</w:t>
-      </w:r>
-      <w:r>
-        <w:t xml:space="preserve">.</w:t>
-      </w:r>
-      <w:r>
-        <w:t xml:space="preserve"> </w:t>
-      </w:r>
-      <w:r>
-        <w:t xml:space="preserve">Commercial warranty claims, insurance settlements and regulatory filings nevertheless frequently compress these dynamics</w:t>
-      </w:r>
-      <w:r>
-        <w:t xml:space="preserve"> </w:t>
-      </w:r>
-      <w:r>
-        <w:t xml:space="preserve">into a binary decision: whether the pilot or the aircraft was primarily responsible. An automatic verdict that looks</w:t>
-      </w:r>
-      <w:r>
-        <w:t xml:space="preserve"> </w:t>
-      </w:r>
-      <w:r>
-        <w:t xml:space="preserve">objective can carry weight it has not earned. Fleet operators face a related but different question: not why one flight</w:t>
-      </w:r>
-      <w:r>
-        <w:t xml:space="preserve"> </w:t>
-      </w:r>
-      <w:r>
-        <w:t xml:space="preserve">ended badly, but which of their drones are most likely to fail next and should be inspected first. A log-based method that</w:t>
-      </w:r>
-      <w:r>
-        <w:t xml:space="preserve"> </w:t>
-      </w:r>
-      <w:r>
-        <w:t xml:space="preserve">is good at the second task need not be good at the first, and confusing the two can mislead both investigators and maintainers.</w:t>
-      </w:r>
-    </w:p>
-    <w:p>
-      <w:pPr>
-        <w:pStyle w:val="BodyText"/>
-      </w:pPr>
-      <w:r>
-        <w:t xml:space="preserve">Whether logs can deliver on either expectation has, to our knowledge, not been tested at scale against real crashes</w:t>
-      </w:r>
-      <w:r>
-        <w:t xml:space="preserve"> </w:t>
-      </w:r>
-      <w:r>
-        <w:t xml:space="preserve">with evaluation protocols that guard against the two known sources of optimism. First, a log that contains a crash also</w:t>
-      </w:r>
-      <w:r>
-        <w:t xml:space="preserve"> </w:t>
-      </w:r>
-      <w:r>
-        <w:t xml:space="preserve">contains its consequences—saturated motors, extreme attitudes and estimator errors—so a detector can learn the crash</w:t>
-      </w:r>
-      <w:r>
-        <w:t xml:space="preserve"> </w:t>
-      </w:r>
-      <w:r>
-        <w:t xml:space="preserve">itself rather than its cause, a form of crash-window data leakage</w:t>
-      </w:r>
-      <w:r>
-        <w:t xml:space="preserve"> </w:t>
-      </w:r>
-      <w:r>
-        <w:t xml:space="preserve">[</w:t>
-      </w:r>
-      <w:hyperlink w:anchor="_3541019a36f31423dbace231a12fca4d5e5f1ad">
-        <w:r>
-          <w:rPr>
-            <w:rStyle w:val="Hyperlink"/>
-          </w:rPr>
-          <w:t xml:space="preserve">8</w:t>
-        </w:r>
-      </w:hyperlink>
-      <w:r>
-        <w:t xml:space="preserve">,</w:t>
-      </w:r>
-      <w:hyperlink w:anchor="_77239db318a405bdd9ca0cc5db74d4c41b2a03f">
-        <w:r>
-          <w:rPr>
-            <w:rStyle w:val="Hyperlink"/>
-          </w:rPr>
-          <w:t xml:space="preserve">9</w:t>
-        </w:r>
-      </w:hyperlink>
-      <w:r>
-        <w:t xml:space="preserve">]</w:t>
-      </w:r>
-      <w:r>
-        <w:t xml:space="preserve">. Second, comparing crash flights with other operators’ good flights mixes</w:t>
-      </w:r>
-      <w:r>
-        <w:t xml:space="preserve"> </w:t>
-      </w:r>
-      <w:r>
-        <w:t xml:space="preserve">the flight with the aircraft and the people using it, so a difference between groups need not say anything about the</w:t>
-      </w:r>
-      <w:r>
-        <w:t xml:space="preserve"> </w:t>
-      </w:r>
-      <w:r>
-        <w:t xml:space="preserve">flight that crashed (between-aircraft confounding). Public fault datasets are dominated by simulation or injected faults</w:t>
-      </w:r>
-      <w:r>
-        <w:t xml:space="preserve"> </w:t>
-      </w:r>
-      <w:r>
-        <w:t xml:space="preserve">[</w:t>
-      </w:r>
-      <w:hyperlink w:anchor="_d75d7cf63098afa5d33e189bc1a163022e7ecdc">
-        <w:r>
-          <w:rPr>
-            <w:rStyle w:val="Hyperlink"/>
-          </w:rPr>
-          <w:t xml:space="preserve">10</w:t>
-        </w:r>
-      </w:hyperlink>
-      <w:r>
-        <w:t xml:space="preserve">–</w:t>
-      </w:r>
-      <w:hyperlink w:anchor="_973650d78dc352a8b25ace59ab002a1d91cdfc9">
-        <w:r>
-          <w:rPr>
-            <w:rStyle w:val="Hyperlink"/>
-          </w:rPr>
-          <w:t xml:space="preserve">12</w:t>
-        </w:r>
-      </w:hyperlink>
-      <w:r>
-        <w:t xml:space="preserve">]</w:t>
-      </w:r>
-      <w:r>
-        <w:t xml:space="preserve">, and accident statistics classify outcomes such as loss of</w:t>
-      </w:r>
-      <w:r>
-        <w:t xml:space="preserve"> </w:t>
-      </w:r>
-      <w:r>
-        <w:t xml:space="preserve">control rather than causes visible in a log</w:t>
-      </w:r>
-      <w:r>
-        <w:t xml:space="preserve"> </w:t>
-      </w:r>
-      <w:r>
-        <w:t xml:space="preserve">[</w:t>
-      </w:r>
-      <w:hyperlink w:anchor="_42246838952b0ed0d35bd475d264714b9e743f7">
-        <w:r>
-          <w:rPr>
-            <w:rStyle w:val="Hyperlink"/>
-          </w:rPr>
-          <w:t xml:space="preserve">13</w:t>
-        </w:r>
-      </w:hyperlink>
-      <w:r>
-        <w:t xml:space="preserve">,</w:t>
-      </w:r>
-      <w:hyperlink w:anchor="_b513b568a9a02649a1ddc461a1dd01e876732a2">
-        <w:r>
-          <w:rPr>
-            <w:rStyle w:val="Hyperlink"/>
-          </w:rPr>
-          <w:t xml:space="preserve">14</w:t>
-        </w:r>
-      </w:hyperlink>
-      <w:r>
-        <w:t xml:space="preserve">]</w:t>
-      </w:r>
-      <w:r>
-        <w:t xml:space="preserve">; neither resource tests</w:t>
-      </w:r>
-      <w:r>
-        <w:t xml:space="preserve"> </w:t>
-      </w:r>
-      <w:r>
-        <w:t xml:space="preserve">whether real crash logs, evaluated under leakage-free and within-aircraft protocols, can support the attribution and</w:t>
-      </w:r>
-      <w:r>
-        <w:t xml:space="preserve"> </w:t>
-      </w:r>
-      <w:r>
-        <w:t xml:space="preserve">prioritization decisions that operators actually need.</w:t>
-      </w:r>
-    </w:p>
-    <w:p>
-      <w:pPr>
-        <w:pStyle w:val="BodyText"/>
-      </w:pPr>
-      <w:r>
-        <w:t xml:space="preserve">The central question this paper asks of the largest public archive of real autopilot logs, PX4 Flight Review</w:t>
-      </w:r>
-      <w:r>
-        <w:t xml:space="preserve"> </w:t>
-      </w:r>
-      <w:r>
-        <w:t xml:space="preserve">[</w:t>
-      </w:r>
-      <w:hyperlink w:anchor="_7bef8dc44b5ed9bb7ced7ca5f392a78a76d6601">
-        <w:r>
-          <w:rPr>
-            <w:rStyle w:val="Hyperlink"/>
-          </w:rPr>
-          <w:t xml:space="preserve">15</w:t>
-        </w:r>
-      </w:hyperlink>
-      <w:r>
-        <w:t xml:space="preserve">,</w:t>
-      </w:r>
-      <w:hyperlink w:anchor="_d96f71c5379cbcad3bc75bfc7936eeacbaeb4ed">
-        <w:r>
-          <w:rPr>
-            <w:rStyle w:val="Hyperlink"/>
-          </w:rPr>
-          <w:t xml:space="preserve">16</w:t>
-        </w:r>
-      </w:hyperlink>
-      <w:r>
-        <w:t xml:space="preserve">]</w:t>
-      </w:r>
-      <w:r>
-        <w:t xml:space="preserve">, is:</w:t>
-      </w:r>
-      <w:r>
-        <w:t xml:space="preserve"> </w:t>
-      </w:r>
-      <w:r>
-        <w:rPr>
-          <w:i/>
-          <w:iCs/>
-        </w:rPr>
-        <w:t xml:space="preserve">what evidentiary value can flight logs carry for a drone fleet</w:t>
-      </w:r>
-      <w:r>
-        <w:rPr>
-          <w:i/>
-          <w:iCs/>
-        </w:rPr>
-        <w:t xml:space="preserve"> </w:t>
-      </w:r>
-      <w:r>
-        <w:rPr>
-          <w:i/>
-          <w:iCs/>
-        </w:rPr>
-        <w:t xml:space="preserve">operator, once evaluation protocols guard against crash-window leakage and between-aircraft confounding?</w:t>
-      </w:r>
-      <w:r>
-        <w:t xml:space="preserve"> </w:t>
-      </w:r>
-      <w:r>
-        <w:t xml:space="preserve">We decompose</w:t>
-      </w:r>
-      <w:r>
-        <w:t xml:space="preserve"> </w:t>
-      </w:r>
-      <w:r>
-        <w:t xml:space="preserve">this into four sub-tests:</w:t>
-      </w:r>
-    </w:p>
-    <w:p>
-      <w:pPr>
-        <w:pStyle w:val="BodyText"/>
-      </w:pPr>
-      <w:r>
-        <w:rPr>
-          <w:b/>
-          <w:bCs/>
-        </w:rPr>
-        <w:t xml:space="preserve">Q1</w:t>
-      </w:r>
-      <w:r>
-        <w:t xml:space="preserve"> </w:t>
-      </w:r>
-      <w:r>
-        <w:t xml:space="preserve">Do configuration settings differ between crash flights and normal flights, and can that difference indicate</w:t>
-      </w:r>
-      <w:r>
-        <w:t xml:space="preserve"> </w:t>
-      </w:r>
-      <w:r>
-        <w:t xml:space="preserve">who was responsible?</w:t>
-      </w:r>
-    </w:p>
-    <w:p>
-      <w:pPr>
-        <w:pStyle w:val="BodyText"/>
-      </w:pPr>
-      <w:r>
-        <w:rPr>
-          <w:b/>
-          <w:bCs/>
-        </w:rPr>
-        <w:t xml:space="preserve">Q2</w:t>
-      </w:r>
-      <w:r>
-        <w:t xml:space="preserve"> </w:t>
-      </w:r>
-      <w:r>
-        <w:t xml:space="preserve">Can a log separate crashes caused by the pilot from crashes caused by the aircraft—and does this separation</w:t>
-      </w:r>
-      <w:r>
-        <w:t xml:space="preserve"> </w:t>
-      </w:r>
-      <w:r>
-        <w:t xml:space="preserve">survive expert-diagnosis validation?</w:t>
-      </w:r>
-    </w:p>
-    <w:p>
-      <w:pPr>
-        <w:pStyle w:val="BodyText"/>
-      </w:pPr>
-      <w:r>
-        <w:rPr>
-          <w:b/>
-          <w:bCs/>
-        </w:rPr>
-        <w:t xml:space="preserve">Q3</w:t>
-      </w:r>
-      <w:r>
-        <w:t xml:space="preserve"> </w:t>
-      </w:r>
-      <w:r>
-        <w:t xml:space="preserve">Once within-aircraft and between-aircraft comparisons are distinguished, which comparison retains a usable</w:t>
-      </w:r>
-      <w:r>
-        <w:t xml:space="preserve"> </w:t>
-      </w:r>
-      <w:r>
-        <w:t xml:space="preserve">signal of pre-crash deterioration?</w:t>
-      </w:r>
-    </w:p>
-    <w:p>
-      <w:pPr>
-        <w:pStyle w:val="BodyText"/>
-      </w:pPr>
-      <w:r>
-        <w:rPr>
-          <w:b/>
-          <w:bCs/>
-        </w:rPr>
-        <w:t xml:space="preserve">Q4</w:t>
-      </w:r>
-      <w:r>
-        <w:t xml:space="preserve"> </w:t>
-      </w:r>
-      <w:r>
-        <w:t xml:space="preserve">Do expert diagnoses agree with uploader labels, and do automatic diagnostic checks find the faults experts</w:t>
-      </w:r>
-      <w:r>
-        <w:t xml:space="preserve"> </w:t>
-      </w:r>
-      <w:r>
-        <w:t xml:space="preserve">name without benefiting from the crash window?</w:t>
-      </w:r>
-    </w:p>
-    <w:p>
-      <w:pPr>
-        <w:pStyle w:val="BodyText"/>
-      </w:pPr>
-      <w:r>
-        <w:t xml:space="preserve">Because language-model assistants are now proposed for exactly this task, we also report a controlled evaluation of</w:t>
-      </w:r>
-      <w:r>
-        <w:t xml:space="preserve"> </w:t>
-      </w:r>
-      <w:r>
-        <w:t xml:space="preserve">small local models used as an attribution review panel, including a test for voting-consensus manipulation.</w:t>
-      </w:r>
-    </w:p>
-    <w:p>
-      <w:pPr>
-        <w:pStyle w:val="BodyText"/>
-      </w:pPr>
-      <w:r>
-        <w:t xml:space="preserve">The contributions are as follows.</w:t>
-      </w:r>
-      <w:r>
-        <w:t xml:space="preserve"> </w:t>
-      </w:r>
-      <w:r>
-        <w:t xml:space="preserve">(i) </w:t>
+        <w:t xml:space="preserve">0.70 without 47 exposure flights flown after the crash; newer metrics inconclusive,</w:t>
+      </w:r>
+      <w:r>
+        <w:t xml:space="preserve"> </w:t>
+      </w:r>
+      <m:oMath>
+        <m:r>
+          <m:t>p</m:t>
+        </m:r>
+        <m:r>
+          <m:rPr>
+            <m:sty m:val="p"/>
+          </m:rPr>
+          <m:t>=</m:t>
+        </m:r>
+        <m:r>
+          <m:t>0.25</m:t>
+        </m:r>
+      </m:oMath>
+      <w:r>
+        <w:t xml:space="preserve">).</w:t>
+      </w:r>
+      <w:r>
+        <w:t xml:space="preserve"> </w:t>
       </w:r>
       <m:oMath>
         <m:sSup>
@@ -1000,10 +391,654 @@
         </m:sSup>
       </m:oMath>
       <w:r>
-        <w:t xml:space="preserve">A factorial optimism audit that splits the apparent crash-vs-normal AUC across five evaluation choices (crash set, comparison flights, crash-window cut, fold grouping, window length; 32 settings, one feature extractor, exact Shapley split). Of a 0.21 [0.06, 0.34] drop from the most optimistic to the most conservative other-aircraft setting (0.88 to 0.67), only vehicle-grouped folds contributed materially (0.06 [0.03, 0.09]); the crash set and the choice of normal flights each carried 0.06–0.07 with intervals spanning zero, so the cause of the remaining drop is not isolated. Separation against other aircraft persisted at 0.67; comparing each drone with its own earlier flights brought it to chance. Within-drone evaluation finds no detectable precursor signal under uncalipered matching in this cohort (Group-CV AUC 0.569, 95% cluster bootstrap CI [0.500, 0.643], pairwise mean AUC 0.592 [0.516, 0.692], rank test</w:t>
-      </w:r>
-      <w:r>
-        <w:t xml:space="preserve"> </w:t>
+        <w:t xml:space="preserve">Against 107 controls, screening gave</w:t>
+      </w:r>
+      <w:r>
+        <w:t xml:space="preserve"> </w:t>
+      </w:r>
+      <m:oMath>
+        <m:r>
+          <m:t>3.3</m:t>
+        </m:r>
+        <m:r>
+          <m:rPr>
+            <m:sty m:val="p"/>
+          </m:rPr>
+          <m:t>×</m:t>
+        </m:r>
+      </m:oMath>
+      <w:r>
+        <w:t xml:space="preserve"> </w:t>
+      </w:r>
+      <w:r>
+        <w:t xml:space="preserve">lift (illustrative PPV 2.26–2.43% at 10% flag rate). AeroFleet 2.0 shows longitudinal evidence without automatic verdicts.</w:t>
+      </w:r>
+    </w:p>
+    <w:p>
+      <w:pPr>
+        <w:pStyle w:val="BodyText"/>
+      </w:pPr>
+      <w:r>
+        <w:rPr>
+          <w:b/>
+          <w:bCs/>
+        </w:rPr>
+        <w:t xml:space="preserve">Keywords:</w:t>
+      </w:r>
+      <w:r>
+        <w:t xml:space="preserve"> </w:t>
+      </w:r>
+      <w:r>
+        <w:t xml:space="preserve">Unmanned aircraft systems; Flight logs; Crash investigation; Fault diagnosis; Data leakage; Fleet assurance</w:t>
+      </w:r>
+    </w:p>
+    <w:p>
+      <w:pPr>
+        <w:pStyle w:val="Heading1"/>
+      </w:pPr>
+      <w:bookmarkStart w:id="10" w:name="_20041c78c304d06f00dcef5457d2ac08ae2eef7"/>
+      <w:r>
+        <w:rPr>
+          <w:rStyle w:val="SectionNumber"/>
+        </w:rPr>
+        <w:t xml:space="preserve">1</w:t>
+      </w:r>
+      <w:r>
+        <w:tab/>
+      </w:r>
+      <w:r>
+        <w:t xml:space="preserve">Introduction</w:t>
+      </w:r>
+      <w:bookmarkEnd w:id="10"/>
+    </w:p>
+    <w:p>
+      <w:pPr>
+        <w:pStyle w:val="FirstParagraph"/>
+      </w:pPr>
+      <w:r>
+        <w:t xml:space="preserve">Small unmanned aircraft are now flown commercially for survey, inspection, agriculture and delivery, and the rules</w:t>
+      </w:r>
+      <w:r>
+        <w:t xml:space="preserve"> </w:t>
+      </w:r>
+      <w:r>
+        <w:t xml:space="preserve">that govern them place weight on records. In the European Union and the United Kingdom an operator in the specific</w:t>
+      </w:r>
+      <w:r>
+        <w:t xml:space="preserve"> </w:t>
+      </w:r>
+      <w:r>
+        <w:t xml:space="preserve">category must keep records of operations, maintenance and personnel for at least three years</w:t>
+      </w:r>
+      <w:r>
+        <w:t xml:space="preserve"> </w:t>
+      </w:r>
+      <w:r>
+        <w:t xml:space="preserve">[</w:t>
+      </w:r>
+      <w:hyperlink w:anchor="_94e90323a8c21041104ada5ef51239cca731079">
+        <w:r>
+          <w:rPr>
+            <w:rStyle w:val="Hyperlink"/>
+          </w:rPr>
+          <w:t xml:space="preserve">1</w:t>
+        </w:r>
+      </w:hyperlink>
+      <w:r>
+        <w:t xml:space="preserve">,</w:t>
+      </w:r>
+      <w:hyperlink w:anchor="_accb9f9d732da81043c804de081f8bf74e6cf24">
+        <w:r>
+          <w:rPr>
+            <w:rStyle w:val="Hyperlink"/>
+          </w:rPr>
+          <w:t xml:space="preserve">2</w:t>
+        </w:r>
+      </w:hyperlink>
+      <w:r>
+        <w:t xml:space="preserve">]</w:t>
+      </w:r>
+      <w:r>
+        <w:t xml:space="preserve">; India requires an accident to be reported within 48 hours</w:t>
+      </w:r>
+      <w:r>
+        <w:t xml:space="preserve"> </w:t>
+      </w:r>
+      <w:r>
+        <w:t xml:space="preserve">[</w:t>
+      </w:r>
+      <w:hyperlink w:anchor="_2a610b70f77ace96e6ffe48ed026a6e5f9efd5a">
+        <w:r>
+          <w:rPr>
+            <w:rStyle w:val="Hyperlink"/>
+          </w:rPr>
+          <w:t xml:space="preserve">3</w:t>
+        </w:r>
+      </w:hyperlink>
+      <w:r>
+        <w:t xml:space="preserve">]</w:t>
+      </w:r>
+      <w:r>
+        <w:t xml:space="preserve">, and</w:t>
+      </w:r>
+      <w:r>
+        <w:t xml:space="preserve"> </w:t>
+      </w:r>
+      <w:r>
+        <w:t xml:space="preserve">the United States within ten days</w:t>
+      </w:r>
+      <w:r>
+        <w:t xml:space="preserve"> </w:t>
+      </w:r>
+      <w:r>
+        <w:t xml:space="preserve">[</w:t>
+      </w:r>
+      <w:hyperlink w:anchor="_dffd97137af0abb4aae0ff556af3c0d05e0ee4a">
+        <w:r>
+          <w:rPr>
+            <w:rStyle w:val="Hyperlink"/>
+          </w:rPr>
+          <w:t xml:space="preserve">4</w:t>
+        </w:r>
+      </w:hyperlink>
+      <w:r>
+        <w:t xml:space="preserve">]</w:t>
+      </w:r>
+      <w:r>
+        <w:t xml:space="preserve">. When something goes wrong, the onboard flight log is the richest</w:t>
+      </w:r>
+      <w:r>
+        <w:t xml:space="preserve"> </w:t>
+      </w:r>
+      <w:r>
+        <w:t xml:space="preserve">record available. Open-source log viewers, commercial fleet platforms and, more recently, machine-learning and</w:t>
+      </w:r>
+      <w:r>
+        <w:t xml:space="preserve"> </w:t>
+      </w:r>
+      <w:r>
+        <w:t xml:space="preserve">language-model prototypes promise to turn that log into an answer: what failed, and whether the pilot or the aircraft</w:t>
+      </w:r>
+      <w:r>
+        <w:t xml:space="preserve"> </w:t>
+      </w:r>
+      <w:r>
+        <w:t xml:space="preserve">was responsible</w:t>
+      </w:r>
+      <w:r>
+        <w:t xml:space="preserve"> </w:t>
+      </w:r>
+      <w:r>
+        <w:t xml:space="preserve">[</w:t>
+      </w:r>
+      <w:hyperlink w:anchor="_398d8a6b28c132ef0c87de1470cc655ebafd86c">
+        <w:r>
+          <w:rPr>
+            <w:rStyle w:val="Hyperlink"/>
+          </w:rPr>
+          <w:t xml:space="preserve">5</w:t>
+        </w:r>
+      </w:hyperlink>
+      <w:r>
+        <w:t xml:space="preserve">,</w:t>
+      </w:r>
+      <w:hyperlink w:anchor="_4d7bbda75dad34c83d023e6afa1cc5b99fb5426">
+        <w:r>
+          <w:rPr>
+            <w:rStyle w:val="Hyperlink"/>
+          </w:rPr>
+          <w:t xml:space="preserve">6</w:t>
+        </w:r>
+      </w:hyperlink>
+      <w:r>
+        <w:t xml:space="preserve">]</w:t>
+      </w:r>
+      <w:r>
+        <w:t xml:space="preserve">.</w:t>
+      </w:r>
+    </w:p>
+    <w:p>
+      <w:pPr>
+        <w:pStyle w:val="BodyText"/>
+      </w:pPr>
+      <w:r>
+        <w:t xml:space="preserve">The question matters beyond engineering curiosity. In aviation safety science, accidents are recognized as systemic,</w:t>
+      </w:r>
+      <w:r>
+        <w:t xml:space="preserve"> </w:t>
+      </w:r>
+      <w:r>
+        <w:t xml:space="preserve">multi-causal events involving human factors, environmental conditions and organizational influences</w:t>
+      </w:r>
+      <w:r>
+        <w:t xml:space="preserve"> </w:t>
+      </w:r>
+      <w:r>
+        <w:t xml:space="preserve">[</w:t>
+      </w:r>
+      <w:hyperlink w:anchor="_006a7190097400c6c37363d97b6f3be0cdc0b48">
+        <w:r>
+          <w:rPr>
+            <w:rStyle w:val="Hyperlink"/>
+          </w:rPr>
+          <w:t xml:space="preserve">7</w:t>
+        </w:r>
+      </w:hyperlink>
+      <w:r>
+        <w:t xml:space="preserve">]</w:t>
+      </w:r>
+      <w:r>
+        <w:t xml:space="preserve">.</w:t>
+      </w:r>
+      <w:r>
+        <w:t xml:space="preserve"> </w:t>
+      </w:r>
+      <w:r>
+        <w:t xml:space="preserve">Commercial warranty claims, insurance settlements and regulatory filings nevertheless frequently compress these dynamics</w:t>
+      </w:r>
+      <w:r>
+        <w:t xml:space="preserve"> </w:t>
+      </w:r>
+      <w:r>
+        <w:t xml:space="preserve">into a binary decision: whether the pilot or the aircraft was primarily responsible. An automatic verdict that looks</w:t>
+      </w:r>
+      <w:r>
+        <w:t xml:space="preserve"> </w:t>
+      </w:r>
+      <w:r>
+        <w:t xml:space="preserve">objective can carry weight it has not earned. Fleet operators face a related but different question: not why one flight</w:t>
+      </w:r>
+      <w:r>
+        <w:t xml:space="preserve"> </w:t>
+      </w:r>
+      <w:r>
+        <w:t xml:space="preserve">ended badly, but which of their drones are most likely to fail next and should be inspected first. A log-based method that</w:t>
+      </w:r>
+      <w:r>
+        <w:t xml:space="preserve"> </w:t>
+      </w:r>
+      <w:r>
+        <w:t xml:space="preserve">is good at the second task need not be good at the first, and confusing the two can mislead both investigators and maintainers.</w:t>
+      </w:r>
+    </w:p>
+    <w:p>
+      <w:pPr>
+        <w:pStyle w:val="BodyText"/>
+      </w:pPr>
+      <w:r>
+        <w:t xml:space="preserve">Whether logs can deliver on either expectation has, to our knowledge, not been tested at scale against real crashes</w:t>
+      </w:r>
+      <w:r>
+        <w:t xml:space="preserve"> </w:t>
+      </w:r>
+      <w:r>
+        <w:t xml:space="preserve">with evaluation protocols that guard against the two known sources of optimism. First, a log that contains a crash also</w:t>
+      </w:r>
+      <w:r>
+        <w:t xml:space="preserve"> </w:t>
+      </w:r>
+      <w:r>
+        <w:t xml:space="preserve">contains its consequences—saturated motors, extreme attitudes and estimator errors—so a detector can learn the crash</w:t>
+      </w:r>
+      <w:r>
+        <w:t xml:space="preserve"> </w:t>
+      </w:r>
+      <w:r>
+        <w:t xml:space="preserve">itself rather than its cause, a form of crash-window data leakage</w:t>
+      </w:r>
+      <w:r>
+        <w:t xml:space="preserve"> </w:t>
+      </w:r>
+      <w:r>
+        <w:t xml:space="preserve">[</w:t>
+      </w:r>
+      <w:hyperlink w:anchor="_3541019a36f31423dbace231a12fca4d5e5f1ad">
+        <w:r>
+          <w:rPr>
+            <w:rStyle w:val="Hyperlink"/>
+          </w:rPr>
+          <w:t xml:space="preserve">8</w:t>
+        </w:r>
+      </w:hyperlink>
+      <w:r>
+        <w:t xml:space="preserve">,</w:t>
+      </w:r>
+      <w:hyperlink w:anchor="_77239db318a405bdd9ca0cc5db74d4c41b2a03f">
+        <w:r>
+          <w:rPr>
+            <w:rStyle w:val="Hyperlink"/>
+          </w:rPr>
+          <w:t xml:space="preserve">9</w:t>
+        </w:r>
+      </w:hyperlink>
+      <w:r>
+        <w:t xml:space="preserve">]</w:t>
+      </w:r>
+      <w:r>
+        <w:t xml:space="preserve">. Second, comparing crash flights with other operators’ good flights mixes</w:t>
+      </w:r>
+      <w:r>
+        <w:t xml:space="preserve"> </w:t>
+      </w:r>
+      <w:r>
+        <w:t xml:space="preserve">the flight with the aircraft and the people using it, so a difference between groups need not say anything about the</w:t>
+      </w:r>
+      <w:r>
+        <w:t xml:space="preserve"> </w:t>
+      </w:r>
+      <w:r>
+        <w:t xml:space="preserve">flight that crashed (between-aircraft confounding). Public fault datasets are dominated by simulation or injected faults</w:t>
+      </w:r>
+      <w:r>
+        <w:t xml:space="preserve"> </w:t>
+      </w:r>
+      <w:r>
+        <w:t xml:space="preserve">[</w:t>
+      </w:r>
+      <w:hyperlink w:anchor="_d75d7cf63098afa5d33e189bc1a163022e7ecdc">
+        <w:r>
+          <w:rPr>
+            <w:rStyle w:val="Hyperlink"/>
+          </w:rPr>
+          <w:t xml:space="preserve">10</w:t>
+        </w:r>
+      </w:hyperlink>
+      <w:r>
+        <w:t xml:space="preserve">–</w:t>
+      </w:r>
+      <w:hyperlink w:anchor="_973650d78dc352a8b25ace59ab002a1d91cdfc9">
+        <w:r>
+          <w:rPr>
+            <w:rStyle w:val="Hyperlink"/>
+          </w:rPr>
+          <w:t xml:space="preserve">12</w:t>
+        </w:r>
+      </w:hyperlink>
+      <w:r>
+        <w:t xml:space="preserve">]</w:t>
+      </w:r>
+      <w:r>
+        <w:t xml:space="preserve">, and accident statistics classify outcomes such as loss of</w:t>
+      </w:r>
+      <w:r>
+        <w:t xml:space="preserve"> </w:t>
+      </w:r>
+      <w:r>
+        <w:t xml:space="preserve">control rather than causes visible in a log</w:t>
+      </w:r>
+      <w:r>
+        <w:t xml:space="preserve"> </w:t>
+      </w:r>
+      <w:r>
+        <w:t xml:space="preserve">[</w:t>
+      </w:r>
+      <w:hyperlink w:anchor="_42246838952b0ed0d35bd475d264714b9e743f7">
+        <w:r>
+          <w:rPr>
+            <w:rStyle w:val="Hyperlink"/>
+          </w:rPr>
+          <w:t xml:space="preserve">13</w:t>
+        </w:r>
+      </w:hyperlink>
+      <w:r>
+        <w:t xml:space="preserve">,</w:t>
+      </w:r>
+      <w:hyperlink w:anchor="_b513b568a9a02649a1ddc461a1dd01e876732a2">
+        <w:r>
+          <w:rPr>
+            <w:rStyle w:val="Hyperlink"/>
+          </w:rPr>
+          <w:t xml:space="preserve">14</w:t>
+        </w:r>
+      </w:hyperlink>
+      <w:r>
+        <w:t xml:space="preserve">]</w:t>
+      </w:r>
+      <w:r>
+        <w:t xml:space="preserve">; neither resource tests</w:t>
+      </w:r>
+      <w:r>
+        <w:t xml:space="preserve"> </w:t>
+      </w:r>
+      <w:r>
+        <w:t xml:space="preserve">whether real crash logs, evaluated under leakage-free and within-aircraft protocols, can support the attribution and</w:t>
+      </w:r>
+      <w:r>
+        <w:t xml:space="preserve"> </w:t>
+      </w:r>
+      <w:r>
+        <w:t xml:space="preserve">prioritization decisions that operators actually need.</w:t>
+      </w:r>
+    </w:p>
+    <w:p>
+      <w:pPr>
+        <w:pStyle w:val="BodyText"/>
+      </w:pPr>
+      <w:r>
+        <w:t xml:space="preserve">The central question this paper asks of the largest public archive of real autopilot logs, PX4 Flight Review</w:t>
+      </w:r>
+      <w:r>
+        <w:t xml:space="preserve"> </w:t>
+      </w:r>
+      <w:r>
+        <w:t xml:space="preserve">[</w:t>
+      </w:r>
+      <w:hyperlink w:anchor="_7bef8dc44b5ed9bb7ced7ca5f392a78a76d6601">
+        <w:r>
+          <w:rPr>
+            <w:rStyle w:val="Hyperlink"/>
+          </w:rPr>
+          <w:t xml:space="preserve">15</w:t>
+        </w:r>
+      </w:hyperlink>
+      <w:r>
+        <w:t xml:space="preserve">,</w:t>
+      </w:r>
+      <w:hyperlink w:anchor="_d96f71c5379cbcad3bc75bfc7936eeacbaeb4ed">
+        <w:r>
+          <w:rPr>
+            <w:rStyle w:val="Hyperlink"/>
+          </w:rPr>
+          <w:t xml:space="preserve">16</w:t>
+        </w:r>
+      </w:hyperlink>
+      <w:r>
+        <w:t xml:space="preserve">]</w:t>
+      </w:r>
+      <w:r>
+        <w:t xml:space="preserve">, is:</w:t>
+      </w:r>
+      <w:r>
+        <w:t xml:space="preserve"> </w:t>
+      </w:r>
+      <w:r>
+        <w:rPr>
+          <w:i/>
+          <w:iCs/>
+        </w:rPr>
+        <w:t xml:space="preserve">what evidentiary value can flight logs carry for a drone fleet</w:t>
+      </w:r>
+      <w:r>
+        <w:rPr>
+          <w:i/>
+          <w:iCs/>
+        </w:rPr>
+        <w:t xml:space="preserve"> </w:t>
+      </w:r>
+      <w:r>
+        <w:rPr>
+          <w:i/>
+          <w:iCs/>
+        </w:rPr>
+        <w:t xml:space="preserve">operator, once evaluation protocols guard against crash-window leakage and between-aircraft confounding?</w:t>
+      </w:r>
+      <w:r>
+        <w:t xml:space="preserve"> </w:t>
+      </w:r>
+      <w:r>
+        <w:t xml:space="preserve">We decompose</w:t>
+      </w:r>
+      <w:r>
+        <w:t xml:space="preserve"> </w:t>
+      </w:r>
+      <w:r>
+        <w:t xml:space="preserve">this into four sub-tests:</w:t>
+      </w:r>
+    </w:p>
+    <w:p>
+      <w:pPr>
+        <w:pStyle w:val="BodyText"/>
+      </w:pPr>
+      <w:r>
+        <w:rPr>
+          <w:b/>
+          <w:bCs/>
+        </w:rPr>
+        <w:t xml:space="preserve">Q1</w:t>
+      </w:r>
+      <w:r>
+        <w:t xml:space="preserve"> </w:t>
+      </w:r>
+      <w:r>
+        <w:t xml:space="preserve">Do configuration settings differ between crash flights and normal flights, and can that difference indicate</w:t>
+      </w:r>
+      <w:r>
+        <w:t xml:space="preserve"> </w:t>
+      </w:r>
+      <w:r>
+        <w:t xml:space="preserve">who was responsible?</w:t>
+      </w:r>
+    </w:p>
+    <w:p>
+      <w:pPr>
+        <w:pStyle w:val="BodyText"/>
+      </w:pPr>
+      <w:r>
+        <w:rPr>
+          <w:b/>
+          <w:bCs/>
+        </w:rPr>
+        <w:t xml:space="preserve">Q2</w:t>
+      </w:r>
+      <w:r>
+        <w:t xml:space="preserve"> </w:t>
+      </w:r>
+      <w:r>
+        <w:t xml:space="preserve">Can a log separate crashes caused by the pilot from crashes caused by the aircraft—and does this separation</w:t>
+      </w:r>
+      <w:r>
+        <w:t xml:space="preserve"> </w:t>
+      </w:r>
+      <w:r>
+        <w:t xml:space="preserve">survive expert-diagnosis validation?</w:t>
+      </w:r>
+    </w:p>
+    <w:p>
+      <w:pPr>
+        <w:pStyle w:val="BodyText"/>
+      </w:pPr>
+      <w:r>
+        <w:rPr>
+          <w:b/>
+          <w:bCs/>
+        </w:rPr>
+        <w:t xml:space="preserve">Q3</w:t>
+      </w:r>
+      <w:r>
+        <w:t xml:space="preserve"> </w:t>
+      </w:r>
+      <w:r>
+        <w:t xml:space="preserve">Once within-aircraft and between-aircraft comparisons are distinguished, which comparison retains a usable</w:t>
+      </w:r>
+      <w:r>
+        <w:t xml:space="preserve"> </w:t>
+      </w:r>
+      <w:r>
+        <w:t xml:space="preserve">signal of pre-crash deterioration?</w:t>
+      </w:r>
+    </w:p>
+    <w:p>
+      <w:pPr>
+        <w:pStyle w:val="BodyText"/>
+      </w:pPr>
+      <w:r>
+        <w:rPr>
+          <w:b/>
+          <w:bCs/>
+        </w:rPr>
+        <w:t xml:space="preserve">Q4</w:t>
+      </w:r>
+      <w:r>
+        <w:t xml:space="preserve"> </w:t>
+      </w:r>
+      <w:r>
+        <w:t xml:space="preserve">Do expert diagnoses agree with uploader labels, and do automatic diagnostic checks find the faults experts</w:t>
+      </w:r>
+      <w:r>
+        <w:t xml:space="preserve"> </w:t>
+      </w:r>
+      <w:r>
+        <w:t xml:space="preserve">name without benefiting from the crash window?</w:t>
+      </w:r>
+    </w:p>
+    <w:p>
+      <w:pPr>
+        <w:pStyle w:val="BodyText"/>
+      </w:pPr>
+      <w:r>
+        <w:t xml:space="preserve">Because language-model assistants are now proposed for exactly this task, we also report a controlled evaluation of</w:t>
+      </w:r>
+      <w:r>
+        <w:t xml:space="preserve"> </w:t>
+      </w:r>
+      <w:r>
+        <w:t xml:space="preserve">small local models used as an attribution review panel, including a test for voting-consensus manipulation.</w:t>
+      </w:r>
+    </w:p>
+    <w:p>
+      <w:pPr>
+        <w:pStyle w:val="BodyText"/>
+      </w:pPr>
+      <w:r>
+        <w:t xml:space="preserve">The contributions are as follows.</w:t>
+      </w:r>
+      <w:r>
+        <w:t xml:space="preserve"> </w:t>
+      </w:r>
+      <w:r>
+        <w:t xml:space="preserve">(i) </w:t>
+      </w:r>
+      <m:oMath>
+        <m:sSup>
+          <m:e>
+            <m:r>
+              <m:t>​</m:t>
+            </m:r>
+          </m:e>
+          <m:sup>
+            <m:r>
+              <m:rPr>
+                <m:sty m:val="p"/>
+              </m:rPr>
+              <m:t>†</m:t>
+            </m:r>
+          </m:sup>
+        </m:sSup>
+      </m:oMath>
+      <w:r>
+        <w:t xml:space="preserve">A factorial optimism audit that splits the apparent crash-vs-normal AUC across five evaluation choices (crash set, comparison flights, crash-window cut, fold grouping, window length; 32 settings, one feature extractor, exact Shapley split). Of a 0.21 [0.06, 0.34] drop from the most optimistic to the most conservative other-aircraft setting (0.88 to 0.67), only vehicle-grouped folds contributed materially (0.06 [0.03, 0.09]); the crash set and the choice of normal flights each carried 0.06–0.07 with intervals spanning zero, so the cause of the remaining drop is not isolated. Separation against other aircraft persisted at 0.67; comparing each drone with its own earlier flights brought it to chance. A GPS-time audit found that 85 of 210 crash-day</w:t>
+      </w:r>
+      <w:r>
+        <w:t xml:space="preserve"> </w:t>
+      </w:r>
+      <w:r>
+        <w:t xml:space="preserve">“earlier”</w:t>
+      </w:r>
+      <w:r>
+        <w:t xml:space="preserve"> </w:t>
+      </w:r>
+      <w:r>
+        <w:t xml:space="preserve">flights had been flown after the crash. Without them, single-feature rank tests still show no within-drone warning (</w:t>
       </w:r>
       <m:oMath>
         <m:acc>
@@ -1023,70 +1058,34 @@
           <m:t>=</m:t>
         </m:r>
         <m:r>
-          <m:t>0.48</m:t>
-        </m:r>
-      </m:oMath>
-      <w:r>
-        <w:t xml:space="preserve">), whereas exploratory duration caliper matching (</w:t>
-      </w:r>
-      <m:oMath>
-        <m:r>
-          <m:rPr>
-            <m:sty m:val="p"/>
-          </m:rPr>
-          <m:t>|</m:t>
-        </m:r>
-        <m:r>
-          <m:rPr>
-            <m:sty m:val="p"/>
-          </m:rPr>
-          <m:t>Δ</m:t>
-        </m:r>
-        <m:r>
-          <m:rPr>
-            <m:sty m:val="p"/>
-          </m:rPr>
-          <m:t>ln</m:t>
-        </m:r>
-        <m:r>
-          <m:rPr>
-            <m:sty m:val="p"/>
-          </m:rPr>
-          <m:t>(</m:t>
-        </m:r>
-        <m:r>
-          <m:rPr>
-            <m:nor/>
-          </m:rPr>
-          <m:t>duration</m:t>
-        </m:r>
-        <m:r>
-          <m:rPr>
-            <m:sty m:val="p"/>
-          </m:rPr>
-          <m:t>)</m:t>
-        </m:r>
-        <m:r>
-          <m:rPr>
-            <m:sty m:val="p"/>
-          </m:rPr>
-          <m:t>|</m:t>
-        </m:r>
-        <m:r>
-          <m:rPr>
-            <m:sty m:val="p"/>
-          </m:rPr>
-          <m:t>≤</m:t>
-        </m:r>
-        <m:r>
-          <m:t>0.25</m:t>
-        </m:r>
-      </m:oMath>
-      <w:r>
-        <w:t xml:space="preserve">) yields an AUC lift of</w:t>
-      </w:r>
-      <w:r>
-        <w:t xml:space="preserve"> </w:t>
+          <m:t>0.49</m:t>
+        </m:r>
+      </m:oMath>
+      <w:r>
+        <w:t xml:space="preserve"> </w:t>
+      </w:r>
+      <w:r>
+        <w:t xml:space="preserve">and 0.55,</w:t>
+      </w:r>
+      <w:r>
+        <w:t xml:space="preserve"> </w:t>
+      </w:r>
+      <m:oMath>
+        <m:r>
+          <m:t>p</m:t>
+        </m:r>
+        <m:r>
+          <m:rPr>
+            <m:sty m:val="p"/>
+          </m:rPr>
+          <m:t>≥</m:t>
+        </m:r>
+        <m:r>
+          <m:t>0.21</m:t>
+        </m:r>
+      </m:oMath>
+      <w:r>
+        <w:t xml:space="preserve">), the within-drone model gives at most a weak signal (0.582 [0.525, 0.660] on stored features; 0.507 [0.436, 0.582] on recomputed features), and the duration-caliper lift reported in earlier versions (</w:t>
       </w:r>
       <m:oMath>
         <m:r>
@@ -1103,10 +1102,7 @@
         <w:t xml:space="preserve"> </w:t>
       </w:r>
       <w:r>
-        <w:t xml:space="preserve">(95% paired cluster bootstrap CI [+0.028, +0.205] on 36 airframes) and</w:t>
-      </w:r>
-      <w:r>
-        <w:t xml:space="preserve"> </w:t>
+        <w:t xml:space="preserve">[+0.028, +0.205]) is no longer distinguishable from zero (</w:t>
       </w:r>
       <m:oMath>
         <m:r>
@@ -1116,14 +1112,28 @@
           <m:t>+</m:t>
         </m:r>
         <m:r>
-          <m:t>0.077</m:t>
-        </m:r>
-      </m:oMath>
-      <w:r>
-        <w:t xml:space="preserve"> </w:t>
-      </w:r>
-      <w:r>
-        <w:t xml:space="preserve">[+0.013, +0.204] without the clipping, tilt and voltage-sag features, so the lift is not carried only by duration-linked features; a fixed 30 s window did not reproduce it, and within-drone AUC stays at 0.57–0.64.</w:t>
+          <m:t>0.086</m:t>
+        </m:r>
+      </m:oMath>
+      <w:r>
+        <w:t xml:space="preserve"> </w:t>
+      </w:r>
+      <w:r>
+        <w:t xml:space="preserve">[</w:t>
+      </w:r>
+      <m:oMath>
+        <m:r>
+          <m:rPr>
+            <m:sty m:val="p"/>
+          </m:rPr>
+          <m:t>−</m:t>
+        </m:r>
+        <m:r>
+          <m:t>0.064</m:t>
+        </m:r>
+      </m:oMath>
+      <w:r>
+        <w:t xml:space="preserve">, +0.184], 24 airframes), so we withdraw the reading that duration differences mask precursors.</w:t>
       </w:r>
       <w:r>
         <w:t xml:space="preserve"> </w:t>
@@ -14099,7 +14109,42 @@
         <w:pStyle w:val="BodyText"/>
       </w:pPr>
       <w:r>
-        <w:t xml:space="preserve">On the 67 multi-flight drones with 372 flights (67 pre-crash flights cut 10 s before impact and 305 earlier flights), three complementary statistics evaluate within-drone precursor separation. Evaluated across flights, pooled logistic regression yielded a cross-sectional AUC of 0.529 [0.453, 0.607] (Step 5), while vehicle-grouped cross-validation yielded an AUC of 0.569 [0.493, 0.645] (Step 6). Crucially, clustering the bootstrap resamples over whole airframe clusters widens the 95% confidence interval to [0.500, 0.643], which touches chance (0.50) and indicates that pooled model discrimination shows no detectable signal in this cohort when accounting for correlation across flights of the same airframe. The mean within-drone pairwise AUC (0.592 [0.516, 0.692]) evaluates ranking solely within each drone’s flight history; its confidence interval extends down to near-chance (0.516), consistent with the non-parametric within-drone rank test on individual physical features (</w:t>
+        <w:t xml:space="preserve">On the 67 multi-flight drones with 372 flights (67 pre-crash flights cut 10 s before impact and 305 earlier flights), three complementary statistics evaluate within-drone precursor separation. Evaluated across flights, pooled logistic regression yielded a cross-sectional AUC of 0.529 [0.453, 0.607] (Step 5), while vehicle-grouped cross-validation yielded an AUC of 0.569 [0.493, 0.645] (Step 6). Clustering the bootstrap resamples over whole airframe clusters gave a 95% interval of [0.500, 0.643], touching chance.</w:t>
+      </w:r>
+      <w:r>
+        <w:t xml:space="preserve"> </w:t>
+      </w:r>
+      <m:oMath>
+        <m:sSup>
+          <m:e>
+            <m:r>
+              <m:t>​</m:t>
+            </m:r>
+          </m:e>
+          <m:sup>
+            <m:r>
+              <m:rPr>
+                <m:sty m:val="p"/>
+              </m:rPr>
+              <m:t>†</m:t>
+            </m:r>
+          </m:sup>
+        </m:sSup>
+      </m:oMath>
+      <w:r>
+        <w:t xml:space="preserve">With reproducible folds the same sample gives 0.559 [0.511, 0.618], and after removing the 85 earlier flights that GPS time shows were flown after the crash (Section 5.5; declared audit</w:t>
+      </w:r>
+      <w:r>
+        <w:t xml:space="preserve"> </w:t>
+      </w:r>
+      <w:r>
+        <w:rPr>
+          <w:rStyle w:val="VerbatimChar"/>
+        </w:rPr>
+        <w:t xml:space="preserve">0d38f5d</w:t>
+      </w:r>
+      <w:r>
+        <w:t xml:space="preserve">), 0.582 [0.525, 0.660] on 57 drones (Table 7, Step 6b). The same comparison on recomputed features (the factorial audit’s same-aircraft cell) gives 0.507 [0.436, 0.582]. We therefore describe the within-drone model result as at most a weak signal that depends on the feature pipeline. The mean within-drone pairwise AUC (0.592 [0.516, 0.692]) evaluates ranking solely within each drone’s flight history; its confidence interval extends down to near-chance (0.516), consistent with the non-parametric within-drone rank test on individual physical features (</w:t>
       </w:r>
       <m:oMath>
         <m:acc>
@@ -14765,6 +14810,97 @@
       </m:oMath>
       <w:r>
         <w:t xml:space="preserve">, interval excluding zero), but the lift is smaller and less stable than with all features, and a fixed 30 s window did not reproduce it (§5.4).</w:t>
+      </w:r>
+      <w:r>
+        <w:t xml:space="preserve"> </w:t>
+      </w:r>
+      <m:oMath>
+        <m:sSup>
+          <m:e>
+            <m:r>
+              <m:t>​</m:t>
+            </m:r>
+          </m:e>
+          <m:sup>
+            <m:r>
+              <m:rPr>
+                <m:sty m:val="p"/>
+              </m:rPr>
+              <m:t>†</m:t>
+            </m:r>
+          </m:sup>
+        </m:sSup>
+      </m:oMath>
+      <w:r>
+        <w:t xml:space="preserve">The caliper sample also contained flights flown after the crash. Without them 24 airframes remain, and the lift is</w:t>
+      </w:r>
+      <w:r>
+        <w:t xml:space="preserve"> </w:t>
+      </w:r>
+      <m:oMath>
+        <m:r>
+          <m:rPr>
+            <m:sty m:val="p"/>
+          </m:rPr>
+          <m:t>+</m:t>
+        </m:r>
+        <m:r>
+          <m:t>0.086</m:t>
+        </m:r>
+      </m:oMath>
+      <w:r>
+        <w:t xml:space="preserve"> </w:t>
+      </w:r>
+      <w:r>
+        <w:t xml:space="preserve">[</w:t>
+      </w:r>
+      <m:oMath>
+        <m:r>
+          <m:rPr>
+            <m:sty m:val="p"/>
+          </m:rPr>
+          <m:t>−</m:t>
+        </m:r>
+        <m:r>
+          <m:t>0.064</m:t>
+        </m:r>
+      </m:oMath>
+      <w:r>
+        <w:t xml:space="preserve">, +0.184] with all features and</w:t>
+      </w:r>
+      <w:r>
+        <w:t xml:space="preserve"> </w:t>
+      </w:r>
+      <m:oMath>
+        <m:r>
+          <m:rPr>
+            <m:sty m:val="p"/>
+          </m:rPr>
+          <m:t>+</m:t>
+        </m:r>
+        <m:r>
+          <m:t>0.063</m:t>
+        </m:r>
+      </m:oMath>
+      <w:r>
+        <w:t xml:space="preserve"> </w:t>
+      </w:r>
+      <w:r>
+        <w:t xml:space="preserve">[</w:t>
+      </w:r>
+      <m:oMath>
+        <m:r>
+          <m:rPr>
+            <m:sty m:val="p"/>
+          </m:rPr>
+          <m:t>−</m:t>
+        </m:r>
+        <m:r>
+          <m:t>0.087</m:t>
+        </m:r>
+      </m:oMath>
+      <w:r>
+        <w:t xml:space="preserve">, +0.159] without the three duration-linked features. Under its declared criterion the masking reading loses support, and we withdraw it: the earlier lift depended on post-crash flights in the comparison set.</w:t>
       </w:r>
     </w:p>
     <w:bookmarkStart w:id="40" w:name="_5384c23fe540f64e7f70d79e466547294e389bd"/>
@@ -15520,6 +15656,89 @@
           </w:p>
         </w:tc>
       </w:tr>
+      <w:tr>
+        <w:tc>
+          <w:tcPr/>
+          <w:p>
+            <w:pPr>
+              <w:pStyle w:val="Compact"/>
+              <w:spacing w:line="240" w:lineRule="auto"/>
+              <w:jc w:val="left"/>
+            </w:pPr>
+            <w:r>
+              <w:rPr>
+                <w:sz w:val="19"/>
+              </w:rPr>
+              <w:t xml:space="preserve">6b</w:t>
+            </w:r>
+          </w:p>
+        </w:tc>
+        <w:tc>
+          <w:tcPr/>
+          <w:p>
+            <w:pPr>
+              <w:pStyle w:val="Compact"/>
+              <w:spacing w:line="240" w:lineRule="auto"/>
+              <w:jc w:val="left"/>
+            </w:pPr>
+            <w:r>
+              <w:rPr>
+                <w:sz w:val="19"/>
+              </w:rPr>
+              <w:t xml:space="preserve">Step 6 without earlier flights flown after the crash (GPS time)</w:t>
+            </w:r>
+          </w:p>
+        </w:tc>
+        <w:tc>
+          <w:tcPr/>
+          <w:p>
+            <w:pPr>
+              <w:pStyle w:val="Compact"/>
+              <w:spacing w:line="240" w:lineRule="auto"/>
+              <w:jc w:val="center"/>
+            </w:pPr>
+            <w:r>
+              <w:rPr>
+                <w:sz w:val="19"/>
+              </w:rPr>
+              <w:t xml:space="preserve">57 crash, 227 earlier</w:t>
+            </w:r>
+          </w:p>
+        </w:tc>
+        <w:tc>
+          <w:tcPr/>
+          <w:p>
+            <w:pPr>
+              <w:pStyle w:val="Compact"/>
+              <w:spacing w:line="240" w:lineRule="auto"/>
+              <w:jc w:val="center"/>
+            </w:pPr>
+            <w:r>
+              <w:rPr>
+                <w:sz w:val="19"/>
+              </w:rPr>
+              <w:t xml:space="preserve">0.582 [0.525, 0.660]</w:t>
+            </w:r>
+            <m:oMath>
+              <m:sSup>
+                <m:e>
+                  <m:r>
+                    <m:t>​</m:t>
+                  </m:r>
+                </m:e>
+                <m:sup>
+                  <m:r>
+                    <m:rPr>
+                      <m:sty m:val="p"/>
+                    </m:rPr>
+                    <m:t>†</m:t>
+                  </m:r>
+                </m:sup>
+              </m:sSup>
+            </m:oMath>
+          </w:p>
+        </w:tc>
+      </w:tr>
     </w:tbl>
     <w:bookmarkEnd w:id="40"/>
     <w:p>
@@ -15567,7 +15786,7 @@
         </m:sSup>
       </m:oMath>
       <w:r>
-        <w:t xml:space="preserve">Cluster bootstrap 95% CI across the 67 drone clusters is [0.500, 0.643], spanning chance (0.50).</w:t>
+        <w:t xml:space="preserve">Cluster bootstrap 95% CI across the 67 drone clusters is [0.500, 0.643], spanning chance (0.50); with reproducible folds 0.559 [0.511, 0.618]. Step 6b: post-crash flight audit, cluster bootstrap over drones.</w:t>
       </w:r>
     </w:p>
     <w:bookmarkStart w:id="41" w:name="_332204dfa69e2fa6bf2a39cf9288ea52d0052a5"/>
@@ -16750,7 +16969,7 @@
         <w:t xml:space="preserve"> </w:t>
       </w:r>
       <w:r>
-        <w:t xml:space="preserve">[0.006, 0.122]), which explains why grouping made no difference in Step 1, where most normal drones contribute one flight. The crash-window cut carried a small but non-zero 0.014 [0.007, 0.023], and the fixed 30 s window carried 0.001. Separation against other aircraft persisted at the most conservative setting (0.666 [0.557, 0.770]); replacing other-aircraft flights by the same drones’ earlier flights at matched settings lowered AUC by a further 0.21, to chance. A fixed 30 s window also did not reproduce the caliper lift within drones (Group-CV 0.455 [0.377, 0.507]); because that window also removes proximity to the crash, it is not a clean test of the masking explanation. One same-drone cell with flight-stratified folds fell below chance (0.393), which we attribute to splitting one drone’s flights across folds and do not interpret.</w:t>
+        <w:t xml:space="preserve">[0.006, 0.122]), which explains why grouping made no difference in Step 1, where most normal drones contribute one flight. The crash-window cut carried a small but non-zero 0.014 [0.007, 0.023], and the fixed 30 s window carried 0.001. Separation against other aircraft persisted at the most conservative setting (0.666 [0.557, 0.770]); replacing other-aircraft flights by the same drones’ earlier flights at matched settings lowered AUC by a further 0.21, to chance (0.507 [0.436, 0.582] after removing earlier flights flown after the crash). A fixed 30 s window also did not reproduce the caliper lift within drones (Group-CV 0.455 [0.377, 0.507]); because that window also removes proximity to the crash, it is not a clean test of the masking explanation. One same-drone cell with flight-stratified folds fell below chance (0.393), which we attribute to splitting one drone’s flights across folds and do not interpret.</w:t>
       </w:r>
     </w:p>
     <w:bookmarkStart w:id="47" w:name="_9a7638f5da02df7bc1e91f3d04aa4fe62b352e5"/>
@@ -26027,6 +26246,168 @@
               <w:rPr>
                 <w:sz w:val="19"/>
               </w:rPr>
+              <w:t xml:space="preserve">Post-crash flight audit</w:t>
+            </w:r>
+            <m:oMath>
+              <m:sSup>
+                <m:e>
+                  <m:r>
+                    <m:t>​</m:t>
+                  </m:r>
+                </m:e>
+                <m:sup>
+                  <m:r>
+                    <m:rPr>
+                      <m:sty m:val="p"/>
+                    </m:rPr>
+                    <m:t>†</m:t>
+                  </m:r>
+                </m:sup>
+              </m:sSup>
+            </m:oMath>
+          </w:p>
+        </w:tc>
+        <w:tc>
+          <w:tcPr/>
+          <w:p>
+            <w:pPr>
+              <w:pStyle w:val="Compact"/>
+              <w:spacing w:line="240" w:lineRule="auto"/>
+              <w:jc w:val="left"/>
+            </w:pPr>
+            <w:r>
+              <w:rPr>
+                <w:sz w:val="19"/>
+              </w:rPr>
+              <w:t xml:space="preserve">GPS-order the within-drone samples</w:t>
+            </w:r>
+          </w:p>
+        </w:tc>
+        <w:tc>
+          <w:tcPr/>
+          <w:p>
+            <w:pPr>
+              <w:pStyle w:val="Compact"/>
+              <w:spacing w:line="240" w:lineRule="auto"/>
+              <w:jc w:val="left"/>
+            </w:pPr>
+            <w:r>
+              <w:rPr>
+                <w:sz w:val="19"/>
+              </w:rPr>
+              <w:t xml:space="preserve">85 of 210 crash-day earlier flights followed the crash; without them rank tests unchanged, within-drone model 0.582 [0.525, 0.660], caliper lift</w:t>
+            </w:r>
+            <w:r>
+              <w:rPr>
+                <w:sz w:val="19"/>
+              </w:rPr>
+              <w:t xml:space="preserve"> </w:t>
+            </w:r>
+            <m:oMath>
+              <m:r>
+                <m:rPr>
+                  <m:sty m:val="p"/>
+                </m:rPr>
+                <m:t>+</m:t>
+              </m:r>
+              <m:r>
+                <m:t>0.086</m:t>
+              </m:r>
+            </m:oMath>
+            <w:r>
+              <w:rPr>
+                <w:sz w:val="19"/>
+              </w:rPr>
+              <w:t xml:space="preserve"> </w:t>
+            </w:r>
+            <w:r>
+              <w:rPr>
+                <w:sz w:val="19"/>
+              </w:rPr>
+              <w:t xml:space="preserve">[</w:t>
+            </w:r>
+            <m:oMath>
+              <m:r>
+                <m:rPr>
+                  <m:sty m:val="p"/>
+                </m:rPr>
+                <m:t>−</m:t>
+              </m:r>
+              <m:r>
+                <m:t>0.064</m:t>
+              </m:r>
+            </m:oMath>
+            <w:r>
+              <w:rPr>
+                <w:sz w:val="19"/>
+              </w:rPr>
+              <w:t xml:space="preserve">, +0.184] (masking withdrawn), same-aircraft 0.507</w:t>
+            </w:r>
+          </w:p>
+        </w:tc>
+        <w:tc>
+          <w:tcPr/>
+          <w:p>
+            <w:pPr>
+              <w:pStyle w:val="Compact"/>
+              <w:spacing w:line="240" w:lineRule="auto"/>
+              <w:jc w:val="center"/>
+            </w:pPr>
+            <w:r>
+              <w:rPr>
+                <w:rStyle w:val="VerbatimChar"/>
+                <w:sz w:val="19"/>
+              </w:rPr>
+              <w:t xml:space="preserve">0d38f5d</w:t>
+            </w:r>
+          </w:p>
+        </w:tc>
+        <w:tc>
+          <w:tcPr/>
+          <w:p>
+            <w:pPr>
+              <w:pStyle w:val="Compact"/>
+              <w:spacing w:line="240" w:lineRule="auto"/>
+              <w:jc w:val="center"/>
+            </w:pPr>
+            <w:r>
+              <w:rPr>
+                <w:sz w:val="19"/>
+              </w:rPr>
+              <w:t xml:space="preserve">pending</w:t>
+            </w:r>
+          </w:p>
+        </w:tc>
+        <w:tc>
+          <w:tcPr/>
+          <w:p>
+            <w:pPr>
+              <w:pStyle w:val="Compact"/>
+              <w:spacing w:line="240" w:lineRule="auto"/>
+              <w:jc w:val="center"/>
+            </w:pPr>
+            <w:r>
+              <w:rPr>
+                <w:sz w:val="19"/>
+              </w:rPr>
+              <w:t xml:space="preserve">2026-10-27</w:t>
+            </w:r>
+          </w:p>
+        </w:tc>
+      </w:tr>
+      <w:tr>
+        <w:tc>
+          <w:tcPr/>
+          <w:p>
+            <w:pPr>
+              <w:pStyle w:val="Compact"/>
+              <w:spacing w:line="240" w:lineRule="auto"/>
+              <w:jc w:val="left"/>
+            </w:pPr>
+            <w:r>
+              <w:rPr>
+                <w:sz w:val="19"/>
+              </w:rPr>
               <w:t xml:space="preserve">Round 14 audit</w:t>
             </w:r>
             <m:oMath>
@@ -27234,7 +27615,31 @@
               <w:rPr>
                 <w:sz w:val="19"/>
               </w:rPr>
-              <w:t xml:space="preserve">Disentangles airframe confounding, though in uncurated archives an uncalipered longitudinal baseline alone yielded no detectable precursor signal (AUC 0.569, cluster CI [0.500, 0.643]) without duration matching.</w:t>
+              <w:t xml:space="preserve">Disentangles airframe confounding. Order flights by GPS time, not date: 85 of 210 crash-day</w:t>
+            </w:r>
+            <w:r>
+              <w:rPr>
+                <w:sz w:val="19"/>
+              </w:rPr>
+              <w:t xml:space="preserve"> </w:t>
+            </w:r>
+            <w:r>
+              <w:rPr>
+                <w:sz w:val="19"/>
+              </w:rPr>
+              <w:t xml:space="preserve">“earlier”</w:t>
+            </w:r>
+            <w:r>
+              <w:rPr>
+                <w:sz w:val="19"/>
+              </w:rPr>
+              <w:t xml:space="preserve"> </w:t>
+            </w:r>
+            <w:r>
+              <w:rPr>
+                <w:sz w:val="19"/>
+              </w:rPr>
+              <w:t xml:space="preserve">flights in this archive were flown after the crash; without them the within-drone model gave at most a weak signal (0.582 [0.525, 0.660]; §5.3).</w:t>
             </w:r>
           </w:p>
         </w:tc>
@@ -27252,127 +27657,39 @@
               <w:rPr>
                 <w:sz w:val="19"/>
               </w:rPr>
-              <w:t xml:space="preserve">4. Duration caliper matching</w:t>
-            </w:r>
-          </w:p>
-        </w:tc>
-        <w:tc>
-          <w:tcPr/>
-          <w:p>
-            <w:pPr>
-              <w:pStyle w:val="Compact"/>
-              <w:spacing w:line="240" w:lineRule="auto"/>
-              <w:jc w:val="left"/>
-            </w:pPr>
-            <w:r>
-              <w:rPr>
-                <w:sz w:val="19"/>
-              </w:rPr>
-              <w:t xml:space="preserve">Enforce duration matching ratio (</w:t>
-            </w:r>
-            <m:oMath>
-              <m:r>
-                <m:rPr>
-                  <m:sty m:val="p"/>
-                </m:rPr>
-                <m:t>|</m:t>
-              </m:r>
-              <m:r>
-                <m:rPr>
-                  <m:sty m:val="p"/>
-                </m:rPr>
-                <m:t>Δ</m:t>
-              </m:r>
-              <m:r>
-                <m:rPr>
-                  <m:sty m:val="p"/>
-                </m:rPr>
-                <m:t>ln</m:t>
-              </m:r>
-              <m:r>
-                <m:rPr>
-                  <m:sty m:val="p"/>
-                </m:rPr>
-                <m:t>(</m:t>
-              </m:r>
-              <m:r>
-                <m:rPr>
-                  <m:nor/>
-                </m:rPr>
-                <m:t>duration</m:t>
-              </m:r>
-              <m:r>
-                <m:rPr>
-                  <m:sty m:val="p"/>
-                </m:rPr>
-                <m:t>)</m:t>
-              </m:r>
-              <m:r>
-                <m:rPr>
-                  <m:sty m:val="p"/>
-                </m:rPr>
-                <m:t>|</m:t>
-              </m:r>
-              <m:r>
-                <m:rPr>
-                  <m:sty m:val="p"/>
-                </m:rPr>
-                <m:t>≤</m:t>
-              </m:r>
-              <m:r>
-                <m:t>0.25</m:t>
-              </m:r>
-            </m:oMath>
-            <w:r>
-              <w:rPr>
-                <w:sz w:val="19"/>
-              </w:rPr>
-              <w:t xml:space="preserve"> </w:t>
-            </w:r>
-            <w:r>
-              <w:rPr>
-                <w:sz w:val="19"/>
-              </w:rPr>
-              <w:t xml:space="preserve">to</w:t>
-            </w:r>
-            <w:r>
-              <w:rPr>
-                <w:sz w:val="19"/>
-              </w:rPr>
-              <w:t xml:space="preserve"> </w:t>
-            </w:r>
-            <m:oMath>
-              <m:r>
-                <m:rPr>
-                  <m:sty m:val="p"/>
-                </m:rPr>
-                <m:t>≤</m:t>
-              </m:r>
-              <m:r>
-                <m:t>0.50</m:t>
-              </m:r>
-            </m:oMath>
-            <w:r>
-              <w:rPr>
-                <w:sz w:val="19"/>
-              </w:rPr>
-              <w:t xml:space="preserve">)</w:t>
-            </w:r>
-          </w:p>
-        </w:tc>
-        <w:tc>
-          <w:tcPr/>
-          <w:p>
-            <w:pPr>
-              <w:pStyle w:val="Compact"/>
-              <w:spacing w:line="240" w:lineRule="auto"/>
-              <w:jc w:val="left"/>
-            </w:pPr>
-            <w:r>
-              <w:rPr>
-                <w:sz w:val="19"/>
-              </w:rPr>
-              <w:t xml:space="preserve">Aborted/short incident flights induce spurious duration separation; caliper matching lifts within-drone AUC by</w:t>
+              <w:t xml:space="preserve">4. Duration reporting</w:t>
+            </w:r>
+          </w:p>
+        </w:tc>
+        <w:tc>
+          <w:tcPr/>
+          <w:p>
+            <w:pPr>
+              <w:pStyle w:val="Compact"/>
+              <w:spacing w:line="240" w:lineRule="auto"/>
+              <w:jc w:val="left"/>
+            </w:pPr>
+            <w:r>
+              <w:rPr>
+                <w:sz w:val="19"/>
+              </w:rPr>
+              <w:t xml:space="preserve">Report window durations of cases and comparisons; use duration matching only as a sensitivity analysis</w:t>
+            </w:r>
+          </w:p>
+        </w:tc>
+        <w:tc>
+          <w:tcPr/>
+          <w:p>
+            <w:pPr>
+              <w:pStyle w:val="Compact"/>
+              <w:spacing w:line="240" w:lineRule="auto"/>
+              <w:jc w:val="left"/>
+            </w:pPr>
+            <w:r>
+              <w:rPr>
+                <w:sz w:val="19"/>
+              </w:rPr>
+              <w:t xml:space="preserve">Aborted or short crash flights create duration differences. A caliper lift of</w:t>
             </w:r>
             <w:r>
               <w:rPr>
@@ -27401,13 +27718,7 @@
               <w:rPr>
                 <w:sz w:val="19"/>
               </w:rPr>
-              <w:t xml:space="preserve">[+0.028, +0.205], and by</w:t>
-            </w:r>
-            <w:r>
-              <w:rPr>
-                <w:sz w:val="19"/>
-              </w:rPr>
-              <w:t xml:space="preserve"> </w:t>
+              <w:t xml:space="preserve">[+0.028, +0.205] vanished once post-crash flights were removed (</w:t>
             </w:r>
             <m:oMath>
               <m:r>
@@ -27417,7 +27728,7 @@
                 <m:t>+</m:t>
               </m:r>
               <m:r>
-                <m:t>0.077</m:t>
+                <m:t>0.086</m:t>
               </m:r>
             </m:oMath>
             <w:r>
@@ -27430,7 +27741,24 @@
               <w:rPr>
                 <w:sz w:val="19"/>
               </w:rPr>
-              <w:t xml:space="preserve">[+0.013, +0.204] without duration-linked features (§5.3).</w:t>
+              <w:t xml:space="preserve">[</w:t>
+            </w:r>
+            <m:oMath>
+              <m:r>
+                <m:rPr>
+                  <m:sty m:val="p"/>
+                </m:rPr>
+                <m:t>−</m:t>
+              </m:r>
+              <m:r>
+                <m:t>0.064</m:t>
+              </m:r>
+            </m:oMath>
+            <w:r>
+              <w:rPr>
+                <w:sz w:val="19"/>
+              </w:rPr>
+              <w:t xml:space="preserve">, +0.184]; §5.3).</w:t>
             </w:r>
           </w:p>
         </w:tc>
@@ -27929,63 +28257,7 @@
         <w:t xml:space="preserve"> </w:t>
       </w:r>
       <w:r>
-        <w:t xml:space="preserve">While cross-sectional models on the discovery sample showed high apparent separation (AUC 0.88), vehicle-grouped cross-validation (0.884) and crash-window removal (0.860) made no detectable difference on that sample. The factorial audit (§5.4) shows why the picture depends on the sample: once comparison drones contribute several flights, grouping folds by vehicle becomes the only material source of optimism (0.062 [0.034, 0.087] of a 0.212 drop). Which crashes are scored and which normal flights they are compared with each carried a similar share, but neither could be isolated with 60–67 crashes. Separation against other aircraft persisted (0.67); only comparison with the same drone’s own earlier flights brought it to chance. On the identical 372 flights of the multi-flight cohort, cross-sectional evaluation (0.529 [0.453, 0.607]) and within-drone Group-CV (0.569 [0.493, 0.645]; cluster bootstrap 95% CI [0.500, 0.643]; pairwise mean AUC 0.592 [0.516, 0.692]) yielded overlapping intervals (the cluster bootstrap interval touches chance at 0.500, while the pairwise interval extends down to near-chance at 0.516), indicating that uncalipered matching yields no detectable precursor signal in this cohort. However, controlling for feature-window duration within drones via caliper matching (</w:t>
-      </w:r>
-      <m:oMath>
-        <m:r>
-          <m:rPr>
-            <m:sty m:val="p"/>
-          </m:rPr>
-          <m:t>|</m:t>
-        </m:r>
-        <m:r>
-          <m:rPr>
-            <m:sty m:val="p"/>
-          </m:rPr>
-          <m:t>Δ</m:t>
-        </m:r>
-        <m:r>
-          <m:rPr>
-            <m:sty m:val="p"/>
-          </m:rPr>
-          <m:t>ln</m:t>
-        </m:r>
-        <m:r>
-          <m:rPr>
-            <m:sty m:val="p"/>
-          </m:rPr>
-          <m:t>(</m:t>
-        </m:r>
-        <m:r>
-          <m:rPr>
-            <m:nor/>
-          </m:rPr>
-          <m:t>duration</m:t>
-        </m:r>
-        <m:r>
-          <m:rPr>
-            <m:sty m:val="p"/>
-          </m:rPr>
-          <m:t>)</m:t>
-        </m:r>
-        <m:r>
-          <m:rPr>
-            <m:sty m:val="p"/>
-          </m:rPr>
-          <m:t>|</m:t>
-        </m:r>
-        <m:r>
-          <m:rPr>
-            <m:sty m:val="p"/>
-          </m:rPr>
-          <m:t>≤</m:t>
-        </m:r>
-        <m:r>
-          <m:t>0.25</m:t>
-        </m:r>
-      </m:oMath>
-      <w:r>
-        <w:t xml:space="preserve">) lifts within-drone AUC from 0.532 to 0.642 (</w:t>
+        <w:t xml:space="preserve">While cross-sectional models on the discovery sample showed high apparent separation (AUC 0.88), vehicle-grouped cross-validation (0.884) and crash-window removal (0.860) made no detectable difference on that sample. The factorial audit (§5.4) shows why the picture depends on the sample: once comparison drones contribute several flights, grouping folds by vehicle becomes the only material source of optimism (0.062 [0.034, 0.087] of a 0.212 drop). Which crashes are scored and which normal flights they are compared with each carried a similar share, but neither could be isolated with 60–67 crashes. Separation against other aircraft persisted (0.67); only comparison with the same drone’s own earlier flights brought it to chance. On the identical 372 flights of the multi-flight cohort, cross-sectional evaluation (0.529 [0.453, 0.607]) and within-drone Group-CV (0.569 [0.493, 0.645]; cluster bootstrap 95% CI [0.500, 0.643]; pairwise mean AUC 0.592 [0.516, 0.692]) yielded overlapping intervals (the cluster bootstrap interval touches chance at 0.500, while the pairwise interval extends down to near-chance at 0.516), indicating that uncalipered matching yields no clear precursor signal in this cohort. A GPS-time audit then showed that 85 of 210 crash-day earlier flights had been flown after the crash. Without them the within-drone model gave 0.582 [0.525, 0.660] on stored features but 0.507 [0.436, 0.582] on recomputed features, so any within-drone signal is weak and pipeline-dependent. A duration-caliper lift reported in earlier versions (</w:t>
       </w:r>
       <m:oMath>
         <m:r>
@@ -28002,7 +28274,7 @@
         <w:t xml:space="preserve"> </w:t>
       </w:r>
       <w:r>
-        <w:t xml:space="preserve">on the exact same 36 airframes; paired cluster bootstrap 95% CI [+0.028, +0.205] with reproducible folds), suggesting that baseline duration differences between crash and non-crash flights may mask within-drone precursor detection in this cohort; without the duration-linked clipping, tilt and voltage-sag features the lift is</w:t>
+        <w:t xml:space="preserve">[+0.028, +0.205]) fell to</w:t>
       </w:r>
       <w:r>
         <w:t xml:space="preserve"> </w:t>
@@ -28015,14 +28287,28 @@
           <m:t>+</m:t>
         </m:r>
         <m:r>
-          <m:t>0.077</m:t>
-        </m:r>
-      </m:oMath>
-      <w:r>
-        <w:t xml:space="preserve"> </w:t>
-      </w:r>
-      <w:r>
-        <w:t xml:space="preserve">[+0.013, +0.204], so the gain is not carried only by them, although a fixed 30 s window did not reproduce it. Diagnostic checks were also</w:t>
+          <m:t>0.086</m:t>
+        </m:r>
+      </m:oMath>
+      <w:r>
+        <w:t xml:space="preserve"> </w:t>
+      </w:r>
+      <w:r>
+        <w:t xml:space="preserve">[</w:t>
+      </w:r>
+      <m:oMath>
+        <m:r>
+          <m:rPr>
+            <m:sty m:val="p"/>
+          </m:rPr>
+          <m:t>−</m:t>
+        </m:r>
+        <m:r>
+          <m:t>0.064</m:t>
+        </m:r>
+      </m:oMath>
+      <w:r>
+        <w:t xml:space="preserve">, +0.184] on 24 airframes, so we withdraw the reading that duration differences mask precursors. Diagnostic checks were also</w:t>
       </w:r>
       <w:r>
         <w:t xml:space="preserve"> </w:t>
@@ -29568,7 +29854,7 @@
         <w:t xml:space="preserve"> </w:t>
       </w:r>
       <w:r>
-        <w:t xml:space="preserve">Earlier flights were selected by calendar date. GPS times showed that 47 of 95 crash-day exposure flights in the between-drone sample were flown after the crash; the between-drone result held without them (§5.5), but the within-drone, caliper and same-aircraft samples have not been audited for the same problem.</w:t>
+        <w:t xml:space="preserve">Earlier flights were selected by calendar date. GPS times showed that 47 of 95 crash-day exposure flights in the between-drone sample, and 85 of 210 crash-day earlier flights in the within-drone sample, were flown after the crash. The between-drone result and the within-drone rank tests held without them; the caliper lift did not, and the within-drone model result depends on the feature pipeline (§5.3). Flights on earlier dates are ordered by the index date only, and 18 crash-day flights had no usable GPS time.</w:t>
       </w:r>
     </w:p>
     <w:p>

</xml_diff>

<commit_message>
Paper: Report crash-moment review; correct aircraft-recall CI
One author's reading of 50 traces replaces the 'pending' text: tilt-defined
crash moments correct in 21 of 26; 18 of 24 fallback logs contain no
crash; confirmed rule precise (11/12) but misses half the real crashes.
Revision-table row added. Exact 95% CI for 18/32 corrected to 37.7-73.6%.
PDF, Word, Overleaf zip, HANDOFF and critical_review rebuilt.

Co-Authored-By: Claude Opus 5.5 <noreply@anthropic.com>
</commit_message>
<xml_diff>
--- a/docs/paper/submission/manuscript.docx
+++ b/docs/paper/submission/manuscript.docx
@@ -16313,7 +16313,62 @@
         <w:t xml:space="preserve">48c2fa7</w:t>
       </w:r>
       <w:r>
-        <w:t xml:space="preserve">). Crash-window leakage may therefore matter for clear crashes; the small overall effect partly reflects how few logs have a clear crash. Within-drone tests on confirmed crashes have only 8–9 drones and are uninformative (rank 0.43, model 0.52). The authors’ manual check of 50 crash traces is pending.</w:t>
+        <w:t xml:space="preserve">). Crash-window leakage may therefore matter for clear crashes; the small overall effect partly reflects how few logs have a clear crash. Within-drone tests on confirmed crashes have only 8–9 drones and are uninformative (rank 0.43, model 0.52).</w:t>
+      </w:r>
+      <w:r>
+        <w:t xml:space="preserve"> </w:t>
+      </w:r>
+      <m:oMath>
+        <m:sSup>
+          <m:e>
+            <m:r>
+              <m:t>​</m:t>
+            </m:r>
+          </m:e>
+          <m:sup>
+            <m:r>
+              <m:rPr>
+                <m:sty m:val="p"/>
+              </m:rPr>
+              <m:t>†</m:t>
+            </m:r>
+          </m:sup>
+        </m:sSup>
+      </m:oMath>
+      <w:r>
+        <w:t xml:space="preserve">One author then judged, by eye, the traces of 50 randomly drawn crash logs (tilt and altitude around</w:t>
+      </w:r>
+      <w:r>
+        <w:t xml:space="preserve"> </w:t>
+      </w:r>
+      <m:oMath>
+        <m:sSub>
+          <m:e>
+            <m:r>
+              <m:t>t</m:t>
+            </m:r>
+          </m:e>
+          <m:sub>
+            <m:r>
+              <m:t>c</m:t>
+            </m:r>
+          </m:sub>
+        </m:sSub>
+      </m:oMath>
+      <w:r>
+        <w:t xml:space="preserve">; declared check</w:t>
+      </w:r>
+      <w:r>
+        <w:t xml:space="preserve"> </w:t>
+      </w:r>
+      <w:r>
+        <w:rPr>
+          <w:rStyle w:val="VerbatimChar"/>
+        </w:rPr>
+        <w:t xml:space="preserve">97974ad</w:t>
+      </w:r>
+      <w:r>
+        <w:t xml:space="preserve">, one reviewer, not blind to the automatic label). Of 26 tilt-defined crash moments, 21 were judged correct (11 of the 12 confirmed and 10 of the 14 unconfirmed; the others were mostly too early); of 24 fallback crash moments, 18 showed no crash at all in the log, 2 were correct, 2 too late and 2 unclear. The confirmed rule is therefore precise (11 of 12; exact 95% CI 62–100%) but misses about half the real crashes (11 of 23), and most crash-rated logs without a tilt event do not contain the crash: the rating describes the flight session, not the log.</w:t>
       </w:r>
     </w:p>
     <w:p>
@@ -20939,7 +20994,7 @@
         <w:t xml:space="preserve"> </w:t>
       </w:r>
       <w:r>
-        <w:t xml:space="preserve">(Bayesian 95% credible interval 0.25–0.61 from independent Jeffreys beta posteriors on the two recalls; exact 95% intervals for the recalls themselves are 37.6–74.3% for aircraft, 18 of 32, and 0.5–71.6% for pilot, 1 of 5). The interval contains chance (0.50) and lies below 0.70, the pass mark declared for the rule on uploader labels (not for this expert set), so the rule probably falls below that mark here but cannot be separated from chance. When evaluated on the subset of 34 logs with complete telemetry required by the statistical models (30 aircraft, 4 pilot), the rule decided 29 cases (25 aircraft, 4 pilot), predicting aircraft in 15 of 25 aircraft and 4 of 4 pilot, yielding a balanced accuracy of</w:t>
+        <w:t xml:space="preserve">(Bayesian 95% credible interval 0.25–0.61 from independent Jeffreys beta posteriors on the two recalls; exact 95% intervals for the recalls themselves are 37.7–73.6% for aircraft, 18 of 32, and 0.5–71.6% for pilot, 1 of 5). The interval contains chance (0.50) and lies below 0.70, the pass mark declared for the rule on uploader labels (not for this expert set), so the rule probably falls below that mark here but cannot be separated from chance. When evaluated on the subset of 34 logs with complete telemetry required by the statistical models (30 aircraft, 4 pilot), the rule decided 29 cases (25 aircraft, 4 pilot), predicting aircraft in 15 of 25 aircraft and 4 of 4 pilot, yielding a balanced accuracy of</w:t>
       </w:r>
       <w:r>
         <w:t xml:space="preserve"> </w:t>
@@ -26083,6 +26138,189 @@
               <w:rPr>
                 <w:sz w:val="19"/>
               </w:rPr>
+              <w:t xml:space="preserve">Crash-moment review</w:t>
+            </w:r>
+            <m:oMath>
+              <m:sSup>
+                <m:e>
+                  <m:r>
+                    <m:t>​</m:t>
+                  </m:r>
+                </m:e>
+                <m:sup>
+                  <m:r>
+                    <m:rPr>
+                      <m:sty m:val="p"/>
+                    </m:rPr>
+                    <m:t>†</m:t>
+                  </m:r>
+                </m:sup>
+              </m:sSup>
+            </m:oMath>
+          </w:p>
+        </w:tc>
+        <w:tc>
+          <w:tcPr/>
+          <w:p>
+            <w:pPr>
+              <w:pStyle w:val="Compact"/>
+              <w:spacing w:line="240" w:lineRule="auto"/>
+              <w:jc w:val="left"/>
+            </w:pPr>
+            <w:r>
+              <w:rPr>
+                <w:sz w:val="19"/>
+              </w:rPr>
+              <w:t xml:space="preserve">Check</w:t>
+            </w:r>
+            <w:r>
+              <w:rPr>
+                <w:sz w:val="19"/>
+              </w:rPr>
+              <w:t xml:space="preserve"> </w:t>
+            </w:r>
+            <m:oMath>
+              <m:sSub>
+                <m:e>
+                  <m:r>
+                    <m:t>t</m:t>
+                  </m:r>
+                </m:e>
+                <m:sub>
+                  <m:r>
+                    <m:t>c</m:t>
+                  </m:r>
+                </m:sub>
+              </m:sSub>
+            </m:oMath>
+            <w:r>
+              <w:rPr>
+                <w:sz w:val="19"/>
+              </w:rPr>
+              <w:t xml:space="preserve"> </w:t>
+            </w:r>
+            <w:r>
+              <w:rPr>
+                <w:sz w:val="19"/>
+              </w:rPr>
+              <w:t xml:space="preserve">by eye (one author)</w:t>
+            </w:r>
+          </w:p>
+        </w:tc>
+        <w:tc>
+          <w:tcPr/>
+          <w:p>
+            <w:pPr>
+              <w:pStyle w:val="Compact"/>
+              <w:spacing w:line="240" w:lineRule="auto"/>
+              <w:jc w:val="left"/>
+            </w:pPr>
+            <w:r>
+              <w:rPr>
+                <w:sz w:val="19"/>
+              </w:rPr>
+              <w:t xml:space="preserve">Tilt-defined</w:t>
+            </w:r>
+            <w:r>
+              <w:rPr>
+                <w:sz w:val="19"/>
+              </w:rPr>
+              <w:t xml:space="preserve"> </w:t>
+            </w:r>
+            <m:oMath>
+              <m:sSub>
+                <m:e>
+                  <m:r>
+                    <m:t>t</m:t>
+                  </m:r>
+                </m:e>
+                <m:sub>
+                  <m:r>
+                    <m:t>c</m:t>
+                  </m:r>
+                </m:sub>
+              </m:sSub>
+            </m:oMath>
+            <w:r>
+              <w:rPr>
+                <w:sz w:val="19"/>
+              </w:rPr>
+              <w:t xml:space="preserve"> </w:t>
+            </w:r>
+            <w:r>
+              <w:rPr>
+                <w:sz w:val="19"/>
+              </w:rPr>
+              <w:t xml:space="preserve">correct in 21 of 26; 18 of 24 fallback logs contain no crash</w:t>
+            </w:r>
+          </w:p>
+        </w:tc>
+        <w:tc>
+          <w:tcPr/>
+          <w:p>
+            <w:pPr>
+              <w:pStyle w:val="Compact"/>
+              <w:spacing w:line="240" w:lineRule="auto"/>
+              <w:jc w:val="left"/>
+            </w:pPr>
+            <w:r>
+              <w:rPr>
+                <w:rStyle w:val="VerbatimChar"/>
+                <w:sz w:val="19"/>
+              </w:rPr>
+              <w:t xml:space="preserve">97974ad</w:t>
+            </w:r>
+            <w:r>
+              <w:rPr>
+                <w:sz w:val="19"/>
+              </w:rPr>
+              <w:t xml:space="preserve">,</w:t>
+            </w:r>
+            <w:r>
+              <w:rPr>
+                <w:sz w:val="19"/>
+              </w:rPr>
+              <w:t xml:space="preserve"> </w:t>
+            </w:r>
+            <w:r>
+              <w:rPr>
+                <w:rStyle w:val="VerbatimChar"/>
+                <w:sz w:val="19"/>
+              </w:rPr>
+              <w:t xml:space="preserve">bfda684</w:t>
+            </w:r>
+          </w:p>
+        </w:tc>
+        <w:tc>
+          <w:tcPr/>
+          <w:p>
+            <w:pPr>
+              <w:pStyle w:val="Compact"/>
+              <w:spacing w:line="240" w:lineRule="auto"/>
+              <w:jc w:val="left"/>
+            </w:pPr>
+            <w:r>
+              <w:rPr>
+                <w:sz w:val="19"/>
+              </w:rPr>
+              <w:t xml:space="preserve">2026-10-27</w:t>
+            </w:r>
+          </w:p>
+        </w:tc>
+      </w:tr>
+      <w:tr>
+        <w:tc>
+          <w:tcPr/>
+          <w:p>
+            <w:pPr>
+              <w:pStyle w:val="Compact"/>
+              <w:spacing w:line="240" w:lineRule="auto"/>
+              <w:jc w:val="left"/>
+            </w:pPr>
+            <w:r>
+              <w:rPr>
+                <w:sz w:val="19"/>
+              </w:rPr>
               <w:t xml:space="preserve">Third robustness audit</w:t>
             </w:r>
             <m:oMath>
@@ -30191,7 +30429,7 @@
         <w:t xml:space="preserve"> </w:t>
       </w:r>
       <w:r>
-        <w:t xml:space="preserve">followed within 10 s by disarming or a landed or ground-contact flag, and 32 do not (second robustness audit). A sheet of 50 traces for manual review is released; the authors’ manual check of it is pending and is not claimed here.</w:t>
+        <w:t xml:space="preserve">followed within 10 s by disarming or a landed or ground-contact flag, and 32 do not (second robustness audit). One author’s reading of 50 traces found the tilt-defined crash moment correct in 21 of 26 logs, while 18 of 24 logs without a tilt event showed no crash at all (Section 5.3); a second, blind reviewer has not yet checked them.</w:t>
       </w:r>
     </w:p>
     <w:p>

</xml_diff>

<commit_message>
Paper: Add archive-wide label audit
About half of crash-rated multicopter logs contain the crash (50% [39%,
61%]); pilot-rated logs show a crash-like tilt far less often than
aircraft-rated (23% vs 45%, p = 0.0003). New Results paragraph; abstract,
contribution (ii), conclusion, threats, highlights, cover letter and
revision table updated. requirements.txt adds python-docx. PDF, Word,
Overleaf zip, HANDOFF and critical_review rebuilt.

Co-Authored-By: Claude Opus 5.5 <noreply@anthropic.com>
</commit_message>
<xml_diff>
--- a/docs/paper/submission/manuscript.docx
+++ b/docs/paper/submission/manuscript.docx
@@ -96,7 +96,27 @@
         </m:sSup>
       </m:oMath>
       <w:r>
-        <w:t xml:space="preserve">Logistic models and trees stayed near chance (AUC 0.42–0.59); with 36 pilot-labelled crashes, only an AUC of 0.72 or more was detectable.</w:t>
+        <w:t xml:space="preserve">Logistic models and trees stayed near chance (AUC 0.42–0.59; with 36 pilot-labelled crashes only AUC</w:t>
+      </w:r>
+      <w:r>
+        <w:t xml:space="preserve"> </w:t>
+      </w:r>
+      <m:oMath>
+        <m:r>
+          <m:rPr>
+            <m:sty m:val="p"/>
+          </m:rPr>
+          <m:t>≥</m:t>
+        </m:r>
+        <m:r>
+          <m:t>0.72</m:t>
+        </m:r>
+      </m:oMath>
+      <w:r>
+        <w:t xml:space="preserve"> </w:t>
+      </w:r>
+      <w:r>
+        <w:t xml:space="preserve">was detectable).</w:t>
       </w:r>
       <w:r>
         <w:t xml:space="preserve"> </w:t>
@@ -142,7 +162,7 @@
         </m:sSup>
       </m:oMath>
       <w:r>
-        <w:t xml:space="preserve">Dates cannot order flights within a day: by GPS time, 44–55% of dated crash-day</w:t>
+        <w:t xml:space="preserve">Archive labels are weaker than assumed: only about half of crash-rated multicopter logs contain the crash (50%, 95% CI 39–61%), pilot-rated logs less often than aircraft-rated ones (23% against 45% with a crash-like tilt), and by GPS time 44–55% of dated crash-day</w:t>
       </w:r>
       <w:r>
         <w:t xml:space="preserve"> </w:t>
@@ -835,7 +855,7 @@
         </m:sSup>
       </m:oMath>
       <w:r>
-        <w:t xml:space="preserve">A data-integrity hazard in public log archives: date-only ordering cannot order same-day flights, and by GPS time 44–55% of dated crash-day</w:t>
+        <w:t xml:space="preserve">A data-integrity hazard in public log archives: only about half of crash-rated multicopter logs contain the crash (50% [39%, 61%]), pilot-rated logs less often than aircraft-rated ones, so the label can leak into any classifier; date-only ordering cannot order same-day flights, and by GPS time 44–55% of dated crash-day</w:t>
       </w:r>
       <w:r>
         <w:t xml:space="preserve"> </w:t>
@@ -847,7 +867,7 @@
         <w:t xml:space="preserve"> </w:t>
       </w:r>
       <w:r>
-        <w:t xml:space="preserve">flights were flown after the crash; over half of crash-rated logs have a later log from the same flight controller. Removing post-crash flights left the declared conclusions in place but removed an apparent within-drone effect, which we withdraw (Sections 5.5 and 8).</w:t>
+        <w:t xml:space="preserve">flights were flown after the crash. Removing post-crash flights left the declared conclusions in place but removed an apparent within-drone effect, which we withdraw (Sections 5.5 and 8).</w:t>
       </w:r>
       <w:r>
         <w:t xml:space="preserve"> </w:t>
@@ -16373,27 +16393,15 @@
     </w:p>
     <w:p>
       <w:pPr>
-        <w:pStyle w:val="Heading2"/>
+        <w:pStyle w:val="BodyText"/>
       </w:pPr>
-      <w:bookmarkStart w:id="47" w:name="_0c9e7e04e6c31fefd3494b28729aa56a3255cc6"/>
       <w:r>
         <w:rPr>
-          <w:rStyle w:val="SectionNumber"/>
+          <w:b/>
+          <w:bCs/>
         </w:rPr>
-        <w:t xml:space="preserve">5.4</w:t>
-      </w:r>
-      <w:r>
-        <w:tab/>
-      </w:r>
-      <w:r>
-        <w:t xml:space="preserve">Factorial optimism audit (exploratory)</w:t>
-      </w:r>
-      <w:bookmarkEnd w:id="47"/>
-    </w:p>
-    <w:p>
-      <w:pPr>
-        <w:pStyle w:val="FirstParagraph"/>
-      </w:pPr>
+        <w:t xml:space="preserve">How many crash-rated logs contain the crash</w:t>
+      </w:r>
       <m:oMath>
         <m:sSup>
           <m:e>
@@ -16412,7 +16420,22 @@
         </m:sSup>
       </m:oMath>
       <w:r>
-        <w:t xml:space="preserve">The steps of Table 7 change several things at once, and their samples were built with different feature extractors. To find what the crash-vs-normal AUC depends on, we declared a factorial audit after the main analyses (commit</w:t>
+        <w:rPr>
+          <w:b/>
+          <w:bCs/>
+        </w:rPr>
+        <w:t xml:space="preserve">.</w:t>
+      </w:r>
+      <w:r>
+        <w:t xml:space="preserve"> </w:t>
+      </w:r>
+      <w:bookmarkStart w:id="47" w:name="_1f0871c64d70200babf328009e7fac579ec90db"/>
+      <w:bookmarkEnd w:id="47"/>
+      <w:r>
+        <w:t xml:space="preserve"> </w:t>
+      </w:r>
+      <w:r>
+        <w:t xml:space="preserve">To see whether this holds beyond our samples, we downloaded all 520 crash-rated logs from real hardware in the archive (declared audit</w:t>
       </w:r>
       <w:r>
         <w:t xml:space="preserve"> </w:t>
@@ -16421,10 +16444,10 @@
         <w:rPr>
           <w:rStyle w:val="VerbatimChar"/>
         </w:rPr>
-        <w:t xml:space="preserve">3c34530</w:t>
-      </w:r>
-      <w:r>
-        <w:t xml:space="preserve">; amended</w:t>
+        <w:t xml:space="preserve">09cf99c</w:t>
+      </w:r>
+      <w:r>
+        <w:t xml:space="preserve">, amended in</w:t>
       </w:r>
       <w:r>
         <w:t xml:space="preserve"> </w:t>
@@ -16433,17 +16456,46 @@
         <w:rPr>
           <w:rStyle w:val="VerbatimChar"/>
         </w:rPr>
-        <w:t xml:space="preserve">f6ba424</w:t>
-      </w:r>
-      <w:r>
-        <w:t xml:space="preserve"> </w:t>
-      </w:r>
-      <w:r>
-        <w:t xml:space="preserve">to a float32 tolerance after its extractor check aborted on rounding differences; run 27 October 2026). Every flight was re-extracted from the raw log by one extractor, and five two-level factors were crossed: crash set (103 multi-history crashes vs. the 67 within-drone crashes), comparison flights (uploader-rated good/great normals vs. unrated flights from drones with no crash-rated log, matched to the within-drone cases on hardware, PX4 version and vehicle type), crash-window cut (</w:t>
-      </w:r>
-      <m:oMath>
-        <m:r>
-          <m:t>m</m:t>
+        <w:t xml:space="preserve">18b0eff</w:t>
+      </w:r>
+      <w:r>
+        <w:t xml:space="preserve"> </w:t>
+      </w:r>
+      <w:r>
+        <w:t xml:space="preserve">to define multicopters by the index vehicle type, because older logs lack the rotary-wing flag). Of the 381 multicopter logs, 40 could not be read. Of the remaining 341, 132 (39%) show tilt above</w:t>
+      </w:r>
+      <w:r>
+        <w:t xml:space="preserve"> </w:t>
+      </w:r>
+      <m:oMath>
+        <m:sSup>
+          <m:e>
+            <m:r>
+              <m:t>60</m:t>
+            </m:r>
+          </m:e>
+          <m:sup>
+            <m:r>
+              <m:rPr>
+                <m:sty m:val="p"/>
+              </m:rPr>
+              <m:t>∘</m:t>
+            </m:r>
+          </m:sup>
+        </m:sSup>
+      </m:oMath>
+      <w:r>
+        <w:t xml:space="preserve"> </w:t>
+      </w:r>
+      <w:r>
+        <w:t xml:space="preserve">(91 confirmed) and 209 do not. Combining these shares with the author’s reading of 50 traces, in which every tilt-defined log and 4 of 22 decidable logs without a tilt event contained the crash, about half of the archive’s crash-rated multicopter logs contain the crash (50%, 95% bootstrap CI 39–61%; this assumes the review rates carry over). The share differs by label: 110 of 247 aircraft-rated logs (45%) but 22 of 94 pilot-rated logs (23%) show a tilt event (two-sided Fisher exact</w:t>
+      </w:r>
+      <w:r>
+        <w:t xml:space="preserve"> </w:t>
+      </w:r>
+      <m:oMath>
+        <m:r>
+          <m:t>p</m:t>
         </m:r>
         <m:r>
           <m:rPr>
@@ -16452,154 +16504,56 @@
           <m:t>=</m:t>
         </m:r>
         <m:r>
-          <m:t>0</m:t>
-        </m:r>
-      </m:oMath>
-      <w:r>
-        <w:t xml:space="preserve"> </w:t>
-      </w:r>
-      <w:r>
-        <w:t xml:space="preserve">vs. 10 s), fold scheme (stratified by flight vs. grouped by vehicle) and window (full flight vs. first 30 s airborne). Normal flights from any crashed vehicle were removed (39 of the 139). Intervals come from one paired two-stage cluster bootstrap (2,000 resamples over crash and control vehicles, models not refitted); a factor was declared material if its share was</w:t>
-      </w:r>
-      <w:r>
-        <w:t xml:space="preserve"> </w:t>
-      </w:r>
-      <m:oMath>
-        <m:r>
-          <m:rPr>
-            <m:sty m:val="p"/>
-          </m:rPr>
-          <m:t>≥</m:t>
-        </m:r>
-        <m:r>
-          <m:t>0.05</m:t>
-        </m:r>
-      </m:oMath>
-      <w:r>
-        <w:t xml:space="preserve"> </w:t>
-      </w:r>
-      <w:r>
-        <w:t xml:space="preserve">with a 95% interval excluding zero. The declaration passed all abort checks (anchors 0.891 and 0.559; extractor agreement 374/374; label-permutation mean 0.495).</w:t>
+          <m:t>0.0003</m:t>
+        </m:r>
+      </m:oMath>
+      <w:r>
+        <w:t xml:space="preserve">), and it is lower in recent logs (43% up to 2019, 44% in 2020–2022, 23% from 2023). Our modelled sample matches the rest of the archive (38% against 39%,</w:t>
+      </w:r>
+      <w:r>
+        <w:t xml:space="preserve"> </w:t>
+      </w:r>
+      <m:oMath>
+        <m:r>
+          <m:t>p</m:t>
+        </m:r>
+        <m:r>
+          <m:rPr>
+            <m:sty m:val="p"/>
+          </m:rPr>
+          <m:t>=</m:t>
+        </m:r>
+        <m:r>
+          <m:t>0.91</m:t>
+        </m:r>
+      </m:oMath>
+      <w:r>
+        <w:t xml:space="preserve">). The uploader’s label therefore partly encodes whether the recording reached the crash, so a classifier could appear to separate pilot-caused from aircraft-caused crashes in this archive by detecting that alone.</w:t>
       </w:r>
     </w:p>
     <w:p>
       <w:pPr>
-        <w:pStyle w:val="BodyText"/>
+        <w:pStyle w:val="Heading2"/>
       </w:pPr>
-      <w:r>
-        <w:t xml:space="preserve">The declared primary</w:t>
-      </w:r>
-      <w:r>
-        <w:t xml:space="preserve"> </w:t>
-      </w:r>
-      <m:oMath>
-        <m:r>
-          <m:t>2</m:t>
-        </m:r>
-        <m:r>
-          <m:rPr>
-            <m:sty m:val="p"/>
-          </m:rPr>
-          <m:t>×</m:t>
-        </m:r>
-        <m:r>
-          <m:t>2</m:t>
-        </m:r>
-      </m:oMath>
-      <w:r>
-        <w:t xml:space="preserve"> </w:t>
-      </w:r>
-      <w:r>
-        <w:t xml:space="preserve">(</w:t>
-      </w:r>
-      <m:oMath>
-        <m:r>
-          <m:t>m</m:t>
-        </m:r>
-        <m:r>
-          <m:rPr>
-            <m:sty m:val="p"/>
-          </m:rPr>
-          <m:t>=</m:t>
-        </m:r>
-        <m:r>
-          <m:t>10</m:t>
-        </m:r>
-      </m:oMath>
-      <w:r>
-        <w:t xml:space="preserve"> s, grouped folds, full window) did not isolate a cause (Table 9): changing the normal flights lowered AUC by 0.094 [</w:t>
-      </w:r>
-      <m:oMath>
-        <m:r>
-          <m:rPr>
-            <m:sty m:val="p"/>
-          </m:rPr>
-          <m:t>−</m:t>
-        </m:r>
-        <m:r>
-          <m:t>0.014</m:t>
-        </m:r>
-      </m:oMath>
-      <w:r>
-        <w:t xml:space="preserve">, 0.197] and changing the crash set by 0.108 [</w:t>
-      </w:r>
-      <m:oMath>
-        <m:r>
-          <m:rPr>
-            <m:sty m:val="p"/>
-          </m:rPr>
-          <m:t>−</m:t>
-        </m:r>
-        <m:r>
-          <m:t>0.037</m:t>
-        </m:r>
-      </m:oMath>
-      <w:r>
-        <w:t xml:space="preserve">, 0.224]. Following the pre-declared wording, the AUC depends on the comparison set; the cause is not isolated. On the constant subset (63 and 60 crashes), AUC fell from 0.878 at the most optimistic setting to 0.666 at the most conservative, a drop of 0.212 [0.062, 0.335]. An exact Shapley split assigned 0.062 [0.034, 0.087] of it to vehicle-grouped folds, the only material factor; the effect was concentrated where comparison drones contribute several flights (interaction with comparison set</w:t>
-      </w:r>
-      <w:r>
-        <w:t xml:space="preserve"> </w:t>
-      </w:r>
-      <m:oMath>
-        <m:r>
-          <m:rPr>
-            <m:sty m:val="p"/>
-          </m:rPr>
-          <m:t>+</m:t>
-        </m:r>
-        <m:r>
-          <m:t>0.082</m:t>
-        </m:r>
-      </m:oMath>
-      <w:r>
-        <w:t xml:space="preserve"> </w:t>
-      </w:r>
-      <w:r>
-        <w:t xml:space="preserve">[0.006, 0.122]), consistent with the regenerated Step 1 of Table 7, where grouping by vehicle lowered the AUC from 0.882 to 0.826. The crash-window cut carried a small but non-zero 0.014 [0.007, 0.023], and the fixed 30 s window carried 0.001. Separation against other aircraft persisted at the most conservative setting (0.666 [0.557, 0.770]); replacing other-aircraft flights by the same drones’ earlier flights at the same settings (first 30 s window,</w:t>
-      </w:r>
-      <w:r>
-        <w:t xml:space="preserve"> </w:t>
-      </w:r>
-      <m:oMath>
-        <m:r>
-          <m:t>m</m:t>
-        </m:r>
-        <m:r>
-          <m:rPr>
-            <m:sty m:val="p"/>
-          </m:rPr>
-          <m:t>=</m:t>
-        </m:r>
-        <m:r>
-          <m:t>10</m:t>
-        </m:r>
-      </m:oMath>
-      <w:r>
-        <w:t xml:space="preserve"> s, grouped folds) lowered AUC by a further 0.21, from 0.666 to 0.455.</w:t>
-      </w:r>
-      <w:r>
-        <w:t xml:space="preserve"> </w:t>
-      </w:r>
+      <w:bookmarkStart w:id="48" w:name="_0c9e7e04e6c31fefd3494b28729aa56a3255cc6"/>
+      <w:r>
+        <w:rPr>
+          <w:rStyle w:val="SectionNumber"/>
+        </w:rPr>
+        <w:t xml:space="preserve">5.4</w:t>
+      </w:r>
+      <w:r>
+        <w:tab/>
+      </w:r>
+      <w:r>
+        <w:t xml:space="preserve">Factorial optimism audit (exploratory)</w:t>
+      </w:r>
+      <w:bookmarkEnd w:id="48"/>
+    </w:p>
+    <w:p>
+      <w:pPr>
+        <w:pStyle w:val="FirstParagraph"/>
+      </w:pPr>
       <m:oMath>
         <m:sSup>
           <m:e>
@@ -16618,6 +16572,212 @@
         </m:sSup>
       </m:oMath>
       <w:r>
+        <w:t xml:space="preserve">The steps of Table 7 change several things at once, and their samples were built with different feature extractors. To find what the crash-vs-normal AUC depends on, we declared a factorial audit after the main analyses (commit</w:t>
+      </w:r>
+      <w:r>
+        <w:t xml:space="preserve"> </w:t>
+      </w:r>
+      <w:r>
+        <w:rPr>
+          <w:rStyle w:val="VerbatimChar"/>
+        </w:rPr>
+        <w:t xml:space="preserve">3c34530</w:t>
+      </w:r>
+      <w:r>
+        <w:t xml:space="preserve">; amended</w:t>
+      </w:r>
+      <w:r>
+        <w:t xml:space="preserve"> </w:t>
+      </w:r>
+      <w:r>
+        <w:rPr>
+          <w:rStyle w:val="VerbatimChar"/>
+        </w:rPr>
+        <w:t xml:space="preserve">f6ba424</w:t>
+      </w:r>
+      <w:r>
+        <w:t xml:space="preserve"> </w:t>
+      </w:r>
+      <w:r>
+        <w:t xml:space="preserve">to a float32 tolerance after its extractor check aborted on rounding differences; run 27 October 2026). Every flight was re-extracted from the raw log by one extractor, and five two-level factors were crossed: crash set (103 multi-history crashes vs. the 67 within-drone crashes), comparison flights (uploader-rated good/great normals vs. unrated flights from drones with no crash-rated log, matched to the within-drone cases on hardware, PX4 version and vehicle type), crash-window cut (</w:t>
+      </w:r>
+      <m:oMath>
+        <m:r>
+          <m:t>m</m:t>
+        </m:r>
+        <m:r>
+          <m:rPr>
+            <m:sty m:val="p"/>
+          </m:rPr>
+          <m:t>=</m:t>
+        </m:r>
+        <m:r>
+          <m:t>0</m:t>
+        </m:r>
+      </m:oMath>
+      <w:r>
+        <w:t xml:space="preserve"> </w:t>
+      </w:r>
+      <w:r>
+        <w:t xml:space="preserve">vs. 10 s), fold scheme (stratified by flight vs. grouped by vehicle) and window (full flight vs. first 30 s airborne). Normal flights from any crashed vehicle were removed (39 of the 139). Intervals come from one paired two-stage cluster bootstrap (2,000 resamples over crash and control vehicles, models not refitted); a factor was declared material if its share was</w:t>
+      </w:r>
+      <w:r>
+        <w:t xml:space="preserve"> </w:t>
+      </w:r>
+      <m:oMath>
+        <m:r>
+          <m:rPr>
+            <m:sty m:val="p"/>
+          </m:rPr>
+          <m:t>≥</m:t>
+        </m:r>
+        <m:r>
+          <m:t>0.05</m:t>
+        </m:r>
+      </m:oMath>
+      <w:r>
+        <w:t xml:space="preserve"> </w:t>
+      </w:r>
+      <w:r>
+        <w:t xml:space="preserve">with a 95% interval excluding zero. The declaration passed all abort checks (anchors 0.891 and 0.559; extractor agreement 374/374; label-permutation mean 0.495).</w:t>
+      </w:r>
+    </w:p>
+    <w:p>
+      <w:pPr>
+        <w:pStyle w:val="BodyText"/>
+      </w:pPr>
+      <w:r>
+        <w:t xml:space="preserve">The declared primary</w:t>
+      </w:r>
+      <w:r>
+        <w:t xml:space="preserve"> </w:t>
+      </w:r>
+      <m:oMath>
+        <m:r>
+          <m:t>2</m:t>
+        </m:r>
+        <m:r>
+          <m:rPr>
+            <m:sty m:val="p"/>
+          </m:rPr>
+          <m:t>×</m:t>
+        </m:r>
+        <m:r>
+          <m:t>2</m:t>
+        </m:r>
+      </m:oMath>
+      <w:r>
+        <w:t xml:space="preserve"> </w:t>
+      </w:r>
+      <w:r>
+        <w:t xml:space="preserve">(</w:t>
+      </w:r>
+      <m:oMath>
+        <m:r>
+          <m:t>m</m:t>
+        </m:r>
+        <m:r>
+          <m:rPr>
+            <m:sty m:val="p"/>
+          </m:rPr>
+          <m:t>=</m:t>
+        </m:r>
+        <m:r>
+          <m:t>10</m:t>
+        </m:r>
+      </m:oMath>
+      <w:r>
+        <w:t xml:space="preserve"> s, grouped folds, full window) did not isolate a cause (Table 9): changing the normal flights lowered AUC by 0.094 [</w:t>
+      </w:r>
+      <m:oMath>
+        <m:r>
+          <m:rPr>
+            <m:sty m:val="p"/>
+          </m:rPr>
+          <m:t>−</m:t>
+        </m:r>
+        <m:r>
+          <m:t>0.014</m:t>
+        </m:r>
+      </m:oMath>
+      <w:r>
+        <w:t xml:space="preserve">, 0.197] and changing the crash set by 0.108 [</w:t>
+      </w:r>
+      <m:oMath>
+        <m:r>
+          <m:rPr>
+            <m:sty m:val="p"/>
+          </m:rPr>
+          <m:t>−</m:t>
+        </m:r>
+        <m:r>
+          <m:t>0.037</m:t>
+        </m:r>
+      </m:oMath>
+      <w:r>
+        <w:t xml:space="preserve">, 0.224]. Following the pre-declared wording, the AUC depends on the comparison set; the cause is not isolated. On the constant subset (63 and 60 crashes), AUC fell from 0.878 at the most optimistic setting to 0.666 at the most conservative, a drop of 0.212 [0.062, 0.335]. An exact Shapley split assigned 0.062 [0.034, 0.087] of it to vehicle-grouped folds, the only material factor; the effect was concentrated where comparison drones contribute several flights (interaction with comparison set</w:t>
+      </w:r>
+      <w:r>
+        <w:t xml:space="preserve"> </w:t>
+      </w:r>
+      <m:oMath>
+        <m:r>
+          <m:rPr>
+            <m:sty m:val="p"/>
+          </m:rPr>
+          <m:t>+</m:t>
+        </m:r>
+        <m:r>
+          <m:t>0.082</m:t>
+        </m:r>
+      </m:oMath>
+      <w:r>
+        <w:t xml:space="preserve"> </w:t>
+      </w:r>
+      <w:r>
+        <w:t xml:space="preserve">[0.006, 0.122]), consistent with the regenerated Step 1 of Table 7, where grouping by vehicle lowered the AUC from 0.882 to 0.826. The crash-window cut carried a small but non-zero 0.014 [0.007, 0.023], and the fixed 30 s window carried 0.001. Separation against other aircraft persisted at the most conservative setting (0.666 [0.557, 0.770]); replacing other-aircraft flights by the same drones’ earlier flights at the same settings (first 30 s window,</w:t>
+      </w:r>
+      <w:r>
+        <w:t xml:space="preserve"> </w:t>
+      </w:r>
+      <m:oMath>
+        <m:r>
+          <m:t>m</m:t>
+        </m:r>
+        <m:r>
+          <m:rPr>
+            <m:sty m:val="p"/>
+          </m:rPr>
+          <m:t>=</m:t>
+        </m:r>
+        <m:r>
+          <m:t>10</m:t>
+        </m:r>
+      </m:oMath>
+      <w:r>
+        <w:t xml:space="preserve"> s, grouped folds) lowered AUC by a further 0.21, from 0.666 to 0.455.</w:t>
+      </w:r>
+      <w:r>
+        <w:t xml:space="preserve"> </w:t>
+      </w:r>
+      <m:oMath>
+        <m:sSup>
+          <m:e>
+            <m:r>
+              <m:t>​</m:t>
+            </m:r>
+          </m:e>
+          <m:sup>
+            <m:r>
+              <m:rPr>
+                <m:sty m:val="p"/>
+              </m:rPr>
+              <m:t>†</m:t>
+            </m:r>
+          </m:sup>
+        </m:sSup>
+      </m:oMath>
+      <w:r>
         <w:t xml:space="preserve">On all 67 within-drone crashes with the full window, the paired difference between other-aircraft and own earlier flights is</w:t>
       </w:r>
       <w:r>
@@ -16675,7 +16835,7 @@
         <w:t xml:space="preserve">[0.029, 0.212] once earlier flights flown after the crash are removed (0.623 against 0.510, both from the factorial pipeline’s same-aircraft cell; second robustness audit). A fixed 30 s window also did not reproduce the caliper lift within drones (Group-CV 0.455 [0.377, 0.507]); because that window also removes proximity to the crash, it is not a clean test of the masking explanation. One same-drone cell with flight-stratified folds fell below chance (0.393), which we attribute to splitting one drone’s flights across folds and do not interpret.</w:t>
       </w:r>
     </w:p>
-    <w:bookmarkStart w:id="48" w:name="_9a7638f5da02df7bc1e91f3d04aa4fe62b352e5"/>
+    <w:bookmarkStart w:id="49" w:name="_9a7638f5da02df7bc1e91f3d04aa4fe62b352e5"/>
     <w:p>
       <w:pPr>
         <w:pStyle w:val="TableCaption"/>
@@ -17647,12 +17807,12 @@
         </w:tc>
       </w:tr>
     </w:tbl>
-    <w:bookmarkEnd w:id="48"/>
+    <w:bookmarkEnd w:id="49"/>
     <w:p>
       <w:pPr>
         <w:pStyle w:val="Heading2"/>
       </w:pPr>
-      <w:bookmarkStart w:id="49" w:name="_7d36f114b9234da3ba56cdf6e68d941cb747d23"/>
+      <w:bookmarkStart w:id="50" w:name="_7d36f114b9234da3ba56cdf6e68d941cb747d23"/>
       <w:r>
         <w:rPr>
           <w:rStyle w:val="SectionNumber"/>
@@ -17665,7 +17825,7 @@
       <w:r>
         <w:t xml:space="preserve">Within the same drone and between drones (Q3b, Q3c)</w:t>
       </w:r>
-      <w:bookmarkEnd w:id="49"/>
+      <w:bookmarkEnd w:id="50"/>
     </w:p>
     <w:p>
       <w:pPr>
@@ -18923,7 +19083,7 @@
         <w:t xml:space="preserve">54.0 inspections per crash) at the 10% flag rate. We emphasize that because the 107 reference controls (filling 124 slots across 20 strata with 17 controls reused across sets) were drawn from the same archive pool as the matched sets, and because the exact Bayes PPVs assume an operational 10% flag rate among non-crash drones rather than measuring realized flag rates across the entire 38,320-vehicle population, these PPV figures (2.26–2.43%) represent an exploratory illustration conditional on the assumed flag rate and discovery sensitivity (20 of 60) rather than an independently frozen population benchmark. In all scenarios, vibration screening functions as a broad maintenance inspection filter rather than an operational crash warning.</w:t>
       </w:r>
     </w:p>
-    <w:bookmarkStart w:id="53" w:name="_9361c5dba1dea8da31b0aed692bc5b019a98a7f"/>
+    <w:bookmarkStart w:id="54" w:name="_9361c5dba1dea8da31b0aed692bc5b019a98a7f"/>
     <w:p>
       <w:pPr>
         <w:pStyle w:val="CaptionedFigure"/>
@@ -18934,18 +19094,18 @@
           <wp:inline>
             <wp:extent cx="4160520" cy="2384920"/>
             <wp:effectExtent b="0" l="0" r="0" t="0"/>
-            <wp:docPr descr="" title="" id="51" name="Picture"/>
+            <wp:docPr descr="" title="" id="52" name="Picture"/>
             <a:graphic>
               <a:graphicData uri="http://schemas.openxmlformats.org/drawingml/2006/picture">
                 <pic:pic>
                   <pic:nvPicPr>
-                    <pic:cNvPr descr="fig_within_between.png" id="52" name="Picture"/>
+                    <pic:cNvPr descr="fig_within_between.png" id="53" name="Picture"/>
                     <pic:cNvPicPr>
                       <a:picLocks noChangeArrowheads="1" noChangeAspect="1"/>
                     </pic:cNvPicPr>
                   </pic:nvPicPr>
                   <pic:blipFill>
-                    <a:blip r:embed="rId50"/>
+                    <a:blip r:embed="rId51"/>
                     <a:stretch>
                       <a:fillRect/>
                     </a:stretch>
@@ -18986,7 +19146,7 @@
         <w:t xml:space="preserve">without a recorded crash (bottom). 0.5 indicates no difference.</w:t>
       </w:r>
     </w:p>
-    <w:bookmarkEnd w:id="53"/>
+    <w:bookmarkEnd w:id="54"/>
     <w:p>
       <w:pPr>
         <w:pStyle w:val="FirstParagraph"/>
@@ -19025,8 +19185,8 @@
       <w:r>
         <w:t xml:space="preserve"> </w:t>
       </w:r>
-      <w:bookmarkStart w:id="54" w:name="_6685fc96ed8b4c9a45ed703c41398c155fb9a1d"/>
-      <w:bookmarkEnd w:id="54"/>
+      <w:bookmarkStart w:id="55" w:name="_6685fc96ed8b4c9a45ed703c41398c155fb9a1d"/>
+      <w:bookmarkEnd w:id="55"/>
       <w:r>
         <w:t xml:space="preserve"> </w:t>
       </w:r>
@@ -19153,7 +19313,7 @@
       <w:pPr>
         <w:pStyle w:val="Heading2"/>
       </w:pPr>
-      <w:bookmarkStart w:id="55" w:name="_c68dcf7b88a01fcf500c8e00d7b03511ec2fbc1"/>
+      <w:bookmarkStart w:id="56" w:name="_c68dcf7b88a01fcf500c8e00d7b03511ec2fbc1"/>
       <w:r>
         <w:rPr>
           <w:rStyle w:val="SectionNumber"/>
@@ -19166,7 +19326,7 @@
       <w:r>
         <w:t xml:space="preserve">Robustness of the between-drone result (exploratory)</w:t>
       </w:r>
-      <w:bookmarkEnd w:id="55"/>
+      <w:bookmarkEnd w:id="56"/>
     </w:p>
     <w:p>
       <w:pPr>
@@ -20154,7 +20314,7 @@
         <w:t xml:space="preserve">capacity of the current single archive, resolving this effect definitively requires prospective multi-fleet partner deployments.</w:t>
       </w:r>
     </w:p>
-    <w:bookmarkStart w:id="59" w:name="_f3665d09ec22ddd60812b28fa68e496f60eecb2"/>
+    <w:bookmarkStart w:id="60" w:name="_f3665d09ec22ddd60812b28fa68e496f60eecb2"/>
     <w:p>
       <w:pPr>
         <w:pStyle w:val="CaptionedFigure"/>
@@ -20165,18 +20325,18 @@
           <wp:inline>
             <wp:extent cx="4160520" cy="2531605"/>
             <wp:effectExtent b="0" l="0" r="0" t="0"/>
-            <wp:docPr descr="" title="" id="57" name="Picture"/>
+            <wp:docPr descr="" title="" id="58" name="Picture"/>
             <a:graphic>
               <a:graphicData uri="http://schemas.openxmlformats.org/drawingml/2006/picture">
                 <pic:pic>
                   <pic:nvPicPr>
-                    <pic:cNvPr descr="fig_robustness.png" id="58" name="Picture"/>
+                    <pic:cNvPr descr="fig_robustness.png" id="59" name="Picture"/>
                     <pic:cNvPicPr>
                       <a:picLocks noChangeArrowheads="1" noChangeAspect="1"/>
                     </pic:cNvPicPr>
                   </pic:nvPicPr>
                   <pic:blipFill>
-                    <a:blip r:embed="rId56"/>
+                    <a:blip r:embed="rId57"/>
                     <a:stretch>
                       <a:fillRect/>
                     </a:stretch>
@@ -20279,12 +20439,12 @@
         <w:t xml:space="preserve">is 0.026 (S1), 0.023 (S2), 0.019 (older estimator metric), 0.28 (newer accelerometer metric), 0.019 and 0.014 (GPS-ordered variants); S8 was not re-run and remains unclustered.</w:t>
       </w:r>
     </w:p>
-    <w:bookmarkEnd w:id="59"/>
+    <w:bookmarkEnd w:id="60"/>
     <w:p>
       <w:pPr>
         <w:pStyle w:val="Heading2"/>
       </w:pPr>
-      <w:bookmarkStart w:id="60" w:name="_440012d4f1ae87c72168f87fd4eb66e49627717"/>
+      <w:bookmarkStart w:id="61" w:name="_440012d4f1ae87c72168f87fd4eb66e49627717"/>
       <w:r>
         <w:rPr>
           <w:rStyle w:val="SectionNumber"/>
@@ -20297,7 +20457,7 @@
       <w:r>
         <w:t xml:space="preserve">Expert diagnoses (Q4)</w:t>
       </w:r>
-      <w:bookmarkEnd w:id="60"/>
+      <w:bookmarkEnd w:id="61"/>
     </w:p>
     <w:p>
       <w:pPr>
@@ -21212,7 +21372,7 @@
         <w:t xml:space="preserve">Nonetheless, this independent evaluation illustrates the challenge of log-based attribution: neither the heuristic rule nor the statistical model demonstrated reliable agreement above chance.</w:t>
       </w:r>
     </w:p>
-    <w:bookmarkStart w:id="61" w:name="_83343f61327e522fa9ffc9aa8f722d134b07ff7"/>
+    <w:bookmarkStart w:id="62" w:name="_83343f61327e522fa9ffc9aa8f722d134b07ff7"/>
     <w:p>
       <w:pPr>
         <w:pStyle w:val="TableCaption"/>
@@ -22259,8 +22419,8 @@
         </w:tc>
       </w:tr>
     </w:tbl>
-    <w:bookmarkEnd w:id="61"/>
-    <w:bookmarkStart w:id="65" w:name="_c0d72e502cb8722b270509e9f977263b14fe2c0"/>
+    <w:bookmarkEnd w:id="62"/>
+    <w:bookmarkStart w:id="66" w:name="_c0d72e502cb8722b270509e9f977263b14fe2c0"/>
     <w:p>
       <w:pPr>
         <w:pStyle w:val="CaptionedFigure"/>
@@ -22271,18 +22431,18 @@
           <wp:inline>
             <wp:extent cx="4160520" cy="2603928"/>
             <wp:effectExtent b="0" l="0" r="0" t="0"/>
-            <wp:docPr descr="" title="" id="63" name="Picture"/>
+            <wp:docPr descr="" title="" id="64" name="Picture"/>
             <a:graphic>
               <a:graphicData uri="http://schemas.openxmlformats.org/drawingml/2006/picture">
                 <pic:pic>
                   <pic:nvPicPr>
-                    <pic:cNvPr descr="fig_forum_causes.png" id="64" name="Picture"/>
+                    <pic:cNvPr descr="fig_forum_causes.png" id="65" name="Picture"/>
                     <pic:cNvPicPr>
                       <a:picLocks noChangeArrowheads="1" noChangeAspect="1"/>
                     </pic:cNvPicPr>
                   </pic:nvPicPr>
                   <pic:blipFill>
-                    <a:blip r:embed="rId62"/>
+                    <a:blip r:embed="rId63"/>
                     <a:stretch>
                       <a:fillRect/>
                     </a:stretch>
@@ -22317,12 +22477,12 @@
         <w:t xml:space="preserve">Figure 6. Causes named by experts in PX4 forum threads that attributed a crash to the aircraft.</w:t>
       </w:r>
     </w:p>
-    <w:bookmarkEnd w:id="65"/>
+    <w:bookmarkEnd w:id="66"/>
     <w:p>
       <w:pPr>
         <w:pStyle w:val="Heading2"/>
       </w:pPr>
-      <w:bookmarkStart w:id="66" w:name="_fb365ced420b86c8cd60024101a350b346a0a31"/>
+      <w:bookmarkStart w:id="67" w:name="_fb365ced420b86c8cd60024101a350b346a0a31"/>
       <w:r>
         <w:rPr>
           <w:rStyle w:val="SectionNumber"/>
@@ -22335,7 +22495,7 @@
       <w:r>
         <w:t xml:space="preserve">Exploratory evaluation of language-model review panels (preliminary)</w:t>
       </w:r>
-      <w:bookmarkEnd w:id="66"/>
+      <w:bookmarkEnd w:id="67"/>
     </w:p>
     <w:p>
       <w:pPr>
@@ -22345,7 +22505,7 @@
         <w:t xml:space="preserve">Because language-model assistants are increasingly proposed for automated flight log analysis, we conducted a preliminary exploratory evaluation on 60 author-generated fault cases using four local models (3–4B parameters) configured both as single agents and as multi-agent review panels (Table 11). While a fixed deterministic rule achieved 75% accuracy (naming the true cause in 35 of 50 active cases and correctly abstaining on 10 no-cause cases) with 0% error (referring 15 cases to human operators), local language models produced substantial error rates (10–63% wrong), suffered from mode collapse or complete abstention on active causes, and proved highly vulnerable to consensus manipulation: in a worst-case sensitivity sweep, a single compromised reviewer systematically flipped the panel’s consensus decision in 45 to 56 of the 60 cases. In contrast, deterministic numeric telemetry extraction into code prevented direct prompt injection by construction across 40 hostile input strings. This exploratory comparison indicates that the tested small local models and review-panel configurations were unreliable on the 60 author-generated cases. Because the cases and fixed rule were developed by the same authors, the comparison is not an independent benchmark and should not be generalized to language models as a class or larger architectures. These preliminary results emphasize that multi-agent consensus voting without cryptographic proofs or fact-citation constraints cannot provide dependable safety assurance.</w:t>
       </w:r>
     </w:p>
-    <w:bookmarkStart w:id="67" w:name="_e9a1c7ab9cd062877714c77f2a5f253f301b820"/>
+    <w:bookmarkStart w:id="68" w:name="_e9a1c7ab9cd062877714c77f2a5f253f301b820"/>
     <w:p>
       <w:pPr>
         <w:pStyle w:val="TableCaption"/>
@@ -23295,7 +23455,7 @@
         </w:tc>
       </w:tr>
     </w:tbl>
-    <w:bookmarkEnd w:id="67"/>
+    <w:bookmarkEnd w:id="68"/>
     <w:p>
       <w:pPr>
         <w:pStyle w:val="FirstParagraph"/>
@@ -23322,7 +23482,7 @@
       <w:pPr>
         <w:pStyle w:val="Heading2"/>
       </w:pPr>
-      <w:bookmarkStart w:id="68" w:name="_000b339d75a155a848ca0c43e54b0b02b7b82d8"/>
+      <w:bookmarkStart w:id="69" w:name="_000b339d75a155a848ca0c43e54b0b02b7b82d8"/>
       <w:r>
         <w:rPr>
           <w:rStyle w:val="SectionNumber"/>
@@ -23335,7 +23495,7 @@
       <w:r>
         <w:t xml:space="preserve">Exploratory analyses added after the declared protocol</w:t>
       </w:r>
-      <w:bookmarkEnd w:id="68"/>
+      <w:bookmarkEnd w:id="69"/>
     </w:p>
     <w:p>
       <w:pPr>
@@ -23391,7 +23551,7 @@
         <w:t xml:space="preserve">throughout the text and tables. None of these exploratory additions altered the conclusions of the pre-declared tests; rather, they established empirical bounds on between-airframe confounding, tested alternative architectures, and quantified operational fleet screening performance.</w:t>
       </w:r>
     </w:p>
-    <w:bookmarkStart w:id="69" w:name="_fb475224272a447d57b77f14dfc8774bb10ba7c"/>
+    <w:bookmarkStart w:id="70" w:name="_fb475224272a447d57b77f14dfc8774bb10ba7c"/>
     <w:p>
       <w:pPr>
         <w:pStyle w:val="TableCaption"/>
@@ -26138,7 +26298,7 @@
               <w:rPr>
                 <w:sz w:val="19"/>
               </w:rPr>
-              <w:t xml:space="preserve">Crash-moment review</w:t>
+              <w:t xml:space="preserve">Archive-wide label audit</w:t>
             </w:r>
             <m:oMath>
               <m:sSup>
@@ -26171,7 +26331,66 @@
               <w:rPr>
                 <w:sz w:val="19"/>
               </w:rPr>
-              <w:t xml:space="preserve">Check</w:t>
+              <w:t xml:space="preserve">All 520 crash-rated logs</w:t>
+            </w:r>
+          </w:p>
+        </w:tc>
+        <w:tc>
+          <w:tcPr/>
+          <w:p>
+            <w:pPr>
+              <w:pStyle w:val="Compact"/>
+              <w:spacing w:line="240" w:lineRule="auto"/>
+              <w:jc w:val="left"/>
+            </w:pPr>
+            <w:r>
+              <w:rPr>
+                <w:sz w:val="19"/>
+              </w:rPr>
+              <w:t xml:space="preserve">39% of 341 readable multicopter logs show a tilt event; about 50% [39, 61] contain the crash; pilot-rated 23% vs aircraft-rated 45% (</w:t>
+            </w:r>
+            <m:oMath>
+              <m:r>
+                <m:t>p</m:t>
+              </m:r>
+              <m:r>
+                <m:rPr>
+                  <m:sty m:val="p"/>
+                </m:rPr>
+                <m:t>=</m:t>
+              </m:r>
+              <m:r>
+                <m:t>0.0003</m:t>
+              </m:r>
+            </m:oMath>
+            <w:r>
+              <w:rPr>
+                <w:sz w:val="19"/>
+              </w:rPr>
+              <w:t xml:space="preserve">)</w:t>
+            </w:r>
+          </w:p>
+        </w:tc>
+        <w:tc>
+          <w:tcPr/>
+          <w:p>
+            <w:pPr>
+              <w:pStyle w:val="Compact"/>
+              <w:spacing w:line="240" w:lineRule="auto"/>
+              <w:jc w:val="left"/>
+            </w:pPr>
+            <w:r>
+              <w:rPr>
+                <w:rStyle w:val="VerbatimChar"/>
+                <w:sz w:val="19"/>
+              </w:rPr>
+              <w:t xml:space="preserve">09cf99c</w:t>
+            </w:r>
+            <w:r>
+              <w:rPr>
+                <w:sz w:val="19"/>
+              </w:rPr>
+              <w:t xml:space="preserve">,</w:t>
             </w:r>
             <w:r>
               <w:rPr>
@@ -26179,115 +26398,12 @@
               </w:rPr>
               <w:t xml:space="preserve"> </w:t>
             </w:r>
-            <m:oMath>
-              <m:sSub>
-                <m:e>
-                  <m:r>
-                    <m:t>t</m:t>
-                  </m:r>
-                </m:e>
-                <m:sub>
-                  <m:r>
-                    <m:t>c</m:t>
-                  </m:r>
-                </m:sub>
-              </m:sSub>
-            </m:oMath>
-            <w:r>
-              <w:rPr>
-                <w:sz w:val="19"/>
-              </w:rPr>
-              <w:t xml:space="preserve"> </w:t>
-            </w:r>
-            <w:r>
-              <w:rPr>
-                <w:sz w:val="19"/>
-              </w:rPr>
-              <w:t xml:space="preserve">by eye (one author)</w:t>
-            </w:r>
-          </w:p>
-        </w:tc>
-        <w:tc>
-          <w:tcPr/>
-          <w:p>
-            <w:pPr>
-              <w:pStyle w:val="Compact"/>
-              <w:spacing w:line="240" w:lineRule="auto"/>
-              <w:jc w:val="left"/>
-            </w:pPr>
-            <w:r>
-              <w:rPr>
-                <w:sz w:val="19"/>
-              </w:rPr>
-              <w:t xml:space="preserve">Tilt-defined</w:t>
-            </w:r>
-            <w:r>
-              <w:rPr>
-                <w:sz w:val="19"/>
-              </w:rPr>
-              <w:t xml:space="preserve"> </w:t>
-            </w:r>
-            <m:oMath>
-              <m:sSub>
-                <m:e>
-                  <m:r>
-                    <m:t>t</m:t>
-                  </m:r>
-                </m:e>
-                <m:sub>
-                  <m:r>
-                    <m:t>c</m:t>
-                  </m:r>
-                </m:sub>
-              </m:sSub>
-            </m:oMath>
-            <w:r>
-              <w:rPr>
-                <w:sz w:val="19"/>
-              </w:rPr>
-              <w:t xml:space="preserve"> </w:t>
-            </w:r>
-            <w:r>
-              <w:rPr>
-                <w:sz w:val="19"/>
-              </w:rPr>
-              <w:t xml:space="preserve">correct in 21 of 26; 18 of 24 fallback logs contain no crash</w:t>
-            </w:r>
-          </w:p>
-        </w:tc>
-        <w:tc>
-          <w:tcPr/>
-          <w:p>
-            <w:pPr>
-              <w:pStyle w:val="Compact"/>
-              <w:spacing w:line="240" w:lineRule="auto"/>
-              <w:jc w:val="left"/>
-            </w:pPr>
             <w:r>
               <w:rPr>
                 <w:rStyle w:val="VerbatimChar"/>
                 <w:sz w:val="19"/>
               </w:rPr>
-              <w:t xml:space="preserve">97974ad</w:t>
-            </w:r>
-            <w:r>
-              <w:rPr>
-                <w:sz w:val="19"/>
-              </w:rPr>
-              <w:t xml:space="preserve">,</w:t>
-            </w:r>
-            <w:r>
-              <w:rPr>
-                <w:sz w:val="19"/>
-              </w:rPr>
-              <w:t xml:space="preserve"> </w:t>
-            </w:r>
-            <w:r>
-              <w:rPr>
-                <w:rStyle w:val="VerbatimChar"/>
-                <w:sz w:val="19"/>
-              </w:rPr>
-              <w:t xml:space="preserve">bfda684</w:t>
+              <w:t xml:space="preserve">18b0eff</w:t>
             </w:r>
           </w:p>
         </w:tc>
@@ -26321,7 +26437,7 @@
               <w:rPr>
                 <w:sz w:val="19"/>
               </w:rPr>
-              <w:t xml:space="preserve">Third robustness audit</w:t>
+              <w:t xml:space="preserve">Crash-moment review</w:t>
             </w:r>
             <m:oMath>
               <m:sSup>
@@ -26354,23 +26470,7 @@
               <w:rPr>
                 <w:sz w:val="19"/>
               </w:rPr>
-              <w:t xml:space="preserve">Confirmed crashes, dates vs GPS, grouped leak curve, clustered variants, stumps</w:t>
-            </w:r>
-          </w:p>
-        </w:tc>
-        <w:tc>
-          <w:tcPr/>
-          <w:p>
-            <w:pPr>
-              <w:pStyle w:val="Compact"/>
-              <w:spacing w:line="240" w:lineRule="auto"/>
-              <w:jc w:val="left"/>
-            </w:pPr>
-            <w:r>
-              <w:rPr>
-                <w:sz w:val="19"/>
-              </w:rPr>
-              <w:t xml:space="preserve">40 of 148 crashes confirmed; leak drop 0.035 overall, 0.103 confirmed; index date = GPS date for 80%, no cross-day misorder; clustered variant</w:t>
+              <w:t xml:space="preserve">Check</w:t>
             </w:r>
             <w:r>
               <w:rPr>
@@ -26379,9 +26479,18 @@
               <w:t xml:space="preserve"> </w:t>
             </w:r>
             <m:oMath>
-              <m:r>
-                <m:t>p</m:t>
-              </m:r>
+              <m:sSub>
+                <m:e>
+                  <m:r>
+                    <m:t>t</m:t>
+                  </m:r>
+                </m:e>
+                <m:sub>
+                  <m:r>
+                    <m:t>c</m:t>
+                  </m:r>
+                </m:sub>
+              </m:sSub>
             </m:oMath>
             <w:r>
               <w:rPr>
@@ -26393,7 +26502,55 @@
               <w:rPr>
                 <w:sz w:val="19"/>
               </w:rPr>
-              <w:t xml:space="preserve">0.014–0.026 (newer metric 0.28); stumps 0.447/0.481</w:t>
+              <w:t xml:space="preserve">by eye (one author)</w:t>
+            </w:r>
+          </w:p>
+        </w:tc>
+        <w:tc>
+          <w:tcPr/>
+          <w:p>
+            <w:pPr>
+              <w:pStyle w:val="Compact"/>
+              <w:spacing w:line="240" w:lineRule="auto"/>
+              <w:jc w:val="left"/>
+            </w:pPr>
+            <w:r>
+              <w:rPr>
+                <w:sz w:val="19"/>
+              </w:rPr>
+              <w:t xml:space="preserve">Tilt-defined</w:t>
+            </w:r>
+            <w:r>
+              <w:rPr>
+                <w:sz w:val="19"/>
+              </w:rPr>
+              <w:t xml:space="preserve"> </w:t>
+            </w:r>
+            <m:oMath>
+              <m:sSub>
+                <m:e>
+                  <m:r>
+                    <m:t>t</m:t>
+                  </m:r>
+                </m:e>
+                <m:sub>
+                  <m:r>
+                    <m:t>c</m:t>
+                  </m:r>
+                </m:sub>
+              </m:sSub>
+            </m:oMath>
+            <w:r>
+              <w:rPr>
+                <w:sz w:val="19"/>
+              </w:rPr>
+              <w:t xml:space="preserve"> </w:t>
+            </w:r>
+            <w:r>
+              <w:rPr>
+                <w:sz w:val="19"/>
+              </w:rPr>
+              <w:t xml:space="preserve">correct in 21 of 26; 18 of 24 fallback logs contain no crash</w:t>
             </w:r>
           </w:p>
         </w:tc>
@@ -26410,7 +26567,26 @@
                 <w:rStyle w:val="VerbatimChar"/>
                 <w:sz w:val="19"/>
               </w:rPr>
-              <w:t xml:space="preserve">48c2fa7</w:t>
+              <w:t xml:space="preserve">97974ad</w:t>
+            </w:r>
+            <w:r>
+              <w:rPr>
+                <w:sz w:val="19"/>
+              </w:rPr>
+              <w:t xml:space="preserve">,</w:t>
+            </w:r>
+            <w:r>
+              <w:rPr>
+                <w:sz w:val="19"/>
+              </w:rPr>
+              <w:t xml:space="preserve"> </w:t>
+            </w:r>
+            <w:r>
+              <w:rPr>
+                <w:rStyle w:val="VerbatimChar"/>
+                <w:sz w:val="19"/>
+              </w:rPr>
+              <w:t xml:space="preserve">bfda684</w:t>
             </w:r>
           </w:p>
         </w:tc>
@@ -26444,7 +26620,7 @@
               <w:rPr>
                 <w:sz w:val="19"/>
               </w:rPr>
-              <w:t xml:space="preserve">Second robustness audit</w:t>
+              <w:t xml:space="preserve">Third robustness audit</w:t>
             </w:r>
             <m:oMath>
               <m:sSup>
@@ -26477,7 +26653,23 @@
               <w:rPr>
                 <w:sz w:val="19"/>
               </w:rPr>
-              <w:t xml:space="preserve">Refit nulls, clustered between-drone</w:t>
+              <w:t xml:space="preserve">Confirmed crashes, dates vs GPS, grouped leak curve, clustered variants, stumps</w:t>
+            </w:r>
+          </w:p>
+        </w:tc>
+        <w:tc>
+          <w:tcPr/>
+          <w:p>
+            <w:pPr>
+              <w:pStyle w:val="Compact"/>
+              <w:spacing w:line="240" w:lineRule="auto"/>
+              <w:jc w:val="left"/>
+            </w:pPr>
+            <w:r>
+              <w:rPr>
+                <w:sz w:val="19"/>
+              </w:rPr>
+              <w:t xml:space="preserve">40 of 148 crashes confirmed; leak drop 0.035 overall, 0.103 confirmed; index date = GPS date for 80%, no cross-day misorder; clustered variant</w:t>
             </w:r>
             <w:r>
               <w:rPr>
@@ -26494,128 +26686,14 @@
               <w:rPr>
                 <w:sz w:val="19"/>
               </w:rPr>
-              <w:t xml:space="preserve">, paired comparison, fixed-seed Table 7, re-flights, crash moment</w:t>
-            </w:r>
-          </w:p>
-        </w:tc>
-        <w:tc>
-          <w:tcPr/>
-          <w:p>
-            <w:pPr>
-              <w:pStyle w:val="Compact"/>
-              <w:spacing w:line="240" w:lineRule="auto"/>
-              <w:jc w:val="left"/>
-            </w:pPr>
-            <w:r>
-              <w:rPr>
-                <w:sz w:val="19"/>
-              </w:rPr>
-              <w:t xml:space="preserve">Between-drone clustered</w:t>
-            </w:r>
-            <w:r>
-              <w:rPr>
-                <w:sz w:val="19"/>
-              </w:rPr>
               <w:t xml:space="preserve"> </w:t>
             </w:r>
-            <m:oMath>
-              <m:r>
-                <m:t>p</m:t>
-              </m:r>
-              <m:r>
-                <m:rPr>
-                  <m:sty m:val="p"/>
-                </m:rPr>
-                <m:t>=</m:t>
-              </m:r>
-              <m:r>
-                <m:t>0.012</m:t>
-              </m:r>
-            </m:oMath>
-            <w:r>
-              <w:rPr>
-                <w:sz w:val="19"/>
-              </w:rPr>
-              <w:t xml:space="preserve"> </w:t>
-            </w:r>
-            <w:r>
-              <w:rPr>
-                <w:sz w:val="19"/>
-              </w:rPr>
-              <w:t xml:space="preserve">(Holm 0.08); other minus own flights</w:t>
-            </w:r>
-            <w:r>
-              <w:rPr>
-                <w:sz w:val="19"/>
-              </w:rPr>
-              <w:t xml:space="preserve"> </w:t>
-            </w:r>
-            <m:oMath>
-              <m:r>
-                <m:rPr>
-                  <m:sty m:val="p"/>
-                </m:rPr>
-                <m:t>+</m:t>
-              </m:r>
-              <m:r>
-                <m:t>0.113</m:t>
-              </m:r>
-            </m:oMath>
-            <w:r>
-              <w:rPr>
-                <w:sz w:val="19"/>
-              </w:rPr>
-              <w:t xml:space="preserve"> </w:t>
-            </w:r>
-            <w:r>
-              <w:rPr>
-                <w:sz w:val="19"/>
-              </w:rPr>
-              <w:t xml:space="preserve">[0.029, 0.212]; Step 1 grouping 0.882</w:t>
-            </w:r>
-            <w:r>
-              <w:rPr>
-                <w:sz w:val="19"/>
-              </w:rPr>
-              <w:t xml:space="preserve"> </w:t>
-            </w:r>
-            <m:oMath>
-              <m:r>
-                <m:rPr>
-                  <m:sty m:val="p"/>
-                </m:rPr>
-                <m:t>→</m:t>
-              </m:r>
-            </m:oMath>
-            <w:r>
-              <w:rPr>
-                <w:sz w:val="19"/>
-              </w:rPr>
-              <w:t xml:space="preserve"> </w:t>
-            </w:r>
-            <w:r>
-              <w:rPr>
-                <w:sz w:val="19"/>
-              </w:rPr>
-              <w:t xml:space="preserve">0.826; 54% of crash-rated logs have a later log from the same flight controller; Task B refit-null upper bounds</w:t>
-            </w:r>
-            <w:r>
-              <w:rPr>
-                <w:sz w:val="19"/>
-              </w:rPr>
-              <w:t xml:space="preserve"> </w:t>
-            </w:r>
-            <m:oMath>
-              <m:r>
-                <m:rPr>
-                  <m:sty m:val="p"/>
-                </m:rPr>
-                <m:t>≤</m:t>
-              </m:r>
-              <m:r>
-                <m:t>0.69</m:t>
-              </m:r>
-            </m:oMath>
+            <w:r>
+              <w:rPr>
+                <w:sz w:val="19"/>
+              </w:rPr>
+              <w:t xml:space="preserve">0.014–0.026 (newer metric 0.28); stumps 0.447/0.481</w:t>
+            </w:r>
           </w:p>
         </w:tc>
         <w:tc>
@@ -26631,26 +26709,7 @@
                 <w:rStyle w:val="VerbatimChar"/>
                 <w:sz w:val="19"/>
               </w:rPr>
-              <w:t xml:space="preserve">6fff27d</w:t>
-            </w:r>
-            <w:r>
-              <w:rPr>
-                <w:sz w:val="19"/>
-              </w:rPr>
-              <w:t xml:space="preserve">,</w:t>
-            </w:r>
-            <w:r>
-              <w:rPr>
-                <w:sz w:val="19"/>
-              </w:rPr>
-              <w:t xml:space="preserve"> </w:t>
-            </w:r>
-            <w:r>
-              <w:rPr>
-                <w:rStyle w:val="VerbatimChar"/>
-                <w:sz w:val="19"/>
-              </w:rPr>
-              <w:t xml:space="preserve">016dafe</w:t>
+              <w:t xml:space="preserve">48c2fa7</w:t>
             </w:r>
           </w:p>
         </w:tc>
@@ -26684,7 +26743,7 @@
               <w:rPr>
                 <w:sz w:val="19"/>
               </w:rPr>
-              <w:t xml:space="preserve">Post-crash flight audit</w:t>
+              <w:t xml:space="preserve">Second robustness audit</w:t>
             </w:r>
             <m:oMath>
               <m:sSup>
@@ -26717,23 +26776,72 @@
               <w:rPr>
                 <w:sz w:val="19"/>
               </w:rPr>
-              <w:t xml:space="preserve">GPS-order the within-drone samples</w:t>
-            </w:r>
-          </w:p>
-        </w:tc>
-        <w:tc>
-          <w:tcPr/>
-          <w:p>
-            <w:pPr>
-              <w:pStyle w:val="Compact"/>
-              <w:spacing w:line="240" w:lineRule="auto"/>
-              <w:jc w:val="left"/>
-            </w:pPr>
-            <w:r>
-              <w:rPr>
-                <w:sz w:val="19"/>
-              </w:rPr>
-              <w:t xml:space="preserve">85 of 210 crash-day earlier flights followed the crash; without them rank tests unchanged, within-drone model 0.582 [0.525, 0.660], caliper lift</w:t>
+              <w:t xml:space="preserve">Refit nulls, clustered between-drone</w:t>
+            </w:r>
+            <w:r>
+              <w:rPr>
+                <w:sz w:val="19"/>
+              </w:rPr>
+              <w:t xml:space="preserve"> </w:t>
+            </w:r>
+            <m:oMath>
+              <m:r>
+                <m:t>p</m:t>
+              </m:r>
+            </m:oMath>
+            <w:r>
+              <w:rPr>
+                <w:sz w:val="19"/>
+              </w:rPr>
+              <w:t xml:space="preserve">, paired comparison, fixed-seed Table 7, re-flights, crash moment</w:t>
+            </w:r>
+          </w:p>
+        </w:tc>
+        <w:tc>
+          <w:tcPr/>
+          <w:p>
+            <w:pPr>
+              <w:pStyle w:val="Compact"/>
+              <w:spacing w:line="240" w:lineRule="auto"/>
+              <w:jc w:val="left"/>
+            </w:pPr>
+            <w:r>
+              <w:rPr>
+                <w:sz w:val="19"/>
+              </w:rPr>
+              <w:t xml:space="preserve">Between-drone clustered</w:t>
+            </w:r>
+            <w:r>
+              <w:rPr>
+                <w:sz w:val="19"/>
+              </w:rPr>
+              <w:t xml:space="preserve"> </w:t>
+            </w:r>
+            <m:oMath>
+              <m:r>
+                <m:t>p</m:t>
+              </m:r>
+              <m:r>
+                <m:rPr>
+                  <m:sty m:val="p"/>
+                </m:rPr>
+                <m:t>=</m:t>
+              </m:r>
+              <m:r>
+                <m:t>0.012</m:t>
+              </m:r>
+            </m:oMath>
+            <w:r>
+              <w:rPr>
+                <w:sz w:val="19"/>
+              </w:rPr>
+              <w:t xml:space="preserve"> </w:t>
+            </w:r>
+            <w:r>
+              <w:rPr>
+                <w:sz w:val="19"/>
+              </w:rPr>
+              <w:t xml:space="preserve">(Holm 0.08); other minus own flights</w:t>
             </w:r>
             <w:r>
               <w:rPr>
@@ -26749,7 +26857,7 @@
                 <m:t>+</m:t>
               </m:r>
               <m:r>
-                <m:t>0.086</m:t>
+                <m:t>0.113</m:t>
               </m:r>
             </m:oMath>
             <w:r>
@@ -26762,25 +26870,51 @@
               <w:rPr>
                 <w:sz w:val="19"/>
               </w:rPr>
-              <w:t xml:space="preserve">[</w:t>
+              <w:t xml:space="preserve">[0.029, 0.212]; Step 1 grouping 0.882</w:t>
+            </w:r>
+            <w:r>
+              <w:rPr>
+                <w:sz w:val="19"/>
+              </w:rPr>
+              <w:t xml:space="preserve"> </w:t>
             </w:r>
             <m:oMath>
               <m:r>
                 <m:rPr>
                   <m:sty m:val="p"/>
                 </m:rPr>
-                <m:t>−</m:t>
+                <m:t>→</m:t>
+              </m:r>
+            </m:oMath>
+            <w:r>
+              <w:rPr>
+                <w:sz w:val="19"/>
+              </w:rPr>
+              <w:t xml:space="preserve"> </w:t>
+            </w:r>
+            <w:r>
+              <w:rPr>
+                <w:sz w:val="19"/>
+              </w:rPr>
+              <w:t xml:space="preserve">0.826; 54% of crash-rated logs have a later log from the same flight controller; Task B refit-null upper bounds</w:t>
+            </w:r>
+            <w:r>
+              <w:rPr>
+                <w:sz w:val="19"/>
+              </w:rPr>
+              <w:t xml:space="preserve"> </w:t>
+            </w:r>
+            <m:oMath>
+              <m:r>
+                <m:rPr>
+                  <m:sty m:val="p"/>
+                </m:rPr>
+                <m:t>≤</m:t>
               </m:r>
               <m:r>
-                <m:t>0.064</m:t>
+                <m:t>0.69</m:t>
               </m:r>
             </m:oMath>
-            <w:r>
-              <w:rPr>
-                <w:sz w:val="19"/>
-              </w:rPr>
-              <w:t xml:space="preserve">, +0.184] (masking withdrawn), same-aircraft 0.507</w:t>
-            </w:r>
           </w:p>
         </w:tc>
         <w:tc>
@@ -26796,7 +26930,26 @@
                 <w:rStyle w:val="VerbatimChar"/>
                 <w:sz w:val="19"/>
               </w:rPr>
-              <w:t xml:space="preserve">0d38f5d</w:t>
+              <w:t xml:space="preserve">6fff27d</w:t>
+            </w:r>
+            <w:r>
+              <w:rPr>
+                <w:sz w:val="19"/>
+              </w:rPr>
+              <w:t xml:space="preserve">,</w:t>
+            </w:r>
+            <w:r>
+              <w:rPr>
+                <w:sz w:val="19"/>
+              </w:rPr>
+              <w:t xml:space="preserve"> </w:t>
+            </w:r>
+            <w:r>
+              <w:rPr>
+                <w:rStyle w:val="VerbatimChar"/>
+                <w:sz w:val="19"/>
+              </w:rPr>
+              <w:t xml:space="preserve">016dafe</w:t>
             </w:r>
           </w:p>
         </w:tc>
@@ -26830,7 +26983,7 @@
               <w:rPr>
                 <w:sz w:val="19"/>
               </w:rPr>
-              <w:t xml:space="preserve">Flight-order audit</w:t>
+              <w:t xml:space="preserve">Post-crash flight audit</w:t>
             </w:r>
             <m:oMath>
               <m:sSup>
@@ -26863,23 +27016,23 @@
               <w:rPr>
                 <w:sz w:val="19"/>
               </w:rPr>
-              <w:t xml:space="preserve">Caliper without duration-linked features; GPS ordering</w:t>
-            </w:r>
-          </w:p>
-        </w:tc>
-        <w:tc>
-          <w:tcPr/>
-          <w:p>
-            <w:pPr>
-              <w:pStyle w:val="Compact"/>
-              <w:spacing w:line="240" w:lineRule="auto"/>
-              <w:jc w:val="left"/>
-            </w:pPr>
-            <w:r>
-              <w:rPr>
-                <w:sz w:val="19"/>
-              </w:rPr>
-              <w:t xml:space="preserve">Lift</w:t>
+              <w:t xml:space="preserve">GPS-order the within-drone samples</w:t>
+            </w:r>
+          </w:p>
+        </w:tc>
+        <w:tc>
+          <w:tcPr/>
+          <w:p>
+            <w:pPr>
+              <w:pStyle w:val="Compact"/>
+              <w:spacing w:line="240" w:lineRule="auto"/>
+              <w:jc w:val="left"/>
+            </w:pPr>
+            <w:r>
+              <w:rPr>
+                <w:sz w:val="19"/>
+              </w:rPr>
+              <w:t xml:space="preserve">85 of 210 crash-day earlier flights followed the crash; without them rank tests unchanged, within-drone model 0.582 [0.525, 0.660], caliper lift</w:t>
             </w:r>
             <w:r>
               <w:rPr>
@@ -26895,7 +27048,7 @@
                 <m:t>+</m:t>
               </m:r>
               <m:r>
-                <m:t>0.077</m:t>
+                <m:t>0.086</m:t>
               </m:r>
             </m:oMath>
             <w:r>
@@ -26908,27 +27061,24 @@
               <w:rPr>
                 <w:sz w:val="19"/>
               </w:rPr>
-              <w:t xml:space="preserve">[+0.013, +0.204] without three features; 47 of 95 crash-day exposure flights followed the crash; between-drone 0.698 (</w:t>
+              <w:t xml:space="preserve">[</w:t>
             </w:r>
             <m:oMath>
-              <m:r>
-                <m:t>p</m:t>
-              </m:r>
               <m:r>
                 <m:rPr>
                   <m:sty m:val="p"/>
                 </m:rPr>
-                <m:t>=</m:t>
+                <m:t>−</m:t>
               </m:r>
               <m:r>
-                <m:t>0.0021</m:t>
+                <m:t>0.064</m:t>
               </m:r>
             </m:oMath>
             <w:r>
               <w:rPr>
                 <w:sz w:val="19"/>
               </w:rPr>
-              <w:t xml:space="preserve">, 43 sets) without them</w:t>
+              <w:t xml:space="preserve">, +0.184] (masking withdrawn), same-aircraft 0.507</w:t>
             </w:r>
           </w:p>
         </w:tc>
@@ -26945,26 +27095,7 @@
                 <w:rStyle w:val="VerbatimChar"/>
                 <w:sz w:val="19"/>
               </w:rPr>
-              <w:t xml:space="preserve">0e26db0</w:t>
-            </w:r>
-            <w:r>
-              <w:rPr>
-                <w:sz w:val="19"/>
-              </w:rPr>
-              <w:t xml:space="preserve">,</w:t>
-            </w:r>
-            <w:r>
-              <w:rPr>
-                <w:sz w:val="19"/>
-              </w:rPr>
-              <w:t xml:space="preserve"> </w:t>
-            </w:r>
-            <w:r>
-              <w:rPr>
-                <w:rStyle w:val="VerbatimChar"/>
-                <w:sz w:val="19"/>
-              </w:rPr>
-              <w:t xml:space="preserve">187f570</w:t>
+              <w:t xml:space="preserve">0d38f5d</w:t>
             </w:r>
           </w:p>
         </w:tc>
@@ -26998,7 +27129,7 @@
               <w:rPr>
                 <w:sz w:val="19"/>
               </w:rPr>
-              <w:t xml:space="preserve">Factorial optimism audit</w:t>
+              <w:t xml:space="preserve">Flight-order audit</w:t>
             </w:r>
             <m:oMath>
               <m:sSup>
@@ -27031,6 +27162,174 @@
               <w:rPr>
                 <w:sz w:val="19"/>
               </w:rPr>
+              <w:t xml:space="preserve">Caliper without duration-linked features; GPS ordering</w:t>
+            </w:r>
+          </w:p>
+        </w:tc>
+        <w:tc>
+          <w:tcPr/>
+          <w:p>
+            <w:pPr>
+              <w:pStyle w:val="Compact"/>
+              <w:spacing w:line="240" w:lineRule="auto"/>
+              <w:jc w:val="left"/>
+            </w:pPr>
+            <w:r>
+              <w:rPr>
+                <w:sz w:val="19"/>
+              </w:rPr>
+              <w:t xml:space="preserve">Lift</w:t>
+            </w:r>
+            <w:r>
+              <w:rPr>
+                <w:sz w:val="19"/>
+              </w:rPr>
+              <w:t xml:space="preserve"> </w:t>
+            </w:r>
+            <m:oMath>
+              <m:r>
+                <m:rPr>
+                  <m:sty m:val="p"/>
+                </m:rPr>
+                <m:t>+</m:t>
+              </m:r>
+              <m:r>
+                <m:t>0.077</m:t>
+              </m:r>
+            </m:oMath>
+            <w:r>
+              <w:rPr>
+                <w:sz w:val="19"/>
+              </w:rPr>
+              <w:t xml:space="preserve"> </w:t>
+            </w:r>
+            <w:r>
+              <w:rPr>
+                <w:sz w:val="19"/>
+              </w:rPr>
+              <w:t xml:space="preserve">[+0.013, +0.204] without three features; 47 of 95 crash-day exposure flights followed the crash; between-drone 0.698 (</w:t>
+            </w:r>
+            <m:oMath>
+              <m:r>
+                <m:t>p</m:t>
+              </m:r>
+              <m:r>
+                <m:rPr>
+                  <m:sty m:val="p"/>
+                </m:rPr>
+                <m:t>=</m:t>
+              </m:r>
+              <m:r>
+                <m:t>0.0021</m:t>
+              </m:r>
+            </m:oMath>
+            <w:r>
+              <w:rPr>
+                <w:sz w:val="19"/>
+              </w:rPr>
+              <w:t xml:space="preserve">, 43 sets) without them</w:t>
+            </w:r>
+          </w:p>
+        </w:tc>
+        <w:tc>
+          <w:tcPr/>
+          <w:p>
+            <w:pPr>
+              <w:pStyle w:val="Compact"/>
+              <w:spacing w:line="240" w:lineRule="auto"/>
+              <w:jc w:val="left"/>
+            </w:pPr>
+            <w:r>
+              <w:rPr>
+                <w:rStyle w:val="VerbatimChar"/>
+                <w:sz w:val="19"/>
+              </w:rPr>
+              <w:t xml:space="preserve">0e26db0</w:t>
+            </w:r>
+            <w:r>
+              <w:rPr>
+                <w:sz w:val="19"/>
+              </w:rPr>
+              <w:t xml:space="preserve">,</w:t>
+            </w:r>
+            <w:r>
+              <w:rPr>
+                <w:sz w:val="19"/>
+              </w:rPr>
+              <w:t xml:space="preserve"> </w:t>
+            </w:r>
+            <w:r>
+              <w:rPr>
+                <w:rStyle w:val="VerbatimChar"/>
+                <w:sz w:val="19"/>
+              </w:rPr>
+              <w:t xml:space="preserve">187f570</w:t>
+            </w:r>
+          </w:p>
+        </w:tc>
+        <w:tc>
+          <w:tcPr/>
+          <w:p>
+            <w:pPr>
+              <w:pStyle w:val="Compact"/>
+              <w:spacing w:line="240" w:lineRule="auto"/>
+              <w:jc w:val="left"/>
+            </w:pPr>
+            <w:r>
+              <w:rPr>
+                <w:sz w:val="19"/>
+              </w:rPr>
+              <w:t xml:space="preserve">2026-10-27</w:t>
+            </w:r>
+          </w:p>
+        </w:tc>
+      </w:tr>
+      <w:tr>
+        <w:tc>
+          <w:tcPr/>
+          <w:p>
+            <w:pPr>
+              <w:pStyle w:val="Compact"/>
+              <w:spacing w:line="240" w:lineRule="auto"/>
+              <w:jc w:val="left"/>
+            </w:pPr>
+            <w:r>
+              <w:rPr>
+                <w:sz w:val="19"/>
+              </w:rPr>
+              <w:t xml:space="preserve">Factorial optimism audit</w:t>
+            </w:r>
+            <m:oMath>
+              <m:sSup>
+                <m:e>
+                  <m:r>
+                    <m:t>​</m:t>
+                  </m:r>
+                </m:e>
+                <m:sup>
+                  <m:r>
+                    <m:rPr>
+                      <m:sty m:val="p"/>
+                    </m:rPr>
+                    <m:t>†</m:t>
+                  </m:r>
+                </m:sup>
+              </m:sSup>
+            </m:oMath>
+          </w:p>
+        </w:tc>
+        <w:tc>
+          <w:tcPr/>
+          <w:p>
+            <w:pPr>
+              <w:pStyle w:val="Compact"/>
+              <w:spacing w:line="240" w:lineRule="auto"/>
+              <w:jc w:val="left"/>
+            </w:pPr>
+            <w:r>
+              <w:rPr>
+                <w:sz w:val="19"/>
+              </w:rPr>
               <w:t xml:space="preserve">Isolate what the AUC depends on</w:t>
             </w:r>
           </w:p>
@@ -27119,12 +27418,12 @@
         </w:tc>
       </w:tr>
     </w:tbl>
-    <w:bookmarkEnd w:id="69"/>
+    <w:bookmarkEnd w:id="70"/>
     <w:p>
       <w:pPr>
         <w:pStyle w:val="Heading1"/>
       </w:pPr>
-      <w:bookmarkStart w:id="70" w:name="_5197750e0310900a35791fde6fc3b970851116d"/>
+      <w:bookmarkStart w:id="71" w:name="_5197750e0310900a35791fde6fc3b970851116d"/>
       <w:r>
         <w:rPr>
           <w:rStyle w:val="SectionNumber"/>
@@ -27137,7 +27436,7 @@
       <w:r>
         <w:t xml:space="preserve">Design implications for fleet assurance</w:t>
       </w:r>
-      <w:bookmarkEnd w:id="70"/>
+      <w:bookmarkEnd w:id="71"/>
     </w:p>
     <w:p>
       <w:pPr>
@@ -27146,7 +27445,7 @@
       <w:r>
         <w:t xml:space="preserve">To translate these empirical findings into operational practice, we developed AeroFleet 2.0 (</w:t>
       </w:r>
-      <w:hyperlink r:id="rId71">
+      <w:hyperlink r:id="rId72">
         <w:r>
           <w:rPr>
             <w:rStyle w:val="Hyperlink"/>
@@ -27186,7 +27485,7 @@
         <w:t xml:space="preserve">at an assumed 10% flag rate, 41–44 inspections per crash), rather than issuing per-flight crash alarms. Finally, to ensure evidentiary integrity over the lifecycle of each airframe, all reviews, approvals, and configuration checks are appended to a tamper-evident, Ed25519-signed record referencing SHA-256 digests of the original telemetry files.</w:t>
       </w:r>
     </w:p>
-    <w:bookmarkStart w:id="72" w:name="_4816a700d4290cff51a6fa69217ee9f1521b64f"/>
+    <w:bookmarkStart w:id="73" w:name="_4816a700d4290cff51a6fa69217ee9f1521b64f"/>
     <w:p>
       <w:pPr>
         <w:pStyle w:val="TableCaption"/>
@@ -27644,12 +27943,12 @@
         </w:tc>
       </w:tr>
     </w:tbl>
-    <w:bookmarkEnd w:id="72"/>
+    <w:bookmarkEnd w:id="73"/>
     <w:p>
       <w:pPr>
         <w:pStyle w:val="Heading2"/>
       </w:pPr>
-      <w:bookmarkStart w:id="73" w:name="_46768506b9d2d22e677daf79594de5255acfb0b"/>
+      <w:bookmarkStart w:id="74" w:name="_46768506b9d2d22e677daf79594de5255acfb0b"/>
       <w:r>
         <w:rPr>
           <w:rStyle w:val="SectionNumber"/>
@@ -27662,7 +27961,7 @@
       <w:r>
         <w:t xml:space="preserve">Recommended reporting checklist for flight-log diagnostics</w:t>
       </w:r>
-      <w:bookmarkEnd w:id="73"/>
+      <w:bookmarkEnd w:id="74"/>
     </w:p>
     <w:p>
       <w:pPr>
@@ -27672,7 +27971,7 @@
         <w:t xml:space="preserve">To support drone safety regulators, accident investigators, and data-driven diagnostic tool developers in avoiding the leakage and confounding traps quantified in this study, Table 14 outlines an eight-item recommended reporting checklist. Each item pairs a methodological recommendation with its empirical rationale and the specific failure mode observed in our experiments when that control is omitted.</w:t>
       </w:r>
     </w:p>
-    <w:bookmarkStart w:id="74" w:name="_8dfd3cae62712a91b3c1ba079a4ea82fa2a3d98"/>
+    <w:bookmarkStart w:id="75" w:name="_8dfd3cae62712a91b3c1ba079a4ea82fa2a3d98"/>
     <w:p>
       <w:pPr>
         <w:pStyle w:val="TableCaption"/>
@@ -28421,12 +28720,12 @@
         </w:tc>
       </w:tr>
     </w:tbl>
-    <w:bookmarkEnd w:id="74"/>
+    <w:bookmarkEnd w:id="75"/>
     <w:p>
       <w:pPr>
         <w:pStyle w:val="Heading1"/>
       </w:pPr>
-      <w:bookmarkStart w:id="75" w:name="_074802e0e16f6322e726b21f081c01c392e8fbd"/>
+      <w:bookmarkStart w:id="76" w:name="_074802e0e16f6322e726b21f081c01c392e8fbd"/>
       <w:r>
         <w:rPr>
           <w:rStyle w:val="SectionNumber"/>
@@ -28439,7 +28738,7 @@
       <w:r>
         <w:t xml:space="preserve">Discussion</w:t>
       </w:r>
-      <w:bookmarkEnd w:id="75"/>
+      <w:bookmarkEnd w:id="76"/>
     </w:p>
     <w:p>
       <w:pPr>
@@ -29541,7 +29840,7 @@
       <w:pPr>
         <w:pStyle w:val="Heading1"/>
       </w:pPr>
-      <w:bookmarkStart w:id="76" w:name="_82b82981e21bad8167d56d1f0b74a832e215810"/>
+      <w:bookmarkStart w:id="77" w:name="_82b82981e21bad8167d56d1f0b74a832e215810"/>
       <w:r>
         <w:rPr>
           <w:rStyle w:val="SectionNumber"/>
@@ -29554,7 +29853,7 @@
       <w:r>
         <w:t xml:space="preserve">Threats to validity</w:t>
       </w:r>
-      <w:bookmarkEnd w:id="76"/>
+      <w:bookmarkEnd w:id="77"/>
     </w:p>
     <w:p>
       <w:pPr>
@@ -30360,7 +30659,7 @@
         <w:t xml:space="preserve"> </w:t>
       </w:r>
       <w:r>
-        <w:t xml:space="preserve">An uploader’s crash rating does not show that the aircraft was lost, but the archive cannot show that it survived either. Of 490 crash-rated logs from real hardware with a vehicle identifier, 264 (54%) have a later-dated log from the same flight-controller serial (median 4.5 days later; 83 within one day); among the 40 crashed airframes of the between-drone test the share is 78% (median one day). Because a flight controller can be moved to a new frame, this shows that the controller was flown again, not that the aircraft survived; the same-day flights after the crash found by GPS time are consistent with minor incidents but do not prove them. The crash moment is also uncertain: in only 72 of the 148 modelled crash logs does tilt exceed</w:t>
+        <w:t xml:space="preserve">Archive-wide, only about half of crash-rated multicopter logs contain the crash (Section 5.3). An uploader’s crash rating does not show that the aircraft was lost, but the archive cannot show that it survived either. Of 490 crash-rated logs from real hardware with a vehicle identifier, 264 (54%) have a later-dated log from the same flight-controller serial (median 4.5 days later; 83 within one day); among the 40 crashed airframes of the between-drone test the share is 78% (median one day). Because a flight controller can be moved to a new frame, this shows that the controller was flown again, not that the aircraft survived; the same-day flights after the crash found by GPS time are consistent with minor incidents but do not prove them. The crash moment is also uncertain: in only 72 of the 148 modelled crash logs does tilt exceed</w:t>
       </w:r>
       <w:r>
         <w:t xml:space="preserve"> </w:t>
@@ -30871,7 +31170,7 @@
       <w:pPr>
         <w:pStyle w:val="Heading1"/>
       </w:pPr>
-      <w:bookmarkStart w:id="77" w:name="_0cf7f8e9027f9f9352f3019b4ede1d43d537ff7"/>
+      <w:bookmarkStart w:id="78" w:name="_0cf7f8e9027f9f9352f3019b4ede1d43d537ff7"/>
       <w:r>
         <w:rPr>
           <w:rStyle w:val="SectionNumber"/>
@@ -30883,103 +31182,6 @@
       </w:r>
       <w:r>
         <w:t xml:space="preserve">Conclusion</w:t>
-      </w:r>
-      <w:bookmarkEnd w:id="77"/>
-    </w:p>
-    <w:p>
-      <w:pPr>
-        <w:pStyle w:val="FirstParagraph"/>
-      </w:pPr>
-      <w:r>
-        <w:t xml:space="preserve">Across 590 crash-rated logs from a 479,547-flight PX4 archive, flight logs did not support pilot-versus-aircraft verdicts. A fixed rule reached 0.47 balanced accuracy on held-out crashes, and exploratory models stayed near chance (AUC 0.42–0.59; approximate upper bounds at most 0.69), short of the roughly 0.8 an operational verdict needs; with 36 pilot-labelled crashes, only an AUC of about 0.72 could be detected with 80% power. Agreement with 43 expert-diagnosed logs was inconclusive (balanced accuracy 0.38, Bayesian 95% CrI 0.25–0.61).</w:t>
-      </w:r>
-    </w:p>
-    <w:p>
-      <w:pPr>
-        <w:pStyle w:val="BodyText"/>
-      </w:pPr>
-      <w:r>
-        <w:t xml:space="preserve">Much of what looks like crash anticipation comes from how an evaluation is built. In a factorial audit of 32 settings, the apparent AUC of 0.88 fell by 0.21 across settings, of which 0.06 came from grouping folds by vehicle, the only factor that could be isolated; and crash-window leakage was small overall but larger among the minority of crashes with a confirmed crash moment. Ordering flights by archive date also failed for same-day flights: by GPS time, 44–55% of dated crash-day</w:t>
-      </w:r>
-      <w:r>
-        <w:t xml:space="preserve"> </w:t>
-      </w:r>
-      <w:r>
-        <w:t xml:space="preserve">“earlier”</w:t>
-      </w:r>
-      <w:r>
-        <w:t xml:space="preserve"> </w:t>
-      </w:r>
-      <w:r>
-        <w:t xml:space="preserve">flights were flown after the crash. Against each drone’s own earlier flights, the crash flight showed no warning in vibration or rate tracking.</w:t>
-      </w:r>
-    </w:p>
-    <w:p>
-      <w:pPr>
-        <w:pStyle w:val="BodyText"/>
-      </w:pPr>
-      <w:r>
-        <w:t xml:space="preserve">What the logs did show is a suggestive between-airframe signal: drones that later crashed vibrated more than matched drones on ordinary flights on older estimator metrics (mean rank 0.67;</w:t>
-      </w:r>
-      <w:r>
-        <w:t xml:space="preserve"> </w:t>
-      </w:r>
-      <m:oMath>
-        <m:r>
-          <m:t>p</m:t>
-        </m:r>
-        <m:r>
-          <m:rPr>
-            <m:sty m:val="p"/>
-          </m:rPr>
-          <m:t>=</m:t>
-        </m:r>
-        <m:r>
-          <m:t>0.012</m:t>
-        </m:r>
-      </m:oMath>
-      <w:r>
-        <w:t xml:space="preserve"> </w:t>
-      </w:r>
-      <w:r>
-        <w:t xml:space="preserve">clustered by airframe, Holm-adjusted 0.08), and replication on newer metrics was inconclusive. Used to rank airframes for inspection, it gave an illustrative</w:t>
-      </w:r>
-      <w:r>
-        <w:t xml:space="preserve"> </w:t>
-      </w:r>
-      <m:oMath>
-        <m:r>
-          <m:t>3.3</m:t>
-        </m:r>
-        <m:r>
-          <m:rPr>
-            <m:sty m:val="p"/>
-          </m:rPr>
-          <m:t>×</m:t>
-        </m:r>
-      </m:oMath>
-      <w:r>
-        <w:t xml:space="preserve"> </w:t>
-      </w:r>
-      <w:r>
-        <w:t xml:space="preserve">lift at an assumed 10% flag rate.</w:t>
-      </w:r>
-    </w:p>
-    <w:p>
-      <w:pPr>
-        <w:pStyle w:val="BodyText"/>
-      </w:pPr>
-      <w:r>
-        <w:t xml:space="preserve">Log analytics for drone fleets should therefore present evidence rather than issue verdicts; ranking airframes by vibration is a hypothesis for prospective testing, and should be evaluated with vehicle-grouped folds, comparisons against each aircraft’s own history, and flights ordered by GPS time. AeroFleet 2.0 implements this approach as an open-source tool.</w:t>
-      </w:r>
-    </w:p>
-    <w:p>
-      <w:pPr>
-        <w:pStyle w:val="Heading1"/>
-      </w:pPr>
-      <w:bookmarkStart w:id="78" w:name="_84dc18e74b75db6057c8c16a8f70e097972540a"/>
-      <w:r>
-        <w:t xml:space="preserve">Declaration of competing interest</w:t>
       </w:r>
       <w:bookmarkEnd w:id="78"/>
     </w:p>
@@ -30988,16 +31190,95 @@
         <w:pStyle w:val="FirstParagraph"/>
       </w:pPr>
       <w:r>
-        <w:t xml:space="preserve">The authors declare that they have no known competing financial interests or personal relationships that could have appeared to influence the work reported in this paper. The authors develop the open-source AeroFleet 2.0 tool described in Section 6; it is not commercial.</w:t>
+        <w:t xml:space="preserve">Across 590 crash-rated logs from a 479,547-flight PX4 archive, flight logs did not support pilot-versus-aircraft verdicts. A fixed rule reached 0.47 balanced accuracy on held-out crashes, and exploratory models stayed near chance (AUC 0.42–0.59; approximate upper bounds at most 0.69), short of the roughly 0.8 an operational verdict needs; with 36 pilot-labelled crashes, only an AUC of about 0.72 could be detected with 80% power. Agreement with 43 expert-diagnosed logs was inconclusive (balanced accuracy 0.38, Bayesian 95% CrI 0.25–0.61).</w:t>
+      </w:r>
+    </w:p>
+    <w:p>
+      <w:pPr>
+        <w:pStyle w:val="BodyText"/>
+      </w:pPr>
+      <w:r>
+        <w:t xml:space="preserve">Much of what looks like crash anticipation comes from how an evaluation is built. In a factorial audit of 32 settings, the apparent AUC of 0.88 fell by 0.21 across settings, of which 0.06 came from grouping folds by vehicle, the only factor that could be isolated; and crash-window leakage was small overall but larger among the minority of crashes with a confirmed crash moment. The archive’s labels are also weaker than assumed: only about half of crash-rated multicopter logs contain the crash, and pilot-rated logs less often than aircraft-rated ones. Ordering flights by archive date failed for same-day flights: by GPS time, 44–55% of dated crash-day</w:t>
+      </w:r>
+      <w:r>
+        <w:t xml:space="preserve"> </w:t>
+      </w:r>
+      <w:r>
+        <w:t xml:space="preserve">“earlier”</w:t>
+      </w:r>
+      <w:r>
+        <w:t xml:space="preserve"> </w:t>
+      </w:r>
+      <w:r>
+        <w:t xml:space="preserve">flights were flown after the crash. Against each drone’s own earlier flights, the crash flight showed no warning in vibration or rate tracking.</w:t>
+      </w:r>
+    </w:p>
+    <w:p>
+      <w:pPr>
+        <w:pStyle w:val="BodyText"/>
+      </w:pPr>
+      <w:r>
+        <w:t xml:space="preserve">What the logs did show is a suggestive between-airframe signal: drones that later crashed vibrated more than matched drones on ordinary flights on older estimator metrics (mean rank 0.67;</w:t>
+      </w:r>
+      <w:r>
+        <w:t xml:space="preserve"> </w:t>
+      </w:r>
+      <m:oMath>
+        <m:r>
+          <m:t>p</m:t>
+        </m:r>
+        <m:r>
+          <m:rPr>
+            <m:sty m:val="p"/>
+          </m:rPr>
+          <m:t>=</m:t>
+        </m:r>
+        <m:r>
+          <m:t>0.012</m:t>
+        </m:r>
+      </m:oMath>
+      <w:r>
+        <w:t xml:space="preserve"> </w:t>
+      </w:r>
+      <w:r>
+        <w:t xml:space="preserve">clustered by airframe, Holm-adjusted 0.08), and replication on newer metrics was inconclusive. Used to rank airframes for inspection, it gave an illustrative</w:t>
+      </w:r>
+      <w:r>
+        <w:t xml:space="preserve"> </w:t>
+      </w:r>
+      <m:oMath>
+        <m:r>
+          <m:t>3.3</m:t>
+        </m:r>
+        <m:r>
+          <m:rPr>
+            <m:sty m:val="p"/>
+          </m:rPr>
+          <m:t>×</m:t>
+        </m:r>
+      </m:oMath>
+      <w:r>
+        <w:t xml:space="preserve"> </w:t>
+      </w:r>
+      <w:r>
+        <w:t xml:space="preserve">lift at an assumed 10% flag rate.</w:t>
+      </w:r>
+    </w:p>
+    <w:p>
+      <w:pPr>
+        <w:pStyle w:val="BodyText"/>
+      </w:pPr>
+      <w:r>
+        <w:t xml:space="preserve">Log analytics for drone fleets should therefore present evidence rather than issue verdicts; ranking airframes by vibration is a hypothesis for prospective testing, and should be evaluated with vehicle-grouped folds, comparisons against each aircraft’s own history, and flights ordered by GPS time. AeroFleet 2.0 implements this approach as an open-source tool.</w:t>
       </w:r>
     </w:p>
     <w:p>
       <w:pPr>
         <w:pStyle w:val="Heading1"/>
       </w:pPr>
-      <w:bookmarkStart w:id="79" w:name="_1f74eb43af444059c7518034463b6c89b1cacf4"/>
-      <w:r>
-        <w:t xml:space="preserve">Declaration of generative AI and AI-assisted technologies in the manuscript preparation process</w:t>
+      <w:bookmarkStart w:id="79" w:name="_84dc18e74b75db6057c8c16a8f70e097972540a"/>
+      <w:r>
+        <w:t xml:space="preserve">Declaration of competing interest</w:t>
       </w:r>
       <w:bookmarkEnd w:id="79"/>
     </w:p>
@@ -31006,28 +31287,16 @@
         <w:pStyle w:val="FirstParagraph"/>
       </w:pPr>
       <w:r>
-        <w:t xml:space="preserve">During the preparation of this work the authors used an AI assistant (Claude, Anthropic) to write analysis code, draft</w:t>
-      </w:r>
-      <w:r>
-        <w:t xml:space="preserve"> </w:t>
-      </w:r>
-      <w:r>
-        <w:t xml:space="preserve">and revise text, and assist the recording of forum diagnoses. After using this tool, the authors reviewed and edited</w:t>
-      </w:r>
-      <w:r>
-        <w:t xml:space="preserve"> </w:t>
-      </w:r>
-      <w:r>
-        <w:t xml:space="preserve">the content as needed and take full responsibility for the content of the published article.</w:t>
+        <w:t xml:space="preserve">The authors declare that they have no known competing financial interests or personal relationships that could have appeared to influence the work reported in this paper. The authors develop the open-source AeroFleet 2.0 tool described in Section 6; it is not commercial.</w:t>
       </w:r>
     </w:p>
     <w:p>
       <w:pPr>
         <w:pStyle w:val="Heading1"/>
       </w:pPr>
-      <w:bookmarkStart w:id="80" w:name="_ea5c66868f283220c19382d0fdd5a852ec570ca"/>
-      <w:r>
-        <w:t xml:space="preserve">Data availability</w:t>
+      <w:bookmarkStart w:id="80" w:name="_1f74eb43af444059c7518034463b6c89b1cacf4"/>
+      <w:r>
+        <w:t xml:space="preserve">Declaration of generative AI and AI-assisted technologies in the manuscript preparation process</w:t>
       </w:r>
       <w:bookmarkEnd w:id="80"/>
     </w:p>
@@ -31036,6 +31305,36 @@
         <w:pStyle w:val="FirstParagraph"/>
       </w:pPr>
       <w:r>
+        <w:t xml:space="preserve">During the preparation of this work the authors used an AI assistant (Claude, Anthropic) to write analysis code, draft</w:t>
+      </w:r>
+      <w:r>
+        <w:t xml:space="preserve"> </w:t>
+      </w:r>
+      <w:r>
+        <w:t xml:space="preserve">and revise text, and assist the recording of forum diagnoses. After using this tool, the authors reviewed and edited</w:t>
+      </w:r>
+      <w:r>
+        <w:t xml:space="preserve"> </w:t>
+      </w:r>
+      <w:r>
+        <w:t xml:space="preserve">the content as needed and take full responsibility for the content of the published article.</w:t>
+      </w:r>
+    </w:p>
+    <w:p>
+      <w:pPr>
+        <w:pStyle w:val="Heading1"/>
+      </w:pPr>
+      <w:bookmarkStart w:id="81" w:name="_ea5c66868f283220c19382d0fdd5a852ec570ca"/>
+      <w:r>
+        <w:t xml:space="preserve">Data availability</w:t>
+      </w:r>
+      <w:bookmarkEnd w:id="81"/>
+    </w:p>
+    <w:p>
+      <w:pPr>
+        <w:pStyle w:val="FirstParagraph"/>
+      </w:pPr>
+      <w:r>
         <w:t xml:space="preserve">Selection scripts, analysis code, the declared hypotheses with their commit history, derived features, expert labels</w:t>
       </w:r>
       <w:r>
@@ -31047,7 +31346,7 @@
       <w:r>
         <w:t xml:space="preserve"> </w:t>
       </w:r>
-      <w:hyperlink r:id="rId71">
+      <w:hyperlink r:id="rId72">
         <w:r>
           <w:rPr>
             <w:rStyle w:val="Hyperlink"/>
@@ -31069,11 +31368,11 @@
       <w:pPr>
         <w:pStyle w:val="Heading1"/>
       </w:pPr>
-      <w:bookmarkStart w:id="81" w:name="_funding"/>
+      <w:bookmarkStart w:id="82" w:name="_funding"/>
       <w:r>
         <w:t xml:space="preserve">Funding</w:t>
       </w:r>
-      <w:bookmarkEnd w:id="81"/>
+      <w:bookmarkEnd w:id="82"/>
     </w:p>
     <w:p>
       <w:pPr>
@@ -31093,14 +31392,14 @@
       <w:pPr>
         <w:pStyle w:val="Heading1"/>
       </w:pPr>
-      <w:bookmarkStart w:id="82" w:name="_bibliography"/>
+      <w:bookmarkStart w:id="83" w:name="_bibliography"/>
       <w:r>
         <w:t xml:space="preserve">References</w:t>
       </w:r>
-      <w:bookmarkEnd w:id="82"/>
+      <w:bookmarkEnd w:id="83"/>
     </w:p>
-    <w:bookmarkStart w:id="152" w:name="_refs"/>
-    <w:bookmarkStart w:id="83" w:name="_94e90323a8c21041104ada5ef51239cca731079"/>
+    <w:bookmarkStart w:id="153" w:name="_refs"/>
+    <w:bookmarkStart w:id="84" w:name="_94e90323a8c21041104ada5ef51239cca731079"/>
     <w:p>
       <w:pPr>
         <w:pStyle w:val="Bibliography"/>
@@ -31127,8 +31426,8 @@
         <w:t xml:space="preserve">, (2019).</w:t>
       </w:r>
     </w:p>
-    <w:bookmarkEnd w:id="83"/>
-    <w:bookmarkStart w:id="84" w:name="_accb9f9d732da81043c804de081f8bf74e6cf24"/>
+    <w:bookmarkEnd w:id="84"/>
+    <w:bookmarkStart w:id="85" w:name="_accb9f9d732da81043c804de081f8bf74e6cf24"/>
     <w:p>
       <w:pPr>
         <w:pStyle w:val="Bibliography"/>
@@ -31155,8 +31454,8 @@
         <w:t xml:space="preserve">, (2026).</w:t>
       </w:r>
     </w:p>
-    <w:bookmarkEnd w:id="84"/>
-    <w:bookmarkStart w:id="85" w:name="_2a610b70f77ace96e6ffe48ed026a6e5f9efd5a"/>
+    <w:bookmarkEnd w:id="85"/>
+    <w:bookmarkStart w:id="86" w:name="_2a610b70f77ace96e6ffe48ed026a6e5f9efd5a"/>
     <w:p>
       <w:pPr>
         <w:pStyle w:val="Bibliography"/>
@@ -31183,8 +31482,8 @@
         <w:t xml:space="preserve">, (2021).</w:t>
       </w:r>
     </w:p>
-    <w:bookmarkEnd w:id="85"/>
-    <w:bookmarkStart w:id="86" w:name="_dffd97137af0abb4aae0ff556af3c0d05e0ee4a"/>
+    <w:bookmarkEnd w:id="86"/>
+    <w:bookmarkStart w:id="87" w:name="_dffd97137af0abb4aae0ff556af3c0d05e0ee4a"/>
     <w:p>
       <w:pPr>
         <w:pStyle w:val="Bibliography"/>
@@ -31211,8 +31510,8 @@
         <w:t xml:space="preserve">, (2026).</w:t>
       </w:r>
     </w:p>
-    <w:bookmarkEnd w:id="86"/>
-    <w:bookmarkStart w:id="88" w:name="_398d8a6b28c132ef0c87de1470cc655ebafd86c"/>
+    <w:bookmarkEnd w:id="87"/>
+    <w:bookmarkStart w:id="89" w:name="_398d8a6b28c132ef0c87de1470cc655ebafd86c"/>
     <w:p>
       <w:pPr>
         <w:pStyle w:val="Bibliography"/>
@@ -31238,7 +31537,7 @@
       <w:r>
         <w:t xml:space="preserve">-agents driven automated simulation testing and analysis of small uncrewed aerial systems, in: 2025 IEEE/ACM 47th International Conference on Software Engineering (ICSE), 2025: pp. 385–397. https://doi.org/</w:t>
       </w:r>
-      <w:hyperlink r:id="rId87">
+      <w:hyperlink r:id="rId88">
         <w:r>
           <w:rPr>
             <w:rStyle w:val="Hyperlink"/>
@@ -31250,8 +31549,8 @@
         <w:t xml:space="preserve">.</w:t>
       </w:r>
     </w:p>
-    <w:bookmarkEnd w:id="88"/>
-    <w:bookmarkStart w:id="90" w:name="_4d7bbda75dad34c83d023e6afa1cc5b99fb5426"/>
+    <w:bookmarkEnd w:id="89"/>
+    <w:bookmarkStart w:id="91" w:name="_4d7bbda75dad34c83d023e6afa1cc5b99fb5426"/>
     <w:p>
       <w:pPr>
         <w:pStyle w:val="Bibliography"/>
@@ -31286,7 +31585,7 @@
       <w:r>
         <w:t xml:space="preserve">, Forensic Science International: Digital Investigation 56 (2026) 302051. https://doi.org/</w:t>
       </w:r>
-      <w:hyperlink r:id="rId89">
+      <w:hyperlink r:id="rId90">
         <w:r>
           <w:rPr>
             <w:rStyle w:val="Hyperlink"/>
@@ -31298,8 +31597,8 @@
         <w:t xml:space="preserve">.</w:t>
       </w:r>
     </w:p>
-    <w:bookmarkEnd w:id="90"/>
-    <w:bookmarkStart w:id="91" w:name="_006a7190097400c6c37363d97b6f3be0cdc0b48"/>
+    <w:bookmarkEnd w:id="91"/>
+    <w:bookmarkStart w:id="92" w:name="_006a7190097400c6c37363d97b6f3be0cdc0b48"/>
     <w:p>
       <w:pPr>
         <w:pStyle w:val="Bibliography"/>
@@ -31317,8 +31616,8 @@
         <w:t xml:space="preserve">D.A. Wiegmann, S.A. Shappell, A human error approach to aviation accident analysis: The human factors analysis and classification system, Ashgate, Aldershot, 2003.</w:t>
       </w:r>
     </w:p>
-    <w:bookmarkEnd w:id="91"/>
-    <w:bookmarkStart w:id="93" w:name="_3541019a36f31423dbace231a12fca4d5e5f1ad"/>
+    <w:bookmarkEnd w:id="92"/>
+    <w:bookmarkStart w:id="94" w:name="_3541019a36f31423dbace231a12fca4d5e5f1ad"/>
     <w:p>
       <w:pPr>
         <w:pStyle w:val="Bibliography"/>
@@ -31335,7 +31634,7 @@
       <w:r>
         <w:t xml:space="preserve">S. Kaufman, S. Rosset, C. Perlich, O. Stitelman, Leakage in data mining: Formulation, detection, and avoidance, ACM Transactions on Knowledge Discovery from Data 6 (2012) 15:1–15:21. https://doi.org/</w:t>
       </w:r>
-      <w:hyperlink r:id="rId92">
+      <w:hyperlink r:id="rId93">
         <w:r>
           <w:rPr>
             <w:rStyle w:val="Hyperlink"/>
@@ -31347,8 +31646,8 @@
         <w:t xml:space="preserve">.</w:t>
       </w:r>
     </w:p>
-    <w:bookmarkEnd w:id="93"/>
-    <w:bookmarkStart w:id="95" w:name="_77239db318a405bdd9ca0cc5db74d4c41b2a03f"/>
+    <w:bookmarkEnd w:id="94"/>
+    <w:bookmarkStart w:id="96" w:name="_77239db318a405bdd9ca0cc5db74d4c41b2a03f"/>
     <w:p>
       <w:pPr>
         <w:pStyle w:val="Bibliography"/>
@@ -31365,7 +31664,7 @@
       <w:r>
         <w:t xml:space="preserve">S. Kapoor, A. Narayanan, Leakage and the reproducibility crisis in machine-learning-based science, Patterns 4 (2023) 100804. https://doi.org/</w:t>
       </w:r>
-      <w:hyperlink r:id="rId94">
+      <w:hyperlink r:id="rId95">
         <w:r>
           <w:rPr>
             <w:rStyle w:val="Hyperlink"/>
@@ -31377,8 +31676,8 @@
         <w:t xml:space="preserve">.</w:t>
       </w:r>
     </w:p>
-    <w:bookmarkEnd w:id="95"/>
-    <w:bookmarkStart w:id="97" w:name="_d75d7cf63098afa5d33e189bc1a163022e7ecdc"/>
+    <w:bookmarkEnd w:id="96"/>
+    <w:bookmarkStart w:id="98" w:name="_d75d7cf63098afa5d33e189bc1a163022e7ecdc"/>
     <w:p>
       <w:pPr>
         <w:pStyle w:val="Bibliography"/>
@@ -31416,7 +31715,7 @@
       <w:r>
         <w:t xml:space="preserve">fault and anomaly detection, The International Journal of Robotics Research 40 (2021) 515–520. https://doi.org/</w:t>
       </w:r>
-      <w:hyperlink r:id="rId96">
+      <w:hyperlink r:id="rId97">
         <w:r>
           <w:rPr>
             <w:rStyle w:val="Hyperlink"/>
@@ -31428,8 +31727,8 @@
         <w:t xml:space="preserve">.</w:t>
       </w:r>
     </w:p>
-    <w:bookmarkEnd w:id="97"/>
-    <w:bookmarkStart w:id="99" w:name="_446d2d8311e3f2ab8e5f2830e712f064a3280b9"/>
+    <w:bookmarkEnd w:id="98"/>
+    <w:bookmarkStart w:id="100" w:name="_446d2d8311e3f2ab8e5f2830e712f064a3280b9"/>
     <w:p>
       <w:pPr>
         <w:pStyle w:val="Bibliography"/>
@@ -31455,7 +31754,7 @@
       <w:r>
         <w:t xml:space="preserve">: A dataset for multicopter fault detection and health assessment, The International Journal of Robotics Research 44 (2025) 1081–1092. https://doi.org/</w:t>
       </w:r>
-      <w:hyperlink r:id="rId98">
+      <w:hyperlink r:id="rId99">
         <w:r>
           <w:rPr>
             <w:rStyle w:val="Hyperlink"/>
@@ -31467,8 +31766,8 @@
         <w:t xml:space="preserve">.</w:t>
       </w:r>
     </w:p>
-    <w:bookmarkEnd w:id="99"/>
-    <w:bookmarkStart w:id="100" w:name="_973650d78dc352a8b25ace59ab002a1d91cdfc9"/>
+    <w:bookmarkEnd w:id="100"/>
+    <w:bookmarkStart w:id="101" w:name="_973650d78dc352a8b25ace59ab002a1d91cdfc9"/>
     <w:p>
       <w:pPr>
         <w:pStyle w:val="Bibliography"/>
@@ -31504,8 +31803,8 @@
         <w:t xml:space="preserve">, (2026).</w:t>
       </w:r>
     </w:p>
-    <w:bookmarkEnd w:id="100"/>
-    <w:bookmarkStart w:id="102" w:name="_42246838952b0ed0d35bd475d264714b9e743f7"/>
+    <w:bookmarkEnd w:id="101"/>
+    <w:bookmarkStart w:id="103" w:name="_42246838952b0ed0d35bd475d264714b9e743f7"/>
     <w:p>
       <w:pPr>
         <w:pStyle w:val="Bibliography"/>
@@ -31522,7 +31821,7 @@
       <w:r>
         <w:t xml:space="preserve">G. Wild, J. Murray, G. Baxter, Exploring civil drone accidents and incidents to help prevent potential air disasters, Aerospace 3 (2016) 22. https://doi.org/</w:t>
       </w:r>
-      <w:hyperlink r:id="rId101">
+      <w:hyperlink r:id="rId102">
         <w:r>
           <w:rPr>
             <w:rStyle w:val="Hyperlink"/>
@@ -31534,8 +31833,8 @@
         <w:t xml:space="preserve">.</w:t>
       </w:r>
     </w:p>
-    <w:bookmarkEnd w:id="102"/>
-    <w:bookmarkStart w:id="103" w:name="_b513b568a9a02649a1ddc461a1dd01e876732a2"/>
+    <w:bookmarkEnd w:id="103"/>
+    <w:bookmarkStart w:id="104" w:name="_b513b568a9a02649a1ddc461a1dd01e876732a2"/>
     <w:p>
       <w:pPr>
         <w:pStyle w:val="Bibliography"/>
@@ -31562,8 +31861,8 @@
         <w:t xml:space="preserve">, AAIB, Department for Transport, Farnborough, UK, 2026.</w:t>
       </w:r>
     </w:p>
-    <w:bookmarkEnd w:id="103"/>
-    <w:bookmarkStart w:id="105" w:name="_7bef8dc44b5ed9bb7ced7ca5f392a78a76d6601"/>
+    <w:bookmarkEnd w:id="104"/>
+    <w:bookmarkStart w:id="106" w:name="_7bef8dc44b5ed9bb7ced7ca5f392a78a76d6601"/>
     <w:p>
       <w:pPr>
         <w:pStyle w:val="Bibliography"/>
@@ -31589,7 +31888,7 @@
       <w:r>
         <w:t xml:space="preserve">: A node-based multithreaded open source robotics framework for deeply embedded platforms, in: 2015 IEEE International Conference on Robotics and Automation (ICRA), 2015: pp. 6235–6240. https://doi.org/</w:t>
       </w:r>
-      <w:hyperlink r:id="rId104">
+      <w:hyperlink r:id="rId105">
         <w:r>
           <w:rPr>
             <w:rStyle w:val="Hyperlink"/>
@@ -31601,8 +31900,8 @@
         <w:t xml:space="preserve">.</w:t>
       </w:r>
     </w:p>
-    <w:bookmarkEnd w:id="105"/>
-    <w:bookmarkStart w:id="106" w:name="_d96f71c5379cbcad3bc75bfc7936eeacbaeb4ed"/>
+    <w:bookmarkEnd w:id="106"/>
+    <w:bookmarkStart w:id="107" w:name="_d96f71c5379cbcad3bc75bfc7936eeacbaeb4ed"/>
     <w:p>
       <w:pPr>
         <w:pStyle w:val="Bibliography"/>
@@ -31650,8 +31949,8 @@
         <w:t xml:space="preserve">parser, (2026).</w:t>
       </w:r>
     </w:p>
-    <w:bookmarkEnd w:id="106"/>
-    <w:bookmarkStart w:id="107" w:name="_c1fc4b225b7dfa71f64cc84e83afba5f24698c2"/>
+    <w:bookmarkEnd w:id="107"/>
+    <w:bookmarkStart w:id="108" w:name="_c1fc4b225b7dfa71f64cc84e83afba5f24698c2"/>
     <w:p>
       <w:pPr>
         <w:pStyle w:val="Bibliography"/>
@@ -31690,8 +31989,8 @@
         <w:t xml:space="preserve">telemetry anomaly mining, (2026).</w:t>
       </w:r>
     </w:p>
-    <w:bookmarkEnd w:id="107"/>
-    <w:bookmarkStart w:id="109" w:name="_3d31df3710cff81ff87ef6665f7295f981708a9"/>
+    <w:bookmarkEnd w:id="108"/>
+    <w:bookmarkStart w:id="110" w:name="_3d31df3710cff81ff87ef6665f7295f981708a9"/>
     <w:p>
       <w:pPr>
         <w:pStyle w:val="Bibliography"/>
@@ -31732,7 +32031,7 @@
       <w:r>
         <w:t xml:space="preserve">flight logs, Sensors 26 (2026) 3188. https://doi.org/</w:t>
       </w:r>
-      <w:hyperlink r:id="rId108">
+      <w:hyperlink r:id="rId109">
         <w:r>
           <w:rPr>
             <w:rStyle w:val="Hyperlink"/>
@@ -31744,8 +32043,8 @@
         <w:t xml:space="preserve">.</w:t>
       </w:r>
     </w:p>
-    <w:bookmarkEnd w:id="109"/>
-    <w:bookmarkStart w:id="111" w:name="_950e388298cdb3fb08e5b74428870c5b4c838aa"/>
+    <w:bookmarkEnd w:id="110"/>
+    <w:bookmarkStart w:id="112" w:name="_950e388298cdb3fb08e5b74428870c5b4c838aa"/>
     <w:p>
       <w:pPr>
         <w:pStyle w:val="Bibliography"/>
@@ -31762,7 +32061,7 @@
       <w:r>
         <w:t xml:space="preserve">D. Wang, S. Li, G. Xiao, Y. Liu, Y. Sui, P. He, M.R. Lyu, An exploratory investigation of log anomalies in unmanned aerial vehicles, in: Proceedings of the IEEE/ACM 46th International Conference on Software Engineering (ICSE), 2024: pp. 2593–2605. https://doi.org/</w:t>
       </w:r>
-      <w:hyperlink r:id="rId110">
+      <w:hyperlink r:id="rId111">
         <w:r>
           <w:rPr>
             <w:rStyle w:val="Hyperlink"/>
@@ -31774,8 +32073,8 @@
         <w:t xml:space="preserve">.</w:t>
       </w:r>
     </w:p>
-    <w:bookmarkEnd w:id="111"/>
-    <w:bookmarkStart w:id="113" w:name="_de2316363361acc29c6a15415cb3110e85473cd"/>
+    <w:bookmarkEnd w:id="112"/>
+    <w:bookmarkStart w:id="114" w:name="_de2316363361acc29c6a15415cb3110e85473cd"/>
     <w:p>
       <w:pPr>
         <w:pStyle w:val="Bibliography"/>
@@ -31804,7 +32103,7 @@
       <w:r>
         <w:t xml:space="preserve">fault detection methods, state-of-the-art, Drones 6 (2022) 330. https://doi.org/</w:t>
       </w:r>
-      <w:hyperlink r:id="rId112">
+      <w:hyperlink r:id="rId113">
         <w:r>
           <w:rPr>
             <w:rStyle w:val="Hyperlink"/>
@@ -31816,8 +32115,8 @@
         <w:t xml:space="preserve">.</w:t>
       </w:r>
     </w:p>
-    <w:bookmarkEnd w:id="113"/>
-    <w:bookmarkStart w:id="115" w:name="_1ece912d6a7cc2c7f97bdecc84d0912f3af390e"/>
+    <w:bookmarkEnd w:id="114"/>
+    <w:bookmarkStart w:id="116" w:name="_1ece912d6a7cc2c7f97bdecc84d0912f3af390e"/>
     <w:p>
       <w:pPr>
         <w:pStyle w:val="Bibliography"/>
@@ -31834,7 +32133,7 @@
       <w:r>
         <w:t xml:space="preserve">E. Khalastchi, M. Kalech, On fault detection and diagnosis in robotic systems, ACM Computing Surveys 51 (2018) 9:1–9:24. https://doi.org/</w:t>
       </w:r>
-      <w:hyperlink r:id="rId114">
+      <w:hyperlink r:id="rId115">
         <w:r>
           <w:rPr>
             <w:rStyle w:val="Hyperlink"/>
@@ -31846,8 +32145,8 @@
         <w:t xml:space="preserve">.</w:t>
       </w:r>
     </w:p>
-    <w:bookmarkEnd w:id="115"/>
-    <w:bookmarkStart w:id="117" w:name="_200a90d3af15f3f5a64a3cb8afd6783e6bc5c1d"/>
+    <w:bookmarkEnd w:id="116"/>
+    <w:bookmarkStart w:id="118" w:name="_200a90d3af15f3f5a64a3cb8afd6783e6bc5c1d"/>
     <w:p>
       <w:pPr>
         <w:pStyle w:val="Bibliography"/>
@@ -31864,7 +32163,7 @@
       <w:r>
         <w:t xml:space="preserve">E. Zibaei, R. Borth, Building causal models for finding actual causes of unmanned aerial vehicle failures, Frontiers in Robotics and AI 11 (2024) 1123762. https://doi.org/</w:t>
       </w:r>
-      <w:hyperlink r:id="rId116">
+      <w:hyperlink r:id="rId117">
         <w:r>
           <w:rPr>
             <w:rStyle w:val="Hyperlink"/>
@@ -31876,8 +32175,8 @@
         <w:t xml:space="preserve">.</w:t>
       </w:r>
     </w:p>
-    <w:bookmarkEnd w:id="117"/>
-    <w:bookmarkStart w:id="119" w:name="_362e51e11e30eb0e0461101d9c36e4d21d357be"/>
+    <w:bookmarkEnd w:id="118"/>
+    <w:bookmarkStart w:id="120" w:name="_362e51e11e30eb0e0461101d9c36e4d21d357be"/>
     <w:p>
       <w:pPr>
         <w:pStyle w:val="Bibliography"/>
@@ -31894,7 +32193,7 @@
       <w:r>
         <w:t xml:space="preserve">D. Wang, S. Li, G. Xiao, Y. Liu, Y. Sui, An exploratory study of autopilot software bugs in unmanned aerial vehicles, in: Proceedings of the 29th ACM Joint European Software Engineering Conference and Symposium on the Foundations of Software Engineering (ESEC/FSE), 2021: pp. 20–31. https://doi.org/</w:t>
       </w:r>
-      <w:hyperlink r:id="rId118">
+      <w:hyperlink r:id="rId119">
         <w:r>
           <w:rPr>
             <w:rStyle w:val="Hyperlink"/>
@@ -31906,8 +32205,8 @@
         <w:t xml:space="preserve">.</w:t>
       </w:r>
     </w:p>
-    <w:bookmarkEnd w:id="119"/>
-    <w:bookmarkStart w:id="121" w:name="_28fc3a5fe4ab4d700ff5d5013cf5016c3615a4e"/>
+    <w:bookmarkEnd w:id="120"/>
+    <w:bookmarkStart w:id="122" w:name="_28fc3a5fe4ab4d700ff5d5013cf5016c3615a4e"/>
     <w:p>
       <w:pPr>
         <w:pStyle w:val="Bibliography"/>
@@ -31936,7 +32235,7 @@
       <w:r>
         <w:t xml:space="preserve"> </w:t>
       </w:r>
-      <w:hyperlink r:id="rId120">
+      <w:hyperlink r:id="rId121">
         <w:r>
           <w:rPr>
             <w:rStyle w:val="Hyperlink"/>
@@ -31948,8 +32247,8 @@
         <w:t xml:space="preserve">.</w:t>
       </w:r>
     </w:p>
-    <w:bookmarkEnd w:id="121"/>
-    <w:bookmarkStart w:id="123" w:name="_d4ad44bf9b3d266a94b61d09f97230334249200"/>
+    <w:bookmarkEnd w:id="122"/>
+    <w:bookmarkStart w:id="124" w:name="_d4ad44bf9b3d266a94b61d09f97230334249200"/>
     <w:p>
       <w:pPr>
         <w:pStyle w:val="Bibliography"/>
@@ -31993,7 +32292,7 @@
       <w:r>
         <w:t xml:space="preserve">, Computers and Electrical Engineering 135 (2026) 111144. https://doi.org/</w:t>
       </w:r>
-      <w:hyperlink r:id="rId122">
+      <w:hyperlink r:id="rId123">
         <w:r>
           <w:rPr>
             <w:rStyle w:val="Hyperlink"/>
@@ -32005,8 +32304,8 @@
         <w:t xml:space="preserve">.</w:t>
       </w:r>
     </w:p>
-    <w:bookmarkEnd w:id="123"/>
-    <w:bookmarkStart w:id="125" w:name="_c31a8d3d1228c558f290994c7b0f9dadcd70167"/>
+    <w:bookmarkEnd w:id="124"/>
+    <w:bookmarkStart w:id="126" w:name="_c31a8d3d1228c558f290994c7b0f9dadcd70167"/>
     <w:p>
       <w:pPr>
         <w:pStyle w:val="Bibliography"/>
@@ -32035,7 +32334,7 @@
       <w:r>
         <w:t xml:space="preserve">safety through battery health monitoring and flight log-based crash diagnostics, IEEE Sensors Reviews (2025). https://doi.org/</w:t>
       </w:r>
-      <w:hyperlink r:id="rId124">
+      <w:hyperlink r:id="rId125">
         <w:r>
           <w:rPr>
             <w:rStyle w:val="Hyperlink"/>
@@ -32047,8 +32346,8 @@
         <w:t xml:space="preserve">.</w:t>
       </w:r>
     </w:p>
-    <w:bookmarkEnd w:id="125"/>
-    <w:bookmarkStart w:id="127" w:name="_db271caa090a7def1254596a62a362b0608337f"/>
+    <w:bookmarkEnd w:id="126"/>
+    <w:bookmarkStart w:id="128" w:name="_db271caa090a7def1254596a62a362b0608337f"/>
     <w:p>
       <w:pPr>
         <w:pStyle w:val="Bibliography"/>
@@ -32074,7 +32373,7 @@
       <w:r>
         <w:t xml:space="preserve">: Drone forensics in dataflash and telemetry logs, in: Advances in Information and Computer Security, Springer, 2019: pp. 377–390. https://doi.org/</w:t>
       </w:r>
-      <w:hyperlink r:id="rId126">
+      <w:hyperlink r:id="rId127">
         <w:r>
           <w:rPr>
             <w:rStyle w:val="Hyperlink"/>
@@ -32086,8 +32385,8 @@
         <w:t xml:space="preserve">.</w:t>
       </w:r>
     </w:p>
-    <w:bookmarkEnd w:id="127"/>
-    <w:bookmarkStart w:id="129" w:name="_4f9a794a6a4ddf2789379e73f8e74e34b9538b4"/>
+    <w:bookmarkEnd w:id="128"/>
+    <w:bookmarkStart w:id="130" w:name="_4f9a794a6a4ddf2789379e73f8e74e34b9538b4"/>
     <w:p>
       <w:pPr>
         <w:pStyle w:val="Bibliography"/>
@@ -32104,7 +32403,7 @@
       <w:r>
         <w:t xml:space="preserve">E. Petritoli, F. Leccese, L. Ciani, Reliability and maintenance analysis of unmanned aerial vehicles, Sensors 18 (2018) 3171. https://doi.org/</w:t>
       </w:r>
-      <w:hyperlink r:id="rId128">
+      <w:hyperlink r:id="rId129">
         <w:r>
           <w:rPr>
             <w:rStyle w:val="Hyperlink"/>
@@ -32116,8 +32415,8 @@
         <w:t xml:space="preserve">.</w:t>
       </w:r>
     </w:p>
-    <w:bookmarkEnd w:id="129"/>
-    <w:bookmarkStart w:id="130" w:name="_a0e369e89429aa426010697429f06415b068aab"/>
+    <w:bookmarkEnd w:id="130"/>
+    <w:bookmarkStart w:id="131" w:name="_a0e369e89429aa426010697429f06415b068aab"/>
     <w:p>
       <w:pPr>
         <w:pStyle w:val="Bibliography"/>
@@ -32147,8 +32446,8 @@
         <w:t xml:space="preserve">analysis of 221 mishaps over 10 years, Aviation, Space, and Environmental Medicine 77 (2006) 724–732.</w:t>
       </w:r>
     </w:p>
-    <w:bookmarkEnd w:id="130"/>
-    <w:bookmarkStart w:id="132" w:name="_b71485d7ca39b77d2f8c60f2e52a354c8c113b0"/>
+    <w:bookmarkEnd w:id="131"/>
+    <w:bookmarkStart w:id="133" w:name="_b71485d7ca39b77d2f8c60f2e52a354c8c113b0"/>
     <w:p>
       <w:pPr>
         <w:pStyle w:val="Bibliography"/>
@@ -32195,7 +32494,7 @@
       <w:r>
         <w:t xml:space="preserve">forensic intelligent agent for low-altitude public security, Expert Systems with Applications 327 (2026) 132859. https://doi.org/</w:t>
       </w:r>
-      <w:hyperlink r:id="rId131">
+      <w:hyperlink r:id="rId132">
         <w:r>
           <w:rPr>
             <w:rStyle w:val="Hyperlink"/>
@@ -32207,8 +32506,8 @@
         <w:t xml:space="preserve">.</w:t>
       </w:r>
     </w:p>
-    <w:bookmarkEnd w:id="132"/>
-    <w:bookmarkStart w:id="134" w:name="_06ffb55068ea9e0b3a7aa6e754cfcffab5f832f"/>
+    <w:bookmarkEnd w:id="133"/>
+    <w:bookmarkStart w:id="135" w:name="_06ffb55068ea9e0b3a7aa6e754cfcffab5f832f"/>
     <w:p>
       <w:pPr>
         <w:pStyle w:val="Bibliography"/>
@@ -32228,7 +32527,7 @@
       <w:r>
         <w:t xml:space="preserve"> </w:t>
       </w:r>
-      <w:hyperlink r:id="rId133">
+      <w:hyperlink r:id="rId134">
         <w:r>
           <w:rPr>
             <w:rStyle w:val="Hyperlink"/>
@@ -32240,8 +32539,8 @@
         <w:t xml:space="preserve">.</w:t>
       </w:r>
     </w:p>
-    <w:bookmarkEnd w:id="134"/>
-    <w:bookmarkStart w:id="136" w:name="_8a3cc11b1319c0fe6bf6179f8196eab503a64d0"/>
+    <w:bookmarkEnd w:id="135"/>
+    <w:bookmarkStart w:id="137" w:name="_8a3cc11b1319c0fe6bf6179f8196eab503a64d0"/>
     <w:p>
       <w:pPr>
         <w:pStyle w:val="Bibliography"/>
@@ -32267,7 +32566,7 @@
       <w:r>
         <w:t xml:space="preserve">-integrated applications with indirect prompt injection, in: Proceedings of the 16th ACM Workshop on Artificial Intelligence and Security (AISec), 2023: pp. 79–90. https://doi.org/</w:t>
       </w:r>
-      <w:hyperlink r:id="rId135">
+      <w:hyperlink r:id="rId136">
         <w:r>
           <w:rPr>
             <w:rStyle w:val="Hyperlink"/>
@@ -32279,8 +32578,8 @@
         <w:t xml:space="preserve">.</w:t>
       </w:r>
     </w:p>
-    <w:bookmarkEnd w:id="136"/>
-    <w:bookmarkStart w:id="138" w:name="_1347ffcfa7cf605bba5af95142b3cba7f0abdc4"/>
+    <w:bookmarkEnd w:id="137"/>
+    <w:bookmarkStart w:id="139" w:name="_1347ffcfa7cf605bba5af95142b3cba7f0abdc4"/>
     <w:p>
       <w:pPr>
         <w:pStyle w:val="Bibliography"/>
@@ -32297,7 +32596,7 @@
       <w:r>
         <w:t xml:space="preserve">J.P. Vieira, V.A. Bauler, R.K. Rosa, D. Silva, Towards a more realistic evaluation of machine learning models for bearing fault diagnosis, (2025). https://doi.org/</w:t>
       </w:r>
-      <w:hyperlink r:id="rId137">
+      <w:hyperlink r:id="rId138">
         <w:r>
           <w:rPr>
             <w:rStyle w:val="Hyperlink"/>
@@ -32309,8 +32608,8 @@
         <w:t xml:space="preserve">.</w:t>
       </w:r>
     </w:p>
-    <w:bookmarkEnd w:id="138"/>
-    <w:bookmarkStart w:id="140" w:name="_ab8841c06958c924804c38799fc8ccd94ea102a"/>
+    <w:bookmarkEnd w:id="139"/>
+    <w:bookmarkStart w:id="141" w:name="_ab8841c06958c924804c38799fc8ccd94ea102a"/>
     <w:p>
       <w:pPr>
         <w:pStyle w:val="Bibliography"/>
@@ -32327,7 +32626,7 @@
       <w:r>
         <w:t xml:space="preserve">B. Frénay, M. Verleysen, Classification in the presence of label noise: A survey, IEEE Transactions on Neural Networks and Learning Systems 25 (2014) 845–869. https://doi.org/</w:t>
       </w:r>
-      <w:hyperlink r:id="rId139">
+      <w:hyperlink r:id="rId140">
         <w:r>
           <w:rPr>
             <w:rStyle w:val="Hyperlink"/>
@@ -32339,8 +32638,8 @@
         <w:t xml:space="preserve">.</w:t>
       </w:r>
     </w:p>
-    <w:bookmarkEnd w:id="140"/>
-    <w:bookmarkStart w:id="142" w:name="_90b58fdc380e5ffe19ed416545c54d06f184b09"/>
+    <w:bookmarkEnd w:id="141"/>
+    <w:bookmarkStart w:id="143" w:name="_90b58fdc380e5ffe19ed416545c54d06f184b09"/>
     <w:p>
       <w:pPr>
         <w:pStyle w:val="Bibliography"/>
@@ -32357,7 +32656,7 @@
       <w:r>
         <w:t xml:space="preserve">E.A. Stuart, Matching methods for causal inference: A review and a look forward, Statistical Science 25 (2010) 1–21. https://doi.org/</w:t>
       </w:r>
-      <w:hyperlink r:id="rId141">
+      <w:hyperlink r:id="rId142">
         <w:r>
           <w:rPr>
             <w:rStyle w:val="Hyperlink"/>
@@ -32369,8 +32668,8 @@
         <w:t xml:space="preserve">.</w:t>
       </w:r>
     </w:p>
-    <w:bookmarkEnd w:id="142"/>
-    <w:bookmarkStart w:id="144" w:name="_f6e66cea9a1ea78573b548bc5cf8461c81300ca"/>
+    <w:bookmarkEnd w:id="143"/>
+    <w:bookmarkStart w:id="145" w:name="_f6e66cea9a1ea78573b548bc5cf8461c81300ca"/>
     <w:p>
       <w:pPr>
         <w:pStyle w:val="Bibliography"/>
@@ -32387,7 +32686,7 @@
       <w:r>
         <w:t xml:space="preserve">B.A. Nosek, C.R. Ebersole, A.C. DeHaven, D.T. Mellor, The preregistration revolution, Proceedings of the National Academy of Sciences 115 (2018) 2600–2606. https://doi.org/</w:t>
       </w:r>
-      <w:hyperlink r:id="rId143">
+      <w:hyperlink r:id="rId144">
         <w:r>
           <w:rPr>
             <w:rStyle w:val="Hyperlink"/>
@@ -32399,8 +32698,8 @@
         <w:t xml:space="preserve">.</w:t>
       </w:r>
     </w:p>
-    <w:bookmarkEnd w:id="144"/>
-    <w:bookmarkStart w:id="146" w:name="_ad8397d41f792404ea3ffa2c2145e851561e0cf"/>
+    <w:bookmarkEnd w:id="145"/>
+    <w:bookmarkStart w:id="147" w:name="_ad8397d41f792404ea3ffa2c2145e851561e0cf"/>
     <w:p>
       <w:pPr>
         <w:pStyle w:val="Bibliography"/>
@@ -32423,7 +32722,7 @@
       <w:r>
         <w:t xml:space="preserve">) curve, Radiology 143 (1982) 29–36. https://doi.org/</w:t>
       </w:r>
-      <w:hyperlink r:id="rId145">
+      <w:hyperlink r:id="rId146">
         <w:r>
           <w:rPr>
             <w:rStyle w:val="Hyperlink"/>
@@ -32435,8 +32734,8 @@
         <w:t xml:space="preserve">.</w:t>
       </w:r>
     </w:p>
-    <w:bookmarkEnd w:id="146"/>
-    <w:bookmarkStart w:id="148" w:name="_7ae2e06bcfe80442633569f5f6b1e21460598cb"/>
+    <w:bookmarkEnd w:id="147"/>
+    <w:bookmarkStart w:id="149" w:name="_7ae2e06bcfe80442633569f5f6b1e21460598cb"/>
     <w:p>
       <w:pPr>
         <w:pStyle w:val="Bibliography"/>
@@ -32453,7 +32752,7 @@
       <w:r>
         <w:t xml:space="preserve">H.B. Mann, D.R. Whitney, On a test of whether one of two random variables is stochastically larger than the other, The Annals of Mathematical Statistics 18 (1947) 50–60. https://doi.org/</w:t>
       </w:r>
-      <w:hyperlink r:id="rId147">
+      <w:hyperlink r:id="rId148">
         <w:r>
           <w:rPr>
             <w:rStyle w:val="Hyperlink"/>
@@ -32465,8 +32764,8 @@
         <w:t xml:space="preserve">.</w:t>
       </w:r>
     </w:p>
-    <w:bookmarkEnd w:id="148"/>
-    <w:bookmarkStart w:id="149" w:name="_d0a9d29bfb3d63b968b17ba95db409a8b61dfda"/>
+    <w:bookmarkEnd w:id="149"/>
+    <w:bookmarkStart w:id="150" w:name="_d0a9d29bfb3d63b968b17ba95db409a8b61dfda"/>
     <w:p>
       <w:pPr>
         <w:pStyle w:val="Bibliography"/>
@@ -32484,8 +32783,8 @@
         <w:t xml:space="preserve">B. Efron, R.J. Tibshirani, An introduction to the bootstrap, Chapman &amp; Hall, New York, 1993.</w:t>
       </w:r>
     </w:p>
-    <w:bookmarkEnd w:id="149"/>
-    <w:bookmarkStart w:id="151" w:name="_89a013c1487ff07275d04a7e5b79d7551b6a9f6"/>
+    <w:bookmarkEnd w:id="150"/>
+    <w:bookmarkStart w:id="152" w:name="_89a013c1487ff07275d04a7e5b79d7551b6a9f6"/>
     <w:p>
       <w:pPr>
         <w:pStyle w:val="Bibliography"/>
@@ -32505,7 +32804,7 @@
       <w:r>
         <w:t xml:space="preserve"> </w:t>
       </w:r>
-      <w:hyperlink r:id="rId150">
+      <w:hyperlink r:id="rId151">
         <w:r>
           <w:rPr>
             <w:rStyle w:val="Hyperlink"/>
@@ -32517,8 +32816,8 @@
         <w:t xml:space="preserve">.</w:t>
       </w:r>
     </w:p>
-    <w:bookmarkEnd w:id="151"/>
     <w:bookmarkEnd w:id="152"/>
+    <w:bookmarkEnd w:id="153"/>
     <w:sectPr>
       <w:footnotePr>
         <w:numRestart w:val="eachSect"/>

</xml_diff>

<commit_message>
Paper: Report two-reviewer crash-moment check; drop 'about half' claim
A second, blind author review shows the computed crash moment is mostly
right when tilt-defined and mostly wrong otherwise (agreement 85%, kappa
0.70), but whether no-tilt logs contain a crash is disputed (kappa 0.32;
archive share 50% vs 86% by reviewer). The paper now claims only that 61%
of crash-rated multicopter logs lack a crash-like tilt and that pilot-rated
logs show one less often. Abstract, contribution (ii), Results, threats,
conclusion, highlights, cover letter and revision table updated; PDF, Word,
Overleaf zip, HANDOFF and critical_review rebuilt.

Co-Authored-By: Claude Opus 5.5 <noreply@anthropic.com>
</commit_message>
<xml_diff>
--- a/docs/paper/submission/manuscript.docx
+++ b/docs/paper/submission/manuscript.docx
@@ -162,7 +162,7 @@
         </m:sSup>
       </m:oMath>
       <w:r>
-        <w:t xml:space="preserve">Archive labels are weaker than assumed: only about half of crash-rated multicopter logs contain the crash (50%, 95% CI 39–61%), pilot-rated logs less often than aircraft-rated ones (23% against 45% with a crash-like tilt), and by GPS time 44–55% of dated crash-day</w:t>
+        <w:t xml:space="preserve">Archive labels are weaker than assumed: 61% of crash-rated multicopter logs show no crash-like tilt, and there two reviewers found the computed crash moment mostly wrong; pilot-rated logs show such a tilt less often than aircraft-rated ones (23% against 45%); and by GPS time 44–55% of dated crash-day</w:t>
       </w:r>
       <w:r>
         <w:t xml:space="preserve"> </w:t>
@@ -855,7 +855,7 @@
         </m:sSup>
       </m:oMath>
       <w:r>
-        <w:t xml:space="preserve">A data-integrity hazard in public log archives: only about half of crash-rated multicopter logs contain the crash (50% [39%, 61%]), pilot-rated logs less often than aircraft-rated ones, so the label can leak into any classifier; date-only ordering cannot order same-day flights, and by GPS time 44–55% of dated crash-day</w:t>
+        <w:t xml:space="preserve">A data-integrity hazard in public log archives: 61% of crash-rated multicopter logs show no crash-like tilt, so the standard crash moment is unreliable for most of the archive, and pilot-rated logs show such a tilt less often than aircraft-rated ones (23% against 45%), so the label can leak into any classifier; date-only ordering cannot order same-day flights, and by GPS time 44–55% of dated crash-day</w:t>
       </w:r>
       <w:r>
         <w:t xml:space="preserve"> </w:t>
@@ -16356,7 +16356,7 @@
         </m:sSup>
       </m:oMath>
       <w:r>
-        <w:t xml:space="preserve">One author then judged, by eye, the traces of 50 randomly drawn crash logs (tilt and altitude around</w:t>
+        <w:t xml:space="preserve">Two authors then judged, by eye, the traces of 50 randomly drawn crash logs (tilt and altitude around</w:t>
       </w:r>
       <w:r>
         <w:t xml:space="preserve"> </w:t>
@@ -16376,7 +16376,7 @@
         </m:sSub>
       </m:oMath>
       <w:r>
-        <w:t xml:space="preserve">; declared check</w:t>
+        <w:t xml:space="preserve">). The first labelled a sheet that showed the automatic verdict (declared check</w:t>
       </w:r>
       <w:r>
         <w:t xml:space="preserve"> </w:t>
@@ -16388,7 +16388,79 @@
         <w:t xml:space="preserve">97974ad</w:t>
       </w:r>
       <w:r>
-        <w:t xml:space="preserve">, one reviewer, not blind to the automatic label). Of 26 tilt-defined crash moments, 21 were judged correct (11 of the 12 confirmed and 10 of the 14 unconfirmed; the others were mostly too early); of 24 fallback crash moments, 18 showed no crash at all in the log, 2 were correct, 2 too late and 2 unclear. The confirmed rule is therefore precise (11 of 12; exact 95% CI 62–100%) but misses about half the real crashes (11 of 23), and most crash-rated logs without a tilt event do not contain the crash: the rating describes the flight session, not the log.</w:t>
+        <w:t xml:space="preserve">); the second labelled the same logs on a blind sheet, in a new order without identifiers or verdicts (</w:t>
+      </w:r>
+      <w:r>
+        <w:rPr>
+          <w:rStyle w:val="VerbatimChar"/>
+        </w:rPr>
+        <w:t xml:space="preserve">59c8212</w:t>
+      </w:r>
+      <w:r>
+        <w:t xml:space="preserve">). They agreed on whether the computed crash moment was right in 40 of 47 decidable logs (85%, Cohen’s</w:t>
+      </w:r>
+      <w:r>
+        <w:t xml:space="preserve"> </w:t>
+      </w:r>
+      <m:oMath>
+        <m:r>
+          <m:t>κ</m:t>
+        </m:r>
+        <m:r>
+          <m:rPr>
+            <m:sty m:val="p"/>
+          </m:rPr>
+          <m:t>=</m:t>
+        </m:r>
+        <m:r>
+          <m:t>0.70</m:t>
+        </m:r>
+      </m:oMath>
+      <w:r>
+        <w:t xml:space="preserve">). Of the 26 tilt-defined crash moments, the reviewers judged 21 and 24 correct, including 11 and 12 of the 12 confirmed ones; of the 24 fallback crash moments, only 2 and 6. The confirmed rule is therefore precise but misses many real crashes, and the fallback crash moment is usually wrong. Whether fallback logs contain the crash elsewhere was disputed (</w:t>
+      </w:r>
+      <m:oMath>
+        <m:r>
+          <m:t>κ</m:t>
+        </m:r>
+        <m:r>
+          <m:rPr>
+            <m:sty m:val="p"/>
+          </m:rPr>
+          <m:t>=</m:t>
+        </m:r>
+        <m:r>
+          <m:t>0.32</m:t>
+        </m:r>
+      </m:oMath>
+      <w:r>
+        <w:t xml:space="preserve">): the first reviewer saw no crash in 18 of 24, while the blind reviewer saw a crash before the computed moment in most of them, a crash that never crossed</w:t>
+      </w:r>
+      <w:r>
+        <w:t xml:space="preserve"> </w:t>
+      </w:r>
+      <m:oMath>
+        <m:sSup>
+          <m:e>
+            <m:r>
+              <m:t>60</m:t>
+            </m:r>
+          </m:e>
+          <m:sup>
+            <m:r>
+              <m:rPr>
+                <m:sty m:val="p"/>
+              </m:rPr>
+              <m:t>∘</m:t>
+            </m:r>
+          </m:sup>
+        </m:sSup>
+      </m:oMath>
+      <w:r>
+        <w:t xml:space="preserve"> </w:t>
+      </w:r>
+      <w:r>
+        <w:t xml:space="preserve">tilt.</w:t>
       </w:r>
     </w:p>
     <w:p>
@@ -16488,7 +16560,7 @@
         <w:t xml:space="preserve"> </w:t>
       </w:r>
       <w:r>
-        <w:t xml:space="preserve">(91 confirmed) and 209 do not. Combining these shares with the author’s reading of 50 traces, in which every tilt-defined log and 4 of 22 decidable logs without a tilt event contained the crash, about half of the archive’s crash-rated multicopter logs contain the crash (50%, 95% bootstrap CI 39–61%; this assumes the review rates carry over). The share differs by label: 110 of 247 aircraft-rated logs (45%) but 22 of 94 pilot-rated logs (23%) show a tilt event (two-sided Fisher exact</w:t>
+        <w:t xml:space="preserve">(91 confirmed) and 209 do not. So in 61% of the archive’s crash-rated multicopter logs the standard tilt rule finds no crash, and the computed crash moment there is usually wrong. How many of those logs contain the crash at all depends on the reviewer: combining the archive shares with each reviewer’s labels gives 50% [40–62%] of crash-rated multicopter logs containing the crash for the first reviewer and 86% [75–97%] for the blind reviewer (66% [47–86%] on the logs where they agree), so we do not claim a single figure. The share differs by label: 110 of 247 aircraft-rated logs (45%) but 22 of 94 pilot-rated logs (23%) show a tilt event (two-sided Fisher exact</w:t>
       </w:r>
       <w:r>
         <w:t xml:space="preserve"> </w:t>
@@ -26347,7 +26419,7 @@
               <w:rPr>
                 <w:sz w:val="19"/>
               </w:rPr>
-              <w:t xml:space="preserve">39% of 341 readable multicopter logs show a tilt event; about 50% [39, 61] contain the crash; pilot-rated 23% vs aircraft-rated 45% (</w:t>
+              <w:t xml:space="preserve">39% of 341 readable multicopter logs show a tilt event; share containing the crash 50–86% depending on reviewer; pilot-rated 23% vs aircraft-rated 45% (</w:t>
             </w:r>
             <m:oMath>
               <m:r>
@@ -26502,30 +26574,18 @@
               <w:rPr>
                 <w:sz w:val="19"/>
               </w:rPr>
-              <w:t xml:space="preserve">by eye (one author)</w:t>
-            </w:r>
-          </w:p>
-        </w:tc>
-        <w:tc>
-          <w:tcPr/>
-          <w:p>
-            <w:pPr>
-              <w:pStyle w:val="Compact"/>
-              <w:spacing w:line="240" w:lineRule="auto"/>
-              <w:jc w:val="left"/>
-            </w:pPr>
-            <w:r>
-              <w:rPr>
-                <w:sz w:val="19"/>
-              </w:rPr>
-              <w:t xml:space="preserve">Tilt-defined</w:t>
-            </w:r>
-            <w:r>
-              <w:rPr>
-                <w:sz w:val="19"/>
-              </w:rPr>
-              <w:t xml:space="preserve"> </w:t>
-            </w:r>
+              <w:t xml:space="preserve">by eye (two authors, second blind)</w:t>
+            </w:r>
+          </w:p>
+        </w:tc>
+        <w:tc>
+          <w:tcPr/>
+          <w:p>
+            <w:pPr>
+              <w:pStyle w:val="Compact"/>
+              <w:spacing w:line="240" w:lineRule="auto"/>
+              <w:jc w:val="left"/>
+            </w:pPr>
             <m:oMath>
               <m:sSub>
                 <m:e>
@@ -26550,8 +26610,54 @@
               <w:rPr>
                 <w:sz w:val="19"/>
               </w:rPr>
-              <w:t xml:space="preserve">correct in 21 of 26; 18 of 24 fallback logs contain no crash</w:t>
-            </w:r>
+              <w:t xml:space="preserve">right: agreement 85%,</w:t>
+            </w:r>
+            <w:r>
+              <w:rPr>
+                <w:sz w:val="19"/>
+              </w:rPr>
+              <w:t xml:space="preserve"> </w:t>
+            </w:r>
+            <m:oMath>
+              <m:r>
+                <m:t>κ</m:t>
+              </m:r>
+              <m:r>
+                <m:rPr>
+                  <m:sty m:val="p"/>
+                </m:rPr>
+                <m:t>=</m:t>
+              </m:r>
+              <m:r>
+                <m:t>0.70</m:t>
+              </m:r>
+            </m:oMath>
+            <w:r>
+              <w:rPr>
+                <w:sz w:val="19"/>
+              </w:rPr>
+              <w:t xml:space="preserve">; tilt-defined correct 21 and 24 of 26, fallback 2 and 6 of 24; whether fallback logs contain the crash</w:t>
+            </w:r>
+            <w:r>
+              <w:rPr>
+                <w:sz w:val="19"/>
+              </w:rPr>
+              <w:t xml:space="preserve"> </w:t>
+            </w:r>
+            <m:oMath>
+              <m:r>
+                <m:t>κ</m:t>
+              </m:r>
+              <m:r>
+                <m:rPr>
+                  <m:sty m:val="p"/>
+                </m:rPr>
+                <m:t>=</m:t>
+              </m:r>
+              <m:r>
+                <m:t>0.32</m:t>
+              </m:r>
+            </m:oMath>
           </w:p>
         </w:tc>
         <w:tc>
@@ -26586,23 +26692,23 @@
                 <w:rStyle w:val="VerbatimChar"/>
                 <w:sz w:val="19"/>
               </w:rPr>
-              <w:t xml:space="preserve">bfda684</w:t>
-            </w:r>
-          </w:p>
-        </w:tc>
-        <w:tc>
-          <w:tcPr/>
-          <w:p>
-            <w:pPr>
-              <w:pStyle w:val="Compact"/>
-              <w:spacing w:line="240" w:lineRule="auto"/>
-              <w:jc w:val="left"/>
-            </w:pPr>
-            <w:r>
-              <w:rPr>
-                <w:sz w:val="19"/>
-              </w:rPr>
-              <w:t xml:space="preserve">2026-10-27</w:t>
+              <w:t xml:space="preserve">59c8212</w:t>
+            </w:r>
+          </w:p>
+        </w:tc>
+        <w:tc>
+          <w:tcPr/>
+          <w:p>
+            <w:pPr>
+              <w:pStyle w:val="Compact"/>
+              <w:spacing w:line="240" w:lineRule="auto"/>
+              <w:jc w:val="left"/>
+            </w:pPr>
+            <w:r>
+              <w:rPr>
+                <w:sz w:val="19"/>
+              </w:rPr>
+              <w:t xml:space="preserve">2026-10-28</w:t>
             </w:r>
           </w:p>
         </w:tc>
@@ -30659,7 +30765,7 @@
         <w:t xml:space="preserve"> </w:t>
       </w:r>
       <w:r>
-        <w:t xml:space="preserve">Archive-wide, only about half of crash-rated multicopter logs contain the crash (Section 5.3). An uploader’s crash rating does not show that the aircraft was lost, but the archive cannot show that it survived either. Of 490 crash-rated logs from real hardware with a vehicle identifier, 264 (54%) have a later-dated log from the same flight-controller serial (median 4.5 days later; 83 within one day); among the 40 crashed airframes of the between-drone test the share is 78% (median one day). Because a flight controller can be moved to a new frame, this shows that the controller was flown again, not that the aircraft survived; the same-day flights after the crash found by GPS time are consistent with minor incidents but do not prove them. The crash moment is also uncertain: in only 72 of the 148 modelled crash logs does tilt exceed</w:t>
+        <w:t xml:space="preserve">Archive-wide, 61% of crash-rated multicopter logs show no crash-like tilt, and reviewers disagreed on how many of those contain the crash at all (Section 5.3). An uploader’s crash rating does not show that the aircraft was lost, but the archive cannot show that it survived either. Of 490 crash-rated logs from real hardware with a vehicle identifier, 264 (54%) have a later-dated log from the same flight-controller serial (median 4.5 days later; 83 within one day); among the 40 crashed airframes of the between-drone test the share is 78% (median one day). Because a flight controller can be moved to a new frame, this shows that the controller was flown again, not that the aircraft survived; the same-day flights after the crash found by GPS time are consistent with minor incidents but do not prove them. The crash moment is also uncertain: in only 72 of the 148 modelled crash logs does tilt exceed</w:t>
       </w:r>
       <w:r>
         <w:t xml:space="preserve"> </w:t>
@@ -30728,7 +30834,44 @@
         <w:t xml:space="preserve"> </w:t>
       </w:r>
       <w:r>
-        <w:t xml:space="preserve">followed within 10 s by disarming or a landed or ground-contact flag, and 32 do not (second robustness audit). One author’s reading of 50 traces found the tilt-defined crash moment correct in 21 of 26 logs, while 18 of 24 logs without a tilt event showed no crash at all (Section 5.3); a second, blind reviewer has not yet checked them.</w:t>
+        <w:t xml:space="preserve">followed within 10 s by disarming or a landed or ground-contact flag, and 32 do not (second robustness audit). Two reviewers, one blind, agreed that the tilt-defined crash moment is mostly right (21 and 24 of 26) and the fallback moment mostly wrong (2 and 6 of 24;</w:t>
+      </w:r>
+      <w:r>
+        <w:t xml:space="preserve"> </w:t>
+      </w:r>
+      <m:oMath>
+        <m:r>
+          <m:t>κ</m:t>
+        </m:r>
+        <m:r>
+          <m:rPr>
+            <m:sty m:val="p"/>
+          </m:rPr>
+          <m:t>=</m:t>
+        </m:r>
+        <m:r>
+          <m:t>0.70</m:t>
+        </m:r>
+      </m:oMath>
+      <w:r>
+        <w:t xml:space="preserve">), but disagreed on whether fallback logs contain the crash at all (</w:t>
+      </w:r>
+      <m:oMath>
+        <m:r>
+          <m:t>κ</m:t>
+        </m:r>
+        <m:r>
+          <m:rPr>
+            <m:sty m:val="p"/>
+          </m:rPr>
+          <m:t>=</m:t>
+        </m:r>
+        <m:r>
+          <m:t>0.32</m:t>
+        </m:r>
+      </m:oMath>
+      <w:r>
+        <w:t xml:space="preserve">; Section 5.3).</w:t>
       </w:r>
     </w:p>
     <w:p>
@@ -31198,7 +31341,7 @@
         <w:pStyle w:val="BodyText"/>
       </w:pPr>
       <w:r>
-        <w:t xml:space="preserve">Much of what looks like crash anticipation comes from how an evaluation is built. In a factorial audit of 32 settings, the apparent AUC of 0.88 fell by 0.21 across settings, of which 0.06 came from grouping folds by vehicle, the only factor that could be isolated; and crash-window leakage was small overall but larger among the minority of crashes with a confirmed crash moment. The archive’s labels are also weaker than assumed: only about half of crash-rated multicopter logs contain the crash, and pilot-rated logs less often than aircraft-rated ones. Ordering flights by archive date failed for same-day flights: by GPS time, 44–55% of dated crash-day</w:t>
+        <w:t xml:space="preserve">Much of what looks like crash anticipation comes from how an evaluation is built. In a factorial audit of 32 settings, the apparent AUC of 0.88 fell by 0.21 across settings, of which 0.06 came from grouping folds by vehicle, the only factor that could be isolated; and crash-window leakage was small overall but larger among the minority of crashes with a confirmed crash moment. The archive’s labels are also weaker than assumed: most crash-rated multicopter logs show no crash-like tilt, where the computed crash moment is usually wrong, and pilot-rated logs show one less often than aircraft-rated ones. Ordering flights by archive date failed for same-day flights: by GPS time, 44–55% of dated crash-day</w:t>
       </w:r>
       <w:r>
         <w:t xml:space="preserve"> </w:t>

</xml_diff>

<commit_message>
Paper: Address Round 19
Crash-moment results restricted to multicopters (fixed-wing/VTOL tilt is
not a crash criterion; section 4.2 now states what the code does, defines
VTOL). New table of window effect by crash subset with n and intervals;
headline 0.089 [0.019, 0.168] on tilt-defined multicopters, 0.131 without
tilt/stick; post hoc status stated. Label link reworded with physical
alternative, tilt-alone AUC 0.53, within-stratum attribution. Rule proxy
described with intervals; multi-cue detector failure reported. Figure 1
label, reference URLs, HANDOFF and thirtieth review pass.

Co-Authored-By: Claude Opus 5.5 <noreply@anthropic.com>
</commit_message>
<xml_diff>
--- a/docs/paper/submission/manuscript.docx
+++ b/docs/paper/submission/manuscript.docx
@@ -136,7 +136,7 @@
         </m:sSup>
       </m:oMath>
       <w:r>
-        <w:t xml:space="preserve">Across 32 evaluation settings, apparent crash-detection AUC fell by 0.21 [0.06, 0.34], 0.06 of it from grouping folds by vehicle; crash-window leakage was small overall but material among crashes with a crash-like tilt (0.067 [0.015, 0.131]).</w:t>
+        <w:t xml:space="preserve">Across 32 evaluation settings, apparent crash-detection AUC fell by 0.21 [0.06, 0.34], 0.06 of it from grouping folds by vehicle; crash-window leakage was small overall but material among multicopter crashes with a crash-like tilt (0.089 [0.019, 0.168]; 37 crashes, post hoc), even without tilt features.</w:t>
       </w:r>
       <w:r>
         <w:t xml:space="preserve"> </w:t>
@@ -676,7 +676,7 @@
         <w:t xml:space="preserve"> </w:t>
       </w:r>
       <w:r>
-        <w:t xml:space="preserve">Both were tested. Crash-window leakage was small for model accuracy overall (0.014 of AUC in the factorial audit), possibly in part because most crash logs have no clear crash moment; on the tilt-defined crashes it was material (0.067 [0.015, 0.131]), although the declared leak criterion was still not met; grouping cross-validation folds by vehicle mattered more, and comparing each drone with its own earlier flights mattered most. A further threat to validity, which we had not planned to test, lies in the archive’s own records: most crash-rated logs show no crash-like event, the uploader’s label is associated with whether one is present, and dates cannot order flights within a day. These defects can bias results in either direction, and date ordering matters only to longitudinal designs. We decompose</w:t>
+        <w:t xml:space="preserve">Both were tested. Crash-window leakage was small for model accuracy overall (0.014 of AUC in the factorial audit), possibly in part because most crash logs have no clear crash moment; on multicopter crashes with a crash-like tilt it was material (0.089 [0.019, 0.168]) and did not depend on the tilt features themselves; grouping cross-validation folds by vehicle mattered more, and comparing each drone with its own earlier flights mattered most. A further threat to validity, which we had not planned to test, lies in the archive’s own records: most crash-rated logs show no crash-like event, the uploader’s label is associated with whether one is present, and dates cannot order flights within a day. These defects can bias results in either direction, and date ordering matters only to longitudinal designs. We decompose</w:t>
       </w:r>
       <w:r>
         <w:t xml:space="preserve"> </w:t>
@@ -925,7 +925,7 @@
         <w:t xml:space="preserve"> </w:t>
       </w:r>
       <w:r>
-        <w:t xml:space="preserve">Pilot-rated logs show a crash-like tilt half as often as aircraft-rated ones (23% against 45%; odds ratio 2.1 [1.2, 3.7] adjusted for era and vehicle type), so a classifier could separate the labels without learning anything about cause; in our modelled sample tilt alone would reach only AUC 0.55, and our classifiers stayed at chance (Section 5.4).</w:t>
+        <w:t xml:space="preserve">Pilot-rated logs show a crash-like tilt half as often as aircraft-rated ones (23% against 45%; odds ratio 2.1 [1.2, 3.7] adjusted for era and vehicle type), so the label partly encodes whether the log shows a tilt-type crash and a classifier could separate the labels without learning anything about cause; in our modelled multicopters tilt alone reaches only AUC 0.53, and attribution stayed near chance within each tilt stratum (Section 5.4).</w:t>
       </w:r>
       <w:r>
         <w:t xml:space="preserve"> </w:t>
@@ -6577,7 +6577,7 @@
       <w:pPr>
         <w:pStyle w:val="Heading2"/>
       </w:pPr>
-      <w:bookmarkStart w:id="26" w:name="_3e02a71fb6433a5b51224604e9029e12073209c"/>
+      <w:bookmarkStart w:id="26" w:name="_4cd53af4af85f34dcaa9d1af8ead8b07baec195"/>
       <w:r>
         <w:rPr>
           <w:rStyle w:val="SectionNumber"/>
@@ -6597,7 +6597,7 @@
         <w:pStyle w:val="FirstParagraph"/>
       </w:pPr>
       <w:r>
-        <w:t xml:space="preserve">For rotary-wing aircraft the crash moment</w:t>
+        <w:t xml:space="preserve">The crash moment</w:t>
       </w:r>
       <w:r>
         <w:t xml:space="preserve"> </w:t>
@@ -6740,13 +6740,75 @@
         </m:sSup>
       </m:oMath>
       <w:r>
-        <w:t xml:space="preserve">; for fixed-wing</w:t>
-      </w:r>
-      <w:r>
-        <w:t xml:space="preserve"> </w:t>
-      </w:r>
-      <w:r>
-        <w:t xml:space="preserve">aircraft, and when no such tilt occurs, it is the end of the armed period. Normal flights use the end of the armed</w:t>
+        <w:t xml:space="preserve">; when no such</w:t>
+      </w:r>
+      <w:r>
+        <w:t xml:space="preserve"> </w:t>
+      </w:r>
+      <w:r>
+        <w:t xml:space="preserve">tilt occurs, it is the end of the armed period. The tilt rule is skipped only when the log’s vehicle-status record</w:t>
+      </w:r>
+      <w:r>
+        <w:t xml:space="preserve"> </w:t>
+      </w:r>
+      <w:r>
+        <w:t xml:space="preserve">marks the aircraft as not rotary-wing. Older logs lack that flag and are treated as rotary-wing, so the rule was also</w:t>
+      </w:r>
+      <w:r>
+        <w:t xml:space="preserve"> </w:t>
+      </w:r>
+      <w:r>
+        <w:t xml:space="preserve">applied to some fixed-wing and VTOL logs, where a bank above</w:t>
+      </w:r>
+      <w:r>
+        <w:t xml:space="preserve"> </w:t>
+      </w:r>
+      <m:oMath>
+        <m:sSup>
+          <m:e>
+            <m:r>
+              <m:t>60</m:t>
+            </m:r>
+          </m:e>
+          <m:sup>
+            <m:r>
+              <m:rPr>
+                <m:sty m:val="p"/>
+              </m:rPr>
+              <m:t>∘</m:t>
+            </m:r>
+          </m:sup>
+        </m:sSup>
+      </m:oMath>
+      <w:r>
+        <w:t xml:space="preserve"> </w:t>
+      </w:r>
+      <w:r>
+        <w:t xml:space="preserve">can be normal flight. Aircraft type is taken</w:t>
+      </w:r>
+      <w:r>
+        <w:t xml:space="preserve"> </w:t>
+      </w:r>
+      <w:r>
+        <w:t xml:space="preserve">from the archive index: multicopter means quadrotor, hexarotor or octorotor; fixed-wing means fixed wing; VTOL means</w:t>
+      </w:r>
+      <w:r>
+        <w:t xml:space="preserve"> </w:t>
+      </w:r>
+      <w:r>
+        <w:t xml:space="preserve">any index type marked as vertical take-off and landing (tailsitters, tiltrotors and fixed-wing aircraft with lift</w:t>
+      </w:r>
+      <w:r>
+        <w:t xml:space="preserve"> </w:t>
+      </w:r>
+      <w:r>
+        <w:t xml:space="preserve">rotors), which hover like multicopters but fly forward on a wing. Crash-moment analyses are therefore</w:t>
+      </w:r>
+      <w:r>
+        <w:t xml:space="preserve"> </w:t>
+      </w:r>
+      <w:r>
+        <w:t xml:space="preserve">reported for multicopters (Section 5.4). Normal flights use the end of the armed</w:t>
       </w:r>
       <w:r>
         <w:t xml:space="preserve"> </w:t>
@@ -9771,39 +9833,59 @@
               <w:rPr>
                 <w:sz w:val="19"/>
               </w:rPr>
-              <w:t xml:space="preserve">AUC drop 0.035 when the last 10 s are cut (criterion 0.10); window effect 0.067 [0.015, 0.131] on tilt-defined crashes</w:t>
-            </w:r>
-          </w:p>
-        </w:tc>
-        <w:tc>
-          <w:tcPr/>
-          <w:p>
-            <w:pPr>
-              <w:pStyle w:val="Compact"/>
-              <w:spacing w:line="240" w:lineRule="auto"/>
-              <w:jc w:val="left"/>
-            </w:pPr>
-            <w:r>
-              <w:rPr>
-                <w:sz w:val="19"/>
-              </w:rPr>
-              <w:t xml:space="preserve">Declared; exploratory subset</w:t>
-            </w:r>
-          </w:p>
-        </w:tc>
-        <w:tc>
-          <w:tcPr/>
-          <w:p>
-            <w:pPr>
-              <w:pStyle w:val="Compact"/>
-              <w:spacing w:line="240" w:lineRule="auto"/>
-              <w:jc w:val="left"/>
-            </w:pPr>
-            <w:r>
-              <w:rPr>
-                <w:sz w:val="19"/>
-              </w:rPr>
-              <w:t xml:space="preserve">Small overall, material on tilt-defined</w:t>
+              <w:t xml:space="preserve">AUC drop 0.035 when the last 10 s are cut (criterion 0.10); window effect 0.089 [0.019, 0.168] on tilt-defined multicopter crashes (</w:t>
+            </w:r>
+            <m:oMath>
+              <m:r>
+                <m:t>n</m:t>
+              </m:r>
+              <m:r>
+                <m:rPr>
+                  <m:sty m:val="p"/>
+                </m:rPr>
+                <m:t>=</m:t>
+              </m:r>
+              <m:r>
+                <m:t>37</m:t>
+              </m:r>
+            </m:oMath>
+            <w:r>
+              <w:rPr>
+                <w:sz w:val="19"/>
+              </w:rPr>
+              <w:t xml:space="preserve">), 0.131 without tilt and stick features</w:t>
+            </w:r>
+          </w:p>
+        </w:tc>
+        <w:tc>
+          <w:tcPr/>
+          <w:p>
+            <w:pPr>
+              <w:pStyle w:val="Compact"/>
+              <w:spacing w:line="240" w:lineRule="auto"/>
+              <w:jc w:val="left"/>
+            </w:pPr>
+            <w:r>
+              <w:rPr>
+                <w:sz w:val="19"/>
+              </w:rPr>
+              <w:t xml:space="preserve">Declared; post hoc subset</w:t>
+            </w:r>
+          </w:p>
+        </w:tc>
+        <w:tc>
+          <w:tcPr/>
+          <w:p>
+            <w:pPr>
+              <w:pStyle w:val="Compact"/>
+              <w:spacing w:line="240" w:lineRule="auto"/>
+              <w:jc w:val="left"/>
+            </w:pPr>
+            <w:r>
+              <w:rPr>
+                <w:sz w:val="19"/>
+              </w:rPr>
+              <w:t xml:space="preserve">Small overall, material on tilt-defined multicopters</w:t>
             </w:r>
           </w:p>
         </w:tc>
@@ -11287,7 +11369,59 @@
         </m:sSup>
       </m:oMath>
       <w:r>
-        <w:t xml:space="preserve">The rule itself did not improve as the crash was cut away: on the modelled crashes its balanced accuracy was 0.460 with the full window and 0.454, 0.393, 0.371 and 0.350 with the last 5, 10, 20 and 30 s removed.</w:t>
+        <w:t xml:space="preserve">The rule did not improve as the crash was cut away. Re-running it at each cut needs the rule’s signs computed from the leak-curve features, so this is a feature-based proxy of the declared rule, not the rule itself, and a crash with no sign counts as wrong. On the modelled crashes the proxy’s balanced accuracy was 0.46 [0.38, 0.54] with the full window and 0.45 [0.37, 0.54], 0.39 [0.31, 0.50], 0.37 [0.28, 0.47] and 0.35 [0.25, 0.45] with the last 5, 10, 20 and 30 s removed (bootstrap over crashes; audit</w:t>
+      </w:r>
+      <w:r>
+        <w:t xml:space="preserve"> </w:t>
+      </w:r>
+      <w:r>
+        <w:rPr>
+          <w:rStyle w:val="VerbatimChar"/>
+        </w:rPr>
+        <w:t xml:space="preserve">9650a69</w:t>
+      </w:r>
+      <w:r>
+        <w:t xml:space="preserve">). It falls below 0.5 because an aircraft sign fires on 55–68% of all crashes, pilot-rated ones included, so only 19–29% of pilot-rated crashes are called pilot; undecided crashes are only 7–11%, and on decided crashes alone the figure is 0.50 [0.41, 0.59] at</w:t>
+      </w:r>
+      <w:r>
+        <w:t xml:space="preserve"> </w:t>
+      </w:r>
+      <m:oMath>
+        <m:r>
+          <m:t>m</m:t>
+        </m:r>
+        <m:r>
+          <m:rPr>
+            <m:sty m:val="p"/>
+          </m:rPr>
+          <m:t>=</m:t>
+        </m:r>
+        <m:r>
+          <m:t>0</m:t>
+        </m:r>
+      </m:oMath>
+      <w:r>
+        <w:t xml:space="preserve"> s and 0.39 [0.28, 0.50] at</w:t>
+      </w:r>
+      <w:r>
+        <w:t xml:space="preserve"> </w:t>
+      </w:r>
+      <m:oMath>
+        <m:r>
+          <m:t>m</m:t>
+        </m:r>
+        <m:r>
+          <m:rPr>
+            <m:sty m:val="p"/>
+          </m:rPr>
+          <m:t>=</m:t>
+        </m:r>
+        <m:r>
+          <m:t>30</m:t>
+        </m:r>
+      </m:oMath>
+      <w:r>
+        <w:t xml:space="preserve"> s. Values below 0.5 therefore reflect signs that fire at least as often on pilot-rated crashes, plus undecided crashes counted as wrong; they are not evidence of a reversed signal.</w:t>
       </w:r>
       <w:r>
         <w:t xml:space="preserve"> </w:t>
@@ -16816,7 +16950,7 @@
         <w:t xml:space="preserve"> </w:t>
       </w:r>
       <w:r>
-        <w:t xml:space="preserve">falls back to the end of the armed period. The 148 include 18 fixed-wing and 22 VTOL logs by index vehicle type, which account for 31 of the 72 tilt-defined crashes; for these aircraft a bank above</w:t>
+        <w:t xml:space="preserve">falls back to the end of the armed period. By index vehicle type (Section 4.2) the 148 are 108 multicopters, 18 fixed-wing and 22 VTOL logs. Tilt-defined crashes are 41 of the 108 multicopters (29 confirmed), but 15 of the 18 fixed-wing (2 confirmed) and 16 of the 22 VTOL logs (9 confirmed). For fixed-wing and VTOL aircraft a bank above</w:t>
       </w:r>
       <w:r>
         <w:t xml:space="preserve"> </w:t>
@@ -16842,13 +16976,23 @@
         <w:t xml:space="preserve"> </w:t>
       </w:r>
       <w:r>
-        <w:t xml:space="preserve">can occur in normal flight, so the tilt rule is not a crash criterion for them. Among the 108 multicopters, 41 (38%) are tilt-defined, the same share as in the rest of the archive (39%; Section 5.4).</w:t>
-      </w:r>
-    </w:p>
-    <w:p>
-      <w:pPr>
-        <w:pStyle w:val="BodyText"/>
-      </w:pPr>
+        <w:t xml:space="preserve">can occur in normal flight, and an aircraft that banks and then lands and disarms meets the</w:t>
+      </w:r>
+      <w:r>
+        <w:t xml:space="preserve"> </w:t>
+      </w:r>
+      <w:r>
+        <w:t xml:space="preserve">“confirmed”</w:t>
+      </w:r>
+      <w:r>
+        <w:t xml:space="preserve"> </w:t>
+      </w:r>
+      <w:r>
+        <w:t xml:space="preserve">condition without crashing, so the tilt rule is not a crash criterion for them.</w:t>
+      </w:r>
+      <w:r>
+        <w:t xml:space="preserve"> </w:t>
+      </w:r>
       <m:oMath>
         <m:sSup>
           <m:e>
@@ -16867,6 +17011,31 @@
         </m:sSup>
       </m:oMath>
       <w:r>
+        <w:t xml:space="preserve">We therefore restrict crash-moment results to multicopters and report the mixed set only for comparison. Among the 108 multicopters, 41 (38%) are tilt-defined, the same share as in the rest of the archive (39%; Section 5.4).</w:t>
+      </w:r>
+    </w:p>
+    <w:p>
+      <w:pPr>
+        <w:pStyle w:val="BodyText"/>
+      </w:pPr>
+      <m:oMath>
+        <m:sSup>
+          <m:e>
+            <m:r>
+              <m:t>​</m:t>
+            </m:r>
+          </m:e>
+          <m:sup>
+            <m:r>
+              <m:rPr>
+                <m:sty m:val="p"/>
+              </m:rPr>
+              <m:t>†</m:t>
+            </m:r>
+          </m:sup>
+        </m:sSup>
+      </m:oMath>
+      <w:r>
         <w:t xml:space="preserve">Two authors then judged, by eye, the traces of 50 randomly drawn crash logs (tilt and altitude around</w:t>
       </w:r>
       <w:r>
@@ -16928,7 +17097,30 @@
         </m:r>
       </m:oMath>
       <w:r>
-        <w:t xml:space="preserve">, bootstrap 95% CI 0.50–0.87). Of the 26 tilt-defined crash moments, the reviewers judged 21 and 24 correct, including 11 and 12 of the 12 confirmed ones; of the 24 fallback crash moments, only 2 and 6. Whether fallback logs contain the crash elsewhere was disputed (</w:t>
+        <w:t xml:space="preserve">, bootstrap 95% CI 0.50–0.87). Of the 26 tilt-defined crash moments, the reviewers judged 21 and 24 correct, including 11 and 12 of the 12 confirmed ones; of the 24 fallback crash moments, only 2 and 6.</w:t>
+      </w:r>
+      <w:r>
+        <w:t xml:space="preserve"> </w:t>
+      </w:r>
+      <m:oMath>
+        <m:sSup>
+          <m:e>
+            <m:r>
+              <m:t>​</m:t>
+            </m:r>
+          </m:e>
+          <m:sup>
+            <m:r>
+              <m:rPr>
+                <m:sty m:val="p"/>
+              </m:rPr>
+              <m:t>†</m:t>
+            </m:r>
+          </m:sup>
+        </m:sSup>
+      </m:oMath>
+      <w:r>
+        <w:t xml:space="preserve">By vehicle type (34 multicopter, 7 fixed-wing and 9 VTOL logs), both reviewers judged all 15 multicopter tilt-defined crash moments correct (10 confirmed, 5 not); the disagreements on tilt-defined moments were all in fixed-wing (4 and 4 of 5 correct) and VTOL logs (2 and 5 of 6). Of the 19 multicopter fallback moments, 2 and 5 were judged correct. Whether fallback logs contain the crash elsewhere was disputed (</w:t>
       </w:r>
       <m:oMath>
         <m:r>
@@ -17088,11 +17280,9 @@
       <w:r>
         <w:t xml:space="preserve">.</w:t>
       </w:r>
-    </w:p>
-    <w:p>
-      <w:pPr>
-        <w:pStyle w:val="BodyText"/>
-      </w:pPr>
+      <w:r>
+        <w:t xml:space="preserve"> </w:t>
+      </w:r>
       <m:oMath>
         <m:sSup>
           <m:e>
@@ -17111,9 +17301,81 @@
         </m:sSup>
       </m:oMath>
       <w:r>
-        <w:t xml:space="preserve">Because the tilt-defined crash moment is the one both reviewers support, we repeated the window analyses on the tilt-defined crashes. With grouped folds on the constant cohort, removing the last 10 s lowered AUC by 0.035 over all crashes (0.833 to 0.799), by 0.084 over the 43 tilt-defined crashes in that cohort (0.883 to 0.800) and by 0.103 over the 25 confirmed ones, so the declared leak criterion (</w:t>
-      </w:r>
-      <m:oMath>
+        <w:t xml:space="preserve">A second detector, declared after that failure (</w:t>
+      </w:r>
+      <w:r>
+        <w:rPr>
+          <w:rStyle w:val="VerbatimChar"/>
+        </w:rPr>
+        <w:t xml:space="preserve">9650a69</w:t>
+      </w:r>
+      <w:r>
+        <w:t xml:space="preserve">), combined four cues: tilt above</w:t>
+      </w:r>
+      <w:r>
+        <w:t xml:space="preserve"> </w:t>
+      </w:r>
+      <m:oMath>
+        <m:sSup>
+          <m:e>
+            <m:r>
+              <m:t>60</m:t>
+            </m:r>
+          </m:e>
+          <m:sup>
+            <m:r>
+              <m:rPr>
+                <m:sty m:val="p"/>
+              </m:rPr>
+              <m:t>∘</m:t>
+            </m:r>
+          </m:sup>
+        </m:sSup>
+      </m:oMath>
+      <w:r>
+        <w:t xml:space="preserve">; a descent faster than 5 m/s ending within 3 s in ground contact or disarm; a disarm while the land detector still reported flight; and an acceleration above 6 g within 2 s before landing or disarm. It again matched the first reviewer (</w:t>
+      </w:r>
+      <m:oMath>
+        <m:r>
+          <m:t>κ</m:t>
+        </m:r>
+        <m:r>
+          <m:rPr>
+            <m:sty m:val="p"/>
+          </m:rPr>
+          <m:t>=</m:t>
+        </m:r>
+        <m:r>
+          <m:t>0.82</m:t>
+        </m:r>
+      </m:oMath>
+      <w:r>
+        <w:t xml:space="preserve">, 0.62–0.96) but not the blind one (</w:t>
+      </w:r>
+      <m:oMath>
+        <m:r>
+          <m:t>κ</m:t>
+        </m:r>
+        <m:r>
+          <m:rPr>
+            <m:sty m:val="p"/>
+          </m:rPr>
+          <m:t>=</m:t>
+        </m:r>
+        <m:r>
+          <m:t>0.32</m:t>
+        </m:r>
+      </m:oMath>
+      <w:r>
+        <w:t xml:space="preserve">, 0.11–0.57), and fired on 45 of 139 normal flights (32%; 40 through the impact cue), so it also failed the gate (both</w:t>
+      </w:r>
+      <w:r>
+        <w:t xml:space="preserve"> </w:t>
+      </w:r>
+      <m:oMath>
+        <m:r>
+          <m:t>κ</m:t>
+        </m:r>
         <m:r>
           <m:rPr>
             <m:sty m:val="p"/>
@@ -17121,101 +17383,40 @@
           <m:t>≥</m:t>
         </m:r>
         <m:r>
-          <m:t>0.10</m:t>
-        </m:r>
-      </m:oMath>
-      <w:r>
-        <w:t xml:space="preserve">) is not met except in the smallest subset, which has no interval. In the factorial pipeline, the mean</w:t>
-      </w:r>
-      <w:r>
-        <w:t xml:space="preserve"> </w:t>
-      </w:r>
-      <m:oMath>
-        <m:r>
-          <m:t>m</m:t>
-        </m:r>
-        <m:r>
-          <m:rPr>
-            <m:sty m:val="p"/>
-          </m:rPr>
-          <m:t>=</m:t>
-        </m:r>
-        <m:r>
-          <m:t>0</m:t>
-        </m:r>
-      </m:oMath>
-      <w:r>
-        <w:t xml:space="preserve"> </w:t>
-      </w:r>
-      <w:r>
-        <w:t xml:space="preserve">versus 10 s difference over the four crash and normal sets was 0.014 [</w:t>
-      </w:r>
-      <m:oMath>
-        <m:r>
-          <m:rPr>
-            <m:sty m:val="p"/>
-          </m:rPr>
-          <m:t>−</m:t>
-        </m:r>
-        <m:r>
-          <m:t>0.027</m:t>
-        </m:r>
-      </m:oMath>
-      <w:r>
-        <w:t xml:space="preserve">, 0.038] for all crashes and 0.067 [0.015, 0.131] for tilt-defined ones, which meets the declared materiality rule (0.05 with an interval excluding zero). Crash-window leakage is therefore small overall but material among crashes whose log shows a crash-like tilt; the small overall figure is possibly in part due to the many logs without one. Within the same drone, tilt-defined crashes still showed no warning (vibration rank 0.47,</w:t>
-      </w:r>
-      <w:r>
-        <w:t xml:space="preserve"> </w:t>
-      </w:r>
-      <m:oMath>
-        <m:r>
-          <m:t>p</m:t>
-        </m:r>
-        <m:r>
-          <m:rPr>
-            <m:sty m:val="p"/>
-          </m:rPr>
-          <m:t>=</m:t>
-        </m:r>
-        <m:r>
-          <m:t>0.66</m:t>
-        </m:r>
-      </m:oMath>
-      <w:r>
-        <w:t xml:space="preserve">, 18 drones; tracking 0.48,</w:t>
-      </w:r>
-      <w:r>
-        <w:t xml:space="preserve"> </w:t>
-      </w:r>
-      <m:oMath>
-        <m:r>
-          <m:t>p</m:t>
-        </m:r>
-        <m:r>
-          <m:rPr>
-            <m:sty m:val="p"/>
-          </m:rPr>
-          <m:t>=</m:t>
-        </m:r>
-        <m:r>
-          <m:t>0.58</m:t>
-        </m:r>
-      </m:oMath>
-      <w:r>
-        <w:t xml:space="preserve">, 16 drones; model 0.55 [0.43, 0.67]).</w:t>
+          <m:t>0.6</m:t>
+        </m:r>
+      </m:oMath>
+      <w:r>
+        <w:t xml:space="preserve">, false alarms</w:t>
+      </w:r>
+      <w:r>
+        <w:t xml:space="preserve"> </w:t>
+      </w:r>
+      <m:oMath>
+        <m:r>
+          <m:rPr>
+            <m:sty m:val="p"/>
+          </m:rPr>
+          <m:t>≤</m:t>
+        </m:r>
+        <m:r>
+          <m:t>10</m:t>
+        </m:r>
+        <m:r>
+          <m:rPr>
+            <m:sty m:val="p"/>
+          </m:rPr>
+          <m:t>%</m:t>
+        </m:r>
+      </m:oMath>
+      <w:r>
+        <w:t xml:space="preserve">). The two reviewers disagree mainly on low-tilt logs, so a detector tuned to either cannot be validated by both; settling this needs a third rater who is not an author.</w:t>
       </w:r>
     </w:p>
     <w:p>
       <w:pPr>
         <w:pStyle w:val="BodyText"/>
       </w:pPr>
-      <w:r>
-        <w:rPr>
-          <w:b/>
-          <w:bCs/>
-        </w:rPr>
-        <w:t xml:space="preserve">How many crash-rated logs contain the crash</w:t>
-      </w:r>
       <m:oMath>
         <m:sSup>
           <m:e>
@@ -17234,6 +17435,310 @@
         </m:sSup>
       </m:oMath>
       <w:r>
+        <w:t xml:space="preserve">Because the tilt-defined crash moment on multicopters is the one both reviewers support, we repeated the window analyses on tilt-defined crashes (Table 10). These subgroups are post hoc: the tilt-defined set was chosen after the confirmed-crash result (Appendix Appendix A), and the multicopter restriction after the review above. With grouped folds on the constant cohort (124 normal flights; intervals from a paired vehicle bootstrap, declared audit</w:t>
+      </w:r>
+      <w:r>
+        <w:t xml:space="preserve"> </w:t>
+      </w:r>
+      <w:r>
+        <w:rPr>
+          <w:rStyle w:val="VerbatimChar"/>
+        </w:rPr>
+        <w:t xml:space="preserve">9650a69</w:t>
+      </w:r>
+      <w:r>
+        <w:t xml:space="preserve">), removing the last 10 s lowered AUC by 0.035 [0.005, 0.077] over all 89 crashes but by 0.114 [0.027, 0.222] over the 24 tilt-defined multicopter crashes (0.878 to 0.764). That meets the declared leak criterion (</w:t>
+      </w:r>
+      <m:oMath>
+        <m:r>
+          <m:rPr>
+            <m:sty m:val="p"/>
+          </m:rPr>
+          <m:t>≥</m:t>
+        </m:r>
+        <m:r>
+          <m:t>0.10</m:t>
+        </m:r>
+      </m:oMath>
+      <w:r>
+        <w:t xml:space="preserve">) by its point estimate only; the interval includes 0.10. In the factorial pipeline, the mean</w:t>
+      </w:r>
+      <w:r>
+        <w:t xml:space="preserve"> </w:t>
+      </w:r>
+      <m:oMath>
+        <m:r>
+          <m:t>m</m:t>
+        </m:r>
+        <m:r>
+          <m:rPr>
+            <m:sty m:val="p"/>
+          </m:rPr>
+          <m:t>=</m:t>
+        </m:r>
+        <m:r>
+          <m:t>0</m:t>
+        </m:r>
+      </m:oMath>
+      <w:r>
+        <w:t xml:space="preserve"> </w:t>
+      </w:r>
+      <w:r>
+        <w:t xml:space="preserve">versus 10 s difference over the four crash and normal sets was 0.014 [</w:t>
+      </w:r>
+      <m:oMath>
+        <m:r>
+          <m:rPr>
+            <m:sty m:val="p"/>
+          </m:rPr>
+          <m:t>−</m:t>
+        </m:r>
+        <m:r>
+          <m:t>0.027</m:t>
+        </m:r>
+      </m:oMath>
+      <w:r>
+        <w:t xml:space="preserve">, 0.038] for all crashes and 0.089 [0.019, 0.168] for tilt-defined multicopter crashes (21 and 16 in the two crash sets), which meets the declared materiality rule (0.05 with an interval excluding zero).</w:t>
+      </w:r>
+    </w:p>
+    <w:p>
+      <w:pPr>
+        <w:pStyle w:val="BodyText"/>
+      </w:pPr>
+      <m:oMath>
+        <m:sSup>
+          <m:e>
+            <m:r>
+              <m:t>​</m:t>
+            </m:r>
+          </m:e>
+          <m:sup>
+            <m:r>
+              <m:rPr>
+                <m:sty m:val="p"/>
+              </m:rPr>
+              <m:t>†</m:t>
+            </m:r>
+          </m:sup>
+        </m:sSup>
+      </m:oMath>
+      <w:r>
+        <w:t xml:space="preserve">Because the cut removes the very tilt that defines the subgroup, part of this effect could be mechanical. We refitted without the tilt and stick features (declared before the run, with the wording rule that the abstract would drop</w:t>
+      </w:r>
+      <w:r>
+        <w:t xml:space="preserve"> </w:t>
+      </w:r>
+      <w:r>
+        <w:t xml:space="preserve">“material”</w:t>
+      </w:r>
+      <w:r>
+        <w:t xml:space="preserve"> </w:t>
+      </w:r>
+      <w:r>
+        <w:t xml:space="preserve">if the effect fell below 0.05). The effect grew rather than shrank: 0.216 [0.086, 0.402] on the leak curve and 0.131 [0.042, 0.226] in the factorial pipeline, because without those features AUC after the cut falls further (0.583 against 0.764 for the full model on the leak curve). The last seconds before a tilt-defined crash therefore carry signal in several features, not only the defining tilt. Crash-window leakage is small overall but material among multicopter crashes whose log shows a crash-like tilt; the small overall figure is possibly in part due to the many logs without one. The two figures of 0.014 in this paper are different quantities that coincide after rounding: the Shapley share of the window cut (0.0144 [0.007, 0.023]; Section 5.5) averages the cut over every combination of the other four factors on the constant subset, with the models fixed in each bootstrap, so its interval is narrow; the four-cell difference (0.0136 [</w:t>
+      </w:r>
+      <m:oMath>
+        <m:r>
+          <m:rPr>
+            <m:sty m:val="p"/>
+          </m:rPr>
+          <m:t>−</m:t>
+        </m:r>
+        <m:r>
+          <m:t>0.027</m:t>
+        </m:r>
+      </m:oMath>
+      <w:r>
+        <w:t xml:space="preserve">, 0.038]) compares just four separately fitted pairs on the full sets.</w:t>
+      </w:r>
+    </w:p>
+    <w:p>
+      <w:pPr>
+        <w:pStyle w:val="FirstParagraph"/>
+      </w:pPr>
+      <w:r>
+        <w:t xml:space="preserve">@l r c c@</w:t>
+      </w:r>
+      <w:r>
+        <w:t xml:space="preserve"> </w:t>
+      </w:r>
+      <w:r>
+        <w:t xml:space="preserve">Crash subset &amp;</w:t>
+      </w:r>
+      <w:r>
+        <w:t xml:space="preserve"> </w:t>
+      </w:r>
+      <m:oMath>
+        <m:r>
+          <m:t>n</m:t>
+        </m:r>
+      </m:oMath>
+      <w:r>
+        <w:t xml:space="preserve"> </w:t>
+      </w:r>
+      <w:r>
+        <w:t xml:space="preserve">&amp; Leak drop &amp; No tilt/stick</w:t>
+      </w:r>
+      <w:r>
+        <w:br/>
+      </w:r>
+      <w:r>
+        <w:t xml:space="preserve">All crashes &amp; 89 &amp; 0.035 [0.005, 0.077] &amp; 0.063 [0.023, 0.109]</w:t>
+      </w:r>
+      <w:r>
+        <w:br/>
+      </w:r>
+      <w:r>
+        <w:t xml:space="preserve">Tilt-defined, all types &amp; 43 &amp; 0.084 [0.018, 0.139] &amp; 0.115 [0.044, 0.188]</w:t>
+      </w:r>
+      <w:r>
+        <w:br/>
+      </w:r>
+      <w:r>
+        <w:t xml:space="preserve">Confirmed, all types &amp; 25 &amp; 0.103 [0.027, 0.188] &amp; 0.125 [0.013, 0.247]</w:t>
+      </w:r>
+      <w:r>
+        <w:br/>
+      </w:r>
+      <w:r>
+        <w:t xml:space="preserve">Tilt-defined multicopters &amp; 24 &amp; 0.114 [0.027, 0.222] &amp; 0.216 [0.086, 0.402]</w:t>
+      </w:r>
+      <w:r>
+        <w:br/>
+      </w:r>
+      <w:r>
+        <w:t xml:space="preserve">Confirmed multicopters &amp; 18 &amp; 0.168 [0.048, 0.340] &amp; 0.155 [</w:t>
+      </w:r>
+      <m:oMath>
+        <m:r>
+          <m:rPr>
+            <m:sty m:val="p"/>
+          </m:rPr>
+          <m:t>−</m:t>
+        </m:r>
+        <m:r>
+          <m:t>0.032</m:t>
+        </m:r>
+      </m:oMath>
+      <w:r>
+        <w:t xml:space="preserve">, 0.491]</w:t>
+      </w:r>
+      <w:r>
+        <w:br/>
+      </w:r>
+      <w:r>
+        <w:br/>
+      </w:r>
+      <w:r>
+        <w:t xml:space="preserve">All crashes &amp; 145 &amp; 0.014 [</w:t>
+      </w:r>
+      <m:oMath>
+        <m:r>
+          <m:rPr>
+            <m:sty m:val="p"/>
+          </m:rPr>
+          <m:t>−</m:t>
+        </m:r>
+        <m:r>
+          <m:t>0.027</m:t>
+        </m:r>
+      </m:oMath>
+      <w:r>
+        <w:t xml:space="preserve">, 0.038] &amp; –</w:t>
+      </w:r>
+      <w:r>
+        <w:br/>
+      </w:r>
+      <w:r>
+        <w:t xml:space="preserve">Tilt-defined, all types &amp; 63 &amp; 0.067 [0.015, 0.131] &amp; –</w:t>
+      </w:r>
+      <w:r>
+        <w:br/>
+      </w:r>
+      <w:r>
+        <w:t xml:space="preserve">Tilt-defined multicopters &amp; 37 &amp; 0.089 [0.019, 0.168] &amp; 0.131 [0.042, 0.226]</w:t>
+      </w:r>
+      <w:r>
+        <w:br/>
+      </w:r>
+    </w:p>
+    <w:p>
+      <w:pPr>
+        <w:pStyle w:val="BodyText"/>
+      </w:pPr>
+      <w:r>
+        <w:t xml:space="preserve">Within the same drone, tilt-defined crashes still showed no warning (vibration rank 0.47,</w:t>
+      </w:r>
+      <w:r>
+        <w:t xml:space="preserve"> </w:t>
+      </w:r>
+      <m:oMath>
+        <m:r>
+          <m:t>p</m:t>
+        </m:r>
+        <m:r>
+          <m:rPr>
+            <m:sty m:val="p"/>
+          </m:rPr>
+          <m:t>=</m:t>
+        </m:r>
+        <m:r>
+          <m:t>0.66</m:t>
+        </m:r>
+      </m:oMath>
+      <w:r>
+        <w:t xml:space="preserve">, 18 drones; tracking 0.48,</w:t>
+      </w:r>
+      <w:r>
+        <w:t xml:space="preserve"> </w:t>
+      </w:r>
+      <m:oMath>
+        <m:r>
+          <m:t>p</m:t>
+        </m:r>
+        <m:r>
+          <m:rPr>
+            <m:sty m:val="p"/>
+          </m:rPr>
+          <m:t>=</m:t>
+        </m:r>
+        <m:r>
+          <m:t>0.58</m:t>
+        </m:r>
+      </m:oMath>
+      <w:r>
+        <w:t xml:space="preserve">, 16 drones; model 0.55 [0.43, 0.67]).</w:t>
+      </w:r>
+    </w:p>
+    <w:p>
+      <w:pPr>
+        <w:pStyle w:val="BodyText"/>
+      </w:pPr>
+      <w:r>
+        <w:rPr>
+          <w:b/>
+          <w:bCs/>
+        </w:rPr>
+        <w:t xml:space="preserve">How many crash-rated logs contain the crash</w:t>
+      </w:r>
+      <m:oMath>
+        <m:sSup>
+          <m:e>
+            <m:r>
+              <m:t>​</m:t>
+            </m:r>
+          </m:e>
+          <m:sup>
+            <m:r>
+              <m:rPr>
+                <m:sty m:val="p"/>
+              </m:rPr>
+              <m:t>†</m:t>
+            </m:r>
+          </m:sup>
+        </m:sSup>
+      </m:oMath>
+      <w:r>
         <w:rPr>
           <w:b/>
           <w:bCs/>
@@ -17345,7 +17850,7 @@
         </m:sSup>
       </m:oMath>
       <w:r>
-        <w:t xml:space="preserve">Pilot ratings are also more common in recent logs (46 of 81 from 2023), so we adjusted for era and vehicle type (declared audit</w:t>
+        <w:t xml:space="preserve">Pilot ratings are also more common in recent logs (46 of the 81 readable multicopter logs from 2023 onwards are pilot-rated), so we adjusted for era and vehicle type (declared audit</w:t>
       </w:r>
       <w:r>
         <w:t xml:space="preserve"> </w:t>
@@ -17389,7 +17894,7 @@
         <w:t xml:space="preserve"> </w:t>
       </w:r>
       <w:r>
-        <w:t xml:space="preserve">would separate aircraft-rated from pilot-rated logs at AUC 0.61 [0.55, 0.66] across the archive but only 0.55 [0.45, 0.64] in our 148 modelled crashes, consistent with our classifiers staying at chance. Our modelled sample matches the rest of the archive (38% against 39%,</w:t>
+        <w:t xml:space="preserve">would separate aircraft-rated from pilot-rated logs at AUC 0.61 [0.55, 0.66] across the archive but only 0.55 [0.45, 0.64] in our 148 modelled crashes and 0.53 [0.43, 0.63] in the 108 modelled multicopters, consistent with our classifiers staying at chance. Our modelled sample matches the rest of the archive (38% against 39%,</w:t>
       </w:r>
       <w:r>
         <w:t xml:space="preserve"> </w:t>
@@ -17409,32 +17914,11 @@
         </m:r>
       </m:oMath>
       <w:r>
-        <w:t xml:space="preserve">). The uploader’s label therefore partly encodes whether the recording reached the crash, so a classifier could appear to separate pilot-caused from aircraft-caused crashes in this archive by detecting that alone.</w:t>
-      </w:r>
-    </w:p>
-    <w:p>
-      <w:pPr>
-        <w:pStyle w:val="Heading2"/>
-      </w:pPr>
-      <w:bookmarkStart w:id="50" w:name="_0c9e7e04e6c31fefd3494b28729aa56a3255cc6"/>
-      <w:r>
-        <w:rPr>
-          <w:rStyle w:val="SectionNumber"/>
-        </w:rPr>
-        <w:t xml:space="preserve">5.5</w:t>
-      </w:r>
-      <w:r>
-        <w:tab/>
-      </w:r>
-      <w:r>
-        <w:t xml:space="preserve">Factorial optimism audit (exploratory)</w:t>
-      </w:r>
-      <w:bookmarkEnd w:id="50"/>
-    </w:p>
-    <w:p>
-      <w:pPr>
-        <w:pStyle w:val="FirstParagraph"/>
-      </w:pPr>
+        <w:t xml:space="preserve">). The uploader’s label therefore partly encodes whether the log shows a tilt-type crash. Two readings fit this: the recording may stop before the crash more often in pilot-rated logs, or pilot-caused crashes may physically involve less tilt (for example a controlled descent into an obstacle rather than a loss of attitude control); the reviewers’ disagreement on low-tilt logs means we cannot tell them apart. Either way, a classifier could appear to separate the labels in this archive by detecting tilt-type crashes alone.</w:t>
+      </w:r>
+      <w:r>
+        <w:t xml:space="preserve"> </w:t>
+      </w:r>
       <m:oMath>
         <m:sSup>
           <m:e>
@@ -17453,7 +17937,7 @@
         </m:sSup>
       </m:oMath>
       <w:r>
-        <w:t xml:space="preserve">The steps of Table 8 change several things at once, and their samples were built with different feature extractors. To find what the crash-vs-normal AUC depends on, we declared a factorial audit after the main analyses (commit</w:t>
+        <w:t xml:space="preserve">To check whether tilt hides a real signal, we repeated the attribution model within each tilt stratum of the modelled multicopters (declared audit</w:t>
       </w:r>
       <w:r>
         <w:t xml:space="preserve"> </w:t>
@@ -17462,29 +17946,17 @@
         <w:rPr>
           <w:rStyle w:val="VerbatimChar"/>
         </w:rPr>
-        <w:t xml:space="preserve">3c34530</w:t>
-      </w:r>
-      <w:r>
-        <w:t xml:space="preserve">; amended</w:t>
-      </w:r>
-      <w:r>
-        <w:t xml:space="preserve"> </w:t>
-      </w:r>
-      <w:r>
-        <w:rPr>
-          <w:rStyle w:val="VerbatimChar"/>
-        </w:rPr>
-        <w:t xml:space="preserve">f6ba424</w:t>
-      </w:r>
-      <w:r>
-        <w:t xml:space="preserve"> </w:t>
-      </w:r>
-      <w:r>
-        <w:t xml:space="preserve">to a float32 tolerance after its extractor check aborted on rounding differences; run 27 October 2026). Every flight was re-extracted from the raw log by one extractor, and five two-level factors were crossed: crash set (103 multi-history crashes vs. the 67 within-drone crashes), comparison flights (uploader-rated good/great normals vs. unrated flights from drones with no crash-rated log, matched to the within-drone cases on hardware, PX4 version and vehicle type), crash-window cut (</w:t>
-      </w:r>
-      <m:oMath>
-        <m:r>
-          <m:t>m</m:t>
+        <w:t xml:space="preserve">9650a69</w:t>
+      </w:r>
+      <w:r>
+        <w:t xml:space="preserve">; 200 refitting permutations): AUC 0.63 among 41 tilt-defined crashes (9 pilot-rated;</w:t>
+      </w:r>
+      <w:r>
+        <w:t xml:space="preserve"> </w:t>
+      </w:r>
+      <m:oMath>
+        <m:r>
+          <m:t>p</m:t>
         </m:r>
         <m:r>
           <m:rPr>
@@ -17493,154 +17965,56 @@
           <m:t>=</m:t>
         </m:r>
         <m:r>
-          <m:t>0</m:t>
-        </m:r>
-      </m:oMath>
-      <w:r>
-        <w:t xml:space="preserve"> </w:t>
-      </w:r>
-      <w:r>
-        <w:t xml:space="preserve">vs. 10 s), fold scheme (stratified by flight vs. grouped by vehicle) and window (full flight vs. first 30 s airborne). Normal flights from any crashed vehicle were removed (39 of the 139). Intervals come from one paired two-stage cluster bootstrap (2,000 resamples over crash and control vehicles, models not refitted); a factor was declared material if its share was</w:t>
-      </w:r>
-      <w:r>
-        <w:t xml:space="preserve"> </w:t>
-      </w:r>
-      <m:oMath>
-        <m:r>
-          <m:rPr>
-            <m:sty m:val="p"/>
-          </m:rPr>
-          <m:t>≥</m:t>
-        </m:r>
-        <m:r>
-          <m:t>0.05</m:t>
-        </m:r>
-      </m:oMath>
-      <w:r>
-        <w:t xml:space="preserve"> </w:t>
-      </w:r>
-      <w:r>
-        <w:t xml:space="preserve">with a 95% interval excluding zero. The declaration passed all abort checks (anchors 0.891 and 0.559; extractor agreement 374/374; label-permutation mean 0.495).</w:t>
+          <m:t>0.10</m:t>
+        </m:r>
+      </m:oMath>
+      <w:r>
+        <w:t xml:space="preserve">; approximate bounds 0.39–0.87) and 0.62 among 67 without tilt (18 pilot-rated;</w:t>
+      </w:r>
+      <w:r>
+        <w:t xml:space="preserve"> </w:t>
+      </w:r>
+      <m:oMath>
+        <m:r>
+          <m:t>p</m:t>
+        </m:r>
+        <m:r>
+          <m:rPr>
+            <m:sty m:val="p"/>
+          </m:rPr>
+          <m:t>=</m:t>
+        </m:r>
+        <m:r>
+          <m:t>0.11</m:t>
+        </m:r>
+      </m:oMath>
+      <w:r>
+        <w:t xml:space="preserve">; 0.43–0.81). Neither is distinguishable from chance, but with 9 and 18 pilot-rated crashes neither rules out a usable signal either.</w:t>
       </w:r>
     </w:p>
     <w:p>
       <w:pPr>
-        <w:pStyle w:val="BodyText"/>
+        <w:pStyle w:val="Heading2"/>
       </w:pPr>
-      <w:r>
-        <w:t xml:space="preserve">The declared primary</w:t>
-      </w:r>
-      <w:r>
-        <w:t xml:space="preserve"> </w:t>
-      </w:r>
-      <m:oMath>
-        <m:r>
-          <m:t>2</m:t>
-        </m:r>
-        <m:r>
-          <m:rPr>
-            <m:sty m:val="p"/>
-          </m:rPr>
-          <m:t>×</m:t>
-        </m:r>
-        <m:r>
-          <m:t>2</m:t>
-        </m:r>
-      </m:oMath>
-      <w:r>
-        <w:t xml:space="preserve"> </w:t>
-      </w:r>
-      <w:r>
-        <w:t xml:space="preserve">(</w:t>
-      </w:r>
-      <m:oMath>
-        <m:r>
-          <m:t>m</m:t>
-        </m:r>
-        <m:r>
-          <m:rPr>
-            <m:sty m:val="p"/>
-          </m:rPr>
-          <m:t>=</m:t>
-        </m:r>
-        <m:r>
-          <m:t>10</m:t>
-        </m:r>
-      </m:oMath>
-      <w:r>
-        <w:t xml:space="preserve"> s, grouped folds, full window) did not isolate a cause (Table 10): changing the normal flights lowered AUC by 0.094 [</w:t>
-      </w:r>
-      <m:oMath>
-        <m:r>
-          <m:rPr>
-            <m:sty m:val="p"/>
-          </m:rPr>
-          <m:t>−</m:t>
-        </m:r>
-        <m:r>
-          <m:t>0.014</m:t>
-        </m:r>
-      </m:oMath>
-      <w:r>
-        <w:t xml:space="preserve">, 0.197] and changing the crash set by 0.108 [</w:t>
-      </w:r>
-      <m:oMath>
-        <m:r>
-          <m:rPr>
-            <m:sty m:val="p"/>
-          </m:rPr>
-          <m:t>−</m:t>
-        </m:r>
-        <m:r>
-          <m:t>0.037</m:t>
-        </m:r>
-      </m:oMath>
-      <w:r>
-        <w:t xml:space="preserve">, 0.224]. Following the pre-declared wording, the AUC depends on the comparison set; the cause is not isolated. On the constant subset (63 and 60 crashes), AUC fell from 0.878 at the most optimistic setting to 0.666 at the most conservative, a drop of 0.212 [0.062, 0.335]. An exact Shapley split assigned 0.062 [0.034, 0.087] of it to vehicle-grouped folds, the only material factor; the effect was concentrated where comparison drones contribute several flights (interaction with comparison set</w:t>
-      </w:r>
-      <w:r>
-        <w:t xml:space="preserve"> </w:t>
-      </w:r>
-      <m:oMath>
-        <m:r>
-          <m:rPr>
-            <m:sty m:val="p"/>
-          </m:rPr>
-          <m:t>+</m:t>
-        </m:r>
-        <m:r>
-          <m:t>0.082</m:t>
-        </m:r>
-      </m:oMath>
-      <w:r>
-        <w:t xml:space="preserve"> </w:t>
-      </w:r>
-      <w:r>
-        <w:t xml:space="preserve">[0.006, 0.122]), consistent with the regenerated Step 1 of Table 8, where grouping by vehicle lowered the AUC from 0.882 to 0.826. The crash-window cut carried a small but non-zero Shapley share of 0.014 [0.007, 0.023] (on all crashes; Section 5.4 gives the larger effect on tilt-defined crashes), and the fixed 30 s window carried 0.001. Separation against other aircraft persisted at the most conservative setting (0.666 [0.557, 0.770]); replacing other-aircraft flights by the same drones’ earlier flights at the same settings (first 30 s window,</w:t>
-      </w:r>
-      <w:r>
-        <w:t xml:space="preserve"> </w:t>
-      </w:r>
-      <m:oMath>
-        <m:r>
-          <m:t>m</m:t>
-        </m:r>
-        <m:r>
-          <m:rPr>
-            <m:sty m:val="p"/>
-          </m:rPr>
-          <m:t>=</m:t>
-        </m:r>
-        <m:r>
-          <m:t>10</m:t>
-        </m:r>
-      </m:oMath>
-      <w:r>
-        <w:t xml:space="preserve"> s, grouped folds) lowered AUC by a further 0.21, from 0.666 to 0.455.</w:t>
-      </w:r>
-      <w:r>
-        <w:t xml:space="preserve"> </w:t>
-      </w:r>
+      <w:bookmarkStart w:id="50" w:name="_0c9e7e04e6c31fefd3494b28729aa56a3255cc6"/>
+      <w:r>
+        <w:rPr>
+          <w:rStyle w:val="SectionNumber"/>
+        </w:rPr>
+        <w:t xml:space="preserve">5.5</w:t>
+      </w:r>
+      <w:r>
+        <w:tab/>
+      </w:r>
+      <w:r>
+        <w:t xml:space="preserve">Factorial optimism audit (exploratory)</w:t>
+      </w:r>
+      <w:bookmarkEnd w:id="50"/>
+    </w:p>
+    <w:p>
+      <w:pPr>
+        <w:pStyle w:val="FirstParagraph"/>
+      </w:pPr>
       <m:oMath>
         <m:sSup>
           <m:e>
@@ -17659,70 +18033,190 @@
         </m:sSup>
       </m:oMath>
       <w:r>
-        <w:t xml:space="preserve">On all 67 within-drone crashes with the full window, the paired difference between other-aircraft and own earlier flights is</w:t>
-      </w:r>
-      <w:r>
-        <w:t xml:space="preserve"> </w:t>
-      </w:r>
-      <m:oMath>
-        <m:r>
-          <m:rPr>
-            <m:sty m:val="p"/>
-          </m:rPr>
-          <m:t>+</m:t>
-        </m:r>
-        <m:r>
-          <m:t>0.083</m:t>
-        </m:r>
-      </m:oMath>
-      <w:r>
-        <w:t xml:space="preserve"> </w:t>
-      </w:r>
-      <w:r>
-        <w:t xml:space="preserve">[</w:t>
-      </w:r>
-      <m:oMath>
-        <m:r>
-          <m:rPr>
-            <m:sty m:val="p"/>
-          </m:rPr>
-          <m:t>−</m:t>
-        </m:r>
-        <m:r>
-          <m:t>0.007</m:t>
-        </m:r>
-      </m:oMath>
-      <w:r>
-        <w:t xml:space="preserve">, 0.166] (0.623 against 0.539), and</w:t>
-      </w:r>
-      <w:r>
-        <w:t xml:space="preserve"> </w:t>
-      </w:r>
-      <m:oMath>
-        <m:r>
-          <m:rPr>
-            <m:sty m:val="p"/>
-          </m:rPr>
-          <m:t>+</m:t>
-        </m:r>
-        <m:r>
-          <m:t>0.113</m:t>
-        </m:r>
-      </m:oMath>
-      <w:r>
-        <w:t xml:space="preserve"> </w:t>
-      </w:r>
-      <w:r>
-        <w:t xml:space="preserve">[0.029, 0.212] once earlier flights flown after the crash are removed (0.623 against 0.510, both from the factorial pipeline’s same-aircraft cell; clustering and refit audit). A fixed 30 s window also did not reproduce the caliper lift within drones (Group-CV 0.455 [0.377, 0.507]); because that window also removes proximity to the crash, it is not a clean test of the masking explanation. One same-drone cell with flight-stratified folds fell below chance (0.393), which we attribute to splitting one drone’s flights across folds and do not interpret.</w:t>
+        <w:t xml:space="preserve">The steps of Table 8 change several things at once, and their samples were built with different feature extractors. To find what the crash-vs-normal AUC depends on, we declared a factorial audit after the main analyses (commit</w:t>
+      </w:r>
+      <w:r>
+        <w:t xml:space="preserve"> </w:t>
+      </w:r>
+      <w:r>
+        <w:rPr>
+          <w:rStyle w:val="VerbatimChar"/>
+        </w:rPr>
+        <w:t xml:space="preserve">3c34530</w:t>
+      </w:r>
+      <w:r>
+        <w:t xml:space="preserve">; amended</w:t>
+      </w:r>
+      <w:r>
+        <w:t xml:space="preserve"> </w:t>
+      </w:r>
+      <w:r>
+        <w:rPr>
+          <w:rStyle w:val="VerbatimChar"/>
+        </w:rPr>
+        <w:t xml:space="preserve">f6ba424</w:t>
+      </w:r>
+      <w:r>
+        <w:t xml:space="preserve"> </w:t>
+      </w:r>
+      <w:r>
+        <w:t xml:space="preserve">to a float32 tolerance after its extractor check aborted on rounding differences; run 27 October 2026). Every flight was re-extracted from the raw log by one extractor, and five two-level factors were crossed: crash set (103 multi-history crashes vs. the 67 within-drone crashes), comparison flights (uploader-rated good/great normals vs. unrated flights from drones with no crash-rated log, matched to the within-drone cases on hardware, PX4 version and vehicle type), crash-window cut (</w:t>
+      </w:r>
+      <m:oMath>
+        <m:r>
+          <m:t>m</m:t>
+        </m:r>
+        <m:r>
+          <m:rPr>
+            <m:sty m:val="p"/>
+          </m:rPr>
+          <m:t>=</m:t>
+        </m:r>
+        <m:r>
+          <m:t>0</m:t>
+        </m:r>
+      </m:oMath>
+      <w:r>
+        <w:t xml:space="preserve"> </w:t>
+      </w:r>
+      <w:r>
+        <w:t xml:space="preserve">vs. 10 s), fold scheme (stratified by flight vs. grouped by vehicle) and window (full flight vs. first 30 s airborne). Normal flights from any crashed vehicle were removed (39 of the 139). Intervals come from one paired two-stage cluster bootstrap (2,000 resamples over crash and control vehicles, models not refitted); a factor was declared material if its share was</w:t>
+      </w:r>
+      <w:r>
+        <w:t xml:space="preserve"> </w:t>
+      </w:r>
+      <m:oMath>
+        <m:r>
+          <m:rPr>
+            <m:sty m:val="p"/>
+          </m:rPr>
+          <m:t>≥</m:t>
+        </m:r>
+        <m:r>
+          <m:t>0.05</m:t>
+        </m:r>
+      </m:oMath>
+      <w:r>
+        <w:t xml:space="preserve"> </w:t>
+      </w:r>
+      <w:r>
+        <w:t xml:space="preserve">with a 95% interval excluding zero. The declaration passed all abort checks (anchors 0.891 and 0.559; extractor agreement 374/374; label-permutation mean 0.495).</w:t>
       </w:r>
     </w:p>
-    <w:bookmarkStart w:id="51" w:name="_9a7638f5da02df7bc1e91f3d04aa4fe62b352e5"/>
     <w:p>
       <w:pPr>
-        <w:pStyle w:val="TableCaption"/>
+        <w:pStyle w:val="BodyText"/>
       </w:pPr>
       <w:r>
-        <w:t xml:space="preserve">Table 10.</w:t>
+        <w:t xml:space="preserve">The declared primary</w:t>
+      </w:r>
+      <w:r>
+        <w:t xml:space="preserve"> </w:t>
+      </w:r>
+      <m:oMath>
+        <m:r>
+          <m:t>2</m:t>
+        </m:r>
+        <m:r>
+          <m:rPr>
+            <m:sty m:val="p"/>
+          </m:rPr>
+          <m:t>×</m:t>
+        </m:r>
+        <m:r>
+          <m:t>2</m:t>
+        </m:r>
+      </m:oMath>
+      <w:r>
+        <w:t xml:space="preserve"> </w:t>
+      </w:r>
+      <w:r>
+        <w:t xml:space="preserve">(</w:t>
+      </w:r>
+      <m:oMath>
+        <m:r>
+          <m:t>m</m:t>
+        </m:r>
+        <m:r>
+          <m:rPr>
+            <m:sty m:val="p"/>
+          </m:rPr>
+          <m:t>=</m:t>
+        </m:r>
+        <m:r>
+          <m:t>10</m:t>
+        </m:r>
+      </m:oMath>
+      <w:r>
+        <w:t xml:space="preserve"> s, grouped folds, full window) did not isolate a cause (Table 11): changing the normal flights lowered AUC by 0.094 [</w:t>
+      </w:r>
+      <m:oMath>
+        <m:r>
+          <m:rPr>
+            <m:sty m:val="p"/>
+          </m:rPr>
+          <m:t>−</m:t>
+        </m:r>
+        <m:r>
+          <m:t>0.014</m:t>
+        </m:r>
+      </m:oMath>
+      <w:r>
+        <w:t xml:space="preserve">, 0.197] and changing the crash set by 0.108 [</w:t>
+      </w:r>
+      <m:oMath>
+        <m:r>
+          <m:rPr>
+            <m:sty m:val="p"/>
+          </m:rPr>
+          <m:t>−</m:t>
+        </m:r>
+        <m:r>
+          <m:t>0.037</m:t>
+        </m:r>
+      </m:oMath>
+      <w:r>
+        <w:t xml:space="preserve">, 0.224]. Following the pre-declared wording, the AUC depends on the comparison set; the cause is not isolated. On the constant subset (63 and 60 crashes), AUC fell from 0.878 at the most optimistic setting to 0.666 at the most conservative, a drop of 0.212 [0.062, 0.335]. An exact Shapley split assigned 0.062 [0.034, 0.087] of it to vehicle-grouped folds, the only material factor; the effect was concentrated where comparison drones contribute several flights (interaction with comparison set</w:t>
+      </w:r>
+      <w:r>
+        <w:t xml:space="preserve"> </w:t>
+      </w:r>
+      <m:oMath>
+        <m:r>
+          <m:rPr>
+            <m:sty m:val="p"/>
+          </m:rPr>
+          <m:t>+</m:t>
+        </m:r>
+        <m:r>
+          <m:t>0.082</m:t>
+        </m:r>
+      </m:oMath>
+      <w:r>
+        <w:t xml:space="preserve"> </w:t>
+      </w:r>
+      <w:r>
+        <w:t xml:space="preserve">[0.006, 0.122]), consistent with the regenerated Step 1 of Table 8, where grouping by vehicle lowered the AUC from 0.882 to 0.826. The crash-window cut carried a small but non-zero Shapley share of 0.014 [0.007, 0.023] (on all crashes; Section 5.4 gives the larger effect on tilt-defined crashes), and the fixed 30 s window carried 0.001. Separation against other aircraft persisted at the most conservative setting (0.666 [0.557, 0.770]); replacing other-aircraft flights by the same drones’ earlier flights at the same settings (first 30 s window,</w:t>
+      </w:r>
+      <w:r>
+        <w:t xml:space="preserve"> </w:t>
+      </w:r>
+      <m:oMath>
+        <m:r>
+          <m:t>m</m:t>
+        </m:r>
+        <m:r>
+          <m:rPr>
+            <m:sty m:val="p"/>
+          </m:rPr>
+          <m:t>=</m:t>
+        </m:r>
+        <m:r>
+          <m:t>10</m:t>
+        </m:r>
+      </m:oMath>
+      <w:r>
+        <w:t xml:space="preserve"> s, grouped folds) lowered AUC by a further 0.21, from 0.666 to 0.455.</w:t>
       </w:r>
       <w:r>
         <w:t xml:space="preserve"> </w:t>
@@ -17745,6 +18239,92 @@
         </m:sSup>
       </m:oMath>
       <w:r>
+        <w:t xml:space="preserve">On all 67 within-drone crashes with the full window, the paired difference between other-aircraft and own earlier flights is</w:t>
+      </w:r>
+      <w:r>
+        <w:t xml:space="preserve"> </w:t>
+      </w:r>
+      <m:oMath>
+        <m:r>
+          <m:rPr>
+            <m:sty m:val="p"/>
+          </m:rPr>
+          <m:t>+</m:t>
+        </m:r>
+        <m:r>
+          <m:t>0.083</m:t>
+        </m:r>
+      </m:oMath>
+      <w:r>
+        <w:t xml:space="preserve"> </w:t>
+      </w:r>
+      <w:r>
+        <w:t xml:space="preserve">[</w:t>
+      </w:r>
+      <m:oMath>
+        <m:r>
+          <m:rPr>
+            <m:sty m:val="p"/>
+          </m:rPr>
+          <m:t>−</m:t>
+        </m:r>
+        <m:r>
+          <m:t>0.007</m:t>
+        </m:r>
+      </m:oMath>
+      <w:r>
+        <w:t xml:space="preserve">, 0.166] (0.623 against 0.539), and</w:t>
+      </w:r>
+      <w:r>
+        <w:t xml:space="preserve"> </w:t>
+      </w:r>
+      <m:oMath>
+        <m:r>
+          <m:rPr>
+            <m:sty m:val="p"/>
+          </m:rPr>
+          <m:t>+</m:t>
+        </m:r>
+        <m:r>
+          <m:t>0.113</m:t>
+        </m:r>
+      </m:oMath>
+      <w:r>
+        <w:t xml:space="preserve"> </w:t>
+      </w:r>
+      <w:r>
+        <w:t xml:space="preserve">[0.029, 0.212] once earlier flights flown after the crash are removed (0.623 against 0.510, both from the factorial pipeline’s same-aircraft cell; clustering and refit audit). A fixed 30 s window also did not reproduce the caliper lift within drones (Group-CV 0.455 [0.377, 0.507]); because that window also removes proximity to the crash, it is not a clean test of the masking explanation. One same-drone cell with flight-stratified folds fell below chance (0.393), which we attribute to splitting one drone’s flights across folds and do not interpret.</w:t>
+      </w:r>
+    </w:p>
+    <w:bookmarkStart w:id="51" w:name="_9a7638f5da02df7bc1e91f3d04aa4fe62b352e5"/>
+    <w:p>
+      <w:pPr>
+        <w:pStyle w:val="TableCaption"/>
+      </w:pPr>
+      <w:r>
+        <w:t xml:space="preserve">Table 11.</w:t>
+      </w:r>
+      <w:r>
+        <w:t xml:space="preserve"> </w:t>
+      </w:r>
+      <m:oMath>
+        <m:sSup>
+          <m:e>
+            <m:r>
+              <m:t>​</m:t>
+            </m:r>
+          </m:e>
+          <m:sup>
+            <m:r>
+              <m:rPr>
+                <m:sty m:val="p"/>
+              </m:rPr>
+              <m:t>†</m:t>
+            </m:r>
+          </m:sup>
+        </m:sSup>
+      </m:oMath>
+      <w:r>
         <w:t xml:space="preserve">Factorial optimism audit. Top: declared primary</w:t>
       </w:r>
       <w:r>
@@ -17793,7 +18373,7 @@
         <w:tblStyle w:val="Table"/>
         <w:tblW w:type="pct" w:w="5000"/>
         <w:tblLook w:firstRow="1" w:lastRow="0" w:firstColumn="0" w:lastColumn="0" w:noHBand="0" w:noVBand="0" w:val="0020"/>
-        <w:tblCaption w:val="Table 10. ^\daggerFactorial optimism audit. Top: declared primary 2\times2 (103 multi-history and 67 within-drone crashes) (m=10 s, vehicle-grouped folds, full window). Bottom: exact Shapley split of the 0.212 [0.062, 0.335] AUC drop from the most optimistic to the most conservative other-aircraft setting (constant subset, 63/60 crashes). 95% intervals from a paired two-stage cluster bootstrap."/>
+        <w:tblCaption w:val="Table 11. ^\daggerFactorial optimism audit. Top: declared primary 2\times2 (103 multi-history and 67 within-drone crashes) (m=10 s, vehicle-grouped folds, full window). Bottom: exact Shapley split of the 0.212 [0.062, 0.335] AUC drop from the most optimistic to the most conservative other-aircraft setting (constant subset, 63/60 crashes). 95% intervals from a paired two-stage cluster bootstrap."/>
         <w:tblBorders>
           <w:top w:val="single" w:sz="4" w:color="808080"/>
           <w:left w:val="single" w:sz="4" w:color="808080"/>
@@ -21018,7 +21598,7 @@
         </m:r>
       </m:oMath>
       <w:r>
-        <w:t xml:space="preserve">, 30 drones); the within-drone model gave 0.582 [0.525, 0.660] on stored features (57 drones, 227 earlier flights) but 0.507 [0.436, 0.582] on recomputed features; and the duration-caliper lift (Section 5.3) was no longer clearly distinguishable from zero. Removing the 18 undated flights as well changed none of these conclusions (</w:t>
+        <w:t xml:space="preserve">, 30 drones); the within-drone model gave 0.582 [0.525, 0.660] on stored features (57 drones, 227 earlier flights) but 0.507 [0.436, 0.582] on recomputed features; and the duration-caliper lift (Section 5.6) was no longer clearly distinguishable from zero. Removing the 18 undated flights as well changed none of these conclusions (</w:t>
       </w:r>
       <w:r>
         <w:rPr>
@@ -22227,7 +22807,7 @@
         <w:t xml:space="preserve"> </w:t>
       </w:r>
       <w:r>
-        <w:t xml:space="preserve">Table 11 (12 tuning, 5 vibration, 5 GPS, 9 motor, 4 battery).</w:t>
+        <w:t xml:space="preserve">Table 12 (12 tuning, 5 vibration, 5 GPS, 9 motor, 4 battery).</w:t>
       </w:r>
     </w:p>
     <w:p>
@@ -22235,7 +22815,7 @@
         <w:pStyle w:val="BodyText"/>
       </w:pPr>
       <w:r>
-        <w:t xml:space="preserve">Table 11 compares the fault checks with the full flight window (</w:t>
+        <w:t xml:space="preserve">Table 12 compares the fault checks with the full flight window (</w:t>
       </w:r>
       <m:oMath>
         <m:r>
@@ -23099,7 +23679,7 @@
         <w:pStyle w:val="TableCaption"/>
       </w:pPr>
       <w:r>
-        <w:t xml:space="preserve">Table 11. Fault checks on logs whose expert named the matching fault, with the full window (</w:t>
+        <w:t xml:space="preserve">Table 12. Fault checks on logs whose expert named the matching fault, with the full window (</w:t>
       </w:r>
       <m:oMath>
         <m:r>
@@ -23153,7 +23733,7 @@
         <w:tblStyle w:val="Table"/>
         <w:tblW w:type="pct" w:w="5000"/>
         <w:tblLook w:firstRow="0" w:lastRow="0" w:firstColumn="0" w:lastColumn="0" w:noHBand="0" w:noVBand="0" w:val="0000"/>
-        <w:tblCaption w:val="Table 11. Fault checks on logs whose expert named the matching fault, with the full window (m=0 s) and with the last 10 s before the crash removed (m=10 s). Declared criterion: at least 50% of diagnosed logs and at most 10% of normal flights. Paired columns show constant logs surviving across both windows."/>
+        <w:tblCaption w:val="Table 12. Fault checks on logs whose expert named the matching fault, with the full window (m=0 s) and with the last 10 s before the crash removed (m=10 s). Declared criterion: at least 50% of diagnosed logs and at most 10% of normal flights. Paired columns show constant logs surviving across both windows."/>
         <w:tblBorders>
           <w:top w:val="single" w:sz="4" w:color="808080"/>
           <w:left w:val="single" w:sz="4" w:color="808080"/>
@@ -24223,7 +24803,7 @@
         <w:pStyle w:val="FirstParagraph"/>
       </w:pPr>
       <w:r>
-        <w:t xml:space="preserve">Because language-model assistants are increasingly proposed for automated flight log analysis, we conducted a preliminary exploratory evaluation on 60 author-generated fault cases using four local models (3–4B parameters) configured both as single agents and as multi-agent review panels (Table 12). While a fixed deterministic rule achieved 75% accuracy (naming the true cause in 35 of 50 active cases and correctly abstaining on 10 no-cause cases) with 0% error (referring 15 cases to human operators), local language models produced substantial error rates (10–63% wrong), suffered from mode collapse or complete abstention on active causes, and proved highly vulnerable to consensus manipulation: in a worst-case sensitivity sweep, a single compromised reviewer systematically flipped the panel’s consensus decision in 45 to 56 of the 60 cases. In contrast, deterministic numeric telemetry extraction into code prevented direct prompt injection by construction across 40 hostile input strings. This exploratory comparison indicates that the tested small local models and review-panel configurations were unreliable on the 60 author-generated cases. Because the cases and fixed rule were developed by the same authors, the comparison is not an independent benchmark and should not be generalized to language models as a class or larger architectures. These preliminary results emphasize that multi-agent consensus voting without cryptographic proofs or fact-citation constraints cannot provide dependable safety assurance.</w:t>
+        <w:t xml:space="preserve">Because language-model assistants are increasingly proposed for automated flight log analysis, we conducted a preliminary exploratory evaluation on 60 author-generated fault cases using four local models (3–4B parameters) configured both as single agents and as multi-agent review panels (Table 13). While a fixed deterministic rule achieved 75% accuracy (naming the true cause in 35 of 50 active cases and correctly abstaining on 10 no-cause cases) with 0% error (referring 15 cases to human operators), local language models produced substantial error rates (10–63% wrong), suffered from mode collapse or complete abstention on active causes, and proved highly vulnerable to consensus manipulation: in a worst-case sensitivity sweep, a single compromised reviewer systematically flipped the panel’s consensus decision in 45 to 56 of the 60 cases. In contrast, deterministic numeric telemetry extraction into code prevented direct prompt injection by construction across 40 hostile input strings. This exploratory comparison indicates that the tested small local models and review-panel configurations were unreliable on the 60 author-generated cases. Because the cases and fixed rule were developed by the same authors, the comparison is not an independent benchmark and should not be generalized to language models as a class or larger architectures. These preliminary results emphasize that multi-agent consensus voting without cryptographic proofs or fact-citation constraints cannot provide dependable safety assurance.</w:t>
       </w:r>
     </w:p>
     <w:bookmarkStart w:id="70" w:name="_e9a1c7ab9cd062877714c77f2a5f253f301b820"/>
@@ -24232,7 +24812,7 @@
         <w:pStyle w:val="TableCaption"/>
       </w:pPr>
       <w:r>
-        <w:t xml:space="preserve">Table 12. Language-model review panels on 60 generated cases: counts of right (R), wrong (W), and deferred (Def) cases, with coverage (Cov., share of cases decided) and accuracy when answering (Acc.).</w:t>
+        <w:t xml:space="preserve">Table 13. Language-model review panels on 60 generated cases: counts of right (R), wrong (W), and deferred (Def) cases, with coverage (Cov., share of cases decided) and accuracy when answering (Acc.).</w:t>
       </w:r>
       <w:r>
         <w:t xml:space="preserve"> </w:t>
@@ -24252,7 +24832,7 @@
         <w:tblStyle w:val="Table"/>
         <w:tblW w:type="pct" w:w="5000"/>
         <w:tblLook w:firstRow="0" w:lastRow="0" w:firstColumn="0" w:lastColumn="0" w:noHBand="0" w:noVBand="0" w:val="0000"/>
-        <w:tblCaption w:val="Table 12. Language-model review panels on 60 generated cases: counts of right (R), wrong (W), and deferred (Def) cases, with coverage (Cov., share of cases decided) and accuracy when answering (Acc.). “Right” includes correctly leaving a no-cause case open. Single-agent gemma3 and phi4 answered only the 10 no-cause cases (0% coverage on active causes). Adversary flips show consensus changes caused by a single compromised reviewer in a worst-case sweep."/>
+        <w:tblCaption w:val="Table 13. Language-model review panels on 60 generated cases: counts of right (R), wrong (W), and deferred (Def) cases, with coverage (Cov., share of cases decided) and accuracy when answering (Acc.). “Right” includes correctly leaving a no-cause case open. Single-agent gemma3 and phi4 answered only the 10 no-cause cases (0% coverage on active causes). Adversary flips show consensus changes caused by a single compromised reviewer in a worst-case sweep."/>
         <w:tblBorders>
           <w:top w:val="single" w:sz="4" w:color="808080"/>
           <w:left w:val="single" w:sz="4" w:color="808080"/>
@@ -25234,7 +25814,7 @@
         </w:r>
       </w:hyperlink>
       <w:r>
-        <w:t xml:space="preserve">), an open-source, ground-side assurance tool for PX4 and ArduPilot fleets. The tool reads existing flight logs and configuration files without executing unverified autonomous decisions or contacting the aircraft in flight. Table 13 maps each empirical finding from Sections 3–5 directly to an assurance design implication.</w:t>
+        <w:t xml:space="preserve">), an open-source, ground-side assurance tool for PX4 and ArduPilot fleets. The tool reads existing flight logs and configuration files without executing unverified autonomous decisions or contacting the aircraft in flight. Table 14 maps each empirical finding from Sections 3–5 directly to an assurance design implication.</w:t>
       </w:r>
     </w:p>
     <w:p>
@@ -25271,7 +25851,7 @@
         <w:pStyle w:val="TableCaption"/>
       </w:pPr>
       <w:r>
-        <w:t xml:space="preserve">Table 13. From empirical findings to design implications in fleet assurance.</w:t>
+        <w:t xml:space="preserve">Table 14. From empirical findings to design implications in fleet assurance.</w:t>
       </w:r>
     </w:p>
     <w:tbl>
@@ -25279,7 +25859,7 @@
         <w:tblStyle w:val="Table"/>
         <w:tblW w:type="pct" w:w="5000"/>
         <w:tblLook w:firstRow="1" w:lastRow="0" w:firstColumn="0" w:lastColumn="0" w:noHBand="0" w:noVBand="0" w:val="0020"/>
-        <w:tblCaption w:val="Table 13. From empirical findings to design implications in fleet assurance."/>
+        <w:tblCaption w:val="Table 14. From empirical findings to design implications in fleet assurance."/>
         <w:tblBorders>
           <w:top w:val="single" w:sz="4" w:color="808080"/>
           <w:left w:val="single" w:sz="4" w:color="808080"/>
@@ -25426,7 +26006,7 @@
               <w:rPr>
                 <w:sz w:val="19"/>
               </w:rPr>
-              <w:t xml:space="preserve">Crash-window leakage was small for model AUC overall (0.014) but material among tilt-defined crashes (0.067 [0.015, 0.131]; §5.4), and present in one rule-based check (tuning sensitivity</w:t>
+              <w:t xml:space="preserve">Crash-window leakage was small for model AUC overall (0.014) but material among tilt-defined multicopter crashes (0.089 [0.019, 0.168]; §5.4), and present in one rule-based check (tuning sensitivity</w:t>
             </w:r>
             <w:r>
               <w:rPr>
@@ -25748,7 +26328,7 @@
         <w:pStyle w:val="FirstParagraph"/>
       </w:pPr>
       <w:r>
-        <w:t xml:space="preserve">To support drone safety regulators, accident investigators, and data-driven diagnostic tool developers in avoiding the leakage and confounding traps quantified in this study, Table 14 outlines a nine-item recommended reporting checklist. Each item pairs a methodological recommendation with its empirical rationale and the specific failure mode observed in our experiments when that control is omitted.</w:t>
+        <w:t xml:space="preserve">To support drone safety regulators, accident investigators, and data-driven diagnostic tool developers in avoiding the leakage and confounding traps quantified in this study, Table 15 outlines a nine-item recommended reporting checklist. Each item pairs a methodological recommendation with its empirical rationale and the specific failure mode observed in our experiments when that control is omitted.</w:t>
       </w:r>
     </w:p>
     <w:bookmarkStart w:id="75" w:name="_8dfd3cae62712a91b3c1ba079a4ea82fa2a3d98"/>
@@ -25757,7 +26337,7 @@
         <w:pStyle w:val="TableCaption"/>
       </w:pPr>
       <w:r>
-        <w:t xml:space="preserve">Table 14. Recommended checklist for leakage-controlled evaluation and reporting of UAV flight-log diagnostic models and accident analytics.</w:t>
+        <w:t xml:space="preserve">Table 15. Recommended checklist for leakage-controlled evaluation and reporting of UAV flight-log diagnostic models and accident analytics.</w:t>
       </w:r>
     </w:p>
     <w:tbl>
@@ -25765,7 +26345,7 @@
         <w:tblStyle w:val="Table"/>
         <w:tblW w:type="pct" w:w="5000"/>
         <w:tblLook w:firstRow="1" w:lastRow="0" w:firstColumn="0" w:lastColumn="0" w:noHBand="0" w:noVBand="0" w:val="0020"/>
-        <w:tblCaption w:val="Table 14. Recommended checklist for leakage-controlled evaluation and reporting of UAV flight-log diagnostic models and accident analytics."/>
+        <w:tblCaption w:val="Table 15. Recommended checklist for leakage-controlled evaluation and reporting of UAV flight-log diagnostic models and accident analytics."/>
         <w:tblBorders>
           <w:top w:val="single" w:sz="4" w:color="808080"/>
           <w:left w:val="single" w:sz="4" w:color="808080"/>
@@ -25921,7 +26501,7 @@
               <w:rPr>
                 <w:sz w:val="19"/>
               </w:rPr>
-              <w:t xml:space="preserve">Small for model AUC overall (Shapley share 0.014 [0.007, 0.023]) but material among tilt-defined crashes (0.067 [0.015, 0.131]; §5.4); present in one rule-based check (tuning</w:t>
+              <w:t xml:space="preserve">Small for model AUC overall (Shapley share 0.014 [0.007, 0.023]) but material among tilt-defined multicopter crashes (0.089 [0.019, 0.168]; §5.4); present in one rule-based check (tuning</w:t>
             </w:r>
             <w:r>
               <w:rPr>
@@ -25991,7 +26571,7 @@
               <w:rPr>
                 <w:sz w:val="19"/>
               </w:rPr>
-              <w:t xml:space="preserve">). Confirm the crash moment before cutting.</w:t>
+              <w:t xml:space="preserve">). Confirm the crash moment before cutting; apply tilt rules to multicopters only.</w:t>
             </w:r>
           </w:p>
         </w:tc>
@@ -26115,7 +26695,7 @@
               <w:rPr>
                 <w:sz w:val="19"/>
               </w:rPr>
-              <w:t xml:space="preserve">flights in this archive were flown after the crash; without them the within-drone model gave at most a weak signal (0.582 [0.525, 0.660]; §5.3).</w:t>
+              <w:t xml:space="preserve">flights in this archive were flown after the crash; without them the within-drone model gave at most a weak signal (0.582 [0.525, 0.660]; §5.6).</w:t>
             </w:r>
           </w:p>
         </w:tc>
@@ -26234,7 +26814,7 @@
               <w:rPr>
                 <w:sz w:val="19"/>
               </w:rPr>
-              <w:t xml:space="preserve">, +0.184]; §5.3).</w:t>
+              <w:t xml:space="preserve">, +0.184]; §5.6).</w:t>
             </w:r>
           </w:p>
         </w:tc>
@@ -26730,280 +27310,10 @@
         <w:t xml:space="preserve"> </w:t>
       </w:r>
       <w:r>
-        <w:t xml:space="preserve">While cross-sectional models on the discovery sample showed high apparent separation (AUC 0.88), grouping folds by vehicle lowered it to 0.826 and crash-window removal changed little (Table 8, regenerated). The factorial audit (§5.5) shows why the picture depends on the sample: once comparison drones contribute several flights, grouping folds by vehicle becomes the only material source of optimism (0.062 [0.034, 0.087] of a 0.212 drop). Which crashes are scored and which normal flights they are compared with each carried a similar share, but neither could be isolated with 60–67 crashes. Separation against other aircraft persisted (0.67); only comparison with the same drone’s own earlier flights brought it to chance. On the 372 flights of the multi-flight cohort, cross-sectional and within-drone evaluation gave overlapping intervals (0.546 and 0.559, regenerated), indicating that uncalipered matching yields no clear precursor signal in this cohort. A GPS-time audit then showed that 85 of 210 crash-day earlier flights had been flown after the crash. Without them the within-drone model gave 0.582 [0.525, 0.660] on stored features but 0.507 [0.436, 0.582] on recomputed features, so any within-drone signal is weak and pipeline-dependent. A duration-caliper lift reported in earlier versions (</w:t>
-      </w:r>
-      <m:oMath>
-        <m:r>
-          <m:rPr>
-            <m:sty m:val="p"/>
-          </m:rPr>
-          <m:t>+</m:t>
-        </m:r>
-        <m:r>
-          <m:t>0.110</m:t>
-        </m:r>
-      </m:oMath>
-      <w:r>
-        <w:t xml:space="preserve"> </w:t>
-      </w:r>
-      <w:r>
-        <w:t xml:space="preserve">[+0.028, +0.205]) is no longer clearly distinguishable from zero (</w:t>
-      </w:r>
-      <m:oMath>
-        <m:r>
-          <m:rPr>
-            <m:sty m:val="p"/>
-          </m:rPr>
-          <m:t>+</m:t>
-        </m:r>
-        <m:r>
-          <m:t>0.086</m:t>
-        </m:r>
-      </m:oMath>
-      <w:r>
-        <w:t xml:space="preserve"> </w:t>
-      </w:r>
-      <w:r>
-        <w:t xml:space="preserve">[</w:t>
-      </w:r>
-      <m:oMath>
-        <m:r>
-          <m:rPr>
-            <m:sty m:val="p"/>
-          </m:rPr>
-          <m:t>−</m:t>
-        </m:r>
-        <m:r>
-          <m:t>0.064</m:t>
-        </m:r>
-      </m:oMath>
-      <w:r>
-        <w:t xml:space="preserve">, +0.184], 24 airframes); the interval still includes the earlier estimate, and with 24 airframes only a lift of about 0.18 could be detected, so the result is inconclusive rather than null; we withdraw the claim that duration differences mask precursors. Diagnostic checks were also</w:t>
-      </w:r>
-      <w:r>
-        <w:t xml:space="preserve"> </w:t>
-      </w:r>
-      <w:r>
-        <w:rPr>
-          <w:i/>
-          <w:iCs/>
-        </w:rPr>
-        <w:t xml:space="preserve">consistent with</w:t>
-      </w:r>
-      <w:r>
-        <w:t xml:space="preserve"> </w:t>
-      </w:r>
-      <w:r>
-        <w:t xml:space="preserve">crash-window leakage: specifically, tuning fault detection</w:t>
-      </w:r>
-      <w:r>
-        <w:t xml:space="preserve"> </w:t>
-      </w:r>
-      <w:r>
-        <w:t xml:space="preserve">fell from 7/9 to 1/9 sensitivity (unadjusted</w:t>
-      </w:r>
-      <w:r>
-        <w:t xml:space="preserve"> </w:t>
-      </w:r>
-      <m:oMath>
-        <m:r>
-          <m:t>p</m:t>
-        </m:r>
-        <m:r>
-          <m:rPr>
-            <m:sty m:val="p"/>
-          </m:rPr>
-          <m:t>=</m:t>
-        </m:r>
-        <m:r>
-          <m:t>0.031</m:t>
-        </m:r>
-      </m:oMath>
-      <w:r>
-        <w:t xml:space="preserve"> </w:t>
-      </w:r>
-      <w:r>
-        <w:t xml:space="preserve">on paired logs) when the final 10 s were removed, accompanied by</w:t>
-      </w:r>
-      <w:r>
-        <w:t xml:space="preserve"> </w:t>
-      </w:r>
-      <w:r>
-        <w:t xml:space="preserve">a drop in normal-flight firing from 13% to 5% which suggests that shorter windows reduce trigger exposure alongside</w:t>
-      </w:r>
-      <w:r>
-        <w:t xml:space="preserve"> </w:t>
-      </w:r>
-      <w:r>
-        <w:t xml:space="preserve">leakage. Furthermore, this finding is exploratory, does not survive Bonferroni correction over five checks (</w:t>
-      </w:r>
-      <m:oMath>
-        <m:r>
-          <m:t>p</m:t>
-        </m:r>
-        <m:r>
-          <m:rPr>
-            <m:sty m:val="p"/>
-          </m:rPr>
-          <m:t>≈</m:t>
-        </m:r>
-        <m:r>
-          <m:t>0.16</m:t>
-        </m:r>
-      </m:oMath>
-      <w:r>
-        <w:t xml:space="preserve">),</w:t>
-      </w:r>
-      <w:r>
-        <w:t xml:space="preserve"> </w:t>
-      </w:r>
-      <w:r>
-        <w:t xml:space="preserve">and the low baseline sensitivity of the remaining checks (</w:t>
-      </w:r>
-      <m:oMath>
-        <m:r>
-          <m:rPr>
-            <m:sty m:val="p"/>
-          </m:rPr>
-          <m:t>≤</m:t>
-        </m:r>
-        <m:r>
-          <m:t>25</m:t>
-        </m:r>
-        <m:r>
-          <m:rPr>
-            <m:sty m:val="p"/>
-          </m:rPr>
-          <m:t>%</m:t>
-        </m:r>
-      </m:oMath>
-      <w:r>
-        <w:t xml:space="preserve">) leaves open whether other physical failure modes</w:t>
-      </w:r>
-      <w:r>
-        <w:t xml:space="preserve"> </w:t>
-      </w:r>
-      <w:r>
-        <w:t xml:space="preserve">exhibit the same pattern. In interpreting feature signals, two operational definitions of motor saturation must be distinguished: the whole-flight cumulative summary feature used in predictive models (</w:t>
-      </w:r>
-      <m:oMath>
-        <m:r>
-          <m:rPr>
-            <m:scr m:val="monospace"/>
-            <m:sty m:val="p"/>
-          </m:rPr>
-          <m:t>sat_frac</m:t>
-        </m:r>
-      </m:oMath>
-      <w:r>
-        <w:t xml:space="preserve">, the fraction of armed flight time with any motor at</w:t>
-      </w:r>
-      <w:r>
-        <w:t xml:space="preserve"> </w:t>
-      </w:r>
-      <m:oMath>
-        <m:r>
-          <m:rPr>
-            <m:sty m:val="p"/>
-          </m:rPr>
-          <m:t>≥</m:t>
-        </m:r>
-        <m:r>
-          <m:t>95</m:t>
-        </m:r>
-        <m:r>
-          <m:rPr>
-            <m:sty m:val="p"/>
-          </m:rPr>
-          <m:t>%</m:t>
-        </m:r>
-      </m:oMath>
-      <w:r>
-        <w:t xml:space="preserve"> </w:t>
-      </w:r>
-      <w:r>
-        <w:t xml:space="preserve">authority), versus the discrete threshold check used in the attribution rule (motor output at</w:t>
-      </w:r>
-      <w:r>
-        <w:t xml:space="preserve"> </w:t>
-      </w:r>
-      <m:oMath>
-        <m:r>
-          <m:rPr>
-            <m:sty m:val="p"/>
-          </m:rPr>
-          <m:t>≥</m:t>
-        </m:r>
-        <m:r>
-          <m:t>95</m:t>
-        </m:r>
-        <m:r>
-          <m:rPr>
-            <m:sty m:val="p"/>
-          </m:rPr>
-          <m:t>%</m:t>
-        </m:r>
-      </m:oMath>
-      <w:r>
-        <w:t xml:space="preserve"> </w:t>
-      </w:r>
-      <w:r>
-        <w:t xml:space="preserve">authority for</w:t>
-      </w:r>
-      <w:r>
-        <w:t xml:space="preserve"> </w:t>
-      </w:r>
-      <m:oMath>
-        <m:r>
-          <m:rPr>
-            <m:sty m:val="p"/>
-          </m:rPr>
-          <m:t>≥</m:t>
-        </m:r>
-        <m:r>
-          <m:t>1.0</m:t>
-        </m:r>
-      </m:oMath>
-      <w:r>
-        <w:t xml:space="preserve"> s cumulative during the final 10 s before</w:t>
-      </w:r>
-      <w:r>
-        <w:t xml:space="preserve"> </w:t>
-      </w:r>
-      <m:oMath>
-        <m:sSub>
-          <m:e>
-            <m:r>
-              <m:t>t</m:t>
-            </m:r>
-          </m:e>
-          <m:sub>
-            <m:r>
-              <m:t>c</m:t>
-            </m:r>
-          </m:sub>
-        </m:sSub>
-      </m:oMath>
-      <w:r>
-        <w:t xml:space="preserve">). Furthermore, while crash-flight analysis windows terminate at impact or tilt, normal-flight comparison windows end at disarm (encompassing the complete descent, flare, touchdown, and landing sequence), which contributes to duration differences and baseline feature exposure. Regardless of the precise mechanism, we recommend that diagnostic evaluations remove the crash window,</w:t>
-      </w:r>
-      <w:r>
-        <w:t xml:space="preserve"> </w:t>
-      </w:r>
-      <w:r>
-        <w:t xml:space="preserve">report flight duration (whose effect we could not isolate), and compare against an aircraft’s own operating baseline before claiming pre-crash anticipation.</w:t>
-      </w:r>
-    </w:p>
-    <w:p>
-      <w:pPr>
-        <w:pStyle w:val="BodyText"/>
-      </w:pPr>
-      <w:r>
-        <w:rPr>
-          <w:b/>
-          <w:bCs/>
-        </w:rPr>
-        <w:t xml:space="preserve">Implications for work on public log archives</w:t>
+        <w:t xml:space="preserve">While cross-sectional models on the discovery sample showed high apparent separation (AUC 0.88), grouping folds by vehicle lowered it to 0.826 and crash-window removal changed little (Table 8, regenerated).</w:t>
+      </w:r>
+      <w:r>
+        <w:t xml:space="preserve"> </w:t>
       </w:r>
       <m:oMath>
         <m:sSup>
@@ -27023,6 +27333,299 @@
         </m:sSup>
       </m:oMath>
       <w:r>
+        <w:t xml:space="preserve">That small window effect hides a subgroup: among multicopter crashes whose log shows a crash-like tilt, cutting the last 10 s mattered (0.089 [0.019, 0.168], 37 crashes; post hoc), and more so without tilt and stick features (0.131), so the effect is not just the defining tilt being removed. The overall figure is small partly because most crash logs show no clear crash (§5.4). The factorial audit (§5.5) shows why the picture depends on the sample: once comparison drones contribute several flights, grouping folds by vehicle becomes the only material source of optimism (0.062 [0.034, 0.087] of a 0.212 drop). Which crashes are scored and which normal flights they are compared with each carried a similar share, but neither could be isolated with 60–67 crashes. Separation against other aircraft persisted (0.67); only comparison with the same drone’s own earlier flights brought it to chance. On the 372 flights of the multi-flight cohort, cross-sectional and within-drone evaluation gave overlapping intervals (0.546 and 0.559, regenerated), indicating that uncalipered matching yields no clear precursor signal in this cohort. A GPS-time audit then showed that 85 of 210 crash-day earlier flights had been flown after the crash. Without them the within-drone model gave 0.582 [0.525, 0.660] on stored features but 0.507 [0.436, 0.582] on recomputed features, so any within-drone signal is weak and pipeline-dependent. A duration-caliper lift reported in earlier versions (</w:t>
+      </w:r>
+      <m:oMath>
+        <m:r>
+          <m:rPr>
+            <m:sty m:val="p"/>
+          </m:rPr>
+          <m:t>+</m:t>
+        </m:r>
+        <m:r>
+          <m:t>0.110</m:t>
+        </m:r>
+      </m:oMath>
+      <w:r>
+        <w:t xml:space="preserve"> </w:t>
+      </w:r>
+      <w:r>
+        <w:t xml:space="preserve">[+0.028, +0.205]) is no longer clearly distinguishable from zero (</w:t>
+      </w:r>
+      <m:oMath>
+        <m:r>
+          <m:rPr>
+            <m:sty m:val="p"/>
+          </m:rPr>
+          <m:t>+</m:t>
+        </m:r>
+        <m:r>
+          <m:t>0.086</m:t>
+        </m:r>
+      </m:oMath>
+      <w:r>
+        <w:t xml:space="preserve"> </w:t>
+      </w:r>
+      <w:r>
+        <w:t xml:space="preserve">[</w:t>
+      </w:r>
+      <m:oMath>
+        <m:r>
+          <m:rPr>
+            <m:sty m:val="p"/>
+          </m:rPr>
+          <m:t>−</m:t>
+        </m:r>
+        <m:r>
+          <m:t>0.064</m:t>
+        </m:r>
+      </m:oMath>
+      <w:r>
+        <w:t xml:space="preserve">, +0.184], 24 airframes); the interval still includes the earlier estimate, and with 24 airframes only a lift of about 0.18 could be detected, so the result is inconclusive rather than null; we withdraw the claim that duration differences mask precursors. Diagnostic checks were also</w:t>
+      </w:r>
+      <w:r>
+        <w:t xml:space="preserve"> </w:t>
+      </w:r>
+      <w:r>
+        <w:rPr>
+          <w:i/>
+          <w:iCs/>
+        </w:rPr>
+        <w:t xml:space="preserve">consistent with</w:t>
+      </w:r>
+      <w:r>
+        <w:t xml:space="preserve"> </w:t>
+      </w:r>
+      <w:r>
+        <w:t xml:space="preserve">crash-window leakage: specifically, tuning fault detection</w:t>
+      </w:r>
+      <w:r>
+        <w:t xml:space="preserve"> </w:t>
+      </w:r>
+      <w:r>
+        <w:t xml:space="preserve">fell from 7/9 to 1/9 sensitivity (unadjusted</w:t>
+      </w:r>
+      <w:r>
+        <w:t xml:space="preserve"> </w:t>
+      </w:r>
+      <m:oMath>
+        <m:r>
+          <m:t>p</m:t>
+        </m:r>
+        <m:r>
+          <m:rPr>
+            <m:sty m:val="p"/>
+          </m:rPr>
+          <m:t>=</m:t>
+        </m:r>
+        <m:r>
+          <m:t>0.031</m:t>
+        </m:r>
+      </m:oMath>
+      <w:r>
+        <w:t xml:space="preserve"> </w:t>
+      </w:r>
+      <w:r>
+        <w:t xml:space="preserve">on paired logs) when the final 10 s were removed, accompanied by</w:t>
+      </w:r>
+      <w:r>
+        <w:t xml:space="preserve"> </w:t>
+      </w:r>
+      <w:r>
+        <w:t xml:space="preserve">a drop in normal-flight firing from 13% to 5% which suggests that shorter windows reduce trigger exposure alongside</w:t>
+      </w:r>
+      <w:r>
+        <w:t xml:space="preserve"> </w:t>
+      </w:r>
+      <w:r>
+        <w:t xml:space="preserve">leakage. Furthermore, this finding is exploratory, does not survive Bonferroni correction over five checks (</w:t>
+      </w:r>
+      <m:oMath>
+        <m:r>
+          <m:t>p</m:t>
+        </m:r>
+        <m:r>
+          <m:rPr>
+            <m:sty m:val="p"/>
+          </m:rPr>
+          <m:t>≈</m:t>
+        </m:r>
+        <m:r>
+          <m:t>0.16</m:t>
+        </m:r>
+      </m:oMath>
+      <w:r>
+        <w:t xml:space="preserve">),</w:t>
+      </w:r>
+      <w:r>
+        <w:t xml:space="preserve"> </w:t>
+      </w:r>
+      <w:r>
+        <w:t xml:space="preserve">and the low baseline sensitivity of the remaining checks (</w:t>
+      </w:r>
+      <m:oMath>
+        <m:r>
+          <m:rPr>
+            <m:sty m:val="p"/>
+          </m:rPr>
+          <m:t>≤</m:t>
+        </m:r>
+        <m:r>
+          <m:t>25</m:t>
+        </m:r>
+        <m:r>
+          <m:rPr>
+            <m:sty m:val="p"/>
+          </m:rPr>
+          <m:t>%</m:t>
+        </m:r>
+      </m:oMath>
+      <w:r>
+        <w:t xml:space="preserve">) leaves open whether other physical failure modes</w:t>
+      </w:r>
+      <w:r>
+        <w:t xml:space="preserve"> </w:t>
+      </w:r>
+      <w:r>
+        <w:t xml:space="preserve">exhibit the same pattern. In interpreting feature signals, two operational definitions of motor saturation must be distinguished: the whole-flight cumulative summary feature used in predictive models (</w:t>
+      </w:r>
+      <m:oMath>
+        <m:r>
+          <m:rPr>
+            <m:scr m:val="monospace"/>
+            <m:sty m:val="p"/>
+          </m:rPr>
+          <m:t>sat_frac</m:t>
+        </m:r>
+      </m:oMath>
+      <w:r>
+        <w:t xml:space="preserve">, the fraction of armed flight time with any motor at</w:t>
+      </w:r>
+      <w:r>
+        <w:t xml:space="preserve"> </w:t>
+      </w:r>
+      <m:oMath>
+        <m:r>
+          <m:rPr>
+            <m:sty m:val="p"/>
+          </m:rPr>
+          <m:t>≥</m:t>
+        </m:r>
+        <m:r>
+          <m:t>95</m:t>
+        </m:r>
+        <m:r>
+          <m:rPr>
+            <m:sty m:val="p"/>
+          </m:rPr>
+          <m:t>%</m:t>
+        </m:r>
+      </m:oMath>
+      <w:r>
+        <w:t xml:space="preserve"> </w:t>
+      </w:r>
+      <w:r>
+        <w:t xml:space="preserve">authority), versus the discrete threshold check used in the attribution rule (motor output at</w:t>
+      </w:r>
+      <w:r>
+        <w:t xml:space="preserve"> </w:t>
+      </w:r>
+      <m:oMath>
+        <m:r>
+          <m:rPr>
+            <m:sty m:val="p"/>
+          </m:rPr>
+          <m:t>≥</m:t>
+        </m:r>
+        <m:r>
+          <m:t>95</m:t>
+        </m:r>
+        <m:r>
+          <m:rPr>
+            <m:sty m:val="p"/>
+          </m:rPr>
+          <m:t>%</m:t>
+        </m:r>
+      </m:oMath>
+      <w:r>
+        <w:t xml:space="preserve"> </w:t>
+      </w:r>
+      <w:r>
+        <w:t xml:space="preserve">authority for</w:t>
+      </w:r>
+      <w:r>
+        <w:t xml:space="preserve"> </w:t>
+      </w:r>
+      <m:oMath>
+        <m:r>
+          <m:rPr>
+            <m:sty m:val="p"/>
+          </m:rPr>
+          <m:t>≥</m:t>
+        </m:r>
+        <m:r>
+          <m:t>1.0</m:t>
+        </m:r>
+      </m:oMath>
+      <w:r>
+        <w:t xml:space="preserve"> s cumulative during the final 10 s before</w:t>
+      </w:r>
+      <w:r>
+        <w:t xml:space="preserve"> </w:t>
+      </w:r>
+      <m:oMath>
+        <m:sSub>
+          <m:e>
+            <m:r>
+              <m:t>t</m:t>
+            </m:r>
+          </m:e>
+          <m:sub>
+            <m:r>
+              <m:t>c</m:t>
+            </m:r>
+          </m:sub>
+        </m:sSub>
+      </m:oMath>
+      <w:r>
+        <w:t xml:space="preserve">). Furthermore, while crash-flight analysis windows terminate at impact or tilt, normal-flight comparison windows end at disarm (encompassing the complete descent, flare, touchdown, and landing sequence), which contributes to duration differences and baseline feature exposure. Regardless of the precise mechanism, we recommend that diagnostic evaluations remove the crash window,</w:t>
+      </w:r>
+      <w:r>
+        <w:t xml:space="preserve"> </w:t>
+      </w:r>
+      <w:r>
+        <w:t xml:space="preserve">report flight duration (whose effect we could not isolate), and compare against an aircraft’s own operating baseline before claiming pre-crash anticipation.</w:t>
+      </w:r>
+    </w:p>
+    <w:p>
+      <w:pPr>
+        <w:pStyle w:val="BodyText"/>
+      </w:pPr>
+      <w:r>
+        <w:rPr>
+          <w:b/>
+          <w:bCs/>
+        </w:rPr>
+        <w:t xml:space="preserve">Implications for work on public log archives</w:t>
+      </w:r>
+      <m:oMath>
+        <m:sSup>
+          <m:e>
+            <m:r>
+              <m:t>​</m:t>
+            </m:r>
+          </m:e>
+          <m:sup>
+            <m:r>
+              <m:rPr>
+                <m:sty m:val="p"/>
+              </m:rPr>
+              <m:t>†</m:t>
+            </m:r>
+          </m:sup>
+        </m:sSup>
+      </m:oMath>
+      <w:r>
         <w:rPr>
           <w:b/>
           <w:bCs/>
@@ -27053,7 +27656,33 @@
         <w:t xml:space="preserve">]</w:t>
       </w:r>
       <w:r>
-        <w:t xml:space="preserve">. Our audit suggests three checks before using its crash ratings as labels. First, most crash-rated multicopter logs show no crash-like event, so a crash moment computed from tilt, and any analysis window built on it, is reliable only for the minority that do. Second, the share of logs with such an event differs by responsibility label, so a pilot-versus-aircraft classifier trained on these labels could appear to work by detecting whether the recording reached the crash. Third, dates cannot order flights within a day, so</w:t>
+        <w:t xml:space="preserve">. Our audit suggests four checks before using its crash ratings as labels. First, most crash-rated multicopter logs show no crash-like event, so a crash moment computed from tilt, and any analysis window built on it, is reliable only for the minority that do. Second, the share of logs with such an event differs by responsibility label, so a pilot-versus-aircraft classifier trained on these labels could appear to work by detecting tilt-type crashes, whether because recordings of pilot-caused crashes stop earlier or because those crashes involve less tilt. Third, a tilt rule is a crash criterion only for multicopters: fixed-wing and VTOL logs bank beyond</w:t>
+      </w:r>
+      <w:r>
+        <w:t xml:space="preserve"> </w:t>
+      </w:r>
+      <m:oMath>
+        <m:sSup>
+          <m:e>
+            <m:r>
+              <m:t>60</m:t>
+            </m:r>
+          </m:e>
+          <m:sup>
+            <m:r>
+              <m:rPr>
+                <m:sty m:val="p"/>
+              </m:rPr>
+              <m:t>∘</m:t>
+            </m:r>
+          </m:sup>
+        </m:sSup>
+      </m:oMath>
+      <w:r>
+        <w:t xml:space="preserve"> </w:t>
+      </w:r>
+      <w:r>
+        <w:t xml:space="preserve">in normal flight, and older logs lack the flag that would exclude them, so vehicle type must come from the archive index. Fourth, dates cannot order flights within a day, so</w:t>
       </w:r>
       <w:r>
         <w:t xml:space="preserve"> </w:t>
@@ -28525,7 +29154,7 @@
         </m:sSup>
       </m:oMath>
       <w:r>
-        <w:t xml:space="preserve">; for the other 76,</w:t>
+        <w:t xml:space="preserve">, and 31 of those are fixed-wing or VTOL logs where the rule is not a crash criterion; for the other 76,</w:t>
       </w:r>
       <w:r>
         <w:t xml:space="preserve"> </w:t>
@@ -28571,7 +29200,7 @@
         <w:t xml:space="preserve"> </w:t>
       </w:r>
       <w:r>
-        <w:t xml:space="preserve">followed within 10 s by disarming or a landed or ground-contact flag, and 32 do not (clustering and refit audit). Two reviewers, one blind, agreed that the tilt-defined crash moment is mostly right (21 and 24 of 26) and the fallback moment mostly wrong (2 and 6 of 24;</w:t>
+        <w:t xml:space="preserve">followed within 10 s by disarming or a landed or ground-contact flag, and 32 do not (clustering and refit audit). Two reviewers, one blind, agreed that the tilt-defined crash moment is mostly right (21 and 24 of 26; all 15 multicopter ones for both) and the fallback moment mostly wrong (2 and 6 of 24;</w:t>
       </w:r>
       <w:r>
         <w:t xml:space="preserve"> </w:t>
@@ -28649,7 +29278,7 @@
         </m:sSup>
       </m:oMath>
       <w:r>
-        <w:t xml:space="preserve">The index date matched the GPS UTC date for 365 of 456 flights with a GPS time (80%; 90% within one day), so it is mostly the flight date, and none of 221 flights dated before the crash day started after the crash by GPS time; the problem is confined to same-day flights, which a date cannot order. GPS times showed that 47 of 95 crash-day exposure flights in the between-drone sample, and 85 of 210 crash-day earlier flights in the within-drone sample, were flown after the crash. The between-drone result and the within-drone rank tests held without them; the caliper lift did not, and the within-drone model result depends on the feature pipeline (§5.3). Flights on earlier dates are ordered by the index date only, and 18 crash-day flights had no usable GPS time.</w:t>
+        <w:t xml:space="preserve">The index date matched the GPS UTC date for 365 of 456 flights with a GPS time (80%; 90% within one day), so it is mostly the flight date, and none of 221 flights dated before the crash day started after the crash by GPS time; the problem is confined to same-day flights, which a date cannot order. GPS times showed that 47 of 95 crash-day exposure flights in the between-drone sample, and 85 of 210 crash-day earlier flights in the within-drone sample, were flown after the crash. The between-drone result and the within-drone rank tests held without them; the caliper lift did not, and the within-drone model result depends on the feature pipeline (§5.6). Flights on earlier dates are ordered by the index date only, and 18 crash-day flights had no usable GPS time.</w:t>
       </w:r>
     </w:p>
     <w:p>
@@ -28679,7 +29308,7 @@
         <w:t xml:space="preserve"> </w:t>
       </w:r>
       <w:r>
-        <w:t xml:space="preserve">in Table 11 have very small sample sizes (</w:t>
+        <w:t xml:space="preserve">in Table 12 have very small sample sizes (</w:t>
       </w:r>
       <m:oMath>
         <m:r>
@@ -29078,7 +29707,7 @@
         <w:pStyle w:val="BodyText"/>
       </w:pPr>
       <w:r>
-        <w:t xml:space="preserve">Much of what looks like crash anticipation comes from how an evaluation is built. In a factorial audit of 32 settings, the apparent AUC of 0.88 fell by 0.21 across settings, of which 0.06 came from grouping folds by vehicle, the only factor that could be isolated; and crash-window leakage was small overall but material among the minority of crashes whose log shows a crash-like tilt. The archive’s labels are also weaker than assumed: most crash-rated multicopter logs show no crash-like tilt, where the computed crash moment is usually wrong, and pilot-rated logs show one less often than aircraft-rated ones. Ordering flights by archive date failed for same-day flights: by GPS time, 44–55% of dated crash-day</w:t>
+        <w:t xml:space="preserve">Part of what looks like crash anticipation comes from how an evaluation is built. In a factorial audit of 32 settings, the apparent AUC of 0.88 fell by 0.21 across settings, of which 0.06 came from grouping folds by vehicle, the only factor that could be isolated; and crash-window leakage was small overall but material among the minority of crashes whose log shows a crash-like tilt. The archive’s labels are also weaker than assumed: most crash-rated multicopter logs show no crash-like tilt, where the computed crash moment is usually wrong, and pilot-rated logs show one less often than aircraft-rated ones. Ordering flights by archive date failed for same-day flights: by GPS time, 44–55% of dated crash-day</w:t>
       </w:r>
       <w:r>
         <w:t xml:space="preserve"> </w:t>
@@ -29312,7 +29941,7 @@
         <w:t xml:space="preserve">]</w:t>
       </w:r>
       <w:r>
-        <w:t xml:space="preserve">, Table A.15 documents each such analysis, its motivation, key results, git commit hash, first archive date in Software Heritage, and analysis run date. They are marked with</w:t>
+        <w:t xml:space="preserve">, Table A.16 documents each such analysis, its motivation, key results, git commit hash, first archive date in Software Heritage, and analysis run date. They are marked with</w:t>
       </w:r>
       <w:r>
         <w:t xml:space="preserve"> </w:t>
@@ -29338,7 +29967,7 @@
         <w:t xml:space="preserve"> </w:t>
       </w:r>
       <w:r>
-        <w:t xml:space="preserve">throughout the text and tables. None of these exploratory additions altered the conclusions of the pre-declared tests; rather, they established empirical bounds on between-airframe confounding, tested alternative architectures, and quantified operational fleet screening performance.</w:t>
+        <w:t xml:space="preserve">throughout the text and tables. None of these exploratory additions altered the conclusions of the pre-declared tests. They bounded between-airframe confounding, tested other model types, quantified fleet screening, and audited the crash records themselves: the crash moment, the uploader labels against log content, and the order of flights.</w:t>
       </w:r>
     </w:p>
     <w:bookmarkStart w:id="84" w:name="_fb475224272a447d57b77f14dfc8774bb10ba7c"/>
@@ -31937,7 +32566,7 @@
               <w:rPr>
                 <w:sz w:val="19"/>
               </w:rPr>
-              <w:t xml:space="preserve">BA declines smoothly from 0.460 (</w:t>
+              <w:t xml:space="preserve">Feature-based proxy of the rule: BA 0.46 [0.38, 0.54] (</w:t>
             </w:r>
             <m:oMath>
               <m:r>
@@ -31957,67 +32586,7 @@
               <w:rPr>
                 <w:sz w:val="19"/>
               </w:rPr>
-              <w:t xml:space="preserve"> s) to 0.454 (</w:t>
-            </w:r>
-            <m:oMath>
-              <m:r>
-                <m:t>m</m:t>
-              </m:r>
-              <m:r>
-                <m:rPr>
-                  <m:sty m:val="p"/>
-                </m:rPr>
-                <m:t>=</m:t>
-              </m:r>
-              <m:r>
-                <m:t>5</m:t>
-              </m:r>
-            </m:oMath>
-            <w:r>
-              <w:rPr>
-                <w:sz w:val="19"/>
-              </w:rPr>
-              <w:t xml:space="preserve">), 0.393 (</w:t>
-            </w:r>
-            <m:oMath>
-              <m:r>
-                <m:t>m</m:t>
-              </m:r>
-              <m:r>
-                <m:rPr>
-                  <m:sty m:val="p"/>
-                </m:rPr>
-                <m:t>=</m:t>
-              </m:r>
-              <m:r>
-                <m:t>10</m:t>
-              </m:r>
-            </m:oMath>
-            <w:r>
-              <w:rPr>
-                <w:sz w:val="19"/>
-              </w:rPr>
-              <w:t xml:space="preserve">), 0.371 (</w:t>
-            </w:r>
-            <m:oMath>
-              <m:r>
-                <m:t>m</m:t>
-              </m:r>
-              <m:r>
-                <m:rPr>
-                  <m:sty m:val="p"/>
-                </m:rPr>
-                <m:t>=</m:t>
-              </m:r>
-              <m:r>
-                <m:t>20</m:t>
-              </m:r>
-            </m:oMath>
-            <w:r>
-              <w:rPr>
-                <w:sz w:val="19"/>
-              </w:rPr>
-              <w:t xml:space="preserve">), 0.350 (</w:t>
+              <w:t xml:space="preserve"> s) to 0.45, 0.39, 0.37, 0.35 [0.25, 0.45] (</w:t>
             </w:r>
             <m:oMath>
               <m:r>
@@ -32037,7 +32606,7 @@
               <w:rPr>
                 <w:sz w:val="19"/>
               </w:rPr>
-              <w:t xml:space="preserve">)</w:t>
+              <w:t xml:space="preserve">); below 0.5 from low pilot recall, not undecided cases</w:t>
             </w:r>
           </w:p>
         </w:tc>
@@ -32344,7 +32913,7 @@
               <w:rPr>
                 <w:sz w:val="19"/>
               </w:rPr>
-              <w:t xml:space="preserve">Crash-moment review</w:t>
+              <w:t xml:space="preserve">Aircraft-type and label-link audit</w:t>
             </w:r>
             <m:oMath>
               <m:sSup>
@@ -32377,6 +32946,163 @@
               <w:rPr>
                 <w:sz w:val="19"/>
               </w:rPr>
+              <w:t xml:space="preserve">Round-19 review: tilt set mixed aircraft types; mechanical-effect concern; tilt as label proxy; multi-cue detector</w:t>
+            </w:r>
+          </w:p>
+        </w:tc>
+        <w:tc>
+          <w:tcPr/>
+          <w:p>
+            <w:pPr>
+              <w:pStyle w:val="Compact"/>
+              <w:spacing w:line="240" w:lineRule="auto"/>
+              <w:jc w:val="left"/>
+            </w:pPr>
+            <w:r>
+              <w:rPr>
+                <w:sz w:val="19"/>
+              </w:rPr>
+              <w:t xml:space="preserve">Multicopter tilt-defined effect 0.089 [0.019, 0.168], 0.131 [0.042, 0.226] without tilt/stick; all 15 reviewed multicopter tilt moments correct for both reviewers; tilt-alone AUC 0.53; within-stratum attribution 0.63 (</w:t>
+            </w:r>
+            <m:oMath>
+              <m:r>
+                <m:t>p</m:t>
+              </m:r>
+              <m:r>
+                <m:rPr>
+                  <m:sty m:val="p"/>
+                </m:rPr>
+                <m:t>=</m:t>
+              </m:r>
+              <m:r>
+                <m:t>0.10</m:t>
+              </m:r>
+            </m:oMath>
+            <w:r>
+              <w:rPr>
+                <w:sz w:val="19"/>
+              </w:rPr>
+              <w:t xml:space="preserve">) and 0.62 (</w:t>
+            </w:r>
+            <m:oMath>
+              <m:r>
+                <m:t>p</m:t>
+              </m:r>
+              <m:r>
+                <m:rPr>
+                  <m:sty m:val="p"/>
+                </m:rPr>
+                <m:t>=</m:t>
+              </m:r>
+              <m:r>
+                <m:t>0.11</m:t>
+              </m:r>
+            </m:oMath>
+            <w:r>
+              <w:rPr>
+                <w:sz w:val="19"/>
+              </w:rPr>
+              <w:t xml:space="preserve">); rule proxy BA 0.46 [0.38, 0.54]; multi-cue detector failed gate (</w:t>
+            </w:r>
+            <m:oMath>
+              <m:r>
+                <m:t>κ</m:t>
+              </m:r>
+            </m:oMath>
+            <w:r>
+              <w:rPr>
+                <w:sz w:val="19"/>
+              </w:rPr>
+              <w:t xml:space="preserve"> </w:t>
+            </w:r>
+            <w:r>
+              <w:rPr>
+                <w:sz w:val="19"/>
+              </w:rPr>
+              <w:t xml:space="preserve">0.82 and 0.32; 32% false alarms)</w:t>
+            </w:r>
+          </w:p>
+        </w:tc>
+        <w:tc>
+          <w:tcPr/>
+          <w:p>
+            <w:pPr>
+              <w:pStyle w:val="Compact"/>
+              <w:spacing w:line="240" w:lineRule="auto"/>
+              <w:jc w:val="left"/>
+            </w:pPr>
+            <w:r>
+              <w:rPr>
+                <w:rStyle w:val="VerbatimChar"/>
+                <w:sz w:val="19"/>
+              </w:rPr>
+              <w:t xml:space="preserve">9650a69</w:t>
+            </w:r>
+          </w:p>
+        </w:tc>
+        <w:tc>
+          <w:tcPr/>
+          <w:p>
+            <w:pPr>
+              <w:pStyle w:val="Compact"/>
+              <w:spacing w:line="240" w:lineRule="auto"/>
+              <w:jc w:val="left"/>
+            </w:pPr>
+            <w:r>
+              <w:rPr>
+                <w:sz w:val="19"/>
+              </w:rPr>
+              <w:t xml:space="preserve">2026-10-29</w:t>
+            </w:r>
+          </w:p>
+        </w:tc>
+      </w:tr>
+      <w:tr>
+        <w:tc>
+          <w:tcPr/>
+          <w:p>
+            <w:pPr>
+              <w:pStyle w:val="Compact"/>
+              <w:spacing w:line="240" w:lineRule="auto"/>
+              <w:jc w:val="left"/>
+            </w:pPr>
+            <w:r>
+              <w:rPr>
+                <w:sz w:val="19"/>
+              </w:rPr>
+              <w:t xml:space="preserve">Crash-moment review</w:t>
+            </w:r>
+            <m:oMath>
+              <m:sSup>
+                <m:e>
+                  <m:r>
+                    <m:t>​</m:t>
+                  </m:r>
+                </m:e>
+                <m:sup>
+                  <m:r>
+                    <m:rPr>
+                      <m:sty m:val="p"/>
+                    </m:rPr>
+                    <m:t>†</m:t>
+                  </m:r>
+                </m:sup>
+              </m:sSup>
+            </m:oMath>
+          </w:p>
+        </w:tc>
+        <w:tc>
+          <w:tcPr/>
+          <w:p>
+            <w:pPr>
+              <w:pStyle w:val="Compact"/>
+              <w:spacing w:line="240" w:lineRule="auto"/>
+              <w:jc w:val="left"/>
+            </w:pPr>
+            <w:r>
+              <w:rPr>
+                <w:sz w:val="19"/>
+              </w:rPr>
               <w:t xml:space="preserve">Check</w:t>
             </w:r>
             <w:r>
@@ -32471,7 +33197,7 @@
               <w:rPr>
                 <w:sz w:val="19"/>
               </w:rPr>
-              <w:t xml:space="preserve">; tilt-defined correct 21 and 24 of 26, fallback 2 and 6 of 24; whether fallback logs contain the crash</w:t>
+              <w:t xml:space="preserve">; tilt-defined correct 21 and 24 of 26 (multicopters 15 of 15 for both), fallback 2 and 6 of 24; whether fallback logs contain the crash</w:t>
             </w:r>
             <w:r>
               <w:rPr>

</xml_diff>

<commit_message>
Paper: Add RflyMAD injected-fault control
New section on 488 real flights with firmware-injected faults of known
onset (declared a9877c1, results 95fa814): the declared rule recognised
3% of motor faults; study features separated faulty from fault-free
flights at AUC 0.86 before injection. Abstract, contributions, summary
table, Discussion, checklist (pre-onset baseline), Threats, Conclusion
and Appendix A updated; HANDOFF and review log.

Co-Authored-By: Claude Opus 5.5 <noreply@anthropic.com>
</commit_message>
<xml_diff>
--- a/docs/paper/submission/manuscript.docx
+++ b/docs/paper/submission/manuscript.docx
@@ -136,7 +136,7 @@
         </m:sSup>
       </m:oMath>
       <w:r>
-        <w:t xml:space="preserve">Across 32 evaluation settings, apparent crash-detection AUC fell by 0.21 [0.06, 0.34], 0.06 of it from grouping folds by vehicle; crash-window leakage was small overall but material among multicopter crashes with a crash-like tilt (0.089 [0.019, 0.168]; 37 crashes, post hoc), even without tilt features.</w:t>
+        <w:t xml:space="preserve">Across 32 evaluation settings, apparent crash-detection AUC fell by 0.21 [0.06, 0.34], 0.06 of it from grouping folds by vehicle; crash-window leakage was small overall but material among multicopter crashes with a crash-like tilt (0.089 [0.019, 0.168]; post hoc).</w:t>
       </w:r>
       <w:r>
         <w:t xml:space="preserve"> </w:t>
@@ -159,19 +159,7 @@
         </m:sSup>
       </m:oMath>
       <w:r>
-        <w:t xml:space="preserve">Archive records are weaker than assumed: 61% of crash-rated multicopter logs show no crash-like tilt, where two reviewers found the computed crash moment mostly wrong; pilot-rated logs show one less often (23% against 45%; adjusted odds ratio 2.1 [1.2, 3.7]); and 44–55% of dated crash-day</w:t>
-      </w:r>
-      <w:r>
-        <w:t xml:space="preserve"> </w:t>
-      </w:r>
-      <w:r>
-        <w:t xml:space="preserve">“earlier”</w:t>
-      </w:r>
-      <w:r>
-        <w:t xml:space="preserve"> </w:t>
-      </w:r>
-      <w:r>
-        <w:t xml:space="preserve">flights were flown after the crash. Crash flights showed no warning against the drone’s own earlier flights;</w:t>
+        <w:t xml:space="preserve">Two external checks bound these results. On 488 real flights with injected faults, our features separated faulty from fault-free flights at AUC 0.86 before any fault was injected, and the rule called only 3% of motor faults aircraft-caused; a published log checker separated crashes from other drones’ flights but not causes.</w:t>
       </w:r>
       <w:r>
         <w:t xml:space="preserve"> </w:t>
@@ -194,7 +182,19 @@
         </m:sSup>
       </m:oMath>
       <w:r>
-        <w:t xml:space="preserve">a published open-source log checker re-evaluated under the same protocol showed the same pattern (AUC 0.72 against other drones’ flights without the last 10 s; attribution 0.52). Drones that later crashed vibrated more than matched drones (mean rank 0.67;</w:t>
+        <w:t xml:space="preserve">Archive records are weaker than assumed: 61% of crash-rated multicopter logs show no crash-like tilt; pilot-rated logs show one less often (adjusted odds ratio 2.1 [1.2, 3.7]); and 44–55% of dated crash-day</w:t>
+      </w:r>
+      <w:r>
+        <w:t xml:space="preserve"> </w:t>
+      </w:r>
+      <w:r>
+        <w:t xml:space="preserve">“earlier”</w:t>
+      </w:r>
+      <w:r>
+        <w:t xml:space="preserve"> </w:t>
+      </w:r>
+      <w:r>
+        <w:t xml:space="preserve">flights were flown after the crash. Crash flights showed no warning against the drone’s own earlier flights. Drones that later crashed vibrated more than matched drones (mean rank 0.67;</w:t>
       </w:r>
       <w:r>
         <w:t xml:space="preserve"> </w:t>
@@ -1014,6 +1014,42 @@
           <w:i/>
           <w:iCs/>
         </w:rPr>
+        <w:t xml:space="preserve">A known-cause control.</w:t>
+      </w:r>
+      <w:r>
+        <w:t xml:space="preserve"> </w:t>
+      </w:r>
+      <w:r>
+        <w:t xml:space="preserve">On 488 real flights with firmware-injected faults of known onset, our features separated faulty from fault-free flights at AUC 0.86 using only data from before the fault, and the declared rule called 3% of motor faults aircraft-caused: a high fault-versus-normal AUC can arise with no fault present, and the rule’s signs miss faults the controller absorbs (Section 5.9).</w:t>
+      </w:r>
+      <w:r>
+        <w:t xml:space="preserve"> </w:t>
+      </w:r>
+      <w:r>
+        <w:t xml:space="preserve">(vi) </w:t>
+      </w:r>
+      <m:oMath>
+        <m:sSup>
+          <m:e>
+            <m:r>
+              <m:t>​</m:t>
+            </m:r>
+          </m:e>
+          <m:sup>
+            <m:r>
+              <m:rPr>
+                <m:sty m:val="p"/>
+              </m:rPr>
+              <m:t>†</m:t>
+            </m:r>
+          </m:sup>
+        </m:sSup>
+      </m:oMath>
+      <w:r>
+        <w:rPr>
+          <w:i/>
+          <w:iCs/>
+        </w:rPr>
         <w:t xml:space="preserve">Flight order.</w:t>
       </w:r>
       <w:r>
@@ -1046,7 +1082,7 @@
         <w:t xml:space="preserve"> </w:t>
       </w:r>
       <w:r>
-        <w:t xml:space="preserve">(vi) With these features, rules and labels, logs did not separate pilot-caused from aircraft-caused crashes: the declared rule reached 0.47 balanced accuracy on held-out crashes, and exploratory models gave AUC 0.42–0.59 with approximate upper bounds</w:t>
+        <w:t xml:space="preserve">(vii) With these features, rules and labels, logs did not separate pilot-caused from aircraft-caused crashes: the declared rule reached 0.47 balanced accuracy on held-out crashes, and exploratory models gave AUC 0.42–0.59 with approximate upper bounds</w:t>
       </w:r>
       <w:r>
         <w:t xml:space="preserve"> </w:t>
@@ -1089,7 +1125,7 @@
         <w:t xml:space="preserve"> </w:t>
       </w:r>
       <w:r>
-        <w:t xml:space="preserve">(vii) Drones that later crashed vibrated more than matched drones on ordinary flights (mean rank 0.67;</w:t>
+        <w:t xml:space="preserve">(viii) Drones that later crashed vibrated more than matched drones on ordinary flights (mean rank 0.67;</w:t>
       </w:r>
       <w:r>
         <w:t xml:space="preserve"> </w:t>
@@ -1118,7 +1154,7 @@
         <w:t xml:space="preserve"> </w:t>
       </w:r>
       <w:r>
-        <w:t xml:space="preserve">(viii) A small validation set of real PX4 crash logs with independent expert diagnoses (148 threads coded twice,</w:t>
+        <w:t xml:space="preserve">(ix) A small validation set of real PX4 crash logs with independent expert diagnoses (148 threads coded twice,</w:t>
       </w:r>
       <w:r>
         <w:t xml:space="preserve"> </w:t>
@@ -2745,7 +2781,7 @@
         <w:t xml:space="preserve"> </w:t>
       </w:r>
       <w:r>
-        <w:t xml:space="preserve">the pilot in only 6.1% of all threads (9 of 148) and 8.6% of decided threads (9 of 105, Section 5.9). Across all</w:t>
+        <w:t xml:space="preserve">the pilot in only 6.1% of all threads (9 of 148) and 8.6% of decided threads (9 of 105, Section 5.10). Across all</w:t>
       </w:r>
       <w:r>
         <w:t xml:space="preserve"> </w:t>
@@ -3359,7 +3395,7 @@
         <w:t xml:space="preserve"> </w:t>
       </w:r>
       <w:r>
-        <w:t xml:space="preserve">PX4 forum (Section 5.9). The attribution rule was evaluated on 205 crashes (93 development and 112 held-out).</w:t>
+        <w:t xml:space="preserve">PX4 forum (Section 5.10). The attribution rule was evaluated on 205 crashes (93 development and 112 held-out).</w:t>
       </w:r>
       <w:r>
         <w:t xml:space="preserve"> </w:t>
@@ -9318,7 +9354,7 @@
         <w:t xml:space="preserve"> </w:t>
       </w:r>
       <w:r>
-        <w:t xml:space="preserve">provided in Section 5.10.</w:t>
+        <w:t xml:space="preserve">provided in Section 5.11.</w:t>
       </w:r>
     </w:p>
     <w:p>
@@ -9858,7 +9894,7 @@
               <w:rPr>
                 <w:sz w:val="19"/>
               </w:rPr>
-              <w:t xml:space="preserve">5.9</w:t>
+              <w:t xml:space="preserve">5.10</w:t>
             </w:r>
           </w:p>
         </w:tc>
@@ -10694,6 +10730,114 @@
               <w:rPr>
                 <w:sz w:val="19"/>
               </w:rPr>
+              <w:t xml:space="preserve">Injected faults (known cause)</w:t>
+            </w:r>
+          </w:p>
+        </w:tc>
+        <w:tc>
+          <w:tcPr/>
+          <w:p>
+            <w:pPr>
+              <w:pStyle w:val="Compact"/>
+              <w:spacing w:line="240" w:lineRule="auto"/>
+              <w:jc w:val="left"/>
+            </w:pPr>
+            <w:r>
+              <w:rPr>
+                <w:sz w:val="19"/>
+              </w:rPr>
+              <w:t xml:space="preserve">488 real RflyMAD flights: features AUC 0.86</w:t>
+            </w:r>
+            <w:r>
+              <w:rPr>
+                <w:sz w:val="19"/>
+              </w:rPr>
+              <w:t xml:space="preserve"> </w:t>
+            </w:r>
+            <w:r>
+              <w:rPr>
+                <w:i/>
+                <w:iCs/>
+                <w:sz w:val="19"/>
+              </w:rPr>
+              <w:t xml:space="preserve">before</w:t>
+            </w:r>
+            <w:r>
+              <w:rPr>
+                <w:sz w:val="19"/>
+              </w:rPr>
+              <w:t xml:space="preserve"> </w:t>
+            </w:r>
+            <w:r>
+              <w:rPr>
+                <w:sz w:val="19"/>
+              </w:rPr>
+              <w:t xml:space="preserve">the fault; rule called 3% of motor faults aircraft-caused (BA 0.50)</w:t>
+            </w:r>
+          </w:p>
+        </w:tc>
+        <w:tc>
+          <w:tcPr/>
+          <w:p>
+            <w:pPr>
+              <w:pStyle w:val="Compact"/>
+              <w:spacing w:line="240" w:lineRule="auto"/>
+              <w:jc w:val="left"/>
+            </w:pPr>
+            <w:r>
+              <w:rPr>
+                <w:sz w:val="19"/>
+              </w:rPr>
+              <w:t xml:space="preserve">Exploratory</w:t>
+            </w:r>
+          </w:p>
+        </w:tc>
+        <w:tc>
+          <w:tcPr/>
+          <w:p>
+            <w:pPr>
+              <w:pStyle w:val="Compact"/>
+              <w:spacing w:line="240" w:lineRule="auto"/>
+              <w:jc w:val="left"/>
+            </w:pPr>
+            <w:r>
+              <w:rPr>
+                <w:sz w:val="19"/>
+              </w:rPr>
+              <w:t xml:space="preserve">Separation without a fault; rule insensitive</w:t>
+            </w:r>
+          </w:p>
+        </w:tc>
+        <w:tc>
+          <w:tcPr/>
+          <w:p>
+            <w:pPr>
+              <w:pStyle w:val="Compact"/>
+              <w:spacing w:line="240" w:lineRule="auto"/>
+              <w:jc w:val="left"/>
+            </w:pPr>
+            <w:r>
+              <w:rPr>
+                <w:sz w:val="19"/>
+              </w:rPr>
+              <w:t xml:space="preserve">5.9</w:t>
+            </w:r>
+          </w:p>
+        </w:tc>
+      </w:tr>
+      <w:tr>
+        <w:tc>
+          <w:tcPr/>
+          <w:p>
+            <w:pPr>
+              <w:pStyle w:val="Compact"/>
+              <w:spacing w:line="240" w:lineRule="auto"/>
+              <w:jc w:val="left"/>
+            </w:pPr>
+            <w:r>
+              <w:rPr>
+                <w:sz w:val="19"/>
+              </w:rPr>
               <w:t xml:space="preserve">Language-model panels</w:t>
             </w:r>
           </w:p>
@@ -10758,7 +10902,7 @@
               <w:rPr>
                 <w:sz w:val="19"/>
               </w:rPr>
-              <w:t xml:space="preserve">5.10</w:t>
+              <w:t xml:space="preserve">5.11</w:t>
             </w:r>
           </w:p>
         </w:tc>
@@ -14667,7 +14811,7 @@
         <w:t xml:space="preserve"> </w:t>
       </w:r>
       <w:r>
-        <w:t xml:space="preserve">the last 10 s were removed (Section 5.9).</w:t>
+        <w:t xml:space="preserve">the last 10 s were removed (Section 5.10).</w:t>
       </w:r>
     </w:p>
     <w:p>
@@ -23063,7 +23207,7 @@
       <w:pPr>
         <w:pStyle w:val="Heading2"/>
       </w:pPr>
-      <w:bookmarkStart w:id="64" w:name="_440012d4f1ae87c72168f87fd4eb66e49627717"/>
+      <w:bookmarkStart w:id="64" w:name="_88fffead1741df09d844c4883a484ed85f08942"/>
       <w:r>
         <w:rPr>
           <w:rStyle w:val="SectionNumber"/>
@@ -23074,7 +23218,7 @@
         <w:tab/>
       </w:r>
       <w:r>
-        <w:t xml:space="preserve">Expert diagnoses (Q4)</w:t>
+        <w:t xml:space="preserve">A known-cause control: injected faults on real flights (exploratory)</w:t>
       </w:r>
       <w:bookmarkEnd w:id="64"/>
     </w:p>
@@ -23082,195 +23226,6 @@
       <w:pPr>
         <w:pStyle w:val="FirstParagraph"/>
       </w:pPr>
-      <w:r>
-        <w:t xml:space="preserve">Of 148 forum threads describing a real crash, the expert attributed it to the aircraft in 94 (64%), to the pilot in 9</w:t>
-      </w:r>
-      <w:r>
-        <w:t xml:space="preserve"> </w:t>
-      </w:r>
-      <w:r>
-        <w:t xml:space="preserve">(6%), to both in 2, and was unclear or gave no diagnosis in 43 (29%). Tuning or configuration was the cause named</w:t>
-      </w:r>
-      <w:r>
-        <w:t xml:space="preserve"> </w:t>
-      </w:r>
-      <w:r>
-        <w:t xml:space="preserve">most often (26 of 94; 14 of the 47 confirmed by the poster), followed by GPS, compass or estimator problems (18) and</w:t>
-      </w:r>
-      <w:r>
-        <w:t xml:space="preserve"> </w:t>
-      </w:r>
-      <w:r>
-        <w:t xml:space="preserve">motors, ESCs or propellers (16) (Fig. 6). Of 14 threads whose log carried an aircraft crash rating in the index, the</w:t>
-      </w:r>
-      <w:r>
-        <w:t xml:space="preserve"> </w:t>
-      </w:r>
-      <w:r>
-        <w:t xml:space="preserve">expert agreed in 11 and was unclear in 3; none attributed the crash to the pilot. Download attempts across all 148 threads</w:t>
-      </w:r>
-      <w:r>
-        <w:t xml:space="preserve"> </w:t>
-      </w:r>
-      <w:r>
-        <w:t xml:space="preserve">yielded 43 downloadable logs from 43 distinct threads (38 aircraft-fault and 5 pilot-fault; the remaining 105 had unhosted</w:t>
-      </w:r>
-      <w:r>
-        <w:t xml:space="preserve"> </w:t>
-      </w:r>
-      <w:r>
-        <w:t xml:space="preserve">or expired external links). Of the 38 aircraft logs, exactly 35 were associated with checkable fault categories in</w:t>
-      </w:r>
-      <w:r>
-        <w:t xml:space="preserve"> </w:t>
-      </w:r>
-      <w:r>
-        <w:t xml:space="preserve">Table 12 (12 tuning, 5 vibration, 5 GPS, 9 motor, 4 battery).</w:t>
-      </w:r>
-    </w:p>
-    <w:p>
-      <w:pPr>
-        <w:pStyle w:val="BodyText"/>
-      </w:pPr>
-      <w:r>
-        <w:t xml:space="preserve">Table 12 compares the fault checks with the full flight window (</w:t>
-      </w:r>
-      <m:oMath>
-        <m:r>
-          <m:t>m</m:t>
-        </m:r>
-        <m:r>
-          <m:rPr>
-            <m:sty m:val="p"/>
-          </m:rPr>
-          <m:t>=</m:t>
-        </m:r>
-        <m:r>
-          <m:t>0</m:t>
-        </m:r>
-      </m:oMath>
-      <w:r>
-        <w:t xml:space="preserve"> s) and with the last 10 s before</w:t>
-      </w:r>
-      <w:r>
-        <w:t xml:space="preserve"> </w:t>
-      </w:r>
-      <w:r>
-        <w:t xml:space="preserve">the crash removed (</w:t>
-      </w:r>
-      <m:oMath>
-        <m:r>
-          <m:t>m</m:t>
-        </m:r>
-        <m:r>
-          <m:rPr>
-            <m:sty m:val="p"/>
-          </m:rPr>
-          <m:t>=</m:t>
-        </m:r>
-        <m:r>
-          <m:t>10</m:t>
-        </m:r>
-      </m:oMath>
-      <w:r>
-        <w:t xml:space="preserve"> s). With the window ending 10 s before the crash, no check met the declared criterion.</w:t>
-      </w:r>
-      <w:r>
-        <w:t xml:space="preserve"> </w:t>
-      </w:r>
-      <w:r>
-        <w:t xml:space="preserve">The tuning check illustrates the diagnostic leakage described in Section 5.3: across all candidate logs with the full</w:t>
-      </w:r>
-      <w:r>
-        <w:t xml:space="preserve"> </w:t>
-      </w:r>
-      <w:r>
-        <w:t xml:space="preserve">window, the check fired on 10 of 12 (83.3%). Across the 9 constant tuning logs with duration</w:t>
-      </w:r>
-      <w:r>
-        <w:t xml:space="preserve"> </w:t>
-      </w:r>
-      <m:oMath>
-        <m:r>
-          <m:rPr>
-            <m:sty m:val="p"/>
-          </m:rPr>
-          <m:t>≥</m:t>
-        </m:r>
-        <m:r>
-          <m:t>10</m:t>
-        </m:r>
-      </m:oMath>
-      <w:r>
-        <w:t xml:space="preserve"> s surviving the 10 s</w:t>
-      </w:r>
-      <w:r>
-        <w:t xml:space="preserve"> </w:t>
-      </w:r>
-      <w:r>
-        <w:t xml:space="preserve">cut-off without sample attrition, firing dropped from 7 of 9 (77.8%) with the full window to 1 of 9 (11.1%) at</w:t>
-      </w:r>
-      <w:r>
-        <w:t xml:space="preserve"> </w:t>
-      </w:r>
-      <m:oMath>
-        <m:r>
-          <m:t>m</m:t>
-        </m:r>
-        <m:r>
-          <m:rPr>
-            <m:sty m:val="p"/>
-          </m:rPr>
-          <m:t>=</m:t>
-        </m:r>
-        <m:r>
-          <m:t>10</m:t>
-        </m:r>
-      </m:oMath>
-      <w:r>
-        <w:t xml:space="preserve"> s</w:t>
-      </w:r>
-      <w:r>
-        <w:t xml:space="preserve"> </w:t>
-      </w:r>
-      <w:r>
-        <w:t xml:space="preserve">(6 logs lost firing, 0 gained; exact two-sided McNemar</w:t>
-      </w:r>
-      <w:r>
-        <w:t xml:space="preserve"> </w:t>
-      </w:r>
-      <m:oMath>
-        <m:r>
-          <m:t>p</m:t>
-        </m:r>
-        <m:r>
-          <m:rPr>
-            <m:sty m:val="p"/>
-          </m:rPr>
-          <m:t>=</m:t>
-        </m:r>
-        <m:r>
-          <m:t>0.03125</m:t>
-        </m:r>
-      </m:oMath>
-      <w:r>
-        <w:t xml:space="preserve">). However, normal-flight firing also fell from 18/142 (13%)</w:t>
-      </w:r>
-      <w:r>
-        <w:t xml:space="preserve"> </w:t>
-      </w:r>
-      <w:r>
-        <w:t xml:space="preserve">to 7/130 (5%), indicating that window shortening itself reduces cumulative exposure to threshold triggers alongside any crash-impact</w:t>
-      </w:r>
-      <w:r>
-        <w:t xml:space="preserve"> </w:t>
-      </w:r>
-      <w:r>
-        <w:t xml:space="preserve">leakage. The tuning check itself is defined as rate-tracking RMS above 0.30 rad/s, a quantity that loss of control raises by definition, so its drop shows that this one rule-based check depends on the crash window rather than measuring a general leakage effect.</w:t>
-      </w:r>
-      <w:r>
-        <w:t xml:space="preserve"> </w:t>
-      </w:r>
       <m:oMath>
         <m:sSup>
           <m:e>
@@ -23289,111 +23244,45 @@
         </m:sSup>
       </m:oMath>
       <w:r>
-        <w:t xml:space="preserve">Its drop was also not clearly larger than the normal-flight drop: among flights that fired at the full window and could be scored at both cut-offs, crash logs lost firing in 6 of 7 and normal flights in 4 of 11 (one-sided Fisher exact</w:t>
-      </w:r>
-      <w:r>
-        <w:t xml:space="preserve"> </w:t>
-      </w:r>
-      <m:oMath>
-        <m:r>
-          <m:t>p</m:t>
-        </m:r>
-        <m:r>
-          <m:rPr>
-            <m:sty m:val="p"/>
-          </m:rPr>
-          <m:t>=</m:t>
-        </m:r>
-        <m:r>
-          <m:t>0.057</m:t>
-        </m:r>
-      </m:oMath>
-      <w:r>
-        <w:t xml:space="preserve">). Furthermore, this exploratory finding is descriptive rather than confirmatory: across the five diagnostic checks evaluated,</w:t>
-      </w:r>
-      <w:r>
-        <w:t xml:space="preserve"> </w:t>
-      </w:r>
-      <w:r>
-        <w:t xml:space="preserve">an unadjusted</w:t>
-      </w:r>
-      <w:r>
-        <w:t xml:space="preserve"> </w:t>
-      </w:r>
-      <m:oMath>
-        <m:r>
-          <m:t>p</m:t>
-        </m:r>
-        <m:r>
-          <m:rPr>
-            <m:sty m:val="p"/>
-          </m:rPr>
-          <m:t>=</m:t>
-        </m:r>
-        <m:r>
-          <m:t>0.031</m:t>
-        </m:r>
-      </m:oMath>
-      <w:r>
-        <w:t xml:space="preserve"> </w:t>
-      </w:r>
-      <w:r>
-        <w:t xml:space="preserve">does not survive Bonferroni multiplicity correction (</w:t>
-      </w:r>
-      <m:oMath>
-        <m:r>
-          <m:t>p</m:t>
-        </m:r>
-        <m:r>
-          <m:rPr>
-            <m:sty m:val="p"/>
-          </m:rPr>
-          <m:t>≈</m:t>
-        </m:r>
-        <m:r>
-          <m:t>0.16</m:t>
-        </m:r>
-      </m:oMath>
-      <w:r>
-        <w:t xml:space="preserve">), and the other four checks exhibited</w:t>
-      </w:r>
-      <w:r>
-        <w:t xml:space="preserve"> </w:t>
-      </w:r>
-      <w:r>
-        <w:t xml:space="preserve">low baseline sensitivity even on full windows (</w:t>
-      </w:r>
-      <m:oMath>
-        <m:r>
-          <m:rPr>
-            <m:sty m:val="p"/>
-          </m:rPr>
-          <m:t>≤</m:t>
-        </m:r>
-        <m:r>
-          <m:t>25</m:t>
-        </m:r>
-        <m:r>
-          <m:rPr>
-            <m:sty m:val="p"/>
-          </m:rPr>
-          <m:t>%</m:t>
-        </m:r>
-      </m:oMath>
-      <w:r>
-        <w:t xml:space="preserve">, with 0/4 for motor and 0/2 for battery on paired logs), while tuning exceeded</w:t>
-      </w:r>
-      <w:r>
-        <w:t xml:space="preserve"> </w:t>
-      </w:r>
-      <w:r>
-        <w:t xml:space="preserve">the declared 10% normal-flight false-alarm ceiling (13%). Thus, while the rate-tracking check depended on the crash window, claims that</w:t>
-      </w:r>
-      <w:r>
-        <w:t xml:space="preserve"> </w:t>
-      </w:r>
-      <w:r>
-        <w:t xml:space="preserve">leakage is strictly confined to tuning must be tempered by the limited baseline sensitivity of the remaining checks.</w:t>
+        <w:t xml:space="preserve">The archive cannot separate a tool that fails from labels that fail. RflyMAD</w:t>
+      </w:r>
+      <w:r>
+        <w:t xml:space="preserve"> </w:t>
+      </w:r>
+      <w:r>
+        <w:t xml:space="preserve">[</w:t>
+      </w:r>
+      <w:hyperlink w:anchor="_446d2d8311e3f2ab8e5f2830e712f064a3280b9">
+        <w:r>
+          <w:rPr>
+            <w:rStyle w:val="Hyperlink"/>
+          </w:rPr>
+          <w:t xml:space="preserve">11</w:t>
+        </w:r>
+      </w:hyperlink>
+      <w:r>
+        <w:t xml:space="preserve">]</w:t>
+      </w:r>
+      <w:r>
+        <w:t xml:space="preserve"> </w:t>
+      </w:r>
+      <w:r>
+        <w:t xml:space="preserve">can: its real flights carry faults injected in the PX4 firmware (motor efficiency loss and sensor faults on three multicopters, one operator), and each log records the injection in a dedicated topic, so the cause and its onset time are known. We downloaded the real-flight subset from its Kaggle copy and declared the analysis before scoring any log (</w:t>
+      </w:r>
+      <w:r>
+        <w:rPr>
+          <w:rStyle w:val="VerbatimChar"/>
+        </w:rPr>
+        <w:t xml:space="preserve">a9877c1</w:t>
+      </w:r>
+      <w:r>
+        <w:t xml:space="preserve">). Of 493 logs, 5 in fault folders had no fault code and were excluded, leaving 240 motor-fault, 197 sensor-fault and 51 fault-free flights (the Kaggle copy has 51 fault-free real flights, not the 84 the dataset page lists). Onset came from the log, not from the per-case workbooks, one of which described a different case. Fault-free flights were given a pseudo-onset at the median onset time of fault flights with the same flight pattern. Windows ran from take-off to the onset (</w:t>
+      </w:r>
+      <w:r>
+        <w:t xml:space="preserve">“pre”</w:t>
+      </w:r>
+      <w:r>
+        <w:t xml:space="preserve">), to 10 s after it, and to the end of the flight.</w:t>
       </w:r>
     </w:p>
     <w:p>
@@ -23401,258 +23290,7 @@
         <w:pStyle w:val="BodyText"/>
       </w:pPr>
       <w:r>
-        <w:t xml:space="preserve">To test diagnostic attribution on independently evaluated incidents, we evaluated the rule across all 43 downloadable logs behind</w:t>
-      </w:r>
-      <w:r>
-        <w:t xml:space="preserve"> </w:t>
-      </w:r>
-      <w:r>
-        <w:t xml:space="preserve">expert forum threads (38 aircraft-fault and 5 pilot-fault). As noted in Section 3, cross-tabulating these 43 logs against</w:t>
-      </w:r>
-      <w:r>
-        <w:t xml:space="preserve"> </w:t>
-      </w:r>
-      <w:r>
-        <w:t xml:space="preserve">archive ratings revealed that all 9 logs carrying an uploader rating were labeled</w:t>
-      </w:r>
-      <w:r>
-        <w:t xml:space="preserve"> </w:t>
-      </w:r>
-      <w:r>
-        <w:rPr>
-          <w:rStyle w:val="VerbatimChar"/>
-        </w:rPr>
-        <w:t xml:space="preserve">crash_sw_hw</w:t>
-      </w:r>
-      <w:r>
-        <w:t xml:space="preserve"> </w:t>
-      </w:r>
-      <w:r>
-        <w:t xml:space="preserve">(and all 9 were diagnosed as aircraft</w:t>
-      </w:r>
-      <w:r>
-        <w:t xml:space="preserve"> </w:t>
-      </w:r>
-      <w:r>
-        <w:t xml:space="preserve">faults by experts, 100% agreement); the 5 expert pilot crashes were submitted unrated, which is consistent with, but not statistical</w:t>
-      </w:r>
-      <w:r>
-        <w:t xml:space="preserve"> </w:t>
-      </w:r>
-      <w:r>
-        <w:t xml:space="preserve">evidence of, reluctance to self-identify pilot fault: all 5 pilot logs were unrated in the index against 28 of 38 aircraft logs unrated</w:t>
-      </w:r>
-      <w:r>
-        <w:t xml:space="preserve"> </w:t>
-      </w:r>
-      <w:r>
-        <w:t xml:space="preserve">(one-sided Fisher exact</w:t>
-      </w:r>
-      <w:r>
-        <w:t xml:space="preserve"> </w:t>
-      </w:r>
-      <m:oMath>
-        <m:r>
-          <m:t>p</m:t>
-        </m:r>
-        <m:r>
-          <m:rPr>
-            <m:sty m:val="p"/>
-          </m:rPr>
-          <m:t>=</m:t>
-        </m:r>
-        <m:r>
-          <m:t>0.25</m:t>
-        </m:r>
-      </m:oMath>
-      <w:r>
-        <w:t xml:space="preserve">). Evaluated on the 38 aircraft incidents, the fixed rule predicted</w:t>
-      </w:r>
-      <w:r>
-        <w:t xml:space="preserve"> </w:t>
-      </w:r>
-      <w:r>
-        <w:t xml:space="preserve">“aircraft”</w:t>
-      </w:r>
-      <w:r>
-        <w:t xml:space="preserve"> </w:t>
-      </w:r>
-      <w:r>
-        <w:t xml:space="preserve">in 18 (47.4%),</w:t>
-      </w:r>
-      <w:r>
-        <w:t xml:space="preserve"> </w:t>
-      </w:r>
-      <w:r>
-        <w:t xml:space="preserve">“unknown”</w:t>
-      </w:r>
-      <w:r>
-        <w:t xml:space="preserve"> </w:t>
-      </w:r>
-      <w:r>
-        <w:t xml:space="preserve">in 6 (15.8%), and erroneously blamed the</w:t>
-      </w:r>
-      <w:r>
-        <w:t xml:space="preserve"> </w:t>
-      </w:r>
-      <w:r>
-        <w:t xml:space="preserve">“pilot”</w:t>
-      </w:r>
-      <w:r>
-        <w:t xml:space="preserve"> </w:t>
-      </w:r>
-      <w:r>
-        <w:t xml:space="preserve">in 14 (36.8%). On decided aircraft cases (</w:t>
-      </w:r>
-      <m:oMath>
-        <m:r>
-          <m:t>n</m:t>
-        </m:r>
-        <m:r>
-          <m:rPr>
-            <m:sty m:val="p"/>
-          </m:rPr>
-          <m:t>=</m:t>
-        </m:r>
-        <m:r>
-          <m:t>32</m:t>
-        </m:r>
-      </m:oMath>
-      <w:r>
-        <w:t xml:space="preserve">), the rule was wrong on</w:t>
-      </w:r>
-      <w:r>
-        <w:t xml:space="preserve"> </w:t>
-      </w:r>
-      <w:r>
-        <w:t xml:space="preserve">43.8% (14/32). Detailed inspection of flight mode sequences confirmed the failure mechanism: in all 14 misclassified logs, the vehicle was</w:t>
-      </w:r>
-      <w:r>
-        <w:t xml:space="preserve"> </w:t>
-      </w:r>
-      <w:r>
-        <w:t xml:space="preserve">in a pilot-flown mode at the crash moment (</w:t>
-      </w:r>
-      <w:r>
-        <w:rPr>
-          <w:rStyle w:val="VerbatimChar"/>
-        </w:rPr>
-        <w:t xml:space="preserve">POSCTL</w:t>
-      </w:r>
-      <w:r>
-        <w:t xml:space="preserve"> </w:t>
-      </w:r>
-      <w:r>
-        <w:t xml:space="preserve">in 7 logs,</w:t>
-      </w:r>
-      <w:r>
-        <w:t xml:space="preserve"> </w:t>
-      </w:r>
-      <w:r>
-        <w:rPr>
-          <w:rStyle w:val="VerbatimChar"/>
-        </w:rPr>
-        <w:t xml:space="preserve">STAB</w:t>
-      </w:r>
-      <w:r>
-        <w:t xml:space="preserve"> </w:t>
-      </w:r>
-      <w:r>
-        <w:t xml:space="preserve">in 4,</w:t>
-      </w:r>
-      <w:r>
-        <w:t xml:space="preserve"> </w:t>
-      </w:r>
-      <w:r>
-        <w:rPr>
-          <w:rStyle w:val="VerbatimChar"/>
-        </w:rPr>
-        <w:t xml:space="preserve">ALTCTL</w:t>
-      </w:r>
-      <w:r>
-        <w:t xml:space="preserve"> </w:t>
-      </w:r>
-      <w:r>
-        <w:t xml:space="preserve">in 3; including log</w:t>
-      </w:r>
-      <w:r>
-        <w:t xml:space="preserve"> </w:t>
-      </w:r>
-      <w:r>
-        <w:rPr>
-          <w:rStyle w:val="VerbatimChar"/>
-        </w:rPr>
-        <w:t xml:space="preserve">e9034973</w:t>
-      </w:r>
-      <w:r>
-        <w:t xml:space="preserve">,</w:t>
-      </w:r>
-      <w:r>
-        <w:t xml:space="preserve"> </w:t>
-      </w:r>
-      <w:r>
-        <w:t xml:space="preserve">which transitioned</w:t>
-      </w:r>
-      <w:r>
-        <w:t xml:space="preserve"> </w:t>
-      </w:r>
-      <w:r>
-        <w:rPr>
-          <w:rStyle w:val="VerbatimChar"/>
-        </w:rPr>
-        <w:t xml:space="preserve">POSCTL</w:t>
-      </w:r>
-      <w:r>
-        <w:t xml:space="preserve"> </w:t>
-      </w:r>
-      <m:oMath>
-        <m:r>
-          <m:rPr>
-            <m:sty m:val="p"/>
-          </m:rPr>
-          <m:t>→</m:t>
-        </m:r>
-      </m:oMath>
-      <w:r>
-        <w:t xml:space="preserve"> </w:t>
-      </w:r>
-      <w:r>
-        <w:rPr>
-          <w:rStyle w:val="VerbatimChar"/>
-        </w:rPr>
-        <w:t xml:space="preserve">AUTO_4</w:t>
-      </w:r>
-      <w:r>
-        <w:t xml:space="preserve"> </w:t>
-      </w:r>
-      <m:oMath>
-        <m:r>
-          <m:rPr>
-            <m:sty m:val="p"/>
-          </m:rPr>
-          <m:t>→</m:t>
-        </m:r>
-      </m:oMath>
-      <w:r>
-        <w:t xml:space="preserve"> </w:t>
-      </w:r>
-      <w:r>
-        <w:rPr>
-          <w:rStyle w:val="VerbatimChar"/>
-        </w:rPr>
-        <w:t xml:space="preserve">POSCTL</w:t>
-      </w:r>
-      <w:r>
-        <w:t xml:space="preserve"> </w:t>
-      </w:r>
-      <w:r>
-        <w:t xml:space="preserve">as the pilot attempted manual recovery). Because no hardware</w:t>
-      </w:r>
-      <w:r>
-        <w:t xml:space="preserve"> </w:t>
-      </w:r>
-      <w:r>
-        <w:t xml:space="preserve">failsafe fired before impact, the rule defaulted to blaming the pilot.</w:t>
+        <w:t xml:space="preserve">The declared attribution rule, unchanged, called 8 of 240 motor-fault flights (3%) and 10 of 197 sensor-fault flights (5%) aircraft-caused, against 2 of 51 fault-free flights (4%); its balanced accuracy for motor faults against fault-free flights was 0.50 [0.47, 0.52], below the 0.70 that would have shown it recognises known aircraft faults. Its signs are built for crashes (saturated motors, clipping, failsafes, warnings) and did not fire on a 15–20% loss of motor efficiency that the controller absorbed. FlightMD’s health score did not separate faulty from fault-free flights before the fault (AUC 0.47 [0.39, 0.55]) or with 10 s of it (0.51 [0.44, 0.58]), but did on the whole flight (0.69 [0.63, 0.75]).</w:t>
       </w:r>
     </w:p>
     <w:p>
@@ -23660,62 +23298,392 @@
         <w:pStyle w:val="BodyText"/>
       </w:pPr>
       <w:r>
-        <w:t xml:space="preserve">Conversely, when evaluated on the 5 pilot-fault incidents, the fixed rule predicted</w:t>
-      </w:r>
-      <w:r>
-        <w:t xml:space="preserve"> </w:t>
-      </w:r>
-      <w:r>
-        <w:t xml:space="preserve">“aircraft”</w:t>
-      </w:r>
-      <w:r>
-        <w:t xml:space="preserve"> </w:t>
-      </w:r>
-      <w:r>
-        <w:t xml:space="preserve">in 4 (80.0%) and</w:t>
-      </w:r>
-      <w:r>
-        <w:t xml:space="preserve"> </w:t>
-      </w:r>
-      <w:r>
-        <w:t xml:space="preserve">“pilot”</w:t>
-      </w:r>
-      <w:r>
-        <w:t xml:space="preserve"> </w:t>
-      </w:r>
-      <w:r>
-        <w:t xml:space="preserve">in only 1 (20.0%;</w:t>
-      </w:r>
-      <w:r>
-        <w:t xml:space="preserve"> </w:t>
-      </w:r>
-      <w:r>
-        <w:t xml:space="preserve">pilot recall 1 of 5, exact Clopper–Pearson 95% CI 0.5–71.6%, Wilson 3.6–62.4%), misclassifying 4 of 5 pilot crashes because motor saturation,</w:t>
-      </w:r>
-      <w:r>
-        <w:t xml:space="preserve"> </w:t>
-      </w:r>
-      <w:r>
-        <w:t xml:space="preserve">accelerometer clipping, or failsafe activation occurred as the vehicle struck the ground. Combining both classes across all 37 decided expert logs</w:t>
-      </w:r>
-      <w:r>
-        <w:t xml:space="preserve"> </w:t>
-      </w:r>
-      <w:r>
-        <w:t xml:space="preserve">(32 aircraft, 5 pilot), the rule produced 18 incorrect decisions out of 37 (48.6% error rate), yielding a balanced accuracy of</w:t>
-      </w:r>
-      <w:r>
-        <w:t xml:space="preserve"> </w:t>
-      </w:r>
-      <m:oMath>
-        <m:r>
-          <m:rPr>
-            <m:sty m:val="p"/>
-          </m:rPr>
-          <m:t>(</m:t>
-        </m:r>
-        <m:r>
-          <m:t>56.25</m:t>
+        <w:t xml:space="preserve">The study’s 11 features did the opposite. A logistic model separated faulty from fault-free flights at AUC 0.86 (permutation</w:t>
+      </w:r>
+      <w:r>
+        <w:t xml:space="preserve"> </w:t>
+      </w:r>
+      <m:oMath>
+        <m:r>
+          <m:t>p</m:t>
+        </m:r>
+        <m:r>
+          <m:rPr>
+            <m:sty m:val="p"/>
+          </m:rPr>
+          <m:t>=</m:t>
+        </m:r>
+        <m:r>
+          <m:t>0.005</m:t>
+        </m:r>
+      </m:oMath>
+      <w:r>
+        <w:t xml:space="preserve">) using only data from</w:t>
+      </w:r>
+      <w:r>
+        <w:t xml:space="preserve"> </w:t>
+      </w:r>
+      <w:r>
+        <w:rPr>
+          <w:i/>
+          <w:iCs/>
+        </w:rPr>
+        <w:t xml:space="preserve">before</w:t>
+      </w:r>
+      <w:r>
+        <w:t xml:space="preserve"> </w:t>
+      </w:r>
+      <w:r>
+        <w:t xml:space="preserve">the fault was injected; including 10 s of the fault changed this by</w:t>
+      </w:r>
+      <w:r>
+        <w:t xml:space="preserve"> </w:t>
+      </w:r>
+      <m:oMath>
+        <m:r>
+          <m:rPr>
+            <m:sty m:val="p"/>
+          </m:rPr>
+          <m:t>−</m:t>
+        </m:r>
+        <m:r>
+          <m:t>0.008</m:t>
+        </m:r>
+      </m:oMath>
+      <w:r>
+        <w:t xml:space="preserve"> </w:t>
+      </w:r>
+      <w:r>
+        <w:t xml:space="preserve">[</w:t>
+      </w:r>
+      <m:oMath>
+        <m:r>
+          <m:rPr>
+            <m:sty m:val="p"/>
+          </m:rPr>
+          <m:t>−</m:t>
+        </m:r>
+        <m:r>
+          <m:t>0.033</m:t>
+        </m:r>
+      </m:oMath>
+      <w:r>
+        <w:t xml:space="preserve">, 0.018], and the whole flight gave 0.82. The separation held within each flight pattern (pooled 0.88) and, in a check we had not declared, on the four days when both classes were flown (0.82, 163 flights). It came mainly from tilt and rate-tracking error (single-feature AUC 0.86 and 0.81): the fault flights were flown more aggressively before the injection. A fault-versus-normal classifier on this dataset can therefore score well with no fault present, which is the between-flight confounding of Section 5.5 in a setting where the cause is known. Both results bound the archive findings: the rule’s failure there partly reflects signs that miss faults the controller absorbs, not only noisy labels; and a high crash-versus-normal AUC is weak evidence of a fault signal unless a pre-onset or same-flight baseline is reported.</w:t>
+      </w:r>
+    </w:p>
+    <w:p>
+      <w:pPr>
+        <w:pStyle w:val="Heading2"/>
+      </w:pPr>
+      <w:bookmarkStart w:id="65" w:name="_440012d4f1ae87c72168f87fd4eb66e49627717"/>
+      <w:r>
+        <w:rPr>
+          <w:rStyle w:val="SectionNumber"/>
+        </w:rPr>
+        <w:t xml:space="preserve">5.10</w:t>
+      </w:r>
+      <w:r>
+        <w:tab/>
+      </w:r>
+      <w:r>
+        <w:t xml:space="preserve">Expert diagnoses (Q4)</w:t>
+      </w:r>
+      <w:bookmarkEnd w:id="65"/>
+    </w:p>
+    <w:p>
+      <w:pPr>
+        <w:pStyle w:val="FirstParagraph"/>
+      </w:pPr>
+      <w:r>
+        <w:t xml:space="preserve">Of 148 forum threads describing a real crash, the expert attributed it to the aircraft in 94 (64%), to the pilot in 9</w:t>
+      </w:r>
+      <w:r>
+        <w:t xml:space="preserve"> </w:t>
+      </w:r>
+      <w:r>
+        <w:t xml:space="preserve">(6%), to both in 2, and was unclear or gave no diagnosis in 43 (29%). Tuning or configuration was the cause named</w:t>
+      </w:r>
+      <w:r>
+        <w:t xml:space="preserve"> </w:t>
+      </w:r>
+      <w:r>
+        <w:t xml:space="preserve">most often (26 of 94; 14 of the 47 confirmed by the poster), followed by GPS, compass or estimator problems (18) and</w:t>
+      </w:r>
+      <w:r>
+        <w:t xml:space="preserve"> </w:t>
+      </w:r>
+      <w:r>
+        <w:t xml:space="preserve">motors, ESCs or propellers (16) (Fig. 6). Of 14 threads whose log carried an aircraft crash rating in the index, the</w:t>
+      </w:r>
+      <w:r>
+        <w:t xml:space="preserve"> </w:t>
+      </w:r>
+      <w:r>
+        <w:t xml:space="preserve">expert agreed in 11 and was unclear in 3; none attributed the crash to the pilot. Download attempts across all 148 threads</w:t>
+      </w:r>
+      <w:r>
+        <w:t xml:space="preserve"> </w:t>
+      </w:r>
+      <w:r>
+        <w:t xml:space="preserve">yielded 43 downloadable logs from 43 distinct threads (38 aircraft-fault and 5 pilot-fault; the remaining 105 had unhosted</w:t>
+      </w:r>
+      <w:r>
+        <w:t xml:space="preserve"> </w:t>
+      </w:r>
+      <w:r>
+        <w:t xml:space="preserve">or expired external links). Of the 38 aircraft logs, exactly 35 were associated with checkable fault categories in</w:t>
+      </w:r>
+      <w:r>
+        <w:t xml:space="preserve"> </w:t>
+      </w:r>
+      <w:r>
+        <w:t xml:space="preserve">Table 12 (12 tuning, 5 vibration, 5 GPS, 9 motor, 4 battery).</w:t>
+      </w:r>
+    </w:p>
+    <w:p>
+      <w:pPr>
+        <w:pStyle w:val="BodyText"/>
+      </w:pPr>
+      <w:r>
+        <w:t xml:space="preserve">Table 12 compares the fault checks with the full flight window (</w:t>
+      </w:r>
+      <m:oMath>
+        <m:r>
+          <m:t>m</m:t>
+        </m:r>
+        <m:r>
+          <m:rPr>
+            <m:sty m:val="p"/>
+          </m:rPr>
+          <m:t>=</m:t>
+        </m:r>
+        <m:r>
+          <m:t>0</m:t>
+        </m:r>
+      </m:oMath>
+      <w:r>
+        <w:t xml:space="preserve"> s) and with the last 10 s before</w:t>
+      </w:r>
+      <w:r>
+        <w:t xml:space="preserve"> </w:t>
+      </w:r>
+      <w:r>
+        <w:t xml:space="preserve">the crash removed (</w:t>
+      </w:r>
+      <m:oMath>
+        <m:r>
+          <m:t>m</m:t>
+        </m:r>
+        <m:r>
+          <m:rPr>
+            <m:sty m:val="p"/>
+          </m:rPr>
+          <m:t>=</m:t>
+        </m:r>
+        <m:r>
+          <m:t>10</m:t>
+        </m:r>
+      </m:oMath>
+      <w:r>
+        <w:t xml:space="preserve"> s). With the window ending 10 s before the crash, no check met the declared criterion.</w:t>
+      </w:r>
+      <w:r>
+        <w:t xml:space="preserve"> </w:t>
+      </w:r>
+      <w:r>
+        <w:t xml:space="preserve">The tuning check illustrates the diagnostic leakage described in Section 5.3: across all candidate logs with the full</w:t>
+      </w:r>
+      <w:r>
+        <w:t xml:space="preserve"> </w:t>
+      </w:r>
+      <w:r>
+        <w:t xml:space="preserve">window, the check fired on 10 of 12 (83.3%). Across the 9 constant tuning logs with duration</w:t>
+      </w:r>
+      <w:r>
+        <w:t xml:space="preserve"> </w:t>
+      </w:r>
+      <m:oMath>
+        <m:r>
+          <m:rPr>
+            <m:sty m:val="p"/>
+          </m:rPr>
+          <m:t>≥</m:t>
+        </m:r>
+        <m:r>
+          <m:t>10</m:t>
+        </m:r>
+      </m:oMath>
+      <w:r>
+        <w:t xml:space="preserve"> s surviving the 10 s</w:t>
+      </w:r>
+      <w:r>
+        <w:t xml:space="preserve"> </w:t>
+      </w:r>
+      <w:r>
+        <w:t xml:space="preserve">cut-off without sample attrition, firing dropped from 7 of 9 (77.8%) with the full window to 1 of 9 (11.1%) at</w:t>
+      </w:r>
+      <w:r>
+        <w:t xml:space="preserve"> </w:t>
+      </w:r>
+      <m:oMath>
+        <m:r>
+          <m:t>m</m:t>
+        </m:r>
+        <m:r>
+          <m:rPr>
+            <m:sty m:val="p"/>
+          </m:rPr>
+          <m:t>=</m:t>
+        </m:r>
+        <m:r>
+          <m:t>10</m:t>
+        </m:r>
+      </m:oMath>
+      <w:r>
+        <w:t xml:space="preserve"> s</w:t>
+      </w:r>
+      <w:r>
+        <w:t xml:space="preserve"> </w:t>
+      </w:r>
+      <w:r>
+        <w:t xml:space="preserve">(6 logs lost firing, 0 gained; exact two-sided McNemar</w:t>
+      </w:r>
+      <w:r>
+        <w:t xml:space="preserve"> </w:t>
+      </w:r>
+      <m:oMath>
+        <m:r>
+          <m:t>p</m:t>
+        </m:r>
+        <m:r>
+          <m:rPr>
+            <m:sty m:val="p"/>
+          </m:rPr>
+          <m:t>=</m:t>
+        </m:r>
+        <m:r>
+          <m:t>0.03125</m:t>
+        </m:r>
+      </m:oMath>
+      <w:r>
+        <w:t xml:space="preserve">). However, normal-flight firing also fell from 18/142 (13%)</w:t>
+      </w:r>
+      <w:r>
+        <w:t xml:space="preserve"> </w:t>
+      </w:r>
+      <w:r>
+        <w:t xml:space="preserve">to 7/130 (5%), indicating that window shortening itself reduces cumulative exposure to threshold triggers alongside any crash-impact</w:t>
+      </w:r>
+      <w:r>
+        <w:t xml:space="preserve"> </w:t>
+      </w:r>
+      <w:r>
+        <w:t xml:space="preserve">leakage. The tuning check itself is defined as rate-tracking RMS above 0.30 rad/s, a quantity that loss of control raises by definition, so its drop shows that this one rule-based check depends on the crash window rather than measuring a general leakage effect.</w:t>
+      </w:r>
+      <w:r>
+        <w:t xml:space="preserve"> </w:t>
+      </w:r>
+      <m:oMath>
+        <m:sSup>
+          <m:e>
+            <m:r>
+              <m:t>​</m:t>
+            </m:r>
+          </m:e>
+          <m:sup>
+            <m:r>
+              <m:rPr>
+                <m:sty m:val="p"/>
+              </m:rPr>
+              <m:t>†</m:t>
+            </m:r>
+          </m:sup>
+        </m:sSup>
+      </m:oMath>
+      <w:r>
+        <w:t xml:space="preserve">Its drop was also not clearly larger than the normal-flight drop: among flights that fired at the full window and could be scored at both cut-offs, crash logs lost firing in 6 of 7 and normal flights in 4 of 11 (one-sided Fisher exact</w:t>
+      </w:r>
+      <w:r>
+        <w:t xml:space="preserve"> </w:t>
+      </w:r>
+      <m:oMath>
+        <m:r>
+          <m:t>p</m:t>
+        </m:r>
+        <m:r>
+          <m:rPr>
+            <m:sty m:val="p"/>
+          </m:rPr>
+          <m:t>=</m:t>
+        </m:r>
+        <m:r>
+          <m:t>0.057</m:t>
+        </m:r>
+      </m:oMath>
+      <w:r>
+        <w:t xml:space="preserve">). Furthermore, this exploratory finding is descriptive rather than confirmatory: across the five diagnostic checks evaluated,</w:t>
+      </w:r>
+      <w:r>
+        <w:t xml:space="preserve"> </w:t>
+      </w:r>
+      <w:r>
+        <w:t xml:space="preserve">an unadjusted</w:t>
+      </w:r>
+      <w:r>
+        <w:t xml:space="preserve"> </w:t>
+      </w:r>
+      <m:oMath>
+        <m:r>
+          <m:t>p</m:t>
+        </m:r>
+        <m:r>
+          <m:rPr>
+            <m:sty m:val="p"/>
+          </m:rPr>
+          <m:t>=</m:t>
+        </m:r>
+        <m:r>
+          <m:t>0.031</m:t>
+        </m:r>
+      </m:oMath>
+      <w:r>
+        <w:t xml:space="preserve"> </w:t>
+      </w:r>
+      <w:r>
+        <w:t xml:space="preserve">does not survive Bonferroni multiplicity correction (</w:t>
+      </w:r>
+      <m:oMath>
+        <m:r>
+          <m:t>p</m:t>
+        </m:r>
+        <m:r>
+          <m:rPr>
+            <m:sty m:val="p"/>
+          </m:rPr>
+          <m:t>≈</m:t>
+        </m:r>
+        <m:r>
+          <m:t>0.16</m:t>
+        </m:r>
+      </m:oMath>
+      <w:r>
+        <w:t xml:space="preserve">), and the other four checks exhibited</w:t>
+      </w:r>
+      <w:r>
+        <w:t xml:space="preserve"> </w:t>
+      </w:r>
+      <w:r>
+        <w:t xml:space="preserve">low baseline sensitivity even on full windows (</w:t>
+      </w:r>
+      <m:oMath>
+        <m:r>
+          <m:rPr>
+            <m:sty m:val="p"/>
+          </m:rPr>
+          <m:t>≤</m:t>
+        </m:r>
+        <m:r>
+          <m:t>25</m:t>
         </m:r>
         <m:r>
           <m:rPr>
@@ -23723,125 +23691,41 @@
           </m:rPr>
           <m:t>%</m:t>
         </m:r>
-        <m:r>
-          <m:rPr>
-            <m:sty m:val="p"/>
-          </m:rPr>
-          <m:t>+</m:t>
-        </m:r>
-        <m:r>
-          <m:t>20.0</m:t>
-        </m:r>
-        <m:r>
-          <m:rPr>
-            <m:sty m:val="p"/>
-          </m:rPr>
-          <m:t>%</m:t>
-        </m:r>
-        <m:r>
-          <m:rPr>
-            <m:sty m:val="p"/>
-          </m:rPr>
-          <m:t>)</m:t>
-        </m:r>
-        <m:r>
-          <m:rPr>
-            <m:sty m:val="p"/>
-          </m:rPr>
-          <m:t>/</m:t>
-        </m:r>
-        <m:r>
-          <m:t>2</m:t>
-        </m:r>
-        <m:r>
-          <m:rPr>
-            <m:sty m:val="p"/>
-          </m:rPr>
-          <m:t>=</m:t>
-        </m:r>
-        <m:r>
-          <m:t>38.1</m:t>
-        </m:r>
-        <m:r>
-          <m:rPr>
-            <m:sty m:val="p"/>
-          </m:rPr>
-          <m:t>%</m:t>
-        </m:r>
-      </m:oMath>
-      <w:r>
-        <w:t xml:space="preserve"> </w:t>
-      </w:r>
-      <w:r>
-        <w:t xml:space="preserve">(Bayesian 95% credible interval 0.25–0.61 from independent Jeffreys beta posteriors on the two recalls; exact 95% intervals for the recalls themselves are 37.7–73.6% for aircraft, 18 of 32, and 0.5–71.6% for pilot, 1 of 5). The interval contains chance (0.50) and lies below 0.70, the pass mark declared for the rule on uploader labels (not for this expert set), so the rule probably falls below that mark here but cannot be separated from chance. When evaluated on the subset of 34 logs with complete telemetry required by the statistical models (30 aircraft, 4 pilot), the rule decided 29 cases (25 aircraft, 4 pilot), predicting aircraft in 15 of 25 aircraft and 4 of 4 pilot, yielding a balanced accuracy of</w:t>
-      </w:r>
-      <w:r>
-        <w:t xml:space="preserve"> </w:t>
-      </w:r>
-      <m:oMath>
-        <m:r>
-          <m:rPr>
-            <m:sty m:val="p"/>
-          </m:rPr>
-          <m:t>(</m:t>
-        </m:r>
-        <m:r>
-          <m:t>60.0</m:t>
-        </m:r>
-        <m:r>
-          <m:rPr>
-            <m:sty m:val="p"/>
-          </m:rPr>
-          <m:t>%</m:t>
-        </m:r>
-        <m:r>
-          <m:rPr>
-            <m:sty m:val="p"/>
-          </m:rPr>
-          <m:t>+</m:t>
-        </m:r>
-        <m:r>
-          <m:t>0.0</m:t>
-        </m:r>
-        <m:r>
-          <m:rPr>
-            <m:sty m:val="p"/>
-          </m:rPr>
-          <m:t>%</m:t>
-        </m:r>
-        <m:r>
-          <m:rPr>
-            <m:sty m:val="p"/>
-          </m:rPr>
-          <m:t>)</m:t>
-        </m:r>
-        <m:r>
-          <m:rPr>
-            <m:sty m:val="p"/>
-          </m:rPr>
-          <m:t>/</m:t>
-        </m:r>
-        <m:r>
-          <m:t>2</m:t>
-        </m:r>
-        <m:r>
-          <m:rPr>
-            <m:sty m:val="p"/>
-          </m:rPr>
-          <m:t>=</m:t>
-        </m:r>
-        <m:r>
-          <m:t>30.0</m:t>
-        </m:r>
-        <m:r>
-          <m:rPr>
-            <m:sty m:val="p"/>
-          </m:rPr>
-          <m:t>%</m:t>
-        </m:r>
-      </m:oMath>
-      <w:r>
-        <w:t xml:space="preserve">. Of the 30 complete aircraft logs, exactly 5 overlapped with the 148 modelled crashes in the training pool (all 5 rated</w:t>
+      </m:oMath>
+      <w:r>
+        <w:t xml:space="preserve">, with 0/4 for motor and 0/2 for battery on paired logs), while tuning exceeded</w:t>
+      </w:r>
+      <w:r>
+        <w:t xml:space="preserve"> </w:t>
+      </w:r>
+      <w:r>
+        <w:t xml:space="preserve">the declared 10% normal-flight false-alarm ceiling (13%). Thus, while the rate-tracking check depended on the crash window, claims that</w:t>
+      </w:r>
+      <w:r>
+        <w:t xml:space="preserve"> </w:t>
+      </w:r>
+      <w:r>
+        <w:t xml:space="preserve">leakage is strictly confined to tuning must be tempered by the limited baseline sensitivity of the remaining checks.</w:t>
+      </w:r>
+    </w:p>
+    <w:p>
+      <w:pPr>
+        <w:pStyle w:val="BodyText"/>
+      </w:pPr>
+      <w:r>
+        <w:t xml:space="preserve">To test diagnostic attribution on independently evaluated incidents, we evaluated the rule across all 43 downloadable logs behind</w:t>
+      </w:r>
+      <w:r>
+        <w:t xml:space="preserve"> </w:t>
+      </w:r>
+      <w:r>
+        <w:t xml:space="preserve">expert forum threads (38 aircraft-fault and 5 pilot-fault). As noted in Section 3, cross-tabulating these 43 logs against</w:t>
+      </w:r>
+      <w:r>
+        <w:t xml:space="preserve"> </w:t>
+      </w:r>
+      <w:r>
+        <w:t xml:space="preserve">archive ratings revealed that all 9 logs carrying an uploader rating were labeled</w:t>
       </w:r>
       <w:r>
         <w:t xml:space="preserve"> </w:t>
@@ -23856,6 +23740,434 @@
         <w:t xml:space="preserve"> </w:t>
       </w:r>
       <w:r>
+        <w:t xml:space="preserve">(and all 9 were diagnosed as aircraft</w:t>
+      </w:r>
+      <w:r>
+        <w:t xml:space="preserve"> </w:t>
+      </w:r>
+      <w:r>
+        <w:t xml:space="preserve">faults by experts, 100% agreement); the 5 expert pilot crashes were submitted unrated, which is consistent with, but not statistical</w:t>
+      </w:r>
+      <w:r>
+        <w:t xml:space="preserve"> </w:t>
+      </w:r>
+      <w:r>
+        <w:t xml:space="preserve">evidence of, reluctance to self-identify pilot fault: all 5 pilot logs were unrated in the index against 28 of 38 aircraft logs unrated</w:t>
+      </w:r>
+      <w:r>
+        <w:t xml:space="preserve"> </w:t>
+      </w:r>
+      <w:r>
+        <w:t xml:space="preserve">(one-sided Fisher exact</w:t>
+      </w:r>
+      <w:r>
+        <w:t xml:space="preserve"> </w:t>
+      </w:r>
+      <m:oMath>
+        <m:r>
+          <m:t>p</m:t>
+        </m:r>
+        <m:r>
+          <m:rPr>
+            <m:sty m:val="p"/>
+          </m:rPr>
+          <m:t>=</m:t>
+        </m:r>
+        <m:r>
+          <m:t>0.25</m:t>
+        </m:r>
+      </m:oMath>
+      <w:r>
+        <w:t xml:space="preserve">). Evaluated on the 38 aircraft incidents, the fixed rule predicted</w:t>
+      </w:r>
+      <w:r>
+        <w:t xml:space="preserve"> </w:t>
+      </w:r>
+      <w:r>
+        <w:t xml:space="preserve">“aircraft”</w:t>
+      </w:r>
+      <w:r>
+        <w:t xml:space="preserve"> </w:t>
+      </w:r>
+      <w:r>
+        <w:t xml:space="preserve">in 18 (47.4%),</w:t>
+      </w:r>
+      <w:r>
+        <w:t xml:space="preserve"> </w:t>
+      </w:r>
+      <w:r>
+        <w:t xml:space="preserve">“unknown”</w:t>
+      </w:r>
+      <w:r>
+        <w:t xml:space="preserve"> </w:t>
+      </w:r>
+      <w:r>
+        <w:t xml:space="preserve">in 6 (15.8%), and erroneously blamed the</w:t>
+      </w:r>
+      <w:r>
+        <w:t xml:space="preserve"> </w:t>
+      </w:r>
+      <w:r>
+        <w:t xml:space="preserve">“pilot”</w:t>
+      </w:r>
+      <w:r>
+        <w:t xml:space="preserve"> </w:t>
+      </w:r>
+      <w:r>
+        <w:t xml:space="preserve">in 14 (36.8%). On decided aircraft cases (</w:t>
+      </w:r>
+      <m:oMath>
+        <m:r>
+          <m:t>n</m:t>
+        </m:r>
+        <m:r>
+          <m:rPr>
+            <m:sty m:val="p"/>
+          </m:rPr>
+          <m:t>=</m:t>
+        </m:r>
+        <m:r>
+          <m:t>32</m:t>
+        </m:r>
+      </m:oMath>
+      <w:r>
+        <w:t xml:space="preserve">), the rule was wrong on</w:t>
+      </w:r>
+      <w:r>
+        <w:t xml:space="preserve"> </w:t>
+      </w:r>
+      <w:r>
+        <w:t xml:space="preserve">43.8% (14/32). Detailed inspection of flight mode sequences confirmed the failure mechanism: in all 14 misclassified logs, the vehicle was</w:t>
+      </w:r>
+      <w:r>
+        <w:t xml:space="preserve"> </w:t>
+      </w:r>
+      <w:r>
+        <w:t xml:space="preserve">in a pilot-flown mode at the crash moment (</w:t>
+      </w:r>
+      <w:r>
+        <w:rPr>
+          <w:rStyle w:val="VerbatimChar"/>
+        </w:rPr>
+        <w:t xml:space="preserve">POSCTL</w:t>
+      </w:r>
+      <w:r>
+        <w:t xml:space="preserve"> </w:t>
+      </w:r>
+      <w:r>
+        <w:t xml:space="preserve">in 7 logs,</w:t>
+      </w:r>
+      <w:r>
+        <w:t xml:space="preserve"> </w:t>
+      </w:r>
+      <w:r>
+        <w:rPr>
+          <w:rStyle w:val="VerbatimChar"/>
+        </w:rPr>
+        <w:t xml:space="preserve">STAB</w:t>
+      </w:r>
+      <w:r>
+        <w:t xml:space="preserve"> </w:t>
+      </w:r>
+      <w:r>
+        <w:t xml:space="preserve">in 4,</w:t>
+      </w:r>
+      <w:r>
+        <w:t xml:space="preserve"> </w:t>
+      </w:r>
+      <w:r>
+        <w:rPr>
+          <w:rStyle w:val="VerbatimChar"/>
+        </w:rPr>
+        <w:t xml:space="preserve">ALTCTL</w:t>
+      </w:r>
+      <w:r>
+        <w:t xml:space="preserve"> </w:t>
+      </w:r>
+      <w:r>
+        <w:t xml:space="preserve">in 3; including log</w:t>
+      </w:r>
+      <w:r>
+        <w:t xml:space="preserve"> </w:t>
+      </w:r>
+      <w:r>
+        <w:rPr>
+          <w:rStyle w:val="VerbatimChar"/>
+        </w:rPr>
+        <w:t xml:space="preserve">e9034973</w:t>
+      </w:r>
+      <w:r>
+        <w:t xml:space="preserve">,</w:t>
+      </w:r>
+      <w:r>
+        <w:t xml:space="preserve"> </w:t>
+      </w:r>
+      <w:r>
+        <w:t xml:space="preserve">which transitioned</w:t>
+      </w:r>
+      <w:r>
+        <w:t xml:space="preserve"> </w:t>
+      </w:r>
+      <w:r>
+        <w:rPr>
+          <w:rStyle w:val="VerbatimChar"/>
+        </w:rPr>
+        <w:t xml:space="preserve">POSCTL</w:t>
+      </w:r>
+      <w:r>
+        <w:t xml:space="preserve"> </w:t>
+      </w:r>
+      <m:oMath>
+        <m:r>
+          <m:rPr>
+            <m:sty m:val="p"/>
+          </m:rPr>
+          <m:t>→</m:t>
+        </m:r>
+      </m:oMath>
+      <w:r>
+        <w:t xml:space="preserve"> </w:t>
+      </w:r>
+      <w:r>
+        <w:rPr>
+          <w:rStyle w:val="VerbatimChar"/>
+        </w:rPr>
+        <w:t xml:space="preserve">AUTO_4</w:t>
+      </w:r>
+      <w:r>
+        <w:t xml:space="preserve"> </w:t>
+      </w:r>
+      <m:oMath>
+        <m:r>
+          <m:rPr>
+            <m:sty m:val="p"/>
+          </m:rPr>
+          <m:t>→</m:t>
+        </m:r>
+      </m:oMath>
+      <w:r>
+        <w:t xml:space="preserve"> </w:t>
+      </w:r>
+      <w:r>
+        <w:rPr>
+          <w:rStyle w:val="VerbatimChar"/>
+        </w:rPr>
+        <w:t xml:space="preserve">POSCTL</w:t>
+      </w:r>
+      <w:r>
+        <w:t xml:space="preserve"> </w:t>
+      </w:r>
+      <w:r>
+        <w:t xml:space="preserve">as the pilot attempted manual recovery). Because no hardware</w:t>
+      </w:r>
+      <w:r>
+        <w:t xml:space="preserve"> </w:t>
+      </w:r>
+      <w:r>
+        <w:t xml:space="preserve">failsafe fired before impact, the rule defaulted to blaming the pilot.</w:t>
+      </w:r>
+    </w:p>
+    <w:p>
+      <w:pPr>
+        <w:pStyle w:val="BodyText"/>
+      </w:pPr>
+      <w:r>
+        <w:t xml:space="preserve">Conversely, when evaluated on the 5 pilot-fault incidents, the fixed rule predicted</w:t>
+      </w:r>
+      <w:r>
+        <w:t xml:space="preserve"> </w:t>
+      </w:r>
+      <w:r>
+        <w:t xml:space="preserve">“aircraft”</w:t>
+      </w:r>
+      <w:r>
+        <w:t xml:space="preserve"> </w:t>
+      </w:r>
+      <w:r>
+        <w:t xml:space="preserve">in 4 (80.0%) and</w:t>
+      </w:r>
+      <w:r>
+        <w:t xml:space="preserve"> </w:t>
+      </w:r>
+      <w:r>
+        <w:t xml:space="preserve">“pilot”</w:t>
+      </w:r>
+      <w:r>
+        <w:t xml:space="preserve"> </w:t>
+      </w:r>
+      <w:r>
+        <w:t xml:space="preserve">in only 1 (20.0%;</w:t>
+      </w:r>
+      <w:r>
+        <w:t xml:space="preserve"> </w:t>
+      </w:r>
+      <w:r>
+        <w:t xml:space="preserve">pilot recall 1 of 5, exact Clopper–Pearson 95% CI 0.5–71.6%, Wilson 3.6–62.4%), misclassifying 4 of 5 pilot crashes because motor saturation,</w:t>
+      </w:r>
+      <w:r>
+        <w:t xml:space="preserve"> </w:t>
+      </w:r>
+      <w:r>
+        <w:t xml:space="preserve">accelerometer clipping, or failsafe activation occurred as the vehicle struck the ground. Combining both classes across all 37 decided expert logs</w:t>
+      </w:r>
+      <w:r>
+        <w:t xml:space="preserve"> </w:t>
+      </w:r>
+      <w:r>
+        <w:t xml:space="preserve">(32 aircraft, 5 pilot), the rule produced 18 incorrect decisions out of 37 (48.6% error rate), yielding a balanced accuracy of</w:t>
+      </w:r>
+      <w:r>
+        <w:t xml:space="preserve"> </w:t>
+      </w:r>
+      <m:oMath>
+        <m:r>
+          <m:rPr>
+            <m:sty m:val="p"/>
+          </m:rPr>
+          <m:t>(</m:t>
+        </m:r>
+        <m:r>
+          <m:t>56.25</m:t>
+        </m:r>
+        <m:r>
+          <m:rPr>
+            <m:sty m:val="p"/>
+          </m:rPr>
+          <m:t>%</m:t>
+        </m:r>
+        <m:r>
+          <m:rPr>
+            <m:sty m:val="p"/>
+          </m:rPr>
+          <m:t>+</m:t>
+        </m:r>
+        <m:r>
+          <m:t>20.0</m:t>
+        </m:r>
+        <m:r>
+          <m:rPr>
+            <m:sty m:val="p"/>
+          </m:rPr>
+          <m:t>%</m:t>
+        </m:r>
+        <m:r>
+          <m:rPr>
+            <m:sty m:val="p"/>
+          </m:rPr>
+          <m:t>)</m:t>
+        </m:r>
+        <m:r>
+          <m:rPr>
+            <m:sty m:val="p"/>
+          </m:rPr>
+          <m:t>/</m:t>
+        </m:r>
+        <m:r>
+          <m:t>2</m:t>
+        </m:r>
+        <m:r>
+          <m:rPr>
+            <m:sty m:val="p"/>
+          </m:rPr>
+          <m:t>=</m:t>
+        </m:r>
+        <m:r>
+          <m:t>38.1</m:t>
+        </m:r>
+        <m:r>
+          <m:rPr>
+            <m:sty m:val="p"/>
+          </m:rPr>
+          <m:t>%</m:t>
+        </m:r>
+      </m:oMath>
+      <w:r>
+        <w:t xml:space="preserve"> </w:t>
+      </w:r>
+      <w:r>
+        <w:t xml:space="preserve">(Bayesian 95% credible interval 0.25–0.61 from independent Jeffreys beta posteriors on the two recalls; exact 95% intervals for the recalls themselves are 37.7–73.6% for aircraft, 18 of 32, and 0.5–71.6% for pilot, 1 of 5). The interval contains chance (0.50) and lies below 0.70, the pass mark declared for the rule on uploader labels (not for this expert set), so the rule probably falls below that mark here but cannot be separated from chance. When evaluated on the subset of 34 logs with complete telemetry required by the statistical models (30 aircraft, 4 pilot), the rule decided 29 cases (25 aircraft, 4 pilot), predicting aircraft in 15 of 25 aircraft and 4 of 4 pilot, yielding a balanced accuracy of</w:t>
+      </w:r>
+      <w:r>
+        <w:t xml:space="preserve"> </w:t>
+      </w:r>
+      <m:oMath>
+        <m:r>
+          <m:rPr>
+            <m:sty m:val="p"/>
+          </m:rPr>
+          <m:t>(</m:t>
+        </m:r>
+        <m:r>
+          <m:t>60.0</m:t>
+        </m:r>
+        <m:r>
+          <m:rPr>
+            <m:sty m:val="p"/>
+          </m:rPr>
+          <m:t>%</m:t>
+        </m:r>
+        <m:r>
+          <m:rPr>
+            <m:sty m:val="p"/>
+          </m:rPr>
+          <m:t>+</m:t>
+        </m:r>
+        <m:r>
+          <m:t>0.0</m:t>
+        </m:r>
+        <m:r>
+          <m:rPr>
+            <m:sty m:val="p"/>
+          </m:rPr>
+          <m:t>%</m:t>
+        </m:r>
+        <m:r>
+          <m:rPr>
+            <m:sty m:val="p"/>
+          </m:rPr>
+          <m:t>)</m:t>
+        </m:r>
+        <m:r>
+          <m:rPr>
+            <m:sty m:val="p"/>
+          </m:rPr>
+          <m:t>/</m:t>
+        </m:r>
+        <m:r>
+          <m:t>2</m:t>
+        </m:r>
+        <m:r>
+          <m:rPr>
+            <m:sty m:val="p"/>
+          </m:rPr>
+          <m:t>=</m:t>
+        </m:r>
+        <m:r>
+          <m:t>30.0</m:t>
+        </m:r>
+        <m:r>
+          <m:rPr>
+            <m:sty m:val="p"/>
+          </m:rPr>
+          <m:t>%</m:t>
+        </m:r>
+      </m:oMath>
+      <w:r>
+        <w:t xml:space="preserve">. Of the 30 complete aircraft logs, exactly 5 overlapped with the 148 modelled crashes in the training pool (all 5 rated</w:t>
+      </w:r>
+      <w:r>
+        <w:t xml:space="preserve"> </w:t>
+      </w:r>
+      <w:r>
+        <w:rPr>
+          <w:rStyle w:val="VerbatimChar"/>
+        </w:rPr>
+        <w:t xml:space="preserve">crash_sw_hw</w:t>
+      </w:r>
+      <w:r>
+        <w:t xml:space="preserve"> </w:t>
+      </w:r>
+      <w:r>
         <w:t xml:space="preserve">in the index; 0 pilot logs overlapped). Evaluating the cross-validated logistic regression model across all 34 complete logs yielded predictions of</w:t>
       </w:r>
       <w:r>
@@ -23991,7 +24303,7 @@
         <w:t xml:space="preserve">Nonetheless, this independent evaluation illustrates the challenge of log-based attribution: neither the heuristic rule nor the statistical model demonstrated reliable agreement above chance.</w:t>
       </w:r>
     </w:p>
-    <w:bookmarkStart w:id="65" w:name="_83343f61327e522fa9ffc9aa8f722d134b07ff7"/>
+    <w:bookmarkStart w:id="66" w:name="_83343f61327e522fa9ffc9aa8f722d134b07ff7"/>
     <w:p>
       <w:pPr>
         <w:pStyle w:val="TableCaption"/>
@@ -25038,8 +25350,8 @@
         </w:tc>
       </w:tr>
     </w:tbl>
-    <w:bookmarkEnd w:id="65"/>
-    <w:bookmarkStart w:id="69" w:name="_c0d72e502cb8722b270509e9f977263b14fe2c0"/>
+    <w:bookmarkEnd w:id="66"/>
+    <w:bookmarkStart w:id="70" w:name="_c0d72e502cb8722b270509e9f977263b14fe2c0"/>
     <w:p>
       <w:pPr>
         <w:pStyle w:val="CaptionedFigure"/>
@@ -25050,18 +25362,18 @@
           <wp:inline>
             <wp:extent cx="4160520" cy="2603928"/>
             <wp:effectExtent b="0" l="0" r="0" t="0"/>
-            <wp:docPr descr="" title="" id="67" name="Picture"/>
+            <wp:docPr descr="" title="" id="68" name="Picture"/>
             <a:graphic>
               <a:graphicData uri="http://schemas.openxmlformats.org/drawingml/2006/picture">
                 <pic:pic>
                   <pic:nvPicPr>
-                    <pic:cNvPr descr="fig_forum_causes.png" id="68" name="Picture"/>
+                    <pic:cNvPr descr="fig_forum_causes.png" id="69" name="Picture"/>
                     <pic:cNvPicPr>
                       <a:picLocks noChangeArrowheads="1" noChangeAspect="1"/>
                     </pic:cNvPicPr>
                   </pic:nvPicPr>
                   <pic:blipFill>
-                    <a:blip r:embed="rId66"/>
+                    <a:blip r:embed="rId67"/>
                     <a:stretch>
                       <a:fillRect/>
                     </a:stretch>
@@ -25096,17 +25408,17 @@
         <w:t xml:space="preserve">Figure 6. Causes named by experts in PX4 forum threads that attributed a crash to the aircraft.</w:t>
       </w:r>
     </w:p>
-    <w:bookmarkEnd w:id="69"/>
+    <w:bookmarkEnd w:id="70"/>
     <w:p>
       <w:pPr>
         <w:pStyle w:val="Heading2"/>
       </w:pPr>
-      <w:bookmarkStart w:id="70" w:name="_fb365ced420b86c8cd60024101a350b346a0a31"/>
+      <w:bookmarkStart w:id="71" w:name="_fb365ced420b86c8cd60024101a350b346a0a31"/>
       <w:r>
         <w:rPr>
           <w:rStyle w:val="SectionNumber"/>
         </w:rPr>
-        <w:t xml:space="preserve">5.10</w:t>
+        <w:t xml:space="preserve">5.11</w:t>
       </w:r>
       <w:r>
         <w:tab/>
@@ -25114,7 +25426,7 @@
       <w:r>
         <w:t xml:space="preserve">Exploratory evaluation of language-model review panels (preliminary)</w:t>
       </w:r>
-      <w:bookmarkEnd w:id="70"/>
+      <w:bookmarkEnd w:id="71"/>
     </w:p>
     <w:p>
       <w:pPr>
@@ -25124,7 +25436,7 @@
         <w:t xml:space="preserve">Because language-model assistants are increasingly proposed for automated flight log analysis, we conducted a preliminary exploratory evaluation on 60 author-generated fault cases using four local models (3–4B parameters) configured both as single agents and as multi-agent review panels (Table 13). While a fixed deterministic rule achieved 75% accuracy (naming the true cause in 35 of 50 active cases and correctly abstaining on 10 no-cause cases) with 0% error (referring 15 cases to human operators), local language models produced substantial error rates (10–63% wrong), suffered from mode collapse or complete abstention on active causes, and proved highly vulnerable to consensus manipulation: in a worst-case sensitivity sweep, a single compromised reviewer systematically flipped the panel’s consensus decision in 45 to 56 of the 60 cases. In contrast, deterministic numeric telemetry extraction into code prevented direct prompt injection by construction across 40 hostile input strings. This exploratory comparison indicates that the tested small local models and review-panel configurations were unreliable on the 60 author-generated cases. Because the cases and fixed rule were developed by the same authors, the comparison is not an independent benchmark and should not be generalized to language models as a class or larger architectures. These preliminary results emphasize that multi-agent consensus voting without cryptographic proofs or fact-citation constraints cannot provide dependable safety assurance.</w:t>
       </w:r>
     </w:p>
-    <w:bookmarkStart w:id="71" w:name="_e9a1c7ab9cd062877714c77f2a5f253f301b820"/>
+    <w:bookmarkStart w:id="72" w:name="_e9a1c7ab9cd062877714c77f2a5f253f301b820"/>
     <w:p>
       <w:pPr>
         <w:pStyle w:val="TableCaption"/>
@@ -26074,7 +26386,7 @@
         </w:tc>
       </w:tr>
     </w:tbl>
-    <w:bookmarkEnd w:id="71"/>
+    <w:bookmarkEnd w:id="72"/>
     <w:p>
       <w:pPr>
         <w:pStyle w:val="FirstParagraph"/>
@@ -26101,7 +26413,7 @@
       <w:pPr>
         <w:pStyle w:val="Heading1"/>
       </w:pPr>
-      <w:bookmarkStart w:id="72" w:name="_5197750e0310900a35791fde6fc3b970851116d"/>
+      <w:bookmarkStart w:id="73" w:name="_5197750e0310900a35791fde6fc3b970851116d"/>
       <w:r>
         <w:rPr>
           <w:rStyle w:val="SectionNumber"/>
@@ -26114,7 +26426,7 @@
       <w:r>
         <w:t xml:space="preserve">Design implications for fleet assurance</w:t>
       </w:r>
-      <w:bookmarkEnd w:id="72"/>
+      <w:bookmarkEnd w:id="73"/>
     </w:p>
     <w:p>
       <w:pPr>
@@ -26123,7 +26435,7 @@
       <w:r>
         <w:t xml:space="preserve">To translate these empirical findings into operational practice, we developed AeroFleet 2.0 (</w:t>
       </w:r>
-      <w:hyperlink r:id="rId73">
+      <w:hyperlink r:id="rId74">
         <w:r>
           <w:rPr>
             <w:rStyle w:val="Hyperlink"/>
@@ -26163,7 +26475,7 @@
         <w:t xml:space="preserve">at an assumed 10% flag rate, 41–44 inspections per crash), rather than issuing per-flight crash alarms. Finally, to ensure evidentiary integrity over the lifecycle of each airframe, all reviews, approvals, and configuration checks are appended to a tamper-evident, Ed25519-signed record referencing SHA-256 digests of the original telemetry files.</w:t>
       </w:r>
     </w:p>
-    <w:bookmarkStart w:id="74" w:name="_4816a700d4290cff51a6fa69217ee9f1521b64f"/>
+    <w:bookmarkStart w:id="75" w:name="_4816a700d4290cff51a6fa69217ee9f1521b64f"/>
     <w:p>
       <w:pPr>
         <w:pStyle w:val="TableCaption"/>
@@ -26274,7 +26586,7 @@
               <w:rPr>
                 <w:sz w:val="19"/>
               </w:rPr>
-              <w:t xml:space="preserve">Across the telemetry features, rules, and models evaluated here, logs do not separate pilot from aircraft causes above chance (balanced accuracy 0.47 on held-out test, 0.381 on expert set, 95% CrI 0.25–0.61; §5.2, §5.9)</w:t>
+              <w:t xml:space="preserve">Across the telemetry features, rules, and models evaluated here, logs do not separate pilot from aircraft causes above chance (balanced accuracy 0.47 on held-out test, 0.381 on expert set, 95% CrI 0.25–0.61; §5.2, §5.10)</w:t>
             </w:r>
           </w:p>
         </w:tc>
@@ -26368,7 +26680,7 @@
               <w:rPr>
                 <w:sz w:val="19"/>
               </w:rPr>
-              <w:t xml:space="preserve">, exploratory; §5.3, §5.9)</w:t>
+              <w:t xml:space="preserve">, exploratory; §5.3, §5.10)</w:t>
             </w:r>
           </w:p>
         </w:tc>
@@ -26599,7 +26911,7 @@
               <w:rPr>
                 <w:sz w:val="19"/>
               </w:rPr>
-              <w:t xml:space="preserve">Multi-agent consensus voting is vulnerable to reviewer manipulation in exploratory 60-case setup (§5.10)</w:t>
+              <w:t xml:space="preserve">Multi-agent consensus voting is vulnerable to reviewer manipulation in exploratory 60-case setup (§5.11)</w:t>
             </w:r>
           </w:p>
         </w:tc>
@@ -26621,12 +26933,12 @@
         </w:tc>
       </w:tr>
     </w:tbl>
-    <w:bookmarkEnd w:id="74"/>
+    <w:bookmarkEnd w:id="75"/>
     <w:p>
       <w:pPr>
         <w:pStyle w:val="Heading2"/>
       </w:pPr>
-      <w:bookmarkStart w:id="75" w:name="_46768506b9d2d22e677daf79594de5255acfb0b"/>
+      <w:bookmarkStart w:id="76" w:name="_46768506b9d2d22e677daf79594de5255acfb0b"/>
       <w:r>
         <w:rPr>
           <w:rStyle w:val="SectionNumber"/>
@@ -26639,7 +26951,7 @@
       <w:r>
         <w:t xml:space="preserve">Recommended reporting checklist for flight-log diagnostics</w:t>
       </w:r>
-      <w:bookmarkEnd w:id="75"/>
+      <w:bookmarkEnd w:id="76"/>
     </w:p>
     <w:p>
       <w:pPr>
@@ -26649,7 +26961,7 @@
         <w:t xml:space="preserve">To support drone safety regulators, accident investigators, and data-driven diagnostic tool developers in avoiding the leakage and confounding traps quantified in this study, Table 15 outlines a nine-item recommended reporting checklist. Each item pairs a methodological recommendation with its empirical rationale and the specific failure mode observed in our experiments when that control is omitted.</w:t>
       </w:r>
     </w:p>
-    <w:bookmarkStart w:id="76" w:name="_8dfd3cae62712a91b3c1ba079a4ea82fa2a3d98"/>
+    <w:bookmarkStart w:id="77" w:name="_8dfd3cae62712a91b3c1ba079a4ea82fa2a3d98"/>
     <w:p>
       <w:pPr>
         <w:pStyle w:val="TableCaption"/>
@@ -27202,7 +27514,7 @@
               <w:rPr>
                 <w:sz w:val="19"/>
               </w:rPr>
-              <w:t xml:space="preserve">Uploader labels are noisy and biased; evaluation should quantify inter-rater reliability across both pilot-fault and aircraft-fault classes (§5.9).</w:t>
+              <w:t xml:space="preserve">Uploader labels are noisy and biased; evaluation should quantify inter-rater reliability across both pilot-fault and aircraft-fault classes (§5.10).</w:t>
             </w:r>
           </w:p>
         </w:tc>
@@ -27464,13 +27776,80 @@
           </w:p>
         </w:tc>
       </w:tr>
+      <w:tr>
+        <w:tc>
+          <w:tcPr/>
+          <w:p>
+            <w:pPr>
+              <w:pStyle w:val="Compact"/>
+              <w:spacing w:line="240" w:lineRule="auto"/>
+              <w:jc w:val="left"/>
+            </w:pPr>
+            <w:r>
+              <w:rPr>
+                <w:sz w:val="19"/>
+              </w:rPr>
+              <w:t xml:space="preserve">10. Pre-onset baseline</w:t>
+            </w:r>
+            <m:oMath>
+              <m:sSup>
+                <m:e>
+                  <m:r>
+                    <m:t>​</m:t>
+                  </m:r>
+                </m:e>
+                <m:sup>
+                  <m:r>
+                    <m:rPr>
+                      <m:sty m:val="p"/>
+                    </m:rPr>
+                    <m:t>†</m:t>
+                  </m:r>
+                </m:sup>
+              </m:sSup>
+            </m:oMath>
+          </w:p>
+        </w:tc>
+        <w:tc>
+          <w:tcPr/>
+          <w:p>
+            <w:pPr>
+              <w:pStyle w:val="Compact"/>
+              <w:spacing w:line="240" w:lineRule="auto"/>
+              <w:jc w:val="left"/>
+            </w:pPr>
+            <w:r>
+              <w:rPr>
+                <w:sz w:val="19"/>
+              </w:rPr>
+              <w:t xml:space="preserve">Where onset is known, report the same classifier on data before the onset</w:t>
+            </w:r>
+          </w:p>
+        </w:tc>
+        <w:tc>
+          <w:tcPr/>
+          <w:p>
+            <w:pPr>
+              <w:pStyle w:val="Compact"/>
+              <w:spacing w:line="240" w:lineRule="auto"/>
+              <w:jc w:val="left"/>
+            </w:pPr>
+            <w:r>
+              <w:rPr>
+                <w:sz w:val="19"/>
+              </w:rPr>
+              <w:t xml:space="preserve">On 488 injected-fault flights our features reached AUC 0.86 before the fault and 0.85 with it, so the separation was not the fault (§5.9).</w:t>
+            </w:r>
+          </w:p>
+        </w:tc>
+      </w:tr>
     </w:tbl>
-    <w:bookmarkEnd w:id="76"/>
+    <w:bookmarkEnd w:id="77"/>
     <w:p>
       <w:pPr>
         <w:pStyle w:val="Heading1"/>
       </w:pPr>
-      <w:bookmarkStart w:id="77" w:name="_074802e0e16f6322e726b21f081c01c392e8fbd"/>
+      <w:bookmarkStart w:id="78" w:name="_074802e0e16f6322e726b21f081c01c392e8fbd"/>
       <w:r>
         <w:rPr>
           <w:rStyle w:val="SectionNumber"/>
@@ -27483,7 +27862,7 @@
       <w:r>
         <w:t xml:space="preserve">Discussion</w:t>
       </w:r>
-      <w:bookmarkEnd w:id="77"/>
+      <w:bookmarkEnd w:id="78"/>
     </w:p>
     <w:p>
       <w:pPr>
@@ -28569,6 +28948,29 @@
       <w:r>
         <w:t xml:space="preserve">needed to make progress on attribution, and our expert-diagnosis labels are a small first step.</w:t>
       </w:r>
+      <w:r>
+        <w:t xml:space="preserve"> </w:t>
+      </w:r>
+      <m:oMath>
+        <m:sSup>
+          <m:e>
+            <m:r>
+              <m:t>​</m:t>
+            </m:r>
+          </m:e>
+          <m:sup>
+            <m:r>
+              <m:rPr>
+                <m:sty m:val="p"/>
+              </m:rPr>
+              <m:t>†</m:t>
+            </m:r>
+          </m:sup>
+        </m:sSup>
+      </m:oMath>
+      <w:r>
+        <w:t xml:space="preserve">Injected-fault data are still useful as a control: on RflyMAD’s real flights our features separated faulty from fault-free flights before any fault existed (AUC 0.86; Section 5.9), so evaluations on such datasets should report a pre-onset baseline alongside detection accuracy.</w:t>
+      </w:r>
     </w:p>
     <w:p>
       <w:pPr>
@@ -28731,7 +29133,7 @@
       <w:pPr>
         <w:pStyle w:val="Heading1"/>
       </w:pPr>
-      <w:bookmarkStart w:id="78" w:name="_82b82981e21bad8167d56d1f0b74a832e215810"/>
+      <w:bookmarkStart w:id="79" w:name="_82b82981e21bad8167d56d1f0b74a832e215810"/>
       <w:r>
         <w:rPr>
           <w:rStyle w:val="SectionNumber"/>
@@ -28744,7 +29146,7 @@
       <w:r>
         <w:t xml:space="preserve">Threats to validity</w:t>
       </w:r>
-      <w:bookmarkEnd w:id="78"/>
+      <w:bookmarkEnd w:id="79"/>
     </w:p>
     <w:p>
       <w:pPr>
@@ -30007,285 +30409,7 @@
           <w:b/>
           <w:bCs/>
         </w:rPr>
-        <w:t xml:space="preserve">The tool.</w:t>
-      </w:r>
-      <w:r>
-        <w:t xml:space="preserve"> </w:t>
-      </w:r>
-      <w:r>
-        <w:t xml:space="preserve">AeroFleet 2.0 is an open-source evidence-review tool whose operational safety benefit has not yet been demonstrated in field deployment. The software verifies parameter baselines and longitudinal vibration ranks deterministically from telemetry files; prospective evaluation of the vibration ranking in operational fleets and evaluation with human operators remain future work (Sections 6 and 7).</w:t>
-      </w:r>
-    </w:p>
-    <w:p>
-      <w:pPr>
-        <w:pStyle w:val="Heading1"/>
-      </w:pPr>
-      <w:bookmarkStart w:id="79" w:name="_0cf7f8e9027f9f9352f3019b4ede1d43d537ff7"/>
-      <w:r>
-        <w:rPr>
-          <w:rStyle w:val="SectionNumber"/>
-        </w:rPr>
-        <w:t xml:space="preserve">9</w:t>
-      </w:r>
-      <w:r>
-        <w:tab/>
-      </w:r>
-      <w:r>
-        <w:t xml:space="preserve">Conclusion</w:t>
-      </w:r>
-      <w:bookmarkEnd w:id="79"/>
-    </w:p>
-    <w:p>
-      <w:pPr>
-        <w:pStyle w:val="FirstParagraph"/>
-      </w:pPr>
-      <w:r>
-        <w:t xml:space="preserve">Across 590 crash-rated logs from a 479,547-flight PX4 archive, flight logs did not support pilot-versus-aircraft verdicts. A fixed rule reached 0.47 balanced accuracy on held-out crashes, and exploratory models stayed near chance (AUC 0.42–0.59; approximate upper bounds at most 0.69), short of the roughly 0.8 an operational verdict needs; with 36 pilot-labelled crashes, only an AUC of about 0.72 could be detected with 80% power. Agreement with 43 expert-diagnosed logs was inconclusive (balanced accuracy 0.38, Bayesian 95% CrI 0.25–0.61).</w:t>
-      </w:r>
-    </w:p>
-    <w:p>
-      <w:pPr>
-        <w:pStyle w:val="BodyText"/>
-      </w:pPr>
-      <w:r>
-        <w:t xml:space="preserve">Part of what looks like crash anticipation comes from how an evaluation is built. In a factorial audit of 32 settings, the apparent AUC of 0.88 fell by 0.21 across settings, of which 0.06 came from grouping folds by vehicle, the only factor that could be isolated; and crash-window leakage was small overall but material among the minority of crashes whose log shows a crash-like tilt. The archive’s labels are also weaker than assumed: most crash-rated multicopter logs show no crash-like tilt, where the computed crash moment is usually wrong, and pilot-rated logs show one less often than aircraft-rated ones. Ordering flights by archive date failed for same-day flights: by GPS time, 44–55% of dated crash-day</w:t>
-      </w:r>
-      <w:r>
-        <w:t xml:space="preserve"> </w:t>
-      </w:r>
-      <w:r>
-        <w:t xml:space="preserve">“earlier”</w:t>
-      </w:r>
-      <w:r>
-        <w:t xml:space="preserve"> </w:t>
-      </w:r>
-      <w:r>
-        <w:t xml:space="preserve">flights were flown after the crash. Against each drone’s own earlier flights, the crash flight showed no warning in vibration or rate tracking. A published open-source log checker, run unchanged under the same protocol, showed the same three results: separation from other drones’ flights, no warning within a drone, and attribution at chance.</w:t>
-      </w:r>
-    </w:p>
-    <w:p>
-      <w:pPr>
-        <w:pStyle w:val="BodyText"/>
-      </w:pPr>
-      <w:r>
-        <w:t xml:space="preserve">What the logs did show is a suggestive between-airframe signal: drones that later crashed vibrated more than matched drones on ordinary flights on older estimator metrics (mean rank 0.67;</w:t>
-      </w:r>
-      <w:r>
-        <w:t xml:space="preserve"> </w:t>
-      </w:r>
-      <m:oMath>
-        <m:r>
-          <m:t>p</m:t>
-        </m:r>
-        <m:r>
-          <m:rPr>
-            <m:sty m:val="p"/>
-          </m:rPr>
-          <m:t>=</m:t>
-        </m:r>
-        <m:r>
-          <m:t>0.012</m:t>
-        </m:r>
-      </m:oMath>
-      <w:r>
-        <w:t xml:space="preserve"> </w:t>
-      </w:r>
-      <w:r>
-        <w:t xml:space="preserve">clustered by airframe, Holm-adjusted 0.08), and replication on newer metrics was inconclusive. Used to rank airframes for inspection, it gave an illustrative</w:t>
-      </w:r>
-      <w:r>
-        <w:t xml:space="preserve"> </w:t>
-      </w:r>
-      <m:oMath>
-        <m:r>
-          <m:t>3.3</m:t>
-        </m:r>
-        <m:r>
-          <m:rPr>
-            <m:sty m:val="p"/>
-          </m:rPr>
-          <m:t>×</m:t>
-        </m:r>
-      </m:oMath>
-      <w:r>
-        <w:t xml:space="preserve"> </w:t>
-      </w:r>
-      <w:r>
-        <w:t xml:space="preserve">lift at an assumed 10% flag rate.</w:t>
-      </w:r>
-    </w:p>
-    <w:p>
-      <w:pPr>
-        <w:pStyle w:val="BodyText"/>
-      </w:pPr>
-      <w:r>
-        <w:t xml:space="preserve">Log analytics for drone fleets should therefore present evidence rather than issue verdicts; ranking airframes by vibration is a hypothesis for prospective testing, and should be evaluated with vehicle-grouped folds, comparisons against each aircraft’s own history, and flights ordered by GPS time. AeroFleet 2.0 implements this approach as an open-source tool.</w:t>
-      </w:r>
-    </w:p>
-    <w:p>
-      <w:pPr>
-        <w:pStyle w:val="Heading1"/>
-      </w:pPr>
-      <w:bookmarkStart w:id="80" w:name="_84dc18e74b75db6057c8c16a8f70e097972540a"/>
-      <w:r>
-        <w:t xml:space="preserve">Declaration of competing interest</w:t>
-      </w:r>
-      <w:bookmarkEnd w:id="80"/>
-    </w:p>
-    <w:p>
-      <w:pPr>
-        <w:pStyle w:val="FirstParagraph"/>
-      </w:pPr>
-      <w:r>
-        <w:t xml:space="preserve">The authors declare that they have no known competing financial interests or personal relationships that could have appeared to influence the work reported in this paper. The authors develop the open-source AeroFleet 2.0 tool described in Section 6; it is not commercial.</w:t>
-      </w:r>
-    </w:p>
-    <w:p>
-      <w:pPr>
-        <w:pStyle w:val="Heading1"/>
-      </w:pPr>
-      <w:bookmarkStart w:id="81" w:name="_1f74eb43af444059c7518034463b6c89b1cacf4"/>
-      <w:r>
-        <w:t xml:space="preserve">Declaration of generative AI and AI-assisted technologies in the manuscript preparation process</w:t>
-      </w:r>
-      <w:bookmarkEnd w:id="81"/>
-    </w:p>
-    <w:p>
-      <w:pPr>
-        <w:pStyle w:val="FirstParagraph"/>
-      </w:pPr>
-      <w:r>
-        <w:t xml:space="preserve">During the preparation of this work the authors used an AI assistant (Claude, Anthropic) to write analysis code, draft</w:t>
-      </w:r>
-      <w:r>
-        <w:t xml:space="preserve"> </w:t>
-      </w:r>
-      <w:r>
-        <w:t xml:space="preserve">and revise text, and assist the recording of forum diagnoses. After using this tool, the authors reviewed and edited</w:t>
-      </w:r>
-      <w:r>
-        <w:t xml:space="preserve"> </w:t>
-      </w:r>
-      <w:r>
-        <w:t xml:space="preserve">the content as needed and take full responsibility for the content of the published article.</w:t>
-      </w:r>
-    </w:p>
-    <w:p>
-      <w:pPr>
-        <w:pStyle w:val="Heading1"/>
-      </w:pPr>
-      <w:bookmarkStart w:id="82" w:name="_ea5c66868f283220c19382d0fdd5a852ec570ca"/>
-      <w:r>
-        <w:t xml:space="preserve">Data availability</w:t>
-      </w:r>
-      <w:bookmarkEnd w:id="82"/>
-    </w:p>
-    <w:p>
-      <w:pPr>
-        <w:pStyle w:val="FirstParagraph"/>
-      </w:pPr>
-      <w:r>
-        <w:t xml:space="preserve">Selection scripts, analysis code, the declared hypotheses with their commit history, derived features, expert labels</w:t>
-      </w:r>
-      <w:r>
-        <w:t xml:space="preserve"> </w:t>
-      </w:r>
-      <w:r>
-        <w:t xml:space="preserve">(without forum text), and the source code of the AeroFleet 2.0 tool are available at</w:t>
-      </w:r>
-      <w:r>
-        <w:t xml:space="preserve"> </w:t>
-      </w:r>
-      <w:hyperlink r:id="rId73">
-        <w:r>
-          <w:rPr>
-            <w:rStyle w:val="Hyperlink"/>
-          </w:rPr>
-          <w:t xml:space="preserve">https://github.com/AdityaPathare46/aerofleet</w:t>
-        </w:r>
-      </w:hyperlink>
-      <w:r>
-        <w:t xml:space="preserve">; a DOI-archived release will be provided on acceptance. Raw logs</w:t>
-      </w:r>
-      <w:r>
-        <w:t xml:space="preserve"> </w:t>
-      </w:r>
-      <w:r>
-        <w:t xml:space="preserve">are public on PX4 Flight Review and are referenced by identifier.</w:t>
-      </w:r>
-    </w:p>
-    <w:p>
-      <w:pPr>
-        <w:pStyle w:val="Heading1"/>
-      </w:pPr>
-      <w:bookmarkStart w:id="83" w:name="_funding"/>
-      <w:r>
-        <w:t xml:space="preserve">Funding</w:t>
-      </w:r>
-      <w:bookmarkEnd w:id="83"/>
-    </w:p>
-    <w:p>
-      <w:pPr>
-        <w:pStyle w:val="FirstParagraph"/>
-      </w:pPr>
-      <w:r>
-        <w:t xml:space="preserve">This research did not receive any specific grant from funding agencies in the public, commercial, or not-for-profit</w:t>
-      </w:r>
-      <w:r>
-        <w:t xml:space="preserve"> </w:t>
-      </w:r>
-      <w:r>
-        <w:t xml:space="preserve">sectors.</w:t>
-      </w:r>
-    </w:p>
-    <w:p>
-      <w:pPr>
-        <w:pStyle w:val="Heading1"/>
-      </w:pPr>
-      <w:bookmarkStart w:id="84" w:name="_000b339d75a155a848ca0c43e54b0b02b7b82d8"/>
-      <w:r>
-        <w:rPr>
-          <w:rStyle w:val="SectionNumber"/>
-        </w:rPr>
-        <w:t xml:space="preserve">10</w:t>
-      </w:r>
-      <w:r>
-        <w:tab/>
-      </w:r>
-      <w:r>
-        <w:t xml:space="preserve">Exploratory analyses added after the declared protocol</w:t>
-      </w:r>
-      <w:bookmarkEnd w:id="84"/>
-    </w:p>
-    <w:p>
-      <w:pPr>
-        <w:pStyle w:val="FirstParagraph"/>
-      </w:pPr>
-      <w:r>
-        <w:t xml:space="preserve">To preserve the boundary between pre-declared confirmatory hypotheses (committed to version control on 20–24 October 2026; Table 4) and exploratory analyses added after the declared protocol</w:t>
-      </w:r>
-      <w:r>
-        <w:t xml:space="preserve"> </w:t>
-      </w:r>
-      <w:r>
-        <w:t xml:space="preserve">[</w:t>
-      </w:r>
-      <w:hyperlink w:anchor="_f6e66cea9a1ea78573b548bc5cf8461c81300ca">
-        <w:r>
-          <w:rPr>
-            <w:rStyle w:val="Hyperlink"/>
-          </w:rPr>
-          <w:t xml:space="preserve">36</w:t>
-        </w:r>
-      </w:hyperlink>
-      <w:r>
-        <w:t xml:space="preserve">]</w:t>
-      </w:r>
-      <w:r>
-        <w:t xml:space="preserve">, Table A.16 documents each such analysis, its motivation, key results, git commit hash, first archive date in Software Heritage, and analysis run date. They are marked with</w:t>
-      </w:r>
-      <w:r>
-        <w:t xml:space="preserve"> </w:t>
+        <w:t xml:space="preserve">Injected faults</w:t>
       </w:r>
       <m:oMath>
         <m:sSup>
@@ -30305,13 +30429,333 @@
         </m:sSup>
       </m:oMath>
       <w:r>
+        <w:rPr>
+          <w:b/>
+          <w:bCs/>
+        </w:rPr>
+        <w:t xml:space="preserve">.</w:t>
+      </w:r>
+      <w:r>
+        <w:t xml:space="preserve"> </w:t>
+      </w:r>
+      <w:r>
+        <w:t xml:space="preserve">The RflyMAD control uses three airframes flown by one team, faults injected in firmware (mostly a 15–20% motor efficiency loss or sensor noise) that rarely end in a crash, and stratified rather than vehicle-grouped folds, because three airframes are too few to group by. Its pre-fault separation shows that fault and fault-free flights were flown differently; it does not show how large that effect is in other datasets. The rule’s low sensitivity there concerns faults the controller absorbs; it does not show the rule would miss a fault that ends in a crash.</w:t>
+      </w:r>
+    </w:p>
+    <w:p>
+      <w:pPr>
+        <w:pStyle w:val="BodyText"/>
+      </w:pPr>
+      <w:r>
+        <w:rPr>
+          <w:b/>
+          <w:bCs/>
+        </w:rPr>
+        <w:t xml:space="preserve">The tool.</w:t>
+      </w:r>
+      <w:r>
+        <w:t xml:space="preserve"> </w:t>
+      </w:r>
+      <w:r>
+        <w:t xml:space="preserve">AeroFleet 2.0 is an open-source evidence-review tool whose operational safety benefit has not yet been demonstrated in field deployment. The software verifies parameter baselines and longitudinal vibration ranks deterministically from telemetry files; prospective evaluation of the vibration ranking in operational fleets and evaluation with human operators remain future work (Sections 6 and 7).</w:t>
+      </w:r>
+    </w:p>
+    <w:p>
+      <w:pPr>
+        <w:pStyle w:val="Heading1"/>
+      </w:pPr>
+      <w:bookmarkStart w:id="80" w:name="_0cf7f8e9027f9f9352f3019b4ede1d43d537ff7"/>
+      <w:r>
+        <w:rPr>
+          <w:rStyle w:val="SectionNumber"/>
+        </w:rPr>
+        <w:t xml:space="preserve">9</w:t>
+      </w:r>
+      <w:r>
+        <w:tab/>
+      </w:r>
+      <w:r>
+        <w:t xml:space="preserve">Conclusion</w:t>
+      </w:r>
+      <w:bookmarkEnd w:id="80"/>
+    </w:p>
+    <w:p>
+      <w:pPr>
+        <w:pStyle w:val="FirstParagraph"/>
+      </w:pPr>
+      <w:r>
+        <w:t xml:space="preserve">Across 590 crash-rated logs from a 479,547-flight PX4 archive, flight logs did not support pilot-versus-aircraft verdicts. A fixed rule reached 0.47 balanced accuracy on held-out crashes, and exploratory models stayed near chance (AUC 0.42–0.59; approximate upper bounds at most 0.69), short of the roughly 0.8 an operational verdict needs; with 36 pilot-labelled crashes, only an AUC of about 0.72 could be detected with 80% power. Agreement with 43 expert-diagnosed logs was inconclusive (balanced accuracy 0.38, Bayesian 95% CrI 0.25–0.61).</w:t>
+      </w:r>
+    </w:p>
+    <w:p>
+      <w:pPr>
+        <w:pStyle w:val="BodyText"/>
+      </w:pPr>
+      <w:r>
+        <w:t xml:space="preserve">Part of what looks like crash anticipation comes from how an evaluation is built. In a factorial audit of 32 settings, the apparent AUC of 0.88 fell by 0.21 across settings, of which 0.06 came from grouping folds by vehicle, the only factor that could be isolated; and crash-window leakage was small overall but material among the minority of crashes whose log shows a crash-like tilt. The archive’s labels are also weaker than assumed: most crash-rated multicopter logs show no crash-like tilt, where the computed crash moment is usually wrong, and pilot-rated logs show one less often than aircraft-rated ones. Ordering flights by archive date failed for same-day flights: by GPS time, 44–55% of dated crash-day</w:t>
+      </w:r>
+      <w:r>
+        <w:t xml:space="preserve"> </w:t>
+      </w:r>
+      <w:r>
+        <w:t xml:space="preserve">“earlier”</w:t>
+      </w:r>
+      <w:r>
+        <w:t xml:space="preserve"> </w:t>
+      </w:r>
+      <w:r>
+        <w:t xml:space="preserve">flights were flown after the crash. Against each drone’s own earlier flights, the crash flight showed no warning in vibration or rate tracking. A published open-source log checker, run unchanged under the same protocol, showed the same three results: separation from other drones’ flights, no warning within a drone, and attribution at chance. On real flights with injected faults of known onset, our features separated faulty from fault-free flights before the fault was injected, and the declared rule recognised almost none of the known motor faults.</w:t>
+      </w:r>
+    </w:p>
+    <w:p>
+      <w:pPr>
+        <w:pStyle w:val="BodyText"/>
+      </w:pPr>
+      <w:r>
+        <w:t xml:space="preserve">What the logs did show is a suggestive between-airframe signal: drones that later crashed vibrated more than matched drones on ordinary flights on older estimator metrics (mean rank 0.67;</w:t>
+      </w:r>
+      <w:r>
+        <w:t xml:space="preserve"> </w:t>
+      </w:r>
+      <m:oMath>
+        <m:r>
+          <m:t>p</m:t>
+        </m:r>
+        <m:r>
+          <m:rPr>
+            <m:sty m:val="p"/>
+          </m:rPr>
+          <m:t>=</m:t>
+        </m:r>
+        <m:r>
+          <m:t>0.012</m:t>
+        </m:r>
+      </m:oMath>
+      <w:r>
+        <w:t xml:space="preserve"> </w:t>
+      </w:r>
+      <w:r>
+        <w:t xml:space="preserve">clustered by airframe, Holm-adjusted 0.08), and replication on newer metrics was inconclusive. Used to rank airframes for inspection, it gave an illustrative</w:t>
+      </w:r>
+      <w:r>
+        <w:t xml:space="preserve"> </w:t>
+      </w:r>
+      <m:oMath>
+        <m:r>
+          <m:t>3.3</m:t>
+        </m:r>
+        <m:r>
+          <m:rPr>
+            <m:sty m:val="p"/>
+          </m:rPr>
+          <m:t>×</m:t>
+        </m:r>
+      </m:oMath>
+      <w:r>
+        <w:t xml:space="preserve"> </w:t>
+      </w:r>
+      <w:r>
+        <w:t xml:space="preserve">lift at an assumed 10% flag rate.</w:t>
+      </w:r>
+    </w:p>
+    <w:p>
+      <w:pPr>
+        <w:pStyle w:val="BodyText"/>
+      </w:pPr>
+      <w:r>
+        <w:t xml:space="preserve">Log analytics for drone fleets should therefore present evidence rather than issue verdicts; ranking airframes by vibration is a hypothesis for prospective testing, and should be evaluated with vehicle-grouped folds, comparisons against each aircraft’s own history, and flights ordered by GPS time. AeroFleet 2.0 implements this approach as an open-source tool.</w:t>
+      </w:r>
+    </w:p>
+    <w:p>
+      <w:pPr>
+        <w:pStyle w:val="Heading1"/>
+      </w:pPr>
+      <w:bookmarkStart w:id="81" w:name="_84dc18e74b75db6057c8c16a8f70e097972540a"/>
+      <w:r>
+        <w:t xml:space="preserve">Declaration of competing interest</w:t>
+      </w:r>
+      <w:bookmarkEnd w:id="81"/>
+    </w:p>
+    <w:p>
+      <w:pPr>
+        <w:pStyle w:val="FirstParagraph"/>
+      </w:pPr>
+      <w:r>
+        <w:t xml:space="preserve">The authors declare that they have no known competing financial interests or personal relationships that could have appeared to influence the work reported in this paper. The authors develop the open-source AeroFleet 2.0 tool described in Section 6; it is not commercial.</w:t>
+      </w:r>
+    </w:p>
+    <w:p>
+      <w:pPr>
+        <w:pStyle w:val="Heading1"/>
+      </w:pPr>
+      <w:bookmarkStart w:id="82" w:name="_1f74eb43af444059c7518034463b6c89b1cacf4"/>
+      <w:r>
+        <w:t xml:space="preserve">Declaration of generative AI and AI-assisted technologies in the manuscript preparation process</w:t>
+      </w:r>
+      <w:bookmarkEnd w:id="82"/>
+    </w:p>
+    <w:p>
+      <w:pPr>
+        <w:pStyle w:val="FirstParagraph"/>
+      </w:pPr>
+      <w:r>
+        <w:t xml:space="preserve">During the preparation of this work the authors used an AI assistant (Claude, Anthropic) to write analysis code, draft</w:t>
+      </w:r>
+      <w:r>
+        <w:t xml:space="preserve"> </w:t>
+      </w:r>
+      <w:r>
+        <w:t xml:space="preserve">and revise text, and assist the recording of forum diagnoses. After using this tool, the authors reviewed and edited</w:t>
+      </w:r>
+      <w:r>
+        <w:t xml:space="preserve"> </w:t>
+      </w:r>
+      <w:r>
+        <w:t xml:space="preserve">the content as needed and take full responsibility for the content of the published article.</w:t>
+      </w:r>
+    </w:p>
+    <w:p>
+      <w:pPr>
+        <w:pStyle w:val="Heading1"/>
+      </w:pPr>
+      <w:bookmarkStart w:id="83" w:name="_ea5c66868f283220c19382d0fdd5a852ec570ca"/>
+      <w:r>
+        <w:t xml:space="preserve">Data availability</w:t>
+      </w:r>
+      <w:bookmarkEnd w:id="83"/>
+    </w:p>
+    <w:p>
+      <w:pPr>
+        <w:pStyle w:val="FirstParagraph"/>
+      </w:pPr>
+      <w:r>
+        <w:t xml:space="preserve">Selection scripts, analysis code, the declared hypotheses with their commit history, derived features, expert labels</w:t>
+      </w:r>
+      <w:r>
+        <w:t xml:space="preserve"> </w:t>
+      </w:r>
+      <w:r>
+        <w:t xml:space="preserve">(without forum text), and the source code of the AeroFleet 2.0 tool are available at</w:t>
+      </w:r>
+      <w:r>
+        <w:t xml:space="preserve"> </w:t>
+      </w:r>
+      <w:hyperlink r:id="rId74">
+        <w:r>
+          <w:rPr>
+            <w:rStyle w:val="Hyperlink"/>
+          </w:rPr>
+          <w:t xml:space="preserve">https://github.com/AdityaPathare46/aerofleet</w:t>
+        </w:r>
+      </w:hyperlink>
+      <w:r>
+        <w:t xml:space="preserve">; a DOI-archived release will be provided on acceptance. Raw logs</w:t>
+      </w:r>
+      <w:r>
+        <w:t xml:space="preserve"> </w:t>
+      </w:r>
+      <w:r>
+        <w:t xml:space="preserve">are public on PX4 Flight Review and are referenced by identifier.</w:t>
+      </w:r>
+    </w:p>
+    <w:p>
+      <w:pPr>
+        <w:pStyle w:val="Heading1"/>
+      </w:pPr>
+      <w:bookmarkStart w:id="84" w:name="_funding"/>
+      <w:r>
+        <w:t xml:space="preserve">Funding</w:t>
+      </w:r>
+      <w:bookmarkEnd w:id="84"/>
+    </w:p>
+    <w:p>
+      <w:pPr>
+        <w:pStyle w:val="FirstParagraph"/>
+      </w:pPr>
+      <w:r>
+        <w:t xml:space="preserve">This research did not receive any specific grant from funding agencies in the public, commercial, or not-for-profit</w:t>
+      </w:r>
+      <w:r>
+        <w:t xml:space="preserve"> </w:t>
+      </w:r>
+      <w:r>
+        <w:t xml:space="preserve">sectors.</w:t>
+      </w:r>
+    </w:p>
+    <w:p>
+      <w:pPr>
+        <w:pStyle w:val="Heading1"/>
+      </w:pPr>
+      <w:bookmarkStart w:id="85" w:name="_000b339d75a155a848ca0c43e54b0b02b7b82d8"/>
+      <w:r>
+        <w:rPr>
+          <w:rStyle w:val="SectionNumber"/>
+        </w:rPr>
+        <w:t xml:space="preserve">10</w:t>
+      </w:r>
+      <w:r>
+        <w:tab/>
+      </w:r>
+      <w:r>
+        <w:t xml:space="preserve">Exploratory analyses added after the declared protocol</w:t>
+      </w:r>
+      <w:bookmarkEnd w:id="85"/>
+    </w:p>
+    <w:p>
+      <w:pPr>
+        <w:pStyle w:val="FirstParagraph"/>
+      </w:pPr>
+      <w:r>
+        <w:t xml:space="preserve">To preserve the boundary between pre-declared confirmatory hypotheses (committed to version control on 20–24 October 2026; Table 4) and exploratory analyses added after the declared protocol</w:t>
+      </w:r>
+      <w:r>
+        <w:t xml:space="preserve"> </w:t>
+      </w:r>
+      <w:r>
+        <w:t xml:space="preserve">[</w:t>
+      </w:r>
+      <w:hyperlink w:anchor="_f6e66cea9a1ea78573b548bc5cf8461c81300ca">
+        <w:r>
+          <w:rPr>
+            <w:rStyle w:val="Hyperlink"/>
+          </w:rPr>
+          <w:t xml:space="preserve">36</w:t>
+        </w:r>
+      </w:hyperlink>
+      <w:r>
+        <w:t xml:space="preserve">]</w:t>
+      </w:r>
+      <w:r>
+        <w:t xml:space="preserve">, Table A.16 documents each such analysis, its motivation, key results, git commit hash, first archive date in Software Heritage, and analysis run date. They are marked with</w:t>
+      </w:r>
+      <w:r>
+        <w:t xml:space="preserve"> </w:t>
+      </w:r>
+      <m:oMath>
+        <m:sSup>
+          <m:e>
+            <m:r>
+              <m:t>​</m:t>
+            </m:r>
+          </m:e>
+          <m:sup>
+            <m:r>
+              <m:rPr>
+                <m:sty m:val="p"/>
+              </m:rPr>
+              <m:t>†</m:t>
+            </m:r>
+          </m:sup>
+        </m:sSup>
+      </m:oMath>
+      <w:r>
         <w:t xml:space="preserve"> </w:t>
       </w:r>
       <w:r>
         <w:t xml:space="preserve">throughout the text and tables. None of these exploratory additions altered the conclusions of the pre-declared tests. They bounded between-airframe confounding, tested other model types, quantified fleet screening, and audited the crash records themselves: the crash moment, the uploader labels against log content, and the order of flights.</w:t>
       </w:r>
     </w:p>
-    <w:bookmarkStart w:id="85" w:name="_fb475224272a447d57b77f14dfc8774bb10ba7c"/>
+    <w:bookmarkStart w:id="86" w:name="_fb475224272a447d57b77f14dfc8774bb10ba7c"/>
     <w:p>
       <w:pPr>
         <w:pStyle w:val="TableCaption"/>
@@ -33583,7 +34027,7 @@
               <w:rPr>
                 <w:sz w:val="19"/>
               </w:rPr>
-              <w:t xml:space="preserve">Crash-moment review</w:t>
+              <w:t xml:space="preserve">RflyMAD injected faults</w:t>
             </w:r>
             <m:oMath>
               <m:sSup>
@@ -33616,85 +34060,27 @@
               <w:rPr>
                 <w:sz w:val="19"/>
               </w:rPr>
-              <w:t xml:space="preserve">Check</w:t>
-            </w:r>
-            <w:r>
-              <w:rPr>
-                <w:sz w:val="19"/>
-              </w:rPr>
-              <w:t xml:space="preserve"> </w:t>
-            </w:r>
-            <m:oMath>
-              <m:sSub>
-                <m:e>
-                  <m:r>
-                    <m:t>t</m:t>
-                  </m:r>
-                </m:e>
-                <m:sub>
-                  <m:r>
-                    <m:t>c</m:t>
-                  </m:r>
-                </m:sub>
-              </m:sSub>
-            </m:oMath>
-            <w:r>
-              <w:rPr>
-                <w:sz w:val="19"/>
-              </w:rPr>
-              <w:t xml:space="preserve"> </w:t>
-            </w:r>
-            <w:r>
-              <w:rPr>
-                <w:sz w:val="19"/>
-              </w:rPr>
-              <w:t xml:space="preserve">by eye (two authors, second blind)</w:t>
-            </w:r>
-          </w:p>
-        </w:tc>
-        <w:tc>
-          <w:tcPr/>
-          <w:p>
-            <w:pPr>
-              <w:pStyle w:val="Compact"/>
-              <w:spacing w:line="240" w:lineRule="auto"/>
-              <w:jc w:val="left"/>
-            </w:pPr>
-            <m:oMath>
-              <m:sSub>
-                <m:e>
-                  <m:r>
-                    <m:t>t</m:t>
-                  </m:r>
-                </m:e>
-                <m:sub>
-                  <m:r>
-                    <m:t>c</m:t>
-                  </m:r>
-                </m:sub>
-              </m:sSub>
-            </m:oMath>
-            <w:r>
-              <w:rPr>
-                <w:sz w:val="19"/>
-              </w:rPr>
-              <w:t xml:space="preserve"> </w:t>
-            </w:r>
-            <w:r>
-              <w:rPr>
-                <w:sz w:val="19"/>
-              </w:rPr>
-              <w:t xml:space="preserve">right: agreement 85%,</w:t>
-            </w:r>
-            <w:r>
-              <w:rPr>
-                <w:sz w:val="19"/>
-              </w:rPr>
-              <w:t xml:space="preserve"> </w:t>
+              <w:t xml:space="preserve">Known-cause positive control on 488 real flights</w:t>
+            </w:r>
+          </w:p>
+        </w:tc>
+        <w:tc>
+          <w:tcPr/>
+          <w:p>
+            <w:pPr>
+              <w:pStyle w:val="Compact"/>
+              <w:spacing w:line="240" w:lineRule="auto"/>
+              <w:jc w:val="left"/>
+            </w:pPr>
+            <w:r>
+              <w:rPr>
+                <w:sz w:val="19"/>
+              </w:rPr>
+              <w:t xml:space="preserve">Rule BA 0.50 [0.47, 0.52] (3% of motor faults called aircraft); FlightMD 0.47 pre-fault, 0.69 whole flight; features AUC 0.86 pre-fault (</w:t>
             </w:r>
             <m:oMath>
               <m:r>
-                <m:t>κ</m:t>
+                <m:t>p</m:t>
               </m:r>
               <m:r>
                 <m:rPr>
@@ -33703,14 +34089,14 @@
                 <m:t>=</m:t>
               </m:r>
               <m:r>
-                <m:t>0.70</m:t>
+                <m:t>0.005</m:t>
               </m:r>
             </m:oMath>
             <w:r>
               <w:rPr>
                 <w:sz w:val="19"/>
               </w:rPr>
-              <w:t xml:space="preserve">; tilt-defined correct 21 and 24 of 26 (multicopters 15 of 15 for both), fallback 2 and 6 of 24; whether fallback logs contain the crash</w:t>
+              <w:t xml:space="preserve">), fault adds</w:t>
             </w:r>
             <w:r>
               <w:rPr>
@@ -33719,19 +34105,22 @@
               <w:t xml:space="preserve"> </w:t>
             </w:r>
             <m:oMath>
-              <m:r>
-                <m:t>κ</m:t>
-              </m:r>
               <m:r>
                 <m:rPr>
                   <m:sty m:val="p"/>
                 </m:rPr>
-                <m:t>=</m:t>
+                <m:t>−</m:t>
               </m:r>
               <m:r>
-                <m:t>0.32</m:t>
+                <m:t>0.008</m:t>
               </m:r>
             </m:oMath>
+            <w:r>
+              <w:rPr>
+                <w:sz w:val="19"/>
+              </w:rPr>
+              <w:t xml:space="preserve">; within flight pattern 0.88</w:t>
+            </w:r>
           </w:p>
         </w:tc>
         <w:tc>
@@ -33747,42 +34136,23 @@
                 <w:rStyle w:val="VerbatimChar"/>
                 <w:sz w:val="19"/>
               </w:rPr>
-              <w:t xml:space="preserve">97974ad</w:t>
-            </w:r>
-            <w:r>
-              <w:rPr>
-                <w:sz w:val="19"/>
-              </w:rPr>
-              <w:t xml:space="preserve">,</w:t>
-            </w:r>
-            <w:r>
-              <w:rPr>
-                <w:sz w:val="19"/>
-              </w:rPr>
-              <w:t xml:space="preserve"> </w:t>
-            </w:r>
-            <w:r>
-              <w:rPr>
-                <w:rStyle w:val="VerbatimChar"/>
-                <w:sz w:val="19"/>
-              </w:rPr>
-              <w:t xml:space="preserve">59c8212</w:t>
-            </w:r>
-          </w:p>
-        </w:tc>
-        <w:tc>
-          <w:tcPr/>
-          <w:p>
-            <w:pPr>
-              <w:pStyle w:val="Compact"/>
-              <w:spacing w:line="240" w:lineRule="auto"/>
-              <w:jc w:val="left"/>
-            </w:pPr>
-            <w:r>
-              <w:rPr>
-                <w:sz w:val="19"/>
-              </w:rPr>
-              <w:t xml:space="preserve">2026-10-28</w:t>
+              <w:t xml:space="preserve">a9877c1</w:t>
+            </w:r>
+          </w:p>
+        </w:tc>
+        <w:tc>
+          <w:tcPr/>
+          <w:p>
+            <w:pPr>
+              <w:pStyle w:val="Compact"/>
+              <w:spacing w:line="240" w:lineRule="auto"/>
+              <w:jc w:val="left"/>
+            </w:pPr>
+            <w:r>
+              <w:rPr>
+                <w:sz w:val="19"/>
+              </w:rPr>
+              <w:t xml:space="preserve">2026-10-29</w:t>
             </w:r>
           </w:p>
         </w:tc>
@@ -33800,7 +34170,7 @@
               <w:rPr>
                 <w:sz w:val="19"/>
               </w:rPr>
-              <w:t xml:space="preserve">Crash-moment and date audit</w:t>
+              <w:t xml:space="preserve">Crash-moment review</w:t>
             </w:r>
             <m:oMath>
               <m:sSup>
@@ -33833,23 +34203,75 @@
               <w:rPr>
                 <w:sz w:val="19"/>
               </w:rPr>
-              <w:t xml:space="preserve">Confirmed crashes, dates vs GPS, grouped leak curve, clustered variants, stumps</w:t>
-            </w:r>
-          </w:p>
-        </w:tc>
-        <w:tc>
-          <w:tcPr/>
-          <w:p>
-            <w:pPr>
-              <w:pStyle w:val="Compact"/>
-              <w:spacing w:line="240" w:lineRule="auto"/>
-              <w:jc w:val="left"/>
-            </w:pPr>
-            <w:r>
-              <w:rPr>
-                <w:sz w:val="19"/>
-              </w:rPr>
-              <w:t xml:space="preserve">40 of 148 crashes confirmed; leak drop 0.035 overall, 0.103 confirmed; index date = GPS date for 80%, no cross-day misorder; clustered variant</w:t>
+              <w:t xml:space="preserve">Check</w:t>
+            </w:r>
+            <w:r>
+              <w:rPr>
+                <w:sz w:val="19"/>
+              </w:rPr>
+              <w:t xml:space="preserve"> </w:t>
+            </w:r>
+            <m:oMath>
+              <m:sSub>
+                <m:e>
+                  <m:r>
+                    <m:t>t</m:t>
+                  </m:r>
+                </m:e>
+                <m:sub>
+                  <m:r>
+                    <m:t>c</m:t>
+                  </m:r>
+                </m:sub>
+              </m:sSub>
+            </m:oMath>
+            <w:r>
+              <w:rPr>
+                <w:sz w:val="19"/>
+              </w:rPr>
+              <w:t xml:space="preserve"> </w:t>
+            </w:r>
+            <w:r>
+              <w:rPr>
+                <w:sz w:val="19"/>
+              </w:rPr>
+              <w:t xml:space="preserve">by eye (two authors, second blind)</w:t>
+            </w:r>
+          </w:p>
+        </w:tc>
+        <w:tc>
+          <w:tcPr/>
+          <w:p>
+            <w:pPr>
+              <w:pStyle w:val="Compact"/>
+              <w:spacing w:line="240" w:lineRule="auto"/>
+              <w:jc w:val="left"/>
+            </w:pPr>
+            <m:oMath>
+              <m:sSub>
+                <m:e>
+                  <m:r>
+                    <m:t>t</m:t>
+                  </m:r>
+                </m:e>
+                <m:sub>
+                  <m:r>
+                    <m:t>c</m:t>
+                  </m:r>
+                </m:sub>
+              </m:sSub>
+            </m:oMath>
+            <w:r>
+              <w:rPr>
+                <w:sz w:val="19"/>
+              </w:rPr>
+              <w:t xml:space="preserve"> </w:t>
+            </w:r>
+            <w:r>
+              <w:rPr>
+                <w:sz w:val="19"/>
+              </w:rPr>
+              <w:t xml:space="preserve">right: agreement 85%,</w:t>
             </w:r>
             <w:r>
               <w:rPr>
@@ -33859,21 +34281,44 @@
             </w:r>
             <m:oMath>
               <m:r>
-                <m:t>p</m:t>
+                <m:t>κ</m:t>
+              </m:r>
+              <m:r>
+                <m:rPr>
+                  <m:sty m:val="p"/>
+                </m:rPr>
+                <m:t>=</m:t>
+              </m:r>
+              <m:r>
+                <m:t>0.70</m:t>
               </m:r>
             </m:oMath>
             <w:r>
               <w:rPr>
                 <w:sz w:val="19"/>
               </w:rPr>
+              <w:t xml:space="preserve">; tilt-defined correct 21 and 24 of 26 (multicopters 15 of 15 for both), fallback 2 and 6 of 24; whether fallback logs contain the crash</w:t>
+            </w:r>
+            <w:r>
+              <w:rPr>
+                <w:sz w:val="19"/>
+              </w:rPr>
               <w:t xml:space="preserve"> </w:t>
             </w:r>
-            <w:r>
-              <w:rPr>
-                <w:sz w:val="19"/>
-              </w:rPr>
-              <w:t xml:space="preserve">0.014–0.026 (newer metric 0.28); stumps 0.447/0.481</w:t>
-            </w:r>
+            <m:oMath>
+              <m:r>
+                <m:t>κ</m:t>
+              </m:r>
+              <m:r>
+                <m:rPr>
+                  <m:sty m:val="p"/>
+                </m:rPr>
+                <m:t>=</m:t>
+              </m:r>
+              <m:r>
+                <m:t>0.32</m:t>
+              </m:r>
+            </m:oMath>
           </w:p>
         </w:tc>
         <w:tc>
@@ -33889,23 +34334,42 @@
                 <w:rStyle w:val="VerbatimChar"/>
                 <w:sz w:val="19"/>
               </w:rPr>
-              <w:t xml:space="preserve">48c2fa7</w:t>
-            </w:r>
-          </w:p>
-        </w:tc>
-        <w:tc>
-          <w:tcPr/>
-          <w:p>
-            <w:pPr>
-              <w:pStyle w:val="Compact"/>
-              <w:spacing w:line="240" w:lineRule="auto"/>
-              <w:jc w:val="left"/>
-            </w:pPr>
-            <w:r>
-              <w:rPr>
-                <w:sz w:val="19"/>
-              </w:rPr>
-              <w:t xml:space="preserve">2026-10-27</w:t>
+              <w:t xml:space="preserve">97974ad</w:t>
+            </w:r>
+            <w:r>
+              <w:rPr>
+                <w:sz w:val="19"/>
+              </w:rPr>
+              <w:t xml:space="preserve">,</w:t>
+            </w:r>
+            <w:r>
+              <w:rPr>
+                <w:sz w:val="19"/>
+              </w:rPr>
+              <w:t xml:space="preserve"> </w:t>
+            </w:r>
+            <w:r>
+              <w:rPr>
+                <w:rStyle w:val="VerbatimChar"/>
+                <w:sz w:val="19"/>
+              </w:rPr>
+              <w:t xml:space="preserve">59c8212</w:t>
+            </w:r>
+          </w:p>
+        </w:tc>
+        <w:tc>
+          <w:tcPr/>
+          <w:p>
+            <w:pPr>
+              <w:pStyle w:val="Compact"/>
+              <w:spacing w:line="240" w:lineRule="auto"/>
+              <w:jc w:val="left"/>
+            </w:pPr>
+            <w:r>
+              <w:rPr>
+                <w:sz w:val="19"/>
+              </w:rPr>
+              <w:t xml:space="preserve">2026-10-28</w:t>
             </w:r>
           </w:p>
         </w:tc>
@@ -33923,7 +34387,7 @@
               <w:rPr>
                 <w:sz w:val="19"/>
               </w:rPr>
-              <w:t xml:space="preserve">Clustering and refit audit</w:t>
+              <w:t xml:space="preserve">Crash-moment and date audit</w:t>
             </w:r>
             <m:oMath>
               <m:sSup>
@@ -33956,7 +34420,23 @@
               <w:rPr>
                 <w:sz w:val="19"/>
               </w:rPr>
-              <w:t xml:space="preserve">Refit nulls, clustered between-drone</w:t>
+              <w:t xml:space="preserve">Confirmed crashes, dates vs GPS, grouped leak curve, clustered variants, stumps</w:t>
+            </w:r>
+          </w:p>
+        </w:tc>
+        <w:tc>
+          <w:tcPr/>
+          <w:p>
+            <w:pPr>
+              <w:pStyle w:val="Compact"/>
+              <w:spacing w:line="240" w:lineRule="auto"/>
+              <w:jc w:val="left"/>
+            </w:pPr>
+            <w:r>
+              <w:rPr>
+                <w:sz w:val="19"/>
+              </w:rPr>
+              <w:t xml:space="preserve">40 of 148 crashes confirmed; leak drop 0.035 overall, 0.103 confirmed; index date = GPS date for 80%, no cross-day misorder; clustered variant</w:t>
             </w:r>
             <w:r>
               <w:rPr>
@@ -33973,128 +34453,14 @@
               <w:rPr>
                 <w:sz w:val="19"/>
               </w:rPr>
-              <w:t xml:space="preserve">, paired comparison, fixed-seed Table 8, re-flights, crash moment</w:t>
-            </w:r>
-          </w:p>
-        </w:tc>
-        <w:tc>
-          <w:tcPr/>
-          <w:p>
-            <w:pPr>
-              <w:pStyle w:val="Compact"/>
-              <w:spacing w:line="240" w:lineRule="auto"/>
-              <w:jc w:val="left"/>
-            </w:pPr>
-            <w:r>
-              <w:rPr>
-                <w:sz w:val="19"/>
-              </w:rPr>
-              <w:t xml:space="preserve">Between-drone clustered</w:t>
-            </w:r>
-            <w:r>
-              <w:rPr>
-                <w:sz w:val="19"/>
-              </w:rPr>
               <w:t xml:space="preserve"> </w:t>
             </w:r>
-            <m:oMath>
-              <m:r>
-                <m:t>p</m:t>
-              </m:r>
-              <m:r>
-                <m:rPr>
-                  <m:sty m:val="p"/>
-                </m:rPr>
-                <m:t>=</m:t>
-              </m:r>
-              <m:r>
-                <m:t>0.012</m:t>
-              </m:r>
-            </m:oMath>
-            <w:r>
-              <w:rPr>
-                <w:sz w:val="19"/>
-              </w:rPr>
-              <w:t xml:space="preserve"> </w:t>
-            </w:r>
-            <w:r>
-              <w:rPr>
-                <w:sz w:val="19"/>
-              </w:rPr>
-              <w:t xml:space="preserve">(Holm 0.08); other minus own flights</w:t>
-            </w:r>
-            <w:r>
-              <w:rPr>
-                <w:sz w:val="19"/>
-              </w:rPr>
-              <w:t xml:space="preserve"> </w:t>
-            </w:r>
-            <m:oMath>
-              <m:r>
-                <m:rPr>
-                  <m:sty m:val="p"/>
-                </m:rPr>
-                <m:t>+</m:t>
-              </m:r>
-              <m:r>
-                <m:t>0.113</m:t>
-              </m:r>
-            </m:oMath>
-            <w:r>
-              <w:rPr>
-                <w:sz w:val="19"/>
-              </w:rPr>
-              <w:t xml:space="preserve"> </w:t>
-            </w:r>
-            <w:r>
-              <w:rPr>
-                <w:sz w:val="19"/>
-              </w:rPr>
-              <w:t xml:space="preserve">[0.029, 0.212]; Step 1 grouping 0.882</w:t>
-            </w:r>
-            <w:r>
-              <w:rPr>
-                <w:sz w:val="19"/>
-              </w:rPr>
-              <w:t xml:space="preserve"> </w:t>
-            </w:r>
-            <m:oMath>
-              <m:r>
-                <m:rPr>
-                  <m:sty m:val="p"/>
-                </m:rPr>
-                <m:t>→</m:t>
-              </m:r>
-            </m:oMath>
-            <w:r>
-              <w:rPr>
-                <w:sz w:val="19"/>
-              </w:rPr>
-              <w:t xml:space="preserve"> </w:t>
-            </w:r>
-            <w:r>
-              <w:rPr>
-                <w:sz w:val="19"/>
-              </w:rPr>
-              <w:t xml:space="preserve">0.826; 54% of crash-rated logs have a later log from the same flight controller; Task B refit-null upper bounds</w:t>
-            </w:r>
-            <w:r>
-              <w:rPr>
-                <w:sz w:val="19"/>
-              </w:rPr>
-              <w:t xml:space="preserve"> </w:t>
-            </w:r>
-            <m:oMath>
-              <m:r>
-                <m:rPr>
-                  <m:sty m:val="p"/>
-                </m:rPr>
-                <m:t>≤</m:t>
-              </m:r>
-              <m:r>
-                <m:t>0.69</m:t>
-              </m:r>
-            </m:oMath>
+            <w:r>
+              <w:rPr>
+                <w:sz w:val="19"/>
+              </w:rPr>
+              <w:t xml:space="preserve">0.014–0.026 (newer metric 0.28); stumps 0.447/0.481</w:t>
+            </w:r>
           </w:p>
         </w:tc>
         <w:tc>
@@ -34110,26 +34476,7 @@
                 <w:rStyle w:val="VerbatimChar"/>
                 <w:sz w:val="19"/>
               </w:rPr>
-              <w:t xml:space="preserve">6fff27d</w:t>
-            </w:r>
-            <w:r>
-              <w:rPr>
-                <w:sz w:val="19"/>
-              </w:rPr>
-              <w:t xml:space="preserve">,</w:t>
-            </w:r>
-            <w:r>
-              <w:rPr>
-                <w:sz w:val="19"/>
-              </w:rPr>
-              <w:t xml:space="preserve"> </w:t>
-            </w:r>
-            <w:r>
-              <w:rPr>
-                <w:rStyle w:val="VerbatimChar"/>
-                <w:sz w:val="19"/>
-              </w:rPr>
-              <w:t xml:space="preserve">016dafe</w:t>
+              <w:t xml:space="preserve">48c2fa7</w:t>
             </w:r>
           </w:p>
         </w:tc>
@@ -34163,7 +34510,7 @@
               <w:rPr>
                 <w:sz w:val="19"/>
               </w:rPr>
-              <w:t xml:space="preserve">Post-crash flight audit</w:t>
+              <w:t xml:space="preserve">Clustering and refit audit</w:t>
             </w:r>
             <m:oMath>
               <m:sSup>
@@ -34196,23 +34543,72 @@
               <w:rPr>
                 <w:sz w:val="19"/>
               </w:rPr>
-              <w:t xml:space="preserve">GPS-order the within-drone samples</w:t>
-            </w:r>
-          </w:p>
-        </w:tc>
-        <w:tc>
-          <w:tcPr/>
-          <w:p>
-            <w:pPr>
-              <w:pStyle w:val="Compact"/>
-              <w:spacing w:line="240" w:lineRule="auto"/>
-              <w:jc w:val="left"/>
-            </w:pPr>
-            <w:r>
-              <w:rPr>
-                <w:sz w:val="19"/>
-              </w:rPr>
-              <w:t xml:space="preserve">85 of 210 crash-day earlier flights followed the crash; without them rank tests unchanged, within-drone model 0.582 [0.525, 0.660], caliper lift</w:t>
+              <w:t xml:space="preserve">Refit nulls, clustered between-drone</w:t>
+            </w:r>
+            <w:r>
+              <w:rPr>
+                <w:sz w:val="19"/>
+              </w:rPr>
+              <w:t xml:space="preserve"> </w:t>
+            </w:r>
+            <m:oMath>
+              <m:r>
+                <m:t>p</m:t>
+              </m:r>
+            </m:oMath>
+            <w:r>
+              <w:rPr>
+                <w:sz w:val="19"/>
+              </w:rPr>
+              <w:t xml:space="preserve">, paired comparison, fixed-seed Table 8, re-flights, crash moment</w:t>
+            </w:r>
+          </w:p>
+        </w:tc>
+        <w:tc>
+          <w:tcPr/>
+          <w:p>
+            <w:pPr>
+              <w:pStyle w:val="Compact"/>
+              <w:spacing w:line="240" w:lineRule="auto"/>
+              <w:jc w:val="left"/>
+            </w:pPr>
+            <w:r>
+              <w:rPr>
+                <w:sz w:val="19"/>
+              </w:rPr>
+              <w:t xml:space="preserve">Between-drone clustered</w:t>
+            </w:r>
+            <w:r>
+              <w:rPr>
+                <w:sz w:val="19"/>
+              </w:rPr>
+              <w:t xml:space="preserve"> </w:t>
+            </w:r>
+            <m:oMath>
+              <m:r>
+                <m:t>p</m:t>
+              </m:r>
+              <m:r>
+                <m:rPr>
+                  <m:sty m:val="p"/>
+                </m:rPr>
+                <m:t>=</m:t>
+              </m:r>
+              <m:r>
+                <m:t>0.012</m:t>
+              </m:r>
+            </m:oMath>
+            <w:r>
+              <w:rPr>
+                <w:sz w:val="19"/>
+              </w:rPr>
+              <w:t xml:space="preserve"> </w:t>
+            </w:r>
+            <w:r>
+              <w:rPr>
+                <w:sz w:val="19"/>
+              </w:rPr>
+              <w:t xml:space="preserve">(Holm 0.08); other minus own flights</w:t>
             </w:r>
             <w:r>
               <w:rPr>
@@ -34228,7 +34624,7 @@
                 <m:t>+</m:t>
               </m:r>
               <m:r>
-                <m:t>0.086</m:t>
+                <m:t>0.113</m:t>
               </m:r>
             </m:oMath>
             <w:r>
@@ -34241,25 +34637,51 @@
               <w:rPr>
                 <w:sz w:val="19"/>
               </w:rPr>
-              <w:t xml:space="preserve">[</w:t>
+              <w:t xml:space="preserve">[0.029, 0.212]; Step 1 grouping 0.882</w:t>
+            </w:r>
+            <w:r>
+              <w:rPr>
+                <w:sz w:val="19"/>
+              </w:rPr>
+              <w:t xml:space="preserve"> </w:t>
             </w:r>
             <m:oMath>
               <m:r>
                 <m:rPr>
                   <m:sty m:val="p"/>
                 </m:rPr>
-                <m:t>−</m:t>
+                <m:t>→</m:t>
+              </m:r>
+            </m:oMath>
+            <w:r>
+              <w:rPr>
+                <w:sz w:val="19"/>
+              </w:rPr>
+              <w:t xml:space="preserve"> </w:t>
+            </w:r>
+            <w:r>
+              <w:rPr>
+                <w:sz w:val="19"/>
+              </w:rPr>
+              <w:t xml:space="preserve">0.826; 54% of crash-rated logs have a later log from the same flight controller; Task B refit-null upper bounds</w:t>
+            </w:r>
+            <w:r>
+              <w:rPr>
+                <w:sz w:val="19"/>
+              </w:rPr>
+              <w:t xml:space="preserve"> </w:t>
+            </w:r>
+            <m:oMath>
+              <m:r>
+                <m:rPr>
+                  <m:sty m:val="p"/>
+                </m:rPr>
+                <m:t>≤</m:t>
               </m:r>
               <m:r>
-                <m:t>0.064</m:t>
+                <m:t>0.69</m:t>
               </m:r>
             </m:oMath>
-            <w:r>
-              <w:rPr>
-                <w:sz w:val="19"/>
-              </w:rPr>
-              <w:t xml:space="preserve">, +0.184] (masking withdrawn), same-aircraft 0.507</w:t>
-            </w:r>
           </w:p>
         </w:tc>
         <w:tc>
@@ -34275,7 +34697,26 @@
                 <w:rStyle w:val="VerbatimChar"/>
                 <w:sz w:val="19"/>
               </w:rPr>
-              <w:t xml:space="preserve">0d38f5d</w:t>
+              <w:t xml:space="preserve">6fff27d</w:t>
+            </w:r>
+            <w:r>
+              <w:rPr>
+                <w:sz w:val="19"/>
+              </w:rPr>
+              <w:t xml:space="preserve">,</w:t>
+            </w:r>
+            <w:r>
+              <w:rPr>
+                <w:sz w:val="19"/>
+              </w:rPr>
+              <w:t xml:space="preserve"> </w:t>
+            </w:r>
+            <w:r>
+              <w:rPr>
+                <w:rStyle w:val="VerbatimChar"/>
+                <w:sz w:val="19"/>
+              </w:rPr>
+              <w:t xml:space="preserve">016dafe</w:t>
             </w:r>
           </w:p>
         </w:tc>
@@ -34309,7 +34750,7 @@
               <w:rPr>
                 <w:sz w:val="19"/>
               </w:rPr>
-              <w:t xml:space="preserve">Flight-order audit</w:t>
+              <w:t xml:space="preserve">Post-crash flight audit</w:t>
             </w:r>
             <m:oMath>
               <m:sSup>
@@ -34342,23 +34783,23 @@
               <w:rPr>
                 <w:sz w:val="19"/>
               </w:rPr>
-              <w:t xml:space="preserve">Caliper without duration-linked features; GPS ordering</w:t>
-            </w:r>
-          </w:p>
-        </w:tc>
-        <w:tc>
-          <w:tcPr/>
-          <w:p>
-            <w:pPr>
-              <w:pStyle w:val="Compact"/>
-              <w:spacing w:line="240" w:lineRule="auto"/>
-              <w:jc w:val="left"/>
-            </w:pPr>
-            <w:r>
-              <w:rPr>
-                <w:sz w:val="19"/>
-              </w:rPr>
-              <w:t xml:space="preserve">Lift</w:t>
+              <w:t xml:space="preserve">GPS-order the within-drone samples</w:t>
+            </w:r>
+          </w:p>
+        </w:tc>
+        <w:tc>
+          <w:tcPr/>
+          <w:p>
+            <w:pPr>
+              <w:pStyle w:val="Compact"/>
+              <w:spacing w:line="240" w:lineRule="auto"/>
+              <w:jc w:val="left"/>
+            </w:pPr>
+            <w:r>
+              <w:rPr>
+                <w:sz w:val="19"/>
+              </w:rPr>
+              <w:t xml:space="preserve">85 of 210 crash-day earlier flights followed the crash; without them rank tests unchanged, within-drone model 0.582 [0.525, 0.660], caliper lift</w:t>
             </w:r>
             <w:r>
               <w:rPr>
@@ -34374,7 +34815,7 @@
                 <m:t>+</m:t>
               </m:r>
               <m:r>
-                <m:t>0.077</m:t>
+                <m:t>0.086</m:t>
               </m:r>
             </m:oMath>
             <w:r>
@@ -34387,27 +34828,24 @@
               <w:rPr>
                 <w:sz w:val="19"/>
               </w:rPr>
-              <w:t xml:space="preserve">[+0.013, +0.204] without three features; 47 of 95 crash-day exposure flights followed the crash; between-drone 0.698 (</w:t>
+              <w:t xml:space="preserve">[</w:t>
             </w:r>
             <m:oMath>
-              <m:r>
-                <m:t>p</m:t>
-              </m:r>
               <m:r>
                 <m:rPr>
                   <m:sty m:val="p"/>
                 </m:rPr>
-                <m:t>=</m:t>
+                <m:t>−</m:t>
               </m:r>
               <m:r>
-                <m:t>0.0021</m:t>
+                <m:t>0.064</m:t>
               </m:r>
             </m:oMath>
             <w:r>
               <w:rPr>
                 <w:sz w:val="19"/>
               </w:rPr>
-              <w:t xml:space="preserve">, 43 sets) without them</w:t>
+              <w:t xml:space="preserve">, +0.184] (masking withdrawn), same-aircraft 0.507</w:t>
             </w:r>
           </w:p>
         </w:tc>
@@ -34424,26 +34862,7 @@
                 <w:rStyle w:val="VerbatimChar"/>
                 <w:sz w:val="19"/>
               </w:rPr>
-              <w:t xml:space="preserve">0e26db0</w:t>
-            </w:r>
-            <w:r>
-              <w:rPr>
-                <w:sz w:val="19"/>
-              </w:rPr>
-              <w:t xml:space="preserve">,</w:t>
-            </w:r>
-            <w:r>
-              <w:rPr>
-                <w:sz w:val="19"/>
-              </w:rPr>
-              <w:t xml:space="preserve"> </w:t>
-            </w:r>
-            <w:r>
-              <w:rPr>
-                <w:rStyle w:val="VerbatimChar"/>
-                <w:sz w:val="19"/>
-              </w:rPr>
-              <w:t xml:space="preserve">187f570</w:t>
+              <w:t xml:space="preserve">0d38f5d</w:t>
             </w:r>
           </w:p>
         </w:tc>
@@ -34477,7 +34896,7 @@
               <w:rPr>
                 <w:sz w:val="19"/>
               </w:rPr>
-              <w:t xml:space="preserve">Factorial optimism audit</w:t>
+              <w:t xml:space="preserve">Flight-order audit</w:t>
             </w:r>
             <m:oMath>
               <m:sSup>
@@ -34510,6 +34929,174 @@
               <w:rPr>
                 <w:sz w:val="19"/>
               </w:rPr>
+              <w:t xml:space="preserve">Caliper without duration-linked features; GPS ordering</w:t>
+            </w:r>
+          </w:p>
+        </w:tc>
+        <w:tc>
+          <w:tcPr/>
+          <w:p>
+            <w:pPr>
+              <w:pStyle w:val="Compact"/>
+              <w:spacing w:line="240" w:lineRule="auto"/>
+              <w:jc w:val="left"/>
+            </w:pPr>
+            <w:r>
+              <w:rPr>
+                <w:sz w:val="19"/>
+              </w:rPr>
+              <w:t xml:space="preserve">Lift</w:t>
+            </w:r>
+            <w:r>
+              <w:rPr>
+                <w:sz w:val="19"/>
+              </w:rPr>
+              <w:t xml:space="preserve"> </w:t>
+            </w:r>
+            <m:oMath>
+              <m:r>
+                <m:rPr>
+                  <m:sty m:val="p"/>
+                </m:rPr>
+                <m:t>+</m:t>
+              </m:r>
+              <m:r>
+                <m:t>0.077</m:t>
+              </m:r>
+            </m:oMath>
+            <w:r>
+              <w:rPr>
+                <w:sz w:val="19"/>
+              </w:rPr>
+              <w:t xml:space="preserve"> </w:t>
+            </w:r>
+            <w:r>
+              <w:rPr>
+                <w:sz w:val="19"/>
+              </w:rPr>
+              <w:t xml:space="preserve">[+0.013, +0.204] without three features; 47 of 95 crash-day exposure flights followed the crash; between-drone 0.698 (</w:t>
+            </w:r>
+            <m:oMath>
+              <m:r>
+                <m:t>p</m:t>
+              </m:r>
+              <m:r>
+                <m:rPr>
+                  <m:sty m:val="p"/>
+                </m:rPr>
+                <m:t>=</m:t>
+              </m:r>
+              <m:r>
+                <m:t>0.0021</m:t>
+              </m:r>
+            </m:oMath>
+            <w:r>
+              <w:rPr>
+                <w:sz w:val="19"/>
+              </w:rPr>
+              <w:t xml:space="preserve">, 43 sets) without them</w:t>
+            </w:r>
+          </w:p>
+        </w:tc>
+        <w:tc>
+          <w:tcPr/>
+          <w:p>
+            <w:pPr>
+              <w:pStyle w:val="Compact"/>
+              <w:spacing w:line="240" w:lineRule="auto"/>
+              <w:jc w:val="left"/>
+            </w:pPr>
+            <w:r>
+              <w:rPr>
+                <w:rStyle w:val="VerbatimChar"/>
+                <w:sz w:val="19"/>
+              </w:rPr>
+              <w:t xml:space="preserve">0e26db0</w:t>
+            </w:r>
+            <w:r>
+              <w:rPr>
+                <w:sz w:val="19"/>
+              </w:rPr>
+              <w:t xml:space="preserve">,</w:t>
+            </w:r>
+            <w:r>
+              <w:rPr>
+                <w:sz w:val="19"/>
+              </w:rPr>
+              <w:t xml:space="preserve"> </w:t>
+            </w:r>
+            <w:r>
+              <w:rPr>
+                <w:rStyle w:val="VerbatimChar"/>
+                <w:sz w:val="19"/>
+              </w:rPr>
+              <w:t xml:space="preserve">187f570</w:t>
+            </w:r>
+          </w:p>
+        </w:tc>
+        <w:tc>
+          <w:tcPr/>
+          <w:p>
+            <w:pPr>
+              <w:pStyle w:val="Compact"/>
+              <w:spacing w:line="240" w:lineRule="auto"/>
+              <w:jc w:val="left"/>
+            </w:pPr>
+            <w:r>
+              <w:rPr>
+                <w:sz w:val="19"/>
+              </w:rPr>
+              <w:t xml:space="preserve">2026-10-27</w:t>
+            </w:r>
+          </w:p>
+        </w:tc>
+      </w:tr>
+      <w:tr>
+        <w:tc>
+          <w:tcPr/>
+          <w:p>
+            <w:pPr>
+              <w:pStyle w:val="Compact"/>
+              <w:spacing w:line="240" w:lineRule="auto"/>
+              <w:jc w:val="left"/>
+            </w:pPr>
+            <w:r>
+              <w:rPr>
+                <w:sz w:val="19"/>
+              </w:rPr>
+              <w:t xml:space="preserve">Factorial optimism audit</w:t>
+            </w:r>
+            <m:oMath>
+              <m:sSup>
+                <m:e>
+                  <m:r>
+                    <m:t>​</m:t>
+                  </m:r>
+                </m:e>
+                <m:sup>
+                  <m:r>
+                    <m:rPr>
+                      <m:sty m:val="p"/>
+                    </m:rPr>
+                    <m:t>†</m:t>
+                  </m:r>
+                </m:sup>
+              </m:sSup>
+            </m:oMath>
+          </w:p>
+        </w:tc>
+        <w:tc>
+          <w:tcPr/>
+          <w:p>
+            <w:pPr>
+              <w:pStyle w:val="Compact"/>
+              <w:spacing w:line="240" w:lineRule="auto"/>
+              <w:jc w:val="left"/>
+            </w:pPr>
+            <w:r>
+              <w:rPr>
+                <w:sz w:val="19"/>
+              </w:rPr>
               <w:t xml:space="preserve">Isolate what the AUC depends on</w:t>
             </w:r>
           </w:p>
@@ -34598,19 +35185,19 @@
         </w:tc>
       </w:tr>
     </w:tbl>
-    <w:bookmarkEnd w:id="85"/>
+    <w:bookmarkEnd w:id="86"/>
     <w:p>
       <w:pPr>
         <w:pStyle w:val="Heading1"/>
       </w:pPr>
-      <w:bookmarkStart w:id="86" w:name="_bibliography"/>
+      <w:bookmarkStart w:id="87" w:name="_bibliography"/>
       <w:r>
         <w:t xml:space="preserve">References</w:t>
       </w:r>
-      <w:bookmarkEnd w:id="86"/>
+      <w:bookmarkEnd w:id="87"/>
     </w:p>
-    <w:bookmarkStart w:id="158" w:name="_refs"/>
-    <w:bookmarkStart w:id="87" w:name="_94e90323a8c21041104ada5ef51239cca731079"/>
+    <w:bookmarkStart w:id="159" w:name="_refs"/>
+    <w:bookmarkStart w:id="88" w:name="_94e90323a8c21041104ada5ef51239cca731079"/>
     <w:p>
       <w:pPr>
         <w:pStyle w:val="Bibliography"/>
@@ -34637,8 +35224,8 @@
         <w:t xml:space="preserve">, (2019).</w:t>
       </w:r>
     </w:p>
-    <w:bookmarkEnd w:id="87"/>
-    <w:bookmarkStart w:id="88" w:name="_accb9f9d732da81043c804de081f8bf74e6cf24"/>
+    <w:bookmarkEnd w:id="88"/>
+    <w:bookmarkStart w:id="89" w:name="_accb9f9d732da81043c804de081f8bf74e6cf24"/>
     <w:p>
       <w:pPr>
         <w:pStyle w:val="Bibliography"/>
@@ -34665,8 +35252,8 @@
         <w:t xml:space="preserve">, (2026).</w:t>
       </w:r>
     </w:p>
-    <w:bookmarkEnd w:id="88"/>
-    <w:bookmarkStart w:id="89" w:name="_2a610b70f77ace96e6ffe48ed026a6e5f9efd5a"/>
+    <w:bookmarkEnd w:id="89"/>
+    <w:bookmarkStart w:id="90" w:name="_2a610b70f77ace96e6ffe48ed026a6e5f9efd5a"/>
     <w:p>
       <w:pPr>
         <w:pStyle w:val="Bibliography"/>
@@ -34693,8 +35280,8 @@
         <w:t xml:space="preserve">, (2021).</w:t>
       </w:r>
     </w:p>
-    <w:bookmarkEnd w:id="89"/>
-    <w:bookmarkStart w:id="90" w:name="_dffd97137af0abb4aae0ff556af3c0d05e0ee4a"/>
+    <w:bookmarkEnd w:id="90"/>
+    <w:bookmarkStart w:id="91" w:name="_dffd97137af0abb4aae0ff556af3c0d05e0ee4a"/>
     <w:p>
       <w:pPr>
         <w:pStyle w:val="Bibliography"/>
@@ -34721,8 +35308,8 @@
         <w:t xml:space="preserve">, (2026).</w:t>
       </w:r>
     </w:p>
-    <w:bookmarkEnd w:id="90"/>
-    <w:bookmarkStart w:id="92" w:name="_398d8a6b28c132ef0c87de1470cc655ebafd86c"/>
+    <w:bookmarkEnd w:id="91"/>
+    <w:bookmarkStart w:id="93" w:name="_398d8a6b28c132ef0c87de1470cc655ebafd86c"/>
     <w:p>
       <w:pPr>
         <w:pStyle w:val="Bibliography"/>
@@ -34748,7 +35335,7 @@
       <w:r>
         <w:t xml:space="preserve">-agents driven automated simulation testing and analysis of small uncrewed aerial systems, in: 2025 IEEE/ACM 47th International Conference on Software Engineering (ICSE), 2025: pp. 385–397. https://doi.org/</w:t>
       </w:r>
-      <w:hyperlink r:id="rId91">
+      <w:hyperlink r:id="rId92">
         <w:r>
           <w:rPr>
             <w:rStyle w:val="Hyperlink"/>
@@ -34760,8 +35347,8 @@
         <w:t xml:space="preserve">.</w:t>
       </w:r>
     </w:p>
-    <w:bookmarkEnd w:id="92"/>
-    <w:bookmarkStart w:id="94" w:name="_4d7bbda75dad34c83d023e6afa1cc5b99fb5426"/>
+    <w:bookmarkEnd w:id="93"/>
+    <w:bookmarkStart w:id="95" w:name="_4d7bbda75dad34c83d023e6afa1cc5b99fb5426"/>
     <w:p>
       <w:pPr>
         <w:pStyle w:val="Bibliography"/>
@@ -34796,7 +35383,7 @@
       <w:r>
         <w:t xml:space="preserve">, Forensic Science International: Digital Investigation 56 (2026) 302051. https://doi.org/</w:t>
       </w:r>
-      <w:hyperlink r:id="rId93">
+      <w:hyperlink r:id="rId94">
         <w:r>
           <w:rPr>
             <w:rStyle w:val="Hyperlink"/>
@@ -34808,8 +35395,8 @@
         <w:t xml:space="preserve">.</w:t>
       </w:r>
     </w:p>
-    <w:bookmarkEnd w:id="94"/>
-    <w:bookmarkStart w:id="95" w:name="_006a7190097400c6c37363d97b6f3be0cdc0b48"/>
+    <w:bookmarkEnd w:id="95"/>
+    <w:bookmarkStart w:id="96" w:name="_006a7190097400c6c37363d97b6f3be0cdc0b48"/>
     <w:p>
       <w:pPr>
         <w:pStyle w:val="Bibliography"/>
@@ -34827,8 +35414,8 @@
         <w:t xml:space="preserve">D.A. Wiegmann, S.A. Shappell, A human error approach to aviation accident analysis: The human factors analysis and classification system, Ashgate, Aldershot, 2003.</w:t>
       </w:r>
     </w:p>
-    <w:bookmarkEnd w:id="95"/>
-    <w:bookmarkStart w:id="97" w:name="_3541019a36f31423dbace231a12fca4d5e5f1ad"/>
+    <w:bookmarkEnd w:id="96"/>
+    <w:bookmarkStart w:id="98" w:name="_3541019a36f31423dbace231a12fca4d5e5f1ad"/>
     <w:p>
       <w:pPr>
         <w:pStyle w:val="Bibliography"/>
@@ -34845,7 +35432,7 @@
       <w:r>
         <w:t xml:space="preserve">S. Kaufman, S. Rosset, C. Perlich, O. Stitelman, Leakage in data mining: Formulation, detection, and avoidance, ACM Transactions on Knowledge Discovery from Data 6 (2012) 15:1–15:21. https://doi.org/</w:t>
       </w:r>
-      <w:hyperlink r:id="rId96">
+      <w:hyperlink r:id="rId97">
         <w:r>
           <w:rPr>
             <w:rStyle w:val="Hyperlink"/>
@@ -34857,8 +35444,8 @@
         <w:t xml:space="preserve">.</w:t>
       </w:r>
     </w:p>
-    <w:bookmarkEnd w:id="97"/>
-    <w:bookmarkStart w:id="99" w:name="_77239db318a405bdd9ca0cc5db74d4c41b2a03f"/>
+    <w:bookmarkEnd w:id="98"/>
+    <w:bookmarkStart w:id="100" w:name="_77239db318a405bdd9ca0cc5db74d4c41b2a03f"/>
     <w:p>
       <w:pPr>
         <w:pStyle w:val="Bibliography"/>
@@ -34875,7 +35462,7 @@
       <w:r>
         <w:t xml:space="preserve">S. Kapoor, A. Narayanan, Leakage and the reproducibility crisis in machine-learning-based science, Patterns 4 (2023) 100804. https://doi.org/</w:t>
       </w:r>
-      <w:hyperlink r:id="rId98">
+      <w:hyperlink r:id="rId99">
         <w:r>
           <w:rPr>
             <w:rStyle w:val="Hyperlink"/>
@@ -34887,8 +35474,8 @@
         <w:t xml:space="preserve">.</w:t>
       </w:r>
     </w:p>
-    <w:bookmarkEnd w:id="99"/>
-    <w:bookmarkStart w:id="101" w:name="_d75d7cf63098afa5d33e189bc1a163022e7ecdc"/>
+    <w:bookmarkEnd w:id="100"/>
+    <w:bookmarkStart w:id="102" w:name="_d75d7cf63098afa5d33e189bc1a163022e7ecdc"/>
     <w:p>
       <w:pPr>
         <w:pStyle w:val="Bibliography"/>
@@ -34926,7 +35513,7 @@
       <w:r>
         <w:t xml:space="preserve">fault and anomaly detection, The International Journal of Robotics Research 40 (2021) 515–520. https://doi.org/</w:t>
       </w:r>
-      <w:hyperlink r:id="rId100">
+      <w:hyperlink r:id="rId101">
         <w:r>
           <w:rPr>
             <w:rStyle w:val="Hyperlink"/>
@@ -34938,8 +35525,8 @@
         <w:t xml:space="preserve">.</w:t>
       </w:r>
     </w:p>
-    <w:bookmarkEnd w:id="101"/>
-    <w:bookmarkStart w:id="103" w:name="_446d2d8311e3f2ab8e5f2830e712f064a3280b9"/>
+    <w:bookmarkEnd w:id="102"/>
+    <w:bookmarkStart w:id="104" w:name="_446d2d8311e3f2ab8e5f2830e712f064a3280b9"/>
     <w:p>
       <w:pPr>
         <w:pStyle w:val="Bibliography"/>
@@ -34965,7 +35552,7 @@
       <w:r>
         <w:t xml:space="preserve">: A dataset for multicopter fault detection and health assessment, The International Journal of Robotics Research 44 (2025) 1081–1092. https://doi.org/</w:t>
       </w:r>
-      <w:hyperlink r:id="rId102">
+      <w:hyperlink r:id="rId103">
         <w:r>
           <w:rPr>
             <w:rStyle w:val="Hyperlink"/>
@@ -34977,8 +35564,8 @@
         <w:t xml:space="preserve">.</w:t>
       </w:r>
     </w:p>
-    <w:bookmarkEnd w:id="103"/>
-    <w:bookmarkStart w:id="104" w:name="_973650d78dc352a8b25ace59ab002a1d91cdfc9"/>
+    <w:bookmarkEnd w:id="104"/>
+    <w:bookmarkStart w:id="105" w:name="_973650d78dc352a8b25ace59ab002a1d91cdfc9"/>
     <w:p>
       <w:pPr>
         <w:pStyle w:val="Bibliography"/>
@@ -35014,8 +35601,8 @@
         <w:t xml:space="preserve">, (2026).</w:t>
       </w:r>
     </w:p>
-    <w:bookmarkEnd w:id="104"/>
-    <w:bookmarkStart w:id="106" w:name="_42246838952b0ed0d35bd475d264714b9e743f7"/>
+    <w:bookmarkEnd w:id="105"/>
+    <w:bookmarkStart w:id="107" w:name="_42246838952b0ed0d35bd475d264714b9e743f7"/>
     <w:p>
       <w:pPr>
         <w:pStyle w:val="Bibliography"/>
@@ -35032,7 +35619,7 @@
       <w:r>
         <w:t xml:space="preserve">G. Wild, J. Murray, G. Baxter, Exploring civil drone accidents and incidents to help prevent potential air disasters, Aerospace 3 (2016) 22. https://doi.org/</w:t>
       </w:r>
-      <w:hyperlink r:id="rId105">
+      <w:hyperlink r:id="rId106">
         <w:r>
           <w:rPr>
             <w:rStyle w:val="Hyperlink"/>
@@ -35044,8 +35631,8 @@
         <w:t xml:space="preserve">.</w:t>
       </w:r>
     </w:p>
-    <w:bookmarkEnd w:id="106"/>
-    <w:bookmarkStart w:id="107" w:name="_b513b568a9a02649a1ddc461a1dd01e876732a2"/>
+    <w:bookmarkEnd w:id="107"/>
+    <w:bookmarkStart w:id="108" w:name="_b513b568a9a02649a1ddc461a1dd01e876732a2"/>
     <w:p>
       <w:pPr>
         <w:pStyle w:val="Bibliography"/>
@@ -35072,8 +35659,8 @@
         <w:t xml:space="preserve">, AAIB, Department for Transport, Farnborough, UK, 2026.</w:t>
       </w:r>
     </w:p>
-    <w:bookmarkEnd w:id="107"/>
-    <w:bookmarkStart w:id="109" w:name="_7bef8dc44b5ed9bb7ced7ca5f392a78a76d6601"/>
+    <w:bookmarkEnd w:id="108"/>
+    <w:bookmarkStart w:id="110" w:name="_7bef8dc44b5ed9bb7ced7ca5f392a78a76d6601"/>
     <w:p>
       <w:pPr>
         <w:pStyle w:val="Bibliography"/>
@@ -35099,7 +35686,7 @@
       <w:r>
         <w:t xml:space="preserve">: A node-based multithreaded open source robotics framework for deeply embedded platforms, in: 2015 IEEE International Conference on Robotics and Automation (ICRA), 2015: pp. 6235–6240. https://doi.org/</w:t>
       </w:r>
-      <w:hyperlink r:id="rId108">
+      <w:hyperlink r:id="rId109">
         <w:r>
           <w:rPr>
             <w:rStyle w:val="Hyperlink"/>
@@ -35111,8 +35698,8 @@
         <w:t xml:space="preserve">.</w:t>
       </w:r>
     </w:p>
-    <w:bookmarkEnd w:id="109"/>
-    <w:bookmarkStart w:id="110" w:name="_d96f71c5379cbcad3bc75bfc7936eeacbaeb4ed"/>
+    <w:bookmarkEnd w:id="110"/>
+    <w:bookmarkStart w:id="111" w:name="_d96f71c5379cbcad3bc75bfc7936eeacbaeb4ed"/>
     <w:p>
       <w:pPr>
         <w:pStyle w:val="Bibliography"/>
@@ -35160,8 +35747,8 @@
         <w:t xml:space="preserve">parser, (2026).</w:t>
       </w:r>
     </w:p>
-    <w:bookmarkEnd w:id="110"/>
-    <w:bookmarkStart w:id="111" w:name="_c1fc4b225b7dfa71f64cc84e83afba5f24698c2"/>
+    <w:bookmarkEnd w:id="111"/>
+    <w:bookmarkStart w:id="112" w:name="_c1fc4b225b7dfa71f64cc84e83afba5f24698c2"/>
     <w:p>
       <w:pPr>
         <w:pStyle w:val="Bibliography"/>
@@ -35200,8 +35787,8 @@
         <w:t xml:space="preserve">telemetry anomaly mining, (2026).</w:t>
       </w:r>
     </w:p>
-    <w:bookmarkEnd w:id="111"/>
-    <w:bookmarkStart w:id="113" w:name="_3d31df3710cff81ff87ef6665f7295f981708a9"/>
+    <w:bookmarkEnd w:id="112"/>
+    <w:bookmarkStart w:id="114" w:name="_3d31df3710cff81ff87ef6665f7295f981708a9"/>
     <w:p>
       <w:pPr>
         <w:pStyle w:val="Bibliography"/>
@@ -35242,7 +35829,7 @@
       <w:r>
         <w:t xml:space="preserve">flight logs, Sensors 26 (2026) 3188. https://doi.org/</w:t>
       </w:r>
-      <w:hyperlink r:id="rId112">
+      <w:hyperlink r:id="rId113">
         <w:r>
           <w:rPr>
             <w:rStyle w:val="Hyperlink"/>
@@ -35254,8 +35841,8 @@
         <w:t xml:space="preserve">.</w:t>
       </w:r>
     </w:p>
-    <w:bookmarkEnd w:id="113"/>
-    <w:bookmarkStart w:id="115" w:name="_950e388298cdb3fb08e5b74428870c5b4c838aa"/>
+    <w:bookmarkEnd w:id="114"/>
+    <w:bookmarkStart w:id="116" w:name="_950e388298cdb3fb08e5b74428870c5b4c838aa"/>
     <w:p>
       <w:pPr>
         <w:pStyle w:val="Bibliography"/>
@@ -35272,7 +35859,7 @@
       <w:r>
         <w:t xml:space="preserve">D. Wang, S. Li, G. Xiao, Y. Liu, Y. Sui, P. He, M.R. Lyu, An exploratory investigation of log anomalies in unmanned aerial vehicles, in: Proceedings of the IEEE/ACM 46th International Conference on Software Engineering (ICSE), 2024: pp. 2593–2605. https://doi.org/</w:t>
       </w:r>
-      <w:hyperlink r:id="rId114">
+      <w:hyperlink r:id="rId115">
         <w:r>
           <w:rPr>
             <w:rStyle w:val="Hyperlink"/>
@@ -35284,8 +35871,8 @@
         <w:t xml:space="preserve">.</w:t>
       </w:r>
     </w:p>
-    <w:bookmarkEnd w:id="115"/>
-    <w:bookmarkStart w:id="117" w:name="_de2316363361acc29c6a15415cb3110e85473cd"/>
+    <w:bookmarkEnd w:id="116"/>
+    <w:bookmarkStart w:id="118" w:name="_de2316363361acc29c6a15415cb3110e85473cd"/>
     <w:p>
       <w:pPr>
         <w:pStyle w:val="Bibliography"/>
@@ -35314,7 +35901,7 @@
       <w:r>
         <w:t xml:space="preserve">fault detection methods, state-of-the-art, Drones 6 (2022) 330. https://doi.org/</w:t>
       </w:r>
-      <w:hyperlink r:id="rId116">
+      <w:hyperlink r:id="rId117">
         <w:r>
           <w:rPr>
             <w:rStyle w:val="Hyperlink"/>
@@ -35326,8 +35913,8 @@
         <w:t xml:space="preserve">.</w:t>
       </w:r>
     </w:p>
-    <w:bookmarkEnd w:id="117"/>
-    <w:bookmarkStart w:id="119" w:name="_1ece912d6a7cc2c7f97bdecc84d0912f3af390e"/>
+    <w:bookmarkEnd w:id="118"/>
+    <w:bookmarkStart w:id="120" w:name="_1ece912d6a7cc2c7f97bdecc84d0912f3af390e"/>
     <w:p>
       <w:pPr>
         <w:pStyle w:val="Bibliography"/>
@@ -35344,7 +35931,7 @@
       <w:r>
         <w:t xml:space="preserve">E. Khalastchi, M. Kalech, On fault detection and diagnosis in robotic systems, ACM Computing Surveys 51 (2018) 9:1–9:24. https://doi.org/</w:t>
       </w:r>
-      <w:hyperlink r:id="rId118">
+      <w:hyperlink r:id="rId119">
         <w:r>
           <w:rPr>
             <w:rStyle w:val="Hyperlink"/>
@@ -35356,8 +35943,8 @@
         <w:t xml:space="preserve">.</w:t>
       </w:r>
     </w:p>
-    <w:bookmarkEnd w:id="119"/>
-    <w:bookmarkStart w:id="121" w:name="_200a90d3af15f3f5a64a3cb8afd6783e6bc5c1d"/>
+    <w:bookmarkEnd w:id="120"/>
+    <w:bookmarkStart w:id="122" w:name="_200a90d3af15f3f5a64a3cb8afd6783e6bc5c1d"/>
     <w:p>
       <w:pPr>
         <w:pStyle w:val="Bibliography"/>
@@ -35374,7 +35961,7 @@
       <w:r>
         <w:t xml:space="preserve">E. Zibaei, R. Borth, Building causal models for finding actual causes of unmanned aerial vehicle failures, Frontiers in Robotics and AI 11 (2024) 1123762. https://doi.org/</w:t>
       </w:r>
-      <w:hyperlink r:id="rId120">
+      <w:hyperlink r:id="rId121">
         <w:r>
           <w:rPr>
             <w:rStyle w:val="Hyperlink"/>
@@ -35386,8 +35973,8 @@
         <w:t xml:space="preserve">.</w:t>
       </w:r>
     </w:p>
-    <w:bookmarkEnd w:id="121"/>
-    <w:bookmarkStart w:id="123" w:name="_362e51e11e30eb0e0461101d9c36e4d21d357be"/>
+    <w:bookmarkEnd w:id="122"/>
+    <w:bookmarkStart w:id="124" w:name="_362e51e11e30eb0e0461101d9c36e4d21d357be"/>
     <w:p>
       <w:pPr>
         <w:pStyle w:val="Bibliography"/>
@@ -35404,7 +35991,7 @@
       <w:r>
         <w:t xml:space="preserve">D. Wang, S. Li, G. Xiao, Y. Liu, Y. Sui, An exploratory study of autopilot software bugs in unmanned aerial vehicles, in: Proceedings of the 29th ACM Joint European Software Engineering Conference and Symposium on the Foundations of Software Engineering (ESEC/FSE), 2021: pp. 20–31. https://doi.org/</w:t>
       </w:r>
-      <w:hyperlink r:id="rId122">
+      <w:hyperlink r:id="rId123">
         <w:r>
           <w:rPr>
             <w:rStyle w:val="Hyperlink"/>
@@ -35416,8 +36003,8 @@
         <w:t xml:space="preserve">.</w:t>
       </w:r>
     </w:p>
-    <w:bookmarkEnd w:id="123"/>
-    <w:bookmarkStart w:id="125" w:name="_28fc3a5fe4ab4d700ff5d5013cf5016c3615a4e"/>
+    <w:bookmarkEnd w:id="124"/>
+    <w:bookmarkStart w:id="126" w:name="_28fc3a5fe4ab4d700ff5d5013cf5016c3615a4e"/>
     <w:p>
       <w:pPr>
         <w:pStyle w:val="Bibliography"/>
@@ -35446,7 +36033,7 @@
       <w:r>
         <w:t xml:space="preserve"> </w:t>
       </w:r>
-      <w:hyperlink r:id="rId124">
+      <w:hyperlink r:id="rId125">
         <w:r>
           <w:rPr>
             <w:rStyle w:val="Hyperlink"/>
@@ -35458,8 +36045,8 @@
         <w:t xml:space="preserve">.</w:t>
       </w:r>
     </w:p>
-    <w:bookmarkEnd w:id="125"/>
-    <w:bookmarkStart w:id="127" w:name="_d4ad44bf9b3d266a94b61d09f97230334249200"/>
+    <w:bookmarkEnd w:id="126"/>
+    <w:bookmarkStart w:id="128" w:name="_d4ad44bf9b3d266a94b61d09f97230334249200"/>
     <w:p>
       <w:pPr>
         <w:pStyle w:val="Bibliography"/>
@@ -35503,7 +36090,7 @@
       <w:r>
         <w:t xml:space="preserve">, Computers and Electrical Engineering 135 (2026) 111144. https://doi.org/</w:t>
       </w:r>
-      <w:hyperlink r:id="rId126">
+      <w:hyperlink r:id="rId127">
         <w:r>
           <w:rPr>
             <w:rStyle w:val="Hyperlink"/>
@@ -35515,8 +36102,8 @@
         <w:t xml:space="preserve">.</w:t>
       </w:r>
     </w:p>
-    <w:bookmarkEnd w:id="127"/>
-    <w:bookmarkStart w:id="129" w:name="_c31a8d3d1228c558f290994c7b0f9dadcd70167"/>
+    <w:bookmarkEnd w:id="128"/>
+    <w:bookmarkStart w:id="130" w:name="_c31a8d3d1228c558f290994c7b0f9dadcd70167"/>
     <w:p>
       <w:pPr>
         <w:pStyle w:val="Bibliography"/>
@@ -35545,7 +36132,7 @@
       <w:r>
         <w:t xml:space="preserve">safety through battery health monitoring and flight log-based crash diagnostics, IEEE Sensors Reviews (2025). https://doi.org/</w:t>
       </w:r>
-      <w:hyperlink r:id="rId128">
+      <w:hyperlink r:id="rId129">
         <w:r>
           <w:rPr>
             <w:rStyle w:val="Hyperlink"/>
@@ -35557,8 +36144,8 @@
         <w:t xml:space="preserve">.</w:t>
       </w:r>
     </w:p>
-    <w:bookmarkEnd w:id="129"/>
-    <w:bookmarkStart w:id="131" w:name="_db271caa090a7def1254596a62a362b0608337f"/>
+    <w:bookmarkEnd w:id="130"/>
+    <w:bookmarkStart w:id="132" w:name="_db271caa090a7def1254596a62a362b0608337f"/>
     <w:p>
       <w:pPr>
         <w:pStyle w:val="Bibliography"/>
@@ -35584,7 +36171,7 @@
       <w:r>
         <w:t xml:space="preserve">: Drone forensics in dataflash and telemetry logs, in: Advances in Information and Computer Security, Springer, 2019: pp. 377–390. https://doi.org/</w:t>
       </w:r>
-      <w:hyperlink r:id="rId130">
+      <w:hyperlink r:id="rId131">
         <w:r>
           <w:rPr>
             <w:rStyle w:val="Hyperlink"/>
@@ -35596,8 +36183,8 @@
         <w:t xml:space="preserve">.</w:t>
       </w:r>
     </w:p>
-    <w:bookmarkEnd w:id="131"/>
-    <w:bookmarkStart w:id="133" w:name="_4f9a794a6a4ddf2789379e73f8e74e34b9538b4"/>
+    <w:bookmarkEnd w:id="132"/>
+    <w:bookmarkStart w:id="134" w:name="_4f9a794a6a4ddf2789379e73f8e74e34b9538b4"/>
     <w:p>
       <w:pPr>
         <w:pStyle w:val="Bibliography"/>
@@ -35614,7 +36201,7 @@
       <w:r>
         <w:t xml:space="preserve">E. Petritoli, F. Leccese, L. Ciani, Reliability and maintenance analysis of unmanned aerial vehicles, Sensors 18 (2018) 3171. https://doi.org/</w:t>
       </w:r>
-      <w:hyperlink r:id="rId132">
+      <w:hyperlink r:id="rId133">
         <w:r>
           <w:rPr>
             <w:rStyle w:val="Hyperlink"/>
@@ -35626,8 +36213,8 @@
         <w:t xml:space="preserve">.</w:t>
       </w:r>
     </w:p>
-    <w:bookmarkEnd w:id="133"/>
-    <w:bookmarkStart w:id="134" w:name="_a0e369e89429aa426010697429f06415b068aab"/>
+    <w:bookmarkEnd w:id="134"/>
+    <w:bookmarkStart w:id="135" w:name="_a0e369e89429aa426010697429f06415b068aab"/>
     <w:p>
       <w:pPr>
         <w:pStyle w:val="Bibliography"/>
@@ -35657,8 +36244,8 @@
         <w:t xml:space="preserve">analysis of 221 mishaps over 10 years, Aviation, Space, and Environmental Medicine 77 (2006) 724–732.</w:t>
       </w:r>
     </w:p>
-    <w:bookmarkEnd w:id="134"/>
-    <w:bookmarkStart w:id="136" w:name="_b71485d7ca39b77d2f8c60f2e52a354c8c113b0"/>
+    <w:bookmarkEnd w:id="135"/>
+    <w:bookmarkStart w:id="137" w:name="_b71485d7ca39b77d2f8c60f2e52a354c8c113b0"/>
     <w:p>
       <w:pPr>
         <w:pStyle w:val="Bibliography"/>
@@ -35705,7 +36292,7 @@
       <w:r>
         <w:t xml:space="preserve">forensic intelligent agent for low-altitude public security, Expert Systems with Applications 327 (2026) 132859. https://doi.org/</w:t>
       </w:r>
-      <w:hyperlink r:id="rId135">
+      <w:hyperlink r:id="rId136">
         <w:r>
           <w:rPr>
             <w:rStyle w:val="Hyperlink"/>
@@ -35717,8 +36304,8 @@
         <w:t xml:space="preserve">.</w:t>
       </w:r>
     </w:p>
-    <w:bookmarkEnd w:id="136"/>
-    <w:bookmarkStart w:id="138" w:name="_06ffb55068ea9e0b3a7aa6e754cfcffab5f832f"/>
+    <w:bookmarkEnd w:id="137"/>
+    <w:bookmarkStart w:id="139" w:name="_06ffb55068ea9e0b3a7aa6e754cfcffab5f832f"/>
     <w:p>
       <w:pPr>
         <w:pStyle w:val="Bibliography"/>
@@ -35738,7 +36325,7 @@
       <w:r>
         <w:t xml:space="preserve"> </w:t>
       </w:r>
-      <w:hyperlink r:id="rId137">
+      <w:hyperlink r:id="rId138">
         <w:r>
           <w:rPr>
             <w:rStyle w:val="Hyperlink"/>
@@ -35750,8 +36337,8 @@
         <w:t xml:space="preserve">.</w:t>
       </w:r>
     </w:p>
-    <w:bookmarkEnd w:id="138"/>
-    <w:bookmarkStart w:id="140" w:name="_8a3cc11b1319c0fe6bf6179f8196eab503a64d0"/>
+    <w:bookmarkEnd w:id="139"/>
+    <w:bookmarkStart w:id="141" w:name="_8a3cc11b1319c0fe6bf6179f8196eab503a64d0"/>
     <w:p>
       <w:pPr>
         <w:pStyle w:val="Bibliography"/>
@@ -35777,7 +36364,7 @@
       <w:r>
         <w:t xml:space="preserve">-integrated applications with indirect prompt injection, in: Proceedings of the 16th ACM Workshop on Artificial Intelligence and Security (AISec), 2023: pp. 79–90. https://doi.org/</w:t>
       </w:r>
-      <w:hyperlink r:id="rId139">
+      <w:hyperlink r:id="rId140">
         <w:r>
           <w:rPr>
             <w:rStyle w:val="Hyperlink"/>
@@ -35789,8 +36376,8 @@
         <w:t xml:space="preserve">.</w:t>
       </w:r>
     </w:p>
-    <w:bookmarkEnd w:id="140"/>
-    <w:bookmarkStart w:id="142" w:name="_1347ffcfa7cf605bba5af95142b3cba7f0abdc4"/>
+    <w:bookmarkEnd w:id="141"/>
+    <w:bookmarkStart w:id="143" w:name="_1347ffcfa7cf605bba5af95142b3cba7f0abdc4"/>
     <w:p>
       <w:pPr>
         <w:pStyle w:val="Bibliography"/>
@@ -35807,7 +36394,7 @@
       <w:r>
         <w:t xml:space="preserve">J.P. Vieira, V.A. Bauler, R.K. Rosa, D. Silva, Towards a more realistic evaluation of machine learning models for bearing fault diagnosis, (2025). https://doi.org/</w:t>
       </w:r>
-      <w:hyperlink r:id="rId141">
+      <w:hyperlink r:id="rId142">
         <w:r>
           <w:rPr>
             <w:rStyle w:val="Hyperlink"/>
@@ -35819,8 +36406,8 @@
         <w:t xml:space="preserve">.</w:t>
       </w:r>
     </w:p>
-    <w:bookmarkEnd w:id="142"/>
-    <w:bookmarkStart w:id="144" w:name="_ab8841c06958c924804c38799fc8ccd94ea102a"/>
+    <w:bookmarkEnd w:id="143"/>
+    <w:bookmarkStart w:id="145" w:name="_ab8841c06958c924804c38799fc8ccd94ea102a"/>
     <w:p>
       <w:pPr>
         <w:pStyle w:val="Bibliography"/>
@@ -35837,7 +36424,7 @@
       <w:r>
         <w:t xml:space="preserve">B. Frénay, M. Verleysen, Classification in the presence of label noise: A survey, IEEE Transactions on Neural Networks and Learning Systems 25 (2014) 845–869. https://doi.org/</w:t>
       </w:r>
-      <w:hyperlink r:id="rId143">
+      <w:hyperlink r:id="rId144">
         <w:r>
           <w:rPr>
             <w:rStyle w:val="Hyperlink"/>
@@ -35849,8 +36436,8 @@
         <w:t xml:space="preserve">.</w:t>
       </w:r>
     </w:p>
-    <w:bookmarkEnd w:id="144"/>
-    <w:bookmarkStart w:id="146" w:name="_90b58fdc380e5ffe19ed416545c54d06f184b09"/>
+    <w:bookmarkEnd w:id="145"/>
+    <w:bookmarkStart w:id="147" w:name="_90b58fdc380e5ffe19ed416545c54d06f184b09"/>
     <w:p>
       <w:pPr>
         <w:pStyle w:val="Bibliography"/>
@@ -35867,7 +36454,7 @@
       <w:r>
         <w:t xml:space="preserve">E.A. Stuart, Matching methods for causal inference: A review and a look forward, Statistical Science 25 (2010) 1–21. https://doi.org/</w:t>
       </w:r>
-      <w:hyperlink r:id="rId145">
+      <w:hyperlink r:id="rId146">
         <w:r>
           <w:rPr>
             <w:rStyle w:val="Hyperlink"/>
@@ -35879,8 +36466,8 @@
         <w:t xml:space="preserve">.</w:t>
       </w:r>
     </w:p>
-    <w:bookmarkEnd w:id="146"/>
-    <w:bookmarkStart w:id="148" w:name="_f6e66cea9a1ea78573b548bc5cf8461c81300ca"/>
+    <w:bookmarkEnd w:id="147"/>
+    <w:bookmarkStart w:id="149" w:name="_f6e66cea9a1ea78573b548bc5cf8461c81300ca"/>
     <w:p>
       <w:pPr>
         <w:pStyle w:val="Bibliography"/>
@@ -35897,7 +36484,7 @@
       <w:r>
         <w:t xml:space="preserve">B.A. Nosek, C.R. Ebersole, A.C. DeHaven, D.T. Mellor, The preregistration revolution, Proceedings of the National Academy of Sciences 115 (2018) 2600–2606. https://doi.org/</w:t>
       </w:r>
-      <w:hyperlink r:id="rId147">
+      <w:hyperlink r:id="rId148">
         <w:r>
           <w:rPr>
             <w:rStyle w:val="Hyperlink"/>
@@ -35909,8 +36496,8 @@
         <w:t xml:space="preserve">.</w:t>
       </w:r>
     </w:p>
-    <w:bookmarkEnd w:id="148"/>
-    <w:bookmarkStart w:id="150" w:name="_ad8397d41f792404ea3ffa2c2145e851561e0cf"/>
+    <w:bookmarkEnd w:id="149"/>
+    <w:bookmarkStart w:id="151" w:name="_ad8397d41f792404ea3ffa2c2145e851561e0cf"/>
     <w:p>
       <w:pPr>
         <w:pStyle w:val="Bibliography"/>
@@ -35933,7 +36520,7 @@
       <w:r>
         <w:t xml:space="preserve">) curve, Radiology 143 (1982) 29–36. https://doi.org/</w:t>
       </w:r>
-      <w:hyperlink r:id="rId149">
+      <w:hyperlink r:id="rId150">
         <w:r>
           <w:rPr>
             <w:rStyle w:val="Hyperlink"/>
@@ -35945,8 +36532,8 @@
         <w:t xml:space="preserve">.</w:t>
       </w:r>
     </w:p>
-    <w:bookmarkEnd w:id="150"/>
-    <w:bookmarkStart w:id="152" w:name="_7ae2e06bcfe80442633569f5f6b1e21460598cb"/>
+    <w:bookmarkEnd w:id="151"/>
+    <w:bookmarkStart w:id="153" w:name="_7ae2e06bcfe80442633569f5f6b1e21460598cb"/>
     <w:p>
       <w:pPr>
         <w:pStyle w:val="Bibliography"/>
@@ -35963,7 +36550,7 @@
       <w:r>
         <w:t xml:space="preserve">H.B. Mann, D.R. Whitney, On a test of whether one of two random variables is stochastically larger than the other, The Annals of Mathematical Statistics 18 (1947) 50–60. https://doi.org/</w:t>
       </w:r>
-      <w:hyperlink r:id="rId151">
+      <w:hyperlink r:id="rId152">
         <w:r>
           <w:rPr>
             <w:rStyle w:val="Hyperlink"/>
@@ -35975,8 +36562,8 @@
         <w:t xml:space="preserve">.</w:t>
       </w:r>
     </w:p>
-    <w:bookmarkEnd w:id="152"/>
-    <w:bookmarkStart w:id="153" w:name="_d0a9d29bfb3d63b968b17ba95db409a8b61dfda"/>
+    <w:bookmarkEnd w:id="153"/>
+    <w:bookmarkStart w:id="154" w:name="_d0a9d29bfb3d63b968b17ba95db409a8b61dfda"/>
     <w:p>
       <w:pPr>
         <w:pStyle w:val="Bibliography"/>
@@ -35994,8 +36581,8 @@
         <w:t xml:space="preserve">B. Efron, R.J. Tibshirani, An introduction to the bootstrap, Chapman &amp; Hall, New York, 1993.</w:t>
       </w:r>
     </w:p>
-    <w:bookmarkEnd w:id="153"/>
-    <w:bookmarkStart w:id="155" w:name="_89a013c1487ff07275d04a7e5b79d7551b6a9f6"/>
+    <w:bookmarkEnd w:id="154"/>
+    <w:bookmarkStart w:id="156" w:name="_89a013c1487ff07275d04a7e5b79d7551b6a9f6"/>
     <w:p>
       <w:pPr>
         <w:pStyle w:val="Bibliography"/>
@@ -36015,7 +36602,7 @@
       <w:r>
         <w:t xml:space="preserve"> </w:t>
       </w:r>
-      <w:hyperlink r:id="rId154">
+      <w:hyperlink r:id="rId155">
         <w:r>
           <w:rPr>
             <w:rStyle w:val="Hyperlink"/>
@@ -36027,8 +36614,8 @@
         <w:t xml:space="preserve">.</w:t>
       </w:r>
     </w:p>
-    <w:bookmarkEnd w:id="155"/>
-    <w:bookmarkStart w:id="157" w:name="_b33a3667fdc4f105b36c2f39d7c011ffb6fcb73"/>
+    <w:bookmarkEnd w:id="156"/>
+    <w:bookmarkStart w:id="158" w:name="_b33a3667fdc4f105b36c2f39d7c011ffb6fcb73"/>
     <w:p>
       <w:pPr>
         <w:pStyle w:val="Bibliography"/>
@@ -36090,7 +36677,7 @@
       <w:r>
         <w:t xml:space="preserve"> </w:t>
       </w:r>
-      <w:hyperlink r:id="rId156">
+      <w:hyperlink r:id="rId157">
         <w:r>
           <w:rPr>
             <w:rStyle w:val="Hyperlink"/>
@@ -36102,8 +36689,8 @@
         <w:t xml:space="preserve">.</w:t>
       </w:r>
     </w:p>
-    <w:bookmarkEnd w:id="157"/>
     <w:bookmarkEnd w:id="158"/>
+    <w:bookmarkEnd w:id="159"/>
     <w:sectPr>
       <w:footnotePr>
         <w:numRestart w:val="eachSect"/>

</xml_diff>